<commit_message>
Add PIQ 2 (Father) questions to SSB question sheet
Co-Authored-By: Claude Opus 5.5 <noreply@anthropic.com>
Claude-Session: https://claude.ai/code/session_01TypcejD48cCyAqfjtUUit5
</commit_message>
<xml_diff>
--- a/SSB_Question_Sheet.docx
+++ b/SSB_Question_Sheet.docx
@@ -980,6 +980,1470 @@
           <w:bCs/>
         </w:rPr>
         <w:t xml:space="preserve">What is India's renewable energy situation?</w:t>
+      </w:r>
+    </w:p>
+    <w:p>
+      <w:pPr>
+        <w:spacing w:after="120"/>
+        <w:ind w:left="440"/>
+      </w:pPr>
+    </w:p>
+    <w:p>
+      <w:pPr>
+        <w:pStyle w:val="Heading1"/>
+      </w:pPr>
+      <w:r>
+        <w:t xml:space="preserve">PIQ 2 – Father</w:t>
+      </w:r>
+    </w:p>
+    <w:p>
+      <w:pPr>
+        <w:pStyle w:val="ListParagraph"/>
+        <w:keepNext/>
+        <w:numPr>
+          <w:ilvl w:val="0"/>
+          <w:numId w:val="2"/>
+        </w:numPr>
+        <w:spacing w:after="0" w:before="120"/>
+      </w:pPr>
+      <w:r>
+        <w:rPr>
+          <w:b/>
+          <w:bCs/>
+        </w:rPr>
+        <w:t xml:space="preserve">What is your father's name?</w:t>
+      </w:r>
+    </w:p>
+    <w:p>
+      <w:pPr>
+        <w:spacing w:after="120"/>
+        <w:ind w:left="440"/>
+      </w:pPr>
+    </w:p>
+    <w:p>
+      <w:pPr>
+        <w:pStyle w:val="ListParagraph"/>
+        <w:keepNext/>
+        <w:numPr>
+          <w:ilvl w:val="0"/>
+          <w:numId w:val="2"/>
+        </w:numPr>
+        <w:spacing w:after="0" w:before="120"/>
+      </w:pPr>
+      <w:r>
+        <w:rPr>
+          <w:b/>
+          <w:bCs/>
+        </w:rPr>
+        <w:t xml:space="preserve">How old is your father?</w:t>
+      </w:r>
+    </w:p>
+    <w:p>
+      <w:pPr>
+        <w:spacing w:after="120"/>
+        <w:ind w:left="440"/>
+      </w:pPr>
+    </w:p>
+    <w:p>
+      <w:pPr>
+        <w:pStyle w:val="ListParagraph"/>
+        <w:keepNext/>
+        <w:numPr>
+          <w:ilvl w:val="0"/>
+          <w:numId w:val="2"/>
+        </w:numPr>
+        <w:spacing w:after="0" w:before="120"/>
+      </w:pPr>
+      <w:r>
+        <w:rPr>
+          <w:b/>
+          <w:bCs/>
+        </w:rPr>
+        <w:t xml:space="preserve">Where does he work?</w:t>
+      </w:r>
+    </w:p>
+    <w:p>
+      <w:pPr>
+        <w:spacing w:after="120"/>
+        <w:ind w:left="440"/>
+      </w:pPr>
+    </w:p>
+    <w:p>
+      <w:pPr>
+        <w:pStyle w:val="ListParagraph"/>
+        <w:keepNext/>
+        <w:numPr>
+          <w:ilvl w:val="0"/>
+          <w:numId w:val="2"/>
+        </w:numPr>
+        <w:spacing w:after="0" w:before="120"/>
+      </w:pPr>
+      <w:r>
+        <w:rPr>
+          <w:b/>
+          <w:bCs/>
+        </w:rPr>
+        <w:t xml:space="preserve">What is his educational qualification?</w:t>
+      </w:r>
+    </w:p>
+    <w:p>
+      <w:pPr>
+        <w:spacing w:after="120"/>
+        <w:ind w:left="440"/>
+      </w:pPr>
+    </w:p>
+    <w:p>
+      <w:pPr>
+        <w:pStyle w:val="ListParagraph"/>
+        <w:keepNext/>
+        <w:numPr>
+          <w:ilvl w:val="0"/>
+          <w:numId w:val="2"/>
+        </w:numPr>
+        <w:spacing w:after="0" w:before="120"/>
+      </w:pPr>
+      <w:r>
+        <w:rPr>
+          <w:b/>
+          <w:bCs/>
+        </w:rPr>
+        <w:t xml:space="preserve">How long has he been doing this work?</w:t>
+      </w:r>
+    </w:p>
+    <w:p>
+      <w:pPr>
+        <w:spacing w:after="120"/>
+        <w:ind w:left="440"/>
+      </w:pPr>
+    </w:p>
+    <w:p>
+      <w:pPr>
+        <w:pStyle w:val="ListParagraph"/>
+        <w:keepNext/>
+        <w:numPr>
+          <w:ilvl w:val="0"/>
+          <w:numId w:val="2"/>
+        </w:numPr>
+        <w:spacing w:after="0" w:before="120"/>
+      </w:pPr>
+      <w:r>
+        <w:rPr>
+          <w:b/>
+          <w:bCs/>
+        </w:rPr>
+        <w:t xml:space="preserve">Is he employed or self-employed?</w:t>
+      </w:r>
+    </w:p>
+    <w:p>
+      <w:pPr>
+        <w:spacing w:after="120"/>
+        <w:ind w:left="440"/>
+      </w:pPr>
+    </w:p>
+    <w:p>
+      <w:pPr>
+        <w:pStyle w:val="ListParagraph"/>
+        <w:keepNext/>
+        <w:numPr>
+          <w:ilvl w:val="0"/>
+          <w:numId w:val="2"/>
+        </w:numPr>
+        <w:spacing w:after="0" w:before="120"/>
+      </w:pPr>
+      <w:r>
+        <w:rPr>
+          <w:b/>
+          <w:bCs/>
+        </w:rPr>
+        <w:t xml:space="preserve">What are his major responsibilities?</w:t>
+      </w:r>
+    </w:p>
+    <w:p>
+      <w:pPr>
+        <w:spacing w:after="120"/>
+        <w:ind w:left="440"/>
+      </w:pPr>
+    </w:p>
+    <w:p>
+      <w:pPr>
+        <w:pStyle w:val="ListParagraph"/>
+        <w:keepNext/>
+        <w:numPr>
+          <w:ilvl w:val="0"/>
+          <w:numId w:val="2"/>
+        </w:numPr>
+        <w:spacing w:after="0" w:before="120"/>
+      </w:pPr>
+      <w:r>
+        <w:rPr>
+          <w:b/>
+          <w:bCs/>
+        </w:rPr>
+        <w:t xml:space="preserve">What is his daily routine?</w:t>
+      </w:r>
+    </w:p>
+    <w:p>
+      <w:pPr>
+        <w:spacing w:after="120"/>
+        <w:ind w:left="440"/>
+      </w:pPr>
+    </w:p>
+    <w:p>
+      <w:pPr>
+        <w:pStyle w:val="Heading1"/>
+      </w:pPr>
+      <w:r>
+        <w:t xml:space="preserve">PIQ 2 – Father: Farming</w:t>
+      </w:r>
+    </w:p>
+    <w:p>
+      <w:pPr>
+        <w:pStyle w:val="ListParagraph"/>
+        <w:keepNext/>
+        <w:numPr>
+          <w:ilvl w:val="0"/>
+          <w:numId w:val="2"/>
+        </w:numPr>
+        <w:spacing w:after="0" w:before="120"/>
+      </w:pPr>
+      <w:r>
+        <w:rPr>
+          <w:b/>
+          <w:bCs/>
+        </w:rPr>
+        <w:t xml:space="preserve">What crops does your father grow?</w:t>
+      </w:r>
+    </w:p>
+    <w:p>
+      <w:pPr>
+        <w:spacing w:after="120"/>
+        <w:ind w:left="440"/>
+      </w:pPr>
+    </w:p>
+    <w:p>
+      <w:pPr>
+        <w:pStyle w:val="ListParagraph"/>
+        <w:keepNext/>
+        <w:numPr>
+          <w:ilvl w:val="0"/>
+          <w:numId w:val="2"/>
+        </w:numPr>
+        <w:spacing w:after="0" w:before="120"/>
+      </w:pPr>
+      <w:r>
+        <w:rPr>
+          <w:b/>
+          <w:bCs/>
+        </w:rPr>
+        <w:t xml:space="preserve">What is the size of your land?</w:t>
+      </w:r>
+    </w:p>
+    <w:p>
+      <w:pPr>
+        <w:spacing w:after="120"/>
+        <w:ind w:left="440"/>
+      </w:pPr>
+    </w:p>
+    <w:p>
+      <w:pPr>
+        <w:pStyle w:val="ListParagraph"/>
+        <w:keepNext/>
+        <w:numPr>
+          <w:ilvl w:val="0"/>
+          <w:numId w:val="2"/>
+        </w:numPr>
+        <w:spacing w:after="0" w:before="120"/>
+      </w:pPr>
+      <w:r>
+        <w:rPr>
+          <w:b/>
+          <w:bCs/>
+        </w:rPr>
+        <w:t xml:space="preserve">Is the land owned or leased?</w:t>
+      </w:r>
+    </w:p>
+    <w:p>
+      <w:pPr>
+        <w:spacing w:after="120"/>
+        <w:ind w:left="440"/>
+      </w:pPr>
+    </w:p>
+    <w:p>
+      <w:pPr>
+        <w:pStyle w:val="ListParagraph"/>
+        <w:keepNext/>
+        <w:numPr>
+          <w:ilvl w:val="0"/>
+          <w:numId w:val="2"/>
+        </w:numPr>
+        <w:spacing w:after="0" w:before="120"/>
+      </w:pPr>
+      <w:r>
+        <w:rPr>
+          <w:b/>
+          <w:bCs/>
+        </w:rPr>
+        <w:t xml:space="preserve">What is the main source of irrigation?</w:t>
+      </w:r>
+    </w:p>
+    <w:p>
+      <w:pPr>
+        <w:spacing w:after="120"/>
+        <w:ind w:left="440"/>
+      </w:pPr>
+    </w:p>
+    <w:p>
+      <w:pPr>
+        <w:pStyle w:val="ListParagraph"/>
+        <w:keepNext/>
+        <w:numPr>
+          <w:ilvl w:val="0"/>
+          <w:numId w:val="2"/>
+        </w:numPr>
+        <w:spacing w:after="0" w:before="120"/>
+      </w:pPr>
+      <w:r>
+        <w:rPr>
+          <w:b/>
+          <w:bCs/>
+        </w:rPr>
+        <w:t xml:space="preserve">How many crops do you grow in a year?</w:t>
+      </w:r>
+    </w:p>
+    <w:p>
+      <w:pPr>
+        <w:spacing w:after="120"/>
+        <w:ind w:left="440"/>
+      </w:pPr>
+    </w:p>
+    <w:p>
+      <w:pPr>
+        <w:pStyle w:val="ListParagraph"/>
+        <w:keepNext/>
+        <w:numPr>
+          <w:ilvl w:val="0"/>
+          <w:numId w:val="2"/>
+        </w:numPr>
+        <w:spacing w:after="0" w:before="120"/>
+      </w:pPr>
+      <w:r>
+        <w:rPr>
+          <w:b/>
+          <w:bCs/>
+        </w:rPr>
+        <w:t xml:space="preserve">Which crops are grown in which season?</w:t>
+      </w:r>
+    </w:p>
+    <w:p>
+      <w:pPr>
+        <w:spacing w:after="120"/>
+        <w:ind w:left="440"/>
+      </w:pPr>
+    </w:p>
+    <w:p>
+      <w:pPr>
+        <w:pStyle w:val="ListParagraph"/>
+        <w:keepNext/>
+        <w:numPr>
+          <w:ilvl w:val="0"/>
+          <w:numId w:val="2"/>
+        </w:numPr>
+        <w:spacing w:after="0" w:before="120"/>
+      </w:pPr>
+      <w:r>
+        <w:rPr>
+          <w:b/>
+          <w:bCs/>
+        </w:rPr>
+        <w:t xml:space="preserve">What are Kharif, Rabi and Zaid crops?</w:t>
+      </w:r>
+    </w:p>
+    <w:p>
+      <w:pPr>
+        <w:spacing w:after="120"/>
+        <w:ind w:left="440"/>
+      </w:pPr>
+    </w:p>
+    <w:p>
+      <w:pPr>
+        <w:pStyle w:val="ListParagraph"/>
+        <w:keepNext/>
+        <w:numPr>
+          <w:ilvl w:val="0"/>
+          <w:numId w:val="2"/>
+        </w:numPr>
+        <w:spacing w:after="0" w:before="120"/>
+      </w:pPr>
+      <w:r>
+        <w:rPr>
+          <w:b/>
+          <w:bCs/>
+        </w:rPr>
+        <w:t xml:space="preserve">Which crops are common in your region?</w:t>
+      </w:r>
+    </w:p>
+    <w:p>
+      <w:pPr>
+        <w:spacing w:after="120"/>
+        <w:ind w:left="440"/>
+      </w:pPr>
+    </w:p>
+    <w:p>
+      <w:pPr>
+        <w:pStyle w:val="ListParagraph"/>
+        <w:keepNext/>
+        <w:numPr>
+          <w:ilvl w:val="0"/>
+          <w:numId w:val="2"/>
+        </w:numPr>
+        <w:spacing w:after="0" w:before="120"/>
+      </w:pPr>
+      <w:r>
+        <w:rPr>
+          <w:b/>
+          <w:bCs/>
+        </w:rPr>
+        <w:t xml:space="preserve">What decides the choice of crop?</w:t>
+      </w:r>
+    </w:p>
+    <w:p>
+      <w:pPr>
+        <w:spacing w:after="120"/>
+        <w:ind w:left="440"/>
+      </w:pPr>
+    </w:p>
+    <w:p>
+      <w:pPr>
+        <w:pStyle w:val="ListParagraph"/>
+        <w:keepNext/>
+        <w:numPr>
+          <w:ilvl w:val="0"/>
+          <w:numId w:val="2"/>
+        </w:numPr>
+        <w:spacing w:after="0" w:before="120"/>
+      </w:pPr>
+      <w:r>
+        <w:rPr>
+          <w:b/>
+          <w:bCs/>
+        </w:rPr>
+        <w:t xml:space="preserve">What are the major inputs needed for farming?</w:t>
+      </w:r>
+    </w:p>
+    <w:p>
+      <w:pPr>
+        <w:spacing w:after="120"/>
+        <w:ind w:left="440"/>
+      </w:pPr>
+    </w:p>
+    <w:p>
+      <w:pPr>
+        <w:pStyle w:val="ListParagraph"/>
+        <w:keepNext/>
+        <w:numPr>
+          <w:ilvl w:val="0"/>
+          <w:numId w:val="2"/>
+        </w:numPr>
+        <w:spacing w:after="0" w:before="120"/>
+      </w:pPr>
+      <w:r>
+        <w:rPr>
+          <w:b/>
+          <w:bCs/>
+        </w:rPr>
+        <w:t xml:space="preserve">How are fertilisers and pesticides selected?</w:t>
+      </w:r>
+    </w:p>
+    <w:p>
+      <w:pPr>
+        <w:spacing w:after="120"/>
+        <w:ind w:left="440"/>
+      </w:pPr>
+    </w:p>
+    <w:p>
+      <w:pPr>
+        <w:pStyle w:val="ListParagraph"/>
+        <w:keepNext/>
+        <w:numPr>
+          <w:ilvl w:val="0"/>
+          <w:numId w:val="2"/>
+        </w:numPr>
+        <w:spacing w:after="0" w:before="120"/>
+      </w:pPr>
+      <w:r>
+        <w:rPr>
+          <w:b/>
+          <w:bCs/>
+        </w:rPr>
+        <w:t xml:space="preserve">How does weather affect farming?</w:t>
+      </w:r>
+    </w:p>
+    <w:p>
+      <w:pPr>
+        <w:spacing w:after="120"/>
+        <w:ind w:left="440"/>
+      </w:pPr>
+    </w:p>
+    <w:p>
+      <w:pPr>
+        <w:pStyle w:val="ListParagraph"/>
+        <w:keepNext/>
+        <w:numPr>
+          <w:ilvl w:val="0"/>
+          <w:numId w:val="2"/>
+        </w:numPr>
+        <w:spacing w:after="0" w:before="120"/>
+      </w:pPr>
+      <w:r>
+        <w:rPr>
+          <w:b/>
+          <w:bCs/>
+        </w:rPr>
+        <w:t xml:space="preserve">What are the major problems your father faces?</w:t>
+      </w:r>
+    </w:p>
+    <w:p>
+      <w:pPr>
+        <w:spacing w:after="120"/>
+        <w:ind w:left="440"/>
+      </w:pPr>
+    </w:p>
+    <w:p>
+      <w:pPr>
+        <w:pStyle w:val="Heading1"/>
+      </w:pPr>
+      <w:r>
+        <w:t xml:space="preserve">PIQ 2 – Father: Agriculture &amp; Current Affairs</w:t>
+      </w:r>
+    </w:p>
+    <w:p>
+      <w:pPr>
+        <w:pStyle w:val="ListParagraph"/>
+        <w:keepNext/>
+        <w:numPr>
+          <w:ilvl w:val="0"/>
+          <w:numId w:val="2"/>
+        </w:numPr>
+        <w:spacing w:after="0" w:before="120"/>
+      </w:pPr>
+      <w:r>
+        <w:rPr>
+          <w:b/>
+          <w:bCs/>
+        </w:rPr>
+        <w:t xml:space="preserve">What is MSP?</w:t>
+      </w:r>
+    </w:p>
+    <w:p>
+      <w:pPr>
+        <w:spacing w:after="120"/>
+        <w:ind w:left="440"/>
+      </w:pPr>
+    </w:p>
+    <w:p>
+      <w:pPr>
+        <w:pStyle w:val="ListParagraph"/>
+        <w:keepNext/>
+        <w:numPr>
+          <w:ilvl w:val="0"/>
+          <w:numId w:val="2"/>
+        </w:numPr>
+        <w:spacing w:after="0" w:before="120"/>
+      </w:pPr>
+      <w:r>
+        <w:rPr>
+          <w:b/>
+          <w:bCs/>
+        </w:rPr>
+        <w:t xml:space="preserve">Who recommends MSP?</w:t>
+      </w:r>
+    </w:p>
+    <w:p>
+      <w:pPr>
+        <w:spacing w:after="120"/>
+        <w:ind w:left="440"/>
+      </w:pPr>
+    </w:p>
+    <w:p>
+      <w:pPr>
+        <w:pStyle w:val="ListParagraph"/>
+        <w:keepNext/>
+        <w:numPr>
+          <w:ilvl w:val="0"/>
+          <w:numId w:val="2"/>
+        </w:numPr>
+        <w:spacing w:after="0" w:before="120"/>
+      </w:pPr>
+      <w:r>
+        <w:rPr>
+          <w:b/>
+          <w:bCs/>
+        </w:rPr>
+        <w:t xml:space="preserve">Who announces MSP?</w:t>
+      </w:r>
+    </w:p>
+    <w:p>
+      <w:pPr>
+        <w:spacing w:after="120"/>
+        <w:ind w:left="440"/>
+      </w:pPr>
+    </w:p>
+    <w:p>
+      <w:pPr>
+        <w:pStyle w:val="ListParagraph"/>
+        <w:keepNext/>
+        <w:numPr>
+          <w:ilvl w:val="0"/>
+          <w:numId w:val="2"/>
+        </w:numPr>
+        <w:spacing w:after="0" w:before="120"/>
+      </w:pPr>
+      <w:r>
+        <w:rPr>
+          <w:b/>
+          <w:bCs/>
+        </w:rPr>
+        <w:t xml:space="preserve">What is the difference between MSP and market price?</w:t>
+      </w:r>
+    </w:p>
+    <w:p>
+      <w:pPr>
+        <w:spacing w:after="120"/>
+        <w:ind w:left="440"/>
+      </w:pPr>
+    </w:p>
+    <w:p>
+      <w:pPr>
+        <w:pStyle w:val="ListParagraph"/>
+        <w:keepNext/>
+        <w:numPr>
+          <w:ilvl w:val="0"/>
+          <w:numId w:val="2"/>
+        </w:numPr>
+        <w:spacing w:after="0" w:before="120"/>
+      </w:pPr>
+      <w:r>
+        <w:rPr>
+          <w:b/>
+          <w:bCs/>
+        </w:rPr>
+        <w:t xml:space="preserve">What is procurement?</w:t>
+      </w:r>
+    </w:p>
+    <w:p>
+      <w:pPr>
+        <w:spacing w:after="120"/>
+        <w:ind w:left="440"/>
+      </w:pPr>
+    </w:p>
+    <w:p>
+      <w:pPr>
+        <w:pStyle w:val="ListParagraph"/>
+        <w:keepNext/>
+        <w:numPr>
+          <w:ilvl w:val="0"/>
+          <w:numId w:val="2"/>
+        </w:numPr>
+        <w:spacing w:after="0" w:before="120"/>
+      </w:pPr>
+      <w:r>
+        <w:rPr>
+          <w:b/>
+          <w:bCs/>
+        </w:rPr>
+        <w:t xml:space="preserve">What is a mandi?</w:t>
+      </w:r>
+    </w:p>
+    <w:p>
+      <w:pPr>
+        <w:spacing w:after="120"/>
+        <w:ind w:left="440"/>
+      </w:pPr>
+    </w:p>
+    <w:p>
+      <w:pPr>
+        <w:pStyle w:val="ListParagraph"/>
+        <w:keepNext/>
+        <w:numPr>
+          <w:ilvl w:val="0"/>
+          <w:numId w:val="2"/>
+        </w:numPr>
+        <w:spacing w:after="0" w:before="120"/>
+      </w:pPr>
+      <w:r>
+        <w:rPr>
+          <w:b/>
+          <w:bCs/>
+        </w:rPr>
+        <w:t xml:space="preserve">What is e-NAM?</w:t>
+      </w:r>
+    </w:p>
+    <w:p>
+      <w:pPr>
+        <w:spacing w:after="120"/>
+        <w:ind w:left="440"/>
+      </w:pPr>
+    </w:p>
+    <w:p>
+      <w:pPr>
+        <w:pStyle w:val="ListParagraph"/>
+        <w:keepNext/>
+        <w:numPr>
+          <w:ilvl w:val="0"/>
+          <w:numId w:val="2"/>
+        </w:numPr>
+        <w:spacing w:after="0" w:before="120"/>
+      </w:pPr>
+      <w:r>
+        <w:rPr>
+          <w:b/>
+          <w:bCs/>
+        </w:rPr>
+        <w:t xml:space="preserve">What is PM-KISAN?</w:t>
+      </w:r>
+    </w:p>
+    <w:p>
+      <w:pPr>
+        <w:spacing w:after="120"/>
+        <w:ind w:left="440"/>
+      </w:pPr>
+    </w:p>
+    <w:p>
+      <w:pPr>
+        <w:pStyle w:val="ListParagraph"/>
+        <w:keepNext/>
+        <w:numPr>
+          <w:ilvl w:val="0"/>
+          <w:numId w:val="2"/>
+        </w:numPr>
+        <w:spacing w:after="0" w:before="120"/>
+      </w:pPr>
+      <w:r>
+        <w:rPr>
+          <w:b/>
+          <w:bCs/>
+        </w:rPr>
+        <w:t xml:space="preserve">What is crop insurance?</w:t>
+      </w:r>
+    </w:p>
+    <w:p>
+      <w:pPr>
+        <w:spacing w:after="120"/>
+        <w:ind w:left="440"/>
+      </w:pPr>
+    </w:p>
+    <w:p>
+      <w:pPr>
+        <w:pStyle w:val="ListParagraph"/>
+        <w:keepNext/>
+        <w:numPr>
+          <w:ilvl w:val="0"/>
+          <w:numId w:val="2"/>
+        </w:numPr>
+        <w:spacing w:after="0" w:before="120"/>
+      </w:pPr>
+      <w:r>
+        <w:rPr>
+          <w:b/>
+          <w:bCs/>
+        </w:rPr>
+        <w:t xml:space="preserve">What is PMFBY?</w:t>
+      </w:r>
+    </w:p>
+    <w:p>
+      <w:pPr>
+        <w:spacing w:after="120"/>
+        <w:ind w:left="440"/>
+      </w:pPr>
+    </w:p>
+    <w:p>
+      <w:pPr>
+        <w:pStyle w:val="ListParagraph"/>
+        <w:keepNext/>
+        <w:numPr>
+          <w:ilvl w:val="0"/>
+          <w:numId w:val="2"/>
+        </w:numPr>
+        <w:spacing w:after="0" w:before="120"/>
+      </w:pPr>
+      <w:r>
+        <w:rPr>
+          <w:b/>
+          <w:bCs/>
+        </w:rPr>
+        <w:t xml:space="preserve">What are agricultural subsidies?</w:t>
+      </w:r>
+    </w:p>
+    <w:p>
+      <w:pPr>
+        <w:spacing w:after="120"/>
+        <w:ind w:left="440"/>
+      </w:pPr>
+    </w:p>
+    <w:p>
+      <w:pPr>
+        <w:pStyle w:val="ListParagraph"/>
+        <w:keepNext/>
+        <w:numPr>
+          <w:ilvl w:val="0"/>
+          <w:numId w:val="2"/>
+        </w:numPr>
+        <w:spacing w:after="0" w:before="120"/>
+      </w:pPr>
+      <w:r>
+        <w:rPr>
+          <w:b/>
+          <w:bCs/>
+        </w:rPr>
+        <w:t xml:space="preserve">What is irrigation efficiency?</w:t>
+      </w:r>
+    </w:p>
+    <w:p>
+      <w:pPr>
+        <w:spacing w:after="120"/>
+        <w:ind w:left="440"/>
+      </w:pPr>
+    </w:p>
+    <w:p>
+      <w:pPr>
+        <w:pStyle w:val="ListParagraph"/>
+        <w:keepNext/>
+        <w:numPr>
+          <w:ilvl w:val="0"/>
+          <w:numId w:val="2"/>
+        </w:numPr>
+        <w:spacing w:after="0" w:before="120"/>
+      </w:pPr>
+      <w:r>
+        <w:rPr>
+          <w:b/>
+          <w:bCs/>
+        </w:rPr>
+        <w:t xml:space="preserve">What is drip irrigation?</w:t>
+      </w:r>
+    </w:p>
+    <w:p>
+      <w:pPr>
+        <w:spacing w:after="120"/>
+        <w:ind w:left="440"/>
+      </w:pPr>
+    </w:p>
+    <w:p>
+      <w:pPr>
+        <w:pStyle w:val="ListParagraph"/>
+        <w:keepNext/>
+        <w:numPr>
+          <w:ilvl w:val="0"/>
+          <w:numId w:val="2"/>
+        </w:numPr>
+        <w:spacing w:after="0" w:before="120"/>
+      </w:pPr>
+      <w:r>
+        <w:rPr>
+          <w:b/>
+          <w:bCs/>
+        </w:rPr>
+        <w:t xml:space="preserve">What is agricultural mechanisation?</w:t>
+      </w:r>
+    </w:p>
+    <w:p>
+      <w:pPr>
+        <w:spacing w:after="120"/>
+        <w:ind w:left="440"/>
+      </w:pPr>
+    </w:p>
+    <w:p>
+      <w:pPr>
+        <w:pStyle w:val="ListParagraph"/>
+        <w:keepNext/>
+        <w:numPr>
+          <w:ilvl w:val="0"/>
+          <w:numId w:val="2"/>
+        </w:numPr>
+        <w:spacing w:after="0" w:before="120"/>
+      </w:pPr>
+      <w:r>
+        <w:rPr>
+          <w:b/>
+          <w:bCs/>
+        </w:rPr>
+        <w:t xml:space="preserve">How can technology improve farming?</w:t>
+      </w:r>
+    </w:p>
+    <w:p>
+      <w:pPr>
+        <w:spacing w:after="120"/>
+        <w:ind w:left="440"/>
+      </w:pPr>
+    </w:p>
+    <w:p>
+      <w:pPr>
+        <w:pStyle w:val="ListParagraph"/>
+        <w:keepNext/>
+        <w:numPr>
+          <w:ilvl w:val="0"/>
+          <w:numId w:val="2"/>
+        </w:numPr>
+        <w:spacing w:after="0" w:before="120"/>
+      </w:pPr>
+      <w:r>
+        <w:rPr>
+          <w:b/>
+          <w:bCs/>
+        </w:rPr>
+        <w:t xml:space="preserve">What are the major challenges facing Indian agriculture?</w:t>
+      </w:r>
+    </w:p>
+    <w:p>
+      <w:pPr>
+        <w:spacing w:after="120"/>
+        <w:ind w:left="440"/>
+      </w:pPr>
+    </w:p>
+    <w:p>
+      <w:pPr>
+        <w:pStyle w:val="Heading1"/>
+      </w:pPr>
+      <w:r>
+        <w:t xml:space="preserve">PIQ 2 – Father: Personal</w:t>
+      </w:r>
+    </w:p>
+    <w:p>
+      <w:pPr>
+        <w:pStyle w:val="ListParagraph"/>
+        <w:keepNext/>
+        <w:numPr>
+          <w:ilvl w:val="0"/>
+          <w:numId w:val="2"/>
+        </w:numPr>
+        <w:spacing w:after="0" w:before="120"/>
+      </w:pPr>
+      <w:r>
+        <w:rPr>
+          <w:b/>
+          <w:bCs/>
+        </w:rPr>
+        <w:t xml:space="preserve">How close are you to your father?</w:t>
+      </w:r>
+    </w:p>
+    <w:p>
+      <w:pPr>
+        <w:spacing w:after="120"/>
+        <w:ind w:left="440"/>
+      </w:pPr>
+    </w:p>
+    <w:p>
+      <w:pPr>
+        <w:pStyle w:val="ListParagraph"/>
+        <w:keepNext/>
+        <w:numPr>
+          <w:ilvl w:val="0"/>
+          <w:numId w:val="2"/>
+        </w:numPr>
+        <w:spacing w:after="0" w:before="120"/>
+      </w:pPr>
+      <w:r>
+        <w:rPr>
+          <w:b/>
+          <w:bCs/>
+        </w:rPr>
+        <w:t xml:space="preserve">What have you learned from him?</w:t>
+      </w:r>
+    </w:p>
+    <w:p>
+      <w:pPr>
+        <w:spacing w:after="120"/>
+        <w:ind w:left="440"/>
+      </w:pPr>
+    </w:p>
+    <w:p>
+      <w:pPr>
+        <w:pStyle w:val="ListParagraph"/>
+        <w:keepNext/>
+        <w:numPr>
+          <w:ilvl w:val="0"/>
+          <w:numId w:val="2"/>
+        </w:numPr>
+        <w:spacing w:after="0" w:before="120"/>
+      </w:pPr>
+      <w:r>
+        <w:rPr>
+          <w:b/>
+          <w:bCs/>
+        </w:rPr>
+        <w:t xml:space="preserve">What is one quality you admire in him?</w:t>
+      </w:r>
+    </w:p>
+    <w:p>
+      <w:pPr>
+        <w:spacing w:after="120"/>
+        <w:ind w:left="440"/>
+      </w:pPr>
+    </w:p>
+    <w:p>
+      <w:pPr>
+        <w:pStyle w:val="ListParagraph"/>
+        <w:keepNext/>
+        <w:numPr>
+          <w:ilvl w:val="0"/>
+          <w:numId w:val="2"/>
+        </w:numPr>
+        <w:spacing w:after="0" w:before="120"/>
+      </w:pPr>
+      <w:r>
+        <w:rPr>
+          <w:b/>
+          <w:bCs/>
+        </w:rPr>
+        <w:t xml:space="preserve">What is one thing you disagree with him about?</w:t>
+      </w:r>
+    </w:p>
+    <w:p>
+      <w:pPr>
+        <w:spacing w:after="120"/>
+        <w:ind w:left="440"/>
+      </w:pPr>
+    </w:p>
+    <w:p>
+      <w:pPr>
+        <w:pStyle w:val="ListParagraph"/>
+        <w:keepNext/>
+        <w:numPr>
+          <w:ilvl w:val="0"/>
+          <w:numId w:val="2"/>
+        </w:numPr>
+        <w:spacing w:after="0" w:before="120"/>
+      </w:pPr>
+      <w:r>
+        <w:rPr>
+          <w:b/>
+          <w:bCs/>
+        </w:rPr>
+        <w:t xml:space="preserve">Have you ever helped your father in farming?</w:t>
+      </w:r>
+    </w:p>
+    <w:p>
+      <w:pPr>
+        <w:spacing w:after="120"/>
+        <w:ind w:left="440"/>
+      </w:pPr>
+    </w:p>
+    <w:p>
+      <w:pPr>
+        <w:pStyle w:val="ListParagraph"/>
+        <w:keepNext/>
+        <w:numPr>
+          <w:ilvl w:val="0"/>
+          <w:numId w:val="2"/>
+        </w:numPr>
+        <w:spacing w:after="0" w:before="120"/>
+      </w:pPr>
+      <w:r>
+        <w:rPr>
+          <w:b/>
+          <w:bCs/>
+        </w:rPr>
+        <w:t xml:space="preserve">What have you learned from helping him?</w:t>
+      </w:r>
+    </w:p>
+    <w:p>
+      <w:pPr>
+        <w:spacing w:after="120"/>
+        <w:ind w:left="440"/>
+      </w:pPr>
+    </w:p>
+    <w:p>
+      <w:pPr>
+        <w:pStyle w:val="ListParagraph"/>
+        <w:keepNext/>
+        <w:numPr>
+          <w:ilvl w:val="0"/>
+          <w:numId w:val="2"/>
+        </w:numPr>
+        <w:spacing w:after="0" w:before="120"/>
+      </w:pPr>
+      <w:r>
+        <w:rPr>
+          <w:b/>
+          <w:bCs/>
+        </w:rPr>
+        <w:t xml:space="preserve">Does your father support your decision to join the Armed Forces?</w:t>
+      </w:r>
+    </w:p>
+    <w:p>
+      <w:pPr>
+        <w:spacing w:after="120"/>
+        <w:ind w:left="440"/>
+      </w:pPr>
+    </w:p>
+    <w:p>
+      <w:pPr>
+        <w:pStyle w:val="ListParagraph"/>
+        <w:keepNext/>
+        <w:numPr>
+          <w:ilvl w:val="0"/>
+          <w:numId w:val="2"/>
+        </w:numPr>
+        <w:spacing w:after="0" w:before="120"/>
+      </w:pPr>
+      <w:r>
+        <w:rPr>
+          <w:b/>
+          <w:bCs/>
+        </w:rPr>
+        <w:t xml:space="preserve">What does your father expect from you?</w:t>
+      </w:r>
+    </w:p>
+    <w:p>
+      <w:pPr>
+        <w:spacing w:after="120"/>
+        <w:ind w:left="440"/>
+      </w:pPr>
+    </w:p>
+    <w:p>
+      <w:pPr>
+        <w:pStyle w:val="ListParagraph"/>
+        <w:keepNext/>
+        <w:numPr>
+          <w:ilvl w:val="0"/>
+          <w:numId w:val="2"/>
+        </w:numPr>
+        <w:spacing w:after="0" w:before="120"/>
+      </w:pPr>
+      <w:r>
+        <w:rPr>
+          <w:b/>
+          <w:bCs/>
+        </w:rPr>
+        <w:t xml:space="preserve">How has your father's profession influenced you?</w:t>
+      </w:r>
+    </w:p>
+    <w:p>
+      <w:pPr>
+        <w:spacing w:after="120"/>
+        <w:ind w:left="440"/>
+      </w:pPr>
+    </w:p>
+    <w:p>
+      <w:pPr>
+        <w:pStyle w:val="ListParagraph"/>
+        <w:keepNext/>
+        <w:numPr>
+          <w:ilvl w:val="0"/>
+          <w:numId w:val="2"/>
+        </w:numPr>
+        <w:spacing w:after="0" w:before="120"/>
+      </w:pPr>
+      <w:r>
+        <w:rPr>
+          <w:b/>
+          <w:bCs/>
+        </w:rPr>
+        <w:t xml:space="preserve">How will the qualities you learned from your father help you as an officer?</w:t>
+      </w:r>
+    </w:p>
+    <w:p>
+      <w:pPr>
+        <w:spacing w:after="120"/>
+        <w:ind w:left="440"/>
+      </w:pPr>
+    </w:p>
+    <w:p>
+      <w:pPr>
+        <w:pStyle w:val="Heading1"/>
+      </w:pPr>
+      <w:r>
+        <w:t xml:space="preserve">PIQ 2 – Father: Career Comparison</w:t>
+      </w:r>
+    </w:p>
+    <w:p>
+      <w:pPr>
+        <w:pStyle w:val="ListParagraph"/>
+        <w:keepNext/>
+        <w:numPr>
+          <w:ilvl w:val="0"/>
+          <w:numId w:val="2"/>
+        </w:numPr>
+        <w:spacing w:after="0" w:before="120"/>
+      </w:pPr>
+      <w:r>
+        <w:rPr>
+          <w:b/>
+          <w:bCs/>
+        </w:rPr>
+        <w:t xml:space="preserve">Your father is a farmer. Why did you choose engineering?</w:t>
+      </w:r>
+    </w:p>
+    <w:p>
+      <w:pPr>
+        <w:spacing w:after="120"/>
+        <w:ind w:left="440"/>
+      </w:pPr>
+    </w:p>
+    <w:p>
+      <w:pPr>
+        <w:pStyle w:val="ListParagraph"/>
+        <w:keepNext/>
+        <w:numPr>
+          <w:ilvl w:val="0"/>
+          <w:numId w:val="2"/>
+        </w:numPr>
+        <w:spacing w:after="0" w:before="120"/>
+      </w:pPr>
+      <w:r>
+        <w:rPr>
+          <w:b/>
+          <w:bCs/>
+        </w:rPr>
+        <w:t xml:space="preserve">Why didn't you choose agriculture?</w:t>
+      </w:r>
+    </w:p>
+    <w:p>
+      <w:pPr>
+        <w:spacing w:after="120"/>
+        <w:ind w:left="440"/>
+      </w:pPr>
+    </w:p>
+    <w:p>
+      <w:pPr>
+        <w:pStyle w:val="ListParagraph"/>
+        <w:keepNext/>
+        <w:numPr>
+          <w:ilvl w:val="0"/>
+          <w:numId w:val="2"/>
+        </w:numPr>
+        <w:spacing w:after="0" w:before="120"/>
+      </w:pPr>
+      <w:r>
+        <w:rPr>
+          <w:b/>
+          <w:bCs/>
+        </w:rPr>
+        <w:t xml:space="preserve">Why did you choose a corporate career?</w:t>
+      </w:r>
+    </w:p>
+    <w:p>
+      <w:pPr>
+        <w:spacing w:after="120"/>
+        <w:ind w:left="440"/>
+      </w:pPr>
+    </w:p>
+    <w:p>
+      <w:pPr>
+        <w:pStyle w:val="ListParagraph"/>
+        <w:keepNext/>
+        <w:numPr>
+          <w:ilvl w:val="0"/>
+          <w:numId w:val="2"/>
+        </w:numPr>
+        <w:spacing w:after="0" w:before="120"/>
+      </w:pPr>
+      <w:r>
+        <w:rPr>
+          <w:b/>
+          <w:bCs/>
+        </w:rPr>
+        <w:t xml:space="preserve">Your father works in agriculture and you work in IT. What is common between the two fields?</w:t>
+      </w:r>
+    </w:p>
+    <w:p>
+      <w:pPr>
+        <w:spacing w:after="120"/>
+        <w:ind w:left="440"/>
+      </w:pPr>
+    </w:p>
+    <w:p>
+      <w:pPr>
+        <w:pStyle w:val="ListParagraph"/>
+        <w:keepNext/>
+        <w:numPr>
+          <w:ilvl w:val="0"/>
+          <w:numId w:val="2"/>
+        </w:numPr>
+        <w:spacing w:after="0" w:before="120"/>
+      </w:pPr>
+      <w:r>
+        <w:rPr>
+          <w:b/>
+          <w:bCs/>
+        </w:rPr>
+        <w:t xml:space="preserve">What have you learned from your father's profession that helps you at work?</w:t>
+      </w:r>
+    </w:p>
+    <w:p>
+      <w:pPr>
+        <w:spacing w:after="120"/>
+        <w:ind w:left="440"/>
+      </w:pPr>
+    </w:p>
+    <w:p>
+      <w:pPr>
+        <w:pStyle w:val="ListParagraph"/>
+        <w:keepNext/>
+        <w:numPr>
+          <w:ilvl w:val="0"/>
+          <w:numId w:val="2"/>
+        </w:numPr>
+        <w:spacing w:after="0" w:before="120"/>
+      </w:pPr>
+      <w:r>
+        <w:rPr>
+          <w:b/>
+          <w:bCs/>
+        </w:rPr>
+        <w:t xml:space="preserve">If you don't get selected for the Armed Forces, what will you do?</w:t>
+      </w:r>
+    </w:p>
+    <w:p>
+      <w:pPr>
+        <w:spacing w:after="120"/>
+        <w:ind w:left="440"/>
+      </w:pPr>
+    </w:p>
+    <w:p>
+      <w:pPr>
+        <w:pStyle w:val="Heading1"/>
+      </w:pPr>
+      <w:r>
+        <w:t xml:space="preserve">PIQ 2 – Father: Family Responsibility</w:t>
+      </w:r>
+    </w:p>
+    <w:p>
+      <w:pPr>
+        <w:pStyle w:val="ListParagraph"/>
+        <w:keepNext/>
+        <w:numPr>
+          <w:ilvl w:val="0"/>
+          <w:numId w:val="2"/>
+        </w:numPr>
+        <w:spacing w:after="0" w:before="120"/>
+      </w:pPr>
+      <w:r>
+        <w:rPr>
+          <w:b/>
+          <w:bCs/>
+        </w:rPr>
+        <w:t xml:space="preserve">What responsibilities do you have toward your family?</w:t>
+      </w:r>
+    </w:p>
+    <w:p>
+      <w:pPr>
+        <w:spacing w:after="120"/>
+        <w:ind w:left="440"/>
+      </w:pPr>
+    </w:p>
+    <w:p>
+      <w:pPr>
+        <w:pStyle w:val="ListParagraph"/>
+        <w:keepNext/>
+        <w:numPr>
+          <w:ilvl w:val="0"/>
+          <w:numId w:val="2"/>
+        </w:numPr>
+        <w:spacing w:after="0" w:before="120"/>
+      </w:pPr>
+      <w:r>
+        <w:rPr>
+          <w:b/>
+          <w:bCs/>
+        </w:rPr>
+        <w:t xml:space="preserve">Do you contribute financially?</w:t>
+      </w:r>
+    </w:p>
+    <w:p>
+      <w:pPr>
+        <w:spacing w:after="120"/>
+        <w:ind w:left="440"/>
+      </w:pPr>
+    </w:p>
+    <w:p>
+      <w:pPr>
+        <w:pStyle w:val="ListParagraph"/>
+        <w:keepNext/>
+        <w:numPr>
+          <w:ilvl w:val="0"/>
+          <w:numId w:val="2"/>
+        </w:numPr>
+        <w:spacing w:after="0" w:before="120"/>
+      </w:pPr>
+      <w:r>
+        <w:rPr>
+          <w:b/>
+          <w:bCs/>
+        </w:rPr>
+        <w:t xml:space="preserve">What household responsibilities do you handle?</w:t>
+      </w:r>
+    </w:p>
+    <w:p>
+      <w:pPr>
+        <w:spacing w:after="120"/>
+        <w:ind w:left="440"/>
+      </w:pPr>
+    </w:p>
+    <w:p>
+      <w:pPr>
+        <w:pStyle w:val="ListParagraph"/>
+        <w:keepNext/>
+        <w:numPr>
+          <w:ilvl w:val="0"/>
+          <w:numId w:val="2"/>
+        </w:numPr>
+        <w:spacing w:after="0" w:before="120"/>
+      </w:pPr>
+      <w:r>
+        <w:rPr>
+          <w:b/>
+          <w:bCs/>
+        </w:rPr>
+        <w:t xml:space="preserve">Have you ever taken an important decision for your family?</w:t>
+      </w:r>
+    </w:p>
+    <w:p>
+      <w:pPr>
+        <w:spacing w:after="120"/>
+        <w:ind w:left="440"/>
+      </w:pPr>
+    </w:p>
+    <w:p>
+      <w:pPr>
+        <w:pStyle w:val="ListParagraph"/>
+        <w:keepNext/>
+        <w:numPr>
+          <w:ilvl w:val="0"/>
+          <w:numId w:val="2"/>
+        </w:numPr>
+        <w:spacing w:after="0" w:before="120"/>
+      </w:pPr>
+      <w:r>
+        <w:rPr>
+          <w:b/>
+          <w:bCs/>
+        </w:rPr>
+        <w:t xml:space="preserve">Tell me about a time your father depended on you.</w:t>
+      </w:r>
+    </w:p>
+    <w:p>
+      <w:pPr>
+        <w:spacing w:after="120"/>
+        <w:ind w:left="440"/>
+      </w:pPr>
+    </w:p>
+    <w:p>
+      <w:pPr>
+        <w:pStyle w:val="ListParagraph"/>
+        <w:keepNext/>
+        <w:numPr>
+          <w:ilvl w:val="0"/>
+          <w:numId w:val="2"/>
+        </w:numPr>
+        <w:spacing w:after="0" w:before="120"/>
+      </w:pPr>
+      <w:r>
+        <w:rPr>
+          <w:b/>
+          <w:bCs/>
+        </w:rPr>
+        <w:t xml:space="preserve">If your father needs help while you are posted away, what will you do?</w:t>
       </w:r>
     </w:p>
     <w:p>

</xml_diff>

<commit_message>
Add PIQ 3 (Mother) questions to SSB question sheet
Co-Authored-By: Claude Opus 5.5 <noreply@anthropic.com>
Claude-Session: https://claude.ai/code/session_01TypcejD48cCyAqfjtUUit5
</commit_message>
<xml_diff>
--- a/SSB_Question_Sheet.docx
+++ b/SSB_Question_Sheet.docx
@@ -2444,6 +2444,1254 @@
           <w:bCs/>
         </w:rPr>
         <w:t xml:space="preserve">If your father needs help while you are posted away, what will you do?</w:t>
+      </w:r>
+    </w:p>
+    <w:p>
+      <w:pPr>
+        <w:spacing w:after="120"/>
+        <w:ind w:left="440"/>
+      </w:pPr>
+    </w:p>
+    <w:p>
+      <w:pPr>
+        <w:pStyle w:val="Heading1"/>
+      </w:pPr>
+      <w:r>
+        <w:t xml:space="preserve">PIQ 3 – Mother</w:t>
+      </w:r>
+    </w:p>
+    <w:p>
+      <w:pPr>
+        <w:pStyle w:val="ListParagraph"/>
+        <w:keepNext/>
+        <w:numPr>
+          <w:ilvl w:val="0"/>
+          <w:numId w:val="2"/>
+        </w:numPr>
+        <w:spacing w:after="0" w:before="120"/>
+      </w:pPr>
+      <w:r>
+        <w:rPr>
+          <w:b/>
+          <w:bCs/>
+        </w:rPr>
+        <w:t xml:space="preserve">What is your mother's name?</w:t>
+      </w:r>
+    </w:p>
+    <w:p>
+      <w:pPr>
+        <w:spacing w:after="120"/>
+        <w:ind w:left="440"/>
+      </w:pPr>
+    </w:p>
+    <w:p>
+      <w:pPr>
+        <w:pStyle w:val="ListParagraph"/>
+        <w:keepNext/>
+        <w:numPr>
+          <w:ilvl w:val="0"/>
+          <w:numId w:val="2"/>
+        </w:numPr>
+        <w:spacing w:after="0" w:before="120"/>
+      </w:pPr>
+      <w:r>
+        <w:rPr>
+          <w:b/>
+          <w:bCs/>
+        </w:rPr>
+        <w:t xml:space="preserve">How old is your mother?</w:t>
+      </w:r>
+    </w:p>
+    <w:p>
+      <w:pPr>
+        <w:spacing w:after="120"/>
+        <w:ind w:left="440"/>
+      </w:pPr>
+    </w:p>
+    <w:p>
+      <w:pPr>
+        <w:pStyle w:val="ListParagraph"/>
+        <w:keepNext/>
+        <w:numPr>
+          <w:ilvl w:val="0"/>
+          <w:numId w:val="2"/>
+        </w:numPr>
+        <w:spacing w:after="0" w:before="120"/>
+      </w:pPr>
+      <w:r>
+        <w:rPr>
+          <w:b/>
+          <w:bCs/>
+        </w:rPr>
+        <w:t xml:space="preserve">What is her educational qualification?</w:t>
+      </w:r>
+    </w:p>
+    <w:p>
+      <w:pPr>
+        <w:spacing w:after="120"/>
+        <w:ind w:left="440"/>
+      </w:pPr>
+    </w:p>
+    <w:p>
+      <w:pPr>
+        <w:pStyle w:val="ListParagraph"/>
+        <w:keepNext/>
+        <w:numPr>
+          <w:ilvl w:val="0"/>
+          <w:numId w:val="2"/>
+        </w:numPr>
+        <w:spacing w:after="0" w:before="120"/>
+      </w:pPr>
+      <w:r>
+        <w:rPr>
+          <w:b/>
+          <w:bCs/>
+        </w:rPr>
+        <w:t xml:space="preserve">What is her designation?</w:t>
+      </w:r>
+    </w:p>
+    <w:p>
+      <w:pPr>
+        <w:spacing w:after="120"/>
+        <w:ind w:left="440"/>
+      </w:pPr>
+    </w:p>
+    <w:p>
+      <w:pPr>
+        <w:pStyle w:val="ListParagraph"/>
+        <w:keepNext/>
+        <w:numPr>
+          <w:ilvl w:val="0"/>
+          <w:numId w:val="2"/>
+        </w:numPr>
+        <w:spacing w:after="0" w:before="120"/>
+      </w:pPr>
+      <w:r>
+        <w:rPr>
+          <w:b/>
+          <w:bCs/>
+        </w:rPr>
+        <w:t xml:space="preserve">In which school does she work?</w:t>
+      </w:r>
+    </w:p>
+    <w:p>
+      <w:pPr>
+        <w:spacing w:after="120"/>
+        <w:ind w:left="440"/>
+      </w:pPr>
+    </w:p>
+    <w:p>
+      <w:pPr>
+        <w:pStyle w:val="ListParagraph"/>
+        <w:keepNext/>
+        <w:numPr>
+          <w:ilvl w:val="0"/>
+          <w:numId w:val="2"/>
+        </w:numPr>
+        <w:spacing w:after="0" w:before="120"/>
+      </w:pPr>
+      <w:r>
+        <w:rPr>
+          <w:b/>
+          <w:bCs/>
+        </w:rPr>
+        <w:t xml:space="preserve">How long has she been working?</w:t>
+      </w:r>
+    </w:p>
+    <w:p>
+      <w:pPr>
+        <w:spacing w:after="120"/>
+        <w:ind w:left="440"/>
+      </w:pPr>
+    </w:p>
+    <w:p>
+      <w:pPr>
+        <w:pStyle w:val="ListParagraph"/>
+        <w:keepNext/>
+        <w:numPr>
+          <w:ilvl w:val="0"/>
+          <w:numId w:val="2"/>
+        </w:numPr>
+        <w:spacing w:after="0" w:before="120"/>
+      </w:pPr>
+      <w:r>
+        <w:rPr>
+          <w:b/>
+          <w:bCs/>
+        </w:rPr>
+        <w:t xml:space="preserve">What are her main responsibilities?</w:t>
+      </w:r>
+    </w:p>
+    <w:p>
+      <w:pPr>
+        <w:spacing w:after="120"/>
+        <w:ind w:left="440"/>
+      </w:pPr>
+    </w:p>
+    <w:p>
+      <w:pPr>
+        <w:pStyle w:val="ListParagraph"/>
+        <w:keepNext/>
+        <w:numPr>
+          <w:ilvl w:val="0"/>
+          <w:numId w:val="2"/>
+        </w:numPr>
+        <w:spacing w:after="0" w:before="120"/>
+      </w:pPr>
+      <w:r>
+        <w:rPr>
+          <w:b/>
+          <w:bCs/>
+        </w:rPr>
+        <w:t xml:space="preserve">What is her daily routine?</w:t>
+      </w:r>
+    </w:p>
+    <w:p>
+      <w:pPr>
+        <w:spacing w:after="120"/>
+        <w:ind w:left="440"/>
+      </w:pPr>
+    </w:p>
+    <w:p>
+      <w:pPr>
+        <w:pStyle w:val="ListParagraph"/>
+        <w:keepNext/>
+        <w:numPr>
+          <w:ilvl w:val="0"/>
+          <w:numId w:val="2"/>
+        </w:numPr>
+        <w:spacing w:after="0" w:before="120"/>
+      </w:pPr>
+      <w:r>
+        <w:rPr>
+          <w:b/>
+          <w:bCs/>
+        </w:rPr>
+        <w:t xml:space="preserve">What are her interests and hobbies?</w:t>
+      </w:r>
+    </w:p>
+    <w:p>
+      <w:pPr>
+        <w:spacing w:after="120"/>
+        <w:ind w:left="440"/>
+      </w:pPr>
+    </w:p>
+    <w:p>
+      <w:pPr>
+        <w:pStyle w:val="Heading1"/>
+      </w:pPr>
+      <w:r>
+        <w:t xml:space="preserve">PIQ 3 – Mother: Teaching</w:t>
+      </w:r>
+    </w:p>
+    <w:p>
+      <w:pPr>
+        <w:pStyle w:val="ListParagraph"/>
+        <w:keepNext/>
+        <w:numPr>
+          <w:ilvl w:val="0"/>
+          <w:numId w:val="2"/>
+        </w:numPr>
+        <w:spacing w:after="0" w:before="120"/>
+      </w:pPr>
+      <w:r>
+        <w:rPr>
+          <w:b/>
+          <w:bCs/>
+        </w:rPr>
+        <w:t xml:space="preserve">Which subject does your mother teach?</w:t>
+      </w:r>
+    </w:p>
+    <w:p>
+      <w:pPr>
+        <w:spacing w:after="120"/>
+        <w:ind w:left="440"/>
+      </w:pPr>
+    </w:p>
+    <w:p>
+      <w:pPr>
+        <w:pStyle w:val="ListParagraph"/>
+        <w:keepNext/>
+        <w:numPr>
+          <w:ilvl w:val="0"/>
+          <w:numId w:val="2"/>
+        </w:numPr>
+        <w:spacing w:after="0" w:before="120"/>
+      </w:pPr>
+      <w:r>
+        <w:rPr>
+          <w:b/>
+          <w:bCs/>
+        </w:rPr>
+        <w:t xml:space="preserve">Which classes does she teach?</w:t>
+      </w:r>
+    </w:p>
+    <w:p>
+      <w:pPr>
+        <w:spacing w:after="120"/>
+        <w:ind w:left="440"/>
+      </w:pPr>
+    </w:p>
+    <w:p>
+      <w:pPr>
+        <w:pStyle w:val="ListParagraph"/>
+        <w:keepNext/>
+        <w:numPr>
+          <w:ilvl w:val="0"/>
+          <w:numId w:val="2"/>
+        </w:numPr>
+        <w:spacing w:after="0" w:before="120"/>
+      </w:pPr>
+      <w:r>
+        <w:rPr>
+          <w:b/>
+          <w:bCs/>
+        </w:rPr>
+        <w:t xml:space="preserve">Is it a government school?</w:t>
+      </w:r>
+    </w:p>
+    <w:p>
+      <w:pPr>
+        <w:spacing w:after="120"/>
+        <w:ind w:left="440"/>
+      </w:pPr>
+    </w:p>
+    <w:p>
+      <w:pPr>
+        <w:pStyle w:val="ListParagraph"/>
+        <w:keepNext/>
+        <w:numPr>
+          <w:ilvl w:val="0"/>
+          <w:numId w:val="2"/>
+        </w:numPr>
+        <w:spacing w:after="0" w:before="120"/>
+      </w:pPr>
+      <w:r>
+        <w:rPr>
+          <w:b/>
+          <w:bCs/>
+        </w:rPr>
+        <w:t xml:space="preserve">What are the major responsibilities of a teacher?</w:t>
+      </w:r>
+    </w:p>
+    <w:p>
+      <w:pPr>
+        <w:spacing w:after="120"/>
+        <w:ind w:left="440"/>
+      </w:pPr>
+    </w:p>
+    <w:p>
+      <w:pPr>
+        <w:pStyle w:val="ListParagraph"/>
+        <w:keepNext/>
+        <w:numPr>
+          <w:ilvl w:val="0"/>
+          <w:numId w:val="2"/>
+        </w:numPr>
+        <w:spacing w:after="0" w:before="120"/>
+      </w:pPr>
+      <w:r>
+        <w:rPr>
+          <w:b/>
+          <w:bCs/>
+        </w:rPr>
+        <w:t xml:space="preserve">What challenges do government school teachers face?</w:t>
+      </w:r>
+    </w:p>
+    <w:p>
+      <w:pPr>
+        <w:spacing w:after="120"/>
+        <w:ind w:left="440"/>
+      </w:pPr>
+    </w:p>
+    <w:p>
+      <w:pPr>
+        <w:pStyle w:val="ListParagraph"/>
+        <w:keepNext/>
+        <w:numPr>
+          <w:ilvl w:val="0"/>
+          <w:numId w:val="2"/>
+        </w:numPr>
+        <w:spacing w:after="0" w:before="120"/>
+      </w:pPr>
+      <w:r>
+        <w:rPr>
+          <w:b/>
+          <w:bCs/>
+        </w:rPr>
+        <w:t xml:space="preserve">What makes a good teacher?</w:t>
+      </w:r>
+    </w:p>
+    <w:p>
+      <w:pPr>
+        <w:spacing w:after="120"/>
+        <w:ind w:left="440"/>
+      </w:pPr>
+    </w:p>
+    <w:p>
+      <w:pPr>
+        <w:pStyle w:val="ListParagraph"/>
+        <w:keepNext/>
+        <w:numPr>
+          <w:ilvl w:val="0"/>
+          <w:numId w:val="2"/>
+        </w:numPr>
+        <w:spacing w:after="0" w:before="120"/>
+      </w:pPr>
+      <w:r>
+        <w:rPr>
+          <w:b/>
+          <w:bCs/>
+        </w:rPr>
+        <w:t xml:space="preserve">How is teaching different from just delivering information?</w:t>
+      </w:r>
+    </w:p>
+    <w:p>
+      <w:pPr>
+        <w:spacing w:after="120"/>
+        <w:ind w:left="440"/>
+      </w:pPr>
+    </w:p>
+    <w:p>
+      <w:pPr>
+        <w:pStyle w:val="ListParagraph"/>
+        <w:keepNext/>
+        <w:numPr>
+          <w:ilvl w:val="0"/>
+          <w:numId w:val="2"/>
+        </w:numPr>
+        <w:spacing w:after="0" w:before="120"/>
+      </w:pPr>
+      <w:r>
+        <w:rPr>
+          <w:b/>
+          <w:bCs/>
+        </w:rPr>
+        <w:t xml:space="preserve">What changes would improve government schools?</w:t>
+      </w:r>
+    </w:p>
+    <w:p>
+      <w:pPr>
+        <w:spacing w:after="120"/>
+        <w:ind w:left="440"/>
+      </w:pPr>
+    </w:p>
+    <w:p>
+      <w:pPr>
+        <w:pStyle w:val="ListParagraph"/>
+        <w:keepNext/>
+        <w:numPr>
+          <w:ilvl w:val="0"/>
+          <w:numId w:val="2"/>
+        </w:numPr>
+        <w:spacing w:after="0" w:before="120"/>
+      </w:pPr>
+      <w:r>
+        <w:rPr>
+          <w:b/>
+          <w:bCs/>
+        </w:rPr>
+        <w:t xml:space="preserve">What is the role of education in national development?</w:t>
+      </w:r>
+    </w:p>
+    <w:p>
+      <w:pPr>
+        <w:spacing w:after="120"/>
+        <w:ind w:left="440"/>
+      </w:pPr>
+    </w:p>
+    <w:p>
+      <w:pPr>
+        <w:pStyle w:val="Heading1"/>
+      </w:pPr>
+      <w:r>
+        <w:t xml:space="preserve">PIQ 3 – Mother: Education &amp; Current Affairs</w:t>
+      </w:r>
+    </w:p>
+    <w:p>
+      <w:pPr>
+        <w:pStyle w:val="ListParagraph"/>
+        <w:keepNext/>
+        <w:numPr>
+          <w:ilvl w:val="0"/>
+          <w:numId w:val="2"/>
+        </w:numPr>
+        <w:spacing w:after="0" w:before="120"/>
+      </w:pPr>
+      <w:r>
+        <w:rPr>
+          <w:b/>
+          <w:bCs/>
+        </w:rPr>
+        <w:t xml:space="preserve">What is NEP 2020?</w:t>
+      </w:r>
+    </w:p>
+    <w:p>
+      <w:pPr>
+        <w:spacing w:after="120"/>
+        <w:ind w:left="440"/>
+      </w:pPr>
+    </w:p>
+    <w:p>
+      <w:pPr>
+        <w:pStyle w:val="ListParagraph"/>
+        <w:keepNext/>
+        <w:numPr>
+          <w:ilvl w:val="0"/>
+          <w:numId w:val="2"/>
+        </w:numPr>
+        <w:spacing w:after="0" w:before="120"/>
+      </w:pPr>
+      <w:r>
+        <w:rPr>
+          <w:b/>
+          <w:bCs/>
+        </w:rPr>
+        <w:t xml:space="preserve">What are its major features?</w:t>
+      </w:r>
+    </w:p>
+    <w:p>
+      <w:pPr>
+        <w:spacing w:after="120"/>
+        <w:ind w:left="440"/>
+      </w:pPr>
+    </w:p>
+    <w:p>
+      <w:pPr>
+        <w:pStyle w:val="ListParagraph"/>
+        <w:keepNext/>
+        <w:numPr>
+          <w:ilvl w:val="0"/>
+          <w:numId w:val="2"/>
+        </w:numPr>
+        <w:spacing w:after="0" w:before="120"/>
+      </w:pPr>
+      <w:r>
+        <w:rPr>
+          <w:b/>
+          <w:bCs/>
+        </w:rPr>
+        <w:t xml:space="preserve">What is the difference between foundational and higher education?</w:t>
+      </w:r>
+    </w:p>
+    <w:p>
+      <w:pPr>
+        <w:spacing w:after="120"/>
+        <w:ind w:left="440"/>
+      </w:pPr>
+    </w:p>
+    <w:p>
+      <w:pPr>
+        <w:pStyle w:val="ListParagraph"/>
+        <w:keepNext/>
+        <w:numPr>
+          <w:ilvl w:val="0"/>
+          <w:numId w:val="2"/>
+        </w:numPr>
+        <w:spacing w:after="0" w:before="120"/>
+      </w:pPr>
+      <w:r>
+        <w:rPr>
+          <w:b/>
+          <w:bCs/>
+        </w:rPr>
+        <w:t xml:space="preserve">What is vocational education?</w:t>
+      </w:r>
+    </w:p>
+    <w:p>
+      <w:pPr>
+        <w:spacing w:after="120"/>
+        <w:ind w:left="440"/>
+      </w:pPr>
+    </w:p>
+    <w:p>
+      <w:pPr>
+        <w:pStyle w:val="ListParagraph"/>
+        <w:keepNext/>
+        <w:numPr>
+          <w:ilvl w:val="0"/>
+          <w:numId w:val="2"/>
+        </w:numPr>
+        <w:spacing w:after="0" w:before="120"/>
+      </w:pPr>
+      <w:r>
+        <w:rPr>
+          <w:b/>
+          <w:bCs/>
+        </w:rPr>
+        <w:t xml:space="preserve">Why is skill development important?</w:t>
+      </w:r>
+    </w:p>
+    <w:p>
+      <w:pPr>
+        <w:spacing w:after="120"/>
+        <w:ind w:left="440"/>
+      </w:pPr>
+    </w:p>
+    <w:p>
+      <w:pPr>
+        <w:pStyle w:val="ListParagraph"/>
+        <w:keepNext/>
+        <w:numPr>
+          <w:ilvl w:val="0"/>
+          <w:numId w:val="2"/>
+        </w:numPr>
+        <w:spacing w:after="0" w:before="120"/>
+      </w:pPr>
+      <w:r>
+        <w:rPr>
+          <w:b/>
+          <w:bCs/>
+        </w:rPr>
+        <w:t xml:space="preserve">What is the role of technology in education?</w:t>
+      </w:r>
+    </w:p>
+    <w:p>
+      <w:pPr>
+        <w:spacing w:after="120"/>
+        <w:ind w:left="440"/>
+      </w:pPr>
+    </w:p>
+    <w:p>
+      <w:pPr>
+        <w:pStyle w:val="ListParagraph"/>
+        <w:keepNext/>
+        <w:numPr>
+          <w:ilvl w:val="0"/>
+          <w:numId w:val="2"/>
+        </w:numPr>
+        <w:spacing w:after="0" w:before="120"/>
+      </w:pPr>
+      <w:r>
+        <w:rPr>
+          <w:b/>
+          <w:bCs/>
+        </w:rPr>
+        <w:t xml:space="preserve">What are the advantages and disadvantages of online education?</w:t>
+      </w:r>
+    </w:p>
+    <w:p>
+      <w:pPr>
+        <w:spacing w:after="120"/>
+        <w:ind w:left="440"/>
+      </w:pPr>
+    </w:p>
+    <w:p>
+      <w:pPr>
+        <w:pStyle w:val="ListParagraph"/>
+        <w:keepNext/>
+        <w:numPr>
+          <w:ilvl w:val="0"/>
+          <w:numId w:val="2"/>
+        </w:numPr>
+        <w:spacing w:after="0" w:before="120"/>
+      </w:pPr>
+      <w:r>
+        <w:rPr>
+          <w:b/>
+          <w:bCs/>
+        </w:rPr>
+        <w:t xml:space="preserve">What is the digital divide?</w:t>
+      </w:r>
+    </w:p>
+    <w:p>
+      <w:pPr>
+        <w:spacing w:after="120"/>
+        <w:ind w:left="440"/>
+      </w:pPr>
+    </w:p>
+    <w:p>
+      <w:pPr>
+        <w:pStyle w:val="ListParagraph"/>
+        <w:keepNext/>
+        <w:numPr>
+          <w:ilvl w:val="0"/>
+          <w:numId w:val="2"/>
+        </w:numPr>
+        <w:spacing w:after="0" w:before="120"/>
+      </w:pPr>
+      <w:r>
+        <w:rPr>
+          <w:b/>
+          <w:bCs/>
+        </w:rPr>
+        <w:t xml:space="preserve">How can rural education be improved?</w:t>
+      </w:r>
+    </w:p>
+    <w:p>
+      <w:pPr>
+        <w:spacing w:after="120"/>
+        <w:ind w:left="440"/>
+      </w:pPr>
+    </w:p>
+    <w:p>
+      <w:pPr>
+        <w:pStyle w:val="Heading1"/>
+      </w:pPr>
+      <w:r>
+        <w:t xml:space="preserve">PIQ 3 – Mother: Personal</w:t>
+      </w:r>
+    </w:p>
+    <w:p>
+      <w:pPr>
+        <w:pStyle w:val="ListParagraph"/>
+        <w:keepNext/>
+        <w:numPr>
+          <w:ilvl w:val="0"/>
+          <w:numId w:val="2"/>
+        </w:numPr>
+        <w:spacing w:after="0" w:before="120"/>
+      </w:pPr>
+      <w:r>
+        <w:rPr>
+          <w:b/>
+          <w:bCs/>
+        </w:rPr>
+        <w:t xml:space="preserve">How would you describe your mother?</w:t>
+      </w:r>
+    </w:p>
+    <w:p>
+      <w:pPr>
+        <w:spacing w:after="120"/>
+        <w:ind w:left="440"/>
+      </w:pPr>
+    </w:p>
+    <w:p>
+      <w:pPr>
+        <w:pStyle w:val="ListParagraph"/>
+        <w:keepNext/>
+        <w:numPr>
+          <w:ilvl w:val="0"/>
+          <w:numId w:val="2"/>
+        </w:numPr>
+        <w:spacing w:after="0" w:before="120"/>
+      </w:pPr>
+      <w:r>
+        <w:rPr>
+          <w:b/>
+          <w:bCs/>
+        </w:rPr>
+        <w:t xml:space="preserve">What is your relationship with your mother like?</w:t>
+      </w:r>
+    </w:p>
+    <w:p>
+      <w:pPr>
+        <w:spacing w:after="120"/>
+        <w:ind w:left="440"/>
+      </w:pPr>
+    </w:p>
+    <w:p>
+      <w:pPr>
+        <w:pStyle w:val="ListParagraph"/>
+        <w:keepNext/>
+        <w:numPr>
+          <w:ilvl w:val="0"/>
+          <w:numId w:val="2"/>
+        </w:numPr>
+        <w:spacing w:after="0" w:before="120"/>
+      </w:pPr>
+      <w:r>
+        <w:rPr>
+          <w:b/>
+          <w:bCs/>
+        </w:rPr>
+        <w:t xml:space="preserve">What quality of your mother do you admire most?</w:t>
+      </w:r>
+    </w:p>
+    <w:p>
+      <w:pPr>
+        <w:spacing w:after="120"/>
+        <w:ind w:left="440"/>
+      </w:pPr>
+    </w:p>
+    <w:p>
+      <w:pPr>
+        <w:pStyle w:val="ListParagraph"/>
+        <w:keepNext/>
+        <w:numPr>
+          <w:ilvl w:val="0"/>
+          <w:numId w:val="2"/>
+        </w:numPr>
+        <w:spacing w:after="0" w:before="120"/>
+      </w:pPr>
+      <w:r>
+        <w:rPr>
+          <w:b/>
+          <w:bCs/>
+        </w:rPr>
+        <w:t xml:space="preserve">What have you learned from her?</w:t>
+      </w:r>
+    </w:p>
+    <w:p>
+      <w:pPr>
+        <w:spacing w:after="120"/>
+        <w:ind w:left="440"/>
+      </w:pPr>
+    </w:p>
+    <w:p>
+      <w:pPr>
+        <w:pStyle w:val="ListParagraph"/>
+        <w:keepNext/>
+        <w:numPr>
+          <w:ilvl w:val="0"/>
+          <w:numId w:val="2"/>
+        </w:numPr>
+        <w:spacing w:after="0" w:before="120"/>
+      </w:pPr>
+      <w:r>
+        <w:rPr>
+          <w:b/>
+          <w:bCs/>
+        </w:rPr>
+        <w:t xml:space="preserve">What responsibilities does she handle at home?</w:t>
+      </w:r>
+    </w:p>
+    <w:p>
+      <w:pPr>
+        <w:spacing w:after="120"/>
+        <w:ind w:left="440"/>
+      </w:pPr>
+    </w:p>
+    <w:p>
+      <w:pPr>
+        <w:pStyle w:val="ListParagraph"/>
+        <w:keepNext/>
+        <w:numPr>
+          <w:ilvl w:val="0"/>
+          <w:numId w:val="2"/>
+        </w:numPr>
+        <w:spacing w:after="0" w:before="120"/>
+      </w:pPr>
+      <w:r>
+        <w:rPr>
+          <w:b/>
+          <w:bCs/>
+        </w:rPr>
+        <w:t xml:space="preserve">How has she influenced your education?</w:t>
+      </w:r>
+    </w:p>
+    <w:p>
+      <w:pPr>
+        <w:spacing w:after="120"/>
+        <w:ind w:left="440"/>
+      </w:pPr>
+    </w:p>
+    <w:p>
+      <w:pPr>
+        <w:pStyle w:val="ListParagraph"/>
+        <w:keepNext/>
+        <w:numPr>
+          <w:ilvl w:val="0"/>
+          <w:numId w:val="2"/>
+        </w:numPr>
+        <w:spacing w:after="0" w:before="120"/>
+      </w:pPr>
+      <w:r>
+        <w:rPr>
+          <w:b/>
+          <w:bCs/>
+        </w:rPr>
+        <w:t xml:space="preserve">Do you discuss your career decisions with her?</w:t>
+      </w:r>
+    </w:p>
+    <w:p>
+      <w:pPr>
+        <w:spacing w:after="120"/>
+        <w:ind w:left="440"/>
+      </w:pPr>
+    </w:p>
+    <w:p>
+      <w:pPr>
+        <w:pStyle w:val="ListParagraph"/>
+        <w:keepNext/>
+        <w:numPr>
+          <w:ilvl w:val="0"/>
+          <w:numId w:val="2"/>
+        </w:numPr>
+        <w:spacing w:after="0" w:before="120"/>
+      </w:pPr>
+      <w:r>
+        <w:rPr>
+          <w:b/>
+          <w:bCs/>
+        </w:rPr>
+        <w:t xml:space="preserve">What does she think about you joining the Armed Forces?</w:t>
+      </w:r>
+    </w:p>
+    <w:p>
+      <w:pPr>
+        <w:spacing w:after="120"/>
+        <w:ind w:left="440"/>
+      </w:pPr>
+    </w:p>
+    <w:p>
+      <w:pPr>
+        <w:pStyle w:val="ListParagraph"/>
+        <w:keepNext/>
+        <w:numPr>
+          <w:ilvl w:val="0"/>
+          <w:numId w:val="2"/>
+        </w:numPr>
+        <w:spacing w:after="0" w:before="120"/>
+      </w:pPr>
+      <w:r>
+        <w:rPr>
+          <w:b/>
+          <w:bCs/>
+        </w:rPr>
+        <w:t xml:space="preserve">What is one thing you disagree with her about?</w:t>
+      </w:r>
+    </w:p>
+    <w:p>
+      <w:pPr>
+        <w:spacing w:after="120"/>
+        <w:ind w:left="440"/>
+      </w:pPr>
+    </w:p>
+    <w:p>
+      <w:pPr>
+        <w:pStyle w:val="ListParagraph"/>
+        <w:keepNext/>
+        <w:numPr>
+          <w:ilvl w:val="0"/>
+          <w:numId w:val="2"/>
+        </w:numPr>
+        <w:spacing w:after="0" w:before="120"/>
+      </w:pPr>
+      <w:r>
+        <w:rPr>
+          <w:b/>
+          <w:bCs/>
+        </w:rPr>
+        <w:t xml:space="preserve">How do you help your mother?</w:t>
+      </w:r>
+    </w:p>
+    <w:p>
+      <w:pPr>
+        <w:spacing w:after="120"/>
+        <w:ind w:left="440"/>
+      </w:pPr>
+    </w:p>
+    <w:p>
+      <w:pPr>
+        <w:pStyle w:val="ListParagraph"/>
+        <w:keepNext/>
+        <w:numPr>
+          <w:ilvl w:val="0"/>
+          <w:numId w:val="2"/>
+        </w:numPr>
+        <w:spacing w:after="0" w:before="120"/>
+      </w:pPr>
+      <w:r>
+        <w:rPr>
+          <w:b/>
+          <w:bCs/>
+        </w:rPr>
+        <w:t xml:space="preserve">How will what you learned from your mother help you as an officer?</w:t>
+      </w:r>
+    </w:p>
+    <w:p>
+      <w:pPr>
+        <w:spacing w:after="120"/>
+        <w:ind w:left="440"/>
+      </w:pPr>
+    </w:p>
+    <w:p>
+      <w:pPr>
+        <w:pStyle w:val="Heading1"/>
+      </w:pPr>
+      <w:r>
+        <w:t xml:space="preserve">PIQ 3 – Mother vs Father</w:t>
+      </w:r>
+    </w:p>
+    <w:p>
+      <w:pPr>
+        <w:pStyle w:val="ListParagraph"/>
+        <w:keepNext/>
+        <w:numPr>
+          <w:ilvl w:val="0"/>
+          <w:numId w:val="2"/>
+        </w:numPr>
+        <w:spacing w:after="0" w:before="120"/>
+      </w:pPr>
+      <w:r>
+        <w:rPr>
+          <w:b/>
+          <w:bCs/>
+        </w:rPr>
+        <w:t xml:space="preserve">Who are you closer to, your mother or your father?</w:t>
+      </w:r>
+    </w:p>
+    <w:p>
+      <w:pPr>
+        <w:spacing w:after="120"/>
+        <w:ind w:left="440"/>
+      </w:pPr>
+    </w:p>
+    <w:p>
+      <w:pPr>
+        <w:pStyle w:val="ListParagraph"/>
+        <w:keepNext/>
+        <w:numPr>
+          <w:ilvl w:val="0"/>
+          <w:numId w:val="2"/>
+        </w:numPr>
+        <w:spacing w:after="0" w:before="120"/>
+      </w:pPr>
+      <w:r>
+        <w:rPr>
+          <w:b/>
+          <w:bCs/>
+        </w:rPr>
+        <w:t xml:space="preserve">Whom do you approach when you have a problem?</w:t>
+      </w:r>
+    </w:p>
+    <w:p>
+      <w:pPr>
+        <w:spacing w:after="120"/>
+        <w:ind w:left="440"/>
+      </w:pPr>
+    </w:p>
+    <w:p>
+      <w:pPr>
+        <w:pStyle w:val="ListParagraph"/>
+        <w:keepNext/>
+        <w:numPr>
+          <w:ilvl w:val="0"/>
+          <w:numId w:val="2"/>
+        </w:numPr>
+        <w:spacing w:after="0" w:before="120"/>
+      </w:pPr>
+      <w:r>
+        <w:rPr>
+          <w:b/>
+          <w:bCs/>
+        </w:rPr>
+        <w:t xml:space="preserve">What have you learned from your father that you didn't learn from your mother?</w:t>
+      </w:r>
+    </w:p>
+    <w:p>
+      <w:pPr>
+        <w:spacing w:after="120"/>
+        <w:ind w:left="440"/>
+      </w:pPr>
+    </w:p>
+    <w:p>
+      <w:pPr>
+        <w:pStyle w:val="ListParagraph"/>
+        <w:keepNext/>
+        <w:numPr>
+          <w:ilvl w:val="0"/>
+          <w:numId w:val="2"/>
+        </w:numPr>
+        <w:spacing w:after="0" w:before="120"/>
+      </w:pPr>
+      <w:r>
+        <w:rPr>
+          <w:b/>
+          <w:bCs/>
+        </w:rPr>
+        <w:t xml:space="preserve">What have you learned from your mother that you didn't learn from your father?</w:t>
+      </w:r>
+    </w:p>
+    <w:p>
+      <w:pPr>
+        <w:spacing w:after="120"/>
+        <w:ind w:left="440"/>
+      </w:pPr>
+    </w:p>
+    <w:p>
+      <w:pPr>
+        <w:pStyle w:val="ListParagraph"/>
+        <w:keepNext/>
+        <w:numPr>
+          <w:ilvl w:val="0"/>
+          <w:numId w:val="2"/>
+        </w:numPr>
+        <w:spacing w:after="0" w:before="120"/>
+      </w:pPr>
+      <w:r>
+        <w:rPr>
+          <w:b/>
+          <w:bCs/>
+        </w:rPr>
+        <w:t xml:space="preserve">Who is stricter?</w:t>
+      </w:r>
+    </w:p>
+    <w:p>
+      <w:pPr>
+        <w:spacing w:after="120"/>
+        <w:ind w:left="440"/>
+      </w:pPr>
+    </w:p>
+    <w:p>
+      <w:pPr>
+        <w:pStyle w:val="ListParagraph"/>
+        <w:keepNext/>
+        <w:numPr>
+          <w:ilvl w:val="0"/>
+          <w:numId w:val="2"/>
+        </w:numPr>
+        <w:spacing w:after="0" w:before="120"/>
+      </w:pPr>
+      <w:r>
+        <w:rPr>
+          <w:b/>
+          <w:bCs/>
+        </w:rPr>
+        <w:t xml:space="preserve">Who understands you better?</w:t>
+      </w:r>
+    </w:p>
+    <w:p>
+      <w:pPr>
+        <w:spacing w:after="120"/>
+        <w:ind w:left="440"/>
+      </w:pPr>
+    </w:p>
+    <w:p>
+      <w:pPr>
+        <w:pStyle w:val="ListParagraph"/>
+        <w:keepNext/>
+        <w:numPr>
+          <w:ilvl w:val="0"/>
+          <w:numId w:val="2"/>
+        </w:numPr>
+        <w:spacing w:after="0" w:before="120"/>
+      </w:pPr>
+      <w:r>
+        <w:rPr>
+          <w:b/>
+          <w:bCs/>
+        </w:rPr>
+        <w:t xml:space="preserve">Who influences your major decisions more?</w:t>
+      </w:r>
+    </w:p>
+    <w:p>
+      <w:pPr>
+        <w:spacing w:after="120"/>
+        <w:ind w:left="440"/>
+      </w:pPr>
+    </w:p>
+    <w:p>
+      <w:pPr>
+        <w:pStyle w:val="Heading1"/>
+      </w:pPr>
+      <w:r>
+        <w:t xml:space="preserve">PIQ 3 – Mother: Teaching and You</w:t>
+      </w:r>
+    </w:p>
+    <w:p>
+      <w:pPr>
+        <w:pStyle w:val="ListParagraph"/>
+        <w:keepNext/>
+        <w:numPr>
+          <w:ilvl w:val="0"/>
+          <w:numId w:val="2"/>
+        </w:numPr>
+        <w:spacing w:after="0" w:before="120"/>
+      </w:pPr>
+      <w:r>
+        <w:rPr>
+          <w:b/>
+          <w:bCs/>
+        </w:rPr>
+        <w:t xml:space="preserve">Your mother is a teacher. Why didn't you become a teacher?</w:t>
+      </w:r>
+    </w:p>
+    <w:p>
+      <w:pPr>
+        <w:spacing w:after="120"/>
+        <w:ind w:left="440"/>
+      </w:pPr>
+    </w:p>
+    <w:p>
+      <w:pPr>
+        <w:pStyle w:val="ListParagraph"/>
+        <w:keepNext/>
+        <w:numPr>
+          <w:ilvl w:val="0"/>
+          <w:numId w:val="2"/>
+        </w:numPr>
+        <w:spacing w:after="0" w:before="120"/>
+      </w:pPr>
+      <w:r>
+        <w:rPr>
+          <w:b/>
+          <w:bCs/>
+        </w:rPr>
+        <w:t xml:space="preserve">Did your mother's profession shape your interest in education?</w:t>
+      </w:r>
+    </w:p>
+    <w:p>
+      <w:pPr>
+        <w:spacing w:after="120"/>
+        <w:ind w:left="440"/>
+      </w:pPr>
+    </w:p>
+    <w:p>
+      <w:pPr>
+        <w:pStyle w:val="ListParagraph"/>
+        <w:keepNext/>
+        <w:numPr>
+          <w:ilvl w:val="0"/>
+          <w:numId w:val="2"/>
+        </w:numPr>
+        <w:spacing w:after="0" w:before="120"/>
+      </w:pPr>
+      <w:r>
+        <w:rPr>
+          <w:b/>
+          <w:bCs/>
+        </w:rPr>
+        <w:t xml:space="preserve">Have you ever taught someone or helped a junior with studies?</w:t>
+      </w:r>
+    </w:p>
+    <w:p>
+      <w:pPr>
+        <w:spacing w:after="120"/>
+        <w:ind w:left="440"/>
+      </w:pPr>
+    </w:p>
+    <w:p>
+      <w:pPr>
+        <w:pStyle w:val="ListParagraph"/>
+        <w:keepNext/>
+        <w:numPr>
+          <w:ilvl w:val="0"/>
+          <w:numId w:val="2"/>
+        </w:numPr>
+        <w:spacing w:after="0" w:before="120"/>
+      </w:pPr>
+      <w:r>
+        <w:rPr>
+          <w:b/>
+          <w:bCs/>
+        </w:rPr>
+        <w:t xml:space="preserve">Do you enjoy explaining things to others?</w:t>
+      </w:r>
+    </w:p>
+    <w:p>
+      <w:pPr>
+        <w:spacing w:after="120"/>
+        <w:ind w:left="440"/>
+      </w:pPr>
+    </w:p>
+    <w:p>
+      <w:pPr>
+        <w:pStyle w:val="ListParagraph"/>
+        <w:keepNext/>
+        <w:numPr>
+          <w:ilvl w:val="0"/>
+          <w:numId w:val="2"/>
+        </w:numPr>
+        <w:spacing w:after="0" w:before="120"/>
+      </w:pPr>
+      <w:r>
+        <w:rPr>
+          <w:b/>
+          <w:bCs/>
+        </w:rPr>
+        <w:t xml:space="preserve">What has your mother's profession taught you about leadership?</w:t>
       </w:r>
     </w:p>
     <w:p>

</xml_diff>

<commit_message>
Add PIQ 4 (Place of Residence) questions to SSB question sheet
Co-Authored-By: Claude Opus 5.5 <noreply@anthropic.com>
Claude-Session: https://claude.ai/code/session_01TypcejD48cCyAqfjtUUit5
</commit_message>
<xml_diff>
--- a/SSB_Question_Sheet.docx
+++ b/SSB_Question_Sheet.docx
@@ -3692,6 +3692,1606 @@
           <w:bCs/>
         </w:rPr>
         <w:t xml:space="preserve">What has your mother's profession taught you about leadership?</w:t>
+      </w:r>
+    </w:p>
+    <w:p>
+      <w:pPr>
+        <w:spacing w:after="120"/>
+        <w:ind w:left="440"/>
+      </w:pPr>
+    </w:p>
+    <w:p>
+      <w:pPr>
+        <w:pStyle w:val="Heading1"/>
+      </w:pPr>
+      <w:r>
+        <w:t xml:space="preserve">PIQ 4 – Residence</w:t>
+      </w:r>
+    </w:p>
+    <w:p>
+      <w:pPr>
+        <w:pStyle w:val="ListParagraph"/>
+        <w:keepNext/>
+        <w:numPr>
+          <w:ilvl w:val="0"/>
+          <w:numId w:val="2"/>
+        </w:numPr>
+        <w:spacing w:after="0" w:before="120"/>
+      </w:pPr>
+      <w:r>
+        <w:rPr>
+          <w:b/>
+          <w:bCs/>
+        </w:rPr>
+        <w:t xml:space="preserve">Where have you spent most of your life?</w:t>
+      </w:r>
+    </w:p>
+    <w:p>
+      <w:pPr>
+        <w:spacing w:after="120"/>
+        <w:ind w:left="440"/>
+      </w:pPr>
+    </w:p>
+    <w:p>
+      <w:pPr>
+        <w:pStyle w:val="ListParagraph"/>
+        <w:keepNext/>
+        <w:numPr>
+          <w:ilvl w:val="0"/>
+          <w:numId w:val="2"/>
+        </w:numPr>
+        <w:spacing w:after="0" w:before="120"/>
+      </w:pPr>
+      <w:r>
+        <w:rPr>
+          <w:b/>
+          <w:bCs/>
+        </w:rPr>
+        <w:t xml:space="preserve">Where exactly is Palhani?</w:t>
+      </w:r>
+    </w:p>
+    <w:p>
+      <w:pPr>
+        <w:spacing w:after="120"/>
+        <w:ind w:left="440"/>
+      </w:pPr>
+    </w:p>
+    <w:p>
+      <w:pPr>
+        <w:pStyle w:val="ListParagraph"/>
+        <w:keepNext/>
+        <w:numPr>
+          <w:ilvl w:val="0"/>
+          <w:numId w:val="2"/>
+        </w:numPr>
+        <w:spacing w:after="0" w:before="120"/>
+      </w:pPr>
+      <w:r>
+        <w:rPr>
+          <w:b/>
+          <w:bCs/>
+        </w:rPr>
+        <w:t xml:space="preserve">Which district is it in?</w:t>
+      </w:r>
+    </w:p>
+    <w:p>
+      <w:pPr>
+        <w:spacing w:after="120"/>
+        <w:ind w:left="440"/>
+      </w:pPr>
+    </w:p>
+    <w:p>
+      <w:pPr>
+        <w:pStyle w:val="ListParagraph"/>
+        <w:keepNext/>
+        <w:numPr>
+          <w:ilvl w:val="0"/>
+          <w:numId w:val="2"/>
+        </w:numPr>
+        <w:spacing w:after="0" w:before="120"/>
+      </w:pPr>
+      <w:r>
+        <w:rPr>
+          <w:b/>
+          <w:bCs/>
+        </w:rPr>
+        <w:t xml:space="preserve">Which state is Azamgarh in?</w:t>
+      </w:r>
+    </w:p>
+    <w:p>
+      <w:pPr>
+        <w:spacing w:after="120"/>
+        <w:ind w:left="440"/>
+      </w:pPr>
+    </w:p>
+    <w:p>
+      <w:pPr>
+        <w:pStyle w:val="ListParagraph"/>
+        <w:keepNext/>
+        <w:numPr>
+          <w:ilvl w:val="0"/>
+          <w:numId w:val="2"/>
+        </w:numPr>
+        <w:spacing w:after="0" w:before="120"/>
+      </w:pPr>
+      <w:r>
+        <w:rPr>
+          <w:b/>
+          <w:bCs/>
+        </w:rPr>
+        <w:t xml:space="preserve">How long have you lived there?</w:t>
+      </w:r>
+    </w:p>
+    <w:p>
+      <w:pPr>
+        <w:spacing w:after="120"/>
+        <w:ind w:left="440"/>
+      </w:pPr>
+    </w:p>
+    <w:p>
+      <w:pPr>
+        <w:pStyle w:val="ListParagraph"/>
+        <w:keepNext/>
+        <w:numPr>
+          <w:ilvl w:val="0"/>
+          <w:numId w:val="2"/>
+        </w:numPr>
+        <w:spacing w:after="0" w:before="120"/>
+      </w:pPr>
+      <w:r>
+        <w:rPr>
+          <w:b/>
+          <w:bCs/>
+        </w:rPr>
+        <w:t xml:space="preserve">Why have you lived there for most of your life?</w:t>
+      </w:r>
+    </w:p>
+    <w:p>
+      <w:pPr>
+        <w:spacing w:after="120"/>
+        <w:ind w:left="440"/>
+      </w:pPr>
+    </w:p>
+    <w:p>
+      <w:pPr>
+        <w:pStyle w:val="ListParagraph"/>
+        <w:keepNext/>
+        <w:numPr>
+          <w:ilvl w:val="0"/>
+          <w:numId w:val="2"/>
+        </w:numPr>
+        <w:spacing w:after="0" w:before="120"/>
+      </w:pPr>
+      <w:r>
+        <w:rPr>
+          <w:b/>
+          <w:bCs/>
+        </w:rPr>
+        <w:t xml:space="preserve">What do you like about your hometown?</w:t>
+      </w:r>
+    </w:p>
+    <w:p>
+      <w:pPr>
+        <w:spacing w:after="120"/>
+        <w:ind w:left="440"/>
+      </w:pPr>
+    </w:p>
+    <w:p>
+      <w:pPr>
+        <w:pStyle w:val="ListParagraph"/>
+        <w:keepNext/>
+        <w:numPr>
+          <w:ilvl w:val="0"/>
+          <w:numId w:val="2"/>
+        </w:numPr>
+        <w:spacing w:after="0" w:before="120"/>
+      </w:pPr>
+      <w:r>
+        <w:rPr>
+          <w:b/>
+          <w:bCs/>
+        </w:rPr>
+        <w:t xml:space="preserve">What don't you like about it?</w:t>
+      </w:r>
+    </w:p>
+    <w:p>
+      <w:pPr>
+        <w:spacing w:after="120"/>
+        <w:ind w:left="440"/>
+      </w:pPr>
+    </w:p>
+    <w:p>
+      <w:pPr>
+        <w:pStyle w:val="ListParagraph"/>
+        <w:keepNext/>
+        <w:numPr>
+          <w:ilvl w:val="0"/>
+          <w:numId w:val="2"/>
+        </w:numPr>
+        <w:spacing w:after="0" w:before="120"/>
+      </w:pPr>
+      <w:r>
+        <w:rPr>
+          <w:b/>
+          <w:bCs/>
+        </w:rPr>
+        <w:t xml:space="preserve">Would you like to settle there in the future?</w:t>
+      </w:r>
+    </w:p>
+    <w:p>
+      <w:pPr>
+        <w:spacing w:after="120"/>
+        <w:ind w:left="440"/>
+      </w:pPr>
+    </w:p>
+    <w:p>
+      <w:pPr>
+        <w:pStyle w:val="ListParagraph"/>
+        <w:keepNext/>
+        <w:numPr>
+          <w:ilvl w:val="0"/>
+          <w:numId w:val="2"/>
+        </w:numPr>
+        <w:spacing w:after="0" w:before="120"/>
+      </w:pPr>
+      <w:r>
+        <w:rPr>
+          <w:b/>
+          <w:bCs/>
+        </w:rPr>
+        <w:t xml:space="preserve">What changes have you seen in the area in recent years?</w:t>
+      </w:r>
+    </w:p>
+    <w:p>
+      <w:pPr>
+        <w:spacing w:after="120"/>
+        <w:ind w:left="440"/>
+      </w:pPr>
+    </w:p>
+    <w:p>
+      <w:pPr>
+        <w:pStyle w:val="Heading1"/>
+      </w:pPr>
+      <w:r>
+        <w:t xml:space="preserve">PIQ 4 – Residence: Palhani</w:t>
+      </w:r>
+    </w:p>
+    <w:p>
+      <w:pPr>
+        <w:pStyle w:val="ListParagraph"/>
+        <w:keepNext/>
+        <w:numPr>
+          <w:ilvl w:val="0"/>
+          <w:numId w:val="2"/>
+        </w:numPr>
+        <w:spacing w:after="0" w:before="120"/>
+      </w:pPr>
+      <w:r>
+        <w:rPr>
+          <w:b/>
+          <w:bCs/>
+        </w:rPr>
+        <w:t xml:space="preserve">What is Palhani known for?</w:t>
+      </w:r>
+    </w:p>
+    <w:p>
+      <w:pPr>
+        <w:spacing w:after="120"/>
+        <w:ind w:left="440"/>
+      </w:pPr>
+    </w:p>
+    <w:p>
+      <w:pPr>
+        <w:pStyle w:val="ListParagraph"/>
+        <w:keepNext/>
+        <w:numPr>
+          <w:ilvl w:val="0"/>
+          <w:numId w:val="2"/>
+        </w:numPr>
+        <w:spacing w:after="0" w:before="120"/>
+      </w:pPr>
+      <w:r>
+        <w:rPr>
+          <w:b/>
+          <w:bCs/>
+        </w:rPr>
+        <w:t xml:space="preserve">What important places are nearby?</w:t>
+      </w:r>
+    </w:p>
+    <w:p>
+      <w:pPr>
+        <w:spacing w:after="120"/>
+        <w:ind w:left="440"/>
+      </w:pPr>
+    </w:p>
+    <w:p>
+      <w:pPr>
+        <w:pStyle w:val="ListParagraph"/>
+        <w:keepNext/>
+        <w:numPr>
+          <w:ilvl w:val="0"/>
+          <w:numId w:val="2"/>
+        </w:numPr>
+        <w:spacing w:after="0" w:before="120"/>
+      </w:pPr>
+      <w:r>
+        <w:rPr>
+          <w:b/>
+          <w:bCs/>
+        </w:rPr>
+        <w:t xml:space="preserve">What are the major road and railway connections?</w:t>
+      </w:r>
+    </w:p>
+    <w:p>
+      <w:pPr>
+        <w:spacing w:after="120"/>
+        <w:ind w:left="440"/>
+      </w:pPr>
+    </w:p>
+    <w:p>
+      <w:pPr>
+        <w:pStyle w:val="ListParagraph"/>
+        <w:keepNext/>
+        <w:numPr>
+          <w:ilvl w:val="0"/>
+          <w:numId w:val="2"/>
+        </w:numPr>
+        <w:spacing w:after="0" w:before="120"/>
+      </w:pPr>
+      <w:r>
+        <w:rPr>
+          <w:b/>
+          <w:bCs/>
+        </w:rPr>
+        <w:t xml:space="preserve">What schools and colleges are nearby?</w:t>
+      </w:r>
+    </w:p>
+    <w:p>
+      <w:pPr>
+        <w:spacing w:after="120"/>
+        <w:ind w:left="440"/>
+      </w:pPr>
+    </w:p>
+    <w:p>
+      <w:pPr>
+        <w:pStyle w:val="ListParagraph"/>
+        <w:keepNext/>
+        <w:numPr>
+          <w:ilvl w:val="0"/>
+          <w:numId w:val="2"/>
+        </w:numPr>
+        <w:spacing w:after="0" w:before="120"/>
+      </w:pPr>
+      <w:r>
+        <w:rPr>
+          <w:b/>
+          <w:bCs/>
+        </w:rPr>
+        <w:t xml:space="preserve">What are the major occupations of people there?</w:t>
+      </w:r>
+    </w:p>
+    <w:p>
+      <w:pPr>
+        <w:spacing w:after="120"/>
+        <w:ind w:left="440"/>
+      </w:pPr>
+    </w:p>
+    <w:p>
+      <w:pPr>
+        <w:pStyle w:val="ListParagraph"/>
+        <w:keepNext/>
+        <w:numPr>
+          <w:ilvl w:val="0"/>
+          <w:numId w:val="2"/>
+        </w:numPr>
+        <w:spacing w:after="0" w:before="120"/>
+      </w:pPr>
+      <w:r>
+        <w:rPr>
+          <w:b/>
+          <w:bCs/>
+        </w:rPr>
+        <w:t xml:space="preserve">What facilities are available there?</w:t>
+      </w:r>
+    </w:p>
+    <w:p>
+      <w:pPr>
+        <w:spacing w:after="120"/>
+        <w:ind w:left="440"/>
+      </w:pPr>
+    </w:p>
+    <w:p>
+      <w:pPr>
+        <w:pStyle w:val="ListParagraph"/>
+        <w:keepNext/>
+        <w:numPr>
+          <w:ilvl w:val="0"/>
+          <w:numId w:val="2"/>
+        </w:numPr>
+        <w:spacing w:after="0" w:before="120"/>
+      </w:pPr>
+      <w:r>
+        <w:rPr>
+          <w:b/>
+          <w:bCs/>
+        </w:rPr>
+        <w:t xml:space="preserve">What are the main problems in your locality?</w:t>
+      </w:r>
+    </w:p>
+    <w:p>
+      <w:pPr>
+        <w:spacing w:after="120"/>
+        <w:ind w:left="440"/>
+      </w:pPr>
+    </w:p>
+    <w:p>
+      <w:pPr>
+        <w:pStyle w:val="ListParagraph"/>
+        <w:keepNext/>
+        <w:numPr>
+          <w:ilvl w:val="0"/>
+          <w:numId w:val="2"/>
+        </w:numPr>
+        <w:spacing w:after="0" w:before="120"/>
+      </w:pPr>
+      <w:r>
+        <w:rPr>
+          <w:b/>
+          <w:bCs/>
+        </w:rPr>
+        <w:t xml:space="preserve">Tell me five things about your locality that an outsider wouldn't know.</w:t>
+      </w:r>
+    </w:p>
+    <w:p>
+      <w:pPr>
+        <w:spacing w:after="120"/>
+        <w:ind w:left="440"/>
+      </w:pPr>
+    </w:p>
+    <w:p>
+      <w:pPr>
+        <w:pStyle w:val="Heading1"/>
+      </w:pPr>
+      <w:r>
+        <w:t xml:space="preserve">PIQ 4 – Residence: Azamgarh Geography &amp; Administration</w:t>
+      </w:r>
+    </w:p>
+    <w:p>
+      <w:pPr>
+        <w:pStyle w:val="ListParagraph"/>
+        <w:keepNext/>
+        <w:numPr>
+          <w:ilvl w:val="0"/>
+          <w:numId w:val="2"/>
+        </w:numPr>
+        <w:spacing w:after="0" w:before="120"/>
+      </w:pPr>
+      <w:r>
+        <w:rPr>
+          <w:b/>
+          <w:bCs/>
+        </w:rPr>
+        <w:t xml:space="preserve">What is Azamgarh famous for?</w:t>
+      </w:r>
+    </w:p>
+    <w:p>
+      <w:pPr>
+        <w:spacing w:after="120"/>
+        <w:ind w:left="440"/>
+      </w:pPr>
+    </w:p>
+    <w:p>
+      <w:pPr>
+        <w:pStyle w:val="ListParagraph"/>
+        <w:keepNext/>
+        <w:numPr>
+          <w:ilvl w:val="0"/>
+          <w:numId w:val="2"/>
+        </w:numPr>
+        <w:spacing w:after="0" w:before="120"/>
+      </w:pPr>
+      <w:r>
+        <w:rPr>
+          <w:b/>
+          <w:bCs/>
+        </w:rPr>
+        <w:t xml:space="preserve">Where is Azamgarh located in Uttar Pradesh?</w:t>
+      </w:r>
+    </w:p>
+    <w:p>
+      <w:pPr>
+        <w:spacing w:after="120"/>
+        <w:ind w:left="440"/>
+      </w:pPr>
+    </w:p>
+    <w:p>
+      <w:pPr>
+        <w:pStyle w:val="ListParagraph"/>
+        <w:keepNext/>
+        <w:numPr>
+          <w:ilvl w:val="0"/>
+          <w:numId w:val="2"/>
+        </w:numPr>
+        <w:spacing w:after="0" w:before="120"/>
+      </w:pPr>
+      <w:r>
+        <w:rPr>
+          <w:b/>
+          <w:bCs/>
+        </w:rPr>
+        <w:t xml:space="preserve">Which districts surround it?</w:t>
+      </w:r>
+    </w:p>
+    <w:p>
+      <w:pPr>
+        <w:spacing w:after="120"/>
+        <w:ind w:left="440"/>
+      </w:pPr>
+    </w:p>
+    <w:p>
+      <w:pPr>
+        <w:pStyle w:val="ListParagraph"/>
+        <w:keepNext/>
+        <w:numPr>
+          <w:ilvl w:val="0"/>
+          <w:numId w:val="2"/>
+        </w:numPr>
+        <w:spacing w:after="0" w:before="120"/>
+      </w:pPr>
+      <w:r>
+        <w:rPr>
+          <w:b/>
+          <w:bCs/>
+        </w:rPr>
+        <w:t xml:space="preserve">Which geographical region does it belong to?</w:t>
+      </w:r>
+    </w:p>
+    <w:p>
+      <w:pPr>
+        <w:spacing w:after="120"/>
+        <w:ind w:left="440"/>
+      </w:pPr>
+    </w:p>
+    <w:p>
+      <w:pPr>
+        <w:pStyle w:val="ListParagraph"/>
+        <w:keepNext/>
+        <w:numPr>
+          <w:ilvl w:val="0"/>
+          <w:numId w:val="2"/>
+        </w:numPr>
+        <w:spacing w:after="0" w:before="120"/>
+      </w:pPr>
+      <w:r>
+        <w:rPr>
+          <w:b/>
+          <w:bCs/>
+        </w:rPr>
+        <w:t xml:space="preserve">What are its major rivers?</w:t>
+      </w:r>
+    </w:p>
+    <w:p>
+      <w:pPr>
+        <w:spacing w:after="120"/>
+        <w:ind w:left="440"/>
+      </w:pPr>
+    </w:p>
+    <w:p>
+      <w:pPr>
+        <w:pStyle w:val="ListParagraph"/>
+        <w:keepNext/>
+        <w:numPr>
+          <w:ilvl w:val="0"/>
+          <w:numId w:val="2"/>
+        </w:numPr>
+        <w:spacing w:after="0" w:before="120"/>
+      </w:pPr>
+      <w:r>
+        <w:rPr>
+          <w:b/>
+          <w:bCs/>
+        </w:rPr>
+        <w:t xml:space="preserve">What is its climate like?</w:t>
+      </w:r>
+    </w:p>
+    <w:p>
+      <w:pPr>
+        <w:spacing w:after="120"/>
+        <w:ind w:left="440"/>
+      </w:pPr>
+    </w:p>
+    <w:p>
+      <w:pPr>
+        <w:pStyle w:val="ListParagraph"/>
+        <w:keepNext/>
+        <w:numPr>
+          <w:ilvl w:val="0"/>
+          <w:numId w:val="2"/>
+        </w:numPr>
+        <w:spacing w:after="0" w:before="120"/>
+      </w:pPr>
+      <w:r>
+        <w:rPr>
+          <w:b/>
+          <w:bCs/>
+        </w:rPr>
+        <w:t xml:space="preserve">What are the major crops?</w:t>
+      </w:r>
+    </w:p>
+    <w:p>
+      <w:pPr>
+        <w:spacing w:after="120"/>
+        <w:ind w:left="440"/>
+      </w:pPr>
+    </w:p>
+    <w:p>
+      <w:pPr>
+        <w:pStyle w:val="ListParagraph"/>
+        <w:keepNext/>
+        <w:numPr>
+          <w:ilvl w:val="0"/>
+          <w:numId w:val="2"/>
+        </w:numPr>
+        <w:spacing w:after="0" w:before="120"/>
+      </w:pPr>
+      <w:r>
+        <w:rPr>
+          <w:b/>
+          <w:bCs/>
+        </w:rPr>
+        <w:t xml:space="preserve">What is the district headquarters?</w:t>
+      </w:r>
+    </w:p>
+    <w:p>
+      <w:pPr>
+        <w:spacing w:after="120"/>
+        <w:ind w:left="440"/>
+      </w:pPr>
+    </w:p>
+    <w:p>
+      <w:pPr>
+        <w:pStyle w:val="ListParagraph"/>
+        <w:keepNext/>
+        <w:numPr>
+          <w:ilvl w:val="0"/>
+          <w:numId w:val="2"/>
+        </w:numPr>
+        <w:spacing w:after="0" w:before="120"/>
+      </w:pPr>
+      <w:r>
+        <w:rPr>
+          <w:b/>
+          <w:bCs/>
+        </w:rPr>
+        <w:t xml:space="preserve">How many tehsils are there?</w:t>
+      </w:r>
+    </w:p>
+    <w:p>
+      <w:pPr>
+        <w:spacing w:after="120"/>
+        <w:ind w:left="440"/>
+      </w:pPr>
+    </w:p>
+    <w:p>
+      <w:pPr>
+        <w:pStyle w:val="ListParagraph"/>
+        <w:keepNext/>
+        <w:numPr>
+          <w:ilvl w:val="0"/>
+          <w:numId w:val="2"/>
+        </w:numPr>
+        <w:spacing w:after="0" w:before="120"/>
+      </w:pPr>
+      <w:r>
+        <w:rPr>
+          <w:b/>
+          <w:bCs/>
+        </w:rPr>
+        <w:t xml:space="preserve">Who is the District Magistrate?</w:t>
+      </w:r>
+    </w:p>
+    <w:p>
+      <w:pPr>
+        <w:spacing w:after="120"/>
+        <w:ind w:left="440"/>
+      </w:pPr>
+    </w:p>
+    <w:p>
+      <w:pPr>
+        <w:pStyle w:val="ListParagraph"/>
+        <w:keepNext/>
+        <w:numPr>
+          <w:ilvl w:val="0"/>
+          <w:numId w:val="2"/>
+        </w:numPr>
+        <w:spacing w:after="0" w:before="120"/>
+      </w:pPr>
+      <w:r>
+        <w:rPr>
+          <w:b/>
+          <w:bCs/>
+        </w:rPr>
+        <w:t xml:space="preserve">Who is the Superintendent of Police?</w:t>
+      </w:r>
+    </w:p>
+    <w:p>
+      <w:pPr>
+        <w:spacing w:after="120"/>
+        <w:ind w:left="440"/>
+      </w:pPr>
+    </w:p>
+    <w:p>
+      <w:pPr>
+        <w:pStyle w:val="ListParagraph"/>
+        <w:keepNext/>
+        <w:numPr>
+          <w:ilvl w:val="0"/>
+          <w:numId w:val="2"/>
+        </w:numPr>
+        <w:spacing w:after="0" w:before="120"/>
+      </w:pPr>
+      <w:r>
+        <w:rPr>
+          <w:b/>
+          <w:bCs/>
+        </w:rPr>
+        <w:t xml:space="preserve">What are the major administrative challenges?</w:t>
+      </w:r>
+    </w:p>
+    <w:p>
+      <w:pPr>
+        <w:spacing w:after="120"/>
+        <w:ind w:left="440"/>
+      </w:pPr>
+    </w:p>
+    <w:p>
+      <w:pPr>
+        <w:pStyle w:val="ListParagraph"/>
+        <w:keepNext/>
+        <w:numPr>
+          <w:ilvl w:val="0"/>
+          <w:numId w:val="2"/>
+        </w:numPr>
+        <w:spacing w:after="0" w:before="120"/>
+      </w:pPr>
+      <w:r>
+        <w:rPr>
+          <w:b/>
+          <w:bCs/>
+        </w:rPr>
+        <w:t xml:space="preserve">What are the important institutions in Azamgarh?</w:t>
+      </w:r>
+    </w:p>
+    <w:p>
+      <w:pPr>
+        <w:spacing w:after="120"/>
+        <w:ind w:left="440"/>
+      </w:pPr>
+    </w:p>
+    <w:p>
+      <w:pPr>
+        <w:pStyle w:val="ListParagraph"/>
+        <w:keepNext/>
+        <w:numPr>
+          <w:ilvl w:val="0"/>
+          <w:numId w:val="2"/>
+        </w:numPr>
+        <w:spacing w:after="0" w:before="120"/>
+      </w:pPr>
+      <w:r>
+        <w:rPr>
+          <w:b/>
+          <w:bCs/>
+        </w:rPr>
+        <w:t xml:space="preserve">What is the state of education in Azamgarh?</w:t>
+      </w:r>
+    </w:p>
+    <w:p>
+      <w:pPr>
+        <w:spacing w:after="120"/>
+        <w:ind w:left="440"/>
+      </w:pPr>
+    </w:p>
+    <w:p>
+      <w:pPr>
+        <w:pStyle w:val="ListParagraph"/>
+        <w:keepNext/>
+        <w:numPr>
+          <w:ilvl w:val="0"/>
+          <w:numId w:val="2"/>
+        </w:numPr>
+        <w:spacing w:after="0" w:before="120"/>
+      </w:pPr>
+      <w:r>
+        <w:rPr>
+          <w:b/>
+          <w:bCs/>
+        </w:rPr>
+        <w:t xml:space="preserve">What are the current issues in Azamgarh?</w:t>
+      </w:r>
+    </w:p>
+    <w:p>
+      <w:pPr>
+        <w:spacing w:after="120"/>
+        <w:ind w:left="440"/>
+      </w:pPr>
+    </w:p>
+    <w:p>
+      <w:pPr>
+        <w:pStyle w:val="Heading1"/>
+      </w:pPr>
+      <w:r>
+        <w:t xml:space="preserve">PIQ 4 – Residence: Azamgarh History</w:t>
+      </w:r>
+    </w:p>
+    <w:p>
+      <w:pPr>
+        <w:pStyle w:val="ListParagraph"/>
+        <w:keepNext/>
+        <w:numPr>
+          <w:ilvl w:val="0"/>
+          <w:numId w:val="2"/>
+        </w:numPr>
+        <w:spacing w:after="0" w:before="120"/>
+      </w:pPr>
+      <w:r>
+        <w:rPr>
+          <w:b/>
+          <w:bCs/>
+        </w:rPr>
+        <w:t xml:space="preserve">What is Azamgarh known for historically?</w:t>
+      </w:r>
+    </w:p>
+    <w:p>
+      <w:pPr>
+        <w:spacing w:after="120"/>
+        <w:ind w:left="440"/>
+      </w:pPr>
+    </w:p>
+    <w:p>
+      <w:pPr>
+        <w:pStyle w:val="ListParagraph"/>
+        <w:keepNext/>
+        <w:numPr>
+          <w:ilvl w:val="0"/>
+          <w:numId w:val="2"/>
+        </w:numPr>
+        <w:spacing w:after="0" w:before="120"/>
+      </w:pPr>
+      <w:r>
+        <w:rPr>
+          <w:b/>
+          <w:bCs/>
+        </w:rPr>
+        <w:t xml:space="preserve">When was Azamgarh district established?</w:t>
+      </w:r>
+    </w:p>
+    <w:p>
+      <w:pPr>
+        <w:spacing w:after="120"/>
+        <w:ind w:left="440"/>
+      </w:pPr>
+    </w:p>
+    <w:p>
+      <w:pPr>
+        <w:pStyle w:val="ListParagraph"/>
+        <w:keepNext/>
+        <w:numPr>
+          <w:ilvl w:val="0"/>
+          <w:numId w:val="2"/>
+        </w:numPr>
+        <w:spacing w:after="0" w:before="120"/>
+      </w:pPr>
+      <w:r>
+        <w:rPr>
+          <w:b/>
+          <w:bCs/>
+        </w:rPr>
+        <w:t xml:space="preserve">What was the region's role in the Revolt of 1857?</w:t>
+      </w:r>
+    </w:p>
+    <w:p>
+      <w:pPr>
+        <w:spacing w:after="120"/>
+        <w:ind w:left="440"/>
+      </w:pPr>
+    </w:p>
+    <w:p>
+      <w:pPr>
+        <w:pStyle w:val="ListParagraph"/>
+        <w:keepNext/>
+        <w:numPr>
+          <w:ilvl w:val="0"/>
+          <w:numId w:val="2"/>
+        </w:numPr>
+        <w:spacing w:after="0" w:before="120"/>
+      </w:pPr>
+      <w:r>
+        <w:rPr>
+          <w:b/>
+          <w:bCs/>
+        </w:rPr>
+        <w:t xml:space="preserve">Which historical personalities are associated with Azamgarh?</w:t>
+      </w:r>
+    </w:p>
+    <w:p>
+      <w:pPr>
+        <w:spacing w:after="120"/>
+        <w:ind w:left="440"/>
+      </w:pPr>
+    </w:p>
+    <w:p>
+      <w:pPr>
+        <w:pStyle w:val="ListParagraph"/>
+        <w:keepNext/>
+        <w:numPr>
+          <w:ilvl w:val="0"/>
+          <w:numId w:val="2"/>
+        </w:numPr>
+        <w:spacing w:after="0" w:before="120"/>
+      </w:pPr>
+      <w:r>
+        <w:rPr>
+          <w:b/>
+          <w:bCs/>
+        </w:rPr>
+        <w:t xml:space="preserve">What is Azamgarh's significance in India's freedom movement?</w:t>
+      </w:r>
+    </w:p>
+    <w:p>
+      <w:pPr>
+        <w:spacing w:after="120"/>
+        <w:ind w:left="440"/>
+      </w:pPr>
+    </w:p>
+    <w:p>
+      <w:pPr>
+        <w:pStyle w:val="ListParagraph"/>
+        <w:keepNext/>
+        <w:numPr>
+          <w:ilvl w:val="0"/>
+          <w:numId w:val="2"/>
+        </w:numPr>
+        <w:spacing w:after="0" w:before="120"/>
+      </w:pPr>
+      <w:r>
+        <w:rPr>
+          <w:b/>
+          <w:bCs/>
+        </w:rPr>
+        <w:t xml:space="preserve">Which historical sites are in or around the district?</w:t>
+      </w:r>
+    </w:p>
+    <w:p>
+      <w:pPr>
+        <w:spacing w:after="120"/>
+        <w:ind w:left="440"/>
+      </w:pPr>
+    </w:p>
+    <w:p>
+      <w:pPr>
+        <w:pStyle w:val="Heading1"/>
+      </w:pPr>
+      <w:r>
+        <w:t xml:space="preserve">PIQ 4 – Residence: Azamgarh Culture &amp; Personalities</w:t>
+      </w:r>
+    </w:p>
+    <w:p>
+      <w:pPr>
+        <w:pStyle w:val="ListParagraph"/>
+        <w:keepNext/>
+        <w:numPr>
+          <w:ilvl w:val="0"/>
+          <w:numId w:val="2"/>
+        </w:numPr>
+        <w:spacing w:after="0" w:before="120"/>
+      </w:pPr>
+      <w:r>
+        <w:rPr>
+          <w:b/>
+          <w:bCs/>
+        </w:rPr>
+        <w:t xml:space="preserve">Which famous personalities belong to Azamgarh?</w:t>
+      </w:r>
+    </w:p>
+    <w:p>
+      <w:pPr>
+        <w:spacing w:after="120"/>
+        <w:ind w:left="440"/>
+      </w:pPr>
+    </w:p>
+    <w:p>
+      <w:pPr>
+        <w:pStyle w:val="ListParagraph"/>
+        <w:keepNext/>
+        <w:numPr>
+          <w:ilvl w:val="0"/>
+          <w:numId w:val="2"/>
+        </w:numPr>
+        <w:spacing w:after="0" w:before="120"/>
+      </w:pPr>
+      <w:r>
+        <w:rPr>
+          <w:b/>
+          <w:bCs/>
+        </w:rPr>
+        <w:t xml:space="preserve">What is Azamgarh's contribution to literature?</w:t>
+      </w:r>
+    </w:p>
+    <w:p>
+      <w:pPr>
+        <w:spacing w:after="120"/>
+        <w:ind w:left="440"/>
+      </w:pPr>
+    </w:p>
+    <w:p>
+      <w:pPr>
+        <w:pStyle w:val="ListParagraph"/>
+        <w:keepNext/>
+        <w:numPr>
+          <w:ilvl w:val="0"/>
+          <w:numId w:val="2"/>
+        </w:numPr>
+        <w:spacing w:after="0" w:before="120"/>
+      </w:pPr>
+      <w:r>
+        <w:rPr>
+          <w:b/>
+          <w:bCs/>
+        </w:rPr>
+        <w:t xml:space="preserve">Which languages and dialects are commonly spoken?</w:t>
+      </w:r>
+    </w:p>
+    <w:p>
+      <w:pPr>
+        <w:spacing w:after="120"/>
+        <w:ind w:left="440"/>
+      </w:pPr>
+    </w:p>
+    <w:p>
+      <w:pPr>
+        <w:pStyle w:val="ListParagraph"/>
+        <w:keepNext/>
+        <w:numPr>
+          <w:ilvl w:val="0"/>
+          <w:numId w:val="2"/>
+        </w:numPr>
+        <w:spacing w:after="0" w:before="120"/>
+      </w:pPr>
+      <w:r>
+        <w:rPr>
+          <w:b/>
+          <w:bCs/>
+        </w:rPr>
+        <w:t xml:space="preserve">Which festivals are commonly celebrated?</w:t>
+      </w:r>
+    </w:p>
+    <w:p>
+      <w:pPr>
+        <w:spacing w:after="120"/>
+        <w:ind w:left="440"/>
+      </w:pPr>
+    </w:p>
+    <w:p>
+      <w:pPr>
+        <w:pStyle w:val="ListParagraph"/>
+        <w:keepNext/>
+        <w:numPr>
+          <w:ilvl w:val="0"/>
+          <w:numId w:val="2"/>
+        </w:numPr>
+        <w:spacing w:after="0" w:before="120"/>
+      </w:pPr>
+      <w:r>
+        <w:rPr>
+          <w:b/>
+          <w:bCs/>
+        </w:rPr>
+        <w:t xml:space="preserve">What traditional food is popular?</w:t>
+      </w:r>
+    </w:p>
+    <w:p>
+      <w:pPr>
+        <w:spacing w:after="120"/>
+        <w:ind w:left="440"/>
+      </w:pPr>
+    </w:p>
+    <w:p>
+      <w:pPr>
+        <w:pStyle w:val="ListParagraph"/>
+        <w:keepNext/>
+        <w:numPr>
+          <w:ilvl w:val="0"/>
+          <w:numId w:val="2"/>
+        </w:numPr>
+        <w:spacing w:after="0" w:before="120"/>
+      </w:pPr>
+      <w:r>
+        <w:rPr>
+          <w:b/>
+          <w:bCs/>
+        </w:rPr>
+        <w:t xml:space="preserve">What makes the region's culture distinct?</w:t>
+      </w:r>
+    </w:p>
+    <w:p>
+      <w:pPr>
+        <w:spacing w:after="120"/>
+        <w:ind w:left="440"/>
+      </w:pPr>
+    </w:p>
+    <w:p>
+      <w:pPr>
+        <w:pStyle w:val="Heading1"/>
+      </w:pPr>
+      <w:r>
+        <w:t xml:space="preserve">PIQ 4 – Residence: Azamgarh Economy &amp; Development</w:t>
+      </w:r>
+    </w:p>
+    <w:p>
+      <w:pPr>
+        <w:pStyle w:val="ListParagraph"/>
+        <w:keepNext/>
+        <w:numPr>
+          <w:ilvl w:val="0"/>
+          <w:numId w:val="2"/>
+        </w:numPr>
+        <w:spacing w:after="0" w:before="120"/>
+      </w:pPr>
+      <w:r>
+        <w:rPr>
+          <w:b/>
+          <w:bCs/>
+        </w:rPr>
+        <w:t xml:space="preserve">What are the major sources of livelihood?</w:t>
+      </w:r>
+    </w:p>
+    <w:p>
+      <w:pPr>
+        <w:spacing w:after="120"/>
+        <w:ind w:left="440"/>
+      </w:pPr>
+    </w:p>
+    <w:p>
+      <w:pPr>
+        <w:pStyle w:val="ListParagraph"/>
+        <w:keepNext/>
+        <w:numPr>
+          <w:ilvl w:val="0"/>
+          <w:numId w:val="2"/>
+        </w:numPr>
+        <w:spacing w:after="0" w:before="120"/>
+      </w:pPr>
+      <w:r>
+        <w:rPr>
+          <w:b/>
+          <w:bCs/>
+        </w:rPr>
+        <w:t xml:space="preserve">What are the major industries?</w:t>
+      </w:r>
+    </w:p>
+    <w:p>
+      <w:pPr>
+        <w:spacing w:after="120"/>
+        <w:ind w:left="440"/>
+      </w:pPr>
+    </w:p>
+    <w:p>
+      <w:pPr>
+        <w:pStyle w:val="ListParagraph"/>
+        <w:keepNext/>
+        <w:numPr>
+          <w:ilvl w:val="0"/>
+          <w:numId w:val="2"/>
+        </w:numPr>
+        <w:spacing w:after="0" w:before="120"/>
+      </w:pPr>
+      <w:r>
+        <w:rPr>
+          <w:b/>
+          <w:bCs/>
+        </w:rPr>
+        <w:t xml:space="preserve">Which agricultural products are important?</w:t>
+      </w:r>
+    </w:p>
+    <w:p>
+      <w:pPr>
+        <w:spacing w:after="120"/>
+        <w:ind w:left="440"/>
+      </w:pPr>
+    </w:p>
+    <w:p>
+      <w:pPr>
+        <w:pStyle w:val="ListParagraph"/>
+        <w:keepNext/>
+        <w:numPr>
+          <w:ilvl w:val="0"/>
+          <w:numId w:val="2"/>
+        </w:numPr>
+        <w:spacing w:after="0" w:before="120"/>
+      </w:pPr>
+      <w:r>
+        <w:rPr>
+          <w:b/>
+          <w:bCs/>
+        </w:rPr>
+        <w:t xml:space="preserve">What are the major development challenges?</w:t>
+      </w:r>
+    </w:p>
+    <w:p>
+      <w:pPr>
+        <w:spacing w:after="120"/>
+        <w:ind w:left="440"/>
+      </w:pPr>
+    </w:p>
+    <w:p>
+      <w:pPr>
+        <w:pStyle w:val="ListParagraph"/>
+        <w:keepNext/>
+        <w:numPr>
+          <w:ilvl w:val="0"/>
+          <w:numId w:val="2"/>
+        </w:numPr>
+        <w:spacing w:after="0" w:before="120"/>
+      </w:pPr>
+      <w:r>
+        <w:rPr>
+          <w:b/>
+          <w:bCs/>
+        </w:rPr>
+        <w:t xml:space="preserve">Why do people from your area migrate to bigger cities?</w:t>
+      </w:r>
+    </w:p>
+    <w:p>
+      <w:pPr>
+        <w:spacing w:after="120"/>
+        <w:ind w:left="440"/>
+      </w:pPr>
+    </w:p>
+    <w:p>
+      <w:pPr>
+        <w:pStyle w:val="ListParagraph"/>
+        <w:keepNext/>
+        <w:numPr>
+          <w:ilvl w:val="0"/>
+          <w:numId w:val="2"/>
+        </w:numPr>
+        <w:spacing w:after="0" w:before="120"/>
+      </w:pPr>
+      <w:r>
+        <w:rPr>
+          <w:b/>
+          <w:bCs/>
+        </w:rPr>
+        <w:t xml:space="preserve">What could create more jobs locally?</w:t>
+      </w:r>
+    </w:p>
+    <w:p>
+      <w:pPr>
+        <w:spacing w:after="120"/>
+        <w:ind w:left="440"/>
+      </w:pPr>
+    </w:p>
+    <w:p>
+      <w:pPr>
+        <w:pStyle w:val="ListParagraph"/>
+        <w:keepNext/>
+        <w:numPr>
+          <w:ilvl w:val="0"/>
+          <w:numId w:val="2"/>
+        </w:numPr>
+        <w:spacing w:after="0" w:before="120"/>
+      </w:pPr>
+      <w:r>
+        <w:rPr>
+          <w:b/>
+          <w:bCs/>
+        </w:rPr>
+        <w:t xml:space="preserve">How can agriculture in the region be modernised?</w:t>
+      </w:r>
+    </w:p>
+    <w:p>
+      <w:pPr>
+        <w:spacing w:after="120"/>
+        <w:ind w:left="440"/>
+      </w:pPr>
+    </w:p>
+    <w:p>
+      <w:pPr>
+        <w:pStyle w:val="ListParagraph"/>
+        <w:keepNext/>
+        <w:numPr>
+          <w:ilvl w:val="0"/>
+          <w:numId w:val="2"/>
+        </w:numPr>
+        <w:spacing w:after="0" w:before="120"/>
+      </w:pPr>
+      <w:r>
+        <w:rPr>
+          <w:b/>
+          <w:bCs/>
+        </w:rPr>
+        <w:t xml:space="preserve">What infrastructure improvements are needed?</w:t>
+      </w:r>
+    </w:p>
+    <w:p>
+      <w:pPr>
+        <w:spacing w:after="120"/>
+        <w:ind w:left="440"/>
+      </w:pPr>
+    </w:p>
+    <w:p>
+      <w:pPr>
+        <w:pStyle w:val="Heading1"/>
+      </w:pPr>
+      <w:r>
+        <w:t xml:space="preserve">PIQ 4 – Residence: Personal</w:t>
+      </w:r>
+    </w:p>
+    <w:p>
+      <w:pPr>
+        <w:pStyle w:val="ListParagraph"/>
+        <w:keepNext/>
+        <w:numPr>
+          <w:ilvl w:val="0"/>
+          <w:numId w:val="2"/>
+        </w:numPr>
+        <w:spacing w:after="0" w:before="120"/>
+      </w:pPr>
+      <w:r>
+        <w:rPr>
+          <w:b/>
+          <w:bCs/>
+        </w:rPr>
+        <w:t xml:space="preserve">If you became DM of Azamgarh for one year, what would you change?</w:t>
+      </w:r>
+    </w:p>
+    <w:p>
+      <w:pPr>
+        <w:spacing w:after="120"/>
+        <w:ind w:left="440"/>
+      </w:pPr>
+    </w:p>
+    <w:p>
+      <w:pPr>
+        <w:pStyle w:val="ListParagraph"/>
+        <w:keepNext/>
+        <w:numPr>
+          <w:ilvl w:val="0"/>
+          <w:numId w:val="2"/>
+        </w:numPr>
+        <w:spacing w:after="0" w:before="120"/>
+      </w:pPr>
+      <w:r>
+        <w:rPr>
+          <w:b/>
+          <w:bCs/>
+        </w:rPr>
+        <w:t xml:space="preserve">What have you personally done to solve a local problem?</w:t>
+      </w:r>
+    </w:p>
+    <w:p>
+      <w:pPr>
+        <w:spacing w:after="120"/>
+        <w:ind w:left="440"/>
+      </w:pPr>
+    </w:p>
+    <w:p>
+      <w:pPr>
+        <w:pStyle w:val="ListParagraph"/>
+        <w:keepNext/>
+        <w:numPr>
+          <w:ilvl w:val="0"/>
+          <w:numId w:val="2"/>
+        </w:numPr>
+        <w:spacing w:after="0" w:before="120"/>
+      </w:pPr>
+      <w:r>
+        <w:rPr>
+          <w:b/>
+          <w:bCs/>
+        </w:rPr>
+        <w:t xml:space="preserve">Would you prefer living in Azamgarh or a big city?</w:t>
+      </w:r>
+    </w:p>
+    <w:p>
+      <w:pPr>
+        <w:spacing w:after="120"/>
+        <w:ind w:left="440"/>
+      </w:pPr>
+    </w:p>
+    <w:p>
+      <w:pPr>
+        <w:pStyle w:val="ListParagraph"/>
+        <w:keepNext/>
+        <w:numPr>
+          <w:ilvl w:val="0"/>
+          <w:numId w:val="2"/>
+        </w:numPr>
+        <w:spacing w:after="0" w:before="120"/>
+      </w:pPr>
+      <w:r>
+        <w:rPr>
+          <w:b/>
+          <w:bCs/>
+        </w:rPr>
+        <w:t xml:space="preserve">How has growing up there shaped you?</w:t>
+      </w:r>
+    </w:p>
+    <w:p>
+      <w:pPr>
+        <w:spacing w:after="120"/>
+        <w:ind w:left="440"/>
+      </w:pPr>
+    </w:p>
+    <w:p>
+      <w:pPr>
+        <w:pStyle w:val="Heading1"/>
+      </w:pPr>
+      <w:r>
+        <w:t xml:space="preserve">PIQ 4 – Residence: Azamgarh vs Lucknow</w:t>
+      </w:r>
+    </w:p>
+    <w:p>
+      <w:pPr>
+        <w:pStyle w:val="ListParagraph"/>
+        <w:keepNext/>
+        <w:numPr>
+          <w:ilvl w:val="0"/>
+          <w:numId w:val="2"/>
+        </w:numPr>
+        <w:spacing w:after="0" w:before="120"/>
+      </w:pPr>
+      <w:r>
+        <w:rPr>
+          <w:b/>
+          <w:bCs/>
+        </w:rPr>
+        <w:t xml:space="preserve">How is Azamgarh different from Lucknow?</w:t>
+      </w:r>
+    </w:p>
+    <w:p>
+      <w:pPr>
+        <w:spacing w:after="120"/>
+        <w:ind w:left="440"/>
+      </w:pPr>
+    </w:p>
+    <w:p>
+      <w:pPr>
+        <w:pStyle w:val="ListParagraph"/>
+        <w:keepNext/>
+        <w:numPr>
+          <w:ilvl w:val="0"/>
+          <w:numId w:val="2"/>
+        </w:numPr>
+        <w:spacing w:after="0" w:before="120"/>
+      </w:pPr>
+      <w:r>
+        <w:rPr>
+          <w:b/>
+          <w:bCs/>
+        </w:rPr>
+        <w:t xml:space="preserve">Which do you prefer, Azamgarh or Lucknow, and why?</w:t>
+      </w:r>
+    </w:p>
+    <w:p>
+      <w:pPr>
+        <w:spacing w:after="120"/>
+        <w:ind w:left="440"/>
+      </w:pPr>
+    </w:p>
+    <w:p>
+      <w:pPr>
+        <w:pStyle w:val="ListParagraph"/>
+        <w:keepNext/>
+        <w:numPr>
+          <w:ilvl w:val="0"/>
+          <w:numId w:val="2"/>
+        </w:numPr>
+        <w:spacing w:after="0" w:before="120"/>
+      </w:pPr>
+      <w:r>
+        <w:rPr>
+          <w:b/>
+          <w:bCs/>
+        </w:rPr>
+        <w:t xml:space="preserve">What does Lucknow offer that Azamgarh doesn't?</w:t>
+      </w:r>
+    </w:p>
+    <w:p>
+      <w:pPr>
+        <w:spacing w:after="120"/>
+        <w:ind w:left="440"/>
+      </w:pPr>
+    </w:p>
+    <w:p>
+      <w:pPr>
+        <w:pStyle w:val="ListParagraph"/>
+        <w:keepNext/>
+        <w:numPr>
+          <w:ilvl w:val="0"/>
+          <w:numId w:val="2"/>
+        </w:numPr>
+        <w:spacing w:after="0" w:before="120"/>
+      </w:pPr>
+      <w:r>
+        <w:rPr>
+          <w:b/>
+          <w:bCs/>
+        </w:rPr>
+        <w:t xml:space="preserve">What does Azamgarh offer that Lucknow doesn't?</w:t>
+      </w:r>
+    </w:p>
+    <w:p>
+      <w:pPr>
+        <w:spacing w:after="120"/>
+        <w:ind w:left="440"/>
+      </w:pPr>
+    </w:p>
+    <w:p>
+      <w:pPr>
+        <w:pStyle w:val="ListParagraph"/>
+        <w:keepNext/>
+        <w:numPr>
+          <w:ilvl w:val="0"/>
+          <w:numId w:val="2"/>
+        </w:numPr>
+        <w:spacing w:after="0" w:before="120"/>
+      </w:pPr>
+      <w:r>
+        <w:rPr>
+          <w:b/>
+          <w:bCs/>
+        </w:rPr>
+        <w:t xml:space="preserve">How did moving between places affect you?</w:t>
+      </w:r>
+    </w:p>
+    <w:p>
+      <w:pPr>
+        <w:spacing w:after="120"/>
+        <w:ind w:left="440"/>
+      </w:pPr>
+    </w:p>
+    <w:p>
+      <w:pPr>
+        <w:pStyle w:val="ListParagraph"/>
+        <w:keepNext/>
+        <w:numPr>
+          <w:ilvl w:val="0"/>
+          <w:numId w:val="2"/>
+        </w:numPr>
+        <w:spacing w:after="0" w:before="120"/>
+      </w:pPr>
+      <w:r>
+        <w:rPr>
+          <w:b/>
+          <w:bCs/>
+        </w:rPr>
+        <w:t xml:space="preserve">Which place was better for your education?</w:t>
+      </w:r>
+    </w:p>
+    <w:p>
+      <w:pPr>
+        <w:spacing w:after="120"/>
+        <w:ind w:left="440"/>
+      </w:pPr>
+    </w:p>
+    <w:p>
+      <w:pPr>
+        <w:pStyle w:val="ListParagraph"/>
+        <w:keepNext/>
+        <w:numPr>
+          <w:ilvl w:val="0"/>
+          <w:numId w:val="2"/>
+        </w:numPr>
+        <w:spacing w:after="0" w:before="120"/>
+      </w:pPr>
+      <w:r>
+        <w:rPr>
+          <w:b/>
+          <w:bCs/>
+        </w:rPr>
+        <w:t xml:space="preserve">What differences did you see in people's lifestyles?</w:t>
       </w:r>
     </w:p>
     <w:p>

</xml_diff>

<commit_message>
Add PIQ 5 (Current Residence) questions to SSB question sheet
Co-Authored-By: Claude Opus 5.5 <noreply@anthropic.com>
Claude-Session: https://claude.ai/code/session_01TypcejD48cCyAqfjtUUit5
</commit_message>
<xml_diff>
--- a/SSB_Question_Sheet.docx
+++ b/SSB_Question_Sheet.docx
@@ -5292,6 +5292,1646 @@
           <w:bCs/>
         </w:rPr>
         <w:t xml:space="preserve">What differences did you see in people's lifestyles?</w:t>
+      </w:r>
+    </w:p>
+    <w:p>
+      <w:pPr>
+        <w:spacing w:after="120"/>
+        <w:ind w:left="440"/>
+      </w:pPr>
+    </w:p>
+    <w:p>
+      <w:pPr>
+        <w:pStyle w:val="Heading1"/>
+      </w:pPr>
+      <w:r>
+        <w:t xml:space="preserve">PIQ 5 – Current Residence</w:t>
+      </w:r>
+    </w:p>
+    <w:p>
+      <w:pPr>
+        <w:pStyle w:val="ListParagraph"/>
+        <w:keepNext/>
+        <w:numPr>
+          <w:ilvl w:val="0"/>
+          <w:numId w:val="2"/>
+        </w:numPr>
+        <w:spacing w:after="0" w:before="120"/>
+      </w:pPr>
+      <w:r>
+        <w:rPr>
+          <w:b/>
+          <w:bCs/>
+        </w:rPr>
+        <w:t xml:space="preserve">Where are you currently living?</w:t>
+      </w:r>
+    </w:p>
+    <w:p>
+      <w:pPr>
+        <w:spacing w:after="120"/>
+        <w:ind w:left="440"/>
+      </w:pPr>
+    </w:p>
+    <w:p>
+      <w:pPr>
+        <w:pStyle w:val="ListParagraph"/>
+        <w:keepNext/>
+        <w:numPr>
+          <w:ilvl w:val="0"/>
+          <w:numId w:val="2"/>
+        </w:numPr>
+        <w:spacing w:after="0" w:before="120"/>
+      </w:pPr>
+      <w:r>
+        <w:rPr>
+          <w:b/>
+          <w:bCs/>
+        </w:rPr>
+        <w:t xml:space="preserve">Why are you living in Greater Noida?</w:t>
+      </w:r>
+    </w:p>
+    <w:p>
+      <w:pPr>
+        <w:spacing w:after="120"/>
+        <w:ind w:left="440"/>
+      </w:pPr>
+    </w:p>
+    <w:p>
+      <w:pPr>
+        <w:pStyle w:val="ListParagraph"/>
+        <w:keepNext/>
+        <w:numPr>
+          <w:ilvl w:val="0"/>
+          <w:numId w:val="2"/>
+        </w:numPr>
+        <w:spacing w:after="0" w:before="120"/>
+      </w:pPr>
+      <w:r>
+        <w:rPr>
+          <w:b/>
+          <w:bCs/>
+        </w:rPr>
+        <w:t xml:space="preserve">Since when have you been living there?</w:t>
+      </w:r>
+    </w:p>
+    <w:p>
+      <w:pPr>
+        <w:spacing w:after="120"/>
+        <w:ind w:left="440"/>
+      </w:pPr>
+    </w:p>
+    <w:p>
+      <w:pPr>
+        <w:pStyle w:val="ListParagraph"/>
+        <w:keepNext/>
+        <w:numPr>
+          <w:ilvl w:val="0"/>
+          <w:numId w:val="2"/>
+        </w:numPr>
+        <w:spacing w:after="0" w:before="120"/>
+      </w:pPr>
+      <w:r>
+        <w:rPr>
+          <w:b/>
+          <w:bCs/>
+        </w:rPr>
+        <w:t xml:space="preserve">Who do you live with?</w:t>
+      </w:r>
+    </w:p>
+    <w:p>
+      <w:pPr>
+        <w:spacing w:after="120"/>
+        <w:ind w:left="440"/>
+      </w:pPr>
+    </w:p>
+    <w:p>
+      <w:pPr>
+        <w:pStyle w:val="ListParagraph"/>
+        <w:keepNext/>
+        <w:numPr>
+          <w:ilvl w:val="0"/>
+          <w:numId w:val="2"/>
+        </w:numPr>
+        <w:spacing w:after="0" w:before="120"/>
+      </w:pPr>
+      <w:r>
+        <w:rPr>
+          <w:b/>
+          <w:bCs/>
+        </w:rPr>
+        <w:t xml:space="preserve">Is it your own house, a rented place or a hostel?</w:t>
+      </w:r>
+    </w:p>
+    <w:p>
+      <w:pPr>
+        <w:spacing w:after="120"/>
+        <w:ind w:left="440"/>
+      </w:pPr>
+    </w:p>
+    <w:p>
+      <w:pPr>
+        <w:pStyle w:val="ListParagraph"/>
+        <w:keepNext/>
+        <w:numPr>
+          <w:ilvl w:val="0"/>
+          <w:numId w:val="2"/>
+        </w:numPr>
+        <w:spacing w:after="0" w:before="120"/>
+      </w:pPr>
+      <w:r>
+        <w:rPr>
+          <w:b/>
+          <w:bCs/>
+        </w:rPr>
+        <w:t xml:space="preserve">What is your daily routine there?</w:t>
+      </w:r>
+    </w:p>
+    <w:p>
+      <w:pPr>
+        <w:spacing w:after="120"/>
+        <w:ind w:left="440"/>
+      </w:pPr>
+    </w:p>
+    <w:p>
+      <w:pPr>
+        <w:pStyle w:val="ListParagraph"/>
+        <w:keepNext/>
+        <w:numPr>
+          <w:ilvl w:val="0"/>
+          <w:numId w:val="2"/>
+        </w:numPr>
+        <w:spacing w:after="0" w:before="120"/>
+      </w:pPr>
+      <w:r>
+        <w:rPr>
+          <w:b/>
+          <w:bCs/>
+        </w:rPr>
+        <w:t xml:space="preserve">What do you like about living in Greater Noida?</w:t>
+      </w:r>
+    </w:p>
+    <w:p>
+      <w:pPr>
+        <w:spacing w:after="120"/>
+        <w:ind w:left="440"/>
+      </w:pPr>
+    </w:p>
+    <w:p>
+      <w:pPr>
+        <w:pStyle w:val="ListParagraph"/>
+        <w:keepNext/>
+        <w:numPr>
+          <w:ilvl w:val="0"/>
+          <w:numId w:val="2"/>
+        </w:numPr>
+        <w:spacing w:after="0" w:before="120"/>
+      </w:pPr>
+      <w:r>
+        <w:rPr>
+          <w:b/>
+          <w:bCs/>
+        </w:rPr>
+        <w:t xml:space="preserve">What don't you like about it?</w:t>
+      </w:r>
+    </w:p>
+    <w:p>
+      <w:pPr>
+        <w:spacing w:after="120"/>
+        <w:ind w:left="440"/>
+      </w:pPr>
+    </w:p>
+    <w:p>
+      <w:pPr>
+        <w:pStyle w:val="ListParagraph"/>
+        <w:keepNext/>
+        <w:numPr>
+          <w:ilvl w:val="0"/>
+          <w:numId w:val="2"/>
+        </w:numPr>
+        <w:spacing w:after="0" w:before="120"/>
+      </w:pPr>
+      <w:r>
+        <w:rPr>
+          <w:b/>
+          <w:bCs/>
+        </w:rPr>
+        <w:t xml:space="preserve">Would you like to settle there permanently?</w:t>
+      </w:r>
+    </w:p>
+    <w:p>
+      <w:pPr>
+        <w:spacing w:after="120"/>
+        <w:ind w:left="440"/>
+      </w:pPr>
+    </w:p>
+    <w:p>
+      <w:pPr>
+        <w:pStyle w:val="ListParagraph"/>
+        <w:keepNext/>
+        <w:numPr>
+          <w:ilvl w:val="0"/>
+          <w:numId w:val="2"/>
+        </w:numPr>
+        <w:spacing w:after="0" w:before="120"/>
+      </w:pPr>
+      <w:r>
+        <w:rPr>
+          <w:b/>
+          <w:bCs/>
+        </w:rPr>
+        <w:t xml:space="preserve">What have you learned from living independently?</w:t>
+      </w:r>
+    </w:p>
+    <w:p>
+      <w:pPr>
+        <w:spacing w:after="120"/>
+        <w:ind w:left="440"/>
+      </w:pPr>
+    </w:p>
+    <w:p>
+      <w:pPr>
+        <w:pStyle w:val="Heading1"/>
+      </w:pPr>
+      <w:r>
+        <w:t xml:space="preserve">PIQ 5 – Current Residence: Eco Village 2</w:t>
+      </w:r>
+    </w:p>
+    <w:p>
+      <w:pPr>
+        <w:pStyle w:val="ListParagraph"/>
+        <w:keepNext/>
+        <w:numPr>
+          <w:ilvl w:val="0"/>
+          <w:numId w:val="2"/>
+        </w:numPr>
+        <w:spacing w:after="0" w:before="120"/>
+      </w:pPr>
+      <w:r>
+        <w:rPr>
+          <w:b/>
+          <w:bCs/>
+        </w:rPr>
+        <w:t xml:space="preserve">Where exactly is Eco Village 2?</w:t>
+      </w:r>
+    </w:p>
+    <w:p>
+      <w:pPr>
+        <w:spacing w:after="120"/>
+        <w:ind w:left="440"/>
+      </w:pPr>
+    </w:p>
+    <w:p>
+      <w:pPr>
+        <w:pStyle w:val="ListParagraph"/>
+        <w:keepNext/>
+        <w:numPr>
+          <w:ilvl w:val="0"/>
+          <w:numId w:val="2"/>
+        </w:numPr>
+        <w:spacing w:after="0" w:before="120"/>
+      </w:pPr>
+      <w:r>
+        <w:rPr>
+          <w:b/>
+          <w:bCs/>
+        </w:rPr>
+        <w:t xml:space="preserve">Which sector is it in?</w:t>
+      </w:r>
+    </w:p>
+    <w:p>
+      <w:pPr>
+        <w:spacing w:after="120"/>
+        <w:ind w:left="440"/>
+      </w:pPr>
+    </w:p>
+    <w:p>
+      <w:pPr>
+        <w:pStyle w:val="ListParagraph"/>
+        <w:keepNext/>
+        <w:numPr>
+          <w:ilvl w:val="0"/>
+          <w:numId w:val="2"/>
+        </w:numPr>
+        <w:spacing w:after="0" w:before="120"/>
+      </w:pPr>
+      <w:r>
+        <w:rPr>
+          <w:b/>
+          <w:bCs/>
+        </w:rPr>
+        <w:t xml:space="preserve">What are the major landmarks nearby?</w:t>
+      </w:r>
+    </w:p>
+    <w:p>
+      <w:pPr>
+        <w:spacing w:after="120"/>
+        <w:ind w:left="440"/>
+      </w:pPr>
+    </w:p>
+    <w:p>
+      <w:pPr>
+        <w:pStyle w:val="ListParagraph"/>
+        <w:keepNext/>
+        <w:numPr>
+          <w:ilvl w:val="0"/>
+          <w:numId w:val="2"/>
+        </w:numPr>
+        <w:spacing w:after="0" w:before="120"/>
+      </w:pPr>
+      <w:r>
+        <w:rPr>
+          <w:b/>
+          <w:bCs/>
+        </w:rPr>
+        <w:t xml:space="preserve">What is the nearest metro station?</w:t>
+      </w:r>
+    </w:p>
+    <w:p>
+      <w:pPr>
+        <w:spacing w:after="120"/>
+        <w:ind w:left="440"/>
+      </w:pPr>
+    </w:p>
+    <w:p>
+      <w:pPr>
+        <w:pStyle w:val="ListParagraph"/>
+        <w:keepNext/>
+        <w:numPr>
+          <w:ilvl w:val="0"/>
+          <w:numId w:val="2"/>
+        </w:numPr>
+        <w:spacing w:after="0" w:before="120"/>
+      </w:pPr>
+      <w:r>
+        <w:rPr>
+          <w:b/>
+          <w:bCs/>
+        </w:rPr>
+        <w:t xml:space="preserve">What are the major roads near your locality?</w:t>
+      </w:r>
+    </w:p>
+    <w:p>
+      <w:pPr>
+        <w:spacing w:after="120"/>
+        <w:ind w:left="440"/>
+      </w:pPr>
+    </w:p>
+    <w:p>
+      <w:pPr>
+        <w:pStyle w:val="ListParagraph"/>
+        <w:keepNext/>
+        <w:numPr>
+          <w:ilvl w:val="0"/>
+          <w:numId w:val="2"/>
+        </w:numPr>
+        <w:spacing w:after="0" w:before="120"/>
+      </w:pPr>
+      <w:r>
+        <w:rPr>
+          <w:b/>
+          <w:bCs/>
+        </w:rPr>
+        <w:t xml:space="preserve">What schools, hospitals and markets are nearby?</w:t>
+      </w:r>
+    </w:p>
+    <w:p>
+      <w:pPr>
+        <w:spacing w:after="120"/>
+        <w:ind w:left="440"/>
+      </w:pPr>
+    </w:p>
+    <w:p>
+      <w:pPr>
+        <w:pStyle w:val="ListParagraph"/>
+        <w:keepNext/>
+        <w:numPr>
+          <w:ilvl w:val="0"/>
+          <w:numId w:val="2"/>
+        </w:numPr>
+        <w:spacing w:after="0" w:before="120"/>
+      </w:pPr>
+      <w:r>
+        <w:rPr>
+          <w:b/>
+          <w:bCs/>
+        </w:rPr>
+        <w:t xml:space="preserve">What public transport do you use?</w:t>
+      </w:r>
+    </w:p>
+    <w:p>
+      <w:pPr>
+        <w:spacing w:after="120"/>
+        <w:ind w:left="440"/>
+      </w:pPr>
+    </w:p>
+    <w:p>
+      <w:pPr>
+        <w:pStyle w:val="ListParagraph"/>
+        <w:keepNext/>
+        <w:numPr>
+          <w:ilvl w:val="0"/>
+          <w:numId w:val="2"/>
+        </w:numPr>
+        <w:spacing w:after="0" w:before="120"/>
+      </w:pPr>
+      <w:r>
+        <w:rPr>
+          <w:b/>
+          <w:bCs/>
+        </w:rPr>
+        <w:t xml:space="preserve">How is your society managed?</w:t>
+      </w:r>
+    </w:p>
+    <w:p>
+      <w:pPr>
+        <w:spacing w:after="120"/>
+        <w:ind w:left="440"/>
+      </w:pPr>
+    </w:p>
+    <w:p>
+      <w:pPr>
+        <w:pStyle w:val="ListParagraph"/>
+        <w:keepNext/>
+        <w:numPr>
+          <w:ilvl w:val="0"/>
+          <w:numId w:val="2"/>
+        </w:numPr>
+        <w:spacing w:after="0" w:before="120"/>
+      </w:pPr>
+      <w:r>
+        <w:rPr>
+          <w:b/>
+          <w:bCs/>
+        </w:rPr>
+        <w:t xml:space="preserve">What facilities are available in your society?</w:t>
+      </w:r>
+    </w:p>
+    <w:p>
+      <w:pPr>
+        <w:spacing w:after="120"/>
+        <w:ind w:left="440"/>
+      </w:pPr>
+    </w:p>
+    <w:p>
+      <w:pPr>
+        <w:pStyle w:val="ListParagraph"/>
+        <w:keepNext/>
+        <w:numPr>
+          <w:ilvl w:val="0"/>
+          <w:numId w:val="2"/>
+        </w:numPr>
+        <w:spacing w:after="0" w:before="120"/>
+      </w:pPr>
+      <w:r>
+        <w:rPr>
+          <w:b/>
+          <w:bCs/>
+        </w:rPr>
+        <w:t xml:space="preserve">Tell me three problems you have personally seen in your locality.</w:t>
+      </w:r>
+    </w:p>
+    <w:p>
+      <w:pPr>
+        <w:spacing w:after="120"/>
+        <w:ind w:left="440"/>
+      </w:pPr>
+    </w:p>
+    <w:p>
+      <w:pPr>
+        <w:pStyle w:val="ListParagraph"/>
+        <w:keepNext/>
+        <w:numPr>
+          <w:ilvl w:val="0"/>
+          <w:numId w:val="2"/>
+        </w:numPr>
+        <w:spacing w:after="0" w:before="120"/>
+      </w:pPr>
+      <w:r>
+        <w:rPr>
+          <w:b/>
+          <w:bCs/>
+        </w:rPr>
+        <w:t xml:space="preserve">If you were responsible for solving one of them, what would you do?</w:t>
+      </w:r>
+    </w:p>
+    <w:p>
+      <w:pPr>
+        <w:spacing w:after="120"/>
+        <w:ind w:left="440"/>
+      </w:pPr>
+    </w:p>
+    <w:p>
+      <w:pPr>
+        <w:pStyle w:val="Heading1"/>
+      </w:pPr>
+      <w:r>
+        <w:t xml:space="preserve">PIQ 5 – Current Residence: Greater Noida</w:t>
+      </w:r>
+    </w:p>
+    <w:p>
+      <w:pPr>
+        <w:pStyle w:val="ListParagraph"/>
+        <w:keepNext/>
+        <w:numPr>
+          <w:ilvl w:val="0"/>
+          <w:numId w:val="2"/>
+        </w:numPr>
+        <w:spacing w:after="0" w:before="120"/>
+      </w:pPr>
+      <w:r>
+        <w:rPr>
+          <w:b/>
+          <w:bCs/>
+        </w:rPr>
+        <w:t xml:space="preserve">What is Greater Noida?</w:t>
+      </w:r>
+    </w:p>
+    <w:p>
+      <w:pPr>
+        <w:spacing w:after="120"/>
+        <w:ind w:left="440"/>
+      </w:pPr>
+    </w:p>
+    <w:p>
+      <w:pPr>
+        <w:pStyle w:val="ListParagraph"/>
+        <w:keepNext/>
+        <w:numPr>
+          <w:ilvl w:val="0"/>
+          <w:numId w:val="2"/>
+        </w:numPr>
+        <w:spacing w:after="0" w:before="120"/>
+      </w:pPr>
+      <w:r>
+        <w:rPr>
+          <w:b/>
+          <w:bCs/>
+        </w:rPr>
+        <w:t xml:space="preserve">What is Greater Noida known for?</w:t>
+      </w:r>
+    </w:p>
+    <w:p>
+      <w:pPr>
+        <w:spacing w:after="120"/>
+        <w:ind w:left="440"/>
+      </w:pPr>
+    </w:p>
+    <w:p>
+      <w:pPr>
+        <w:pStyle w:val="ListParagraph"/>
+        <w:keepNext/>
+        <w:numPr>
+          <w:ilvl w:val="0"/>
+          <w:numId w:val="2"/>
+        </w:numPr>
+        <w:spacing w:after="0" w:before="120"/>
+      </w:pPr>
+      <w:r>
+        <w:rPr>
+          <w:b/>
+          <w:bCs/>
+        </w:rPr>
+        <w:t xml:space="preserve">Why was Greater Noida developed?</w:t>
+      </w:r>
+    </w:p>
+    <w:p>
+      <w:pPr>
+        <w:spacing w:after="120"/>
+        <w:ind w:left="440"/>
+      </w:pPr>
+    </w:p>
+    <w:p>
+      <w:pPr>
+        <w:pStyle w:val="ListParagraph"/>
+        <w:keepNext/>
+        <w:numPr>
+          <w:ilvl w:val="0"/>
+          <w:numId w:val="2"/>
+        </w:numPr>
+        <w:spacing w:after="0" w:before="120"/>
+      </w:pPr>
+      <w:r>
+        <w:rPr>
+          <w:b/>
+          <w:bCs/>
+        </w:rPr>
+        <w:t xml:space="preserve">How is Greater Noida different from Noida?</w:t>
+      </w:r>
+    </w:p>
+    <w:p>
+      <w:pPr>
+        <w:spacing w:after="120"/>
+        <w:ind w:left="440"/>
+      </w:pPr>
+    </w:p>
+    <w:p>
+      <w:pPr>
+        <w:pStyle w:val="ListParagraph"/>
+        <w:keepNext/>
+        <w:numPr>
+          <w:ilvl w:val="0"/>
+          <w:numId w:val="2"/>
+        </w:numPr>
+        <w:spacing w:after="0" w:before="120"/>
+      </w:pPr>
+      <w:r>
+        <w:rPr>
+          <w:b/>
+          <w:bCs/>
+        </w:rPr>
+        <w:t xml:space="preserve">Which authority manages Greater Noida?</w:t>
+      </w:r>
+    </w:p>
+    <w:p>
+      <w:pPr>
+        <w:spacing w:after="120"/>
+        <w:ind w:left="440"/>
+      </w:pPr>
+    </w:p>
+    <w:p>
+      <w:pPr>
+        <w:pStyle w:val="ListParagraph"/>
+        <w:keepNext/>
+        <w:numPr>
+          <w:ilvl w:val="0"/>
+          <w:numId w:val="2"/>
+        </w:numPr>
+        <w:spacing w:after="0" w:before="120"/>
+      </w:pPr>
+      <w:r>
+        <w:rPr>
+          <w:b/>
+          <w:bCs/>
+        </w:rPr>
+        <w:t xml:space="preserve">What is the role of the Greater Noida Industrial Development Authority?</w:t>
+      </w:r>
+    </w:p>
+    <w:p>
+      <w:pPr>
+        <w:spacing w:after="120"/>
+        <w:ind w:left="440"/>
+      </w:pPr>
+    </w:p>
+    <w:p>
+      <w:pPr>
+        <w:pStyle w:val="ListParagraph"/>
+        <w:keepNext/>
+        <w:numPr>
+          <w:ilvl w:val="0"/>
+          <w:numId w:val="2"/>
+        </w:numPr>
+        <w:spacing w:after="0" w:before="120"/>
+      </w:pPr>
+      <w:r>
+        <w:rPr>
+          <w:b/>
+          <w:bCs/>
+        </w:rPr>
+        <w:t xml:space="preserve">What are its major sectors?</w:t>
+      </w:r>
+    </w:p>
+    <w:p>
+      <w:pPr>
+        <w:spacing w:after="120"/>
+        <w:ind w:left="440"/>
+      </w:pPr>
+    </w:p>
+    <w:p>
+      <w:pPr>
+        <w:pStyle w:val="ListParagraph"/>
+        <w:keepNext/>
+        <w:numPr>
+          <w:ilvl w:val="0"/>
+          <w:numId w:val="2"/>
+        </w:numPr>
+        <w:spacing w:after="0" w:before="120"/>
+      </w:pPr>
+      <w:r>
+        <w:rPr>
+          <w:b/>
+          <w:bCs/>
+        </w:rPr>
+        <w:t xml:space="preserve">What major infrastructure projects are located there?</w:t>
+      </w:r>
+    </w:p>
+    <w:p>
+      <w:pPr>
+        <w:spacing w:after="120"/>
+        <w:ind w:left="440"/>
+      </w:pPr>
+    </w:p>
+    <w:p>
+      <w:pPr>
+        <w:pStyle w:val="ListParagraph"/>
+        <w:keepNext/>
+        <w:numPr>
+          <w:ilvl w:val="0"/>
+          <w:numId w:val="2"/>
+        </w:numPr>
+        <w:spacing w:after="0" w:before="120"/>
+      </w:pPr>
+      <w:r>
+        <w:rPr>
+          <w:b/>
+          <w:bCs/>
+        </w:rPr>
+        <w:t xml:space="preserve">What is the relationship between Greater Noida, Noida and Delhi?</w:t>
+      </w:r>
+    </w:p>
+    <w:p>
+      <w:pPr>
+        <w:spacing w:after="120"/>
+        <w:ind w:left="440"/>
+      </w:pPr>
+    </w:p>
+    <w:p>
+      <w:pPr>
+        <w:pStyle w:val="ListParagraph"/>
+        <w:keepNext/>
+        <w:numPr>
+          <w:ilvl w:val="0"/>
+          <w:numId w:val="2"/>
+        </w:numPr>
+        <w:spacing w:after="0" w:before="120"/>
+      </w:pPr>
+      <w:r>
+        <w:rPr>
+          <w:b/>
+          <w:bCs/>
+        </w:rPr>
+        <w:t xml:space="preserve">What are the major problems and development challenges in Greater Noida?</w:t>
+      </w:r>
+    </w:p>
+    <w:p>
+      <w:pPr>
+        <w:spacing w:after="120"/>
+        <w:ind w:left="440"/>
+      </w:pPr>
+    </w:p>
+    <w:p>
+      <w:pPr>
+        <w:pStyle w:val="Heading1"/>
+      </w:pPr>
+      <w:r>
+        <w:t xml:space="preserve">PIQ 5 – Current Residence: Geography &amp; Connectivity</w:t>
+      </w:r>
+    </w:p>
+    <w:p>
+      <w:pPr>
+        <w:pStyle w:val="ListParagraph"/>
+        <w:keepNext/>
+        <w:numPr>
+          <w:ilvl w:val="0"/>
+          <w:numId w:val="2"/>
+        </w:numPr>
+        <w:spacing w:after="0" w:before="120"/>
+      </w:pPr>
+      <w:r>
+        <w:rPr>
+          <w:b/>
+          <w:bCs/>
+        </w:rPr>
+        <w:t xml:space="preserve">Which districts surround Gautam Buddha Nagar?</w:t>
+      </w:r>
+    </w:p>
+    <w:p>
+      <w:pPr>
+        <w:spacing w:after="120"/>
+        <w:ind w:left="440"/>
+      </w:pPr>
+    </w:p>
+    <w:p>
+      <w:pPr>
+        <w:pStyle w:val="ListParagraph"/>
+        <w:keepNext/>
+        <w:numPr>
+          <w:ilvl w:val="0"/>
+          <w:numId w:val="2"/>
+        </w:numPr>
+        <w:spacing w:after="0" w:before="120"/>
+      </w:pPr>
+      <w:r>
+        <w:rPr>
+          <w:b/>
+          <w:bCs/>
+        </w:rPr>
+        <w:t xml:space="preserve">Where is Greater Noida located relative to Delhi?</w:t>
+      </w:r>
+    </w:p>
+    <w:p>
+      <w:pPr>
+        <w:spacing w:after="120"/>
+        <w:ind w:left="440"/>
+      </w:pPr>
+    </w:p>
+    <w:p>
+      <w:pPr>
+        <w:pStyle w:val="ListParagraph"/>
+        <w:keepNext/>
+        <w:numPr>
+          <w:ilvl w:val="0"/>
+          <w:numId w:val="2"/>
+        </w:numPr>
+        <w:spacing w:after="0" w:before="120"/>
+      </w:pPr>
+      <w:r>
+        <w:rPr>
+          <w:b/>
+          <w:bCs/>
+        </w:rPr>
+        <w:t xml:space="preserve">What major highways connect Greater Noida?</w:t>
+      </w:r>
+    </w:p>
+    <w:p>
+      <w:pPr>
+        <w:spacing w:after="120"/>
+        <w:ind w:left="440"/>
+      </w:pPr>
+    </w:p>
+    <w:p>
+      <w:pPr>
+        <w:pStyle w:val="ListParagraph"/>
+        <w:keepNext/>
+        <w:numPr>
+          <w:ilvl w:val="0"/>
+          <w:numId w:val="2"/>
+        </w:numPr>
+        <w:spacing w:after="0" w:before="120"/>
+      </w:pPr>
+      <w:r>
+        <w:rPr>
+          <w:b/>
+          <w:bCs/>
+        </w:rPr>
+        <w:t xml:space="preserve">How is Greater Noida connected to Delhi?</w:t>
+      </w:r>
+    </w:p>
+    <w:p>
+      <w:pPr>
+        <w:spacing w:after="120"/>
+        <w:ind w:left="440"/>
+      </w:pPr>
+    </w:p>
+    <w:p>
+      <w:pPr>
+        <w:pStyle w:val="ListParagraph"/>
+        <w:keepNext/>
+        <w:numPr>
+          <w:ilvl w:val="0"/>
+          <w:numId w:val="2"/>
+        </w:numPr>
+        <w:spacing w:after="0" w:before="120"/>
+      </w:pPr>
+      <w:r>
+        <w:rPr>
+          <w:b/>
+          <w:bCs/>
+        </w:rPr>
+        <w:t xml:space="preserve">What is the Yamuna Expressway and why is it important?</w:t>
+      </w:r>
+    </w:p>
+    <w:p>
+      <w:pPr>
+        <w:spacing w:after="120"/>
+        <w:ind w:left="440"/>
+      </w:pPr>
+    </w:p>
+    <w:p>
+      <w:pPr>
+        <w:pStyle w:val="ListParagraph"/>
+        <w:keepNext/>
+        <w:numPr>
+          <w:ilvl w:val="0"/>
+          <w:numId w:val="2"/>
+        </w:numPr>
+        <w:spacing w:after="0" w:before="120"/>
+      </w:pPr>
+      <w:r>
+        <w:rPr>
+          <w:b/>
+          <w:bCs/>
+        </w:rPr>
+        <w:t xml:space="preserve">Where does the Yamuna Expressway start and end?</w:t>
+      </w:r>
+    </w:p>
+    <w:p>
+      <w:pPr>
+        <w:spacing w:after="120"/>
+        <w:ind w:left="440"/>
+      </w:pPr>
+    </w:p>
+    <w:p>
+      <w:pPr>
+        <w:pStyle w:val="ListParagraph"/>
+        <w:keepNext/>
+        <w:numPr>
+          <w:ilvl w:val="0"/>
+          <w:numId w:val="2"/>
+        </w:numPr>
+        <w:spacing w:after="0" w:before="120"/>
+      </w:pPr>
+      <w:r>
+        <w:rPr>
+          <w:b/>
+          <w:bCs/>
+        </w:rPr>
+        <w:t xml:space="preserve">What is the Eastern Peripheral Expressway?</w:t>
+      </w:r>
+    </w:p>
+    <w:p>
+      <w:pPr>
+        <w:spacing w:after="120"/>
+        <w:ind w:left="440"/>
+      </w:pPr>
+    </w:p>
+    <w:p>
+      <w:pPr>
+        <w:pStyle w:val="ListParagraph"/>
+        <w:keepNext/>
+        <w:numPr>
+          <w:ilvl w:val="0"/>
+          <w:numId w:val="2"/>
+        </w:numPr>
+        <w:spacing w:after="0" w:before="120"/>
+      </w:pPr>
+      <w:r>
+        <w:rPr>
+          <w:b/>
+          <w:bCs/>
+        </w:rPr>
+        <w:t xml:space="preserve">How is the Delhi–Mumbai Expressway relevant to the region?</w:t>
+      </w:r>
+    </w:p>
+    <w:p>
+      <w:pPr>
+        <w:spacing w:after="120"/>
+        <w:ind w:left="440"/>
+      </w:pPr>
+    </w:p>
+    <w:p>
+      <w:pPr>
+        <w:pStyle w:val="Heading1"/>
+      </w:pPr>
+      <w:r>
+        <w:t xml:space="preserve">PIQ 5 – Current Residence: Economy &amp; Industry</w:t>
+      </w:r>
+    </w:p>
+    <w:p>
+      <w:pPr>
+        <w:pStyle w:val="ListParagraph"/>
+        <w:keepNext/>
+        <w:numPr>
+          <w:ilvl w:val="0"/>
+          <w:numId w:val="2"/>
+        </w:numPr>
+        <w:spacing w:after="0" w:before="120"/>
+      </w:pPr>
+      <w:r>
+        <w:rPr>
+          <w:b/>
+          <w:bCs/>
+        </w:rPr>
+        <w:t xml:space="preserve">What industries are present in Greater Noida?</w:t>
+      </w:r>
+    </w:p>
+    <w:p>
+      <w:pPr>
+        <w:spacing w:after="120"/>
+        <w:ind w:left="440"/>
+      </w:pPr>
+    </w:p>
+    <w:p>
+      <w:pPr>
+        <w:pStyle w:val="ListParagraph"/>
+        <w:keepNext/>
+        <w:numPr>
+          <w:ilvl w:val="0"/>
+          <w:numId w:val="2"/>
+        </w:numPr>
+        <w:spacing w:after="0" w:before="120"/>
+      </w:pPr>
+      <w:r>
+        <w:rPr>
+          <w:b/>
+          <w:bCs/>
+        </w:rPr>
+        <w:t xml:space="preserve">Why is Greater Noida an important industrial region?</w:t>
+      </w:r>
+    </w:p>
+    <w:p>
+      <w:pPr>
+        <w:spacing w:after="120"/>
+        <w:ind w:left="440"/>
+      </w:pPr>
+    </w:p>
+    <w:p>
+      <w:pPr>
+        <w:pStyle w:val="ListParagraph"/>
+        <w:keepNext/>
+        <w:numPr>
+          <w:ilvl w:val="0"/>
+          <w:numId w:val="2"/>
+        </w:numPr>
+        <w:spacing w:after="0" w:before="120"/>
+      </w:pPr>
+      <w:r>
+        <w:rPr>
+          <w:b/>
+          <w:bCs/>
+        </w:rPr>
+        <w:t xml:space="preserve">What are the advantages and disadvantages of its location?</w:t>
+      </w:r>
+    </w:p>
+    <w:p>
+      <w:pPr>
+        <w:spacing w:after="120"/>
+        <w:ind w:left="440"/>
+      </w:pPr>
+    </w:p>
+    <w:p>
+      <w:pPr>
+        <w:pStyle w:val="ListParagraph"/>
+        <w:keepNext/>
+        <w:numPr>
+          <w:ilvl w:val="0"/>
+          <w:numId w:val="2"/>
+        </w:numPr>
+        <w:spacing w:after="0" w:before="120"/>
+      </w:pPr>
+      <w:r>
+        <w:rPr>
+          <w:b/>
+          <w:bCs/>
+        </w:rPr>
+        <w:t xml:space="preserve">What jobs has the region created?</w:t>
+      </w:r>
+    </w:p>
+    <w:p>
+      <w:pPr>
+        <w:spacing w:after="120"/>
+        <w:ind w:left="440"/>
+      </w:pPr>
+    </w:p>
+    <w:p>
+      <w:pPr>
+        <w:pStyle w:val="ListParagraph"/>
+        <w:keepNext/>
+        <w:numPr>
+          <w:ilvl w:val="0"/>
+          <w:numId w:val="2"/>
+        </w:numPr>
+        <w:spacing w:after="0" w:before="120"/>
+      </w:pPr>
+      <w:r>
+        <w:rPr>
+          <w:b/>
+          <w:bCs/>
+        </w:rPr>
+        <w:t xml:space="preserve">What infrastructure is needed for further industrial growth?</w:t>
+      </w:r>
+    </w:p>
+    <w:p>
+      <w:pPr>
+        <w:spacing w:after="120"/>
+        <w:ind w:left="440"/>
+      </w:pPr>
+    </w:p>
+    <w:p>
+      <w:pPr>
+        <w:pStyle w:val="Heading1"/>
+      </w:pPr>
+      <w:r>
+        <w:t xml:space="preserve">PIQ 5 – Current Residence: Current Affairs</w:t>
+      </w:r>
+    </w:p>
+    <w:p>
+      <w:pPr>
+        <w:pStyle w:val="ListParagraph"/>
+        <w:keepNext/>
+        <w:numPr>
+          <w:ilvl w:val="0"/>
+          <w:numId w:val="2"/>
+        </w:numPr>
+        <w:spacing w:after="0" w:before="120"/>
+      </w:pPr>
+      <w:r>
+        <w:rPr>
+          <w:b/>
+          <w:bCs/>
+        </w:rPr>
+        <w:t xml:space="preserve">What is the significance of Noida International Airport at Jewar?</w:t>
+      </w:r>
+    </w:p>
+    <w:p>
+      <w:pPr>
+        <w:spacing w:after="120"/>
+        <w:ind w:left="440"/>
+      </w:pPr>
+    </w:p>
+    <w:p>
+      <w:pPr>
+        <w:pStyle w:val="ListParagraph"/>
+        <w:keepNext/>
+        <w:numPr>
+          <w:ilvl w:val="0"/>
+          <w:numId w:val="2"/>
+        </w:numPr>
+        <w:spacing w:after="0" w:before="120"/>
+      </w:pPr>
+      <w:r>
+        <w:rPr>
+          <w:b/>
+          <w:bCs/>
+        </w:rPr>
+        <w:t xml:space="preserve">What is the current status of Noida International Airport?</w:t>
+      </w:r>
+    </w:p>
+    <w:p>
+      <w:pPr>
+        <w:spacing w:after="120"/>
+        <w:ind w:left="440"/>
+      </w:pPr>
+    </w:p>
+    <w:p>
+      <w:pPr>
+        <w:pStyle w:val="ListParagraph"/>
+        <w:keepNext/>
+        <w:numPr>
+          <w:ilvl w:val="0"/>
+          <w:numId w:val="2"/>
+        </w:numPr>
+        <w:spacing w:after="0" w:before="120"/>
+      </w:pPr>
+      <w:r>
+        <w:rPr>
+          <w:b/>
+          <w:bCs/>
+        </w:rPr>
+        <w:t xml:space="preserve">What is the status of metro expansion in the region?</w:t>
+      </w:r>
+    </w:p>
+    <w:p>
+      <w:pPr>
+        <w:spacing w:after="120"/>
+        <w:ind w:left="440"/>
+      </w:pPr>
+    </w:p>
+    <w:p>
+      <w:pPr>
+        <w:pStyle w:val="ListParagraph"/>
+        <w:keepNext/>
+        <w:numPr>
+          <w:ilvl w:val="0"/>
+          <w:numId w:val="2"/>
+        </w:numPr>
+        <w:spacing w:after="0" w:before="120"/>
+      </w:pPr>
+      <w:r>
+        <w:rPr>
+          <w:b/>
+          <w:bCs/>
+        </w:rPr>
+        <w:t xml:space="preserve">What new expressways are coming up in the region?</w:t>
+      </w:r>
+    </w:p>
+    <w:p>
+      <w:pPr>
+        <w:spacing w:after="120"/>
+        <w:ind w:left="440"/>
+      </w:pPr>
+    </w:p>
+    <w:p>
+      <w:pPr>
+        <w:pStyle w:val="ListParagraph"/>
+        <w:keepNext/>
+        <w:numPr>
+          <w:ilvl w:val="0"/>
+          <w:numId w:val="2"/>
+        </w:numPr>
+        <w:spacing w:after="0" w:before="120"/>
+      </w:pPr>
+      <w:r>
+        <w:rPr>
+          <w:b/>
+          <w:bCs/>
+        </w:rPr>
+        <w:t xml:space="preserve">What is happening in data centres and the technology sector in the region?</w:t>
+      </w:r>
+    </w:p>
+    <w:p>
+      <w:pPr>
+        <w:spacing w:after="120"/>
+        <w:ind w:left="440"/>
+      </w:pPr>
+    </w:p>
+    <w:p>
+      <w:pPr>
+        <w:pStyle w:val="ListParagraph"/>
+        <w:keepNext/>
+        <w:numPr>
+          <w:ilvl w:val="0"/>
+          <w:numId w:val="2"/>
+        </w:numPr>
+        <w:spacing w:after="0" w:before="120"/>
+      </w:pPr>
+      <w:r>
+        <w:rPr>
+          <w:b/>
+          <w:bCs/>
+        </w:rPr>
+        <w:t xml:space="preserve">What electronics manufacturing is taking place in the region?</w:t>
+      </w:r>
+    </w:p>
+    <w:p>
+      <w:pPr>
+        <w:spacing w:after="120"/>
+        <w:ind w:left="440"/>
+      </w:pPr>
+    </w:p>
+    <w:p>
+      <w:pPr>
+        <w:pStyle w:val="ListParagraph"/>
+        <w:keepNext/>
+        <w:numPr>
+          <w:ilvl w:val="0"/>
+          <w:numId w:val="2"/>
+        </w:numPr>
+        <w:spacing w:after="0" w:before="120"/>
+      </w:pPr>
+      <w:r>
+        <w:rPr>
+          <w:b/>
+          <w:bCs/>
+        </w:rPr>
+        <w:t xml:space="preserve">What is the role of logistics in the region's economy?</w:t>
+      </w:r>
+    </w:p>
+    <w:p>
+      <w:pPr>
+        <w:spacing w:after="120"/>
+        <w:ind w:left="440"/>
+      </w:pPr>
+    </w:p>
+    <w:p>
+      <w:pPr>
+        <w:pStyle w:val="ListParagraph"/>
+        <w:keepNext/>
+        <w:numPr>
+          <w:ilvl w:val="0"/>
+          <w:numId w:val="2"/>
+        </w:numPr>
+        <w:spacing w:after="0" w:before="120"/>
+      </w:pPr>
+      <w:r>
+        <w:rPr>
+          <w:b/>
+          <w:bCs/>
+        </w:rPr>
+        <w:t xml:space="preserve">How is urbanisation affecting Greater Noida?</w:t>
+      </w:r>
+    </w:p>
+    <w:p>
+      <w:pPr>
+        <w:spacing w:after="120"/>
+        <w:ind w:left="440"/>
+      </w:pPr>
+    </w:p>
+    <w:p>
+      <w:pPr>
+        <w:pStyle w:val="ListParagraph"/>
+        <w:keepNext/>
+        <w:numPr>
+          <w:ilvl w:val="0"/>
+          <w:numId w:val="2"/>
+        </w:numPr>
+        <w:spacing w:after="0" w:before="120"/>
+      </w:pPr>
+      <w:r>
+        <w:rPr>
+          <w:b/>
+          <w:bCs/>
+        </w:rPr>
+        <w:t xml:space="preserve">What causes air pollution in NCR, and how can it be reduced?</w:t>
+      </w:r>
+    </w:p>
+    <w:p>
+      <w:pPr>
+        <w:spacing w:after="120"/>
+        <w:ind w:left="440"/>
+      </w:pPr>
+    </w:p>
+    <w:p>
+      <w:pPr>
+        <w:pStyle w:val="ListParagraph"/>
+        <w:keepNext/>
+        <w:numPr>
+          <w:ilvl w:val="0"/>
+          <w:numId w:val="2"/>
+        </w:numPr>
+        <w:spacing w:after="0" w:before="120"/>
+      </w:pPr>
+      <w:r>
+        <w:rPr>
+          <w:b/>
+          <w:bCs/>
+        </w:rPr>
+        <w:t xml:space="preserve">What are the traffic problems in the region?</w:t>
+      </w:r>
+    </w:p>
+    <w:p>
+      <w:pPr>
+        <w:spacing w:after="120"/>
+        <w:ind w:left="440"/>
+      </w:pPr>
+    </w:p>
+    <w:p>
+      <w:pPr>
+        <w:pStyle w:val="ListParagraph"/>
+        <w:keepNext/>
+        <w:numPr>
+          <w:ilvl w:val="0"/>
+          <w:numId w:val="2"/>
+        </w:numPr>
+        <w:spacing w:after="0" w:before="120"/>
+      </w:pPr>
+      <w:r>
+        <w:rPr>
+          <w:b/>
+          <w:bCs/>
+        </w:rPr>
+        <w:t xml:space="preserve">How is water managed in the region?</w:t>
+      </w:r>
+    </w:p>
+    <w:p>
+      <w:pPr>
+        <w:spacing w:after="120"/>
+        <w:ind w:left="440"/>
+      </w:pPr>
+    </w:p>
+    <w:p>
+      <w:pPr>
+        <w:pStyle w:val="Heading1"/>
+      </w:pPr>
+      <w:r>
+        <w:t xml:space="preserve">PIQ 5 – Azamgarh vs Greater Noida</w:t>
+      </w:r>
+    </w:p>
+    <w:p>
+      <w:pPr>
+        <w:pStyle w:val="ListParagraph"/>
+        <w:keepNext/>
+        <w:numPr>
+          <w:ilvl w:val="0"/>
+          <w:numId w:val="2"/>
+        </w:numPr>
+        <w:spacing w:after="0" w:before="120"/>
+      </w:pPr>
+      <w:r>
+        <w:rPr>
+          <w:b/>
+          <w:bCs/>
+        </w:rPr>
+        <w:t xml:space="preserve">What is the biggest difference between Azamgarh and Greater Noida?</w:t>
+      </w:r>
+    </w:p>
+    <w:p>
+      <w:pPr>
+        <w:spacing w:after="120"/>
+        <w:ind w:left="440"/>
+      </w:pPr>
+    </w:p>
+    <w:p>
+      <w:pPr>
+        <w:pStyle w:val="ListParagraph"/>
+        <w:keepNext/>
+        <w:numPr>
+          <w:ilvl w:val="0"/>
+          <w:numId w:val="2"/>
+        </w:numPr>
+        <w:spacing w:after="0" w:before="120"/>
+      </w:pPr>
+      <w:r>
+        <w:rPr>
+          <w:b/>
+          <w:bCs/>
+        </w:rPr>
+        <w:t xml:space="preserve">Which place do you prefer?</w:t>
+      </w:r>
+    </w:p>
+    <w:p>
+      <w:pPr>
+        <w:spacing w:after="120"/>
+        <w:ind w:left="440"/>
+      </w:pPr>
+    </w:p>
+    <w:p>
+      <w:pPr>
+        <w:pStyle w:val="ListParagraph"/>
+        <w:keepNext/>
+        <w:numPr>
+          <w:ilvl w:val="0"/>
+          <w:numId w:val="2"/>
+        </w:numPr>
+        <w:spacing w:after="0" w:before="120"/>
+      </w:pPr>
+      <w:r>
+        <w:rPr>
+          <w:b/>
+          <w:bCs/>
+        </w:rPr>
+        <w:t xml:space="preserve">Which has better infrastructure?</w:t>
+      </w:r>
+    </w:p>
+    <w:p>
+      <w:pPr>
+        <w:spacing w:after="120"/>
+        <w:ind w:left="440"/>
+      </w:pPr>
+    </w:p>
+    <w:p>
+      <w:pPr>
+        <w:pStyle w:val="ListParagraph"/>
+        <w:keepNext/>
+        <w:numPr>
+          <w:ilvl w:val="0"/>
+          <w:numId w:val="2"/>
+        </w:numPr>
+        <w:spacing w:after="0" w:before="120"/>
+      </w:pPr>
+      <w:r>
+        <w:rPr>
+          <w:b/>
+          <w:bCs/>
+        </w:rPr>
+        <w:t xml:space="preserve">Which has a better quality of life?</w:t>
+      </w:r>
+    </w:p>
+    <w:p>
+      <w:pPr>
+        <w:spacing w:after="120"/>
+        <w:ind w:left="440"/>
+      </w:pPr>
+    </w:p>
+    <w:p>
+      <w:pPr>
+        <w:pStyle w:val="ListParagraph"/>
+        <w:keepNext/>
+        <w:numPr>
+          <w:ilvl w:val="0"/>
+          <w:numId w:val="2"/>
+        </w:numPr>
+        <w:spacing w:after="0" w:before="120"/>
+      </w:pPr>
+      <w:r>
+        <w:rPr>
+          <w:b/>
+          <w:bCs/>
+        </w:rPr>
+        <w:t xml:space="preserve">What is better in Azamgarh?</w:t>
+      </w:r>
+    </w:p>
+    <w:p>
+      <w:pPr>
+        <w:spacing w:after="120"/>
+        <w:ind w:left="440"/>
+      </w:pPr>
+    </w:p>
+    <w:p>
+      <w:pPr>
+        <w:pStyle w:val="ListParagraph"/>
+        <w:keepNext/>
+        <w:numPr>
+          <w:ilvl w:val="0"/>
+          <w:numId w:val="2"/>
+        </w:numPr>
+        <w:spacing w:after="0" w:before="120"/>
+      </w:pPr>
+      <w:r>
+        <w:rPr>
+          <w:b/>
+          <w:bCs/>
+        </w:rPr>
+        <w:t xml:space="preserve">What is better in Greater Noida?</w:t>
+      </w:r>
+    </w:p>
+    <w:p>
+      <w:pPr>
+        <w:spacing w:after="120"/>
+        <w:ind w:left="440"/>
+      </w:pPr>
+    </w:p>
+    <w:p>
+      <w:pPr>
+        <w:pStyle w:val="ListParagraph"/>
+        <w:keepNext/>
+        <w:numPr>
+          <w:ilvl w:val="0"/>
+          <w:numId w:val="2"/>
+        </w:numPr>
+        <w:spacing w:after="0" w:before="120"/>
+      </w:pPr>
+      <w:r>
+        <w:rPr>
+          <w:b/>
+          <w:bCs/>
+        </w:rPr>
+        <w:t xml:space="preserve">What differences have you seen in people's lifestyles between the two?</w:t>
+      </w:r>
+    </w:p>
+    <w:p>
+      <w:pPr>
+        <w:spacing w:after="120"/>
+        <w:ind w:left="440"/>
+      </w:pPr>
+    </w:p>
+    <w:p>
+      <w:pPr>
+        <w:pStyle w:val="ListParagraph"/>
+        <w:keepNext/>
+        <w:numPr>
+          <w:ilvl w:val="0"/>
+          <w:numId w:val="2"/>
+        </w:numPr>
+        <w:spacing w:after="0" w:before="120"/>
+      </w:pPr>
+      <w:r>
+        <w:rPr>
+          <w:b/>
+          <w:bCs/>
+        </w:rPr>
+        <w:t xml:space="preserve">How are job opportunities different?</w:t>
+      </w:r>
+    </w:p>
+    <w:p>
+      <w:pPr>
+        <w:spacing w:after="120"/>
+        <w:ind w:left="440"/>
+      </w:pPr>
+    </w:p>
+    <w:p>
+      <w:pPr>
+        <w:pStyle w:val="ListParagraph"/>
+        <w:keepNext/>
+        <w:numPr>
+          <w:ilvl w:val="0"/>
+          <w:numId w:val="2"/>
+        </w:numPr>
+        <w:spacing w:after="0" w:before="120"/>
+      </w:pPr>
+      <w:r>
+        <w:rPr>
+          <w:b/>
+          <w:bCs/>
+        </w:rPr>
+        <w:t xml:space="preserve">How is transport different?</w:t>
+      </w:r>
+    </w:p>
+    <w:p>
+      <w:pPr>
+        <w:spacing w:after="120"/>
+        <w:ind w:left="440"/>
+      </w:pPr>
+    </w:p>
+    <w:p>
+      <w:pPr>
+        <w:pStyle w:val="ListParagraph"/>
+        <w:keepNext/>
+        <w:numPr>
+          <w:ilvl w:val="0"/>
+          <w:numId w:val="2"/>
+        </w:numPr>
+        <w:spacing w:after="0" w:before="120"/>
+      </w:pPr>
+      <w:r>
+        <w:rPr>
+          <w:b/>
+          <w:bCs/>
+        </w:rPr>
+        <w:t xml:space="preserve">Which environment do you find more comfortable?</w:t>
+      </w:r>
+    </w:p>
+    <w:p>
+      <w:pPr>
+        <w:spacing w:after="120"/>
+        <w:ind w:left="440"/>
+      </w:pPr>
+    </w:p>
+    <w:p>
+      <w:pPr>
+        <w:pStyle w:val="ListParagraph"/>
+        <w:keepNext/>
+        <w:numPr>
+          <w:ilvl w:val="0"/>
+          <w:numId w:val="2"/>
+        </w:numPr>
+        <w:spacing w:after="0" w:before="120"/>
+      </w:pPr>
+      <w:r>
+        <w:rPr>
+          <w:b/>
+          <w:bCs/>
+        </w:rPr>
+        <w:t xml:space="preserve">What did moving from your hometown to Greater Noida teach you?</w:t>
       </w:r>
     </w:p>
     <w:p>

</xml_diff>

<commit_message>
Add PIQ 6 (Uttar Pradesh) questions to SSB question sheet
Co-Authored-By: Claude Opus 5.5 <noreply@anthropic.com>
Claude-Session: https://claude.ai/code/session_01TypcejD48cCyAqfjtUUit5
</commit_message>
<xml_diff>
--- a/SSB_Question_Sheet.docx
+++ b/SSB_Question_Sheet.docx
@@ -6932,6 +6932,2278 @@
           <w:bCs/>
         </w:rPr>
         <w:t xml:space="preserve">What did moving from your hometown to Greater Noida teach you?</w:t>
+      </w:r>
+    </w:p>
+    <w:p>
+      <w:pPr>
+        <w:spacing w:after="120"/>
+        <w:ind w:left="440"/>
+      </w:pPr>
+    </w:p>
+    <w:p>
+      <w:pPr>
+        <w:pStyle w:val="Heading1"/>
+      </w:pPr>
+      <w:r>
+        <w:t xml:space="preserve">PIQ 6 – Uttar Pradesh: Basics</w:t>
+      </w:r>
+    </w:p>
+    <w:p>
+      <w:pPr>
+        <w:pStyle w:val="ListParagraph"/>
+        <w:keepNext/>
+        <w:numPr>
+          <w:ilvl w:val="0"/>
+          <w:numId w:val="2"/>
+        </w:numPr>
+        <w:spacing w:after="0" w:before="120"/>
+      </w:pPr>
+      <w:r>
+        <w:rPr>
+          <w:b/>
+          <w:bCs/>
+        </w:rPr>
+        <w:t xml:space="preserve">What is the capital of Uttar Pradesh?</w:t>
+      </w:r>
+    </w:p>
+    <w:p>
+      <w:pPr>
+        <w:spacing w:after="120"/>
+        <w:ind w:left="440"/>
+      </w:pPr>
+    </w:p>
+    <w:p>
+      <w:pPr>
+        <w:pStyle w:val="ListParagraph"/>
+        <w:keepNext/>
+        <w:numPr>
+          <w:ilvl w:val="0"/>
+          <w:numId w:val="2"/>
+        </w:numPr>
+        <w:spacing w:after="0" w:before="120"/>
+      </w:pPr>
+      <w:r>
+        <w:rPr>
+          <w:b/>
+          <w:bCs/>
+        </w:rPr>
+        <w:t xml:space="preserve">What is the largest city in UP?</w:t>
+      </w:r>
+    </w:p>
+    <w:p>
+      <w:pPr>
+        <w:spacing w:after="120"/>
+        <w:ind w:left="440"/>
+      </w:pPr>
+    </w:p>
+    <w:p>
+      <w:pPr>
+        <w:pStyle w:val="ListParagraph"/>
+        <w:keepNext/>
+        <w:numPr>
+          <w:ilvl w:val="0"/>
+          <w:numId w:val="2"/>
+        </w:numPr>
+        <w:spacing w:after="0" w:before="120"/>
+      </w:pPr>
+      <w:r>
+        <w:rPr>
+          <w:b/>
+          <w:bCs/>
+        </w:rPr>
+        <w:t xml:space="preserve">How many districts are there?</w:t>
+      </w:r>
+    </w:p>
+    <w:p>
+      <w:pPr>
+        <w:spacing w:after="120"/>
+        <w:ind w:left="440"/>
+      </w:pPr>
+    </w:p>
+    <w:p>
+      <w:pPr>
+        <w:pStyle w:val="ListParagraph"/>
+        <w:keepNext/>
+        <w:numPr>
+          <w:ilvl w:val="0"/>
+          <w:numId w:val="2"/>
+        </w:numPr>
+        <w:spacing w:after="0" w:before="120"/>
+      </w:pPr>
+      <w:r>
+        <w:rPr>
+          <w:b/>
+          <w:bCs/>
+        </w:rPr>
+        <w:t xml:space="preserve">What is the population of UP?</w:t>
+      </w:r>
+    </w:p>
+    <w:p>
+      <w:pPr>
+        <w:spacing w:after="120"/>
+        <w:ind w:left="440"/>
+      </w:pPr>
+    </w:p>
+    <w:p>
+      <w:pPr>
+        <w:pStyle w:val="ListParagraph"/>
+        <w:keepNext/>
+        <w:numPr>
+          <w:ilvl w:val="0"/>
+          <w:numId w:val="2"/>
+        </w:numPr>
+        <w:spacing w:after="0" w:before="120"/>
+      </w:pPr>
+      <w:r>
+        <w:rPr>
+          <w:b/>
+          <w:bCs/>
+        </w:rPr>
+        <w:t xml:space="preserve">Which states share a border with UP?</w:t>
+      </w:r>
+    </w:p>
+    <w:p>
+      <w:pPr>
+        <w:spacing w:after="120"/>
+        <w:ind w:left="440"/>
+      </w:pPr>
+    </w:p>
+    <w:p>
+      <w:pPr>
+        <w:pStyle w:val="ListParagraph"/>
+        <w:keepNext/>
+        <w:numPr>
+          <w:ilvl w:val="0"/>
+          <w:numId w:val="2"/>
+        </w:numPr>
+        <w:spacing w:after="0" w:before="120"/>
+      </w:pPr>
+      <w:r>
+        <w:rPr>
+          <w:b/>
+          <w:bCs/>
+        </w:rPr>
+        <w:t xml:space="preserve">Which country shares an international border with UP?</w:t>
+      </w:r>
+    </w:p>
+    <w:p>
+      <w:pPr>
+        <w:spacing w:after="120"/>
+        <w:ind w:left="440"/>
+      </w:pPr>
+    </w:p>
+    <w:p>
+      <w:pPr>
+        <w:pStyle w:val="ListParagraph"/>
+        <w:keepNext/>
+        <w:numPr>
+          <w:ilvl w:val="0"/>
+          <w:numId w:val="2"/>
+        </w:numPr>
+        <w:spacing w:after="0" w:before="120"/>
+      </w:pPr>
+      <w:r>
+        <w:rPr>
+          <w:b/>
+          <w:bCs/>
+        </w:rPr>
+        <w:t xml:space="preserve">What is the official language?</w:t>
+      </w:r>
+    </w:p>
+    <w:p>
+      <w:pPr>
+        <w:spacing w:after="120"/>
+        <w:ind w:left="440"/>
+      </w:pPr>
+    </w:p>
+    <w:p>
+      <w:pPr>
+        <w:pStyle w:val="ListParagraph"/>
+        <w:keepNext/>
+        <w:numPr>
+          <w:ilvl w:val="0"/>
+          <w:numId w:val="2"/>
+        </w:numPr>
+        <w:spacing w:after="0" w:before="120"/>
+      </w:pPr>
+      <w:r>
+        <w:rPr>
+          <w:b/>
+          <w:bCs/>
+        </w:rPr>
+        <w:t xml:space="preserve">What is the geographical location of UP?</w:t>
+      </w:r>
+    </w:p>
+    <w:p>
+      <w:pPr>
+        <w:spacing w:after="120"/>
+        <w:ind w:left="440"/>
+      </w:pPr>
+    </w:p>
+    <w:p>
+      <w:pPr>
+        <w:pStyle w:val="Heading1"/>
+      </w:pPr>
+      <w:r>
+        <w:t xml:space="preserve">PIQ 6 – UP: Geography</w:t>
+      </w:r>
+    </w:p>
+    <w:p>
+      <w:pPr>
+        <w:pStyle w:val="ListParagraph"/>
+        <w:keepNext/>
+        <w:numPr>
+          <w:ilvl w:val="0"/>
+          <w:numId w:val="2"/>
+        </w:numPr>
+        <w:spacing w:after="0" w:before="120"/>
+      </w:pPr>
+      <w:r>
+        <w:rPr>
+          <w:b/>
+          <w:bCs/>
+        </w:rPr>
+        <w:t xml:space="preserve">Name the major rivers of UP.</w:t>
+      </w:r>
+    </w:p>
+    <w:p>
+      <w:pPr>
+        <w:spacing w:after="120"/>
+        <w:ind w:left="440"/>
+      </w:pPr>
+    </w:p>
+    <w:p>
+      <w:pPr>
+        <w:pStyle w:val="ListParagraph"/>
+        <w:keepNext/>
+        <w:numPr>
+          <w:ilvl w:val="0"/>
+          <w:numId w:val="2"/>
+        </w:numPr>
+        <w:spacing w:after="0" w:before="120"/>
+      </w:pPr>
+      <w:r>
+        <w:rPr>
+          <w:b/>
+          <w:bCs/>
+        </w:rPr>
+        <w:t xml:space="preserve">Where does the Ganga enter UP, and what route does it take?</w:t>
+      </w:r>
+    </w:p>
+    <w:p>
+      <w:pPr>
+        <w:spacing w:after="120"/>
+        <w:ind w:left="440"/>
+      </w:pPr>
+    </w:p>
+    <w:p>
+      <w:pPr>
+        <w:pStyle w:val="ListParagraph"/>
+        <w:keepNext/>
+        <w:numPr>
+          <w:ilvl w:val="0"/>
+          <w:numId w:val="2"/>
+        </w:numPr>
+        <w:spacing w:after="0" w:before="120"/>
+      </w:pPr>
+      <w:r>
+        <w:rPr>
+          <w:b/>
+          <w:bCs/>
+        </w:rPr>
+        <w:t xml:space="preserve">What is the importance of the Yamuna?</w:t>
+      </w:r>
+    </w:p>
+    <w:p>
+      <w:pPr>
+        <w:spacing w:after="120"/>
+        <w:ind w:left="440"/>
+      </w:pPr>
+    </w:p>
+    <w:p>
+      <w:pPr>
+        <w:pStyle w:val="ListParagraph"/>
+        <w:keepNext/>
+        <w:numPr>
+          <w:ilvl w:val="0"/>
+          <w:numId w:val="2"/>
+        </w:numPr>
+        <w:spacing w:after="0" w:before="120"/>
+      </w:pPr>
+      <w:r>
+        <w:rPr>
+          <w:b/>
+          <w:bCs/>
+        </w:rPr>
+        <w:t xml:space="preserve">Which rivers are tributaries of the Ganga?</w:t>
+      </w:r>
+    </w:p>
+    <w:p>
+      <w:pPr>
+        <w:spacing w:after="120"/>
+        <w:ind w:left="440"/>
+      </w:pPr>
+    </w:p>
+    <w:p>
+      <w:pPr>
+        <w:pStyle w:val="ListParagraph"/>
+        <w:keepNext/>
+        <w:numPr>
+          <w:ilvl w:val="0"/>
+          <w:numId w:val="2"/>
+        </w:numPr>
+        <w:spacing w:after="0" w:before="120"/>
+      </w:pPr>
+      <w:r>
+        <w:rPr>
+          <w:b/>
+          <w:bCs/>
+        </w:rPr>
+        <w:t xml:space="preserve">What are the major geographical regions of UP?</w:t>
+      </w:r>
+    </w:p>
+    <w:p>
+      <w:pPr>
+        <w:spacing w:after="120"/>
+        <w:ind w:left="440"/>
+      </w:pPr>
+    </w:p>
+    <w:p>
+      <w:pPr>
+        <w:pStyle w:val="ListParagraph"/>
+        <w:keepNext/>
+        <w:numPr>
+          <w:ilvl w:val="0"/>
+          <w:numId w:val="2"/>
+        </w:numPr>
+        <w:spacing w:after="0" w:before="120"/>
+      </w:pPr>
+      <w:r>
+        <w:rPr>
+          <w:b/>
+          <w:bCs/>
+        </w:rPr>
+        <w:t xml:space="preserve">What type of soil is common?</w:t>
+      </w:r>
+    </w:p>
+    <w:p>
+      <w:pPr>
+        <w:spacing w:after="120"/>
+        <w:ind w:left="440"/>
+      </w:pPr>
+    </w:p>
+    <w:p>
+      <w:pPr>
+        <w:pStyle w:val="ListParagraph"/>
+        <w:keepNext/>
+        <w:numPr>
+          <w:ilvl w:val="0"/>
+          <w:numId w:val="2"/>
+        </w:numPr>
+        <w:spacing w:after="0" w:before="120"/>
+      </w:pPr>
+      <w:r>
+        <w:rPr>
+          <w:b/>
+          <w:bCs/>
+        </w:rPr>
+        <w:t xml:space="preserve">What is the climate like?</w:t>
+      </w:r>
+    </w:p>
+    <w:p>
+      <w:pPr>
+        <w:spacing w:after="120"/>
+        <w:ind w:left="440"/>
+      </w:pPr>
+    </w:p>
+    <w:p>
+      <w:pPr>
+        <w:pStyle w:val="ListParagraph"/>
+        <w:keepNext/>
+        <w:numPr>
+          <w:ilvl w:val="0"/>
+          <w:numId w:val="2"/>
+        </w:numPr>
+        <w:spacing w:after="0" w:before="120"/>
+      </w:pPr>
+      <w:r>
+        <w:rPr>
+          <w:b/>
+          <w:bCs/>
+        </w:rPr>
+        <w:t xml:space="preserve">Which crops are mainly grown in UP?</w:t>
+      </w:r>
+    </w:p>
+    <w:p>
+      <w:pPr>
+        <w:spacing w:after="120"/>
+        <w:ind w:left="440"/>
+      </w:pPr>
+    </w:p>
+    <w:p>
+      <w:pPr>
+        <w:pStyle w:val="ListParagraph"/>
+        <w:keepNext/>
+        <w:numPr>
+          <w:ilvl w:val="0"/>
+          <w:numId w:val="2"/>
+        </w:numPr>
+        <w:spacing w:after="0" w:before="120"/>
+      </w:pPr>
+      <w:r>
+        <w:rPr>
+          <w:b/>
+          <w:bCs/>
+        </w:rPr>
+        <w:t xml:space="preserve">Which areas are more industrialised?</w:t>
+      </w:r>
+    </w:p>
+    <w:p>
+      <w:pPr>
+        <w:spacing w:after="120"/>
+        <w:ind w:left="440"/>
+      </w:pPr>
+    </w:p>
+    <w:p>
+      <w:pPr>
+        <w:pStyle w:val="ListParagraph"/>
+        <w:keepNext/>
+        <w:numPr>
+          <w:ilvl w:val="0"/>
+          <w:numId w:val="2"/>
+        </w:numPr>
+        <w:spacing w:after="0" w:before="120"/>
+      </w:pPr>
+      <w:r>
+        <w:rPr>
+          <w:b/>
+          <w:bCs/>
+        </w:rPr>
+        <w:t xml:space="preserve">Which areas are less developed?</w:t>
+      </w:r>
+    </w:p>
+    <w:p>
+      <w:pPr>
+        <w:spacing w:after="120"/>
+        <w:ind w:left="440"/>
+      </w:pPr>
+    </w:p>
+    <w:p>
+      <w:pPr>
+        <w:pStyle w:val="ListParagraph"/>
+        <w:keepNext/>
+        <w:numPr>
+          <w:ilvl w:val="0"/>
+          <w:numId w:val="2"/>
+        </w:numPr>
+        <w:spacing w:after="0" w:before="120"/>
+      </w:pPr>
+      <w:r>
+        <w:rPr>
+          <w:b/>
+          <w:bCs/>
+        </w:rPr>
+        <w:t xml:space="preserve">What are the major sources of irrigation?</w:t>
+      </w:r>
+    </w:p>
+    <w:p>
+      <w:pPr>
+        <w:spacing w:after="120"/>
+        <w:ind w:left="440"/>
+      </w:pPr>
+    </w:p>
+    <w:p>
+      <w:pPr>
+        <w:pStyle w:val="Heading1"/>
+      </w:pPr>
+      <w:r>
+        <w:t xml:space="preserve">PIQ 6 – UP: History</w:t>
+      </w:r>
+    </w:p>
+    <w:p>
+      <w:pPr>
+        <w:pStyle w:val="ListParagraph"/>
+        <w:keepNext/>
+        <w:numPr>
+          <w:ilvl w:val="0"/>
+          <w:numId w:val="2"/>
+        </w:numPr>
+        <w:spacing w:after="0" w:before="120"/>
+      </w:pPr>
+      <w:r>
+        <w:rPr>
+          <w:b/>
+          <w:bCs/>
+        </w:rPr>
+        <w:t xml:space="preserve">Why is Uttar Pradesh historically important?</w:t>
+      </w:r>
+    </w:p>
+    <w:p>
+      <w:pPr>
+        <w:spacing w:after="120"/>
+        <w:ind w:left="440"/>
+      </w:pPr>
+    </w:p>
+    <w:p>
+      <w:pPr>
+        <w:pStyle w:val="ListParagraph"/>
+        <w:keepNext/>
+        <w:numPr>
+          <w:ilvl w:val="0"/>
+          <w:numId w:val="2"/>
+        </w:numPr>
+        <w:spacing w:after="0" w:before="120"/>
+      </w:pPr>
+      <w:r>
+        <w:rPr>
+          <w:b/>
+          <w:bCs/>
+        </w:rPr>
+        <w:t xml:space="preserve">Which important kingdoms and empires were based in present-day UP?</w:t>
+      </w:r>
+    </w:p>
+    <w:p>
+      <w:pPr>
+        <w:spacing w:after="120"/>
+        <w:ind w:left="440"/>
+      </w:pPr>
+    </w:p>
+    <w:p>
+      <w:pPr>
+        <w:pStyle w:val="ListParagraph"/>
+        <w:keepNext/>
+        <w:numPr>
+          <w:ilvl w:val="0"/>
+          <w:numId w:val="2"/>
+        </w:numPr>
+        <w:spacing w:after="0" w:before="120"/>
+      </w:pPr>
+      <w:r>
+        <w:rPr>
+          <w:b/>
+          <w:bCs/>
+        </w:rPr>
+        <w:t xml:space="preserve">What was UP's role in the freedom struggle?</w:t>
+      </w:r>
+    </w:p>
+    <w:p>
+      <w:pPr>
+        <w:spacing w:after="120"/>
+        <w:ind w:left="440"/>
+      </w:pPr>
+    </w:p>
+    <w:p>
+      <w:pPr>
+        <w:pStyle w:val="ListParagraph"/>
+        <w:keepNext/>
+        <w:numPr>
+          <w:ilvl w:val="0"/>
+          <w:numId w:val="2"/>
+        </w:numPr>
+        <w:spacing w:after="0" w:before="120"/>
+      </w:pPr>
+      <w:r>
+        <w:rPr>
+          <w:b/>
+          <w:bCs/>
+        </w:rPr>
+        <w:t xml:space="preserve">What happened in UP during the Revolt of 1857?</w:t>
+      </w:r>
+    </w:p>
+    <w:p>
+      <w:pPr>
+        <w:spacing w:after="120"/>
+        <w:ind w:left="440"/>
+      </w:pPr>
+    </w:p>
+    <w:p>
+      <w:pPr>
+        <w:pStyle w:val="ListParagraph"/>
+        <w:keepNext/>
+        <w:numPr>
+          <w:ilvl w:val="0"/>
+          <w:numId w:val="2"/>
+        </w:numPr>
+        <w:spacing w:after="0" w:before="120"/>
+      </w:pPr>
+      <w:r>
+        <w:rPr>
+          <w:b/>
+          <w:bCs/>
+        </w:rPr>
+        <w:t xml:space="preserve">Why is Meerut associated with 1857?</w:t>
+      </w:r>
+    </w:p>
+    <w:p>
+      <w:pPr>
+        <w:spacing w:after="120"/>
+        <w:ind w:left="440"/>
+      </w:pPr>
+    </w:p>
+    <w:p>
+      <w:pPr>
+        <w:pStyle w:val="ListParagraph"/>
+        <w:keepNext/>
+        <w:numPr>
+          <w:ilvl w:val="0"/>
+          <w:numId w:val="2"/>
+        </w:numPr>
+        <w:spacing w:after="0" w:before="120"/>
+      </w:pPr>
+      <w:r>
+        <w:rPr>
+          <w:b/>
+          <w:bCs/>
+        </w:rPr>
+        <w:t xml:space="preserve">What was Lucknow's significance in the freedom struggle?</w:t>
+      </w:r>
+    </w:p>
+    <w:p>
+      <w:pPr>
+        <w:spacing w:after="120"/>
+        <w:ind w:left="440"/>
+      </w:pPr>
+    </w:p>
+    <w:p>
+      <w:pPr>
+        <w:pStyle w:val="ListParagraph"/>
+        <w:keepNext/>
+        <w:numPr>
+          <w:ilvl w:val="0"/>
+          <w:numId w:val="2"/>
+        </w:numPr>
+        <w:spacing w:after="0" w:before="120"/>
+      </w:pPr>
+      <w:r>
+        <w:rPr>
+          <w:b/>
+          <w:bCs/>
+        </w:rPr>
+        <w:t xml:space="preserve">What is the significance of Ayodhya?</w:t>
+      </w:r>
+    </w:p>
+    <w:p>
+      <w:pPr>
+        <w:spacing w:after="120"/>
+        <w:ind w:left="440"/>
+      </w:pPr>
+    </w:p>
+    <w:p>
+      <w:pPr>
+        <w:pStyle w:val="ListParagraph"/>
+        <w:keepNext/>
+        <w:numPr>
+          <w:ilvl w:val="0"/>
+          <w:numId w:val="2"/>
+        </w:numPr>
+        <w:spacing w:after="0" w:before="120"/>
+      </w:pPr>
+      <w:r>
+        <w:rPr>
+          <w:b/>
+          <w:bCs/>
+        </w:rPr>
+        <w:t xml:space="preserve">What is the significance of Varanasi?</w:t>
+      </w:r>
+    </w:p>
+    <w:p>
+      <w:pPr>
+        <w:spacing w:after="120"/>
+        <w:ind w:left="440"/>
+      </w:pPr>
+    </w:p>
+    <w:p>
+      <w:pPr>
+        <w:pStyle w:val="ListParagraph"/>
+        <w:keepNext/>
+        <w:numPr>
+          <w:ilvl w:val="0"/>
+          <w:numId w:val="2"/>
+        </w:numPr>
+        <w:spacing w:after="0" w:before="120"/>
+      </w:pPr>
+      <w:r>
+        <w:rPr>
+          <w:b/>
+          <w:bCs/>
+        </w:rPr>
+        <w:t xml:space="preserve">What is the significance of Prayagraj?</w:t>
+      </w:r>
+    </w:p>
+    <w:p>
+      <w:pPr>
+        <w:spacing w:after="120"/>
+        <w:ind w:left="440"/>
+      </w:pPr>
+    </w:p>
+    <w:p>
+      <w:pPr>
+        <w:pStyle w:val="ListParagraph"/>
+        <w:keepNext/>
+        <w:numPr>
+          <w:ilvl w:val="0"/>
+          <w:numId w:val="2"/>
+        </w:numPr>
+        <w:spacing w:after="0" w:before="120"/>
+      </w:pPr>
+      <w:r>
+        <w:rPr>
+          <w:b/>
+          <w:bCs/>
+        </w:rPr>
+        <w:t xml:space="preserve">Which important Buddhist sites are in UP?</w:t>
+      </w:r>
+    </w:p>
+    <w:p>
+      <w:pPr>
+        <w:spacing w:after="120"/>
+        <w:ind w:left="440"/>
+      </w:pPr>
+    </w:p>
+    <w:p>
+      <w:pPr>
+        <w:pStyle w:val="Heading1"/>
+      </w:pPr>
+      <w:r>
+        <w:t xml:space="preserve">PIQ 6 – UP: Economy</w:t>
+      </w:r>
+    </w:p>
+    <w:p>
+      <w:pPr>
+        <w:pStyle w:val="ListParagraph"/>
+        <w:keepNext/>
+        <w:numPr>
+          <w:ilvl w:val="0"/>
+          <w:numId w:val="2"/>
+        </w:numPr>
+        <w:spacing w:after="0" w:before="120"/>
+      </w:pPr>
+      <w:r>
+        <w:rPr>
+          <w:b/>
+          <w:bCs/>
+        </w:rPr>
+        <w:t xml:space="preserve">What are the major industries of UP?</w:t>
+      </w:r>
+    </w:p>
+    <w:p>
+      <w:pPr>
+        <w:spacing w:after="120"/>
+        <w:ind w:left="440"/>
+      </w:pPr>
+    </w:p>
+    <w:p>
+      <w:pPr>
+        <w:pStyle w:val="ListParagraph"/>
+        <w:keepNext/>
+        <w:numPr>
+          <w:ilvl w:val="0"/>
+          <w:numId w:val="2"/>
+        </w:numPr>
+        <w:spacing w:after="0" w:before="120"/>
+      </w:pPr>
+      <w:r>
+        <w:rPr>
+          <w:b/>
+          <w:bCs/>
+        </w:rPr>
+        <w:t xml:space="preserve">Which industries are important in different regions of UP?</w:t>
+      </w:r>
+    </w:p>
+    <w:p>
+      <w:pPr>
+        <w:spacing w:after="120"/>
+        <w:ind w:left="440"/>
+      </w:pPr>
+    </w:p>
+    <w:p>
+      <w:pPr>
+        <w:pStyle w:val="ListParagraph"/>
+        <w:keepNext/>
+        <w:numPr>
+          <w:ilvl w:val="0"/>
+          <w:numId w:val="2"/>
+        </w:numPr>
+        <w:spacing w:after="0" w:before="120"/>
+      </w:pPr>
+      <w:r>
+        <w:rPr>
+          <w:b/>
+          <w:bCs/>
+        </w:rPr>
+        <w:t xml:space="preserve">Why is agriculture important to UP?</w:t>
+      </w:r>
+    </w:p>
+    <w:p>
+      <w:pPr>
+        <w:spacing w:after="120"/>
+        <w:ind w:left="440"/>
+      </w:pPr>
+    </w:p>
+    <w:p>
+      <w:pPr>
+        <w:pStyle w:val="ListParagraph"/>
+        <w:keepNext/>
+        <w:numPr>
+          <w:ilvl w:val="0"/>
+          <w:numId w:val="2"/>
+        </w:numPr>
+        <w:spacing w:after="0" w:before="120"/>
+      </w:pPr>
+      <w:r>
+        <w:rPr>
+          <w:b/>
+          <w:bCs/>
+        </w:rPr>
+        <w:t xml:space="preserve">What is the importance of the MSME sector?</w:t>
+      </w:r>
+    </w:p>
+    <w:p>
+      <w:pPr>
+        <w:spacing w:after="120"/>
+        <w:ind w:left="440"/>
+      </w:pPr>
+    </w:p>
+    <w:p>
+      <w:pPr>
+        <w:pStyle w:val="ListParagraph"/>
+        <w:keepNext/>
+        <w:numPr>
+          <w:ilvl w:val="0"/>
+          <w:numId w:val="2"/>
+        </w:numPr>
+        <w:spacing w:after="0" w:before="120"/>
+      </w:pPr>
+      <w:r>
+        <w:rPr>
+          <w:b/>
+          <w:bCs/>
+        </w:rPr>
+        <w:t xml:space="preserve">What is ODOP, and what are its objectives?</w:t>
+      </w:r>
+    </w:p>
+    <w:p>
+      <w:pPr>
+        <w:spacing w:after="120"/>
+        <w:ind w:left="440"/>
+      </w:pPr>
+    </w:p>
+    <w:p>
+      <w:pPr>
+        <w:pStyle w:val="ListParagraph"/>
+        <w:keepNext/>
+        <w:numPr>
+          <w:ilvl w:val="0"/>
+          <w:numId w:val="2"/>
+        </w:numPr>
+        <w:spacing w:after="0" w:before="120"/>
+      </w:pPr>
+      <w:r>
+        <w:rPr>
+          <w:b/>
+          <w:bCs/>
+        </w:rPr>
+        <w:t xml:space="preserve">What are UP's major export products?</w:t>
+      </w:r>
+    </w:p>
+    <w:p>
+      <w:pPr>
+        <w:spacing w:after="120"/>
+        <w:ind w:left="440"/>
+      </w:pPr>
+    </w:p>
+    <w:p>
+      <w:pPr>
+        <w:pStyle w:val="ListParagraph"/>
+        <w:keepNext/>
+        <w:numPr>
+          <w:ilvl w:val="0"/>
+          <w:numId w:val="2"/>
+        </w:numPr>
+        <w:spacing w:after="0" w:before="120"/>
+      </w:pPr>
+      <w:r>
+        <w:rPr>
+          <w:b/>
+          <w:bCs/>
+        </w:rPr>
+        <w:t xml:space="preserve">What are the major economic challenges?</w:t>
+      </w:r>
+    </w:p>
+    <w:p>
+      <w:pPr>
+        <w:spacing w:after="120"/>
+        <w:ind w:left="440"/>
+      </w:pPr>
+    </w:p>
+    <w:p>
+      <w:pPr>
+        <w:pStyle w:val="ListParagraph"/>
+        <w:keepNext/>
+        <w:numPr>
+          <w:ilvl w:val="0"/>
+          <w:numId w:val="2"/>
+        </w:numPr>
+        <w:spacing w:after="0" w:before="120"/>
+      </w:pPr>
+      <w:r>
+        <w:rPr>
+          <w:b/>
+          <w:bCs/>
+        </w:rPr>
+        <w:t xml:space="preserve">How can UP create more jobs?</w:t>
+      </w:r>
+    </w:p>
+    <w:p>
+      <w:pPr>
+        <w:spacing w:after="120"/>
+        <w:ind w:left="440"/>
+      </w:pPr>
+    </w:p>
+    <w:p>
+      <w:pPr>
+        <w:pStyle w:val="ListParagraph"/>
+        <w:keepNext/>
+        <w:numPr>
+          <w:ilvl w:val="0"/>
+          <w:numId w:val="2"/>
+        </w:numPr>
+        <w:spacing w:after="0" w:before="120"/>
+      </w:pPr>
+      <w:r>
+        <w:rPr>
+          <w:b/>
+          <w:bCs/>
+        </w:rPr>
+        <w:t xml:space="preserve">What infrastructure is helping UP's economic growth?</w:t>
+      </w:r>
+    </w:p>
+    <w:p>
+      <w:pPr>
+        <w:spacing w:after="120"/>
+        <w:ind w:left="440"/>
+      </w:pPr>
+    </w:p>
+    <w:p>
+      <w:pPr>
+        <w:pStyle w:val="ListParagraph"/>
+        <w:keepNext/>
+        <w:numPr>
+          <w:ilvl w:val="0"/>
+          <w:numId w:val="2"/>
+        </w:numPr>
+        <w:spacing w:after="0" w:before="120"/>
+      </w:pPr>
+      <w:r>
+        <w:rPr>
+          <w:b/>
+          <w:bCs/>
+        </w:rPr>
+        <w:t xml:space="preserve">What major projects and government initiatives are under way in UP?</w:t>
+      </w:r>
+    </w:p>
+    <w:p>
+      <w:pPr>
+        <w:spacing w:after="120"/>
+        <w:ind w:left="440"/>
+      </w:pPr>
+    </w:p>
+    <w:p>
+      <w:pPr>
+        <w:pStyle w:val="Heading1"/>
+      </w:pPr>
+      <w:r>
+        <w:t xml:space="preserve">PIQ 6 – UP: Administration</w:t>
+      </w:r>
+    </w:p>
+    <w:p>
+      <w:pPr>
+        <w:pStyle w:val="ListParagraph"/>
+        <w:keepNext/>
+        <w:numPr>
+          <w:ilvl w:val="0"/>
+          <w:numId w:val="2"/>
+        </w:numPr>
+        <w:spacing w:after="0" w:before="120"/>
+      </w:pPr>
+      <w:r>
+        <w:rPr>
+          <w:b/>
+          <w:bCs/>
+        </w:rPr>
+        <w:t xml:space="preserve">Who is the constitutional head of the state?</w:t>
+      </w:r>
+    </w:p>
+    <w:p>
+      <w:pPr>
+        <w:spacing w:after="120"/>
+        <w:ind w:left="440"/>
+      </w:pPr>
+    </w:p>
+    <w:p>
+      <w:pPr>
+        <w:pStyle w:val="ListParagraph"/>
+        <w:keepNext/>
+        <w:numPr>
+          <w:ilvl w:val="0"/>
+          <w:numId w:val="2"/>
+        </w:numPr>
+        <w:spacing w:after="0" w:before="120"/>
+      </w:pPr>
+      <w:r>
+        <w:rPr>
+          <w:b/>
+          <w:bCs/>
+        </w:rPr>
+        <w:t xml:space="preserve">Who heads the state government?</w:t>
+      </w:r>
+    </w:p>
+    <w:p>
+      <w:pPr>
+        <w:spacing w:after="120"/>
+        <w:ind w:left="440"/>
+      </w:pPr>
+    </w:p>
+    <w:p>
+      <w:pPr>
+        <w:pStyle w:val="ListParagraph"/>
+        <w:keepNext/>
+        <w:numPr>
+          <w:ilvl w:val="0"/>
+          <w:numId w:val="2"/>
+        </w:numPr>
+        <w:spacing w:after="0" w:before="120"/>
+      </w:pPr>
+      <w:r>
+        <w:rPr>
+          <w:b/>
+          <w:bCs/>
+        </w:rPr>
+        <w:t xml:space="preserve">What is the role of the Chief Secretary?</w:t>
+      </w:r>
+    </w:p>
+    <w:p>
+      <w:pPr>
+        <w:spacing w:after="120"/>
+        <w:ind w:left="440"/>
+      </w:pPr>
+    </w:p>
+    <w:p>
+      <w:pPr>
+        <w:pStyle w:val="ListParagraph"/>
+        <w:keepNext/>
+        <w:numPr>
+          <w:ilvl w:val="0"/>
+          <w:numId w:val="2"/>
+        </w:numPr>
+        <w:spacing w:after="0" w:before="120"/>
+      </w:pPr>
+      <w:r>
+        <w:rPr>
+          <w:b/>
+          <w:bCs/>
+        </w:rPr>
+        <w:t xml:space="preserve">What is the role of the District Magistrate?</w:t>
+      </w:r>
+    </w:p>
+    <w:p>
+      <w:pPr>
+        <w:spacing w:after="120"/>
+        <w:ind w:left="440"/>
+      </w:pPr>
+    </w:p>
+    <w:p>
+      <w:pPr>
+        <w:pStyle w:val="ListParagraph"/>
+        <w:keepNext/>
+        <w:numPr>
+          <w:ilvl w:val="0"/>
+          <w:numId w:val="2"/>
+        </w:numPr>
+        <w:spacing w:after="0" w:before="120"/>
+      </w:pPr>
+      <w:r>
+        <w:rPr>
+          <w:b/>
+          <w:bCs/>
+        </w:rPr>
+        <w:t xml:space="preserve">What is the role of the Superintendent of Police?</w:t>
+      </w:r>
+    </w:p>
+    <w:p>
+      <w:pPr>
+        <w:spacing w:after="120"/>
+        <w:ind w:left="440"/>
+      </w:pPr>
+    </w:p>
+    <w:p>
+      <w:pPr>
+        <w:pStyle w:val="ListParagraph"/>
+        <w:keepNext/>
+        <w:numPr>
+          <w:ilvl w:val="0"/>
+          <w:numId w:val="2"/>
+        </w:numPr>
+        <w:spacing w:after="0" w:before="120"/>
+      </w:pPr>
+      <w:r>
+        <w:rPr>
+          <w:b/>
+          <w:bCs/>
+        </w:rPr>
+        <w:t xml:space="preserve">What is the difference between a district and a division?</w:t>
+      </w:r>
+    </w:p>
+    <w:p>
+      <w:pPr>
+        <w:spacing w:after="120"/>
+        <w:ind w:left="440"/>
+      </w:pPr>
+    </w:p>
+    <w:p>
+      <w:pPr>
+        <w:pStyle w:val="ListParagraph"/>
+        <w:keepNext/>
+        <w:numPr>
+          <w:ilvl w:val="0"/>
+          <w:numId w:val="2"/>
+        </w:numPr>
+        <w:spacing w:after="0" w:before="120"/>
+      </w:pPr>
+      <w:r>
+        <w:rPr>
+          <w:b/>
+          <w:bCs/>
+        </w:rPr>
+        <w:t xml:space="preserve">What is the role of the UP Legislative Assembly?</w:t>
+      </w:r>
+    </w:p>
+    <w:p>
+      <w:pPr>
+        <w:spacing w:after="120"/>
+        <w:ind w:left="440"/>
+      </w:pPr>
+    </w:p>
+    <w:p>
+      <w:pPr>
+        <w:pStyle w:val="ListParagraph"/>
+        <w:keepNext/>
+        <w:numPr>
+          <w:ilvl w:val="0"/>
+          <w:numId w:val="2"/>
+        </w:numPr>
+        <w:spacing w:after="0" w:before="120"/>
+      </w:pPr>
+      <w:r>
+        <w:rPr>
+          <w:b/>
+          <w:bCs/>
+        </w:rPr>
+        <w:t xml:space="preserve">How many Lok Sabha seats does UP have?</w:t>
+      </w:r>
+    </w:p>
+    <w:p>
+      <w:pPr>
+        <w:spacing w:after="120"/>
+        <w:ind w:left="440"/>
+      </w:pPr>
+    </w:p>
+    <w:p>
+      <w:pPr>
+        <w:pStyle w:val="ListParagraph"/>
+        <w:keepNext/>
+        <w:numPr>
+          <w:ilvl w:val="0"/>
+          <w:numId w:val="2"/>
+        </w:numPr>
+        <w:spacing w:after="0" w:before="120"/>
+      </w:pPr>
+      <w:r>
+        <w:rPr>
+          <w:b/>
+          <w:bCs/>
+        </w:rPr>
+        <w:t xml:space="preserve">How many Rajya Sabha seats does UP have?</w:t>
+      </w:r>
+    </w:p>
+    <w:p>
+      <w:pPr>
+        <w:spacing w:after="120"/>
+        <w:ind w:left="440"/>
+      </w:pPr>
+    </w:p>
+    <w:p>
+      <w:pPr>
+        <w:pStyle w:val="Heading1"/>
+      </w:pPr>
+      <w:r>
+        <w:t xml:space="preserve">PIQ 6 – UP: Defence</w:t>
+      </w:r>
+    </w:p>
+    <w:p>
+      <w:pPr>
+        <w:pStyle w:val="ListParagraph"/>
+        <w:keepNext/>
+        <w:numPr>
+          <w:ilvl w:val="0"/>
+          <w:numId w:val="2"/>
+        </w:numPr>
+        <w:spacing w:after="0" w:before="120"/>
+      </w:pPr>
+      <w:r>
+        <w:rPr>
+          <w:b/>
+          <w:bCs/>
+        </w:rPr>
+        <w:t xml:space="preserve">What is UP's contribution to the Indian Armed Forces?</w:t>
+      </w:r>
+    </w:p>
+    <w:p>
+      <w:pPr>
+        <w:spacing w:after="120"/>
+        <w:ind w:left="440"/>
+      </w:pPr>
+    </w:p>
+    <w:p>
+      <w:pPr>
+        <w:pStyle w:val="ListParagraph"/>
+        <w:keepNext/>
+        <w:numPr>
+          <w:ilvl w:val="0"/>
+          <w:numId w:val="2"/>
+        </w:numPr>
+        <w:spacing w:after="0" w:before="120"/>
+      </w:pPr>
+      <w:r>
+        <w:rPr>
+          <w:b/>
+          <w:bCs/>
+        </w:rPr>
+        <w:t xml:space="preserve">Which major defence establishments are in UP?</w:t>
+      </w:r>
+    </w:p>
+    <w:p>
+      <w:pPr>
+        <w:spacing w:after="120"/>
+        <w:ind w:left="440"/>
+      </w:pPr>
+    </w:p>
+    <w:p>
+      <w:pPr>
+        <w:pStyle w:val="ListParagraph"/>
+        <w:keepNext/>
+        <w:numPr>
+          <w:ilvl w:val="0"/>
+          <w:numId w:val="2"/>
+        </w:numPr>
+        <w:spacing w:after="0" w:before="120"/>
+      </w:pPr>
+      <w:r>
+        <w:rPr>
+          <w:b/>
+          <w:bCs/>
+        </w:rPr>
+        <w:t xml:space="preserve">What is the importance of Lucknow's defence institutions?</w:t>
+      </w:r>
+    </w:p>
+    <w:p>
+      <w:pPr>
+        <w:spacing w:after="120"/>
+        <w:ind w:left="440"/>
+      </w:pPr>
+    </w:p>
+    <w:p>
+      <w:pPr>
+        <w:pStyle w:val="ListParagraph"/>
+        <w:keepNext/>
+        <w:numPr>
+          <w:ilvl w:val="0"/>
+          <w:numId w:val="2"/>
+        </w:numPr>
+        <w:spacing w:after="0" w:before="120"/>
+      </w:pPr>
+      <w:r>
+        <w:rPr>
+          <w:b/>
+          <w:bCs/>
+        </w:rPr>
+        <w:t xml:space="preserve">Which defence-industrial projects are in UP?</w:t>
+      </w:r>
+    </w:p>
+    <w:p>
+      <w:pPr>
+        <w:spacing w:after="120"/>
+        <w:ind w:left="440"/>
+      </w:pPr>
+    </w:p>
+    <w:p>
+      <w:pPr>
+        <w:pStyle w:val="ListParagraph"/>
+        <w:keepNext/>
+        <w:numPr>
+          <w:ilvl w:val="0"/>
+          <w:numId w:val="2"/>
+        </w:numPr>
+        <w:spacing w:after="0" w:before="120"/>
+      </w:pPr>
+      <w:r>
+        <w:rPr>
+          <w:b/>
+          <w:bCs/>
+        </w:rPr>
+        <w:t xml:space="preserve">What is the UP Defence Industrial Corridor?</w:t>
+      </w:r>
+    </w:p>
+    <w:p>
+      <w:pPr>
+        <w:spacing w:after="120"/>
+        <w:ind w:left="440"/>
+      </w:pPr>
+    </w:p>
+    <w:p>
+      <w:pPr>
+        <w:pStyle w:val="ListParagraph"/>
+        <w:keepNext/>
+        <w:numPr>
+          <w:ilvl w:val="0"/>
+          <w:numId w:val="2"/>
+        </w:numPr>
+        <w:spacing w:after="0" w:before="120"/>
+      </w:pPr>
+      <w:r>
+        <w:rPr>
+          <w:b/>
+          <w:bCs/>
+        </w:rPr>
+        <w:t xml:space="preserve">Name its nodes.</w:t>
+      </w:r>
+    </w:p>
+    <w:p>
+      <w:pPr>
+        <w:spacing w:after="120"/>
+        <w:ind w:left="440"/>
+      </w:pPr>
+    </w:p>
+    <w:p>
+      <w:pPr>
+        <w:pStyle w:val="ListParagraph"/>
+        <w:keepNext/>
+        <w:numPr>
+          <w:ilvl w:val="0"/>
+          <w:numId w:val="2"/>
+        </w:numPr>
+        <w:spacing w:after="0" w:before="120"/>
+      </w:pPr>
+      <w:r>
+        <w:rPr>
+          <w:b/>
+          <w:bCs/>
+        </w:rPr>
+        <w:t xml:space="preserve">Why is a defence industrial corridor important?</w:t>
+      </w:r>
+    </w:p>
+    <w:p>
+      <w:pPr>
+        <w:spacing w:after="120"/>
+        <w:ind w:left="440"/>
+      </w:pPr>
+    </w:p>
+    <w:p>
+      <w:pPr>
+        <w:pStyle w:val="ListParagraph"/>
+        <w:keepNext/>
+        <w:numPr>
+          <w:ilvl w:val="0"/>
+          <w:numId w:val="2"/>
+        </w:numPr>
+        <w:spacing w:after="0" w:before="120"/>
+      </w:pPr>
+      <w:r>
+        <w:rPr>
+          <w:b/>
+          <w:bCs/>
+        </w:rPr>
+        <w:t xml:space="preserve">What kind of defence equipment can be made there?</w:t>
+      </w:r>
+    </w:p>
+    <w:p>
+      <w:pPr>
+        <w:spacing w:after="120"/>
+        <w:ind w:left="440"/>
+      </w:pPr>
+    </w:p>
+    <w:p>
+      <w:pPr>
+        <w:pStyle w:val="Heading1"/>
+      </w:pPr>
+      <w:r>
+        <w:t xml:space="preserve">PIQ 6 – UP: Famous Personalities</w:t>
+      </w:r>
+    </w:p>
+    <w:p>
+      <w:pPr>
+        <w:pStyle w:val="ListParagraph"/>
+        <w:keepNext/>
+        <w:numPr>
+          <w:ilvl w:val="0"/>
+          <w:numId w:val="2"/>
+        </w:numPr>
+        <w:spacing w:after="0" w:before="120"/>
+      </w:pPr>
+      <w:r>
+        <w:rPr>
+          <w:b/>
+          <w:bCs/>
+        </w:rPr>
+        <w:t xml:space="preserve">Name some freedom fighters from UP and their contributions.</w:t>
+      </w:r>
+    </w:p>
+    <w:p>
+      <w:pPr>
+        <w:spacing w:after="120"/>
+        <w:ind w:left="440"/>
+      </w:pPr>
+    </w:p>
+    <w:p>
+      <w:pPr>
+        <w:pStyle w:val="ListParagraph"/>
+        <w:keepNext/>
+        <w:numPr>
+          <w:ilvl w:val="0"/>
+          <w:numId w:val="2"/>
+        </w:numPr>
+        <w:spacing w:after="0" w:before="120"/>
+      </w:pPr>
+      <w:r>
+        <w:rPr>
+          <w:b/>
+          <w:bCs/>
+        </w:rPr>
+        <w:t xml:space="preserve">Name some important political leaders from UP.</w:t>
+      </w:r>
+    </w:p>
+    <w:p>
+      <w:pPr>
+        <w:spacing w:after="120"/>
+        <w:ind w:left="440"/>
+      </w:pPr>
+    </w:p>
+    <w:p>
+      <w:pPr>
+        <w:pStyle w:val="ListParagraph"/>
+        <w:keepNext/>
+        <w:numPr>
+          <w:ilvl w:val="0"/>
+          <w:numId w:val="2"/>
+        </w:numPr>
+        <w:spacing w:after="0" w:before="120"/>
+      </w:pPr>
+      <w:r>
+        <w:rPr>
+          <w:b/>
+          <w:bCs/>
+        </w:rPr>
+        <w:t xml:space="preserve">Name some famous writers and poets from UP.</w:t>
+      </w:r>
+    </w:p>
+    <w:p>
+      <w:pPr>
+        <w:spacing w:after="120"/>
+        <w:ind w:left="440"/>
+      </w:pPr>
+    </w:p>
+    <w:p>
+      <w:pPr>
+        <w:pStyle w:val="ListParagraph"/>
+        <w:keepNext/>
+        <w:numPr>
+          <w:ilvl w:val="0"/>
+          <w:numId w:val="2"/>
+        </w:numPr>
+        <w:spacing w:after="0" w:before="120"/>
+      </w:pPr>
+      <w:r>
+        <w:rPr>
+          <w:b/>
+          <w:bCs/>
+        </w:rPr>
+        <w:t xml:space="preserve">Name some scientists from UP.</w:t>
+      </w:r>
+    </w:p>
+    <w:p>
+      <w:pPr>
+        <w:spacing w:after="120"/>
+        <w:ind w:left="440"/>
+      </w:pPr>
+    </w:p>
+    <w:p>
+      <w:pPr>
+        <w:pStyle w:val="ListParagraph"/>
+        <w:keepNext/>
+        <w:numPr>
+          <w:ilvl w:val="0"/>
+          <w:numId w:val="2"/>
+        </w:numPr>
+        <w:spacing w:after="0" w:before="120"/>
+      </w:pPr>
+      <w:r>
+        <w:rPr>
+          <w:b/>
+          <w:bCs/>
+        </w:rPr>
+        <w:t xml:space="preserve">Name some sportspersons from UP.</w:t>
+      </w:r>
+    </w:p>
+    <w:p>
+      <w:pPr>
+        <w:spacing w:after="120"/>
+        <w:ind w:left="440"/>
+      </w:pPr>
+    </w:p>
+    <w:p>
+      <w:pPr>
+        <w:pStyle w:val="ListParagraph"/>
+        <w:keepNext/>
+        <w:numPr>
+          <w:ilvl w:val="0"/>
+          <w:numId w:val="2"/>
+        </w:numPr>
+        <w:spacing w:after="0" w:before="120"/>
+      </w:pPr>
+      <w:r>
+        <w:rPr>
+          <w:b/>
+          <w:bCs/>
+        </w:rPr>
+        <w:t xml:space="preserve">Name some artists and cultural figures from UP.</w:t>
+      </w:r>
+    </w:p>
+    <w:p>
+      <w:pPr>
+        <w:spacing w:after="120"/>
+        <w:ind w:left="440"/>
+      </w:pPr>
+    </w:p>
+    <w:p>
+      <w:pPr>
+        <w:pStyle w:val="ListParagraph"/>
+        <w:keepNext/>
+        <w:numPr>
+          <w:ilvl w:val="0"/>
+          <w:numId w:val="2"/>
+        </w:numPr>
+        <w:spacing w:after="0" w:before="120"/>
+      </w:pPr>
+      <w:r>
+        <w:rPr>
+          <w:b/>
+          <w:bCs/>
+        </w:rPr>
+        <w:t xml:space="preserve">Name some military personalities from UP.</w:t>
+      </w:r>
+    </w:p>
+    <w:p>
+      <w:pPr>
+        <w:spacing w:after="120"/>
+        <w:ind w:left="440"/>
+      </w:pPr>
+    </w:p>
+    <w:p>
+      <w:pPr>
+        <w:pStyle w:val="Heading1"/>
+      </w:pPr>
+      <w:r>
+        <w:t xml:space="preserve">PIQ 6 – UP: Culture</w:t>
+      </w:r>
+    </w:p>
+    <w:p>
+      <w:pPr>
+        <w:pStyle w:val="ListParagraph"/>
+        <w:keepNext/>
+        <w:numPr>
+          <w:ilvl w:val="0"/>
+          <w:numId w:val="2"/>
+        </w:numPr>
+        <w:spacing w:after="0" w:before="120"/>
+      </w:pPr>
+      <w:r>
+        <w:rPr>
+          <w:b/>
+          <w:bCs/>
+        </w:rPr>
+        <w:t xml:space="preserve">What are the major festivals of UP?</w:t>
+      </w:r>
+    </w:p>
+    <w:p>
+      <w:pPr>
+        <w:spacing w:after="120"/>
+        <w:ind w:left="440"/>
+      </w:pPr>
+    </w:p>
+    <w:p>
+      <w:pPr>
+        <w:pStyle w:val="ListParagraph"/>
+        <w:keepNext/>
+        <w:numPr>
+          <w:ilvl w:val="0"/>
+          <w:numId w:val="2"/>
+        </w:numPr>
+        <w:spacing w:after="0" w:before="120"/>
+      </w:pPr>
+      <w:r>
+        <w:rPr>
+          <w:b/>
+          <w:bCs/>
+        </w:rPr>
+        <w:t xml:space="preserve">What are the major classical and folk art forms?</w:t>
+      </w:r>
+    </w:p>
+    <w:p>
+      <w:pPr>
+        <w:spacing w:after="120"/>
+        <w:ind w:left="440"/>
+      </w:pPr>
+    </w:p>
+    <w:p>
+      <w:pPr>
+        <w:pStyle w:val="ListParagraph"/>
+        <w:keepNext/>
+        <w:numPr>
+          <w:ilvl w:val="0"/>
+          <w:numId w:val="2"/>
+        </w:numPr>
+        <w:spacing w:after="0" w:before="120"/>
+      </w:pPr>
+      <w:r>
+        <w:rPr>
+          <w:b/>
+          <w:bCs/>
+        </w:rPr>
+        <w:t xml:space="preserve">What is Kathak?</w:t>
+      </w:r>
+    </w:p>
+    <w:p>
+      <w:pPr>
+        <w:spacing w:after="120"/>
+        <w:ind w:left="440"/>
+      </w:pPr>
+    </w:p>
+    <w:p>
+      <w:pPr>
+        <w:pStyle w:val="ListParagraph"/>
+        <w:keepNext/>
+        <w:numPr>
+          <w:ilvl w:val="0"/>
+          <w:numId w:val="2"/>
+        </w:numPr>
+        <w:spacing w:after="0" w:before="120"/>
+      </w:pPr>
+      <w:r>
+        <w:rPr>
+          <w:b/>
+          <w:bCs/>
+        </w:rPr>
+        <w:t xml:space="preserve">Which traditional handicrafts are associated with UP?</w:t>
+      </w:r>
+    </w:p>
+    <w:p>
+      <w:pPr>
+        <w:spacing w:after="120"/>
+        <w:ind w:left="440"/>
+      </w:pPr>
+    </w:p>
+    <w:p>
+      <w:pPr>
+        <w:pStyle w:val="ListParagraph"/>
+        <w:keepNext/>
+        <w:numPr>
+          <w:ilvl w:val="0"/>
+          <w:numId w:val="2"/>
+        </w:numPr>
+        <w:spacing w:after="0" w:before="120"/>
+      </w:pPr>
+      <w:r>
+        <w:rPr>
+          <w:b/>
+          <w:bCs/>
+        </w:rPr>
+        <w:t xml:space="preserve">What are the major cuisines of UP?</w:t>
+      </w:r>
+    </w:p>
+    <w:p>
+      <w:pPr>
+        <w:spacing w:after="120"/>
+        <w:ind w:left="440"/>
+      </w:pPr>
+    </w:p>
+    <w:p>
+      <w:pPr>
+        <w:pStyle w:val="ListParagraph"/>
+        <w:keepNext/>
+        <w:numPr>
+          <w:ilvl w:val="0"/>
+          <w:numId w:val="2"/>
+        </w:numPr>
+        <w:spacing w:after="0" w:before="120"/>
+      </w:pPr>
+      <w:r>
+        <w:rPr>
+          <w:b/>
+          <w:bCs/>
+        </w:rPr>
+        <w:t xml:space="preserve">What is the significance of the Kumbh Mela?</w:t>
+      </w:r>
+    </w:p>
+    <w:p>
+      <w:pPr>
+        <w:spacing w:after="120"/>
+        <w:ind w:left="440"/>
+      </w:pPr>
+    </w:p>
+    <w:p>
+      <w:pPr>
+        <w:pStyle w:val="ListParagraph"/>
+        <w:keepNext/>
+        <w:numPr>
+          <w:ilvl w:val="0"/>
+          <w:numId w:val="2"/>
+        </w:numPr>
+        <w:spacing w:after="0" w:before="120"/>
+      </w:pPr>
+      <w:r>
+        <w:rPr>
+          <w:b/>
+          <w:bCs/>
+        </w:rPr>
+        <w:t xml:space="preserve">What are the major religious and tourist places?</w:t>
+      </w:r>
+    </w:p>
+    <w:p>
+      <w:pPr>
+        <w:spacing w:after="120"/>
+        <w:ind w:left="440"/>
+      </w:pPr>
+    </w:p>
+    <w:p>
+      <w:pPr>
+        <w:pStyle w:val="Heading1"/>
+      </w:pPr>
+      <w:r>
+        <w:t xml:space="preserve">PIQ 6 – UP: Problems</w:t>
+      </w:r>
+    </w:p>
+    <w:p>
+      <w:pPr>
+        <w:pStyle w:val="ListParagraph"/>
+        <w:keepNext/>
+        <w:numPr>
+          <w:ilvl w:val="0"/>
+          <w:numId w:val="2"/>
+        </w:numPr>
+        <w:spacing w:after="0" w:before="120"/>
+      </w:pPr>
+      <w:r>
+        <w:rPr>
+          <w:b/>
+          <w:bCs/>
+        </w:rPr>
+        <w:t xml:space="preserve">What are the three biggest problems of Uttar Pradesh?</w:t>
+      </w:r>
+    </w:p>
+    <w:p>
+      <w:pPr>
+        <w:spacing w:after="120"/>
+        <w:ind w:left="440"/>
+      </w:pPr>
+    </w:p>
+    <w:p>
+      <w:pPr>
+        <w:pStyle w:val="ListParagraph"/>
+        <w:keepNext/>
+        <w:numPr>
+          <w:ilvl w:val="0"/>
+          <w:numId w:val="2"/>
+        </w:numPr>
+        <w:spacing w:after="0" w:before="120"/>
+      </w:pPr>
+      <w:r>
+        <w:rPr>
+          <w:b/>
+          <w:bCs/>
+        </w:rPr>
+        <w:t xml:space="preserve">Why do you consider them problems?</w:t>
+      </w:r>
+    </w:p>
+    <w:p>
+      <w:pPr>
+        <w:spacing w:after="120"/>
+        <w:ind w:left="440"/>
+      </w:pPr>
+    </w:p>
+    <w:p>
+      <w:pPr>
+        <w:pStyle w:val="ListParagraph"/>
+        <w:keepNext/>
+        <w:numPr>
+          <w:ilvl w:val="0"/>
+          <w:numId w:val="2"/>
+        </w:numPr>
+        <w:spacing w:after="0" w:before="120"/>
+      </w:pPr>
+      <w:r>
+        <w:rPr>
+          <w:b/>
+          <w:bCs/>
+        </w:rPr>
+        <w:t xml:space="preserve">Which one should be addressed first?</w:t>
+      </w:r>
+    </w:p>
+    <w:p>
+      <w:pPr>
+        <w:spacing w:after="120"/>
+        <w:ind w:left="440"/>
+      </w:pPr>
+    </w:p>
+    <w:p>
+      <w:pPr>
+        <w:pStyle w:val="ListParagraph"/>
+        <w:keepNext/>
+        <w:numPr>
+          <w:ilvl w:val="0"/>
+          <w:numId w:val="2"/>
+        </w:numPr>
+        <w:spacing w:after="0" w:before="120"/>
+      </w:pPr>
+      <w:r>
+        <w:rPr>
+          <w:b/>
+          <w:bCs/>
+        </w:rPr>
+        <w:t xml:space="preserve">Which one concerns you personally?</w:t>
+      </w:r>
+    </w:p>
+    <w:p>
+      <w:pPr>
+        <w:spacing w:after="120"/>
+        <w:ind w:left="440"/>
+      </w:pPr>
+    </w:p>
+    <w:p>
+      <w:pPr>
+        <w:pStyle w:val="ListParagraph"/>
+        <w:keepNext/>
+        <w:numPr>
+          <w:ilvl w:val="0"/>
+          <w:numId w:val="2"/>
+        </w:numPr>
+        <w:spacing w:after="0" w:before="120"/>
+      </w:pPr>
+      <w:r>
+        <w:rPr>
+          <w:b/>
+          <w:bCs/>
+        </w:rPr>
+        <w:t xml:space="preserve">What is the root cause?</w:t>
+      </w:r>
+    </w:p>
+    <w:p>
+      <w:pPr>
+        <w:spacing w:after="120"/>
+        <w:ind w:left="440"/>
+      </w:pPr>
+    </w:p>
+    <w:p>
+      <w:pPr>
+        <w:pStyle w:val="ListParagraph"/>
+        <w:keepNext/>
+        <w:numPr>
+          <w:ilvl w:val="0"/>
+          <w:numId w:val="2"/>
+        </w:numPr>
+        <w:spacing w:after="0" w:before="120"/>
+      </w:pPr>
+      <w:r>
+        <w:rPr>
+          <w:b/>
+          <w:bCs/>
+        </w:rPr>
+        <w:t xml:space="preserve">What has the government done about it?</w:t>
+      </w:r>
+    </w:p>
+    <w:p>
+      <w:pPr>
+        <w:spacing w:after="120"/>
+        <w:ind w:left="440"/>
+      </w:pPr>
+    </w:p>
+    <w:p>
+      <w:pPr>
+        <w:pStyle w:val="ListParagraph"/>
+        <w:keepNext/>
+        <w:numPr>
+          <w:ilvl w:val="0"/>
+          <w:numId w:val="2"/>
+        </w:numPr>
+        <w:spacing w:after="0" w:before="120"/>
+      </w:pPr>
+      <w:r>
+        <w:rPr>
+          <w:b/>
+          <w:bCs/>
+        </w:rPr>
+        <w:t xml:space="preserve">What more can be done?</w:t>
+      </w:r>
+    </w:p>
+    <w:p>
+      <w:pPr>
+        <w:spacing w:after="120"/>
+        <w:ind w:left="440"/>
+      </w:pPr>
+    </w:p>
+    <w:p>
+      <w:pPr>
+        <w:pStyle w:val="ListParagraph"/>
+        <w:keepNext/>
+        <w:numPr>
+          <w:ilvl w:val="0"/>
+          <w:numId w:val="2"/>
+        </w:numPr>
+        <w:spacing w:after="0" w:before="120"/>
+      </w:pPr>
+      <w:r>
+        <w:rPr>
+          <w:b/>
+          <w:bCs/>
+        </w:rPr>
+        <w:t xml:space="preserve">What can citizens do themselves?</w:t>
+      </w:r>
+    </w:p>
+    <w:p>
+      <w:pPr>
+        <w:spacing w:after="120"/>
+        <w:ind w:left="440"/>
+      </w:pPr>
+    </w:p>
+    <w:p>
+      <w:pPr>
+        <w:pStyle w:val="ListParagraph"/>
+        <w:keepNext/>
+        <w:numPr>
+          <w:ilvl w:val="0"/>
+          <w:numId w:val="2"/>
+        </w:numPr>
+        <w:spacing w:after="0" w:before="120"/>
+      </w:pPr>
+      <w:r>
+        <w:rPr>
+          <w:b/>
+          <w:bCs/>
+        </w:rPr>
+        <w:t xml:space="preserve">How would you tackle it as a district administrator?</w:t>
+      </w:r>
+    </w:p>
+    <w:p>
+      <w:pPr>
+        <w:spacing w:after="120"/>
+        <w:ind w:left="440"/>
+      </w:pPr>
+    </w:p>
+    <w:p>
+      <w:pPr>
+        <w:pStyle w:val="Heading1"/>
+      </w:pPr>
+      <w:r>
+        <w:t xml:space="preserve">PIQ 6 – UP vs Other States</w:t>
+      </w:r>
+    </w:p>
+    <w:p>
+      <w:pPr>
+        <w:pStyle w:val="ListParagraph"/>
+        <w:keepNext/>
+        <w:numPr>
+          <w:ilvl w:val="0"/>
+          <w:numId w:val="2"/>
+        </w:numPr>
+        <w:spacing w:after="0" w:before="120"/>
+      </w:pPr>
+      <w:r>
+        <w:rPr>
+          <w:b/>
+          <w:bCs/>
+        </w:rPr>
+        <w:t xml:space="preserve">What does UP do better than other states?</w:t>
+      </w:r>
+    </w:p>
+    <w:p>
+      <w:pPr>
+        <w:spacing w:after="120"/>
+        <w:ind w:left="440"/>
+      </w:pPr>
+    </w:p>
+    <w:p>
+      <w:pPr>
+        <w:pStyle w:val="ListParagraph"/>
+        <w:keepNext/>
+        <w:numPr>
+          <w:ilvl w:val="0"/>
+          <w:numId w:val="2"/>
+        </w:numPr>
+        <w:spacing w:after="0" w:before="120"/>
+      </w:pPr>
+      <w:r>
+        <w:rPr>
+          <w:b/>
+          <w:bCs/>
+        </w:rPr>
+        <w:t xml:space="preserve">What does UP need to improve?</w:t>
+      </w:r>
+    </w:p>
+    <w:p>
+      <w:pPr>
+        <w:spacing w:after="120"/>
+        <w:ind w:left="440"/>
+      </w:pPr>
+    </w:p>
+    <w:p>
+      <w:pPr>
+        <w:pStyle w:val="ListParagraph"/>
+        <w:keepNext/>
+        <w:numPr>
+          <w:ilvl w:val="0"/>
+          <w:numId w:val="2"/>
+        </w:numPr>
+        <w:spacing w:after="0" w:before="120"/>
+      </w:pPr>
+      <w:r>
+        <w:rPr>
+          <w:b/>
+          <w:bCs/>
+        </w:rPr>
+        <w:t xml:space="preserve">Why do people migrate from UP to cities like Noida, Lucknow and Delhi?</w:t>
+      </w:r>
+    </w:p>
+    <w:p>
+      <w:pPr>
+        <w:spacing w:after="120"/>
+        <w:ind w:left="440"/>
+      </w:pPr>
+    </w:p>
+    <w:p>
+      <w:pPr>
+        <w:pStyle w:val="ListParagraph"/>
+        <w:keepNext/>
+        <w:numPr>
+          <w:ilvl w:val="0"/>
+          <w:numId w:val="2"/>
+        </w:numPr>
+        <w:spacing w:after="0" w:before="120"/>
+      </w:pPr>
+      <w:r>
+        <w:rPr>
+          <w:b/>
+          <w:bCs/>
+        </w:rPr>
+        <w:t xml:space="preserve">How can UP retain skilled people?</w:t>
+      </w:r>
+    </w:p>
+    <w:p>
+      <w:pPr>
+        <w:spacing w:after="120"/>
+        <w:ind w:left="440"/>
+      </w:pPr>
+    </w:p>
+    <w:p>
+      <w:pPr>
+        <w:pStyle w:val="ListParagraph"/>
+        <w:keepNext/>
+        <w:numPr>
+          <w:ilvl w:val="0"/>
+          <w:numId w:val="2"/>
+        </w:numPr>
+        <w:spacing w:after="0" w:before="120"/>
+      </w:pPr>
+      <w:r>
+        <w:rPr>
+          <w:b/>
+          <w:bCs/>
+        </w:rPr>
+        <w:t xml:space="preserve">Why is development uneven within UP?</w:t>
+      </w:r>
+    </w:p>
+    <w:p>
+      <w:pPr>
+        <w:spacing w:after="120"/>
+        <w:ind w:left="440"/>
+      </w:pPr>
+    </w:p>
+    <w:p>
+      <w:pPr>
+        <w:pStyle w:val="ListParagraph"/>
+        <w:keepNext/>
+        <w:numPr>
+          <w:ilvl w:val="0"/>
+          <w:numId w:val="2"/>
+        </w:numPr>
+        <w:spacing w:after="0" w:before="120"/>
+      </w:pPr>
+      <w:r>
+        <w:rPr>
+          <w:b/>
+          <w:bCs/>
+        </w:rPr>
+        <w:t xml:space="preserve">How do eastern and western UP differ economically?</w:t>
+      </w:r>
+    </w:p>
+    <w:p>
+      <w:pPr>
+        <w:spacing w:after="120"/>
+        <w:ind w:left="440"/>
+      </w:pPr>
+    </w:p>
+    <w:p>
+      <w:pPr>
+        <w:pStyle w:val="ListParagraph"/>
+        <w:keepNext/>
+        <w:numPr>
+          <w:ilvl w:val="0"/>
+          <w:numId w:val="2"/>
+        </w:numPr>
+        <w:spacing w:after="0" w:before="120"/>
+      </w:pPr>
+      <w:r>
+        <w:rPr>
+          <w:b/>
+          <w:bCs/>
+        </w:rPr>
+        <w:t xml:space="preserve">How is the rest of UP different from NCR, where you live now?</w:t>
+      </w:r>
+    </w:p>
+    <w:p>
+      <w:pPr>
+        <w:spacing w:after="120"/>
+        <w:ind w:left="440"/>
+      </w:pPr>
+    </w:p>
+    <w:p>
+      <w:pPr>
+        <w:pStyle w:val="Heading1"/>
+      </w:pPr>
+      <w:r>
+        <w:t xml:space="preserve">PIQ 6 – UP: Personal</w:t>
+      </w:r>
+    </w:p>
+    <w:p>
+      <w:pPr>
+        <w:pStyle w:val="ListParagraph"/>
+        <w:keepNext/>
+        <w:numPr>
+          <w:ilvl w:val="0"/>
+          <w:numId w:val="2"/>
+        </w:numPr>
+        <w:spacing w:after="0" w:before="120"/>
+      </w:pPr>
+      <w:r>
+        <w:rPr>
+          <w:b/>
+          <w:bCs/>
+        </w:rPr>
+        <w:t xml:space="preserve">What has Uttar Pradesh given you?</w:t>
+      </w:r>
+    </w:p>
+    <w:p>
+      <w:pPr>
+        <w:spacing w:after="120"/>
+        <w:ind w:left="440"/>
+      </w:pPr>
+    </w:p>
+    <w:p>
+      <w:pPr>
+        <w:pStyle w:val="ListParagraph"/>
+        <w:keepNext/>
+        <w:numPr>
+          <w:ilvl w:val="0"/>
+          <w:numId w:val="2"/>
+        </w:numPr>
+        <w:spacing w:after="0" w:before="120"/>
+      </w:pPr>
+      <w:r>
+        <w:rPr>
+          <w:b/>
+          <w:bCs/>
+        </w:rPr>
+        <w:t xml:space="preserve">What do you like about being from UP?</w:t>
+      </w:r>
+    </w:p>
+    <w:p>
+      <w:pPr>
+        <w:spacing w:after="120"/>
+        <w:ind w:left="440"/>
+      </w:pPr>
+    </w:p>
+    <w:p>
+      <w:pPr>
+        <w:pStyle w:val="ListParagraph"/>
+        <w:keepNext/>
+        <w:numPr>
+          <w:ilvl w:val="0"/>
+          <w:numId w:val="2"/>
+        </w:numPr>
+        <w:spacing w:after="0" w:before="120"/>
+      </w:pPr>
+      <w:r>
+        <w:rPr>
+          <w:b/>
+          <w:bCs/>
+        </w:rPr>
+        <w:t xml:space="preserve">What is one thing you dislike about your state?</w:t>
+      </w:r>
+    </w:p>
+    <w:p>
+      <w:pPr>
+        <w:spacing w:after="120"/>
+        <w:ind w:left="440"/>
+      </w:pPr>
+    </w:p>
+    <w:p>
+      <w:pPr>
+        <w:pStyle w:val="ListParagraph"/>
+        <w:keepNext/>
+        <w:numPr>
+          <w:ilvl w:val="0"/>
+          <w:numId w:val="2"/>
+        </w:numPr>
+        <w:spacing w:after="0" w:before="120"/>
+      </w:pPr>
+      <w:r>
+        <w:rPr>
+          <w:b/>
+          <w:bCs/>
+        </w:rPr>
+        <w:t xml:space="preserve">What change have you personally seen in UP?</w:t>
+      </w:r>
+    </w:p>
+    <w:p>
+      <w:pPr>
+        <w:spacing w:after="120"/>
+        <w:ind w:left="440"/>
+      </w:pPr>
+    </w:p>
+    <w:p>
+      <w:pPr>
+        <w:pStyle w:val="ListParagraph"/>
+        <w:keepNext/>
+        <w:numPr>
+          <w:ilvl w:val="0"/>
+          <w:numId w:val="2"/>
+        </w:numPr>
+        <w:spacing w:after="0" w:before="120"/>
+      </w:pPr>
+      <w:r>
+        <w:rPr>
+          <w:b/>
+          <w:bCs/>
+        </w:rPr>
+        <w:t xml:space="preserve">Would you return to UP after your career?</w:t>
       </w:r>
     </w:p>
     <w:p>

</xml_diff>

<commit_message>
Add PIQ 7 (Religion) questions to SSB question sheet
Co-Authored-By: Claude Opus 5.5 <noreply@anthropic.com>
Claude-Session: https://claude.ai/code/session_01TypcejD48cCyAqfjtUUit5
</commit_message>
<xml_diff>
--- a/SSB_Question_Sheet.docx
+++ b/SSB_Question_Sheet.docx
@@ -9204,6 +9204,2022 @@
           <w:bCs/>
         </w:rPr>
         <w:t xml:space="preserve">Would you return to UP after your career?</w:t>
+      </w:r>
+    </w:p>
+    <w:p>
+      <w:pPr>
+        <w:spacing w:after="120"/>
+        <w:ind w:left="440"/>
+      </w:pPr>
+    </w:p>
+    <w:p>
+      <w:pPr>
+        <w:pStyle w:val="Heading1"/>
+      </w:pPr>
+      <w:r>
+        <w:t xml:space="preserve">PIQ 7 – Religion</w:t>
+      </w:r>
+    </w:p>
+    <w:p>
+      <w:pPr>
+        <w:pStyle w:val="ListParagraph"/>
+        <w:keepNext/>
+        <w:numPr>
+          <w:ilvl w:val="0"/>
+          <w:numId w:val="2"/>
+        </w:numPr>
+        <w:spacing w:after="0" w:before="120"/>
+      </w:pPr>
+      <w:r>
+        <w:rPr>
+          <w:b/>
+          <w:bCs/>
+        </w:rPr>
+        <w:t xml:space="preserve">What is your religion?</w:t>
+      </w:r>
+    </w:p>
+    <w:p>
+      <w:pPr>
+        <w:spacing w:after="120"/>
+        <w:ind w:left="440"/>
+      </w:pPr>
+    </w:p>
+    <w:p>
+      <w:pPr>
+        <w:pStyle w:val="ListParagraph"/>
+        <w:keepNext/>
+        <w:numPr>
+          <w:ilvl w:val="0"/>
+          <w:numId w:val="2"/>
+        </w:numPr>
+        <w:spacing w:after="0" w:before="120"/>
+      </w:pPr>
+      <w:r>
+        <w:rPr>
+          <w:b/>
+          <w:bCs/>
+        </w:rPr>
+        <w:t xml:space="preserve">What does Hinduism mean to you?</w:t>
+      </w:r>
+    </w:p>
+    <w:p>
+      <w:pPr>
+        <w:spacing w:after="120"/>
+        <w:ind w:left="440"/>
+      </w:pPr>
+    </w:p>
+    <w:p>
+      <w:pPr>
+        <w:pStyle w:val="ListParagraph"/>
+        <w:keepNext/>
+        <w:numPr>
+          <w:ilvl w:val="0"/>
+          <w:numId w:val="2"/>
+        </w:numPr>
+        <w:spacing w:after="0" w:before="120"/>
+      </w:pPr>
+      <w:r>
+        <w:rPr>
+          <w:b/>
+          <w:bCs/>
+        </w:rPr>
+        <w:t xml:space="preserve">What do you understand by Hinduism?</w:t>
+      </w:r>
+    </w:p>
+    <w:p>
+      <w:pPr>
+        <w:spacing w:after="120"/>
+        <w:ind w:left="440"/>
+      </w:pPr>
+    </w:p>
+    <w:p>
+      <w:pPr>
+        <w:pStyle w:val="ListParagraph"/>
+        <w:keepNext/>
+        <w:numPr>
+          <w:ilvl w:val="0"/>
+          <w:numId w:val="2"/>
+        </w:numPr>
+        <w:spacing w:after="0" w:before="120"/>
+      </w:pPr>
+      <w:r>
+        <w:rPr>
+          <w:b/>
+          <w:bCs/>
+        </w:rPr>
+        <w:t xml:space="preserve">What are the basic principles of Hinduism?</w:t>
+      </w:r>
+    </w:p>
+    <w:p>
+      <w:pPr>
+        <w:spacing w:after="120"/>
+        <w:ind w:left="440"/>
+      </w:pPr>
+    </w:p>
+    <w:p>
+      <w:pPr>
+        <w:pStyle w:val="ListParagraph"/>
+        <w:keepNext/>
+        <w:numPr>
+          <w:ilvl w:val="0"/>
+          <w:numId w:val="2"/>
+        </w:numPr>
+        <w:spacing w:after="0" w:before="120"/>
+      </w:pPr>
+      <w:r>
+        <w:rPr>
+          <w:b/>
+          <w:bCs/>
+        </w:rPr>
+        <w:t xml:space="preserve">Is Hinduism a religion, a philosophy, a way of life, or all of these?</w:t>
+      </w:r>
+    </w:p>
+    <w:p>
+      <w:pPr>
+        <w:spacing w:after="120"/>
+        <w:ind w:left="440"/>
+      </w:pPr>
+    </w:p>
+    <w:p>
+      <w:pPr>
+        <w:pStyle w:val="ListParagraph"/>
+        <w:keepNext/>
+        <w:numPr>
+          <w:ilvl w:val="0"/>
+          <w:numId w:val="2"/>
+        </w:numPr>
+        <w:spacing w:after="0" w:before="120"/>
+      </w:pPr>
+      <w:r>
+        <w:rPr>
+          <w:b/>
+          <w:bCs/>
+        </w:rPr>
+        <w:t xml:space="preserve">What religious practices do you actually follow?</w:t>
+      </w:r>
+    </w:p>
+    <w:p>
+      <w:pPr>
+        <w:spacing w:after="120"/>
+        <w:ind w:left="440"/>
+      </w:pPr>
+    </w:p>
+    <w:p>
+      <w:pPr>
+        <w:pStyle w:val="Heading1"/>
+      </w:pPr>
+      <w:r>
+        <w:t xml:space="preserve">PIQ 7 – Religion: Key Concepts</w:t>
+      </w:r>
+    </w:p>
+    <w:p>
+      <w:pPr>
+        <w:pStyle w:val="ListParagraph"/>
+        <w:keepNext/>
+        <w:numPr>
+          <w:ilvl w:val="0"/>
+          <w:numId w:val="2"/>
+        </w:numPr>
+        <w:spacing w:after="0" w:before="120"/>
+      </w:pPr>
+      <w:r>
+        <w:rPr>
+          <w:b/>
+          <w:bCs/>
+        </w:rPr>
+        <w:t xml:space="preserve">What is dharma?</w:t>
+      </w:r>
+    </w:p>
+    <w:p>
+      <w:pPr>
+        <w:spacing w:after="120"/>
+        <w:ind w:left="440"/>
+      </w:pPr>
+    </w:p>
+    <w:p>
+      <w:pPr>
+        <w:pStyle w:val="ListParagraph"/>
+        <w:keepNext/>
+        <w:numPr>
+          <w:ilvl w:val="0"/>
+          <w:numId w:val="2"/>
+        </w:numPr>
+        <w:spacing w:after="0" w:before="120"/>
+      </w:pPr>
+      <w:r>
+        <w:rPr>
+          <w:b/>
+          <w:bCs/>
+        </w:rPr>
+        <w:t xml:space="preserve">Does dharma simply mean religion?</w:t>
+      </w:r>
+    </w:p>
+    <w:p>
+      <w:pPr>
+        <w:spacing w:after="120"/>
+        <w:ind w:left="440"/>
+      </w:pPr>
+    </w:p>
+    <w:p>
+      <w:pPr>
+        <w:pStyle w:val="ListParagraph"/>
+        <w:keepNext/>
+        <w:numPr>
+          <w:ilvl w:val="0"/>
+          <w:numId w:val="2"/>
+        </w:numPr>
+        <w:spacing w:after="0" w:before="120"/>
+      </w:pPr>
+      <w:r>
+        <w:rPr>
+          <w:b/>
+          <w:bCs/>
+        </w:rPr>
+        <w:t xml:space="preserve">What is karma?</w:t>
+      </w:r>
+    </w:p>
+    <w:p>
+      <w:pPr>
+        <w:spacing w:after="120"/>
+        <w:ind w:left="440"/>
+      </w:pPr>
+    </w:p>
+    <w:p>
+      <w:pPr>
+        <w:pStyle w:val="ListParagraph"/>
+        <w:keepNext/>
+        <w:numPr>
+          <w:ilvl w:val="0"/>
+          <w:numId w:val="2"/>
+        </w:numPr>
+        <w:spacing w:after="0" w:before="120"/>
+      </w:pPr>
+      <w:r>
+        <w:rPr>
+          <w:b/>
+          <w:bCs/>
+        </w:rPr>
+        <w:t xml:space="preserve">How is karma different from fate?</w:t>
+      </w:r>
+    </w:p>
+    <w:p>
+      <w:pPr>
+        <w:spacing w:after="120"/>
+        <w:ind w:left="440"/>
+      </w:pPr>
+    </w:p>
+    <w:p>
+      <w:pPr>
+        <w:pStyle w:val="ListParagraph"/>
+        <w:keepNext/>
+        <w:numPr>
+          <w:ilvl w:val="0"/>
+          <w:numId w:val="2"/>
+        </w:numPr>
+        <w:spacing w:after="0" w:before="120"/>
+      </w:pPr>
+      <w:r>
+        <w:rPr>
+          <w:b/>
+          <w:bCs/>
+        </w:rPr>
+        <w:t xml:space="preserve">If you believe in karma, does that mean you don't need to worry about results?</w:t>
+      </w:r>
+    </w:p>
+    <w:p>
+      <w:pPr>
+        <w:spacing w:after="120"/>
+        <w:ind w:left="440"/>
+      </w:pPr>
+    </w:p>
+    <w:p>
+      <w:pPr>
+        <w:pStyle w:val="ListParagraph"/>
+        <w:keepNext/>
+        <w:numPr>
+          <w:ilvl w:val="0"/>
+          <w:numId w:val="2"/>
+        </w:numPr>
+        <w:spacing w:after="0" w:before="120"/>
+      </w:pPr>
+      <w:r>
+        <w:rPr>
+          <w:b/>
+          <w:bCs/>
+        </w:rPr>
+        <w:t xml:space="preserve">What is moksha?</w:t>
+      </w:r>
+    </w:p>
+    <w:p>
+      <w:pPr>
+        <w:spacing w:after="120"/>
+        <w:ind w:left="440"/>
+      </w:pPr>
+    </w:p>
+    <w:p>
+      <w:pPr>
+        <w:pStyle w:val="ListParagraph"/>
+        <w:keepNext/>
+        <w:numPr>
+          <w:ilvl w:val="0"/>
+          <w:numId w:val="2"/>
+        </w:numPr>
+        <w:spacing w:after="0" w:before="120"/>
+      </w:pPr>
+      <w:r>
+        <w:rPr>
+          <w:b/>
+          <w:bCs/>
+        </w:rPr>
+        <w:t xml:space="preserve">What is atman?</w:t>
+      </w:r>
+    </w:p>
+    <w:p>
+      <w:pPr>
+        <w:spacing w:after="120"/>
+        <w:ind w:left="440"/>
+      </w:pPr>
+    </w:p>
+    <w:p>
+      <w:pPr>
+        <w:pStyle w:val="ListParagraph"/>
+        <w:keepNext/>
+        <w:numPr>
+          <w:ilvl w:val="0"/>
+          <w:numId w:val="2"/>
+        </w:numPr>
+        <w:spacing w:after="0" w:before="120"/>
+      </w:pPr>
+      <w:r>
+        <w:rPr>
+          <w:b/>
+          <w:bCs/>
+        </w:rPr>
+        <w:t xml:space="preserve">What is Brahman?</w:t>
+      </w:r>
+    </w:p>
+    <w:p>
+      <w:pPr>
+        <w:spacing w:after="120"/>
+        <w:ind w:left="440"/>
+      </w:pPr>
+    </w:p>
+    <w:p>
+      <w:pPr>
+        <w:pStyle w:val="ListParagraph"/>
+        <w:keepNext/>
+        <w:numPr>
+          <w:ilvl w:val="0"/>
+          <w:numId w:val="2"/>
+        </w:numPr>
+        <w:spacing w:after="0" w:before="120"/>
+      </w:pPr>
+      <w:r>
+        <w:rPr>
+          <w:b/>
+          <w:bCs/>
+        </w:rPr>
+        <w:t xml:space="preserve">What is samsara?</w:t>
+      </w:r>
+    </w:p>
+    <w:p>
+      <w:pPr>
+        <w:spacing w:after="120"/>
+        <w:ind w:left="440"/>
+      </w:pPr>
+    </w:p>
+    <w:p>
+      <w:pPr>
+        <w:pStyle w:val="ListParagraph"/>
+        <w:keepNext/>
+        <w:numPr>
+          <w:ilvl w:val="0"/>
+          <w:numId w:val="2"/>
+        </w:numPr>
+        <w:spacing w:after="0" w:before="120"/>
+      </w:pPr>
+      <w:r>
+        <w:rPr>
+          <w:b/>
+          <w:bCs/>
+        </w:rPr>
+        <w:t xml:space="preserve">What is ahimsa?</w:t>
+      </w:r>
+    </w:p>
+    <w:p>
+      <w:pPr>
+        <w:spacing w:after="120"/>
+        <w:ind w:left="440"/>
+      </w:pPr>
+    </w:p>
+    <w:p>
+      <w:pPr>
+        <w:pStyle w:val="ListParagraph"/>
+        <w:keepNext/>
+        <w:numPr>
+          <w:ilvl w:val="0"/>
+          <w:numId w:val="2"/>
+        </w:numPr>
+        <w:spacing w:after="0" w:before="120"/>
+      </w:pPr>
+      <w:r>
+        <w:rPr>
+          <w:b/>
+          <w:bCs/>
+        </w:rPr>
+        <w:t xml:space="preserve">What is yoga in its philosophical sense?</w:t>
+      </w:r>
+    </w:p>
+    <w:p>
+      <w:pPr>
+        <w:spacing w:after="120"/>
+        <w:ind w:left="440"/>
+      </w:pPr>
+    </w:p>
+    <w:p>
+      <w:pPr>
+        <w:pStyle w:val="ListParagraph"/>
+        <w:keepNext/>
+        <w:numPr>
+          <w:ilvl w:val="0"/>
+          <w:numId w:val="2"/>
+        </w:numPr>
+        <w:spacing w:after="0" w:before="120"/>
+      </w:pPr>
+      <w:r>
+        <w:rPr>
+          <w:b/>
+          <w:bCs/>
+        </w:rPr>
+        <w:t xml:space="preserve">What is seva?</w:t>
+      </w:r>
+    </w:p>
+    <w:p>
+      <w:pPr>
+        <w:spacing w:after="120"/>
+        <w:ind w:left="440"/>
+      </w:pPr>
+    </w:p>
+    <w:p>
+      <w:pPr>
+        <w:pStyle w:val="Heading1"/>
+      </w:pPr>
+      <w:r>
+        <w:t xml:space="preserve">PIQ 7 – Religion: Scriptures</w:t>
+      </w:r>
+    </w:p>
+    <w:p>
+      <w:pPr>
+        <w:pStyle w:val="ListParagraph"/>
+        <w:keepNext/>
+        <w:numPr>
+          <w:ilvl w:val="0"/>
+          <w:numId w:val="2"/>
+        </w:numPr>
+        <w:spacing w:after="0" w:before="120"/>
+      </w:pPr>
+      <w:r>
+        <w:rPr>
+          <w:b/>
+          <w:bCs/>
+        </w:rPr>
+        <w:t xml:space="preserve">What are the major texts of Hinduism?</w:t>
+      </w:r>
+    </w:p>
+    <w:p>
+      <w:pPr>
+        <w:spacing w:after="120"/>
+        <w:ind w:left="440"/>
+      </w:pPr>
+    </w:p>
+    <w:p>
+      <w:pPr>
+        <w:pStyle w:val="ListParagraph"/>
+        <w:keepNext/>
+        <w:numPr>
+          <w:ilvl w:val="0"/>
+          <w:numId w:val="2"/>
+        </w:numPr>
+        <w:spacing w:after="0" w:before="120"/>
+      </w:pPr>
+      <w:r>
+        <w:rPr>
+          <w:b/>
+          <w:bCs/>
+        </w:rPr>
+        <w:t xml:space="preserve">What are the Vedas?</w:t>
+      </w:r>
+    </w:p>
+    <w:p>
+      <w:pPr>
+        <w:spacing w:after="120"/>
+        <w:ind w:left="440"/>
+      </w:pPr>
+    </w:p>
+    <w:p>
+      <w:pPr>
+        <w:pStyle w:val="ListParagraph"/>
+        <w:keepNext/>
+        <w:numPr>
+          <w:ilvl w:val="0"/>
+          <w:numId w:val="2"/>
+        </w:numPr>
+        <w:spacing w:after="0" w:before="120"/>
+      </w:pPr>
+      <w:r>
+        <w:rPr>
+          <w:b/>
+          <w:bCs/>
+        </w:rPr>
+        <w:t xml:space="preserve">Name the four Vedas.</w:t>
+      </w:r>
+    </w:p>
+    <w:p>
+      <w:pPr>
+        <w:spacing w:after="120"/>
+        <w:ind w:left="440"/>
+      </w:pPr>
+    </w:p>
+    <w:p>
+      <w:pPr>
+        <w:pStyle w:val="ListParagraph"/>
+        <w:keepNext/>
+        <w:numPr>
+          <w:ilvl w:val="0"/>
+          <w:numId w:val="2"/>
+        </w:numPr>
+        <w:spacing w:after="0" w:before="120"/>
+      </w:pPr>
+      <w:r>
+        <w:rPr>
+          <w:b/>
+          <w:bCs/>
+        </w:rPr>
+        <w:t xml:space="preserve">What are the Upanishads?</w:t>
+      </w:r>
+    </w:p>
+    <w:p>
+      <w:pPr>
+        <w:spacing w:after="120"/>
+        <w:ind w:left="440"/>
+      </w:pPr>
+    </w:p>
+    <w:p>
+      <w:pPr>
+        <w:pStyle w:val="ListParagraph"/>
+        <w:keepNext/>
+        <w:numPr>
+          <w:ilvl w:val="0"/>
+          <w:numId w:val="2"/>
+        </w:numPr>
+        <w:spacing w:after="0" w:before="120"/>
+      </w:pPr>
+      <w:r>
+        <w:rPr>
+          <w:b/>
+          <w:bCs/>
+        </w:rPr>
+        <w:t xml:space="preserve">What is the Ramayana?</w:t>
+      </w:r>
+    </w:p>
+    <w:p>
+      <w:pPr>
+        <w:spacing w:after="120"/>
+        <w:ind w:left="440"/>
+      </w:pPr>
+    </w:p>
+    <w:p>
+      <w:pPr>
+        <w:pStyle w:val="ListParagraph"/>
+        <w:keepNext/>
+        <w:numPr>
+          <w:ilvl w:val="0"/>
+          <w:numId w:val="2"/>
+        </w:numPr>
+        <w:spacing w:after="0" w:before="120"/>
+      </w:pPr>
+      <w:r>
+        <w:rPr>
+          <w:b/>
+          <w:bCs/>
+        </w:rPr>
+        <w:t xml:space="preserve">Who wrote the Ramayana?</w:t>
+      </w:r>
+    </w:p>
+    <w:p>
+      <w:pPr>
+        <w:spacing w:after="120"/>
+        <w:ind w:left="440"/>
+      </w:pPr>
+    </w:p>
+    <w:p>
+      <w:pPr>
+        <w:pStyle w:val="ListParagraph"/>
+        <w:keepNext/>
+        <w:numPr>
+          <w:ilvl w:val="0"/>
+          <w:numId w:val="2"/>
+        </w:numPr>
+        <w:spacing w:after="0" w:before="120"/>
+      </w:pPr>
+      <w:r>
+        <w:rPr>
+          <w:b/>
+          <w:bCs/>
+        </w:rPr>
+        <w:t xml:space="preserve">What is the Mahabharata?</w:t>
+      </w:r>
+    </w:p>
+    <w:p>
+      <w:pPr>
+        <w:spacing w:after="120"/>
+        <w:ind w:left="440"/>
+      </w:pPr>
+    </w:p>
+    <w:p>
+      <w:pPr>
+        <w:pStyle w:val="ListParagraph"/>
+        <w:keepNext/>
+        <w:numPr>
+          <w:ilvl w:val="0"/>
+          <w:numId w:val="2"/>
+        </w:numPr>
+        <w:spacing w:after="0" w:before="120"/>
+      </w:pPr>
+      <w:r>
+        <w:rPr>
+          <w:b/>
+          <w:bCs/>
+        </w:rPr>
+        <w:t xml:space="preserve">Who is traditionally regarded as its author?</w:t>
+      </w:r>
+    </w:p>
+    <w:p>
+      <w:pPr>
+        <w:spacing w:after="120"/>
+        <w:ind w:left="440"/>
+      </w:pPr>
+    </w:p>
+    <w:p>
+      <w:pPr>
+        <w:pStyle w:val="ListParagraph"/>
+        <w:keepNext/>
+        <w:numPr>
+          <w:ilvl w:val="0"/>
+          <w:numId w:val="2"/>
+        </w:numPr>
+        <w:spacing w:after="0" w:before="120"/>
+      </w:pPr>
+      <w:r>
+        <w:rPr>
+          <w:b/>
+          <w:bCs/>
+        </w:rPr>
+        <w:t xml:space="preserve">What is the Bhagavad Gita?</w:t>
+      </w:r>
+    </w:p>
+    <w:p>
+      <w:pPr>
+        <w:spacing w:after="120"/>
+        <w:ind w:left="440"/>
+      </w:pPr>
+    </w:p>
+    <w:p>
+      <w:pPr>
+        <w:pStyle w:val="ListParagraph"/>
+        <w:keepNext/>
+        <w:numPr>
+          <w:ilvl w:val="0"/>
+          <w:numId w:val="2"/>
+        </w:numPr>
+        <w:spacing w:after="0" w:before="120"/>
+      </w:pPr>
+      <w:r>
+        <w:rPr>
+          <w:b/>
+          <w:bCs/>
+        </w:rPr>
+        <w:t xml:space="preserve">Who delivered the Bhagavad Gita, and to whom?</w:t>
+      </w:r>
+    </w:p>
+    <w:p>
+      <w:pPr>
+        <w:spacing w:after="120"/>
+        <w:ind w:left="440"/>
+      </w:pPr>
+    </w:p>
+    <w:p>
+      <w:pPr>
+        <w:pStyle w:val="ListParagraph"/>
+        <w:keepNext/>
+        <w:numPr>
+          <w:ilvl w:val="0"/>
+          <w:numId w:val="2"/>
+        </w:numPr>
+        <w:spacing w:after="0" w:before="120"/>
+      </w:pPr>
+      <w:r>
+        <w:rPr>
+          <w:b/>
+          <w:bCs/>
+        </w:rPr>
+        <w:t xml:space="preserve">How many chapters does it have?</w:t>
+      </w:r>
+    </w:p>
+    <w:p>
+      <w:pPr>
+        <w:spacing w:after="120"/>
+        <w:ind w:left="440"/>
+      </w:pPr>
+    </w:p>
+    <w:p>
+      <w:pPr>
+        <w:pStyle w:val="ListParagraph"/>
+        <w:keepNext/>
+        <w:numPr>
+          <w:ilvl w:val="0"/>
+          <w:numId w:val="2"/>
+        </w:numPr>
+        <w:spacing w:after="0" w:before="120"/>
+      </w:pPr>
+      <w:r>
+        <w:rPr>
+          <w:b/>
+          <w:bCs/>
+        </w:rPr>
+        <w:t xml:space="preserve">What is the context of the Gita?</w:t>
+      </w:r>
+    </w:p>
+    <w:p>
+      <w:pPr>
+        <w:spacing w:after="120"/>
+        <w:ind w:left="440"/>
+      </w:pPr>
+    </w:p>
+    <w:p>
+      <w:pPr>
+        <w:pStyle w:val="ListParagraph"/>
+        <w:keepNext/>
+        <w:numPr>
+          <w:ilvl w:val="0"/>
+          <w:numId w:val="2"/>
+        </w:numPr>
+        <w:spacing w:after="0" w:before="120"/>
+      </w:pPr>
+      <w:r>
+        <w:rPr>
+          <w:b/>
+          <w:bCs/>
+        </w:rPr>
+        <w:t xml:space="preserve">What is the central message of the Bhagavad Gita?</w:t>
+      </w:r>
+    </w:p>
+    <w:p>
+      <w:pPr>
+        <w:spacing w:after="120"/>
+        <w:ind w:left="440"/>
+      </w:pPr>
+    </w:p>
+    <w:p>
+      <w:pPr>
+        <w:pStyle w:val="ListParagraph"/>
+        <w:keepNext/>
+        <w:numPr>
+          <w:ilvl w:val="0"/>
+          <w:numId w:val="2"/>
+        </w:numPr>
+        <w:spacing w:after="0" w:before="120"/>
+      </w:pPr>
+      <w:r>
+        <w:rPr>
+          <w:b/>
+          <w:bCs/>
+        </w:rPr>
+        <w:t xml:space="preserve">What is the significance of Kurukshetra?</w:t>
+      </w:r>
+    </w:p>
+    <w:p>
+      <w:pPr>
+        <w:spacing w:after="120"/>
+        <w:ind w:left="440"/>
+      </w:pPr>
+    </w:p>
+    <w:p>
+      <w:pPr>
+        <w:pStyle w:val="ListParagraph"/>
+        <w:keepNext/>
+        <w:numPr>
+          <w:ilvl w:val="0"/>
+          <w:numId w:val="2"/>
+        </w:numPr>
+        <w:spacing w:after="0" w:before="120"/>
+      </w:pPr>
+      <w:r>
+        <w:rPr>
+          <w:b/>
+          <w:bCs/>
+        </w:rPr>
+        <w:t xml:space="preserve">Which Hindu text have you read, and what did you learn from it?</w:t>
+      </w:r>
+    </w:p>
+    <w:p>
+      <w:pPr>
+        <w:spacing w:after="120"/>
+        <w:ind w:left="440"/>
+      </w:pPr>
+    </w:p>
+    <w:p>
+      <w:pPr>
+        <w:pStyle w:val="Heading1"/>
+      </w:pPr>
+      <w:r>
+        <w:t xml:space="preserve">PIQ 7 – Religion: Deities &amp; Traditions</w:t>
+      </w:r>
+    </w:p>
+    <w:p>
+      <w:pPr>
+        <w:pStyle w:val="ListParagraph"/>
+        <w:keepNext/>
+        <w:numPr>
+          <w:ilvl w:val="0"/>
+          <w:numId w:val="2"/>
+        </w:numPr>
+        <w:spacing w:after="0" w:before="120"/>
+      </w:pPr>
+      <w:r>
+        <w:rPr>
+          <w:b/>
+          <w:bCs/>
+        </w:rPr>
+        <w:t xml:space="preserve">Who are the major deities in Hindu traditions?</w:t>
+      </w:r>
+    </w:p>
+    <w:p>
+      <w:pPr>
+        <w:spacing w:after="120"/>
+        <w:ind w:left="440"/>
+      </w:pPr>
+    </w:p>
+    <w:p>
+      <w:pPr>
+        <w:pStyle w:val="ListParagraph"/>
+        <w:keepNext/>
+        <w:numPr>
+          <w:ilvl w:val="0"/>
+          <w:numId w:val="2"/>
+        </w:numPr>
+        <w:spacing w:after="0" w:before="120"/>
+      </w:pPr>
+      <w:r>
+        <w:rPr>
+          <w:b/>
+          <w:bCs/>
+        </w:rPr>
+        <w:t xml:space="preserve">Who are the Trimurti, and what is the role of each?</w:t>
+      </w:r>
+    </w:p>
+    <w:p>
+      <w:pPr>
+        <w:spacing w:after="120"/>
+        <w:ind w:left="440"/>
+      </w:pPr>
+    </w:p>
+    <w:p>
+      <w:pPr>
+        <w:pStyle w:val="ListParagraph"/>
+        <w:keepNext/>
+        <w:numPr>
+          <w:ilvl w:val="0"/>
+          <w:numId w:val="2"/>
+        </w:numPr>
+        <w:spacing w:after="0" w:before="120"/>
+      </w:pPr>
+      <w:r>
+        <w:rPr>
+          <w:b/>
+          <w:bCs/>
+        </w:rPr>
+        <w:t xml:space="preserve">What are the Dashavatara? Name the ten avatars of Vishnu.</w:t>
+      </w:r>
+    </w:p>
+    <w:p>
+      <w:pPr>
+        <w:spacing w:after="120"/>
+        <w:ind w:left="440"/>
+      </w:pPr>
+    </w:p>
+    <w:p>
+      <w:pPr>
+        <w:pStyle w:val="ListParagraph"/>
+        <w:keepNext/>
+        <w:numPr>
+          <w:ilvl w:val="0"/>
+          <w:numId w:val="2"/>
+        </w:numPr>
+        <w:spacing w:after="0" w:before="120"/>
+      </w:pPr>
+      <w:r>
+        <w:rPr>
+          <w:b/>
+          <w:bCs/>
+        </w:rPr>
+        <w:t xml:space="preserve">Who was Rama?</w:t>
+      </w:r>
+    </w:p>
+    <w:p>
+      <w:pPr>
+        <w:spacing w:after="120"/>
+        <w:ind w:left="440"/>
+      </w:pPr>
+    </w:p>
+    <w:p>
+      <w:pPr>
+        <w:pStyle w:val="ListParagraph"/>
+        <w:keepNext/>
+        <w:numPr>
+          <w:ilvl w:val="0"/>
+          <w:numId w:val="2"/>
+        </w:numPr>
+        <w:spacing w:after="0" w:before="120"/>
+      </w:pPr>
+      <w:r>
+        <w:rPr>
+          <w:b/>
+          <w:bCs/>
+        </w:rPr>
+        <w:t xml:space="preserve">What is the significance of Shiva?</w:t>
+      </w:r>
+    </w:p>
+    <w:p>
+      <w:pPr>
+        <w:spacing w:after="120"/>
+        <w:ind w:left="440"/>
+      </w:pPr>
+    </w:p>
+    <w:p>
+      <w:pPr>
+        <w:pStyle w:val="ListParagraph"/>
+        <w:keepNext/>
+        <w:numPr>
+          <w:ilvl w:val="0"/>
+          <w:numId w:val="2"/>
+        </w:numPr>
+        <w:spacing w:after="0" w:before="120"/>
+      </w:pPr>
+      <w:r>
+        <w:rPr>
+          <w:b/>
+          <w:bCs/>
+        </w:rPr>
+        <w:t xml:space="preserve">What is Shakti?</w:t>
+      </w:r>
+    </w:p>
+    <w:p>
+      <w:pPr>
+        <w:spacing w:after="120"/>
+        <w:ind w:left="440"/>
+      </w:pPr>
+    </w:p>
+    <w:p>
+      <w:pPr>
+        <w:pStyle w:val="ListParagraph"/>
+        <w:keepNext/>
+        <w:numPr>
+          <w:ilvl w:val="0"/>
+          <w:numId w:val="2"/>
+        </w:numPr>
+        <w:spacing w:after="0" w:before="120"/>
+      </w:pPr>
+      <w:r>
+        <w:rPr>
+          <w:b/>
+          <w:bCs/>
+        </w:rPr>
+        <w:t xml:space="preserve">What are the major Hindu philosophical traditions?</w:t>
+      </w:r>
+    </w:p>
+    <w:p>
+      <w:pPr>
+        <w:spacing w:after="120"/>
+        <w:ind w:left="440"/>
+      </w:pPr>
+    </w:p>
+    <w:p>
+      <w:pPr>
+        <w:pStyle w:val="Heading1"/>
+      </w:pPr>
+      <w:r>
+        <w:t xml:space="preserve">PIQ 7 – Religion: Festivals</w:t>
+      </w:r>
+    </w:p>
+    <w:p>
+      <w:pPr>
+        <w:pStyle w:val="ListParagraph"/>
+        <w:keepNext/>
+        <w:numPr>
+          <w:ilvl w:val="0"/>
+          <w:numId w:val="2"/>
+        </w:numPr>
+        <w:spacing w:after="0" w:before="120"/>
+      </w:pPr>
+      <w:r>
+        <w:rPr>
+          <w:b/>
+          <w:bCs/>
+        </w:rPr>
+        <w:t xml:space="preserve">Which Hindu festivals do you celebrate?</w:t>
+      </w:r>
+    </w:p>
+    <w:p>
+      <w:pPr>
+        <w:spacing w:after="120"/>
+        <w:ind w:left="440"/>
+      </w:pPr>
+    </w:p>
+    <w:p>
+      <w:pPr>
+        <w:pStyle w:val="ListParagraph"/>
+        <w:keepNext/>
+        <w:numPr>
+          <w:ilvl w:val="0"/>
+          <w:numId w:val="2"/>
+        </w:numPr>
+        <w:spacing w:after="0" w:before="120"/>
+      </w:pPr>
+      <w:r>
+        <w:rPr>
+          <w:b/>
+          <w:bCs/>
+        </w:rPr>
+        <w:t xml:space="preserve">Which is your favourite, and why?</w:t>
+      </w:r>
+    </w:p>
+    <w:p>
+      <w:pPr>
+        <w:spacing w:after="120"/>
+        <w:ind w:left="440"/>
+      </w:pPr>
+    </w:p>
+    <w:p>
+      <w:pPr>
+        <w:pStyle w:val="ListParagraph"/>
+        <w:keepNext/>
+        <w:numPr>
+          <w:ilvl w:val="0"/>
+          <w:numId w:val="2"/>
+        </w:numPr>
+        <w:spacing w:after="0" w:before="120"/>
+      </w:pPr>
+      <w:r>
+        <w:rPr>
+          <w:b/>
+          <w:bCs/>
+        </w:rPr>
+        <w:t xml:space="preserve">What is the significance of Diwali?</w:t>
+      </w:r>
+    </w:p>
+    <w:p>
+      <w:pPr>
+        <w:spacing w:after="120"/>
+        <w:ind w:left="440"/>
+      </w:pPr>
+    </w:p>
+    <w:p>
+      <w:pPr>
+        <w:pStyle w:val="ListParagraph"/>
+        <w:keepNext/>
+        <w:numPr>
+          <w:ilvl w:val="0"/>
+          <w:numId w:val="2"/>
+        </w:numPr>
+        <w:spacing w:after="0" w:before="120"/>
+      </w:pPr>
+      <w:r>
+        <w:rPr>
+          <w:b/>
+          <w:bCs/>
+        </w:rPr>
+        <w:t xml:space="preserve">Why is Holi celebrated?</w:t>
+      </w:r>
+    </w:p>
+    <w:p>
+      <w:pPr>
+        <w:spacing w:after="120"/>
+        <w:ind w:left="440"/>
+      </w:pPr>
+    </w:p>
+    <w:p>
+      <w:pPr>
+        <w:pStyle w:val="ListParagraph"/>
+        <w:keepNext/>
+        <w:numPr>
+          <w:ilvl w:val="0"/>
+          <w:numId w:val="2"/>
+        </w:numPr>
+        <w:spacing w:after="0" w:before="120"/>
+      </w:pPr>
+      <w:r>
+        <w:rPr>
+          <w:b/>
+          <w:bCs/>
+        </w:rPr>
+        <w:t xml:space="preserve">What is the significance of Navratri?</w:t>
+      </w:r>
+    </w:p>
+    <w:p>
+      <w:pPr>
+        <w:spacing w:after="120"/>
+        <w:ind w:left="440"/>
+      </w:pPr>
+    </w:p>
+    <w:p>
+      <w:pPr>
+        <w:pStyle w:val="ListParagraph"/>
+        <w:keepNext/>
+        <w:numPr>
+          <w:ilvl w:val="0"/>
+          <w:numId w:val="2"/>
+        </w:numPr>
+        <w:spacing w:after="0" w:before="120"/>
+      </w:pPr>
+      <w:r>
+        <w:rPr>
+          <w:b/>
+          <w:bCs/>
+        </w:rPr>
+        <w:t xml:space="preserve">What is Dussehra?</w:t>
+      </w:r>
+    </w:p>
+    <w:p>
+      <w:pPr>
+        <w:spacing w:after="120"/>
+        <w:ind w:left="440"/>
+      </w:pPr>
+    </w:p>
+    <w:p>
+      <w:pPr>
+        <w:pStyle w:val="ListParagraph"/>
+        <w:keepNext/>
+        <w:numPr>
+          <w:ilvl w:val="0"/>
+          <w:numId w:val="2"/>
+        </w:numPr>
+        <w:spacing w:after="0" w:before="120"/>
+      </w:pPr>
+      <w:r>
+        <w:rPr>
+          <w:b/>
+          <w:bCs/>
+        </w:rPr>
+        <w:t xml:space="preserve">What is Janmashtami?</w:t>
+      </w:r>
+    </w:p>
+    <w:p>
+      <w:pPr>
+        <w:spacing w:after="120"/>
+        <w:ind w:left="440"/>
+      </w:pPr>
+    </w:p>
+    <w:p>
+      <w:pPr>
+        <w:pStyle w:val="ListParagraph"/>
+        <w:keepNext/>
+        <w:numPr>
+          <w:ilvl w:val="0"/>
+          <w:numId w:val="2"/>
+        </w:numPr>
+        <w:spacing w:after="0" w:before="120"/>
+      </w:pPr>
+      <w:r>
+        <w:rPr>
+          <w:b/>
+          <w:bCs/>
+        </w:rPr>
+        <w:t xml:space="preserve">What is Ram Navami?</w:t>
+      </w:r>
+    </w:p>
+    <w:p>
+      <w:pPr>
+        <w:spacing w:after="120"/>
+        <w:ind w:left="440"/>
+      </w:pPr>
+    </w:p>
+    <w:p>
+      <w:pPr>
+        <w:pStyle w:val="ListParagraph"/>
+        <w:keepNext/>
+        <w:numPr>
+          <w:ilvl w:val="0"/>
+          <w:numId w:val="2"/>
+        </w:numPr>
+        <w:spacing w:after="0" w:before="120"/>
+      </w:pPr>
+      <w:r>
+        <w:rPr>
+          <w:b/>
+          <w:bCs/>
+        </w:rPr>
+        <w:t xml:space="preserve">What is Maha Shivratri?</w:t>
+      </w:r>
+    </w:p>
+    <w:p>
+      <w:pPr>
+        <w:spacing w:after="120"/>
+        <w:ind w:left="440"/>
+      </w:pPr>
+    </w:p>
+    <w:p>
+      <w:pPr>
+        <w:pStyle w:val="ListParagraph"/>
+        <w:keepNext/>
+        <w:numPr>
+          <w:ilvl w:val="0"/>
+          <w:numId w:val="2"/>
+        </w:numPr>
+        <w:spacing w:after="0" w:before="120"/>
+      </w:pPr>
+      <w:r>
+        <w:rPr>
+          <w:b/>
+          <w:bCs/>
+        </w:rPr>
+        <w:t xml:space="preserve">Why are festivals important socially?</w:t>
+      </w:r>
+    </w:p>
+    <w:p>
+      <w:pPr>
+        <w:spacing w:after="120"/>
+        <w:ind w:left="440"/>
+      </w:pPr>
+    </w:p>
+    <w:p>
+      <w:pPr>
+        <w:pStyle w:val="Heading1"/>
+      </w:pPr>
+      <w:r>
+        <w:t xml:space="preserve">PIQ 7 – Religion: Values in Personal Life</w:t>
+      </w:r>
+    </w:p>
+    <w:p>
+      <w:pPr>
+        <w:pStyle w:val="ListParagraph"/>
+        <w:keepNext/>
+        <w:numPr>
+          <w:ilvl w:val="0"/>
+          <w:numId w:val="2"/>
+        </w:numPr>
+        <w:spacing w:after="0" w:before="120"/>
+      </w:pPr>
+      <w:r>
+        <w:rPr>
+          <w:b/>
+          <w:bCs/>
+        </w:rPr>
+        <w:t xml:space="preserve">What values have you learned from Hindu philosophy?</w:t>
+      </w:r>
+    </w:p>
+    <w:p>
+      <w:pPr>
+        <w:spacing w:after="120"/>
+        <w:ind w:left="440"/>
+      </w:pPr>
+    </w:p>
+    <w:p>
+      <w:pPr>
+        <w:pStyle w:val="ListParagraph"/>
+        <w:keepNext/>
+        <w:numPr>
+          <w:ilvl w:val="0"/>
+          <w:numId w:val="2"/>
+        </w:numPr>
+        <w:spacing w:after="0" w:before="120"/>
+      </w:pPr>
+      <w:r>
+        <w:rPr>
+          <w:b/>
+          <w:bCs/>
+        </w:rPr>
+        <w:t xml:space="preserve">How do you apply those values in daily life?</w:t>
+      </w:r>
+    </w:p>
+    <w:p>
+      <w:pPr>
+        <w:spacing w:after="120"/>
+        <w:ind w:left="440"/>
+      </w:pPr>
+    </w:p>
+    <w:p>
+      <w:pPr>
+        <w:pStyle w:val="ListParagraph"/>
+        <w:keepNext/>
+        <w:numPr>
+          <w:ilvl w:val="0"/>
+          <w:numId w:val="2"/>
+        </w:numPr>
+        <w:spacing w:after="0" w:before="120"/>
+      </w:pPr>
+      <w:r>
+        <w:rPr>
+          <w:b/>
+          <w:bCs/>
+        </w:rPr>
+        <w:t xml:space="preserve">Has religion influenced your decisions?</w:t>
+      </w:r>
+    </w:p>
+    <w:p>
+      <w:pPr>
+        <w:spacing w:after="120"/>
+        <w:ind w:left="440"/>
+      </w:pPr>
+    </w:p>
+    <w:p>
+      <w:pPr>
+        <w:pStyle w:val="ListParagraph"/>
+        <w:keepNext/>
+        <w:numPr>
+          <w:ilvl w:val="0"/>
+          <w:numId w:val="2"/>
+        </w:numPr>
+        <w:spacing w:after="0" w:before="120"/>
+      </w:pPr>
+      <w:r>
+        <w:rPr>
+          <w:b/>
+          <w:bCs/>
+        </w:rPr>
+        <w:t xml:space="preserve">Does your religion influence your work ethic?</w:t>
+      </w:r>
+    </w:p>
+    <w:p>
+      <w:pPr>
+        <w:spacing w:after="120"/>
+        <w:ind w:left="440"/>
+      </w:pPr>
+    </w:p>
+    <w:p>
+      <w:pPr>
+        <w:pStyle w:val="ListParagraph"/>
+        <w:keepNext/>
+        <w:numPr>
+          <w:ilvl w:val="0"/>
+          <w:numId w:val="2"/>
+        </w:numPr>
+        <w:spacing w:after="0" w:before="120"/>
+      </w:pPr>
+      <w:r>
+        <w:rPr>
+          <w:b/>
+          <w:bCs/>
+        </w:rPr>
+        <w:t xml:space="preserve">What does discipline mean to you?</w:t>
+      </w:r>
+    </w:p>
+    <w:p>
+      <w:pPr>
+        <w:spacing w:after="120"/>
+        <w:ind w:left="440"/>
+      </w:pPr>
+    </w:p>
+    <w:p>
+      <w:pPr>
+        <w:pStyle w:val="ListParagraph"/>
+        <w:keepNext/>
+        <w:numPr>
+          <w:ilvl w:val="0"/>
+          <w:numId w:val="2"/>
+        </w:numPr>
+        <w:spacing w:after="0" w:before="120"/>
+      </w:pPr>
+      <w:r>
+        <w:rPr>
+          <w:b/>
+          <w:bCs/>
+        </w:rPr>
+        <w:t xml:space="preserve">What does self-control mean to you?</w:t>
+      </w:r>
+    </w:p>
+    <w:p>
+      <w:pPr>
+        <w:spacing w:after="120"/>
+        <w:ind w:left="440"/>
+      </w:pPr>
+    </w:p>
+    <w:p>
+      <w:pPr>
+        <w:pStyle w:val="ListParagraph"/>
+        <w:keepNext/>
+        <w:numPr>
+          <w:ilvl w:val="0"/>
+          <w:numId w:val="2"/>
+        </w:numPr>
+        <w:spacing w:after="0" w:before="120"/>
+      </w:pPr>
+      <w:r>
+        <w:rPr>
+          <w:b/>
+          <w:bCs/>
+        </w:rPr>
+        <w:t xml:space="preserve">How do you deal with failure according to your beliefs?</w:t>
+      </w:r>
+    </w:p>
+    <w:p>
+      <w:pPr>
+        <w:spacing w:after="120"/>
+        <w:ind w:left="440"/>
+      </w:pPr>
+    </w:p>
+    <w:p>
+      <w:pPr>
+        <w:pStyle w:val="Heading1"/>
+      </w:pPr>
+      <w:r>
+        <w:t xml:space="preserve">PIQ 7 – Religion and the Armed Forces</w:t>
+      </w:r>
+    </w:p>
+    <w:p>
+      <w:pPr>
+        <w:pStyle w:val="ListParagraph"/>
+        <w:keepNext/>
+        <w:numPr>
+          <w:ilvl w:val="0"/>
+          <w:numId w:val="2"/>
+        </w:numPr>
+        <w:spacing w:after="0" w:before="120"/>
+      </w:pPr>
+      <w:r>
+        <w:rPr>
+          <w:b/>
+          <w:bCs/>
+        </w:rPr>
+        <w:t xml:space="preserve">What role does religion play in the Armed Forces?</w:t>
+      </w:r>
+    </w:p>
+    <w:p>
+      <w:pPr>
+        <w:spacing w:after="120"/>
+        <w:ind w:left="440"/>
+      </w:pPr>
+    </w:p>
+    <w:p>
+      <w:pPr>
+        <w:pStyle w:val="ListParagraph"/>
+        <w:keepNext/>
+        <w:numPr>
+          <w:ilvl w:val="0"/>
+          <w:numId w:val="2"/>
+        </w:numPr>
+        <w:spacing w:after="0" w:before="120"/>
+      </w:pPr>
+      <w:r>
+        <w:rPr>
+          <w:b/>
+          <w:bCs/>
+        </w:rPr>
+        <w:t xml:space="preserve">How would you lead soldiers from different religions?</w:t>
+      </w:r>
+    </w:p>
+    <w:p>
+      <w:pPr>
+        <w:spacing w:after="120"/>
+        <w:ind w:left="440"/>
+      </w:pPr>
+    </w:p>
+    <w:p>
+      <w:pPr>
+        <w:pStyle w:val="ListParagraph"/>
+        <w:keepNext/>
+        <w:numPr>
+          <w:ilvl w:val="0"/>
+          <w:numId w:val="2"/>
+        </w:numPr>
+        <w:spacing w:after="0" w:before="120"/>
+      </w:pPr>
+      <w:r>
+        <w:rPr>
+          <w:b/>
+          <w:bCs/>
+        </w:rPr>
+        <w:t xml:space="preserve">How would you ensure fairness while commanding people from different backgrounds?</w:t>
+      </w:r>
+    </w:p>
+    <w:p>
+      <w:pPr>
+        <w:spacing w:after="120"/>
+        <w:ind w:left="440"/>
+      </w:pPr>
+    </w:p>
+    <w:p>
+      <w:pPr>
+        <w:pStyle w:val="ListParagraph"/>
+        <w:keepNext/>
+        <w:numPr>
+          <w:ilvl w:val="0"/>
+          <w:numId w:val="2"/>
+        </w:numPr>
+        <w:spacing w:after="0" w:before="120"/>
+      </w:pPr>
+      <w:r>
+        <w:rPr>
+          <w:b/>
+          <w:bCs/>
+        </w:rPr>
+        <w:t xml:space="preserve">Should an officer treat personnel differently because of their religion?</w:t>
+      </w:r>
+    </w:p>
+    <w:p>
+      <w:pPr>
+        <w:spacing w:after="120"/>
+        <w:ind w:left="440"/>
+      </w:pPr>
+    </w:p>
+    <w:p>
+      <w:pPr>
+        <w:pStyle w:val="ListParagraph"/>
+        <w:keepNext/>
+        <w:numPr>
+          <w:ilvl w:val="0"/>
+          <w:numId w:val="2"/>
+        </w:numPr>
+        <w:spacing w:after="0" w:before="120"/>
+      </w:pPr>
+      <w:r>
+        <w:rPr>
+          <w:b/>
+          <w:bCs/>
+        </w:rPr>
+        <w:t xml:space="preserve">How would you handle a religious disagreement in your unit?</w:t>
+      </w:r>
+    </w:p>
+    <w:p>
+      <w:pPr>
+        <w:spacing w:after="120"/>
+        <w:ind w:left="440"/>
+      </w:pPr>
+    </w:p>
+    <w:p>
+      <w:pPr>
+        <w:pStyle w:val="ListParagraph"/>
+        <w:keepNext/>
+        <w:numPr>
+          <w:ilvl w:val="0"/>
+          <w:numId w:val="2"/>
+        </w:numPr>
+        <w:spacing w:after="0" w:before="120"/>
+      </w:pPr>
+      <w:r>
+        <w:rPr>
+          <w:b/>
+          <w:bCs/>
+        </w:rPr>
+        <w:t xml:space="preserve">What does secularism mean to you?</w:t>
+      </w:r>
+    </w:p>
+    <w:p>
+      <w:pPr>
+        <w:spacing w:after="120"/>
+        <w:ind w:left="440"/>
+      </w:pPr>
+    </w:p>
+    <w:p>
+      <w:pPr>
+        <w:pStyle w:val="ListParagraph"/>
+        <w:keepNext/>
+        <w:numPr>
+          <w:ilvl w:val="0"/>
+          <w:numId w:val="2"/>
+        </w:numPr>
+        <w:spacing w:after="0" w:before="120"/>
+      </w:pPr>
+      <w:r>
+        <w:rPr>
+          <w:b/>
+          <w:bCs/>
+        </w:rPr>
+        <w:t xml:space="preserve">What is the difference between secularism and irreligion?</w:t>
+      </w:r>
+    </w:p>
+    <w:p>
+      <w:pPr>
+        <w:spacing w:after="120"/>
+        <w:ind w:left="440"/>
+      </w:pPr>
+    </w:p>
+    <w:p>
+      <w:pPr>
+        <w:pStyle w:val="ListParagraph"/>
+        <w:keepNext/>
+        <w:numPr>
+          <w:ilvl w:val="0"/>
+          <w:numId w:val="2"/>
+        </w:numPr>
+        <w:spacing w:after="0" w:before="120"/>
+      </w:pPr>
+      <w:r>
+        <w:rPr>
+          <w:b/>
+          <w:bCs/>
+        </w:rPr>
+        <w:t xml:space="preserve">What does freedom of religion under the Constitution mean?</w:t>
+      </w:r>
+    </w:p>
+    <w:p>
+      <w:pPr>
+        <w:spacing w:after="120"/>
+        <w:ind w:left="440"/>
+      </w:pPr>
+    </w:p>
+    <w:p>
+      <w:pPr>
+        <w:pStyle w:val="ListParagraph"/>
+        <w:keepNext/>
+        <w:numPr>
+          <w:ilvl w:val="0"/>
+          <w:numId w:val="2"/>
+        </w:numPr>
+        <w:spacing w:after="0" w:before="120"/>
+      </w:pPr>
+      <w:r>
+        <w:rPr>
+          <w:b/>
+          <w:bCs/>
+        </w:rPr>
+        <w:t xml:space="preserve">What does unity in diversity mean to you?</w:t>
+      </w:r>
+    </w:p>
+    <w:p>
+      <w:pPr>
+        <w:spacing w:after="120"/>
+        <w:ind w:left="440"/>
+      </w:pPr>
+    </w:p>
+    <w:p>
+      <w:pPr>
+        <w:pStyle w:val="Heading1"/>
+      </w:pPr>
+      <w:r>
+        <w:t xml:space="preserve">PIQ 7 – Religion: Other Religions &amp; Diversity</w:t>
+      </w:r>
+    </w:p>
+    <w:p>
+      <w:pPr>
+        <w:pStyle w:val="ListParagraph"/>
+        <w:keepNext/>
+        <w:numPr>
+          <w:ilvl w:val="0"/>
+          <w:numId w:val="2"/>
+        </w:numPr>
+        <w:spacing w:after="0" w:before="120"/>
+      </w:pPr>
+      <w:r>
+        <w:rPr>
+          <w:b/>
+          <w:bCs/>
+        </w:rPr>
+        <w:t xml:space="preserve">What do you know about other major religions?</w:t>
+      </w:r>
+    </w:p>
+    <w:p>
+      <w:pPr>
+        <w:spacing w:after="120"/>
+        <w:ind w:left="440"/>
+      </w:pPr>
+    </w:p>
+    <w:p>
+      <w:pPr>
+        <w:pStyle w:val="ListParagraph"/>
+        <w:keepNext/>
+        <w:numPr>
+          <w:ilvl w:val="0"/>
+          <w:numId w:val="2"/>
+        </w:numPr>
+        <w:spacing w:after="0" w:before="120"/>
+      </w:pPr>
+      <w:r>
+        <w:rPr>
+          <w:b/>
+          <w:bCs/>
+        </w:rPr>
+        <w:t xml:space="preserve">What similarities do you see between Hinduism and other religions?</w:t>
+      </w:r>
+    </w:p>
+    <w:p>
+      <w:pPr>
+        <w:spacing w:after="120"/>
+        <w:ind w:left="440"/>
+      </w:pPr>
+    </w:p>
+    <w:p>
+      <w:pPr>
+        <w:pStyle w:val="ListParagraph"/>
+        <w:keepNext/>
+        <w:numPr>
+          <w:ilvl w:val="0"/>
+          <w:numId w:val="2"/>
+        </w:numPr>
+        <w:spacing w:after="0" w:before="120"/>
+      </w:pPr>
+      <w:r>
+        <w:rPr>
+          <w:b/>
+          <w:bCs/>
+        </w:rPr>
+        <w:t xml:space="preserve">What is the difference between religion and spirituality?</w:t>
+      </w:r>
+    </w:p>
+    <w:p>
+      <w:pPr>
+        <w:spacing w:after="120"/>
+        <w:ind w:left="440"/>
+      </w:pPr>
+    </w:p>
+    <w:p>
+      <w:pPr>
+        <w:pStyle w:val="ListParagraph"/>
+        <w:keepNext/>
+        <w:numPr>
+          <w:ilvl w:val="0"/>
+          <w:numId w:val="2"/>
+        </w:numPr>
+        <w:spacing w:after="0" w:before="120"/>
+      </w:pPr>
+      <w:r>
+        <w:rPr>
+          <w:b/>
+          <w:bCs/>
+        </w:rPr>
+        <w:t xml:space="preserve">Can a person be spiritual without being religious?</w:t>
+      </w:r>
+    </w:p>
+    <w:p>
+      <w:pPr>
+        <w:spacing w:after="120"/>
+        <w:ind w:left="440"/>
+      </w:pPr>
+    </w:p>
+    <w:p>
+      <w:pPr>
+        <w:pStyle w:val="ListParagraph"/>
+        <w:keepNext/>
+        <w:numPr>
+          <w:ilvl w:val="0"/>
+          <w:numId w:val="2"/>
+        </w:numPr>
+        <w:spacing w:after="0" w:before="120"/>
+      </w:pPr>
+      <w:r>
+        <w:rPr>
+          <w:b/>
+          <w:bCs/>
+        </w:rPr>
+        <w:t xml:space="preserve">What does religious tolerance mean?</w:t>
+      </w:r>
+    </w:p>
+    <w:p>
+      <w:pPr>
+        <w:spacing w:after="120"/>
+        <w:ind w:left="440"/>
+      </w:pPr>
+    </w:p>
+    <w:p>
+      <w:pPr>
+        <w:pStyle w:val="ListParagraph"/>
+        <w:keepNext/>
+        <w:numPr>
+          <w:ilvl w:val="0"/>
+          <w:numId w:val="2"/>
+        </w:numPr>
+        <w:spacing w:after="0" w:before="120"/>
+      </w:pPr>
+      <w:r>
+        <w:rPr>
+          <w:b/>
+          <w:bCs/>
+        </w:rPr>
+        <w:t xml:space="preserve">Why is India known for religious diversity?</w:t>
+      </w:r>
+    </w:p>
+    <w:p>
+      <w:pPr>
+        <w:spacing w:after="120"/>
+        <w:ind w:left="440"/>
+      </w:pPr>
+    </w:p>
+    <w:p>
+      <w:pPr>
+        <w:pStyle w:val="ListParagraph"/>
+        <w:keepNext/>
+        <w:numPr>
+          <w:ilvl w:val="0"/>
+          <w:numId w:val="2"/>
+        </w:numPr>
+        <w:spacing w:after="0" w:before="120"/>
+      </w:pPr>
+      <w:r>
+        <w:rPr>
+          <w:b/>
+          <w:bCs/>
+        </w:rPr>
+        <w:t xml:space="preserve">How can interfaith harmony be promoted?</w:t>
+      </w:r>
+    </w:p>
+    <w:p>
+      <w:pPr>
+        <w:spacing w:after="120"/>
+        <w:ind w:left="440"/>
+      </w:pPr>
+    </w:p>
+    <w:p>
+      <w:pPr>
+        <w:pStyle w:val="Heading1"/>
+      </w:pPr>
+      <w:r>
+        <w:t xml:space="preserve">PIQ 7 – Religion: Challenging Questions</w:t>
+      </w:r>
+    </w:p>
+    <w:p>
+      <w:pPr>
+        <w:pStyle w:val="ListParagraph"/>
+        <w:keepNext/>
+        <w:numPr>
+          <w:ilvl w:val="0"/>
+          <w:numId w:val="2"/>
+        </w:numPr>
+        <w:spacing w:after="0" w:before="120"/>
+      </w:pPr>
+      <w:r>
+        <w:rPr>
+          <w:b/>
+          <w:bCs/>
+        </w:rPr>
+        <w:t xml:space="preserve">Do you blindly follow religious practices?</w:t>
+      </w:r>
+    </w:p>
+    <w:p>
+      <w:pPr>
+        <w:spacing w:after="120"/>
+        <w:ind w:left="440"/>
+      </w:pPr>
+    </w:p>
+    <w:p>
+      <w:pPr>
+        <w:pStyle w:val="ListParagraph"/>
+        <w:keepNext/>
+        <w:numPr>
+          <w:ilvl w:val="0"/>
+          <w:numId w:val="2"/>
+        </w:numPr>
+        <w:spacing w:after="0" w:before="120"/>
+      </w:pPr>
+      <w:r>
+        <w:rPr>
+          <w:b/>
+          <w:bCs/>
+        </w:rPr>
+        <w:t xml:space="preserve">Do you question traditions?</w:t>
+      </w:r>
+    </w:p>
+    <w:p>
+      <w:pPr>
+        <w:spacing w:after="120"/>
+        <w:ind w:left="440"/>
+      </w:pPr>
+    </w:p>
+    <w:p>
+      <w:pPr>
+        <w:pStyle w:val="ListParagraph"/>
+        <w:keepNext/>
+        <w:numPr>
+          <w:ilvl w:val="0"/>
+          <w:numId w:val="2"/>
+        </w:numPr>
+        <w:spacing w:after="0" w:before="120"/>
+      </w:pPr>
+      <w:r>
+        <w:rPr>
+          <w:b/>
+          <w:bCs/>
+        </w:rPr>
+        <w:t xml:space="preserve">Are all traditions equally relevant today?</w:t>
+      </w:r>
+    </w:p>
+    <w:p>
+      <w:pPr>
+        <w:spacing w:after="120"/>
+        <w:ind w:left="440"/>
+      </w:pPr>
+    </w:p>
+    <w:p>
+      <w:pPr>
+        <w:pStyle w:val="ListParagraph"/>
+        <w:keepNext/>
+        <w:numPr>
+          <w:ilvl w:val="0"/>
+          <w:numId w:val="2"/>
+        </w:numPr>
+        <w:spacing w:after="0" w:before="120"/>
+      </w:pPr>
+      <w:r>
+        <w:rPr>
+          <w:b/>
+          <w:bCs/>
+        </w:rPr>
+        <w:t xml:space="preserve">What if you disagree with a religious practice?</w:t>
+      </w:r>
+    </w:p>
+    <w:p>
+      <w:pPr>
+        <w:spacing w:after="120"/>
+        <w:ind w:left="440"/>
+      </w:pPr>
+    </w:p>
+    <w:p>
+      <w:pPr>
+        <w:pStyle w:val="ListParagraph"/>
+        <w:keepNext/>
+        <w:numPr>
+          <w:ilvl w:val="0"/>
+          <w:numId w:val="2"/>
+        </w:numPr>
+        <w:spacing w:after="0" w:before="120"/>
+      </w:pPr>
+      <w:r>
+        <w:rPr>
+          <w:b/>
+          <w:bCs/>
+        </w:rPr>
+        <w:t xml:space="preserve">Can religion and science coexist?</w:t>
+      </w:r>
+    </w:p>
+    <w:p>
+      <w:pPr>
+        <w:spacing w:after="120"/>
+        <w:ind w:left="440"/>
+      </w:pPr>
+    </w:p>
+    <w:p>
+      <w:pPr>
+        <w:pStyle w:val="ListParagraph"/>
+        <w:keepNext/>
+        <w:numPr>
+          <w:ilvl w:val="0"/>
+          <w:numId w:val="2"/>
+        </w:numPr>
+        <w:spacing w:after="0" w:before="120"/>
+      </w:pPr>
+      <w:r>
+        <w:rPr>
+          <w:b/>
+          <w:bCs/>
+        </w:rPr>
+        <w:t xml:space="preserve">What is the role of religion in modern society?</w:t>
+      </w:r>
+    </w:p>
+    <w:p>
+      <w:pPr>
+        <w:spacing w:after="120"/>
+        <w:ind w:left="440"/>
+      </w:pPr>
+    </w:p>
+    <w:p>
+      <w:pPr>
+        <w:pStyle w:val="ListParagraph"/>
+        <w:keepNext/>
+        <w:numPr>
+          <w:ilvl w:val="0"/>
+          <w:numId w:val="2"/>
+        </w:numPr>
+        <w:spacing w:after="0" w:before="120"/>
+      </w:pPr>
+      <w:r>
+        <w:rPr>
+          <w:b/>
+          <w:bCs/>
+        </w:rPr>
+        <w:t xml:space="preserve">Should religion influence public policy?</w:t>
+      </w:r>
+    </w:p>
+    <w:p>
+      <w:pPr>
+        <w:spacing w:after="120"/>
+        <w:ind w:left="440"/>
+      </w:pPr>
+    </w:p>
+    <w:p>
+      <w:pPr>
+        <w:pStyle w:val="ListParagraph"/>
+        <w:keepNext/>
+        <w:numPr>
+          <w:ilvl w:val="0"/>
+          <w:numId w:val="2"/>
+        </w:numPr>
+        <w:spacing w:after="0" w:before="120"/>
+      </w:pPr>
+      <w:r>
+        <w:rPr>
+          <w:b/>
+          <w:bCs/>
+        </w:rPr>
+        <w:t xml:space="preserve">What is the difference between faith and superstition?</w:t>
       </w:r>
     </w:p>
     <w:p>

</xml_diff>

<commit_message>
Add PIQ 8 (Father's education, occupation, income) questions
Co-Authored-By: Claude Opus 5.5 <noreply@anthropic.com>
Claude-Session: https://claude.ai/code/session_01TypcejD48cCyAqfjtUUit5
</commit_message>
<xml_diff>
--- a/SSB_Question_Sheet.docx
+++ b/SSB_Question_Sheet.docx
@@ -11220,6 +11220,1294 @@
           <w:bCs/>
         </w:rPr>
         <w:t xml:space="preserve">What is the difference between faith and superstition?</w:t>
+      </w:r>
+    </w:p>
+    <w:p>
+      <w:pPr>
+        <w:spacing w:after="120"/>
+        <w:ind w:left="440"/>
+      </w:pPr>
+    </w:p>
+    <w:p>
+      <w:pPr>
+        <w:pStyle w:val="Heading1"/>
+      </w:pPr>
+      <w:r>
+        <w:t xml:space="preserve">PIQ 8 – Father: Education &amp; Occupation</w:t>
+      </w:r>
+    </w:p>
+    <w:p>
+      <w:pPr>
+        <w:pStyle w:val="ListParagraph"/>
+        <w:keepNext/>
+        <w:numPr>
+          <w:ilvl w:val="0"/>
+          <w:numId w:val="2"/>
+        </w:numPr>
+        <w:spacing w:after="0" w:before="120"/>
+      </w:pPr>
+      <w:r>
+        <w:rPr>
+          <w:b/>
+          <w:bCs/>
+        </w:rPr>
+        <w:t xml:space="preserve">What did your father study in 10+2?</w:t>
+      </w:r>
+    </w:p>
+    <w:p>
+      <w:pPr>
+        <w:spacing w:after="120"/>
+        <w:ind w:left="440"/>
+      </w:pPr>
+    </w:p>
+    <w:p>
+      <w:pPr>
+        <w:pStyle w:val="ListParagraph"/>
+        <w:keepNext/>
+        <w:numPr>
+          <w:ilvl w:val="0"/>
+          <w:numId w:val="2"/>
+        </w:numPr>
+        <w:spacing w:after="0" w:before="120"/>
+      </w:pPr>
+      <w:r>
+        <w:rPr>
+          <w:b/>
+          <w:bCs/>
+        </w:rPr>
+        <w:t xml:space="preserve">Why did he not pursue higher education?</w:t>
+      </w:r>
+    </w:p>
+    <w:p>
+      <w:pPr>
+        <w:spacing w:after="120"/>
+        <w:ind w:left="440"/>
+      </w:pPr>
+    </w:p>
+    <w:p>
+      <w:pPr>
+        <w:pStyle w:val="ListParagraph"/>
+        <w:keepNext/>
+        <w:numPr>
+          <w:ilvl w:val="0"/>
+          <w:numId w:val="2"/>
+        </w:numPr>
+        <w:spacing w:after="0" w:before="120"/>
+      </w:pPr>
+      <w:r>
+        <w:rPr>
+          <w:b/>
+          <w:bCs/>
+        </w:rPr>
+        <w:t xml:space="preserve">Is farming his main occupation?</w:t>
+      </w:r>
+    </w:p>
+    <w:p>
+      <w:pPr>
+        <w:spacing w:after="120"/>
+        <w:ind w:left="440"/>
+      </w:pPr>
+    </w:p>
+    <w:p>
+      <w:pPr>
+        <w:pStyle w:val="ListParagraph"/>
+        <w:keepNext/>
+        <w:numPr>
+          <w:ilvl w:val="0"/>
+          <w:numId w:val="2"/>
+        </w:numPr>
+        <w:spacing w:after="0" w:before="120"/>
+      </w:pPr>
+      <w:r>
+        <w:rPr>
+          <w:b/>
+          <w:bCs/>
+        </w:rPr>
+        <w:t xml:space="preserve">Is farming your family's traditional occupation?</w:t>
+      </w:r>
+    </w:p>
+    <w:p>
+      <w:pPr>
+        <w:spacing w:after="120"/>
+        <w:ind w:left="440"/>
+      </w:pPr>
+    </w:p>
+    <w:p>
+      <w:pPr>
+        <w:pStyle w:val="ListParagraph"/>
+        <w:keepNext/>
+        <w:numPr>
+          <w:ilvl w:val="0"/>
+          <w:numId w:val="2"/>
+        </w:numPr>
+        <w:spacing w:after="0" w:before="120"/>
+      </w:pPr>
+      <w:r>
+        <w:rPr>
+          <w:b/>
+          <w:bCs/>
+        </w:rPr>
+        <w:t xml:space="preserve">How does your father earn from farming?</w:t>
+      </w:r>
+    </w:p>
+    <w:p>
+      <w:pPr>
+        <w:spacing w:after="120"/>
+        <w:ind w:left="440"/>
+      </w:pPr>
+    </w:p>
+    <w:p>
+      <w:pPr>
+        <w:pStyle w:val="Heading1"/>
+      </w:pPr>
+      <w:r>
+        <w:t xml:space="preserve">PIQ 8 – Father: Farm Details</w:t>
+      </w:r>
+    </w:p>
+    <w:p>
+      <w:pPr>
+        <w:pStyle w:val="ListParagraph"/>
+        <w:keepNext/>
+        <w:numPr>
+          <w:ilvl w:val="0"/>
+          <w:numId w:val="2"/>
+        </w:numPr>
+        <w:spacing w:after="0" w:before="120"/>
+      </w:pPr>
+      <w:r>
+        <w:rPr>
+          <w:b/>
+          <w:bCs/>
+        </w:rPr>
+        <w:t xml:space="preserve">What are the major expenses in farming?</w:t>
+      </w:r>
+    </w:p>
+    <w:p>
+      <w:pPr>
+        <w:spacing w:after="120"/>
+        <w:ind w:left="440"/>
+      </w:pPr>
+    </w:p>
+    <w:p>
+      <w:pPr>
+        <w:pStyle w:val="ListParagraph"/>
+        <w:keepNext/>
+        <w:numPr>
+          <w:ilvl w:val="0"/>
+          <w:numId w:val="2"/>
+        </w:numPr>
+        <w:spacing w:after="0" w:before="120"/>
+      </w:pPr>
+      <w:r>
+        <w:rPr>
+          <w:b/>
+          <w:bCs/>
+        </w:rPr>
+        <w:t xml:space="preserve">What machinery does he use? Does he use a tractor?</w:t>
+      </w:r>
+    </w:p>
+    <w:p>
+      <w:pPr>
+        <w:spacing w:after="120"/>
+        <w:ind w:left="440"/>
+      </w:pPr>
+    </w:p>
+    <w:p>
+      <w:pPr>
+        <w:pStyle w:val="ListParagraph"/>
+        <w:keepNext/>
+        <w:numPr>
+          <w:ilvl w:val="0"/>
+          <w:numId w:val="2"/>
+        </w:numPr>
+        <w:spacing w:after="0" w:before="120"/>
+      </w:pPr>
+      <w:r>
+        <w:rPr>
+          <w:b/>
+          <w:bCs/>
+        </w:rPr>
+        <w:t xml:space="preserve">Does he use chemical fertilisers or organic manure?</w:t>
+      </w:r>
+    </w:p>
+    <w:p>
+      <w:pPr>
+        <w:spacing w:after="120"/>
+        <w:ind w:left="440"/>
+      </w:pPr>
+    </w:p>
+    <w:p>
+      <w:pPr>
+        <w:pStyle w:val="ListParagraph"/>
+        <w:keepNext/>
+        <w:numPr>
+          <w:ilvl w:val="0"/>
+          <w:numId w:val="2"/>
+        </w:numPr>
+        <w:spacing w:after="0" w:before="120"/>
+      </w:pPr>
+      <w:r>
+        <w:rPr>
+          <w:b/>
+          <w:bCs/>
+        </w:rPr>
+        <w:t xml:space="preserve">How are seeds selected?</w:t>
+      </w:r>
+    </w:p>
+    <w:p>
+      <w:pPr>
+        <w:spacing w:after="120"/>
+        <w:ind w:left="440"/>
+      </w:pPr>
+    </w:p>
+    <w:p>
+      <w:pPr>
+        <w:pStyle w:val="ListParagraph"/>
+        <w:keepNext/>
+        <w:numPr>
+          <w:ilvl w:val="0"/>
+          <w:numId w:val="2"/>
+        </w:numPr>
+        <w:spacing w:after="0" w:before="120"/>
+      </w:pPr>
+      <w:r>
+        <w:rPr>
+          <w:b/>
+          <w:bCs/>
+        </w:rPr>
+        <w:t xml:space="preserve">Where does he sell his produce?</w:t>
+      </w:r>
+    </w:p>
+    <w:p>
+      <w:pPr>
+        <w:spacing w:after="120"/>
+        <w:ind w:left="440"/>
+      </w:pPr>
+    </w:p>
+    <w:p>
+      <w:pPr>
+        <w:pStyle w:val="ListParagraph"/>
+        <w:keepNext/>
+        <w:numPr>
+          <w:ilvl w:val="0"/>
+          <w:numId w:val="2"/>
+        </w:numPr>
+        <w:spacing w:after="0" w:before="120"/>
+      </w:pPr>
+      <w:r>
+        <w:rPr>
+          <w:b/>
+          <w:bCs/>
+        </w:rPr>
+        <w:t xml:space="preserve">How does he decide the selling price?</w:t>
+      </w:r>
+    </w:p>
+    <w:p>
+      <w:pPr>
+        <w:spacing w:after="120"/>
+        <w:ind w:left="440"/>
+      </w:pPr>
+    </w:p>
+    <w:p>
+      <w:pPr>
+        <w:pStyle w:val="Heading1"/>
+      </w:pPr>
+      <w:r>
+        <w:t xml:space="preserve">PIQ 8 – Father: Agricultural Economics &amp; Issues</w:t>
+      </w:r>
+    </w:p>
+    <w:p>
+      <w:pPr>
+        <w:pStyle w:val="ListParagraph"/>
+        <w:keepNext/>
+        <w:numPr>
+          <w:ilvl w:val="0"/>
+          <w:numId w:val="2"/>
+        </w:numPr>
+        <w:spacing w:after="0" w:before="120"/>
+      </w:pPr>
+      <w:r>
+        <w:rPr>
+          <w:b/>
+          <w:bCs/>
+        </w:rPr>
+        <w:t xml:space="preserve">Is MSP available for every crop?</w:t>
+      </w:r>
+    </w:p>
+    <w:p>
+      <w:pPr>
+        <w:spacing w:after="120"/>
+        <w:ind w:left="440"/>
+      </w:pPr>
+    </w:p>
+    <w:p>
+      <w:pPr>
+        <w:pStyle w:val="ListParagraph"/>
+        <w:keepNext/>
+        <w:numPr>
+          <w:ilvl w:val="0"/>
+          <w:numId w:val="2"/>
+        </w:numPr>
+        <w:spacing w:after="0" w:before="120"/>
+      </w:pPr>
+      <w:r>
+        <w:rPr>
+          <w:b/>
+          <w:bCs/>
+        </w:rPr>
+        <w:t xml:space="preserve">What is contract farming?</w:t>
+      </w:r>
+    </w:p>
+    <w:p>
+      <w:pPr>
+        <w:spacing w:after="120"/>
+        <w:ind w:left="440"/>
+      </w:pPr>
+    </w:p>
+    <w:p>
+      <w:pPr>
+        <w:pStyle w:val="ListParagraph"/>
+        <w:keepNext/>
+        <w:numPr>
+          <w:ilvl w:val="0"/>
+          <w:numId w:val="2"/>
+        </w:numPr>
+        <w:spacing w:after="0" w:before="120"/>
+      </w:pPr>
+      <w:r>
+        <w:rPr>
+          <w:b/>
+          <w:bCs/>
+        </w:rPr>
+        <w:t xml:space="preserve">How do price fluctuations affect farmers?</w:t>
+      </w:r>
+    </w:p>
+    <w:p>
+      <w:pPr>
+        <w:spacing w:after="120"/>
+        <w:ind w:left="440"/>
+      </w:pPr>
+    </w:p>
+    <w:p>
+      <w:pPr>
+        <w:pStyle w:val="ListParagraph"/>
+        <w:keepNext/>
+        <w:numPr>
+          <w:ilvl w:val="0"/>
+          <w:numId w:val="2"/>
+        </w:numPr>
+        <w:spacing w:after="0" w:before="120"/>
+      </w:pPr>
+      <w:r>
+        <w:rPr>
+          <w:b/>
+          <w:bCs/>
+        </w:rPr>
+        <w:t xml:space="preserve">Why are storage and transport a problem for farmers?</w:t>
+      </w:r>
+    </w:p>
+    <w:p>
+      <w:pPr>
+        <w:spacing w:after="120"/>
+        <w:ind w:left="440"/>
+      </w:pPr>
+    </w:p>
+    <w:p>
+      <w:pPr>
+        <w:pStyle w:val="ListParagraph"/>
+        <w:keepNext/>
+        <w:numPr>
+          <w:ilvl w:val="0"/>
+          <w:numId w:val="2"/>
+        </w:numPr>
+        <w:spacing w:after="0" w:before="120"/>
+      </w:pPr>
+      <w:r>
+        <w:rPr>
+          <w:b/>
+          <w:bCs/>
+        </w:rPr>
+        <w:t xml:space="preserve">What are post-harvest losses, and how can they be reduced?</w:t>
+      </w:r>
+    </w:p>
+    <w:p>
+      <w:pPr>
+        <w:spacing w:after="120"/>
+        <w:ind w:left="440"/>
+      </w:pPr>
+    </w:p>
+    <w:p>
+      <w:pPr>
+        <w:pStyle w:val="ListParagraph"/>
+        <w:keepNext/>
+        <w:numPr>
+          <w:ilvl w:val="0"/>
+          <w:numId w:val="2"/>
+        </w:numPr>
+        <w:spacing w:after="0" w:before="120"/>
+      </w:pPr>
+      <w:r>
+        <w:rPr>
+          <w:b/>
+          <w:bCs/>
+        </w:rPr>
+        <w:t xml:space="preserve">Why is soil health important?</w:t>
+      </w:r>
+    </w:p>
+    <w:p>
+      <w:pPr>
+        <w:spacing w:after="120"/>
+        <w:ind w:left="440"/>
+      </w:pPr>
+    </w:p>
+    <w:p>
+      <w:pPr>
+        <w:pStyle w:val="ListParagraph"/>
+        <w:keepNext/>
+        <w:numPr>
+          <w:ilvl w:val="0"/>
+          <w:numId w:val="2"/>
+        </w:numPr>
+        <w:spacing w:after="0" w:before="120"/>
+      </w:pPr>
+      <w:r>
+        <w:rPr>
+          <w:b/>
+          <w:bCs/>
+        </w:rPr>
+        <w:t xml:space="preserve">What is farm diversification?</w:t>
+      </w:r>
+    </w:p>
+    <w:p>
+      <w:pPr>
+        <w:spacing w:after="120"/>
+        <w:ind w:left="440"/>
+      </w:pPr>
+    </w:p>
+    <w:p>
+      <w:pPr>
+        <w:pStyle w:val="ListParagraph"/>
+        <w:keepNext/>
+        <w:numPr>
+          <w:ilvl w:val="0"/>
+          <w:numId w:val="2"/>
+        </w:numPr>
+        <w:spacing w:after="0" w:before="120"/>
+      </w:pPr>
+      <w:r>
+        <w:rPr>
+          <w:b/>
+          <w:bCs/>
+        </w:rPr>
+        <w:t xml:space="preserve">If you were given ₹10 lakh to improve farming in your village, where would you spend it?</w:t>
+      </w:r>
+    </w:p>
+    <w:p>
+      <w:pPr>
+        <w:spacing w:after="120"/>
+        <w:ind w:left="440"/>
+      </w:pPr>
+    </w:p>
+    <w:p>
+      <w:pPr>
+        <w:pStyle w:val="Heading1"/>
+      </w:pPr>
+      <w:r>
+        <w:t xml:space="preserve">PIQ 8 – Father: Income &amp; Family Finances</w:t>
+      </w:r>
+    </w:p>
+    <w:p>
+      <w:pPr>
+        <w:pStyle w:val="ListParagraph"/>
+        <w:keepNext/>
+        <w:numPr>
+          <w:ilvl w:val="0"/>
+          <w:numId w:val="2"/>
+        </w:numPr>
+        <w:spacing w:after="0" w:before="120"/>
+      </w:pPr>
+      <w:r>
+        <w:rPr>
+          <w:b/>
+          <w:bCs/>
+        </w:rPr>
+        <w:t xml:space="preserve">What is your father's monthly income?</w:t>
+      </w:r>
+    </w:p>
+    <w:p>
+      <w:pPr>
+        <w:spacing w:after="120"/>
+        <w:ind w:left="440"/>
+      </w:pPr>
+    </w:p>
+    <w:p>
+      <w:pPr>
+        <w:pStyle w:val="ListParagraph"/>
+        <w:keepNext/>
+        <w:numPr>
+          <w:ilvl w:val="0"/>
+          <w:numId w:val="2"/>
+        </w:numPr>
+        <w:spacing w:after="0" w:before="120"/>
+      </w:pPr>
+      <w:r>
+        <w:rPr>
+          <w:b/>
+          <w:bCs/>
+        </w:rPr>
+        <w:t xml:space="preserve">You have written ₹20,000. Is that a salary or income?</w:t>
+      </w:r>
+    </w:p>
+    <w:p>
+      <w:pPr>
+        <w:spacing w:after="120"/>
+        <w:ind w:left="440"/>
+      </w:pPr>
+    </w:p>
+    <w:p>
+      <w:pPr>
+        <w:pStyle w:val="ListParagraph"/>
+        <w:keepNext/>
+        <w:numPr>
+          <w:ilvl w:val="0"/>
+          <w:numId w:val="2"/>
+        </w:numPr>
+        <w:spacing w:after="0" w:before="120"/>
+      </w:pPr>
+      <w:r>
+        <w:rPr>
+          <w:b/>
+          <w:bCs/>
+        </w:rPr>
+        <w:t xml:space="preserve">Is it a fixed amount or a monthly average?</w:t>
+      </w:r>
+    </w:p>
+    <w:p>
+      <w:pPr>
+        <w:spacing w:after="120"/>
+        <w:ind w:left="440"/>
+      </w:pPr>
+    </w:p>
+    <w:p>
+      <w:pPr>
+        <w:pStyle w:val="ListParagraph"/>
+        <w:keepNext/>
+        <w:numPr>
+          <w:ilvl w:val="0"/>
+          <w:numId w:val="2"/>
+        </w:numPr>
+        <w:spacing w:after="0" w:before="120"/>
+      </w:pPr>
+      <w:r>
+        <w:rPr>
+          <w:b/>
+          <w:bCs/>
+        </w:rPr>
+        <w:t xml:space="preserve">How much does he earn during harvest season?</w:t>
+      </w:r>
+    </w:p>
+    <w:p>
+      <w:pPr>
+        <w:spacing w:after="120"/>
+        <w:ind w:left="440"/>
+      </w:pPr>
+    </w:p>
+    <w:p>
+      <w:pPr>
+        <w:pStyle w:val="ListParagraph"/>
+        <w:keepNext/>
+        <w:numPr>
+          <w:ilvl w:val="0"/>
+          <w:numId w:val="2"/>
+        </w:numPr>
+        <w:spacing w:after="0" w:before="120"/>
+      </w:pPr>
+      <w:r>
+        <w:rPr>
+          <w:b/>
+          <w:bCs/>
+        </w:rPr>
+        <w:t xml:space="preserve">Does his income fluctuate?</w:t>
+      </w:r>
+    </w:p>
+    <w:p>
+      <w:pPr>
+        <w:spacing w:after="120"/>
+        <w:ind w:left="440"/>
+      </w:pPr>
+    </w:p>
+    <w:p>
+      <w:pPr>
+        <w:pStyle w:val="ListParagraph"/>
+        <w:keepNext/>
+        <w:numPr>
+          <w:ilvl w:val="0"/>
+          <w:numId w:val="2"/>
+        </w:numPr>
+        <w:spacing w:after="0" w:before="120"/>
+      </w:pPr>
+      <w:r>
+        <w:rPr>
+          <w:b/>
+          <w:bCs/>
+        </w:rPr>
+        <w:t xml:space="preserve">How does he manage during a poor harvest?</w:t>
+      </w:r>
+    </w:p>
+    <w:p>
+      <w:pPr>
+        <w:spacing w:after="120"/>
+        <w:ind w:left="440"/>
+      </w:pPr>
+    </w:p>
+    <w:p>
+      <w:pPr>
+        <w:pStyle w:val="ListParagraph"/>
+        <w:keepNext/>
+        <w:numPr>
+          <w:ilvl w:val="0"/>
+          <w:numId w:val="2"/>
+        </w:numPr>
+        <w:spacing w:after="0" w:before="120"/>
+      </w:pPr>
+      <w:r>
+        <w:rPr>
+          <w:b/>
+          <w:bCs/>
+        </w:rPr>
+        <w:t xml:space="preserve">Does your family have any other source of income?</w:t>
+      </w:r>
+    </w:p>
+    <w:p>
+      <w:pPr>
+        <w:spacing w:after="120"/>
+        <w:ind w:left="440"/>
+      </w:pPr>
+    </w:p>
+    <w:p>
+      <w:pPr>
+        <w:pStyle w:val="ListParagraph"/>
+        <w:keepNext/>
+        <w:numPr>
+          <w:ilvl w:val="0"/>
+          <w:numId w:val="2"/>
+        </w:numPr>
+        <w:spacing w:after="0" w:before="120"/>
+      </w:pPr>
+      <w:r>
+        <w:rPr>
+          <w:b/>
+          <w:bCs/>
+        </w:rPr>
+        <w:t xml:space="preserve">Does your mother contribute to the household income?</w:t>
+      </w:r>
+    </w:p>
+    <w:p>
+      <w:pPr>
+        <w:spacing w:after="120"/>
+        <w:ind w:left="440"/>
+      </w:pPr>
+    </w:p>
+    <w:p>
+      <w:pPr>
+        <w:pStyle w:val="ListParagraph"/>
+        <w:keepNext/>
+        <w:numPr>
+          <w:ilvl w:val="0"/>
+          <w:numId w:val="2"/>
+        </w:numPr>
+        <w:spacing w:after="0" w:before="120"/>
+      </w:pPr>
+      <w:r>
+        <w:rPr>
+          <w:b/>
+          <w:bCs/>
+        </w:rPr>
+        <w:t xml:space="preserve">What is your family's approximate monthly expenditure?</w:t>
+      </w:r>
+    </w:p>
+    <w:p>
+      <w:pPr>
+        <w:spacing w:after="120"/>
+        <w:ind w:left="440"/>
+      </w:pPr>
+    </w:p>
+    <w:p>
+      <w:pPr>
+        <w:pStyle w:val="Heading1"/>
+      </w:pPr>
+      <w:r>
+        <w:t xml:space="preserve">PIQ 8 – Father's Education vs Yours</w:t>
+      </w:r>
+    </w:p>
+    <w:p>
+      <w:pPr>
+        <w:pStyle w:val="ListParagraph"/>
+        <w:keepNext/>
+        <w:numPr>
+          <w:ilvl w:val="0"/>
+          <w:numId w:val="2"/>
+        </w:numPr>
+        <w:spacing w:after="0" w:before="120"/>
+      </w:pPr>
+      <w:r>
+        <w:rPr>
+          <w:b/>
+          <w:bCs/>
+        </w:rPr>
+        <w:t xml:space="preserve">Your father studied up to 10+2 and you completed B.Tech. Why the difference?</w:t>
+      </w:r>
+    </w:p>
+    <w:p>
+      <w:pPr>
+        <w:spacing w:after="120"/>
+        <w:ind w:left="440"/>
+      </w:pPr>
+    </w:p>
+    <w:p>
+      <w:pPr>
+        <w:pStyle w:val="ListParagraph"/>
+        <w:keepNext/>
+        <w:numPr>
+          <w:ilvl w:val="0"/>
+          <w:numId w:val="2"/>
+        </w:numPr>
+        <w:spacing w:after="0" w:before="120"/>
+      </w:pPr>
+      <w:r>
+        <w:rPr>
+          <w:b/>
+          <w:bCs/>
+        </w:rPr>
+        <w:t xml:space="preserve">Did your father want you to pursue higher education?</w:t>
+      </w:r>
+    </w:p>
+    <w:p>
+      <w:pPr>
+        <w:spacing w:after="120"/>
+        <w:ind w:left="440"/>
+      </w:pPr>
+    </w:p>
+    <w:p>
+      <w:pPr>
+        <w:pStyle w:val="ListParagraph"/>
+        <w:keepNext/>
+        <w:numPr>
+          <w:ilvl w:val="0"/>
+          <w:numId w:val="2"/>
+        </w:numPr>
+        <w:spacing w:after="0" w:before="120"/>
+      </w:pPr>
+      <w:r>
+        <w:rPr>
+          <w:b/>
+          <w:bCs/>
+        </w:rPr>
+        <w:t xml:space="preserve">Who supported your education?</w:t>
+      </w:r>
+    </w:p>
+    <w:p>
+      <w:pPr>
+        <w:spacing w:after="120"/>
+        <w:ind w:left="440"/>
+      </w:pPr>
+    </w:p>
+    <w:p>
+      <w:pPr>
+        <w:pStyle w:val="ListParagraph"/>
+        <w:keepNext/>
+        <w:numPr>
+          <w:ilvl w:val="0"/>
+          <w:numId w:val="2"/>
+        </w:numPr>
+        <w:spacing w:after="0" w:before="120"/>
+      </w:pPr>
+      <w:r>
+        <w:rPr>
+          <w:b/>
+          <w:bCs/>
+        </w:rPr>
+        <w:t xml:space="preserve">Did your parents influence your career choice?</w:t>
+      </w:r>
+    </w:p>
+    <w:p>
+      <w:pPr>
+        <w:spacing w:after="120"/>
+        <w:ind w:left="440"/>
+      </w:pPr>
+    </w:p>
+    <w:p>
+      <w:pPr>
+        <w:pStyle w:val="ListParagraph"/>
+        <w:keepNext/>
+        <w:numPr>
+          <w:ilvl w:val="0"/>
+          <w:numId w:val="2"/>
+        </w:numPr>
+        <w:spacing w:after="0" w:before="120"/>
+      </w:pPr>
+      <w:r>
+        <w:rPr>
+          <w:b/>
+          <w:bCs/>
+        </w:rPr>
+        <w:t xml:space="preserve">What opportunities did you have that your father didn't?</w:t>
+      </w:r>
+    </w:p>
+    <w:p>
+      <w:pPr>
+        <w:spacing w:after="120"/>
+        <w:ind w:left="440"/>
+      </w:pPr>
+    </w:p>
+    <w:p>
+      <w:pPr>
+        <w:pStyle w:val="ListParagraph"/>
+        <w:keepNext/>
+        <w:numPr>
+          <w:ilvl w:val="0"/>
+          <w:numId w:val="2"/>
+        </w:numPr>
+        <w:spacing w:after="0" w:before="120"/>
+      </w:pPr>
+      <w:r>
+        <w:rPr>
+          <w:b/>
+          <w:bCs/>
+        </w:rPr>
+        <w:t xml:space="preserve">Is formal education necessary for success?</w:t>
+      </w:r>
+    </w:p>
+    <w:p>
+      <w:pPr>
+        <w:spacing w:after="120"/>
+        <w:ind w:left="440"/>
+      </w:pPr>
+    </w:p>
+    <w:p>
+      <w:pPr>
+        <w:pStyle w:val="ListParagraph"/>
+        <w:keepNext/>
+        <w:numPr>
+          <w:ilvl w:val="0"/>
+          <w:numId w:val="2"/>
+        </w:numPr>
+        <w:spacing w:after="0" w:before="120"/>
+      </w:pPr>
+      <w:r>
+        <w:rPr>
+          <w:b/>
+          <w:bCs/>
+        </w:rPr>
+        <w:t xml:space="preserve">What have you learned from your father despite his limited formal education?</w:t>
+      </w:r>
+    </w:p>
+    <w:p>
+      <w:pPr>
+        <w:spacing w:after="120"/>
+        <w:ind w:left="440"/>
+      </w:pPr>
+    </w:p>
+    <w:p>
+      <w:pPr>
+        <w:pStyle w:val="Heading1"/>
+      </w:pPr>
+      <w:r>
+        <w:t xml:space="preserve">PIQ 8 – Father &amp; Your Armed Forces Choice</w:t>
+      </w:r>
+    </w:p>
+    <w:p>
+      <w:pPr>
+        <w:pStyle w:val="ListParagraph"/>
+        <w:keepNext/>
+        <w:numPr>
+          <w:ilvl w:val="0"/>
+          <w:numId w:val="2"/>
+        </w:numPr>
+        <w:spacing w:after="0" w:before="120"/>
+      </w:pPr>
+      <w:r>
+        <w:rPr>
+          <w:b/>
+          <w:bCs/>
+        </w:rPr>
+        <w:t xml:space="preserve">Why do you want to join the Armed Forces?</w:t>
+      </w:r>
+    </w:p>
+    <w:p>
+      <w:pPr>
+        <w:spacing w:after="120"/>
+        <w:ind w:left="440"/>
+      </w:pPr>
+    </w:p>
+    <w:p>
+      <w:pPr>
+        <w:pStyle w:val="ListParagraph"/>
+        <w:keepNext/>
+        <w:numPr>
+          <w:ilvl w:val="0"/>
+          <w:numId w:val="2"/>
+        </w:numPr>
+        <w:spacing w:after="0" w:before="120"/>
+      </w:pPr>
+      <w:r>
+        <w:rPr>
+          <w:b/>
+          <w:bCs/>
+        </w:rPr>
+        <w:t xml:space="preserve">Why do you want to leave your IT career?</w:t>
+      </w:r>
+    </w:p>
+    <w:p>
+      <w:pPr>
+        <w:spacing w:after="120"/>
+        <w:ind w:left="440"/>
+      </w:pPr>
+    </w:p>
+    <w:p>
+      <w:pPr>
+        <w:pStyle w:val="ListParagraph"/>
+        <w:keepNext/>
+        <w:numPr>
+          <w:ilvl w:val="0"/>
+          <w:numId w:val="2"/>
+        </w:numPr>
+        <w:spacing w:after="0" w:before="120"/>
+      </w:pPr>
+      <w:r>
+        <w:rPr>
+          <w:b/>
+          <w:bCs/>
+        </w:rPr>
+        <w:t xml:space="preserve">Why not continue earning in the private sector?</w:t>
+      </w:r>
+    </w:p>
+    <w:p>
+      <w:pPr>
+        <w:spacing w:after="120"/>
+        <w:ind w:left="440"/>
+      </w:pPr>
+    </w:p>
+    <w:p>
+      <w:pPr>
+        <w:pStyle w:val="ListParagraph"/>
+        <w:keepNext/>
+        <w:numPr>
+          <w:ilvl w:val="0"/>
+          <w:numId w:val="2"/>
+        </w:numPr>
+        <w:spacing w:after="0" w:before="120"/>
+      </w:pPr>
+      <w:r>
+        <w:rPr>
+          <w:b/>
+          <w:bCs/>
+        </w:rPr>
+        <w:t xml:space="preserve">Would your family be financially comfortable if you join the Armed Forces?</w:t>
+      </w:r>
+    </w:p>
+    <w:p>
+      <w:pPr>
+        <w:spacing w:after="120"/>
+        <w:ind w:left="440"/>
+      </w:pPr>
+    </w:p>
+    <w:p>
+      <w:pPr>
+        <w:pStyle w:val="ListParagraph"/>
+        <w:keepNext/>
+        <w:numPr>
+          <w:ilvl w:val="0"/>
+          <w:numId w:val="2"/>
+        </w:numPr>
+        <w:spacing w:after="0" w:before="120"/>
+      </w:pPr>
+      <w:r>
+        <w:rPr>
+          <w:b/>
+          <w:bCs/>
+        </w:rPr>
+        <w:t xml:space="preserve">Are you joining for the salary?</w:t>
+      </w:r>
+    </w:p>
+    <w:p>
+      <w:pPr>
+        <w:spacing w:after="120"/>
+        <w:ind w:left="440"/>
+      </w:pPr>
+    </w:p>
+    <w:p>
+      <w:pPr>
+        <w:pStyle w:val="ListParagraph"/>
+        <w:keepNext/>
+        <w:numPr>
+          <w:ilvl w:val="0"/>
+          <w:numId w:val="2"/>
+        </w:numPr>
+        <w:spacing w:after="0" w:before="120"/>
+      </w:pPr>
+      <w:r>
+        <w:rPr>
+          <w:b/>
+          <w:bCs/>
+        </w:rPr>
+        <w:t xml:space="preserve">Are you joining for the uniform or status?</w:t>
+      </w:r>
+    </w:p>
+    <w:p>
+      <w:pPr>
+        <w:spacing w:after="120"/>
+        <w:ind w:left="440"/>
+      </w:pPr>
+    </w:p>
+    <w:p>
+      <w:pPr>
+        <w:pStyle w:val="ListParagraph"/>
+        <w:keepNext/>
+        <w:numPr>
+          <w:ilvl w:val="0"/>
+          <w:numId w:val="2"/>
+        </w:numPr>
+        <w:spacing w:after="0" w:before="120"/>
+      </w:pPr>
+      <w:r>
+        <w:rPr>
+          <w:b/>
+          <w:bCs/>
+        </w:rPr>
+        <w:t xml:space="preserve">What attracts you to military life?</w:t>
+      </w:r>
+    </w:p>
+    <w:p>
+      <w:pPr>
+        <w:spacing w:after="120"/>
+        <w:ind w:left="440"/>
+      </w:pPr>
+    </w:p>
+    <w:p>
+      <w:pPr>
+        <w:pStyle w:val="Heading1"/>
+      </w:pPr>
+      <w:r>
+        <w:t xml:space="preserve">PIQ 8 – Father: Relationship</w:t>
+      </w:r>
+    </w:p>
+    <w:p>
+      <w:pPr>
+        <w:pStyle w:val="ListParagraph"/>
+        <w:keepNext/>
+        <w:numPr>
+          <w:ilvl w:val="0"/>
+          <w:numId w:val="2"/>
+        </w:numPr>
+        <w:spacing w:after="0" w:before="120"/>
+      </w:pPr>
+      <w:r>
+        <w:rPr>
+          <w:b/>
+          <w:bCs/>
+        </w:rPr>
+        <w:t xml:space="preserve">How often do you talk to your father?</w:t>
+      </w:r>
+    </w:p>
+    <w:p>
+      <w:pPr>
+        <w:spacing w:after="120"/>
+        <w:ind w:left="440"/>
+      </w:pPr>
+    </w:p>
+    <w:p>
+      <w:pPr>
+        <w:pStyle w:val="ListParagraph"/>
+        <w:keepNext/>
+        <w:numPr>
+          <w:ilvl w:val="0"/>
+          <w:numId w:val="2"/>
+        </w:numPr>
+        <w:spacing w:after="0" w:before="120"/>
+      </w:pPr>
+      <w:r>
+        <w:rPr>
+          <w:b/>
+          <w:bCs/>
+        </w:rPr>
+        <w:t xml:space="preserve">What do you usually discuss?</w:t>
+      </w:r>
+    </w:p>
+    <w:p>
+      <w:pPr>
+        <w:spacing w:after="120"/>
+        <w:ind w:left="440"/>
+      </w:pPr>
+    </w:p>
+    <w:p>
+      <w:pPr>
+        <w:pStyle w:val="ListParagraph"/>
+        <w:keepNext/>
+        <w:numPr>
+          <w:ilvl w:val="0"/>
+          <w:numId w:val="2"/>
+        </w:numPr>
+        <w:spacing w:after="0" w:before="120"/>
+      </w:pPr>
+      <w:r>
+        <w:rPr>
+          <w:b/>
+          <w:bCs/>
+        </w:rPr>
+        <w:t xml:space="preserve">What is one weakness you have seen in him?</w:t>
+      </w:r>
+    </w:p>
+    <w:p>
+      <w:pPr>
+        <w:spacing w:after="120"/>
+        <w:ind w:left="440"/>
+      </w:pPr>
+    </w:p>
+    <w:p>
+      <w:pPr>
+        <w:pStyle w:val="ListParagraph"/>
+        <w:keepNext/>
+        <w:numPr>
+          <w:ilvl w:val="0"/>
+          <w:numId w:val="2"/>
+        </w:numPr>
+        <w:spacing w:after="0" w:before="120"/>
+      </w:pPr>
+      <w:r>
+        <w:rPr>
+          <w:b/>
+          <w:bCs/>
+        </w:rPr>
+        <w:t xml:space="preserve">What responsibilities do you share with him?</w:t>
+      </w:r>
+    </w:p>
+    <w:p>
+      <w:pPr>
+        <w:spacing w:after="120"/>
+        <w:ind w:left="440"/>
+      </w:pPr>
+    </w:p>
+    <w:p>
+      <w:pPr>
+        <w:pStyle w:val="ListParagraph"/>
+        <w:keepNext/>
+        <w:numPr>
+          <w:ilvl w:val="0"/>
+          <w:numId w:val="2"/>
+        </w:numPr>
+        <w:spacing w:after="0" w:before="120"/>
+      </w:pPr>
+      <w:r>
+        <w:rPr>
+          <w:b/>
+          <w:bCs/>
+        </w:rPr>
+        <w:t xml:space="preserve">Tell me about a difficult situation your father handled.</w:t>
+      </w:r>
+    </w:p>
+    <w:p>
+      <w:pPr>
+        <w:spacing w:after="120"/>
+        <w:ind w:left="440"/>
+      </w:pPr>
+    </w:p>
+    <w:p>
+      <w:pPr>
+        <w:pStyle w:val="ListParagraph"/>
+        <w:keepNext/>
+        <w:numPr>
+          <w:ilvl w:val="0"/>
+          <w:numId w:val="2"/>
+        </w:numPr>
+        <w:spacing w:after="0" w:before="120"/>
+      </w:pPr>
+      <w:r>
+        <w:rPr>
+          <w:b/>
+          <w:bCs/>
+        </w:rPr>
+        <w:t xml:space="preserve">Give an example of your father's hard work or discipline.</w:t>
+      </w:r>
+    </w:p>
+    <w:p>
+      <w:pPr>
+        <w:spacing w:after="120"/>
+        <w:ind w:left="440"/>
+      </w:pPr>
+    </w:p>
+    <w:p>
+      <w:pPr>
+        <w:pStyle w:val="Heading1"/>
+      </w:pPr>
+      <w:r>
+        <w:t xml:space="preserve">PIQ 8 – Father: Practical Situations</w:t>
+      </w:r>
+    </w:p>
+    <w:p>
+      <w:pPr>
+        <w:pStyle w:val="ListParagraph"/>
+        <w:keepNext/>
+        <w:numPr>
+          <w:ilvl w:val="0"/>
+          <w:numId w:val="2"/>
+        </w:numPr>
+        <w:spacing w:after="0" w:before="120"/>
+      </w:pPr>
+      <w:r>
+        <w:rPr>
+          <w:b/>
+          <w:bCs/>
+        </w:rPr>
+        <w:t xml:space="preserve">Suppose your father has a poor harvest this year. What would you do?</w:t>
+      </w:r>
+    </w:p>
+    <w:p>
+      <w:pPr>
+        <w:spacing w:after="120"/>
+        <w:ind w:left="440"/>
+      </w:pPr>
+    </w:p>
+    <w:p>
+      <w:pPr>
+        <w:pStyle w:val="ListParagraph"/>
+        <w:keepNext/>
+        <w:numPr>
+          <w:ilvl w:val="0"/>
+          <w:numId w:val="2"/>
+        </w:numPr>
+        <w:spacing w:after="0" w:before="120"/>
+      </w:pPr>
+      <w:r>
+        <w:rPr>
+          <w:b/>
+          <w:bCs/>
+        </w:rPr>
+        <w:t xml:space="preserve">Farmers in your village are getting poor prices for their produce. What practical steps would you suggest?</w:t>
+      </w:r>
+    </w:p>
+    <w:p>
+      <w:pPr>
+        <w:spacing w:after="120"/>
+        <w:ind w:left="440"/>
+      </w:pPr>
+    </w:p>
+    <w:p>
+      <w:pPr>
+        <w:pStyle w:val="ListParagraph"/>
+        <w:keepNext/>
+        <w:numPr>
+          <w:ilvl w:val="0"/>
+          <w:numId w:val="2"/>
+        </w:numPr>
+        <w:spacing w:after="0" w:before="120"/>
+      </w:pPr>
+      <w:r>
+        <w:rPr>
+          <w:b/>
+          <w:bCs/>
+        </w:rPr>
+        <w:t xml:space="preserve">If you were responsible for agricultural development in your district, what would you prioritise?</w:t>
       </w:r>
     </w:p>
     <w:p>

</xml_diff>

<commit_message>
Add PIQ 9 (Mother's education, occupation, salary) questions
Co-Authored-By: Claude Opus 5.5 <noreply@anthropic.com>
Claude-Session: https://claude.ai/code/session_01TypcejD48cCyAqfjtUUit5
</commit_message>
<xml_diff>
--- a/SSB_Question_Sheet.docx
+++ b/SSB_Question_Sheet.docx
@@ -12508,6 +12508,1126 @@
           <w:bCs/>
         </w:rPr>
         <w:t xml:space="preserve">If you were responsible for agricultural development in your district, what would you prioritise?</w:t>
+      </w:r>
+    </w:p>
+    <w:p>
+      <w:pPr>
+        <w:spacing w:after="120"/>
+        <w:ind w:left="440"/>
+      </w:pPr>
+    </w:p>
+    <w:p>
+      <w:pPr>
+        <w:pStyle w:val="Heading1"/>
+      </w:pPr>
+      <w:r>
+        <w:t xml:space="preserve">PIQ 9 – Mother: Education &amp; Salary</w:t>
+      </w:r>
+    </w:p>
+    <w:p>
+      <w:pPr>
+        <w:pStyle w:val="ListParagraph"/>
+        <w:keepNext/>
+        <w:numPr>
+          <w:ilvl w:val="0"/>
+          <w:numId w:val="2"/>
+        </w:numPr>
+        <w:spacing w:after="0" w:before="120"/>
+      </w:pPr>
+      <w:r>
+        <w:rPr>
+          <w:b/>
+          <w:bCs/>
+        </w:rPr>
+        <w:t xml:space="preserve">What does B.A. stand for?</w:t>
+      </w:r>
+    </w:p>
+    <w:p>
+      <w:pPr>
+        <w:spacing w:after="120"/>
+        <w:ind w:left="440"/>
+      </w:pPr>
+    </w:p>
+    <w:p>
+      <w:pPr>
+        <w:pStyle w:val="ListParagraph"/>
+        <w:keepNext/>
+        <w:numPr>
+          <w:ilvl w:val="0"/>
+          <w:numId w:val="2"/>
+        </w:numPr>
+        <w:spacing w:after="0" w:before="120"/>
+      </w:pPr>
+      <w:r>
+        <w:rPr>
+          <w:b/>
+          <w:bCs/>
+        </w:rPr>
+        <w:t xml:space="preserve">What subjects did your mother study in B.A.?</w:t>
+      </w:r>
+    </w:p>
+    <w:p>
+      <w:pPr>
+        <w:spacing w:after="120"/>
+        <w:ind w:left="440"/>
+      </w:pPr>
+    </w:p>
+    <w:p>
+      <w:pPr>
+        <w:pStyle w:val="ListParagraph"/>
+        <w:keepNext/>
+        <w:numPr>
+          <w:ilvl w:val="0"/>
+          <w:numId w:val="2"/>
+        </w:numPr>
+        <w:spacing w:after="0" w:before="120"/>
+      </w:pPr>
+      <w:r>
+        <w:rPr>
+          <w:b/>
+          <w:bCs/>
+        </w:rPr>
+        <w:t xml:space="preserve">What is B.Ed?</w:t>
+      </w:r>
+    </w:p>
+    <w:p>
+      <w:pPr>
+        <w:spacing w:after="120"/>
+        <w:ind w:left="440"/>
+      </w:pPr>
+    </w:p>
+    <w:p>
+      <w:pPr>
+        <w:pStyle w:val="ListParagraph"/>
+        <w:keepNext/>
+        <w:numPr>
+          <w:ilvl w:val="0"/>
+          <w:numId w:val="2"/>
+        </w:numPr>
+        <w:spacing w:after="0" w:before="120"/>
+      </w:pPr>
+      <w:r>
+        <w:rPr>
+          <w:b/>
+          <w:bCs/>
+        </w:rPr>
+        <w:t xml:space="preserve">Why did she do B.Ed after B.A.?</w:t>
+      </w:r>
+    </w:p>
+    <w:p>
+      <w:pPr>
+        <w:spacing w:after="120"/>
+        <w:ind w:left="440"/>
+      </w:pPr>
+    </w:p>
+    <w:p>
+      <w:pPr>
+        <w:pStyle w:val="ListParagraph"/>
+        <w:keepNext/>
+        <w:numPr>
+          <w:ilvl w:val="0"/>
+          <w:numId w:val="2"/>
+        </w:numPr>
+        <w:spacing w:after="0" w:before="120"/>
+      </w:pPr>
+      <w:r>
+        <w:rPr>
+          <w:b/>
+          <w:bCs/>
+        </w:rPr>
+        <w:t xml:space="preserve">What is your mother's monthly salary?</w:t>
+      </w:r>
+    </w:p>
+    <w:p>
+      <w:pPr>
+        <w:spacing w:after="120"/>
+        <w:ind w:left="440"/>
+      </w:pPr>
+    </w:p>
+    <w:p>
+      <w:pPr>
+        <w:pStyle w:val="ListParagraph"/>
+        <w:keepNext/>
+        <w:numPr>
+          <w:ilvl w:val="0"/>
+          <w:numId w:val="2"/>
+        </w:numPr>
+        <w:spacing w:after="0" w:before="120"/>
+      </w:pPr>
+      <w:r>
+        <w:rPr>
+          <w:b/>
+          <w:bCs/>
+        </w:rPr>
+        <w:t xml:space="preserve">Is ₹1,05,000 her gross salary or take-home salary?</w:t>
+      </w:r>
+    </w:p>
+    <w:p>
+      <w:pPr>
+        <w:spacing w:after="120"/>
+        <w:ind w:left="440"/>
+      </w:pPr>
+    </w:p>
+    <w:p>
+      <w:pPr>
+        <w:pStyle w:val="Heading1"/>
+      </w:pPr>
+      <w:r>
+        <w:t xml:space="preserve">PIQ 9 – Mother: B.A. &amp; Humanities</w:t>
+      </w:r>
+    </w:p>
+    <w:p>
+      <w:pPr>
+        <w:pStyle w:val="ListParagraph"/>
+        <w:keepNext/>
+        <w:numPr>
+          <w:ilvl w:val="0"/>
+          <w:numId w:val="2"/>
+        </w:numPr>
+        <w:spacing w:after="0" w:before="120"/>
+      </w:pPr>
+      <w:r>
+        <w:rPr>
+          <w:b/>
+          <w:bCs/>
+        </w:rPr>
+        <w:t xml:space="preserve">What is the difference between humanities and social sciences?</w:t>
+      </w:r>
+    </w:p>
+    <w:p>
+      <w:pPr>
+        <w:spacing w:after="120"/>
+        <w:ind w:left="440"/>
+      </w:pPr>
+    </w:p>
+    <w:p>
+      <w:pPr>
+        <w:pStyle w:val="ListParagraph"/>
+        <w:keepNext/>
+        <w:numPr>
+          <w:ilvl w:val="0"/>
+          <w:numId w:val="2"/>
+        </w:numPr>
+        <w:spacing w:after="0" w:before="120"/>
+      </w:pPr>
+      <w:r>
+        <w:rPr>
+          <w:b/>
+          <w:bCs/>
+        </w:rPr>
+        <w:t xml:space="preserve">Why is humanities education important for the nation?</w:t>
+      </w:r>
+    </w:p>
+    <w:p>
+      <w:pPr>
+        <w:spacing w:after="120"/>
+        <w:ind w:left="440"/>
+      </w:pPr>
+    </w:p>
+    <w:p>
+      <w:pPr>
+        <w:pStyle w:val="Heading1"/>
+      </w:pPr>
+      <w:r>
+        <w:t xml:space="preserve">PIQ 9 – Mother: B.Ed, Teaching &amp; Education</w:t>
+      </w:r>
+    </w:p>
+    <w:p>
+      <w:pPr>
+        <w:pStyle w:val="ListParagraph"/>
+        <w:keepNext/>
+        <w:numPr>
+          <w:ilvl w:val="0"/>
+          <w:numId w:val="2"/>
+        </w:numPr>
+        <w:spacing w:after="0" w:before="120"/>
+      </w:pPr>
+      <w:r>
+        <w:rPr>
+          <w:b/>
+          <w:bCs/>
+        </w:rPr>
+        <w:t xml:space="preserve">Why is B.Ed required for teaching?</w:t>
+      </w:r>
+    </w:p>
+    <w:p>
+      <w:pPr>
+        <w:spacing w:after="120"/>
+        <w:ind w:left="440"/>
+      </w:pPr>
+    </w:p>
+    <w:p>
+      <w:pPr>
+        <w:pStyle w:val="ListParagraph"/>
+        <w:keepNext/>
+        <w:numPr>
+          <w:ilvl w:val="0"/>
+          <w:numId w:val="2"/>
+        </w:numPr>
+        <w:spacing w:after="0" w:before="120"/>
+      </w:pPr>
+      <w:r>
+        <w:rPr>
+          <w:b/>
+          <w:bCs/>
+        </w:rPr>
+        <w:t xml:space="preserve">What does a teacher learn during B.Ed?</w:t>
+      </w:r>
+    </w:p>
+    <w:p>
+      <w:pPr>
+        <w:spacing w:after="120"/>
+        <w:ind w:left="440"/>
+      </w:pPr>
+    </w:p>
+    <w:p>
+      <w:pPr>
+        <w:pStyle w:val="ListParagraph"/>
+        <w:keepNext/>
+        <w:numPr>
+          <w:ilvl w:val="0"/>
+          <w:numId w:val="2"/>
+        </w:numPr>
+        <w:spacing w:after="0" w:before="120"/>
+      </w:pPr>
+      <w:r>
+        <w:rPr>
+          <w:b/>
+          <w:bCs/>
+        </w:rPr>
+        <w:t xml:space="preserve">What is pedagogy?</w:t>
+      </w:r>
+    </w:p>
+    <w:p>
+      <w:pPr>
+        <w:spacing w:after="120"/>
+        <w:ind w:left="440"/>
+      </w:pPr>
+    </w:p>
+    <w:p>
+      <w:pPr>
+        <w:pStyle w:val="ListParagraph"/>
+        <w:keepNext/>
+        <w:numPr>
+          <w:ilvl w:val="0"/>
+          <w:numId w:val="2"/>
+        </w:numPr>
+        <w:spacing w:after="0" w:before="120"/>
+      </w:pPr>
+      <w:r>
+        <w:rPr>
+          <w:b/>
+          <w:bCs/>
+        </w:rPr>
+        <w:t xml:space="preserve">What is the difference between teaching and learning?</w:t>
+      </w:r>
+    </w:p>
+    <w:p>
+      <w:pPr>
+        <w:spacing w:after="120"/>
+        <w:ind w:left="440"/>
+      </w:pPr>
+    </w:p>
+    <w:p>
+      <w:pPr>
+        <w:pStyle w:val="ListParagraph"/>
+        <w:keepNext/>
+        <w:numPr>
+          <w:ilvl w:val="0"/>
+          <w:numId w:val="2"/>
+        </w:numPr>
+        <w:spacing w:after="0" w:before="120"/>
+      </w:pPr>
+      <w:r>
+        <w:rPr>
+          <w:b/>
+          <w:bCs/>
+        </w:rPr>
+        <w:t xml:space="preserve">What is child-centred education?</w:t>
+      </w:r>
+    </w:p>
+    <w:p>
+      <w:pPr>
+        <w:spacing w:after="120"/>
+        <w:ind w:left="440"/>
+      </w:pPr>
+    </w:p>
+    <w:p>
+      <w:pPr>
+        <w:pStyle w:val="ListParagraph"/>
+        <w:keepNext/>
+        <w:numPr>
+          <w:ilvl w:val="0"/>
+          <w:numId w:val="2"/>
+        </w:numPr>
+        <w:spacing w:after="0" w:before="120"/>
+      </w:pPr>
+      <w:r>
+        <w:rPr>
+          <w:b/>
+          <w:bCs/>
+        </w:rPr>
+        <w:t xml:space="preserve">What is experiential learning?</w:t>
+      </w:r>
+    </w:p>
+    <w:p>
+      <w:pPr>
+        <w:spacing w:after="120"/>
+        <w:ind w:left="440"/>
+      </w:pPr>
+    </w:p>
+    <w:p>
+      <w:pPr>
+        <w:pStyle w:val="ListParagraph"/>
+        <w:keepNext/>
+        <w:numPr>
+          <w:ilvl w:val="0"/>
+          <w:numId w:val="2"/>
+        </w:numPr>
+        <w:spacing w:after="0" w:before="120"/>
+      </w:pPr>
+      <w:r>
+        <w:rPr>
+          <w:b/>
+          <w:bCs/>
+        </w:rPr>
+        <w:t xml:space="preserve">A student keeps performing poorly despite repeated teaching. What should the teacher do?</w:t>
+      </w:r>
+    </w:p>
+    <w:p>
+      <w:pPr>
+        <w:spacing w:after="120"/>
+        <w:ind w:left="440"/>
+      </w:pPr>
+    </w:p>
+    <w:p>
+      <w:pPr>
+        <w:pStyle w:val="ListParagraph"/>
+        <w:keepNext/>
+        <w:numPr>
+          <w:ilvl w:val="0"/>
+          <w:numId w:val="2"/>
+        </w:numPr>
+        <w:spacing w:after="0" w:before="120"/>
+      </w:pPr>
+      <w:r>
+        <w:rPr>
+          <w:b/>
+          <w:bCs/>
+        </w:rPr>
+        <w:t xml:space="preserve">How should a teacher handle a disruptive student?</w:t>
+      </w:r>
+    </w:p>
+    <w:p>
+      <w:pPr>
+        <w:spacing w:after="120"/>
+        <w:ind w:left="440"/>
+      </w:pPr>
+    </w:p>
+    <w:p>
+      <w:pPr>
+        <w:pStyle w:val="ListParagraph"/>
+        <w:keepNext/>
+        <w:numPr>
+          <w:ilvl w:val="0"/>
+          <w:numId w:val="2"/>
+        </w:numPr>
+        <w:spacing w:after="0" w:before="120"/>
+      </w:pPr>
+      <w:r>
+        <w:rPr>
+          <w:b/>
+          <w:bCs/>
+        </w:rPr>
+        <w:t xml:space="preserve">Should all students be taught the same way?</w:t>
+      </w:r>
+    </w:p>
+    <w:p>
+      <w:pPr>
+        <w:spacing w:after="120"/>
+        <w:ind w:left="440"/>
+      </w:pPr>
+    </w:p>
+    <w:p>
+      <w:pPr>
+        <w:pStyle w:val="ListParagraph"/>
+        <w:keepNext/>
+        <w:numPr>
+          <w:ilvl w:val="0"/>
+          <w:numId w:val="2"/>
+        </w:numPr>
+        <w:spacing w:after="0" w:before="120"/>
+      </w:pPr>
+      <w:r>
+        <w:rPr>
+          <w:b/>
+          <w:bCs/>
+        </w:rPr>
+        <w:t xml:space="preserve">What are the major problems in Indian education?</w:t>
+      </w:r>
+    </w:p>
+    <w:p>
+      <w:pPr>
+        <w:spacing w:after="120"/>
+        <w:ind w:left="440"/>
+      </w:pPr>
+    </w:p>
+    <w:p>
+      <w:pPr>
+        <w:pStyle w:val="ListParagraph"/>
+        <w:keepNext/>
+        <w:numPr>
+          <w:ilvl w:val="0"/>
+          <w:numId w:val="2"/>
+        </w:numPr>
+        <w:spacing w:after="0" w:before="120"/>
+      </w:pPr>
+      <w:r>
+        <w:rPr>
+          <w:b/>
+          <w:bCs/>
+        </w:rPr>
+        <w:t xml:space="preserve">What is foundational literacy and numeracy?</w:t>
+      </w:r>
+    </w:p>
+    <w:p>
+      <w:pPr>
+        <w:spacing w:after="120"/>
+        <w:ind w:left="440"/>
+      </w:pPr>
+    </w:p>
+    <w:p>
+      <w:pPr>
+        <w:pStyle w:val="Heading1"/>
+      </w:pPr>
+      <w:r>
+        <w:t xml:space="preserve">PIQ 9 – Mother: Salary Concepts</w:t>
+      </w:r>
+    </w:p>
+    <w:p>
+      <w:pPr>
+        <w:pStyle w:val="ListParagraph"/>
+        <w:keepNext/>
+        <w:numPr>
+          <w:ilvl w:val="0"/>
+          <w:numId w:val="2"/>
+        </w:numPr>
+        <w:spacing w:after="0" w:before="120"/>
+      </w:pPr>
+      <w:r>
+        <w:rPr>
+          <w:b/>
+          <w:bCs/>
+        </w:rPr>
+        <w:t xml:space="preserve">What is the difference between gross and take-home salary?</w:t>
+      </w:r>
+    </w:p>
+    <w:p>
+      <w:pPr>
+        <w:spacing w:after="120"/>
+        <w:ind w:left="440"/>
+      </w:pPr>
+    </w:p>
+    <w:p>
+      <w:pPr>
+        <w:pStyle w:val="ListParagraph"/>
+        <w:keepNext/>
+        <w:numPr>
+          <w:ilvl w:val="0"/>
+          <w:numId w:val="2"/>
+        </w:numPr>
+        <w:spacing w:after="0" w:before="120"/>
+      </w:pPr>
+      <w:r>
+        <w:rPr>
+          <w:b/>
+          <w:bCs/>
+        </w:rPr>
+        <w:t xml:space="preserve">What deductions are made from a salary?</w:t>
+      </w:r>
+    </w:p>
+    <w:p>
+      <w:pPr>
+        <w:spacing w:after="120"/>
+        <w:ind w:left="440"/>
+      </w:pPr>
+    </w:p>
+    <w:p>
+      <w:pPr>
+        <w:pStyle w:val="ListParagraph"/>
+        <w:keepNext/>
+        <w:numPr>
+          <w:ilvl w:val="0"/>
+          <w:numId w:val="2"/>
+        </w:numPr>
+        <w:spacing w:after="0" w:before="120"/>
+      </w:pPr>
+      <w:r>
+        <w:rPr>
+          <w:b/>
+          <w:bCs/>
+        </w:rPr>
+        <w:t xml:space="preserve">What allowances does a government employee get?</w:t>
+      </w:r>
+    </w:p>
+    <w:p>
+      <w:pPr>
+        <w:spacing w:after="120"/>
+        <w:ind w:left="440"/>
+      </w:pPr>
+    </w:p>
+    <w:p>
+      <w:pPr>
+        <w:pStyle w:val="ListParagraph"/>
+        <w:keepNext/>
+        <w:numPr>
+          <w:ilvl w:val="0"/>
+          <w:numId w:val="2"/>
+        </w:numPr>
+        <w:spacing w:after="0" w:before="120"/>
+      </w:pPr>
+      <w:r>
+        <w:rPr>
+          <w:b/>
+          <w:bCs/>
+        </w:rPr>
+        <w:t xml:space="preserve">What is a pension?</w:t>
+      </w:r>
+    </w:p>
+    <w:p>
+      <w:pPr>
+        <w:spacing w:after="120"/>
+        <w:ind w:left="440"/>
+      </w:pPr>
+    </w:p>
+    <w:p>
+      <w:pPr>
+        <w:pStyle w:val="ListParagraph"/>
+        <w:keepNext/>
+        <w:numPr>
+          <w:ilvl w:val="0"/>
+          <w:numId w:val="2"/>
+        </w:numPr>
+        <w:spacing w:after="0" w:before="120"/>
+      </w:pPr>
+      <w:r>
+        <w:rPr>
+          <w:b/>
+          <w:bCs/>
+        </w:rPr>
+        <w:t xml:space="preserve">What is NPS?</w:t>
+      </w:r>
+    </w:p>
+    <w:p>
+      <w:pPr>
+        <w:spacing w:after="120"/>
+        <w:ind w:left="440"/>
+      </w:pPr>
+    </w:p>
+    <w:p>
+      <w:pPr>
+        <w:pStyle w:val="ListParagraph"/>
+        <w:keepNext/>
+        <w:numPr>
+          <w:ilvl w:val="0"/>
+          <w:numId w:val="2"/>
+        </w:numPr>
+        <w:spacing w:after="0" w:before="120"/>
+      </w:pPr>
+      <w:r>
+        <w:rPr>
+          <w:b/>
+          <w:bCs/>
+        </w:rPr>
+        <w:t xml:space="preserve">What is the difference between salary and income?</w:t>
+      </w:r>
+    </w:p>
+    <w:p>
+      <w:pPr>
+        <w:spacing w:after="120"/>
+        <w:ind w:left="440"/>
+      </w:pPr>
+    </w:p>
+    <w:p>
+      <w:pPr>
+        <w:pStyle w:val="Heading1"/>
+      </w:pPr>
+      <w:r>
+        <w:t xml:space="preserve">PIQ 9 – Mother vs Father: Income &amp; Roles</w:t>
+      </w:r>
+    </w:p>
+    <w:p>
+      <w:pPr>
+        <w:pStyle w:val="ListParagraph"/>
+        <w:keepNext/>
+        <w:numPr>
+          <w:ilvl w:val="0"/>
+          <w:numId w:val="2"/>
+        </w:numPr>
+        <w:spacing w:after="0" w:before="120"/>
+      </w:pPr>
+      <w:r>
+        <w:rPr>
+          <w:b/>
+          <w:bCs/>
+        </w:rPr>
+        <w:t xml:space="preserve">Who earns more, your father or your mother?</w:t>
+      </w:r>
+    </w:p>
+    <w:p>
+      <w:pPr>
+        <w:spacing w:after="120"/>
+        <w:ind w:left="440"/>
+      </w:pPr>
+    </w:p>
+    <w:p>
+      <w:pPr>
+        <w:pStyle w:val="ListParagraph"/>
+        <w:keepNext/>
+        <w:numPr>
+          <w:ilvl w:val="0"/>
+          <w:numId w:val="2"/>
+        </w:numPr>
+        <w:spacing w:after="0" w:before="120"/>
+      </w:pPr>
+      <w:r>
+        <w:rPr>
+          <w:b/>
+          <w:bCs/>
+        </w:rPr>
+        <w:t xml:space="preserve">Why is there such a difference?</w:t>
+      </w:r>
+    </w:p>
+    <w:p>
+      <w:pPr>
+        <w:spacing w:after="120"/>
+        <w:ind w:left="440"/>
+      </w:pPr>
+    </w:p>
+    <w:p>
+      <w:pPr>
+        <w:pStyle w:val="ListParagraph"/>
+        <w:keepNext/>
+        <w:numPr>
+          <w:ilvl w:val="0"/>
+          <w:numId w:val="2"/>
+        </w:numPr>
+        <w:spacing w:after="0" w:before="120"/>
+      </w:pPr>
+      <w:r>
+        <w:rPr>
+          <w:b/>
+          <w:bCs/>
+        </w:rPr>
+        <w:t xml:space="preserve">Who contributes more to household finances?</w:t>
+      </w:r>
+    </w:p>
+    <w:p>
+      <w:pPr>
+        <w:spacing w:after="120"/>
+        <w:ind w:left="440"/>
+      </w:pPr>
+    </w:p>
+    <w:p>
+      <w:pPr>
+        <w:pStyle w:val="ListParagraph"/>
+        <w:keepNext/>
+        <w:numPr>
+          <w:ilvl w:val="0"/>
+          <w:numId w:val="2"/>
+        </w:numPr>
+        <w:spacing w:after="0" w:before="120"/>
+      </w:pPr>
+      <w:r>
+        <w:rPr>
+          <w:b/>
+          <w:bCs/>
+        </w:rPr>
+        <w:t xml:space="preserve">Does income decide a person's importance in a family?</w:t>
+      </w:r>
+    </w:p>
+    <w:p>
+      <w:pPr>
+        <w:spacing w:after="120"/>
+        <w:ind w:left="440"/>
+      </w:pPr>
+    </w:p>
+    <w:p>
+      <w:pPr>
+        <w:pStyle w:val="ListParagraph"/>
+        <w:keepNext/>
+        <w:numPr>
+          <w:ilvl w:val="0"/>
+          <w:numId w:val="2"/>
+        </w:numPr>
+        <w:spacing w:after="0" w:before="120"/>
+      </w:pPr>
+      <w:r>
+        <w:rPr>
+          <w:b/>
+          <w:bCs/>
+        </w:rPr>
+        <w:t xml:space="preserve">Who has more responsibilities?</w:t>
+      </w:r>
+    </w:p>
+    <w:p>
+      <w:pPr>
+        <w:spacing w:after="120"/>
+        <w:ind w:left="440"/>
+      </w:pPr>
+    </w:p>
+    <w:p>
+      <w:pPr>
+        <w:pStyle w:val="Heading1"/>
+      </w:pPr>
+      <w:r>
+        <w:t xml:space="preserve">PIQ 9 – Mother's Career vs Yours</w:t>
+      </w:r>
+    </w:p>
+    <w:p>
+      <w:pPr>
+        <w:pStyle w:val="ListParagraph"/>
+        <w:keepNext/>
+        <w:numPr>
+          <w:ilvl w:val="0"/>
+          <w:numId w:val="2"/>
+        </w:numPr>
+        <w:spacing w:after="0" w:before="120"/>
+      </w:pPr>
+      <w:r>
+        <w:rPr>
+          <w:b/>
+          <w:bCs/>
+        </w:rPr>
+        <w:t xml:space="preserve">What did your mother think about you choosing engineering?</w:t>
+      </w:r>
+    </w:p>
+    <w:p>
+      <w:pPr>
+        <w:spacing w:after="120"/>
+        <w:ind w:left="440"/>
+      </w:pPr>
+    </w:p>
+    <w:p>
+      <w:pPr>
+        <w:pStyle w:val="ListParagraph"/>
+        <w:keepNext/>
+        <w:numPr>
+          <w:ilvl w:val="0"/>
+          <w:numId w:val="2"/>
+        </w:numPr>
+        <w:spacing w:after="0" w:before="120"/>
+      </w:pPr>
+      <w:r>
+        <w:rPr>
+          <w:b/>
+          <w:bCs/>
+        </w:rPr>
+        <w:t xml:space="preserve">What did your parents expect you to become?</w:t>
+      </w:r>
+    </w:p>
+    <w:p>
+      <w:pPr>
+        <w:spacing w:after="120"/>
+        <w:ind w:left="440"/>
+      </w:pPr>
+    </w:p>
+    <w:p>
+      <w:pPr>
+        <w:pStyle w:val="ListParagraph"/>
+        <w:keepNext/>
+        <w:numPr>
+          <w:ilvl w:val="0"/>
+          <w:numId w:val="2"/>
+        </w:numPr>
+        <w:spacing w:after="0" w:before="120"/>
+      </w:pPr>
+      <w:r>
+        <w:rPr>
+          <w:b/>
+          <w:bCs/>
+        </w:rPr>
+        <w:t xml:space="preserve">Why did you choose Computer Science?</w:t>
+      </w:r>
+    </w:p>
+    <w:p>
+      <w:pPr>
+        <w:spacing w:after="120"/>
+        <w:ind w:left="440"/>
+      </w:pPr>
+    </w:p>
+    <w:p>
+      <w:pPr>
+        <w:pStyle w:val="ListParagraph"/>
+        <w:keepNext/>
+        <w:numPr>
+          <w:ilvl w:val="0"/>
+          <w:numId w:val="2"/>
+        </w:numPr>
+        <w:spacing w:after="0" w:before="120"/>
+      </w:pPr>
+      <w:r>
+        <w:rPr>
+          <w:b/>
+          <w:bCs/>
+        </w:rPr>
+        <w:t xml:space="preserve">Why software development?</w:t>
+      </w:r>
+    </w:p>
+    <w:p>
+      <w:pPr>
+        <w:spacing w:after="120"/>
+        <w:ind w:left="440"/>
+      </w:pPr>
+    </w:p>
+    <w:p>
+      <w:pPr>
+        <w:pStyle w:val="ListParagraph"/>
+        <w:keepNext/>
+        <w:numPr>
+          <w:ilvl w:val="0"/>
+          <w:numId w:val="2"/>
+        </w:numPr>
+        <w:spacing w:after="0" w:before="120"/>
+      </w:pPr>
+      <w:r>
+        <w:rPr>
+          <w:b/>
+          <w:bCs/>
+        </w:rPr>
+        <w:t xml:space="preserve">How is your profession different from your mother's?</w:t>
+      </w:r>
+    </w:p>
+    <w:p>
+      <w:pPr>
+        <w:spacing w:after="120"/>
+        <w:ind w:left="440"/>
+      </w:pPr>
+    </w:p>
+    <w:p>
+      <w:pPr>
+        <w:pStyle w:val="ListParagraph"/>
+        <w:keepNext/>
+        <w:numPr>
+          <w:ilvl w:val="0"/>
+          <w:numId w:val="2"/>
+        </w:numPr>
+        <w:spacing w:after="0" w:before="120"/>
+      </w:pPr>
+      <w:r>
+        <w:rPr>
+          <w:b/>
+          <w:bCs/>
+        </w:rPr>
+        <w:t xml:space="preserve">What skills are common to teaching and software development?</w:t>
+      </w:r>
+    </w:p>
+    <w:p>
+      <w:pPr>
+        <w:spacing w:after="120"/>
+        <w:ind w:left="440"/>
+      </w:pPr>
+    </w:p>
+    <w:p>
+      <w:pPr>
+        <w:pStyle w:val="Heading1"/>
+      </w:pPr>
+      <w:r>
+        <w:t xml:space="preserve">PIQ 9 – Teaching and Leadership</w:t>
+      </w:r>
+    </w:p>
+    <w:p>
+      <w:pPr>
+        <w:pStyle w:val="ListParagraph"/>
+        <w:keepNext/>
+        <w:numPr>
+          <w:ilvl w:val="0"/>
+          <w:numId w:val="2"/>
+        </w:numPr>
+        <w:spacing w:after="0" w:before="120"/>
+      </w:pPr>
+      <w:r>
+        <w:rPr>
+          <w:b/>
+          <w:bCs/>
+        </w:rPr>
+        <w:t xml:space="preserve">What is the difference between a teacher and a leader?</w:t>
+      </w:r>
+    </w:p>
+    <w:p>
+      <w:pPr>
+        <w:spacing w:after="120"/>
+        <w:ind w:left="440"/>
+      </w:pPr>
+    </w:p>
+    <w:p>
+      <w:pPr>
+        <w:pStyle w:val="ListParagraph"/>
+        <w:keepNext/>
+        <w:numPr>
+          <w:ilvl w:val="0"/>
+          <w:numId w:val="2"/>
+        </w:numPr>
+        <w:spacing w:after="0" w:before="120"/>
+      </w:pPr>
+      <w:r>
+        <w:rPr>
+          <w:b/>
+          <w:bCs/>
+        </w:rPr>
+        <w:t xml:space="preserve">Can a teacher be a leader?</w:t>
+      </w:r>
+    </w:p>
+    <w:p>
+      <w:pPr>
+        <w:spacing w:after="120"/>
+        <w:ind w:left="440"/>
+      </w:pPr>
+    </w:p>
+    <w:p>
+      <w:pPr>
+        <w:pStyle w:val="ListParagraph"/>
+        <w:keepNext/>
+        <w:numPr>
+          <w:ilvl w:val="0"/>
+          <w:numId w:val="2"/>
+        </w:numPr>
+        <w:spacing w:after="0" w:before="120"/>
+      </w:pPr>
+      <w:r>
+        <w:rPr>
+          <w:b/>
+          <w:bCs/>
+        </w:rPr>
+        <w:t xml:space="preserve">What makes people follow someone?</w:t>
+      </w:r>
+    </w:p>
+    <w:p>
+      <w:pPr>
+        <w:spacing w:after="120"/>
+        <w:ind w:left="440"/>
+      </w:pPr>
+    </w:p>
+    <w:p>
+      <w:pPr>
+        <w:pStyle w:val="ListParagraph"/>
+        <w:keepNext/>
+        <w:numPr>
+          <w:ilvl w:val="0"/>
+          <w:numId w:val="2"/>
+        </w:numPr>
+        <w:spacing w:after="0" w:before="120"/>
+      </w:pPr>
+      <w:r>
+        <w:rPr>
+          <w:b/>
+          <w:bCs/>
+        </w:rPr>
+        <w:t xml:space="preserve">How would you motivate a team member who is underperforming?</w:t>
+      </w:r>
+    </w:p>
+    <w:p>
+      <w:pPr>
+        <w:spacing w:after="120"/>
+        <w:ind w:left="440"/>
+      </w:pPr>
+    </w:p>
+    <w:p>
+      <w:pPr>
+        <w:pStyle w:val="ListParagraph"/>
+        <w:keepNext/>
+        <w:numPr>
+          <w:ilvl w:val="0"/>
+          <w:numId w:val="2"/>
+        </w:numPr>
+        <w:spacing w:after="0" w:before="120"/>
+      </w:pPr>
+      <w:r>
+        <w:rPr>
+          <w:b/>
+          <w:bCs/>
+        </w:rPr>
+        <w:t xml:space="preserve">How would you deal with someone who refuses to follow instructions?</w:t>
+      </w:r>
+    </w:p>
+    <w:p>
+      <w:pPr>
+        <w:spacing w:after="120"/>
+        <w:ind w:left="440"/>
+      </w:pPr>
+    </w:p>
+    <w:p>
+      <w:pPr>
+        <w:pStyle w:val="Heading1"/>
+      </w:pPr>
+      <w:r>
+        <w:t xml:space="preserve">PIQ 9 – Mother: Personal</w:t>
+      </w:r>
+    </w:p>
+    <w:p>
+      <w:pPr>
+        <w:pStyle w:val="ListParagraph"/>
+        <w:keepNext/>
+        <w:numPr>
+          <w:ilvl w:val="0"/>
+          <w:numId w:val="2"/>
+        </w:numPr>
+        <w:spacing w:after="0" w:before="120"/>
+      </w:pPr>
+      <w:r>
+        <w:rPr>
+          <w:b/>
+          <w:bCs/>
+        </w:rPr>
+        <w:t xml:space="preserve">What does your mother do on weekends?</w:t>
+      </w:r>
+    </w:p>
+    <w:p>
+      <w:pPr>
+        <w:spacing w:after="120"/>
+        <w:ind w:left="440"/>
+      </w:pPr>
+    </w:p>
+    <w:p>
+      <w:pPr>
+        <w:pStyle w:val="ListParagraph"/>
+        <w:keepNext/>
+        <w:numPr>
+          <w:ilvl w:val="0"/>
+          <w:numId w:val="2"/>
+        </w:numPr>
+        <w:spacing w:after="0" w:before="120"/>
+      </w:pPr>
+      <w:r>
+        <w:rPr>
+          <w:b/>
+          <w:bCs/>
+        </w:rPr>
+        <w:t xml:space="preserve">Tell me about a difficult situation she handled.</w:t>
+      </w:r>
+    </w:p>
+    <w:p>
+      <w:pPr>
+        <w:spacing w:after="120"/>
+        <w:ind w:left="440"/>
+      </w:pPr>
+    </w:p>
+    <w:p>
+      <w:pPr>
+        <w:pStyle w:val="ListParagraph"/>
+        <w:keepNext/>
+        <w:numPr>
+          <w:ilvl w:val="0"/>
+          <w:numId w:val="2"/>
+        </w:numPr>
+        <w:spacing w:after="0" w:before="120"/>
+      </w:pPr>
+      <w:r>
+        <w:rPr>
+          <w:b/>
+          <w:bCs/>
+        </w:rPr>
+        <w:t xml:space="preserve">Give an example of your mother's hard work.</w:t>
       </w:r>
     </w:p>
     <w:p>

</xml_diff>

<commit_message>
Add PIQ 10 (Elder Brother) questions to SSB question sheet
Co-Authored-By: Claude Opus 5.5 <noreply@anthropic.com>
Claude-Session: https://claude.ai/code/session_01TypcejD48cCyAqfjtUUit5
</commit_message>
<xml_diff>
--- a/SSB_Question_Sheet.docx
+++ b/SSB_Question_Sheet.docx
@@ -13628,6 +13628,2174 @@
           <w:bCs/>
         </w:rPr>
         <w:t xml:space="preserve">Give an example of your mother's hard work.</w:t>
+      </w:r>
+    </w:p>
+    <w:p>
+      <w:pPr>
+        <w:spacing w:after="120"/>
+        <w:ind w:left="440"/>
+      </w:pPr>
+    </w:p>
+    <w:p>
+      <w:pPr>
+        <w:pStyle w:val="Heading1"/>
+      </w:pPr>
+      <w:r>
+        <w:t xml:space="preserve">PIQ 10 – Elder Brother</w:t>
+      </w:r>
+    </w:p>
+    <w:p>
+      <w:pPr>
+        <w:pStyle w:val="ListParagraph"/>
+        <w:keepNext/>
+        <w:numPr>
+          <w:ilvl w:val="0"/>
+          <w:numId w:val="2"/>
+        </w:numPr>
+        <w:spacing w:after="0" w:before="120"/>
+      </w:pPr>
+      <w:r>
+        <w:rPr>
+          <w:b/>
+          <w:bCs/>
+        </w:rPr>
+        <w:t xml:space="preserve">What is your elder brother's name?</w:t>
+      </w:r>
+    </w:p>
+    <w:p>
+      <w:pPr>
+        <w:spacing w:after="120"/>
+        <w:ind w:left="440"/>
+      </w:pPr>
+    </w:p>
+    <w:p>
+      <w:pPr>
+        <w:pStyle w:val="ListParagraph"/>
+        <w:keepNext/>
+        <w:numPr>
+          <w:ilvl w:val="0"/>
+          <w:numId w:val="2"/>
+        </w:numPr>
+        <w:spacing w:after="0" w:before="120"/>
+      </w:pPr>
+      <w:r>
+        <w:rPr>
+          <w:b/>
+          <w:bCs/>
+        </w:rPr>
+        <w:t xml:space="preserve">How old is he?</w:t>
+      </w:r>
+    </w:p>
+    <w:p>
+      <w:pPr>
+        <w:spacing w:after="120"/>
+        <w:ind w:left="440"/>
+      </w:pPr>
+    </w:p>
+    <w:p>
+      <w:pPr>
+        <w:pStyle w:val="ListParagraph"/>
+        <w:keepNext/>
+        <w:numPr>
+          <w:ilvl w:val="0"/>
+          <w:numId w:val="2"/>
+        </w:numPr>
+        <w:spacing w:after="0" w:before="120"/>
+      </w:pPr>
+      <w:r>
+        <w:rPr>
+          <w:b/>
+          <w:bCs/>
+        </w:rPr>
+        <w:t xml:space="preserve">What is his educational qualification?</w:t>
+      </w:r>
+    </w:p>
+    <w:p>
+      <w:pPr>
+        <w:spacing w:after="120"/>
+        <w:ind w:left="440"/>
+      </w:pPr>
+    </w:p>
+    <w:p>
+      <w:pPr>
+        <w:pStyle w:val="ListParagraph"/>
+        <w:keepNext/>
+        <w:numPr>
+          <w:ilvl w:val="0"/>
+          <w:numId w:val="2"/>
+        </w:numPr>
+        <w:spacing w:after="0" w:before="120"/>
+      </w:pPr>
+      <w:r>
+        <w:rPr>
+          <w:b/>
+          <w:bCs/>
+        </w:rPr>
+        <w:t xml:space="preserve">Why did he choose Geography?</w:t>
+      </w:r>
+    </w:p>
+    <w:p>
+      <w:pPr>
+        <w:spacing w:after="120"/>
+        <w:ind w:left="440"/>
+      </w:pPr>
+    </w:p>
+    <w:p>
+      <w:pPr>
+        <w:pStyle w:val="ListParagraph"/>
+        <w:keepNext/>
+        <w:numPr>
+          <w:ilvl w:val="0"/>
+          <w:numId w:val="2"/>
+        </w:numPr>
+        <w:spacing w:after="0" w:before="120"/>
+      </w:pPr>
+      <w:r>
+        <w:rPr>
+          <w:b/>
+          <w:bCs/>
+        </w:rPr>
+        <w:t xml:space="preserve">Why did he study Geography but move into automobile sales?</w:t>
+      </w:r>
+    </w:p>
+    <w:p>
+      <w:pPr>
+        <w:spacing w:after="120"/>
+        <w:ind w:left="440"/>
+      </w:pPr>
+    </w:p>
+    <w:p>
+      <w:pPr>
+        <w:pStyle w:val="ListParagraph"/>
+        <w:keepNext/>
+        <w:numPr>
+          <w:ilvl w:val="0"/>
+          <w:numId w:val="2"/>
+        </w:numPr>
+        <w:spacing w:after="0" w:before="120"/>
+      </w:pPr>
+      <w:r>
+        <w:rPr>
+          <w:b/>
+          <w:bCs/>
+        </w:rPr>
+        <w:t xml:space="preserve">What is his designation?</w:t>
+      </w:r>
+    </w:p>
+    <w:p>
+      <w:pPr>
+        <w:spacing w:after="120"/>
+        <w:ind w:left="440"/>
+      </w:pPr>
+    </w:p>
+    <w:p>
+      <w:pPr>
+        <w:pStyle w:val="ListParagraph"/>
+        <w:keepNext/>
+        <w:numPr>
+          <w:ilvl w:val="0"/>
+          <w:numId w:val="2"/>
+        </w:numPr>
+        <w:spacing w:after="0" w:before="120"/>
+      </w:pPr>
+      <w:r>
+        <w:rPr>
+          <w:b/>
+          <w:bCs/>
+        </w:rPr>
+        <w:t xml:space="preserve">Where does he work?</w:t>
+      </w:r>
+    </w:p>
+    <w:p>
+      <w:pPr>
+        <w:spacing w:after="120"/>
+        <w:ind w:left="440"/>
+      </w:pPr>
+    </w:p>
+    <w:p>
+      <w:pPr>
+        <w:pStyle w:val="ListParagraph"/>
+        <w:keepNext/>
+        <w:numPr>
+          <w:ilvl w:val="0"/>
+          <w:numId w:val="2"/>
+        </w:numPr>
+        <w:spacing w:after="0" w:before="120"/>
+      </w:pPr>
+      <w:r>
+        <w:rPr>
+          <w:b/>
+          <w:bCs/>
+        </w:rPr>
+        <w:t xml:space="preserve">How long has he been working there?</w:t>
+      </w:r>
+    </w:p>
+    <w:p>
+      <w:pPr>
+        <w:spacing w:after="120"/>
+        <w:ind w:left="440"/>
+      </w:pPr>
+    </w:p>
+    <w:p>
+      <w:pPr>
+        <w:pStyle w:val="ListParagraph"/>
+        <w:keepNext/>
+        <w:numPr>
+          <w:ilvl w:val="0"/>
+          <w:numId w:val="2"/>
+        </w:numPr>
+        <w:spacing w:after="0" w:before="120"/>
+      </w:pPr>
+      <w:r>
+        <w:rPr>
+          <w:b/>
+          <w:bCs/>
+        </w:rPr>
+        <w:t xml:space="preserve">What are his responsibilities as a Sales Manager?</w:t>
+      </w:r>
+    </w:p>
+    <w:p>
+      <w:pPr>
+        <w:spacing w:after="120"/>
+        <w:ind w:left="440"/>
+      </w:pPr>
+    </w:p>
+    <w:p>
+      <w:pPr>
+        <w:pStyle w:val="ListParagraph"/>
+        <w:keepNext/>
+        <w:numPr>
+          <w:ilvl w:val="0"/>
+          <w:numId w:val="2"/>
+        </w:numPr>
+        <w:spacing w:after="0" w:before="120"/>
+      </w:pPr>
+      <w:r>
+        <w:rPr>
+          <w:b/>
+          <w:bCs/>
+        </w:rPr>
+        <w:t xml:space="preserve">What is his salary?</w:t>
+      </w:r>
+    </w:p>
+    <w:p>
+      <w:pPr>
+        <w:spacing w:after="120"/>
+        <w:ind w:left="440"/>
+      </w:pPr>
+    </w:p>
+    <w:p>
+      <w:pPr>
+        <w:pStyle w:val="ListParagraph"/>
+        <w:keepNext/>
+        <w:numPr>
+          <w:ilvl w:val="0"/>
+          <w:numId w:val="2"/>
+        </w:numPr>
+        <w:spacing w:after="0" w:before="120"/>
+      </w:pPr>
+      <w:r>
+        <w:rPr>
+          <w:b/>
+          <w:bCs/>
+        </w:rPr>
+        <w:t xml:space="preserve">What are his career aspirations?</w:t>
+      </w:r>
+    </w:p>
+    <w:p>
+      <w:pPr>
+        <w:spacing w:after="120"/>
+        <w:ind w:left="440"/>
+      </w:pPr>
+    </w:p>
+    <w:p>
+      <w:pPr>
+        <w:pStyle w:val="Heading1"/>
+      </w:pPr>
+      <w:r>
+        <w:t xml:space="preserve">PIQ 10 – Brother: Geography</w:t>
+      </w:r>
+    </w:p>
+    <w:p>
+      <w:pPr>
+        <w:pStyle w:val="ListParagraph"/>
+        <w:keepNext/>
+        <w:numPr>
+          <w:ilvl w:val="0"/>
+          <w:numId w:val="2"/>
+        </w:numPr>
+        <w:spacing w:after="0" w:before="120"/>
+      </w:pPr>
+      <w:r>
+        <w:rPr>
+          <w:b/>
+          <w:bCs/>
+        </w:rPr>
+        <w:t xml:space="preserve">What is Geography?</w:t>
+      </w:r>
+    </w:p>
+    <w:p>
+      <w:pPr>
+        <w:spacing w:after="120"/>
+        <w:ind w:left="440"/>
+      </w:pPr>
+    </w:p>
+    <w:p>
+      <w:pPr>
+        <w:pStyle w:val="ListParagraph"/>
+        <w:keepNext/>
+        <w:numPr>
+          <w:ilvl w:val="0"/>
+          <w:numId w:val="2"/>
+        </w:numPr>
+        <w:spacing w:after="0" w:before="120"/>
+      </w:pPr>
+      <w:r>
+        <w:rPr>
+          <w:b/>
+          <w:bCs/>
+        </w:rPr>
+        <w:t xml:space="preserve">What are the major branches of Geography?</w:t>
+      </w:r>
+    </w:p>
+    <w:p>
+      <w:pPr>
+        <w:spacing w:after="120"/>
+        <w:ind w:left="440"/>
+      </w:pPr>
+    </w:p>
+    <w:p>
+      <w:pPr>
+        <w:pStyle w:val="ListParagraph"/>
+        <w:keepNext/>
+        <w:numPr>
+          <w:ilvl w:val="0"/>
+          <w:numId w:val="2"/>
+        </w:numPr>
+        <w:spacing w:after="0" w:before="120"/>
+      </w:pPr>
+      <w:r>
+        <w:rPr>
+          <w:b/>
+          <w:bCs/>
+        </w:rPr>
+        <w:t xml:space="preserve">What is the difference between physical and human geography?</w:t>
+      </w:r>
+    </w:p>
+    <w:p>
+      <w:pPr>
+        <w:spacing w:after="120"/>
+        <w:ind w:left="440"/>
+      </w:pPr>
+    </w:p>
+    <w:p>
+      <w:pPr>
+        <w:pStyle w:val="ListParagraph"/>
+        <w:keepNext/>
+        <w:numPr>
+          <w:ilvl w:val="0"/>
+          <w:numId w:val="2"/>
+        </w:numPr>
+        <w:spacing w:after="0" w:before="120"/>
+      </w:pPr>
+      <w:r>
+        <w:rPr>
+          <w:b/>
+          <w:bCs/>
+        </w:rPr>
+        <w:t xml:space="preserve">What is economic geography?</w:t>
+      </w:r>
+    </w:p>
+    <w:p>
+      <w:pPr>
+        <w:spacing w:after="120"/>
+        <w:ind w:left="440"/>
+      </w:pPr>
+    </w:p>
+    <w:p>
+      <w:pPr>
+        <w:pStyle w:val="ListParagraph"/>
+        <w:keepNext/>
+        <w:numPr>
+          <w:ilvl w:val="0"/>
+          <w:numId w:val="2"/>
+        </w:numPr>
+        <w:spacing w:after="0" w:before="120"/>
+      </w:pPr>
+      <w:r>
+        <w:rPr>
+          <w:b/>
+          <w:bCs/>
+        </w:rPr>
+        <w:t xml:space="preserve">What is population geography?</w:t>
+      </w:r>
+    </w:p>
+    <w:p>
+      <w:pPr>
+        <w:spacing w:after="120"/>
+        <w:ind w:left="440"/>
+      </w:pPr>
+    </w:p>
+    <w:p>
+      <w:pPr>
+        <w:pStyle w:val="ListParagraph"/>
+        <w:keepNext/>
+        <w:numPr>
+          <w:ilvl w:val="0"/>
+          <w:numId w:val="2"/>
+        </w:numPr>
+        <w:spacing w:after="0" w:before="120"/>
+      </w:pPr>
+      <w:r>
+        <w:rPr>
+          <w:b/>
+          <w:bCs/>
+        </w:rPr>
+        <w:t xml:space="preserve">What is urban geography?</w:t>
+      </w:r>
+    </w:p>
+    <w:p>
+      <w:pPr>
+        <w:spacing w:after="120"/>
+        <w:ind w:left="440"/>
+      </w:pPr>
+    </w:p>
+    <w:p>
+      <w:pPr>
+        <w:pStyle w:val="ListParagraph"/>
+        <w:keepNext/>
+        <w:numPr>
+          <w:ilvl w:val="0"/>
+          <w:numId w:val="2"/>
+        </w:numPr>
+        <w:spacing w:after="0" w:before="120"/>
+      </w:pPr>
+      <w:r>
+        <w:rPr>
+          <w:b/>
+          <w:bCs/>
+        </w:rPr>
+        <w:t xml:space="preserve">What is a watershed?</w:t>
+      </w:r>
+    </w:p>
+    <w:p>
+      <w:pPr>
+        <w:spacing w:after="120"/>
+        <w:ind w:left="440"/>
+      </w:pPr>
+    </w:p>
+    <w:p>
+      <w:pPr>
+        <w:pStyle w:val="ListParagraph"/>
+        <w:keepNext/>
+        <w:numPr>
+          <w:ilvl w:val="0"/>
+          <w:numId w:val="2"/>
+        </w:numPr>
+        <w:spacing w:after="0" w:before="120"/>
+      </w:pPr>
+      <w:r>
+        <w:rPr>
+          <w:b/>
+          <w:bCs/>
+        </w:rPr>
+        <w:t xml:space="preserve">What is a river basin?</w:t>
+      </w:r>
+    </w:p>
+    <w:p>
+      <w:pPr>
+        <w:spacing w:after="120"/>
+        <w:ind w:left="440"/>
+      </w:pPr>
+    </w:p>
+    <w:p>
+      <w:pPr>
+        <w:pStyle w:val="ListParagraph"/>
+        <w:keepNext/>
+        <w:numPr>
+          <w:ilvl w:val="0"/>
+          <w:numId w:val="2"/>
+        </w:numPr>
+        <w:spacing w:after="0" w:before="120"/>
+      </w:pPr>
+      <w:r>
+        <w:rPr>
+          <w:b/>
+          <w:bCs/>
+        </w:rPr>
+        <w:t xml:space="preserve">What causes the monsoon?</w:t>
+      </w:r>
+    </w:p>
+    <w:p>
+      <w:pPr>
+        <w:spacing w:after="120"/>
+        <w:ind w:left="440"/>
+      </w:pPr>
+    </w:p>
+    <w:p>
+      <w:pPr>
+        <w:pStyle w:val="ListParagraph"/>
+        <w:keepNext/>
+        <w:numPr>
+          <w:ilvl w:val="0"/>
+          <w:numId w:val="2"/>
+        </w:numPr>
+        <w:spacing w:after="0" w:before="120"/>
+      </w:pPr>
+      <w:r>
+        <w:rPr>
+          <w:b/>
+          <w:bCs/>
+        </w:rPr>
+        <w:t xml:space="preserve">Why is India dependent on the monsoon?</w:t>
+      </w:r>
+    </w:p>
+    <w:p>
+      <w:pPr>
+        <w:spacing w:after="120"/>
+        <w:ind w:left="440"/>
+      </w:pPr>
+    </w:p>
+    <w:p>
+      <w:pPr>
+        <w:pStyle w:val="ListParagraph"/>
+        <w:keepNext/>
+        <w:numPr>
+          <w:ilvl w:val="0"/>
+          <w:numId w:val="2"/>
+        </w:numPr>
+        <w:spacing w:after="0" w:before="120"/>
+      </w:pPr>
+      <w:r>
+        <w:rPr>
+          <w:b/>
+          <w:bCs/>
+        </w:rPr>
+        <w:t xml:space="preserve">What factors influence climate?</w:t>
+      </w:r>
+    </w:p>
+    <w:p>
+      <w:pPr>
+        <w:spacing w:after="120"/>
+        <w:ind w:left="440"/>
+      </w:pPr>
+    </w:p>
+    <w:p>
+      <w:pPr>
+        <w:pStyle w:val="ListParagraph"/>
+        <w:keepNext/>
+        <w:numPr>
+          <w:ilvl w:val="0"/>
+          <w:numId w:val="2"/>
+        </w:numPr>
+        <w:spacing w:after="0" w:before="120"/>
+      </w:pPr>
+      <w:r>
+        <w:rPr>
+          <w:b/>
+          <w:bCs/>
+        </w:rPr>
+        <w:t xml:space="preserve">What is the difference between weather and climate?</w:t>
+      </w:r>
+    </w:p>
+    <w:p>
+      <w:pPr>
+        <w:spacing w:after="120"/>
+        <w:ind w:left="440"/>
+      </w:pPr>
+    </w:p>
+    <w:p>
+      <w:pPr>
+        <w:pStyle w:val="ListParagraph"/>
+        <w:keepNext/>
+        <w:numPr>
+          <w:ilvl w:val="0"/>
+          <w:numId w:val="2"/>
+        </w:numPr>
+        <w:spacing w:after="0" w:before="120"/>
+      </w:pPr>
+      <w:r>
+        <w:rPr>
+          <w:b/>
+          <w:bCs/>
+        </w:rPr>
+        <w:t xml:space="preserve">What is urbanisation?</w:t>
+      </w:r>
+    </w:p>
+    <w:p>
+      <w:pPr>
+        <w:spacing w:after="120"/>
+        <w:ind w:left="440"/>
+      </w:pPr>
+    </w:p>
+    <w:p>
+      <w:pPr>
+        <w:pStyle w:val="ListParagraph"/>
+        <w:keepNext/>
+        <w:numPr>
+          <w:ilvl w:val="0"/>
+          <w:numId w:val="2"/>
+        </w:numPr>
+        <w:spacing w:after="0" w:before="120"/>
+      </w:pPr>
+      <w:r>
+        <w:rPr>
+          <w:b/>
+          <w:bCs/>
+        </w:rPr>
+        <w:t xml:space="preserve">What causes migration?</w:t>
+      </w:r>
+    </w:p>
+    <w:p>
+      <w:pPr>
+        <w:spacing w:after="120"/>
+        <w:ind w:left="440"/>
+      </w:pPr>
+    </w:p>
+    <w:p>
+      <w:pPr>
+        <w:pStyle w:val="Heading1"/>
+      </w:pPr>
+      <w:r>
+        <w:t xml:space="preserve">PIQ 10 – Brother: NEXA</w:t>
+      </w:r>
+    </w:p>
+    <w:p>
+      <w:pPr>
+        <w:pStyle w:val="ListParagraph"/>
+        <w:keepNext/>
+        <w:numPr>
+          <w:ilvl w:val="0"/>
+          <w:numId w:val="2"/>
+        </w:numPr>
+        <w:spacing w:after="0" w:before="120"/>
+      </w:pPr>
+      <w:r>
+        <w:rPr>
+          <w:b/>
+          <w:bCs/>
+        </w:rPr>
+        <w:t xml:space="preserve">What is NEXA?</w:t>
+      </w:r>
+    </w:p>
+    <w:p>
+      <w:pPr>
+        <w:spacing w:after="120"/>
+        <w:ind w:left="440"/>
+      </w:pPr>
+    </w:p>
+    <w:p>
+      <w:pPr>
+        <w:pStyle w:val="ListParagraph"/>
+        <w:keepNext/>
+        <w:numPr>
+          <w:ilvl w:val="0"/>
+          <w:numId w:val="2"/>
+        </w:numPr>
+        <w:spacing w:after="0" w:before="120"/>
+      </w:pPr>
+      <w:r>
+        <w:rPr>
+          <w:b/>
+          <w:bCs/>
+        </w:rPr>
+        <w:t xml:space="preserve">Which company runs NEXA, and how is it related to Maruti Suzuki?</w:t>
+      </w:r>
+    </w:p>
+    <w:p>
+      <w:pPr>
+        <w:spacing w:after="120"/>
+        <w:ind w:left="440"/>
+      </w:pPr>
+    </w:p>
+    <w:p>
+      <w:pPr>
+        <w:pStyle w:val="ListParagraph"/>
+        <w:keepNext/>
+        <w:numPr>
+          <w:ilvl w:val="0"/>
+          <w:numId w:val="2"/>
+        </w:numPr>
+        <w:spacing w:after="0" w:before="120"/>
+      </w:pPr>
+      <w:r>
+        <w:rPr>
+          <w:b/>
+          <w:bCs/>
+        </w:rPr>
+        <w:t xml:space="preserve">Why was NEXA created?</w:t>
+      </w:r>
+    </w:p>
+    <w:p>
+      <w:pPr>
+        <w:spacing w:after="120"/>
+        <w:ind w:left="440"/>
+      </w:pPr>
+    </w:p>
+    <w:p>
+      <w:pPr>
+        <w:pStyle w:val="ListParagraph"/>
+        <w:keepNext/>
+        <w:numPr>
+          <w:ilvl w:val="0"/>
+          <w:numId w:val="2"/>
+        </w:numPr>
+        <w:spacing w:after="0" w:before="120"/>
+      </w:pPr>
+      <w:r>
+        <w:rPr>
+          <w:b/>
+          <w:bCs/>
+        </w:rPr>
+        <w:t xml:space="preserve">What is the difference between NEXA and Arena?</w:t>
+      </w:r>
+    </w:p>
+    <w:p>
+      <w:pPr>
+        <w:spacing w:after="120"/>
+        <w:ind w:left="440"/>
+      </w:pPr>
+    </w:p>
+    <w:p>
+      <w:pPr>
+        <w:pStyle w:val="ListParagraph"/>
+        <w:keepNext/>
+        <w:numPr>
+          <w:ilvl w:val="0"/>
+          <w:numId w:val="2"/>
+        </w:numPr>
+        <w:spacing w:after="0" w:before="120"/>
+      </w:pPr>
+      <w:r>
+        <w:rPr>
+          <w:b/>
+          <w:bCs/>
+        </w:rPr>
+        <w:t xml:space="preserve">What type of customers does NEXA target?</w:t>
+      </w:r>
+    </w:p>
+    <w:p>
+      <w:pPr>
+        <w:spacing w:after="120"/>
+        <w:ind w:left="440"/>
+      </w:pPr>
+    </w:p>
+    <w:p>
+      <w:pPr>
+        <w:pStyle w:val="ListParagraph"/>
+        <w:keepNext/>
+        <w:numPr>
+          <w:ilvl w:val="0"/>
+          <w:numId w:val="2"/>
+        </w:numPr>
+        <w:spacing w:after="0" w:before="120"/>
+      </w:pPr>
+      <w:r>
+        <w:rPr>
+          <w:b/>
+          <w:bCs/>
+        </w:rPr>
+        <w:t xml:space="preserve">Name some cars sold through NEXA.</w:t>
+      </w:r>
+    </w:p>
+    <w:p>
+      <w:pPr>
+        <w:spacing w:after="120"/>
+        <w:ind w:left="440"/>
+      </w:pPr>
+    </w:p>
+    <w:p>
+      <w:pPr>
+        <w:pStyle w:val="ListParagraph"/>
+        <w:keepNext/>
+        <w:numPr>
+          <w:ilvl w:val="0"/>
+          <w:numId w:val="2"/>
+        </w:numPr>
+        <w:spacing w:after="0" w:before="120"/>
+      </w:pPr>
+      <w:r>
+        <w:rPr>
+          <w:b/>
+          <w:bCs/>
+        </w:rPr>
+        <w:t xml:space="preserve">What is the role of a dealership?</w:t>
+      </w:r>
+    </w:p>
+    <w:p>
+      <w:pPr>
+        <w:spacing w:after="120"/>
+        <w:ind w:left="440"/>
+      </w:pPr>
+    </w:p>
+    <w:p>
+      <w:pPr>
+        <w:pStyle w:val="ListParagraph"/>
+        <w:keepNext/>
+        <w:numPr>
+          <w:ilvl w:val="0"/>
+          <w:numId w:val="2"/>
+        </w:numPr>
+        <w:spacing w:after="0" w:before="120"/>
+      </w:pPr>
+      <w:r>
+        <w:rPr>
+          <w:b/>
+          <w:bCs/>
+        </w:rPr>
+        <w:t xml:space="preserve">What is the difference between a manufacturer and a dealer?</w:t>
+      </w:r>
+    </w:p>
+    <w:p>
+      <w:pPr>
+        <w:spacing w:after="120"/>
+        <w:ind w:left="440"/>
+      </w:pPr>
+    </w:p>
+    <w:p>
+      <w:pPr>
+        <w:pStyle w:val="Heading1"/>
+      </w:pPr>
+      <w:r>
+        <w:t xml:space="preserve">PIQ 10 – Brother: Automobiles</w:t>
+      </w:r>
+    </w:p>
+    <w:p>
+      <w:pPr>
+        <w:pStyle w:val="ListParagraph"/>
+        <w:keepNext/>
+        <w:numPr>
+          <w:ilvl w:val="0"/>
+          <w:numId w:val="2"/>
+        </w:numPr>
+        <w:spacing w:after="0" w:before="120"/>
+      </w:pPr>
+      <w:r>
+        <w:rPr>
+          <w:b/>
+          <w:bCs/>
+        </w:rPr>
+        <w:t xml:space="preserve">Which car brands compete with Maruti Suzuki?</w:t>
+      </w:r>
+    </w:p>
+    <w:p>
+      <w:pPr>
+        <w:spacing w:after="120"/>
+        <w:ind w:left="440"/>
+      </w:pPr>
+    </w:p>
+    <w:p>
+      <w:pPr>
+        <w:pStyle w:val="ListParagraph"/>
+        <w:keepNext/>
+        <w:numPr>
+          <w:ilvl w:val="0"/>
+          <w:numId w:val="2"/>
+        </w:numPr>
+        <w:spacing w:after="0" w:before="120"/>
+      </w:pPr>
+      <w:r>
+        <w:rPr>
+          <w:b/>
+          <w:bCs/>
+        </w:rPr>
+        <w:t xml:space="preserve">What factors influence a customer's decision to buy a car?</w:t>
+      </w:r>
+    </w:p>
+    <w:p>
+      <w:pPr>
+        <w:spacing w:after="120"/>
+        <w:ind w:left="440"/>
+      </w:pPr>
+    </w:p>
+    <w:p>
+      <w:pPr>
+        <w:pStyle w:val="ListParagraph"/>
+        <w:keepNext/>
+        <w:numPr>
+          <w:ilvl w:val="0"/>
+          <w:numId w:val="2"/>
+        </w:numPr>
+        <w:spacing w:after="0" w:before="120"/>
+      </w:pPr>
+      <w:r>
+        <w:rPr>
+          <w:b/>
+          <w:bCs/>
+        </w:rPr>
+        <w:t xml:space="preserve">EV, petrol or hybrid: which is better and why?</w:t>
+      </w:r>
+    </w:p>
+    <w:p>
+      <w:pPr>
+        <w:spacing w:after="120"/>
+        <w:ind w:left="440"/>
+      </w:pPr>
+    </w:p>
+    <w:p>
+      <w:pPr>
+        <w:pStyle w:val="ListParagraph"/>
+        <w:keepNext/>
+        <w:numPr>
+          <w:ilvl w:val="0"/>
+          <w:numId w:val="2"/>
+        </w:numPr>
+        <w:spacing w:after="0" w:before="120"/>
+      </w:pPr>
+      <w:r>
+        <w:rPr>
+          <w:b/>
+          <w:bCs/>
+        </w:rPr>
+        <w:t xml:space="preserve">What are the advantages and limitations of electric vehicles?</w:t>
+      </w:r>
+    </w:p>
+    <w:p>
+      <w:pPr>
+        <w:spacing w:after="120"/>
+        <w:ind w:left="440"/>
+      </w:pPr>
+    </w:p>
+    <w:p>
+      <w:pPr>
+        <w:pStyle w:val="ListParagraph"/>
+        <w:keepNext/>
+        <w:numPr>
+          <w:ilvl w:val="0"/>
+          <w:numId w:val="2"/>
+        </w:numPr>
+        <w:spacing w:after="0" w:before="120"/>
+      </w:pPr>
+      <w:r>
+        <w:rPr>
+          <w:b/>
+          <w:bCs/>
+        </w:rPr>
+        <w:t xml:space="preserve">What is an SUV?</w:t>
+      </w:r>
+    </w:p>
+    <w:p>
+      <w:pPr>
+        <w:spacing w:after="120"/>
+        <w:ind w:left="440"/>
+      </w:pPr>
+    </w:p>
+    <w:p>
+      <w:pPr>
+        <w:pStyle w:val="ListParagraph"/>
+        <w:keepNext/>
+        <w:numPr>
+          <w:ilvl w:val="0"/>
+          <w:numId w:val="2"/>
+        </w:numPr>
+        <w:spacing w:after="0" w:before="120"/>
+      </w:pPr>
+      <w:r>
+        <w:rPr>
+          <w:b/>
+          <w:bCs/>
+        </w:rPr>
+        <w:t xml:space="preserve">What is an MPV?</w:t>
+      </w:r>
+    </w:p>
+    <w:p>
+      <w:pPr>
+        <w:spacing w:after="120"/>
+        <w:ind w:left="440"/>
+      </w:pPr>
+    </w:p>
+    <w:p>
+      <w:pPr>
+        <w:pStyle w:val="ListParagraph"/>
+        <w:keepNext/>
+        <w:numPr>
+          <w:ilvl w:val="0"/>
+          <w:numId w:val="2"/>
+        </w:numPr>
+        <w:spacing w:after="0" w:before="120"/>
+      </w:pPr>
+      <w:r>
+        <w:rPr>
+          <w:b/>
+          <w:bCs/>
+        </w:rPr>
+        <w:t xml:space="preserve">What is an automatic transmission?</w:t>
+      </w:r>
+    </w:p>
+    <w:p>
+      <w:pPr>
+        <w:spacing w:after="120"/>
+        <w:ind w:left="440"/>
+      </w:pPr>
+    </w:p>
+    <w:p>
+      <w:pPr>
+        <w:pStyle w:val="ListParagraph"/>
+        <w:keepNext/>
+        <w:numPr>
+          <w:ilvl w:val="0"/>
+          <w:numId w:val="2"/>
+        </w:numPr>
+        <w:spacing w:after="0" w:before="120"/>
+      </w:pPr>
+      <w:r>
+        <w:rPr>
+          <w:b/>
+          <w:bCs/>
+        </w:rPr>
+        <w:t xml:space="preserve">What is ADAS?</w:t>
+      </w:r>
+    </w:p>
+    <w:p>
+      <w:pPr>
+        <w:spacing w:after="120"/>
+        <w:ind w:left="440"/>
+      </w:pPr>
+    </w:p>
+    <w:p>
+      <w:pPr>
+        <w:pStyle w:val="ListParagraph"/>
+        <w:keepNext/>
+        <w:numPr>
+          <w:ilvl w:val="0"/>
+          <w:numId w:val="2"/>
+        </w:numPr>
+        <w:spacing w:after="0" w:before="120"/>
+      </w:pPr>
+      <w:r>
+        <w:rPr>
+          <w:b/>
+          <w:bCs/>
+        </w:rPr>
+        <w:t xml:space="preserve">What factors affect car prices?</w:t>
+      </w:r>
+    </w:p>
+    <w:p>
+      <w:pPr>
+        <w:spacing w:after="120"/>
+        <w:ind w:left="440"/>
+      </w:pPr>
+    </w:p>
+    <w:p>
+      <w:pPr>
+        <w:pStyle w:val="Heading1"/>
+      </w:pPr>
+      <w:r>
+        <w:t xml:space="preserve">PIQ 10 – Brother: Sales</w:t>
+      </w:r>
+    </w:p>
+    <w:p>
+      <w:pPr>
+        <w:pStyle w:val="ListParagraph"/>
+        <w:keepNext/>
+        <w:numPr>
+          <w:ilvl w:val="0"/>
+          <w:numId w:val="2"/>
+        </w:numPr>
+        <w:spacing w:after="0" w:before="120"/>
+      </w:pPr>
+      <w:r>
+        <w:rPr>
+          <w:b/>
+          <w:bCs/>
+        </w:rPr>
+        <w:t xml:space="preserve">How does your brother generate sales?</w:t>
+      </w:r>
+    </w:p>
+    <w:p>
+      <w:pPr>
+        <w:spacing w:after="120"/>
+        <w:ind w:left="440"/>
+      </w:pPr>
+    </w:p>
+    <w:p>
+      <w:pPr>
+        <w:pStyle w:val="ListParagraph"/>
+        <w:keepNext/>
+        <w:numPr>
+          <w:ilvl w:val="0"/>
+          <w:numId w:val="2"/>
+        </w:numPr>
+        <w:spacing w:after="0" w:before="120"/>
+      </w:pPr>
+      <w:r>
+        <w:rPr>
+          <w:b/>
+          <w:bCs/>
+        </w:rPr>
+        <w:t xml:space="preserve">How does he manage his sales executives?</w:t>
+      </w:r>
+    </w:p>
+    <w:p>
+      <w:pPr>
+        <w:spacing w:after="120"/>
+        <w:ind w:left="440"/>
+      </w:pPr>
+    </w:p>
+    <w:p>
+      <w:pPr>
+        <w:pStyle w:val="ListParagraph"/>
+        <w:keepNext/>
+        <w:numPr>
+          <w:ilvl w:val="0"/>
+          <w:numId w:val="2"/>
+        </w:numPr>
+        <w:spacing w:after="0" w:before="120"/>
+      </w:pPr>
+      <w:r>
+        <w:rPr>
+          <w:b/>
+          <w:bCs/>
+        </w:rPr>
+        <w:t xml:space="preserve">What is a sales target, and how are targets assigned?</w:t>
+      </w:r>
+    </w:p>
+    <w:p>
+      <w:pPr>
+        <w:spacing w:after="120"/>
+        <w:ind w:left="440"/>
+      </w:pPr>
+    </w:p>
+    <w:p>
+      <w:pPr>
+        <w:pStyle w:val="ListParagraph"/>
+        <w:keepNext/>
+        <w:numPr>
+          <w:ilvl w:val="0"/>
+          <w:numId w:val="2"/>
+        </w:numPr>
+        <w:spacing w:after="0" w:before="120"/>
+      </w:pPr>
+      <w:r>
+        <w:rPr>
+          <w:b/>
+          <w:bCs/>
+        </w:rPr>
+        <w:t xml:space="preserve">What is a lead?</w:t>
+      </w:r>
+    </w:p>
+    <w:p>
+      <w:pPr>
+        <w:spacing w:after="120"/>
+        <w:ind w:left="440"/>
+      </w:pPr>
+    </w:p>
+    <w:p>
+      <w:pPr>
+        <w:pStyle w:val="ListParagraph"/>
+        <w:keepNext/>
+        <w:numPr>
+          <w:ilvl w:val="0"/>
+          <w:numId w:val="2"/>
+        </w:numPr>
+        <w:spacing w:after="0" w:before="120"/>
+      </w:pPr>
+      <w:r>
+        <w:rPr>
+          <w:b/>
+          <w:bCs/>
+        </w:rPr>
+        <w:t xml:space="preserve">What is conversion?</w:t>
+      </w:r>
+    </w:p>
+    <w:p>
+      <w:pPr>
+        <w:spacing w:after="120"/>
+        <w:ind w:left="440"/>
+      </w:pPr>
+    </w:p>
+    <w:p>
+      <w:pPr>
+        <w:pStyle w:val="ListParagraph"/>
+        <w:keepNext/>
+        <w:numPr>
+          <w:ilvl w:val="0"/>
+          <w:numId w:val="2"/>
+        </w:numPr>
+        <w:spacing w:after="0" w:before="120"/>
+      </w:pPr>
+      <w:r>
+        <w:rPr>
+          <w:b/>
+          <w:bCs/>
+        </w:rPr>
+        <w:t xml:space="preserve">What is a sales funnel?</w:t>
+      </w:r>
+    </w:p>
+    <w:p>
+      <w:pPr>
+        <w:spacing w:after="120"/>
+        <w:ind w:left="440"/>
+      </w:pPr>
+    </w:p>
+    <w:p>
+      <w:pPr>
+        <w:pStyle w:val="ListParagraph"/>
+        <w:keepNext/>
+        <w:numPr>
+          <w:ilvl w:val="0"/>
+          <w:numId w:val="2"/>
+        </w:numPr>
+        <w:spacing w:after="0" w:before="120"/>
+      </w:pPr>
+      <w:r>
+        <w:rPr>
+          <w:b/>
+          <w:bCs/>
+        </w:rPr>
+        <w:t xml:space="preserve">How does he handle a customer who refuses to buy?</w:t>
+      </w:r>
+    </w:p>
+    <w:p>
+      <w:pPr>
+        <w:spacing w:after="120"/>
+        <w:ind w:left="440"/>
+      </w:pPr>
+    </w:p>
+    <w:p>
+      <w:pPr>
+        <w:pStyle w:val="ListParagraph"/>
+        <w:keepNext/>
+        <w:numPr>
+          <w:ilvl w:val="0"/>
+          <w:numId w:val="2"/>
+        </w:numPr>
+        <w:spacing w:after="0" w:before="120"/>
+      </w:pPr>
+      <w:r>
+        <w:rPr>
+          <w:b/>
+          <w:bCs/>
+        </w:rPr>
+        <w:t xml:space="preserve">How does he handle an angry customer?</w:t>
+      </w:r>
+    </w:p>
+    <w:p>
+      <w:pPr>
+        <w:spacing w:after="120"/>
+        <w:ind w:left="440"/>
+      </w:pPr>
+    </w:p>
+    <w:p>
+      <w:pPr>
+        <w:pStyle w:val="ListParagraph"/>
+        <w:keepNext/>
+        <w:numPr>
+          <w:ilvl w:val="0"/>
+          <w:numId w:val="2"/>
+        </w:numPr>
+        <w:spacing w:after="0" w:before="120"/>
+      </w:pPr>
+      <w:r>
+        <w:rPr>
+          <w:b/>
+          <w:bCs/>
+        </w:rPr>
+        <w:t xml:space="preserve">How does he motivate his sales team?</w:t>
+      </w:r>
+    </w:p>
+    <w:p>
+      <w:pPr>
+        <w:spacing w:after="120"/>
+        <w:ind w:left="440"/>
+      </w:pPr>
+    </w:p>
+    <w:p>
+      <w:pPr>
+        <w:pStyle w:val="ListParagraph"/>
+        <w:keepNext/>
+        <w:numPr>
+          <w:ilvl w:val="0"/>
+          <w:numId w:val="2"/>
+        </w:numPr>
+        <w:spacing w:after="0" w:before="120"/>
+      </w:pPr>
+      <w:r>
+        <w:rPr>
+          <w:b/>
+          <w:bCs/>
+        </w:rPr>
+        <w:t xml:space="preserve">What is customer relationship management?</w:t>
+      </w:r>
+    </w:p>
+    <w:p>
+      <w:pPr>
+        <w:spacing w:after="120"/>
+        <w:ind w:left="440"/>
+      </w:pPr>
+    </w:p>
+    <w:p>
+      <w:pPr>
+        <w:pStyle w:val="ListParagraph"/>
+        <w:keepNext/>
+        <w:numPr>
+          <w:ilvl w:val="0"/>
+          <w:numId w:val="2"/>
+        </w:numPr>
+        <w:spacing w:after="0" w:before="120"/>
+      </w:pPr>
+      <w:r>
+        <w:rPr>
+          <w:b/>
+          <w:bCs/>
+        </w:rPr>
+        <w:t xml:space="preserve">What is the difference between sales and marketing?</w:t>
+      </w:r>
+    </w:p>
+    <w:p>
+      <w:pPr>
+        <w:spacing w:after="120"/>
+        <w:ind w:left="440"/>
+      </w:pPr>
+    </w:p>
+    <w:p>
+      <w:pPr>
+        <w:pStyle w:val="ListParagraph"/>
+        <w:keepNext/>
+        <w:numPr>
+          <w:ilvl w:val="0"/>
+          <w:numId w:val="2"/>
+        </w:numPr>
+        <w:spacing w:after="0" w:before="120"/>
+      </w:pPr>
+      <w:r>
+        <w:rPr>
+          <w:b/>
+          <w:bCs/>
+        </w:rPr>
+        <w:t xml:space="preserve">How is sales performance measured?</w:t>
+      </w:r>
+    </w:p>
+    <w:p>
+      <w:pPr>
+        <w:spacing w:after="120"/>
+        <w:ind w:left="440"/>
+      </w:pPr>
+    </w:p>
+    <w:p>
+      <w:pPr>
+        <w:pStyle w:val="ListParagraph"/>
+        <w:keepNext/>
+        <w:numPr>
+          <w:ilvl w:val="0"/>
+          <w:numId w:val="2"/>
+        </w:numPr>
+        <w:spacing w:after="0" w:before="120"/>
+      </w:pPr>
+      <w:r>
+        <w:rPr>
+          <w:b/>
+          <w:bCs/>
+        </w:rPr>
+        <w:t xml:space="preserve">Your brother's team has achieved only 60% of its monthly target. What should he do?</w:t>
+      </w:r>
+    </w:p>
+    <w:p>
+      <w:pPr>
+        <w:spacing w:after="120"/>
+        <w:ind w:left="440"/>
+      </w:pPr>
+    </w:p>
+    <w:p>
+      <w:pPr>
+        <w:pStyle w:val="Heading1"/>
+      </w:pPr>
+      <w:r>
+        <w:t xml:space="preserve">PIQ 10 – Brother: Management &amp; Leadership</w:t>
+      </w:r>
+    </w:p>
+    <w:p>
+      <w:pPr>
+        <w:pStyle w:val="ListParagraph"/>
+        <w:keepNext/>
+        <w:numPr>
+          <w:ilvl w:val="0"/>
+          <w:numId w:val="2"/>
+        </w:numPr>
+        <w:spacing w:after="0" w:before="120"/>
+      </w:pPr>
+      <w:r>
+        <w:rPr>
+          <w:b/>
+          <w:bCs/>
+        </w:rPr>
+        <w:t xml:space="preserve">What makes a good manager?</w:t>
+      </w:r>
+    </w:p>
+    <w:p>
+      <w:pPr>
+        <w:spacing w:after="120"/>
+        <w:ind w:left="440"/>
+      </w:pPr>
+    </w:p>
+    <w:p>
+      <w:pPr>
+        <w:pStyle w:val="ListParagraph"/>
+        <w:keepNext/>
+        <w:numPr>
+          <w:ilvl w:val="0"/>
+          <w:numId w:val="2"/>
+        </w:numPr>
+        <w:spacing w:after="0" w:before="120"/>
+      </w:pPr>
+      <w:r>
+        <w:rPr>
+          <w:b/>
+          <w:bCs/>
+        </w:rPr>
+        <w:t xml:space="preserve">What makes a good leader?</w:t>
+      </w:r>
+    </w:p>
+    <w:p>
+      <w:pPr>
+        <w:spacing w:after="120"/>
+        <w:ind w:left="440"/>
+      </w:pPr>
+    </w:p>
+    <w:p>
+      <w:pPr>
+        <w:pStyle w:val="ListParagraph"/>
+        <w:keepNext/>
+        <w:numPr>
+          <w:ilvl w:val="0"/>
+          <w:numId w:val="2"/>
+        </w:numPr>
+        <w:spacing w:after="0" w:before="120"/>
+      </w:pPr>
+      <w:r>
+        <w:rPr>
+          <w:b/>
+          <w:bCs/>
+        </w:rPr>
+        <w:t xml:space="preserve">Is every manager a good leader?</w:t>
+      </w:r>
+    </w:p>
+    <w:p>
+      <w:pPr>
+        <w:spacing w:after="120"/>
+        <w:ind w:left="440"/>
+      </w:pPr>
+    </w:p>
+    <w:p>
+      <w:pPr>
+        <w:pStyle w:val="ListParagraph"/>
+        <w:keepNext/>
+        <w:numPr>
+          <w:ilvl w:val="0"/>
+          <w:numId w:val="2"/>
+        </w:numPr>
+        <w:spacing w:after="0" w:before="120"/>
+      </w:pPr>
+      <w:r>
+        <w:rPr>
+          <w:b/>
+          <w:bCs/>
+        </w:rPr>
+        <w:t xml:space="preserve">What if an employee repeatedly misses targets?</w:t>
+      </w:r>
+    </w:p>
+    <w:p>
+      <w:pPr>
+        <w:spacing w:after="120"/>
+        <w:ind w:left="440"/>
+      </w:pPr>
+    </w:p>
+    <w:p>
+      <w:pPr>
+        <w:pStyle w:val="ListParagraph"/>
+        <w:keepNext/>
+        <w:numPr>
+          <w:ilvl w:val="0"/>
+          <w:numId w:val="2"/>
+        </w:numPr>
+        <w:spacing w:after="0" w:before="120"/>
+      </w:pPr>
+      <w:r>
+        <w:rPr>
+          <w:b/>
+          <w:bCs/>
+        </w:rPr>
+        <w:t xml:space="preserve">What if two team members have a conflict?</w:t>
+      </w:r>
+    </w:p>
+    <w:p>
+      <w:pPr>
+        <w:spacing w:after="120"/>
+        <w:ind w:left="440"/>
+      </w:pPr>
+    </w:p>
+    <w:p>
+      <w:pPr>
+        <w:pStyle w:val="ListParagraph"/>
+        <w:keepNext/>
+        <w:numPr>
+          <w:ilvl w:val="0"/>
+          <w:numId w:val="2"/>
+        </w:numPr>
+        <w:spacing w:after="0" w:before="120"/>
+      </w:pPr>
+      <w:r>
+        <w:rPr>
+          <w:b/>
+          <w:bCs/>
+        </w:rPr>
+        <w:t xml:space="preserve">Should a manager focus only on results?</w:t>
+      </w:r>
+    </w:p>
+    <w:p>
+      <w:pPr>
+        <w:spacing w:after="120"/>
+        <w:ind w:left="440"/>
+      </w:pPr>
+    </w:p>
+    <w:p>
+      <w:pPr>
+        <w:pStyle w:val="ListParagraph"/>
+        <w:keepNext/>
+        <w:numPr>
+          <w:ilvl w:val="0"/>
+          <w:numId w:val="2"/>
+        </w:numPr>
+        <w:spacing w:after="0" w:before="120"/>
+      </w:pPr>
+      <w:r>
+        <w:rPr>
+          <w:b/>
+          <w:bCs/>
+        </w:rPr>
+        <w:t xml:space="preserve">How do you balance employee welfare and organisational targets?</w:t>
+      </w:r>
+    </w:p>
+    <w:p>
+      <w:pPr>
+        <w:spacing w:after="120"/>
+        <w:ind w:left="440"/>
+      </w:pPr>
+    </w:p>
+    <w:p>
+      <w:pPr>
+        <w:pStyle w:val="ListParagraph"/>
+        <w:keepNext/>
+        <w:numPr>
+          <w:ilvl w:val="0"/>
+          <w:numId w:val="2"/>
+        </w:numPr>
+        <w:spacing w:after="0" w:before="120"/>
+      </w:pPr>
+      <w:r>
+        <w:rPr>
+          <w:b/>
+          <w:bCs/>
+        </w:rPr>
+        <w:t xml:space="preserve">What leadership qualities have you learned from your brother?</w:t>
+      </w:r>
+    </w:p>
+    <w:p>
+      <w:pPr>
+        <w:spacing w:after="120"/>
+        <w:ind w:left="440"/>
+      </w:pPr>
+    </w:p>
+    <w:p>
+      <w:pPr>
+        <w:pStyle w:val="Heading1"/>
+      </w:pPr>
+      <w:r>
+        <w:t xml:space="preserve">PIQ 10 – Brother: Relationship</w:t>
+      </w:r>
+    </w:p>
+    <w:p>
+      <w:pPr>
+        <w:pStyle w:val="ListParagraph"/>
+        <w:keepNext/>
+        <w:numPr>
+          <w:ilvl w:val="0"/>
+          <w:numId w:val="2"/>
+        </w:numPr>
+        <w:spacing w:after="0" w:before="120"/>
+      </w:pPr>
+      <w:r>
+        <w:rPr>
+          <w:b/>
+          <w:bCs/>
+        </w:rPr>
+        <w:t xml:space="preserve">How close are you to your brother?</w:t>
+      </w:r>
+    </w:p>
+    <w:p>
+      <w:pPr>
+        <w:spacing w:after="120"/>
+        <w:ind w:left="440"/>
+      </w:pPr>
+    </w:p>
+    <w:p>
+      <w:pPr>
+        <w:pStyle w:val="ListParagraph"/>
+        <w:keepNext/>
+        <w:numPr>
+          <w:ilvl w:val="0"/>
+          <w:numId w:val="2"/>
+        </w:numPr>
+        <w:spacing w:after="0" w:before="120"/>
+      </w:pPr>
+      <w:r>
+        <w:rPr>
+          <w:b/>
+          <w:bCs/>
+        </w:rPr>
+        <w:t xml:space="preserve">What do you usually discuss?</w:t>
+      </w:r>
+    </w:p>
+    <w:p>
+      <w:pPr>
+        <w:spacing w:after="120"/>
+        <w:ind w:left="440"/>
+      </w:pPr>
+    </w:p>
+    <w:p>
+      <w:pPr>
+        <w:pStyle w:val="ListParagraph"/>
+        <w:keepNext/>
+        <w:numPr>
+          <w:ilvl w:val="0"/>
+          <w:numId w:val="2"/>
+        </w:numPr>
+        <w:spacing w:after="0" w:before="120"/>
+      </w:pPr>
+      <w:r>
+        <w:rPr>
+          <w:b/>
+          <w:bCs/>
+        </w:rPr>
+        <w:t xml:space="preserve">How often do you meet?</w:t>
+      </w:r>
+    </w:p>
+    <w:p>
+      <w:pPr>
+        <w:spacing w:after="120"/>
+        <w:ind w:left="440"/>
+      </w:pPr>
+    </w:p>
+    <w:p>
+      <w:pPr>
+        <w:pStyle w:val="ListParagraph"/>
+        <w:keepNext/>
+        <w:numPr>
+          <w:ilvl w:val="0"/>
+          <w:numId w:val="2"/>
+        </w:numPr>
+        <w:spacing w:after="0" w:before="120"/>
+      </w:pPr>
+      <w:r>
+        <w:rPr>
+          <w:b/>
+          <w:bCs/>
+        </w:rPr>
+        <w:t xml:space="preserve">What do you do together?</w:t>
+      </w:r>
+    </w:p>
+    <w:p>
+      <w:pPr>
+        <w:spacing w:after="120"/>
+        <w:ind w:left="440"/>
+      </w:pPr>
+    </w:p>
+    <w:p>
+      <w:pPr>
+        <w:pStyle w:val="ListParagraph"/>
+        <w:keepNext/>
+        <w:numPr>
+          <w:ilvl w:val="0"/>
+          <w:numId w:val="2"/>
+        </w:numPr>
+        <w:spacing w:after="0" w:before="120"/>
+      </w:pPr>
+      <w:r>
+        <w:rPr>
+          <w:b/>
+          <w:bCs/>
+        </w:rPr>
+        <w:t xml:space="preserve">What qualities do you admire in him?</w:t>
+      </w:r>
+    </w:p>
+    <w:p>
+      <w:pPr>
+        <w:spacing w:after="120"/>
+        <w:ind w:left="440"/>
+      </w:pPr>
+    </w:p>
+    <w:p>
+      <w:pPr>
+        <w:pStyle w:val="ListParagraph"/>
+        <w:keepNext/>
+        <w:numPr>
+          <w:ilvl w:val="0"/>
+          <w:numId w:val="2"/>
+        </w:numPr>
+        <w:spacing w:after="0" w:before="120"/>
+      </w:pPr>
+      <w:r>
+        <w:rPr>
+          <w:b/>
+          <w:bCs/>
+        </w:rPr>
+        <w:t xml:space="preserve">What is one weakness of your brother?</w:t>
+      </w:r>
+    </w:p>
+    <w:p>
+      <w:pPr>
+        <w:spacing w:after="120"/>
+        <w:ind w:left="440"/>
+      </w:pPr>
+    </w:p>
+    <w:p>
+      <w:pPr>
+        <w:pStyle w:val="ListParagraph"/>
+        <w:keepNext/>
+        <w:numPr>
+          <w:ilvl w:val="0"/>
+          <w:numId w:val="2"/>
+        </w:numPr>
+        <w:spacing w:after="0" w:before="120"/>
+      </w:pPr>
+      <w:r>
+        <w:rPr>
+          <w:b/>
+          <w:bCs/>
+        </w:rPr>
+        <w:t xml:space="preserve">What do you disagree about?</w:t>
+      </w:r>
+    </w:p>
+    <w:p>
+      <w:pPr>
+        <w:spacing w:after="120"/>
+        <w:ind w:left="440"/>
+      </w:pPr>
+    </w:p>
+    <w:p>
+      <w:pPr>
+        <w:pStyle w:val="ListParagraph"/>
+        <w:keepNext/>
+        <w:numPr>
+          <w:ilvl w:val="0"/>
+          <w:numId w:val="2"/>
+        </w:numPr>
+        <w:spacing w:after="0" w:before="120"/>
+      </w:pPr>
+      <w:r>
+        <w:rPr>
+          <w:b/>
+          <w:bCs/>
+        </w:rPr>
+        <w:t xml:space="preserve">Does he advise you about your career?</w:t>
+      </w:r>
+    </w:p>
+    <w:p>
+      <w:pPr>
+        <w:spacing w:after="120"/>
+        <w:ind w:left="440"/>
+      </w:pPr>
+    </w:p>
+    <w:p>
+      <w:pPr>
+        <w:pStyle w:val="ListParagraph"/>
+        <w:keepNext/>
+        <w:numPr>
+          <w:ilvl w:val="0"/>
+          <w:numId w:val="2"/>
+        </w:numPr>
+        <w:spacing w:after="0" w:before="120"/>
+      </w:pPr>
+      <w:r>
+        <w:rPr>
+          <w:b/>
+          <w:bCs/>
+        </w:rPr>
+        <w:t xml:space="preserve">Do you advise him about anything?</w:t>
+      </w:r>
+    </w:p>
+    <w:p>
+      <w:pPr>
+        <w:spacing w:after="120"/>
+        <w:ind w:left="440"/>
+      </w:pPr>
+    </w:p>
+    <w:p>
+      <w:pPr>
+        <w:pStyle w:val="ListParagraph"/>
+        <w:keepNext/>
+        <w:numPr>
+          <w:ilvl w:val="0"/>
+          <w:numId w:val="2"/>
+        </w:numPr>
+        <w:spacing w:after="0" w:before="120"/>
+      </w:pPr>
+      <w:r>
+        <w:rPr>
+          <w:b/>
+          <w:bCs/>
+        </w:rPr>
+        <w:t xml:space="preserve">Have you ever helped him solve a problem?</w:t>
+      </w:r>
+    </w:p>
+    <w:p>
+      <w:pPr>
+        <w:spacing w:after="120"/>
+        <w:ind w:left="440"/>
+      </w:pPr>
+    </w:p>
+    <w:p>
+      <w:pPr>
+        <w:pStyle w:val="ListParagraph"/>
+        <w:keepNext/>
+        <w:numPr>
+          <w:ilvl w:val="0"/>
+          <w:numId w:val="2"/>
+        </w:numPr>
+        <w:spacing w:after="0" w:before="120"/>
+      </w:pPr>
+      <w:r>
+        <w:rPr>
+          <w:b/>
+          <w:bCs/>
+        </w:rPr>
+        <w:t xml:space="preserve">Has he ever helped you?</w:t>
+      </w:r>
+    </w:p>
+    <w:p>
+      <w:pPr>
+        <w:spacing w:after="120"/>
+        <w:ind w:left="440"/>
+      </w:pPr>
+    </w:p>
+    <w:p>
+      <w:pPr>
+        <w:pStyle w:val="Heading1"/>
+      </w:pPr>
+      <w:r>
+        <w:t xml:space="preserve">PIQ 10 – Brother's Career vs Yours</w:t>
+      </w:r>
+    </w:p>
+    <w:p>
+      <w:pPr>
+        <w:pStyle w:val="ListParagraph"/>
+        <w:keepNext/>
+        <w:numPr>
+          <w:ilvl w:val="0"/>
+          <w:numId w:val="2"/>
+        </w:numPr>
+        <w:spacing w:after="0" w:before="120"/>
+      </w:pPr>
+      <w:r>
+        <w:rPr>
+          <w:b/>
+          <w:bCs/>
+        </w:rPr>
+        <w:t xml:space="preserve">Why didn't you join your brother's field?</w:t>
+      </w:r>
+    </w:p>
+    <w:p>
+      <w:pPr>
+        <w:spacing w:after="120"/>
+        <w:ind w:left="440"/>
+      </w:pPr>
+    </w:p>
+    <w:p>
+      <w:pPr>
+        <w:pStyle w:val="ListParagraph"/>
+        <w:keepNext/>
+        <w:numPr>
+          <w:ilvl w:val="0"/>
+          <w:numId w:val="2"/>
+        </w:numPr>
+        <w:spacing w:after="0" w:before="120"/>
+      </w:pPr>
+      <w:r>
+        <w:rPr>
+          <w:b/>
+          <w:bCs/>
+        </w:rPr>
+        <w:t xml:space="preserve">Do you have any interest in automobile sales?</w:t>
+      </w:r>
+    </w:p>
+    <w:p>
+      <w:pPr>
+        <w:spacing w:after="120"/>
+        <w:ind w:left="440"/>
+      </w:pPr>
+    </w:p>
+    <w:p>
+      <w:pPr>
+        <w:pStyle w:val="ListParagraph"/>
+        <w:keepNext/>
+        <w:numPr>
+          <w:ilvl w:val="0"/>
+          <w:numId w:val="2"/>
+        </w:numPr>
+        <w:spacing w:after="0" w:before="120"/>
+      </w:pPr>
+      <w:r>
+        <w:rPr>
+          <w:b/>
+          <w:bCs/>
+        </w:rPr>
+        <w:t xml:space="preserve">What have you learned from your brother's career?</w:t>
+      </w:r>
+    </w:p>
+    <w:p>
+      <w:pPr>
+        <w:spacing w:after="120"/>
+        <w:ind w:left="440"/>
+      </w:pPr>
+    </w:p>
+    <w:p>
+      <w:pPr>
+        <w:pStyle w:val="ListParagraph"/>
+        <w:keepNext/>
+        <w:numPr>
+          <w:ilvl w:val="0"/>
+          <w:numId w:val="2"/>
+        </w:numPr>
+        <w:spacing w:after="0" w:before="120"/>
+      </w:pPr>
+      <w:r>
+        <w:rPr>
+          <w:b/>
+          <w:bCs/>
+        </w:rPr>
+        <w:t xml:space="preserve">Which career do you prefer, his or yours, and why?</w:t>
+      </w:r>
+    </w:p>
+    <w:p>
+      <w:pPr>
+        <w:spacing w:after="120"/>
+        <w:ind w:left="440"/>
+      </w:pPr>
+    </w:p>
+    <w:p>
+      <w:pPr>
+        <w:pStyle w:val="ListParagraph"/>
+        <w:keepNext/>
+        <w:numPr>
+          <w:ilvl w:val="0"/>
+          <w:numId w:val="2"/>
+        </w:numPr>
+        <w:spacing w:after="0" w:before="120"/>
+      </w:pPr>
+      <w:r>
+        <w:rPr>
+          <w:b/>
+          <w:bCs/>
+        </w:rPr>
+        <w:t xml:space="preserve">What is similar between your job and his?</w:t>
+      </w:r>
+    </w:p>
+    <w:p>
+      <w:pPr>
+        <w:spacing w:after="120"/>
+        <w:ind w:left="440"/>
+      </w:pPr>
+    </w:p>
+    <w:p>
+      <w:pPr>
+        <w:pStyle w:val="ListParagraph"/>
+        <w:keepNext/>
+        <w:numPr>
+          <w:ilvl w:val="0"/>
+          <w:numId w:val="2"/>
+        </w:numPr>
+        <w:spacing w:after="0" w:before="120"/>
+      </w:pPr>
+      <w:r>
+        <w:rPr>
+          <w:b/>
+          <w:bCs/>
+        </w:rPr>
+        <w:t xml:space="preserve">Which skills carry over between software development and sales?</w:t>
+      </w:r>
+    </w:p>
+    <w:p>
+      <w:pPr>
+        <w:spacing w:after="120"/>
+        <w:ind w:left="440"/>
+      </w:pPr>
+    </w:p>
+    <w:p>
+      <w:pPr>
+        <w:pStyle w:val="Heading1"/>
+      </w:pPr>
+      <w:r>
+        <w:t xml:space="preserve">PIQ 10 – Brother: Salary</w:t>
+      </w:r>
+    </w:p>
+    <w:p>
+      <w:pPr>
+        <w:pStyle w:val="ListParagraph"/>
+        <w:keepNext/>
+        <w:numPr>
+          <w:ilvl w:val="0"/>
+          <w:numId w:val="2"/>
+        </w:numPr>
+        <w:spacing w:after="0" w:before="120"/>
+      </w:pPr>
+      <w:r>
+        <w:rPr>
+          <w:b/>
+          <w:bCs/>
+        </w:rPr>
+        <w:t xml:space="preserve">Is ₹40,000 his gross or take-home salary?</w:t>
+      </w:r>
+    </w:p>
+    <w:p>
+      <w:pPr>
+        <w:spacing w:after="120"/>
+        <w:ind w:left="440"/>
+      </w:pPr>
+    </w:p>
+    <w:p>
+      <w:pPr>
+        <w:pStyle w:val="ListParagraph"/>
+        <w:keepNext/>
+        <w:numPr>
+          <w:ilvl w:val="0"/>
+          <w:numId w:val="2"/>
+        </w:numPr>
+        <w:spacing w:after="0" w:before="120"/>
+      </w:pPr>
+      <w:r>
+        <w:rPr>
+          <w:b/>
+          <w:bCs/>
+        </w:rPr>
+        <w:t xml:space="preserve">Is his salary fixed, or does it include incentives?</w:t>
+      </w:r>
+    </w:p>
+    <w:p>
+      <w:pPr>
+        <w:spacing w:after="120"/>
+        <w:ind w:left="440"/>
+      </w:pPr>
+    </w:p>
+    <w:p>
+      <w:pPr>
+        <w:pStyle w:val="ListParagraph"/>
+        <w:keepNext/>
+        <w:numPr>
+          <w:ilvl w:val="0"/>
+          <w:numId w:val="2"/>
+        </w:numPr>
+        <w:spacing w:after="0" w:before="120"/>
+      </w:pPr>
+      <w:r>
+        <w:rPr>
+          <w:b/>
+          <w:bCs/>
+        </w:rPr>
+        <w:t xml:space="preserve">How do sales incentives work, and what decides them?</w:t>
+      </w:r>
+    </w:p>
+    <w:p>
+      <w:pPr>
+        <w:spacing w:after="120"/>
+        <w:ind w:left="440"/>
+      </w:pPr>
+    </w:p>
+    <w:p>
+      <w:pPr>
+        <w:pStyle w:val="ListParagraph"/>
+        <w:keepNext/>
+        <w:numPr>
+          <w:ilvl w:val="0"/>
+          <w:numId w:val="2"/>
+        </w:numPr>
+        <w:spacing w:after="0" w:before="120"/>
+      </w:pPr>
+      <w:r>
+        <w:rPr>
+          <w:b/>
+          <w:bCs/>
+        </w:rPr>
+        <w:t xml:space="preserve">What is the difference between salary and incentive?</w:t>
+      </w:r>
+    </w:p>
+    <w:p>
+      <w:pPr>
+        <w:spacing w:after="120"/>
+        <w:ind w:left="440"/>
+      </w:pPr>
+    </w:p>
+    <w:p>
+      <w:pPr>
+        <w:pStyle w:val="Heading1"/>
+      </w:pPr>
+      <w:r>
+        <w:t xml:space="preserve">PIQ 10 – Family Comparison</w:t>
+      </w:r>
+    </w:p>
+    <w:p>
+      <w:pPr>
+        <w:pStyle w:val="ListParagraph"/>
+        <w:keepNext/>
+        <w:numPr>
+          <w:ilvl w:val="0"/>
+          <w:numId w:val="2"/>
+        </w:numPr>
+        <w:spacing w:after="0" w:before="120"/>
+      </w:pPr>
+      <w:r>
+        <w:rPr>
+          <w:b/>
+          <w:bCs/>
+        </w:rPr>
+        <w:t xml:space="preserve">Who is the most educated person in your family?</w:t>
+      </w:r>
+    </w:p>
+    <w:p>
+      <w:pPr>
+        <w:spacing w:after="120"/>
+        <w:ind w:left="440"/>
+      </w:pPr>
+    </w:p>
+    <w:p>
+      <w:pPr>
+        <w:pStyle w:val="ListParagraph"/>
+        <w:keepNext/>
+        <w:numPr>
+          <w:ilvl w:val="0"/>
+          <w:numId w:val="2"/>
+        </w:numPr>
+        <w:spacing w:after="0" w:before="120"/>
+      </w:pPr>
+      <w:r>
+        <w:rPr>
+          <w:b/>
+          <w:bCs/>
+        </w:rPr>
+        <w:t xml:space="preserve">Who earns the most in your family?</w:t>
+      </w:r>
+    </w:p>
+    <w:p>
+      <w:pPr>
+        <w:spacing w:after="120"/>
+        <w:ind w:left="440"/>
+      </w:pPr>
+    </w:p>
+    <w:p>
+      <w:pPr>
+        <w:pStyle w:val="ListParagraph"/>
+        <w:keepNext/>
+        <w:numPr>
+          <w:ilvl w:val="0"/>
+          <w:numId w:val="2"/>
+        </w:numPr>
+        <w:spacing w:after="0" w:before="120"/>
+      </w:pPr>
+      <w:r>
+        <w:rPr>
+          <w:b/>
+          <w:bCs/>
+        </w:rPr>
+        <w:t xml:space="preserve">Which family member has influenced you most?</w:t>
       </w:r>
     </w:p>
     <w:p>

</xml_diff>

<commit_message>
Add PIQ 11 (Elder Sister) questions to SSB question sheet
Co-Authored-By: Claude Opus 5.5 <noreply@anthropic.com>
Claude-Session: https://claude.ai/code/session_01TypcejD48cCyAqfjtUUit5
</commit_message>
<xml_diff>
--- a/SSB_Question_Sheet.docx
+++ b/SSB_Question_Sheet.docx
@@ -15796,6 +15796,2478 @@
           <w:bCs/>
         </w:rPr>
         <w:t xml:space="preserve">Which family member has influenced you most?</w:t>
+      </w:r>
+    </w:p>
+    <w:p>
+      <w:pPr>
+        <w:spacing w:after="120"/>
+        <w:ind w:left="440"/>
+      </w:pPr>
+    </w:p>
+    <w:p>
+      <w:pPr>
+        <w:pStyle w:val="Heading1"/>
+      </w:pPr>
+      <w:r>
+        <w:t xml:space="preserve">PIQ 11 – Elder Sister</w:t>
+      </w:r>
+    </w:p>
+    <w:p>
+      <w:pPr>
+        <w:pStyle w:val="ListParagraph"/>
+        <w:keepNext/>
+        <w:numPr>
+          <w:ilvl w:val="0"/>
+          <w:numId w:val="2"/>
+        </w:numPr>
+        <w:spacing w:after="0" w:before="120"/>
+      </w:pPr>
+      <w:r>
+        <w:rPr>
+          <w:b/>
+          <w:bCs/>
+        </w:rPr>
+        <w:t xml:space="preserve">What is your sister's name?</w:t>
+      </w:r>
+    </w:p>
+    <w:p>
+      <w:pPr>
+        <w:spacing w:after="120"/>
+        <w:ind w:left="440"/>
+      </w:pPr>
+    </w:p>
+    <w:p>
+      <w:pPr>
+        <w:pStyle w:val="ListParagraph"/>
+        <w:keepNext/>
+        <w:numPr>
+          <w:ilvl w:val="0"/>
+          <w:numId w:val="2"/>
+        </w:numPr>
+        <w:spacing w:after="0" w:before="120"/>
+      </w:pPr>
+      <w:r>
+        <w:rPr>
+          <w:b/>
+          <w:bCs/>
+        </w:rPr>
+        <w:t xml:space="preserve">How old is she?</w:t>
+      </w:r>
+    </w:p>
+    <w:p>
+      <w:pPr>
+        <w:spacing w:after="120"/>
+        <w:ind w:left="440"/>
+      </w:pPr>
+    </w:p>
+    <w:p>
+      <w:pPr>
+        <w:pStyle w:val="ListParagraph"/>
+        <w:keepNext/>
+        <w:numPr>
+          <w:ilvl w:val="0"/>
+          <w:numId w:val="2"/>
+        </w:numPr>
+        <w:spacing w:after="0" w:before="120"/>
+      </w:pPr>
+      <w:r>
+        <w:rPr>
+          <w:b/>
+          <w:bCs/>
+        </w:rPr>
+        <w:t xml:space="preserve">What did she study?</w:t>
+      </w:r>
+    </w:p>
+    <w:p>
+      <w:pPr>
+        <w:spacing w:after="120"/>
+        <w:ind w:left="440"/>
+      </w:pPr>
+    </w:p>
+    <w:p>
+      <w:pPr>
+        <w:pStyle w:val="ListParagraph"/>
+        <w:keepNext/>
+        <w:numPr>
+          <w:ilvl w:val="0"/>
+          <w:numId w:val="2"/>
+        </w:numPr>
+        <w:spacing w:after="0" w:before="120"/>
+      </w:pPr>
+      <w:r>
+        <w:rPr>
+          <w:b/>
+          <w:bCs/>
+        </w:rPr>
+        <w:t xml:space="preserve">Why did she choose Computer Science?</w:t>
+      </w:r>
+    </w:p>
+    <w:p>
+      <w:pPr>
+        <w:spacing w:after="120"/>
+        <w:ind w:left="440"/>
+      </w:pPr>
+    </w:p>
+    <w:p>
+      <w:pPr>
+        <w:pStyle w:val="ListParagraph"/>
+        <w:keepNext/>
+        <w:numPr>
+          <w:ilvl w:val="0"/>
+          <w:numId w:val="2"/>
+        </w:numPr>
+        <w:spacing w:after="0" w:before="120"/>
+      </w:pPr>
+      <w:r>
+        <w:rPr>
+          <w:b/>
+          <w:bCs/>
+        </w:rPr>
+        <w:t xml:space="preserve">Where did she complete her PhD?</w:t>
+      </w:r>
+    </w:p>
+    <w:p>
+      <w:pPr>
+        <w:spacing w:after="120"/>
+        <w:ind w:left="440"/>
+      </w:pPr>
+    </w:p>
+    <w:p>
+      <w:pPr>
+        <w:pStyle w:val="ListParagraph"/>
+        <w:keepNext/>
+        <w:numPr>
+          <w:ilvl w:val="0"/>
+          <w:numId w:val="2"/>
+        </w:numPr>
+        <w:spacing w:after="0" w:before="120"/>
+      </w:pPr>
+      <w:r>
+        <w:rPr>
+          <w:b/>
+          <w:bCs/>
+        </w:rPr>
+        <w:t xml:space="preserve">What was her PhD topic?</w:t>
+      </w:r>
+    </w:p>
+    <w:p>
+      <w:pPr>
+        <w:spacing w:after="120"/>
+        <w:ind w:left="440"/>
+      </w:pPr>
+    </w:p>
+    <w:p>
+      <w:pPr>
+        <w:pStyle w:val="ListParagraph"/>
+        <w:keepNext/>
+        <w:numPr>
+          <w:ilvl w:val="0"/>
+          <w:numId w:val="2"/>
+        </w:numPr>
+        <w:spacing w:after="0" w:before="120"/>
+      </w:pPr>
+      <w:r>
+        <w:rPr>
+          <w:b/>
+          <w:bCs/>
+        </w:rPr>
+        <w:t xml:space="preserve">What problem did her research address, and why did it matter?</w:t>
+      </w:r>
+    </w:p>
+    <w:p>
+      <w:pPr>
+        <w:spacing w:after="120"/>
+        <w:ind w:left="440"/>
+      </w:pPr>
+    </w:p>
+    <w:p>
+      <w:pPr>
+        <w:pStyle w:val="ListParagraph"/>
+        <w:keepNext/>
+        <w:numPr>
+          <w:ilvl w:val="0"/>
+          <w:numId w:val="2"/>
+        </w:numPr>
+        <w:spacing w:after="0" w:before="120"/>
+      </w:pPr>
+      <w:r>
+        <w:rPr>
+          <w:b/>
+          <w:bCs/>
+        </w:rPr>
+        <w:t xml:space="preserve">What methodology did she use?</w:t>
+      </w:r>
+    </w:p>
+    <w:p>
+      <w:pPr>
+        <w:spacing w:after="120"/>
+        <w:ind w:left="440"/>
+      </w:pPr>
+    </w:p>
+    <w:p>
+      <w:pPr>
+        <w:pStyle w:val="ListParagraph"/>
+        <w:keepNext/>
+        <w:numPr>
+          <w:ilvl w:val="0"/>
+          <w:numId w:val="2"/>
+        </w:numPr>
+        <w:spacing w:after="0" w:before="120"/>
+      </w:pPr>
+      <w:r>
+        <w:rPr>
+          <w:b/>
+          <w:bCs/>
+        </w:rPr>
+        <w:t xml:space="preserve">What was the main outcome or application of her research?</w:t>
+      </w:r>
+    </w:p>
+    <w:p>
+      <w:pPr>
+        <w:spacing w:after="120"/>
+        <w:ind w:left="440"/>
+      </w:pPr>
+    </w:p>
+    <w:p>
+      <w:pPr>
+        <w:pStyle w:val="ListParagraph"/>
+        <w:keepNext/>
+        <w:numPr>
+          <w:ilvl w:val="0"/>
+          <w:numId w:val="2"/>
+        </w:numPr>
+        <w:spacing w:after="0" w:before="120"/>
+      </w:pPr>
+      <w:r>
+        <w:rPr>
+          <w:b/>
+          <w:bCs/>
+        </w:rPr>
+        <w:t xml:space="preserve">Where does she work?</w:t>
+      </w:r>
+    </w:p>
+    <w:p>
+      <w:pPr>
+        <w:spacing w:after="120"/>
+        <w:ind w:left="440"/>
+      </w:pPr>
+    </w:p>
+    <w:p>
+      <w:pPr>
+        <w:pStyle w:val="ListParagraph"/>
+        <w:keepNext/>
+        <w:numPr>
+          <w:ilvl w:val="0"/>
+          <w:numId w:val="2"/>
+        </w:numPr>
+        <w:spacing w:after="0" w:before="120"/>
+      </w:pPr>
+      <w:r>
+        <w:rPr>
+          <w:b/>
+          <w:bCs/>
+        </w:rPr>
+        <w:t xml:space="preserve">What does an Assistant Professor do?</w:t>
+      </w:r>
+    </w:p>
+    <w:p>
+      <w:pPr>
+        <w:spacing w:after="120"/>
+        <w:ind w:left="440"/>
+      </w:pPr>
+    </w:p>
+    <w:p>
+      <w:pPr>
+        <w:pStyle w:val="ListParagraph"/>
+        <w:keepNext/>
+        <w:numPr>
+          <w:ilvl w:val="0"/>
+          <w:numId w:val="2"/>
+        </w:numPr>
+        <w:spacing w:after="0" w:before="120"/>
+      </w:pPr>
+      <w:r>
+        <w:rPr>
+          <w:b/>
+          <w:bCs/>
+        </w:rPr>
+        <w:t xml:space="preserve">What subjects does she teach?</w:t>
+      </w:r>
+    </w:p>
+    <w:p>
+      <w:pPr>
+        <w:spacing w:after="120"/>
+        <w:ind w:left="440"/>
+      </w:pPr>
+    </w:p>
+    <w:p>
+      <w:pPr>
+        <w:pStyle w:val="ListParagraph"/>
+        <w:keepNext/>
+        <w:numPr>
+          <w:ilvl w:val="0"/>
+          <w:numId w:val="2"/>
+        </w:numPr>
+        <w:spacing w:after="0" w:before="120"/>
+      </w:pPr>
+      <w:r>
+        <w:rPr>
+          <w:b/>
+          <w:bCs/>
+        </w:rPr>
+        <w:t xml:space="preserve">How long has she been teaching?</w:t>
+      </w:r>
+    </w:p>
+    <w:p>
+      <w:pPr>
+        <w:spacing w:after="120"/>
+        <w:ind w:left="440"/>
+      </w:pPr>
+    </w:p>
+    <w:p>
+      <w:pPr>
+        <w:pStyle w:val="ListParagraph"/>
+        <w:keepNext/>
+        <w:numPr>
+          <w:ilvl w:val="0"/>
+          <w:numId w:val="2"/>
+        </w:numPr>
+        <w:spacing w:after="0" w:before="120"/>
+      </w:pPr>
+      <w:r>
+        <w:rPr>
+          <w:b/>
+          <w:bCs/>
+        </w:rPr>
+        <w:t xml:space="preserve">What is her salary?</w:t>
+      </w:r>
+    </w:p>
+    <w:p>
+      <w:pPr>
+        <w:spacing w:after="120"/>
+        <w:ind w:left="440"/>
+      </w:pPr>
+    </w:p>
+    <w:p>
+      <w:pPr>
+        <w:pStyle w:val="ListParagraph"/>
+        <w:keepNext/>
+        <w:numPr>
+          <w:ilvl w:val="0"/>
+          <w:numId w:val="2"/>
+        </w:numPr>
+        <w:spacing w:after="0" w:before="120"/>
+      </w:pPr>
+      <w:r>
+        <w:rPr>
+          <w:b/>
+          <w:bCs/>
+        </w:rPr>
+        <w:t xml:space="preserve">What are her career goals?</w:t>
+      </w:r>
+    </w:p>
+    <w:p>
+      <w:pPr>
+        <w:spacing w:after="120"/>
+        <w:ind w:left="440"/>
+      </w:pPr>
+    </w:p>
+    <w:p>
+      <w:pPr>
+        <w:pStyle w:val="Heading1"/>
+      </w:pPr>
+      <w:r>
+        <w:t xml:space="preserve">PIQ 11 – Sister: Computer Science Basics</w:t>
+      </w:r>
+    </w:p>
+    <w:p>
+      <w:pPr>
+        <w:pStyle w:val="ListParagraph"/>
+        <w:keepNext/>
+        <w:numPr>
+          <w:ilvl w:val="0"/>
+          <w:numId w:val="2"/>
+        </w:numPr>
+        <w:spacing w:after="0" w:before="120"/>
+      </w:pPr>
+      <w:r>
+        <w:rPr>
+          <w:b/>
+          <w:bCs/>
+        </w:rPr>
+        <w:t xml:space="preserve">What is Computer Science?</w:t>
+      </w:r>
+    </w:p>
+    <w:p>
+      <w:pPr>
+        <w:spacing w:after="120"/>
+        <w:ind w:left="440"/>
+      </w:pPr>
+    </w:p>
+    <w:p>
+      <w:pPr>
+        <w:pStyle w:val="ListParagraph"/>
+        <w:keepNext/>
+        <w:numPr>
+          <w:ilvl w:val="0"/>
+          <w:numId w:val="2"/>
+        </w:numPr>
+        <w:spacing w:after="0" w:before="120"/>
+      </w:pPr>
+      <w:r>
+        <w:rPr>
+          <w:b/>
+          <w:bCs/>
+        </w:rPr>
+        <w:t xml:space="preserve">What is the difference between hardware and software?</w:t>
+      </w:r>
+    </w:p>
+    <w:p>
+      <w:pPr>
+        <w:spacing w:after="120"/>
+        <w:ind w:left="440"/>
+      </w:pPr>
+    </w:p>
+    <w:p>
+      <w:pPr>
+        <w:pStyle w:val="ListParagraph"/>
+        <w:keepNext/>
+        <w:numPr>
+          <w:ilvl w:val="0"/>
+          <w:numId w:val="2"/>
+        </w:numPr>
+        <w:spacing w:after="0" w:before="120"/>
+      </w:pPr>
+      <w:r>
+        <w:rPr>
+          <w:b/>
+          <w:bCs/>
+        </w:rPr>
+        <w:t xml:space="preserve">What is an operating system?</w:t>
+      </w:r>
+    </w:p>
+    <w:p>
+      <w:pPr>
+        <w:spacing w:after="120"/>
+        <w:ind w:left="440"/>
+      </w:pPr>
+    </w:p>
+    <w:p>
+      <w:pPr>
+        <w:pStyle w:val="ListParagraph"/>
+        <w:keepNext/>
+        <w:numPr>
+          <w:ilvl w:val="0"/>
+          <w:numId w:val="2"/>
+        </w:numPr>
+        <w:spacing w:after="0" w:before="120"/>
+      </w:pPr>
+      <w:r>
+        <w:rPr>
+          <w:b/>
+          <w:bCs/>
+        </w:rPr>
+        <w:t xml:space="preserve">What is a database?</w:t>
+      </w:r>
+    </w:p>
+    <w:p>
+      <w:pPr>
+        <w:spacing w:after="120"/>
+        <w:ind w:left="440"/>
+      </w:pPr>
+    </w:p>
+    <w:p>
+      <w:pPr>
+        <w:pStyle w:val="ListParagraph"/>
+        <w:keepNext/>
+        <w:numPr>
+          <w:ilvl w:val="0"/>
+          <w:numId w:val="2"/>
+        </w:numPr>
+        <w:spacing w:after="0" w:before="120"/>
+      </w:pPr>
+      <w:r>
+        <w:rPr>
+          <w:b/>
+          <w:bCs/>
+        </w:rPr>
+        <w:t xml:space="preserve">What is SQL?</w:t>
+      </w:r>
+    </w:p>
+    <w:p>
+      <w:pPr>
+        <w:spacing w:after="120"/>
+        <w:ind w:left="440"/>
+      </w:pPr>
+    </w:p>
+    <w:p>
+      <w:pPr>
+        <w:pStyle w:val="ListParagraph"/>
+        <w:keepNext/>
+        <w:numPr>
+          <w:ilvl w:val="0"/>
+          <w:numId w:val="2"/>
+        </w:numPr>
+        <w:spacing w:after="0" w:before="120"/>
+      </w:pPr>
+      <w:r>
+        <w:rPr>
+          <w:b/>
+          <w:bCs/>
+        </w:rPr>
+        <w:t xml:space="preserve">What is a programming language?</w:t>
+      </w:r>
+    </w:p>
+    <w:p>
+      <w:pPr>
+        <w:spacing w:after="120"/>
+        <w:ind w:left="440"/>
+      </w:pPr>
+    </w:p>
+    <w:p>
+      <w:pPr>
+        <w:pStyle w:val="ListParagraph"/>
+        <w:keepNext/>
+        <w:numPr>
+          <w:ilvl w:val="0"/>
+          <w:numId w:val="2"/>
+        </w:numPr>
+        <w:spacing w:after="0" w:before="120"/>
+      </w:pPr>
+      <w:r>
+        <w:rPr>
+          <w:b/>
+          <w:bCs/>
+        </w:rPr>
+        <w:t xml:space="preserve">What is an algorithm?</w:t>
+      </w:r>
+    </w:p>
+    <w:p>
+      <w:pPr>
+        <w:spacing w:after="120"/>
+        <w:ind w:left="440"/>
+      </w:pPr>
+    </w:p>
+    <w:p>
+      <w:pPr>
+        <w:pStyle w:val="ListParagraph"/>
+        <w:keepNext/>
+        <w:numPr>
+          <w:ilvl w:val="0"/>
+          <w:numId w:val="2"/>
+        </w:numPr>
+        <w:spacing w:after="0" w:before="120"/>
+      </w:pPr>
+      <w:r>
+        <w:rPr>
+          <w:b/>
+          <w:bCs/>
+        </w:rPr>
+        <w:t xml:space="preserve">What is a data structure?</w:t>
+      </w:r>
+    </w:p>
+    <w:p>
+      <w:pPr>
+        <w:spacing w:after="120"/>
+        <w:ind w:left="440"/>
+      </w:pPr>
+    </w:p>
+    <w:p>
+      <w:pPr>
+        <w:pStyle w:val="ListParagraph"/>
+        <w:keepNext/>
+        <w:numPr>
+          <w:ilvl w:val="0"/>
+          <w:numId w:val="2"/>
+        </w:numPr>
+        <w:spacing w:after="0" w:before="120"/>
+      </w:pPr>
+      <w:r>
+        <w:rPr>
+          <w:b/>
+          <w:bCs/>
+        </w:rPr>
+        <w:t xml:space="preserve">What is OOP?</w:t>
+      </w:r>
+    </w:p>
+    <w:p>
+      <w:pPr>
+        <w:spacing w:after="120"/>
+        <w:ind w:left="440"/>
+      </w:pPr>
+    </w:p>
+    <w:p>
+      <w:pPr>
+        <w:pStyle w:val="ListParagraph"/>
+        <w:keepNext/>
+        <w:numPr>
+          <w:ilvl w:val="0"/>
+          <w:numId w:val="2"/>
+        </w:numPr>
+        <w:spacing w:after="0" w:before="120"/>
+      </w:pPr>
+      <w:r>
+        <w:rPr>
+          <w:b/>
+          <w:bCs/>
+        </w:rPr>
+        <w:t xml:space="preserve">What is AI?</w:t>
+      </w:r>
+    </w:p>
+    <w:p>
+      <w:pPr>
+        <w:spacing w:after="120"/>
+        <w:ind w:left="440"/>
+      </w:pPr>
+    </w:p>
+    <w:p>
+      <w:pPr>
+        <w:pStyle w:val="ListParagraph"/>
+        <w:keepNext/>
+        <w:numPr>
+          <w:ilvl w:val="0"/>
+          <w:numId w:val="2"/>
+        </w:numPr>
+        <w:spacing w:after="0" w:before="120"/>
+      </w:pPr>
+      <w:r>
+        <w:rPr>
+          <w:b/>
+          <w:bCs/>
+        </w:rPr>
+        <w:t xml:space="preserve">What is Machine Learning?</w:t>
+      </w:r>
+    </w:p>
+    <w:p>
+      <w:pPr>
+        <w:spacing w:after="120"/>
+        <w:ind w:left="440"/>
+      </w:pPr>
+    </w:p>
+    <w:p>
+      <w:pPr>
+        <w:pStyle w:val="ListParagraph"/>
+        <w:keepNext/>
+        <w:numPr>
+          <w:ilvl w:val="0"/>
+          <w:numId w:val="2"/>
+        </w:numPr>
+        <w:spacing w:after="0" w:before="120"/>
+      </w:pPr>
+      <w:r>
+        <w:rPr>
+          <w:b/>
+          <w:bCs/>
+        </w:rPr>
+        <w:t xml:space="preserve">What is Generative AI?</w:t>
+      </w:r>
+    </w:p>
+    <w:p>
+      <w:pPr>
+        <w:spacing w:after="120"/>
+        <w:ind w:left="440"/>
+      </w:pPr>
+    </w:p>
+    <w:p>
+      <w:pPr>
+        <w:pStyle w:val="ListParagraph"/>
+        <w:keepNext/>
+        <w:numPr>
+          <w:ilvl w:val="0"/>
+          <w:numId w:val="2"/>
+        </w:numPr>
+        <w:spacing w:after="0" w:before="120"/>
+      </w:pPr>
+      <w:r>
+        <w:rPr>
+          <w:b/>
+          <w:bCs/>
+        </w:rPr>
+        <w:t xml:space="preserve">What is cybersecurity?</w:t>
+      </w:r>
+    </w:p>
+    <w:p>
+      <w:pPr>
+        <w:spacing w:after="120"/>
+        <w:ind w:left="440"/>
+      </w:pPr>
+    </w:p>
+    <w:p>
+      <w:pPr>
+        <w:pStyle w:val="ListParagraph"/>
+        <w:keepNext/>
+        <w:numPr>
+          <w:ilvl w:val="0"/>
+          <w:numId w:val="2"/>
+        </w:numPr>
+        <w:spacing w:after="0" w:before="120"/>
+      </w:pPr>
+      <w:r>
+        <w:rPr>
+          <w:b/>
+          <w:bCs/>
+        </w:rPr>
+        <w:t xml:space="preserve">What is cloud computing?</w:t>
+      </w:r>
+    </w:p>
+    <w:p>
+      <w:pPr>
+        <w:spacing w:after="120"/>
+        <w:ind w:left="440"/>
+      </w:pPr>
+    </w:p>
+    <w:p>
+      <w:pPr>
+        <w:pStyle w:val="ListParagraph"/>
+        <w:keepNext/>
+        <w:numPr>
+          <w:ilvl w:val="0"/>
+          <w:numId w:val="2"/>
+        </w:numPr>
+        <w:spacing w:after="0" w:before="120"/>
+      </w:pPr>
+      <w:r>
+        <w:rPr>
+          <w:b/>
+          <w:bCs/>
+        </w:rPr>
+        <w:t xml:space="preserve">What is a computer network?</w:t>
+      </w:r>
+    </w:p>
+    <w:p>
+      <w:pPr>
+        <w:spacing w:after="120"/>
+        <w:ind w:left="440"/>
+      </w:pPr>
+    </w:p>
+    <w:p>
+      <w:pPr>
+        <w:pStyle w:val="ListParagraph"/>
+        <w:keepNext/>
+        <w:numPr>
+          <w:ilvl w:val="0"/>
+          <w:numId w:val="2"/>
+        </w:numPr>
+        <w:spacing w:after="0" w:before="120"/>
+      </w:pPr>
+      <w:r>
+        <w:rPr>
+          <w:b/>
+          <w:bCs/>
+        </w:rPr>
+        <w:t xml:space="preserve">What is the Internet?</w:t>
+      </w:r>
+    </w:p>
+    <w:p>
+      <w:pPr>
+        <w:spacing w:after="120"/>
+        <w:ind w:left="440"/>
+      </w:pPr>
+    </w:p>
+    <w:p>
+      <w:pPr>
+        <w:pStyle w:val="Heading1"/>
+      </w:pPr>
+      <w:r>
+        <w:t xml:space="preserve">PIQ 11 – Sister: PhD &amp; Research</w:t>
+      </w:r>
+    </w:p>
+    <w:p>
+      <w:pPr>
+        <w:pStyle w:val="ListParagraph"/>
+        <w:keepNext/>
+        <w:numPr>
+          <w:ilvl w:val="0"/>
+          <w:numId w:val="2"/>
+        </w:numPr>
+        <w:spacing w:after="0" w:before="120"/>
+      </w:pPr>
+      <w:r>
+        <w:rPr>
+          <w:b/>
+          <w:bCs/>
+        </w:rPr>
+        <w:t xml:space="preserve">What is a PhD?</w:t>
+      </w:r>
+    </w:p>
+    <w:p>
+      <w:pPr>
+        <w:spacing w:after="120"/>
+        <w:ind w:left="440"/>
+      </w:pPr>
+    </w:p>
+    <w:p>
+      <w:pPr>
+        <w:pStyle w:val="ListParagraph"/>
+        <w:keepNext/>
+        <w:numPr>
+          <w:ilvl w:val="0"/>
+          <w:numId w:val="2"/>
+        </w:numPr>
+        <w:spacing w:after="0" w:before="120"/>
+      </w:pPr>
+      <w:r>
+        <w:rPr>
+          <w:b/>
+          <w:bCs/>
+        </w:rPr>
+        <w:t xml:space="preserve">How is a PhD different from a master's degree?</w:t>
+      </w:r>
+    </w:p>
+    <w:p>
+      <w:pPr>
+        <w:spacing w:after="120"/>
+        <w:ind w:left="440"/>
+      </w:pPr>
+    </w:p>
+    <w:p>
+      <w:pPr>
+        <w:pStyle w:val="ListParagraph"/>
+        <w:keepNext/>
+        <w:numPr>
+          <w:ilvl w:val="0"/>
+          <w:numId w:val="2"/>
+        </w:numPr>
+        <w:spacing w:after="0" w:before="120"/>
+      </w:pPr>
+      <w:r>
+        <w:rPr>
+          <w:b/>
+          <w:bCs/>
+        </w:rPr>
+        <w:t xml:space="preserve">What is research?</w:t>
+      </w:r>
+    </w:p>
+    <w:p>
+      <w:pPr>
+        <w:spacing w:after="120"/>
+        <w:ind w:left="440"/>
+      </w:pPr>
+    </w:p>
+    <w:p>
+      <w:pPr>
+        <w:pStyle w:val="ListParagraph"/>
+        <w:keepNext/>
+        <w:numPr>
+          <w:ilvl w:val="0"/>
+          <w:numId w:val="2"/>
+        </w:numPr>
+        <w:spacing w:after="0" w:before="120"/>
+      </w:pPr>
+      <w:r>
+        <w:rPr>
+          <w:b/>
+          <w:bCs/>
+        </w:rPr>
+        <w:t xml:space="preserve">What is a research problem?</w:t>
+      </w:r>
+    </w:p>
+    <w:p>
+      <w:pPr>
+        <w:spacing w:after="120"/>
+        <w:ind w:left="440"/>
+      </w:pPr>
+    </w:p>
+    <w:p>
+      <w:pPr>
+        <w:pStyle w:val="ListParagraph"/>
+        <w:keepNext/>
+        <w:numPr>
+          <w:ilvl w:val="0"/>
+          <w:numId w:val="2"/>
+        </w:numPr>
+        <w:spacing w:after="0" w:before="120"/>
+      </w:pPr>
+      <w:r>
+        <w:rPr>
+          <w:b/>
+          <w:bCs/>
+        </w:rPr>
+        <w:t xml:space="preserve">What is a hypothesis?</w:t>
+      </w:r>
+    </w:p>
+    <w:p>
+      <w:pPr>
+        <w:spacing w:after="120"/>
+        <w:ind w:left="440"/>
+      </w:pPr>
+    </w:p>
+    <w:p>
+      <w:pPr>
+        <w:pStyle w:val="ListParagraph"/>
+        <w:keepNext/>
+        <w:numPr>
+          <w:ilvl w:val="0"/>
+          <w:numId w:val="2"/>
+        </w:numPr>
+        <w:spacing w:after="0" w:before="120"/>
+      </w:pPr>
+      <w:r>
+        <w:rPr>
+          <w:b/>
+          <w:bCs/>
+        </w:rPr>
+        <w:t xml:space="preserve">What is a literature review?</w:t>
+      </w:r>
+    </w:p>
+    <w:p>
+      <w:pPr>
+        <w:spacing w:after="120"/>
+        <w:ind w:left="440"/>
+      </w:pPr>
+    </w:p>
+    <w:p>
+      <w:pPr>
+        <w:pStyle w:val="ListParagraph"/>
+        <w:keepNext/>
+        <w:numPr>
+          <w:ilvl w:val="0"/>
+          <w:numId w:val="2"/>
+        </w:numPr>
+        <w:spacing w:after="0" w:before="120"/>
+      </w:pPr>
+      <w:r>
+        <w:rPr>
+          <w:b/>
+          <w:bCs/>
+        </w:rPr>
+        <w:t xml:space="preserve">What is a research paper?</w:t>
+      </w:r>
+    </w:p>
+    <w:p>
+      <w:pPr>
+        <w:spacing w:after="120"/>
+        <w:ind w:left="440"/>
+      </w:pPr>
+    </w:p>
+    <w:p>
+      <w:pPr>
+        <w:pStyle w:val="ListParagraph"/>
+        <w:keepNext/>
+        <w:numPr>
+          <w:ilvl w:val="0"/>
+          <w:numId w:val="2"/>
+        </w:numPr>
+        <w:spacing w:after="0" w:before="120"/>
+      </w:pPr>
+      <w:r>
+        <w:rPr>
+          <w:b/>
+          <w:bCs/>
+        </w:rPr>
+        <w:t xml:space="preserve">What is peer review?</w:t>
+      </w:r>
+    </w:p>
+    <w:p>
+      <w:pPr>
+        <w:spacing w:after="120"/>
+        <w:ind w:left="440"/>
+      </w:pPr>
+    </w:p>
+    <w:p>
+      <w:pPr>
+        <w:pStyle w:val="ListParagraph"/>
+        <w:keepNext/>
+        <w:numPr>
+          <w:ilvl w:val="0"/>
+          <w:numId w:val="2"/>
+        </w:numPr>
+        <w:spacing w:after="0" w:before="120"/>
+      </w:pPr>
+      <w:r>
+        <w:rPr>
+          <w:b/>
+          <w:bCs/>
+        </w:rPr>
+        <w:t xml:space="preserve">What is plagiarism?</w:t>
+      </w:r>
+    </w:p>
+    <w:p>
+      <w:pPr>
+        <w:spacing w:after="120"/>
+        <w:ind w:left="440"/>
+      </w:pPr>
+    </w:p>
+    <w:p>
+      <w:pPr>
+        <w:pStyle w:val="ListParagraph"/>
+        <w:keepNext/>
+        <w:numPr>
+          <w:ilvl w:val="0"/>
+          <w:numId w:val="2"/>
+        </w:numPr>
+        <w:spacing w:after="0" w:before="120"/>
+      </w:pPr>
+      <w:r>
+        <w:rPr>
+          <w:b/>
+          <w:bCs/>
+        </w:rPr>
+        <w:t xml:space="preserve">What is a citation?</w:t>
+      </w:r>
+    </w:p>
+    <w:p>
+      <w:pPr>
+        <w:spacing w:after="120"/>
+        <w:ind w:left="440"/>
+      </w:pPr>
+    </w:p>
+    <w:p>
+      <w:pPr>
+        <w:pStyle w:val="ListParagraph"/>
+        <w:keepNext/>
+        <w:numPr>
+          <w:ilvl w:val="0"/>
+          <w:numId w:val="2"/>
+        </w:numPr>
+        <w:spacing w:after="0" w:before="120"/>
+      </w:pPr>
+      <w:r>
+        <w:rPr>
+          <w:b/>
+          <w:bCs/>
+        </w:rPr>
+        <w:t xml:space="preserve">What is the difference between applied and fundamental research?</w:t>
+      </w:r>
+    </w:p>
+    <w:p>
+      <w:pPr>
+        <w:spacing w:after="120"/>
+        <w:ind w:left="440"/>
+      </w:pPr>
+    </w:p>
+    <w:p>
+      <w:pPr>
+        <w:pStyle w:val="ListParagraph"/>
+        <w:keepNext/>
+        <w:numPr>
+          <w:ilvl w:val="0"/>
+          <w:numId w:val="2"/>
+        </w:numPr>
+        <w:spacing w:after="0" w:before="120"/>
+      </w:pPr>
+      <w:r>
+        <w:rPr>
+          <w:b/>
+          <w:bCs/>
+        </w:rPr>
+        <w:t xml:space="preserve">Why is research important for a country?</w:t>
+      </w:r>
+    </w:p>
+    <w:p>
+      <w:pPr>
+        <w:spacing w:after="120"/>
+        <w:ind w:left="440"/>
+      </w:pPr>
+    </w:p>
+    <w:p>
+      <w:pPr>
+        <w:pStyle w:val="ListParagraph"/>
+        <w:keepNext/>
+        <w:numPr>
+          <w:ilvl w:val="0"/>
+          <w:numId w:val="2"/>
+        </w:numPr>
+        <w:spacing w:after="0" w:before="120"/>
+      </w:pPr>
+      <w:r>
+        <w:rPr>
+          <w:b/>
+          <w:bCs/>
+        </w:rPr>
+        <w:t xml:space="preserve">Why is research important in Computer Science?</w:t>
+      </w:r>
+    </w:p>
+    <w:p>
+      <w:pPr>
+        <w:spacing w:after="120"/>
+        <w:ind w:left="440"/>
+      </w:pPr>
+    </w:p>
+    <w:p>
+      <w:pPr>
+        <w:pStyle w:val="ListParagraph"/>
+        <w:keepNext/>
+        <w:numPr>
+          <w:ilvl w:val="0"/>
+          <w:numId w:val="2"/>
+        </w:numPr>
+        <w:spacing w:after="0" w:before="120"/>
+      </w:pPr>
+      <w:r>
+        <w:rPr>
+          <w:b/>
+          <w:bCs/>
+        </w:rPr>
+        <w:t xml:space="preserve">Why did your sister choose research?</w:t>
+      </w:r>
+    </w:p>
+    <w:p>
+      <w:pPr>
+        <w:spacing w:after="120"/>
+        <w:ind w:left="440"/>
+      </w:pPr>
+    </w:p>
+    <w:p>
+      <w:pPr>
+        <w:pStyle w:val="Heading1"/>
+      </w:pPr>
+      <w:r>
+        <w:t xml:space="preserve">PIQ 11 – Sister: Assistant Professor</w:t>
+      </w:r>
+    </w:p>
+    <w:p>
+      <w:pPr>
+        <w:pStyle w:val="ListParagraph"/>
+        <w:keepNext/>
+        <w:numPr>
+          <w:ilvl w:val="0"/>
+          <w:numId w:val="2"/>
+        </w:numPr>
+        <w:spacing w:after="0" w:before="120"/>
+      </w:pPr>
+      <w:r>
+        <w:rPr>
+          <w:b/>
+          <w:bCs/>
+        </w:rPr>
+        <w:t xml:space="preserve">Is teaching an Assistant Professor's only responsibility?</w:t>
+      </w:r>
+    </w:p>
+    <w:p>
+      <w:pPr>
+        <w:spacing w:after="120"/>
+        <w:ind w:left="440"/>
+      </w:pPr>
+    </w:p>
+    <w:p>
+      <w:pPr>
+        <w:pStyle w:val="ListParagraph"/>
+        <w:keepNext/>
+        <w:numPr>
+          <w:ilvl w:val="0"/>
+          <w:numId w:val="2"/>
+        </w:numPr>
+        <w:spacing w:after="0" w:before="120"/>
+      </w:pPr>
+      <w:r>
+        <w:rPr>
+          <w:b/>
+          <w:bCs/>
+        </w:rPr>
+        <w:t xml:space="preserve">What is the role of research in a professor's job?</w:t>
+      </w:r>
+    </w:p>
+    <w:p>
+      <w:pPr>
+        <w:spacing w:after="120"/>
+        <w:ind w:left="440"/>
+      </w:pPr>
+    </w:p>
+    <w:p>
+      <w:pPr>
+        <w:pStyle w:val="ListParagraph"/>
+        <w:keepNext/>
+        <w:numPr>
+          <w:ilvl w:val="0"/>
+          <w:numId w:val="2"/>
+        </w:numPr>
+        <w:spacing w:after="0" w:before="120"/>
+      </w:pPr>
+      <w:r>
+        <w:rPr>
+          <w:b/>
+          <w:bCs/>
+        </w:rPr>
+        <w:t xml:space="preserve">What is academic administration?</w:t>
+      </w:r>
+    </w:p>
+    <w:p>
+      <w:pPr>
+        <w:spacing w:after="120"/>
+        <w:ind w:left="440"/>
+      </w:pPr>
+    </w:p>
+    <w:p>
+      <w:pPr>
+        <w:pStyle w:val="ListParagraph"/>
+        <w:keepNext/>
+        <w:numPr>
+          <w:ilvl w:val="0"/>
+          <w:numId w:val="2"/>
+        </w:numPr>
+        <w:spacing w:after="0" w:before="120"/>
+      </w:pPr>
+      <w:r>
+        <w:rPr>
+          <w:b/>
+          <w:bCs/>
+        </w:rPr>
+        <w:t xml:space="preserve">How are students evaluated?</w:t>
+      </w:r>
+    </w:p>
+    <w:p>
+      <w:pPr>
+        <w:spacing w:after="120"/>
+        <w:ind w:left="440"/>
+      </w:pPr>
+    </w:p>
+    <w:p>
+      <w:pPr>
+        <w:pStyle w:val="ListParagraph"/>
+        <w:keepNext/>
+        <w:numPr>
+          <w:ilvl w:val="0"/>
+          <w:numId w:val="2"/>
+        </w:numPr>
+        <w:spacing w:after="0" w:before="120"/>
+      </w:pPr>
+      <w:r>
+        <w:rPr>
+          <w:b/>
+          <w:bCs/>
+        </w:rPr>
+        <w:t xml:space="preserve">What is curriculum design?</w:t>
+      </w:r>
+    </w:p>
+    <w:p>
+      <w:pPr>
+        <w:spacing w:after="120"/>
+        <w:ind w:left="440"/>
+      </w:pPr>
+    </w:p>
+    <w:p>
+      <w:pPr>
+        <w:pStyle w:val="ListParagraph"/>
+        <w:keepNext/>
+        <w:numPr>
+          <w:ilvl w:val="0"/>
+          <w:numId w:val="2"/>
+        </w:numPr>
+        <w:spacing w:after="0" w:before="120"/>
+      </w:pPr>
+      <w:r>
+        <w:rPr>
+          <w:b/>
+          <w:bCs/>
+        </w:rPr>
+        <w:t xml:space="preserve">What is mentoring?</w:t>
+      </w:r>
+    </w:p>
+    <w:p>
+      <w:pPr>
+        <w:spacing w:after="120"/>
+        <w:ind w:left="440"/>
+      </w:pPr>
+    </w:p>
+    <w:p>
+      <w:pPr>
+        <w:pStyle w:val="ListParagraph"/>
+        <w:keepNext/>
+        <w:numPr>
+          <w:ilvl w:val="0"/>
+          <w:numId w:val="2"/>
+        </w:numPr>
+        <w:spacing w:after="0" w:before="120"/>
+      </w:pPr>
+      <w:r>
+        <w:rPr>
+          <w:b/>
+          <w:bCs/>
+        </w:rPr>
+        <w:t xml:space="preserve">What is the difference between a professor and a teacher?</w:t>
+      </w:r>
+    </w:p>
+    <w:p>
+      <w:pPr>
+        <w:spacing w:after="120"/>
+        <w:ind w:left="440"/>
+      </w:pPr>
+    </w:p>
+    <w:p>
+      <w:pPr>
+        <w:pStyle w:val="ListParagraph"/>
+        <w:keepNext/>
+        <w:numPr>
+          <w:ilvl w:val="0"/>
+          <w:numId w:val="2"/>
+        </w:numPr>
+        <w:spacing w:after="0" w:before="120"/>
+      </w:pPr>
+      <w:r>
+        <w:rPr>
+          <w:b/>
+          <w:bCs/>
+        </w:rPr>
+        <w:t xml:space="preserve">What challenges do college teachers face?</w:t>
+      </w:r>
+    </w:p>
+    <w:p>
+      <w:pPr>
+        <w:spacing w:after="120"/>
+        <w:ind w:left="440"/>
+      </w:pPr>
+    </w:p>
+    <w:p>
+      <w:pPr>
+        <w:pStyle w:val="ListParagraph"/>
+        <w:keepNext/>
+        <w:numPr>
+          <w:ilvl w:val="0"/>
+          <w:numId w:val="2"/>
+        </w:numPr>
+        <w:spacing w:after="0" w:before="120"/>
+      </w:pPr>
+      <w:r>
+        <w:rPr>
+          <w:b/>
+          <w:bCs/>
+        </w:rPr>
+        <w:t xml:space="preserve">How can higher education be improved in India?</w:t>
+      </w:r>
+    </w:p>
+    <w:p>
+      <w:pPr>
+        <w:spacing w:after="120"/>
+        <w:ind w:left="440"/>
+      </w:pPr>
+    </w:p>
+    <w:p>
+      <w:pPr>
+        <w:pStyle w:val="Heading1"/>
+      </w:pPr>
+      <w:r>
+        <w:t xml:space="preserve">PIQ 11 – Sister and You: Technical</w:t>
+      </w:r>
+    </w:p>
+    <w:p>
+      <w:pPr>
+        <w:pStyle w:val="ListParagraph"/>
+        <w:keepNext/>
+        <w:numPr>
+          <w:ilvl w:val="0"/>
+          <w:numId w:val="2"/>
+        </w:numPr>
+        <w:spacing w:after="0" w:before="120"/>
+      </w:pPr>
+      <w:r>
+        <w:rPr>
+          <w:b/>
+          <w:bCs/>
+        </w:rPr>
+        <w:t xml:space="preserve">Your sister has a PhD in Computer Science. Why didn't you pursue higher studies or research?</w:t>
+      </w:r>
+    </w:p>
+    <w:p>
+      <w:pPr>
+        <w:spacing w:after="120"/>
+        <w:ind w:left="440"/>
+      </w:pPr>
+    </w:p>
+    <w:p>
+      <w:pPr>
+        <w:pStyle w:val="ListParagraph"/>
+        <w:keepNext/>
+        <w:numPr>
+          <w:ilvl w:val="0"/>
+          <w:numId w:val="2"/>
+        </w:numPr>
+        <w:spacing w:after="0" w:before="120"/>
+      </w:pPr>
+      <w:r>
+        <w:rPr>
+          <w:b/>
+          <w:bCs/>
+        </w:rPr>
+        <w:t xml:space="preserve">Do you want to do an M.Tech, MS or PhD in the future?</w:t>
+      </w:r>
+    </w:p>
+    <w:p>
+      <w:pPr>
+        <w:spacing w:after="120"/>
+        <w:ind w:left="440"/>
+      </w:pPr>
+    </w:p>
+    <w:p>
+      <w:pPr>
+        <w:pStyle w:val="ListParagraph"/>
+        <w:keepNext/>
+        <w:numPr>
+          <w:ilvl w:val="0"/>
+          <w:numId w:val="2"/>
+        </w:numPr>
+        <w:spacing w:after="0" w:before="120"/>
+      </w:pPr>
+      <w:r>
+        <w:rPr>
+          <w:b/>
+          <w:bCs/>
+        </w:rPr>
+        <w:t xml:space="preserve">Your sister has a PhD. Why should I consider you technically capable without higher education?</w:t>
+      </w:r>
+    </w:p>
+    <w:p>
+      <w:pPr>
+        <w:spacing w:after="120"/>
+        <w:ind w:left="440"/>
+      </w:pPr>
+    </w:p>
+    <w:p>
+      <w:pPr>
+        <w:pStyle w:val="ListParagraph"/>
+        <w:keepNext/>
+        <w:numPr>
+          <w:ilvl w:val="0"/>
+          <w:numId w:val="2"/>
+        </w:numPr>
+        <w:spacing w:after="0" w:before="120"/>
+      </w:pPr>
+      <w:r>
+        <w:rPr>
+          <w:b/>
+          <w:bCs/>
+        </w:rPr>
+        <w:t xml:space="preserve">Have you discussed Computer Science with her?</w:t>
+      </w:r>
+    </w:p>
+    <w:p>
+      <w:pPr>
+        <w:spacing w:after="120"/>
+        <w:ind w:left="440"/>
+      </w:pPr>
+    </w:p>
+    <w:p>
+      <w:pPr>
+        <w:pStyle w:val="ListParagraph"/>
+        <w:keepNext/>
+        <w:numPr>
+          <w:ilvl w:val="0"/>
+          <w:numId w:val="2"/>
+        </w:numPr>
+        <w:spacing w:after="0" w:before="120"/>
+      </w:pPr>
+      <w:r>
+        <w:rPr>
+          <w:b/>
+          <w:bCs/>
+        </w:rPr>
+        <w:t xml:space="preserve">Does she help you technically?</w:t>
+      </w:r>
+    </w:p>
+    <w:p>
+      <w:pPr>
+        <w:spacing w:after="120"/>
+        <w:ind w:left="440"/>
+      </w:pPr>
+    </w:p>
+    <w:p>
+      <w:pPr>
+        <w:pStyle w:val="ListParagraph"/>
+        <w:keepNext/>
+        <w:numPr>
+          <w:ilvl w:val="0"/>
+          <w:numId w:val="2"/>
+        </w:numPr>
+        <w:spacing w:after="0" w:before="120"/>
+      </w:pPr>
+      <w:r>
+        <w:rPr>
+          <w:b/>
+          <w:bCs/>
+        </w:rPr>
+        <w:t xml:space="preserve">Do you help her with technology?</w:t>
+      </w:r>
+    </w:p>
+    <w:p>
+      <w:pPr>
+        <w:spacing w:after="120"/>
+        <w:ind w:left="440"/>
+      </w:pPr>
+    </w:p>
+    <w:p>
+      <w:pPr>
+        <w:pStyle w:val="ListParagraph"/>
+        <w:keepNext/>
+        <w:numPr>
+          <w:ilvl w:val="0"/>
+          <w:numId w:val="2"/>
+        </w:numPr>
+        <w:spacing w:after="0" w:before="120"/>
+      </w:pPr>
+      <w:r>
+        <w:rPr>
+          <w:b/>
+          <w:bCs/>
+        </w:rPr>
+        <w:t xml:space="preserve">Have you ever worked on a project together?</w:t>
+      </w:r>
+    </w:p>
+    <w:p>
+      <w:pPr>
+        <w:spacing w:after="120"/>
+        <w:ind w:left="440"/>
+      </w:pPr>
+    </w:p>
+    <w:p>
+      <w:pPr>
+        <w:pStyle w:val="ListParagraph"/>
+        <w:keepNext/>
+        <w:numPr>
+          <w:ilvl w:val="0"/>
+          <w:numId w:val="2"/>
+        </w:numPr>
+        <w:spacing w:after="0" w:before="120"/>
+      </w:pPr>
+      <w:r>
+        <w:rPr>
+          <w:b/>
+          <w:bCs/>
+        </w:rPr>
+        <w:t xml:space="preserve">What area of Computer Science interests you?</w:t>
+      </w:r>
+    </w:p>
+    <w:p>
+      <w:pPr>
+        <w:spacing w:after="120"/>
+        <w:ind w:left="440"/>
+      </w:pPr>
+    </w:p>
+    <w:p>
+      <w:pPr>
+        <w:pStyle w:val="ListParagraph"/>
+        <w:keepNext/>
+        <w:numPr>
+          <w:ilvl w:val="0"/>
+          <w:numId w:val="2"/>
+        </w:numPr>
+        <w:spacing w:after="0" w:before="120"/>
+      </w:pPr>
+      <w:r>
+        <w:rPr>
+          <w:b/>
+          <w:bCs/>
+        </w:rPr>
+        <w:t xml:space="preserve">What do you currently do?</w:t>
+      </w:r>
+    </w:p>
+    <w:p>
+      <w:pPr>
+        <w:spacing w:after="120"/>
+        <w:ind w:left="440"/>
+      </w:pPr>
+    </w:p>
+    <w:p>
+      <w:pPr>
+        <w:pStyle w:val="ListParagraph"/>
+        <w:keepNext/>
+        <w:numPr>
+          <w:ilvl w:val="0"/>
+          <w:numId w:val="2"/>
+        </w:numPr>
+        <w:spacing w:after="0" w:before="120"/>
+      </w:pPr>
+      <w:r>
+        <w:rPr>
+          <w:b/>
+          <w:bCs/>
+        </w:rPr>
+        <w:t xml:space="preserve">Why did you choose frontend development?</w:t>
+      </w:r>
+    </w:p>
+    <w:p>
+      <w:pPr>
+        <w:spacing w:after="120"/>
+        <w:ind w:left="440"/>
+      </w:pPr>
+    </w:p>
+    <w:p>
+      <w:pPr>
+        <w:pStyle w:val="ListParagraph"/>
+        <w:keepNext/>
+        <w:numPr>
+          <w:ilvl w:val="0"/>
+          <w:numId w:val="2"/>
+        </w:numPr>
+        <w:spacing w:after="0" w:before="120"/>
+      </w:pPr>
+      <w:r>
+        <w:rPr>
+          <w:b/>
+          <w:bCs/>
+        </w:rPr>
+        <w:t xml:space="preserve">What technologies do you use?</w:t>
+      </w:r>
+    </w:p>
+    <w:p>
+      <w:pPr>
+        <w:spacing w:after="120"/>
+        <w:ind w:left="440"/>
+      </w:pPr>
+    </w:p>
+    <w:p>
+      <w:pPr>
+        <w:pStyle w:val="ListParagraph"/>
+        <w:keepNext/>
+        <w:numPr>
+          <w:ilvl w:val="0"/>
+          <w:numId w:val="2"/>
+        </w:numPr>
+        <w:spacing w:after="0" w:before="120"/>
+      </w:pPr>
+      <w:r>
+        <w:rPr>
+          <w:b/>
+          <w:bCs/>
+        </w:rPr>
+        <w:t xml:space="preserve">What projects have you worked on?</w:t>
+      </w:r>
+    </w:p>
+    <w:p>
+      <w:pPr>
+        <w:spacing w:after="120"/>
+        <w:ind w:left="440"/>
+      </w:pPr>
+    </w:p>
+    <w:p>
+      <w:pPr>
+        <w:pStyle w:val="ListParagraph"/>
+        <w:keepNext/>
+        <w:numPr>
+          <w:ilvl w:val="0"/>
+          <w:numId w:val="2"/>
+        </w:numPr>
+        <w:spacing w:after="0" w:before="120"/>
+      </w:pPr>
+      <w:r>
+        <w:rPr>
+          <w:b/>
+          <w:bCs/>
+        </w:rPr>
+        <w:t xml:space="preserve">What is your strongest technical area?</w:t>
+      </w:r>
+    </w:p>
+    <w:p>
+      <w:pPr>
+        <w:spacing w:after="120"/>
+        <w:ind w:left="440"/>
+      </w:pPr>
+    </w:p>
+    <w:p>
+      <w:pPr>
+        <w:pStyle w:val="ListParagraph"/>
+        <w:keepNext/>
+        <w:numPr>
+          <w:ilvl w:val="0"/>
+          <w:numId w:val="2"/>
+        </w:numPr>
+        <w:spacing w:after="0" w:before="120"/>
+      </w:pPr>
+      <w:r>
+        <w:rPr>
+          <w:b/>
+          <w:bCs/>
+        </w:rPr>
+        <w:t xml:space="preserve">What are the recent developments in AI and cybersecurity?</w:t>
+      </w:r>
+    </w:p>
+    <w:p>
+      <w:pPr>
+        <w:spacing w:after="120"/>
+        <w:ind w:left="440"/>
+      </w:pPr>
+    </w:p>
+    <w:p>
+      <w:pPr>
+        <w:pStyle w:val="Heading1"/>
+      </w:pPr>
+      <w:r>
+        <w:t xml:space="preserve">PIQ 11 – Computer Science in Defence</w:t>
+      </w:r>
+    </w:p>
+    <w:p>
+      <w:pPr>
+        <w:pStyle w:val="ListParagraph"/>
+        <w:keepNext/>
+        <w:numPr>
+          <w:ilvl w:val="0"/>
+          <w:numId w:val="2"/>
+        </w:numPr>
+        <w:spacing w:after="0" w:before="120"/>
+      </w:pPr>
+      <w:r>
+        <w:rPr>
+          <w:b/>
+          <w:bCs/>
+        </w:rPr>
+        <w:t xml:space="preserve">How can your technical knowledge be useful to the Armed Forces?</w:t>
+      </w:r>
+    </w:p>
+    <w:p>
+      <w:pPr>
+        <w:spacing w:after="120"/>
+        <w:ind w:left="440"/>
+      </w:pPr>
+    </w:p>
+    <w:p>
+      <w:pPr>
+        <w:pStyle w:val="ListParagraph"/>
+        <w:keepNext/>
+        <w:numPr>
+          <w:ilvl w:val="0"/>
+          <w:numId w:val="2"/>
+        </w:numPr>
+        <w:spacing w:after="0" w:before="120"/>
+      </w:pPr>
+      <w:r>
+        <w:rPr>
+          <w:b/>
+          <w:bCs/>
+        </w:rPr>
+        <w:t xml:space="preserve">How is AI used in defence?</w:t>
+      </w:r>
+    </w:p>
+    <w:p>
+      <w:pPr>
+        <w:spacing w:after="120"/>
+        <w:ind w:left="440"/>
+      </w:pPr>
+    </w:p>
+    <w:p>
+      <w:pPr>
+        <w:pStyle w:val="ListParagraph"/>
+        <w:keepNext/>
+        <w:numPr>
+          <w:ilvl w:val="0"/>
+          <w:numId w:val="2"/>
+        </w:numPr>
+        <w:spacing w:after="0" w:before="120"/>
+      </w:pPr>
+      <w:r>
+        <w:rPr>
+          <w:b/>
+          <w:bCs/>
+        </w:rPr>
+        <w:t xml:space="preserve">Why is cybersecurity important for the military?</w:t>
+      </w:r>
+    </w:p>
+    <w:p>
+      <w:pPr>
+        <w:spacing w:after="120"/>
+        <w:ind w:left="440"/>
+      </w:pPr>
+    </w:p>
+    <w:p>
+      <w:pPr>
+        <w:pStyle w:val="ListParagraph"/>
+        <w:keepNext/>
+        <w:numPr>
+          <w:ilvl w:val="0"/>
+          <w:numId w:val="2"/>
+        </w:numPr>
+        <w:spacing w:after="0" w:before="120"/>
+      </w:pPr>
+      <w:r>
+        <w:rPr>
+          <w:b/>
+          <w:bCs/>
+        </w:rPr>
+        <w:t xml:space="preserve">What is cyber warfare?</w:t>
+      </w:r>
+    </w:p>
+    <w:p>
+      <w:pPr>
+        <w:spacing w:after="120"/>
+        <w:ind w:left="440"/>
+      </w:pPr>
+    </w:p>
+    <w:p>
+      <w:pPr>
+        <w:pStyle w:val="ListParagraph"/>
+        <w:keepNext/>
+        <w:numPr>
+          <w:ilvl w:val="0"/>
+          <w:numId w:val="2"/>
+        </w:numPr>
+        <w:spacing w:after="0" w:before="120"/>
+      </w:pPr>
+      <w:r>
+        <w:rPr>
+          <w:b/>
+          <w:bCs/>
+        </w:rPr>
+        <w:t xml:space="preserve">How can cyber attacks affect military operations?</w:t>
+      </w:r>
+    </w:p>
+    <w:p>
+      <w:pPr>
+        <w:spacing w:after="120"/>
+        <w:ind w:left="440"/>
+      </w:pPr>
+    </w:p>
+    <w:p>
+      <w:pPr>
+        <w:pStyle w:val="ListParagraph"/>
+        <w:keepNext/>
+        <w:numPr>
+          <w:ilvl w:val="0"/>
+          <w:numId w:val="2"/>
+        </w:numPr>
+        <w:spacing w:after="0" w:before="120"/>
+      </w:pPr>
+      <w:r>
+        <w:rPr>
+          <w:b/>
+          <w:bCs/>
+        </w:rPr>
+        <w:t xml:space="preserve">How can drones use AI?</w:t>
+      </w:r>
+    </w:p>
+    <w:p>
+      <w:pPr>
+        <w:spacing w:after="120"/>
+        <w:ind w:left="440"/>
+      </w:pPr>
+    </w:p>
+    <w:p>
+      <w:pPr>
+        <w:pStyle w:val="ListParagraph"/>
+        <w:keepNext/>
+        <w:numPr>
+          <w:ilvl w:val="0"/>
+          <w:numId w:val="2"/>
+        </w:numPr>
+        <w:spacing w:after="0" w:before="120"/>
+      </w:pPr>
+      <w:r>
+        <w:rPr>
+          <w:b/>
+          <w:bCs/>
+        </w:rPr>
+        <w:t xml:space="preserve">How can AI help intelligence analysis?</w:t>
+      </w:r>
+    </w:p>
+    <w:p>
+      <w:pPr>
+        <w:spacing w:after="120"/>
+        <w:ind w:left="440"/>
+      </w:pPr>
+    </w:p>
+    <w:p>
+      <w:pPr>
+        <w:pStyle w:val="ListParagraph"/>
+        <w:keepNext/>
+        <w:numPr>
+          <w:ilvl w:val="0"/>
+          <w:numId w:val="2"/>
+        </w:numPr>
+        <w:spacing w:after="0" w:before="120"/>
+      </w:pPr>
+      <w:r>
+        <w:rPr>
+          <w:b/>
+          <w:bCs/>
+        </w:rPr>
+        <w:t xml:space="preserve">What is the role of satellite technology in defence?</w:t>
+      </w:r>
+    </w:p>
+    <w:p>
+      <w:pPr>
+        <w:spacing w:after="120"/>
+        <w:ind w:left="440"/>
+      </w:pPr>
+    </w:p>
+    <w:p>
+      <w:pPr>
+        <w:pStyle w:val="ListParagraph"/>
+        <w:keepNext/>
+        <w:numPr>
+          <w:ilvl w:val="0"/>
+          <w:numId w:val="2"/>
+        </w:numPr>
+        <w:spacing w:after="0" w:before="120"/>
+      </w:pPr>
+      <w:r>
+        <w:rPr>
+          <w:b/>
+          <w:bCs/>
+        </w:rPr>
+        <w:t xml:space="preserve">How can autonomous systems be used?</w:t>
+      </w:r>
+    </w:p>
+    <w:p>
+      <w:pPr>
+        <w:spacing w:after="120"/>
+        <w:ind w:left="440"/>
+      </w:pPr>
+    </w:p>
+    <w:p>
+      <w:pPr>
+        <w:pStyle w:val="ListParagraph"/>
+        <w:keepNext/>
+        <w:numPr>
+          <w:ilvl w:val="0"/>
+          <w:numId w:val="2"/>
+        </w:numPr>
+        <w:spacing w:after="0" w:before="120"/>
+      </w:pPr>
+      <w:r>
+        <w:rPr>
+          <w:b/>
+          <w:bCs/>
+        </w:rPr>
+        <w:t xml:space="preserve">What are the risks of AI in warfare?</w:t>
+      </w:r>
+    </w:p>
+    <w:p>
+      <w:pPr>
+        <w:spacing w:after="120"/>
+        <w:ind w:left="440"/>
+      </w:pPr>
+    </w:p>
+    <w:p>
+      <w:pPr>
+        <w:pStyle w:val="ListParagraph"/>
+        <w:keepNext/>
+        <w:numPr>
+          <w:ilvl w:val="0"/>
+          <w:numId w:val="2"/>
+        </w:numPr>
+        <w:spacing w:after="0" w:before="120"/>
+      </w:pPr>
+      <w:r>
+        <w:rPr>
+          <w:b/>
+          <w:bCs/>
+        </w:rPr>
+        <w:t xml:space="preserve">What is quantum computing?</w:t>
+      </w:r>
+    </w:p>
+    <w:p>
+      <w:pPr>
+        <w:spacing w:after="120"/>
+        <w:ind w:left="440"/>
+      </w:pPr>
+    </w:p>
+    <w:p>
+      <w:pPr>
+        <w:pStyle w:val="ListParagraph"/>
+        <w:keepNext/>
+        <w:numPr>
+          <w:ilvl w:val="0"/>
+          <w:numId w:val="2"/>
+        </w:numPr>
+        <w:spacing w:after="0" w:before="120"/>
+      </w:pPr>
+      <w:r>
+        <w:rPr>
+          <w:b/>
+          <w:bCs/>
+        </w:rPr>
+        <w:t xml:space="preserve">Why could quantum computing matter for cybersecurity?</w:t>
+      </w:r>
+    </w:p>
+    <w:p>
+      <w:pPr>
+        <w:spacing w:after="120"/>
+        <w:ind w:left="440"/>
+      </w:pPr>
+    </w:p>
+    <w:p>
+      <w:pPr>
+        <w:pStyle w:val="Heading1"/>
+      </w:pPr>
+      <w:r>
+        <w:t xml:space="preserve">PIQ 11 – Sister: Salary &amp; Academic Career</w:t>
+      </w:r>
+    </w:p>
+    <w:p>
+      <w:pPr>
+        <w:pStyle w:val="ListParagraph"/>
+        <w:keepNext/>
+        <w:numPr>
+          <w:ilvl w:val="0"/>
+          <w:numId w:val="2"/>
+        </w:numPr>
+        <w:spacing w:after="0" w:before="120"/>
+      </w:pPr>
+      <w:r>
+        <w:rPr>
+          <w:b/>
+          <w:bCs/>
+        </w:rPr>
+        <w:t xml:space="preserve">Is ₹90,000 her gross or take-home salary?</w:t>
+      </w:r>
+    </w:p>
+    <w:p>
+      <w:pPr>
+        <w:spacing w:after="120"/>
+        <w:ind w:left="440"/>
+      </w:pPr>
+    </w:p>
+    <w:p>
+      <w:pPr>
+        <w:pStyle w:val="ListParagraph"/>
+        <w:keepNext/>
+        <w:numPr>
+          <w:ilvl w:val="0"/>
+          <w:numId w:val="2"/>
+        </w:numPr>
+        <w:spacing w:after="0" w:before="120"/>
+      </w:pPr>
+      <w:r>
+        <w:rPr>
+          <w:b/>
+          <w:bCs/>
+        </w:rPr>
+        <w:t xml:space="preserve">Is she at a government or private institution?</w:t>
+      </w:r>
+    </w:p>
+    <w:p>
+      <w:pPr>
+        <w:spacing w:after="120"/>
+        <w:ind w:left="440"/>
+      </w:pPr>
+    </w:p>
+    <w:p>
+      <w:pPr>
+        <w:pStyle w:val="ListParagraph"/>
+        <w:keepNext/>
+        <w:numPr>
+          <w:ilvl w:val="0"/>
+          <w:numId w:val="2"/>
+        </w:numPr>
+        <w:spacing w:after="0" w:before="120"/>
+      </w:pPr>
+      <w:r>
+        <w:rPr>
+          <w:b/>
+          <w:bCs/>
+        </w:rPr>
+        <w:t xml:space="preserve">How is an Assistant Professor's salary decided?</w:t>
+      </w:r>
+    </w:p>
+    <w:p>
+      <w:pPr>
+        <w:spacing w:after="120"/>
+        <w:ind w:left="440"/>
+      </w:pPr>
+    </w:p>
+    <w:p>
+      <w:pPr>
+        <w:pStyle w:val="ListParagraph"/>
+        <w:keepNext/>
+        <w:numPr>
+          <w:ilvl w:val="0"/>
+          <w:numId w:val="2"/>
+        </w:numPr>
+        <w:spacing w:after="0" w:before="120"/>
+      </w:pPr>
+      <w:r>
+        <w:rPr>
+          <w:b/>
+          <w:bCs/>
+        </w:rPr>
+        <w:t xml:space="preserve">What are the career stages in academia, and what comes after Assistant Professor?</w:t>
+      </w:r>
+    </w:p>
+    <w:p>
+      <w:pPr>
+        <w:spacing w:after="120"/>
+        <w:ind w:left="440"/>
+      </w:pPr>
+    </w:p>
+    <w:p>
+      <w:pPr>
+        <w:pStyle w:val="ListParagraph"/>
+        <w:keepNext/>
+        <w:numPr>
+          <w:ilvl w:val="0"/>
+          <w:numId w:val="2"/>
+        </w:numPr>
+        <w:spacing w:after="0" w:before="120"/>
+      </w:pPr>
+      <w:r>
+        <w:rPr>
+          <w:b/>
+          <w:bCs/>
+        </w:rPr>
+        <w:t xml:space="preserve">How does someone become a professor?</w:t>
+      </w:r>
+    </w:p>
+    <w:p>
+      <w:pPr>
+        <w:spacing w:after="120"/>
+        <w:ind w:left="440"/>
+      </w:pPr>
+    </w:p>
+    <w:p>
+      <w:pPr>
+        <w:pStyle w:val="ListParagraph"/>
+        <w:keepNext/>
+        <w:numPr>
+          <w:ilvl w:val="0"/>
+          <w:numId w:val="2"/>
+        </w:numPr>
+        <w:spacing w:after="0" w:before="120"/>
+      </w:pPr>
+      <w:r>
+        <w:rPr>
+          <w:b/>
+          <w:bCs/>
+        </w:rPr>
+        <w:t xml:space="preserve">Does research experience affect academic promotion?</w:t>
+      </w:r>
+    </w:p>
+    <w:p>
+      <w:pPr>
+        <w:spacing w:after="120"/>
+        <w:ind w:left="440"/>
+      </w:pPr>
+    </w:p>
+    <w:p>
+      <w:pPr>
+        <w:pStyle w:val="Heading1"/>
+      </w:pPr>
+      <w:r>
+        <w:t xml:space="preserve">PIQ 11 – Sister: Relationship</w:t>
+      </w:r>
+    </w:p>
+    <w:p>
+      <w:pPr>
+        <w:pStyle w:val="ListParagraph"/>
+        <w:keepNext/>
+        <w:numPr>
+          <w:ilvl w:val="0"/>
+          <w:numId w:val="2"/>
+        </w:numPr>
+        <w:spacing w:after="0" w:before="120"/>
+      </w:pPr>
+      <w:r>
+        <w:rPr>
+          <w:b/>
+          <w:bCs/>
+        </w:rPr>
+        <w:t xml:space="preserve">How close are you to your sister?</w:t>
+      </w:r>
+    </w:p>
+    <w:p>
+      <w:pPr>
+        <w:spacing w:after="120"/>
+        <w:ind w:left="440"/>
+      </w:pPr>
+    </w:p>
+    <w:p>
+      <w:pPr>
+        <w:pStyle w:val="ListParagraph"/>
+        <w:keepNext/>
+        <w:numPr>
+          <w:ilvl w:val="0"/>
+          <w:numId w:val="2"/>
+        </w:numPr>
+        <w:spacing w:after="0" w:before="120"/>
+      </w:pPr>
+      <w:r>
+        <w:rPr>
+          <w:b/>
+          <w:bCs/>
+        </w:rPr>
+        <w:t xml:space="preserve">How often do you talk?</w:t>
+      </w:r>
+    </w:p>
+    <w:p>
+      <w:pPr>
+        <w:spacing w:after="120"/>
+        <w:ind w:left="440"/>
+      </w:pPr>
+    </w:p>
+    <w:p>
+      <w:pPr>
+        <w:pStyle w:val="ListParagraph"/>
+        <w:keepNext/>
+        <w:numPr>
+          <w:ilvl w:val="0"/>
+          <w:numId w:val="2"/>
+        </w:numPr>
+        <w:spacing w:after="0" w:before="120"/>
+      </w:pPr>
+      <w:r>
+        <w:rPr>
+          <w:b/>
+          <w:bCs/>
+        </w:rPr>
+        <w:t xml:space="preserve">What do you discuss?</w:t>
+      </w:r>
+    </w:p>
+    <w:p>
+      <w:pPr>
+        <w:spacing w:after="120"/>
+        <w:ind w:left="440"/>
+      </w:pPr>
+    </w:p>
+    <w:p>
+      <w:pPr>
+        <w:pStyle w:val="ListParagraph"/>
+        <w:keepNext/>
+        <w:numPr>
+          <w:ilvl w:val="0"/>
+          <w:numId w:val="2"/>
+        </w:numPr>
+        <w:spacing w:after="0" w:before="120"/>
+      </w:pPr>
+      <w:r>
+        <w:rPr>
+          <w:b/>
+          <w:bCs/>
+        </w:rPr>
+        <w:t xml:space="preserve">Does she advise you about your career?</w:t>
+      </w:r>
+    </w:p>
+    <w:p>
+      <w:pPr>
+        <w:spacing w:after="120"/>
+        <w:ind w:left="440"/>
+      </w:pPr>
+    </w:p>
+    <w:p>
+      <w:pPr>
+        <w:pStyle w:val="ListParagraph"/>
+        <w:keepNext/>
+        <w:numPr>
+          <w:ilvl w:val="0"/>
+          <w:numId w:val="2"/>
+        </w:numPr>
+        <w:spacing w:after="0" w:before="120"/>
+      </w:pPr>
+      <w:r>
+        <w:rPr>
+          <w:b/>
+          <w:bCs/>
+        </w:rPr>
+        <w:t xml:space="preserve">What do you advise her about?</w:t>
+      </w:r>
+    </w:p>
+    <w:p>
+      <w:pPr>
+        <w:spacing w:after="120"/>
+        <w:ind w:left="440"/>
+      </w:pPr>
+    </w:p>
+    <w:p>
+      <w:pPr>
+        <w:pStyle w:val="ListParagraph"/>
+        <w:keepNext/>
+        <w:numPr>
+          <w:ilvl w:val="0"/>
+          <w:numId w:val="2"/>
+        </w:numPr>
+        <w:spacing w:after="0" w:before="120"/>
+      </w:pPr>
+      <w:r>
+        <w:rPr>
+          <w:b/>
+          <w:bCs/>
+        </w:rPr>
+        <w:t xml:space="preserve">What quality do you admire in her?</w:t>
+      </w:r>
+    </w:p>
+    <w:p>
+      <w:pPr>
+        <w:spacing w:after="120"/>
+        <w:ind w:left="440"/>
+      </w:pPr>
+    </w:p>
+    <w:p>
+      <w:pPr>
+        <w:pStyle w:val="ListParagraph"/>
+        <w:keepNext/>
+        <w:numPr>
+          <w:ilvl w:val="0"/>
+          <w:numId w:val="2"/>
+        </w:numPr>
+        <w:spacing w:after="0" w:before="120"/>
+      </w:pPr>
+      <w:r>
+        <w:rPr>
+          <w:b/>
+          <w:bCs/>
+        </w:rPr>
+        <w:t xml:space="preserve">What is one weakness you have seen in her?</w:t>
+      </w:r>
+    </w:p>
+    <w:p>
+      <w:pPr>
+        <w:spacing w:after="120"/>
+        <w:ind w:left="440"/>
+      </w:pPr>
+    </w:p>
+    <w:p>
+      <w:pPr>
+        <w:pStyle w:val="ListParagraph"/>
+        <w:keepNext/>
+        <w:numPr>
+          <w:ilvl w:val="0"/>
+          <w:numId w:val="2"/>
+        </w:numPr>
+        <w:spacing w:after="0" w:before="120"/>
+      </w:pPr>
+      <w:r>
+        <w:rPr>
+          <w:b/>
+          <w:bCs/>
+        </w:rPr>
+        <w:t xml:space="preserve">Have you ever had a disagreement with her? How did you resolve it?</w:t>
+      </w:r>
+    </w:p>
+    <w:p>
+      <w:pPr>
+        <w:spacing w:after="120"/>
+        <w:ind w:left="440"/>
+      </w:pPr>
+    </w:p>
+    <w:p>
+      <w:pPr>
+        <w:pStyle w:val="ListParagraph"/>
+        <w:keepNext/>
+        <w:numPr>
+          <w:ilvl w:val="0"/>
+          <w:numId w:val="2"/>
+        </w:numPr>
+        <w:spacing w:after="0" w:before="120"/>
+      </w:pPr>
+      <w:r>
+        <w:rPr>
+          <w:b/>
+          <w:bCs/>
+        </w:rPr>
+        <w:t xml:space="preserve">What have you learned from her?</w:t>
+      </w:r>
+    </w:p>
+    <w:p>
+      <w:pPr>
+        <w:spacing w:after="120"/>
+        <w:ind w:left="440"/>
+      </w:pPr>
+    </w:p>
+    <w:p>
+      <w:pPr>
+        <w:pStyle w:val="ListParagraph"/>
+        <w:keepNext/>
+        <w:numPr>
+          <w:ilvl w:val="0"/>
+          <w:numId w:val="2"/>
+        </w:numPr>
+        <w:spacing w:after="0" w:before="120"/>
+      </w:pPr>
+      <w:r>
+        <w:rPr>
+          <w:b/>
+          <w:bCs/>
+        </w:rPr>
+        <w:t xml:space="preserve">What is one thing your sister is better at than you?</w:t>
+      </w:r>
+    </w:p>
+    <w:p>
+      <w:pPr>
+        <w:spacing w:after="120"/>
+        <w:ind w:left="440"/>
+      </w:pPr>
+    </w:p>
+    <w:p>
+      <w:pPr>
+        <w:pStyle w:val="ListParagraph"/>
+        <w:keepNext/>
+        <w:numPr>
+          <w:ilvl w:val="0"/>
+          <w:numId w:val="2"/>
+        </w:numPr>
+        <w:spacing w:after="0" w:before="120"/>
+      </w:pPr>
+      <w:r>
+        <w:rPr>
+          <w:b/>
+          <w:bCs/>
+        </w:rPr>
+        <w:t xml:space="preserve">What are you better at than her?</w:t>
+      </w:r>
+    </w:p>
+    <w:p>
+      <w:pPr>
+        <w:spacing w:after="120"/>
+        <w:ind w:left="440"/>
+      </w:pPr>
+    </w:p>
+    <w:p>
+      <w:pPr>
+        <w:pStyle w:val="Heading1"/>
+      </w:pPr>
+      <w:r>
+        <w:t xml:space="preserve">PIQ 11 – Family &amp; Education</w:t>
+      </w:r>
+    </w:p>
+    <w:p>
+      <w:pPr>
+        <w:pStyle w:val="ListParagraph"/>
+        <w:keepNext/>
+        <w:numPr>
+          <w:ilvl w:val="0"/>
+          <w:numId w:val="2"/>
+        </w:numPr>
+        <w:spacing w:after="0" w:before="120"/>
+      </w:pPr>
+      <w:r>
+        <w:rPr>
+          <w:b/>
+          <w:bCs/>
+        </w:rPr>
+        <w:t xml:space="preserve">Tell me about your family.</w:t>
+      </w:r>
+    </w:p>
+    <w:p>
+      <w:pPr>
+        <w:spacing w:after="120"/>
+        <w:ind w:left="440"/>
+      </w:pPr>
+    </w:p>
+    <w:p>
+      <w:pPr>
+        <w:pStyle w:val="ListParagraph"/>
+        <w:keepNext/>
+        <w:numPr>
+          <w:ilvl w:val="0"/>
+          <w:numId w:val="2"/>
+        </w:numPr>
+        <w:spacing w:after="0" w:before="120"/>
+      </w:pPr>
+      <w:r>
+        <w:rPr>
+          <w:b/>
+          <w:bCs/>
+        </w:rPr>
+        <w:t xml:space="preserve">Why is education important in your family?</w:t>
+      </w:r>
+    </w:p>
+    <w:p>
+      <w:pPr>
+        <w:spacing w:after="120"/>
+        <w:ind w:left="440"/>
+      </w:pPr>
+    </w:p>
+    <w:p>
+      <w:pPr>
+        <w:pStyle w:val="ListParagraph"/>
+        <w:keepNext/>
+        <w:numPr>
+          <w:ilvl w:val="0"/>
+          <w:numId w:val="2"/>
+        </w:numPr>
+        <w:spacing w:after="0" w:before="120"/>
+      </w:pPr>
+      <w:r>
+        <w:rPr>
+          <w:b/>
+          <w:bCs/>
+        </w:rPr>
+        <w:t xml:space="preserve">Does your family discuss education often?</w:t>
       </w:r>
     </w:p>
     <w:p>

</xml_diff>

<commit_message>
Add farming units, conversions and calculation questions
Co-Authored-By: Claude Opus 5.5 <noreply@anthropic.com>
Claude-Session: https://claude.ai/code/session_01TypcejD48cCyAqfjtUUit5
</commit_message>
<xml_diff>
--- a/SSB_Question_Sheet.docx
+++ b/SSB_Question_Sheet.docx
@@ -18268,6 +18268,1022 @@
           <w:bCs/>
         </w:rPr>
         <w:t xml:space="preserve">Does your family discuss education often?</w:t>
+      </w:r>
+    </w:p>
+    <w:p>
+      <w:pPr>
+        <w:spacing w:after="120"/>
+        <w:ind w:left="440"/>
+      </w:pPr>
+    </w:p>
+    <w:p>
+      <w:pPr>
+        <w:pStyle w:val="Heading1"/>
+      </w:pPr>
+      <w:r>
+        <w:t xml:space="preserve">Farming: Land Units &amp; Conversions</w:t>
+      </w:r>
+    </w:p>
+    <w:p>
+      <w:pPr>
+        <w:pStyle w:val="ListParagraph"/>
+        <w:keepNext/>
+        <w:numPr>
+          <w:ilvl w:val="0"/>
+          <w:numId w:val="2"/>
+        </w:numPr>
+        <w:spacing w:after="0" w:before="120"/>
+      </w:pPr>
+      <w:r>
+        <w:rPr>
+          <w:b/>
+          <w:bCs/>
+        </w:rPr>
+        <w:t xml:space="preserve">How many square metres are in one hectare?</w:t>
+      </w:r>
+    </w:p>
+    <w:p>
+      <w:pPr>
+        <w:spacing w:after="120"/>
+        <w:ind w:left="440"/>
+      </w:pPr>
+    </w:p>
+    <w:p>
+      <w:pPr>
+        <w:pStyle w:val="ListParagraph"/>
+        <w:keepNext/>
+        <w:numPr>
+          <w:ilvl w:val="0"/>
+          <w:numId w:val="2"/>
+        </w:numPr>
+        <w:spacing w:after="0" w:before="120"/>
+      </w:pPr>
+      <w:r>
+        <w:rPr>
+          <w:b/>
+          <w:bCs/>
+        </w:rPr>
+        <w:t xml:space="preserve">How many acres are in one hectare?</w:t>
+      </w:r>
+    </w:p>
+    <w:p>
+      <w:pPr>
+        <w:spacing w:after="120"/>
+        <w:ind w:left="440"/>
+      </w:pPr>
+    </w:p>
+    <w:p>
+      <w:pPr>
+        <w:pStyle w:val="ListParagraph"/>
+        <w:keepNext/>
+        <w:numPr>
+          <w:ilvl w:val="0"/>
+          <w:numId w:val="2"/>
+        </w:numPr>
+        <w:spacing w:after="0" w:before="120"/>
+      </w:pPr>
+      <w:r>
+        <w:rPr>
+          <w:b/>
+          <w:bCs/>
+        </w:rPr>
+        <w:t xml:space="preserve">How many square feet are in one acre?</w:t>
+      </w:r>
+    </w:p>
+    <w:p>
+      <w:pPr>
+        <w:spacing w:after="120"/>
+        <w:ind w:left="440"/>
+      </w:pPr>
+    </w:p>
+    <w:p>
+      <w:pPr>
+        <w:pStyle w:val="ListParagraph"/>
+        <w:keepNext/>
+        <w:numPr>
+          <w:ilvl w:val="0"/>
+          <w:numId w:val="2"/>
+        </w:numPr>
+        <w:spacing w:after="0" w:before="120"/>
+      </w:pPr>
+      <w:r>
+        <w:rPr>
+          <w:b/>
+          <w:bCs/>
+        </w:rPr>
+        <w:t xml:space="preserve">How many square yards are in one acre?</w:t>
+      </w:r>
+    </w:p>
+    <w:p>
+      <w:pPr>
+        <w:spacing w:after="120"/>
+        <w:ind w:left="440"/>
+      </w:pPr>
+    </w:p>
+    <w:p>
+      <w:pPr>
+        <w:pStyle w:val="ListParagraph"/>
+        <w:keepNext/>
+        <w:numPr>
+          <w:ilvl w:val="0"/>
+          <w:numId w:val="2"/>
+        </w:numPr>
+        <w:spacing w:after="0" w:before="120"/>
+      </w:pPr>
+      <w:r>
+        <w:rPr>
+          <w:b/>
+          <w:bCs/>
+        </w:rPr>
+        <w:t xml:space="preserve">How many hectares are in one acre?</w:t>
+      </w:r>
+    </w:p>
+    <w:p>
+      <w:pPr>
+        <w:spacing w:after="120"/>
+        <w:ind w:left="440"/>
+      </w:pPr>
+    </w:p>
+    <w:p>
+      <w:pPr>
+        <w:pStyle w:val="ListParagraph"/>
+        <w:keepNext/>
+        <w:numPr>
+          <w:ilvl w:val="0"/>
+          <w:numId w:val="2"/>
+        </w:numPr>
+        <w:spacing w:after="0" w:before="120"/>
+      </w:pPr>
+      <w:r>
+        <w:rPr>
+          <w:b/>
+          <w:bCs/>
+        </w:rPr>
+        <w:t xml:space="preserve">How many hectares are in one square kilometre?</w:t>
+      </w:r>
+    </w:p>
+    <w:p>
+      <w:pPr>
+        <w:spacing w:after="120"/>
+        <w:ind w:left="440"/>
+      </w:pPr>
+    </w:p>
+    <w:p>
+      <w:pPr>
+        <w:pStyle w:val="ListParagraph"/>
+        <w:keepNext/>
+        <w:numPr>
+          <w:ilvl w:val="0"/>
+          <w:numId w:val="2"/>
+        </w:numPr>
+        <w:spacing w:after="0" w:before="120"/>
+      </w:pPr>
+      <w:r>
+        <w:rPr>
+          <w:b/>
+          <w:bCs/>
+        </w:rPr>
+        <w:t xml:space="preserve">How many acres are in one square kilometre?</w:t>
+      </w:r>
+    </w:p>
+    <w:p>
+      <w:pPr>
+        <w:spacing w:after="120"/>
+        <w:ind w:left="440"/>
+      </w:pPr>
+    </w:p>
+    <w:p>
+      <w:pPr>
+        <w:pStyle w:val="ListParagraph"/>
+        <w:keepNext/>
+        <w:numPr>
+          <w:ilvl w:val="0"/>
+          <w:numId w:val="2"/>
+        </w:numPr>
+        <w:spacing w:after="0" w:before="120"/>
+      </w:pPr>
+      <w:r>
+        <w:rPr>
+          <w:b/>
+          <w:bCs/>
+        </w:rPr>
+        <w:t xml:space="preserve">What are bigha, biswa and biswansi?</w:t>
+      </w:r>
+    </w:p>
+    <w:p>
+      <w:pPr>
+        <w:spacing w:after="120"/>
+        <w:ind w:left="440"/>
+      </w:pPr>
+    </w:p>
+    <w:p>
+      <w:pPr>
+        <w:pStyle w:val="ListParagraph"/>
+        <w:keepNext/>
+        <w:numPr>
+          <w:ilvl w:val="0"/>
+          <w:numId w:val="2"/>
+        </w:numPr>
+        <w:spacing w:after="0" w:before="120"/>
+      </w:pPr>
+      <w:r>
+        <w:rPr>
+          <w:b/>
+          <w:bCs/>
+        </w:rPr>
+        <w:t xml:space="preserve">Is a bigha the same size everywhere in India?</w:t>
+      </w:r>
+    </w:p>
+    <w:p>
+      <w:pPr>
+        <w:spacing w:after="120"/>
+        <w:ind w:left="440"/>
+      </w:pPr>
+    </w:p>
+    <w:p>
+      <w:pPr>
+        <w:pStyle w:val="ListParagraph"/>
+        <w:keepNext/>
+        <w:numPr>
+          <w:ilvl w:val="0"/>
+          <w:numId w:val="2"/>
+        </w:numPr>
+        <w:spacing w:after="0" w:before="120"/>
+      </w:pPr>
+      <w:r>
+        <w:rPr>
+          <w:b/>
+          <w:bCs/>
+        </w:rPr>
+        <w:t xml:space="preserve">How much is one bigha in your locality in Azamgarh?</w:t>
+      </w:r>
+    </w:p>
+    <w:p>
+      <w:pPr>
+        <w:spacing w:after="120"/>
+        <w:ind w:left="440"/>
+      </w:pPr>
+    </w:p>
+    <w:p>
+      <w:pPr>
+        <w:pStyle w:val="ListParagraph"/>
+        <w:keepNext/>
+        <w:numPr>
+          <w:ilvl w:val="0"/>
+          <w:numId w:val="2"/>
+        </w:numPr>
+        <w:spacing w:after="0" w:before="120"/>
+      </w:pPr>
+      <w:r>
+        <w:rPr>
+          <w:b/>
+          <w:bCs/>
+        </w:rPr>
+        <w:t xml:space="preserve">How many biswa make one bigha in your area?</w:t>
+      </w:r>
+    </w:p>
+    <w:p>
+      <w:pPr>
+        <w:spacing w:after="120"/>
+        <w:ind w:left="440"/>
+      </w:pPr>
+    </w:p>
+    <w:p>
+      <w:pPr>
+        <w:pStyle w:val="ListParagraph"/>
+        <w:keepNext/>
+        <w:numPr>
+          <w:ilvl w:val="0"/>
+          <w:numId w:val="2"/>
+        </w:numPr>
+        <w:spacing w:after="0" w:before="120"/>
+      </w:pPr>
+      <w:r>
+        <w:rPr>
+          <w:b/>
+          <w:bCs/>
+        </w:rPr>
+        <w:t xml:space="preserve">How does your family measure its land?</w:t>
+      </w:r>
+    </w:p>
+    <w:p>
+      <w:pPr>
+        <w:spacing w:after="120"/>
+        <w:ind w:left="440"/>
+      </w:pPr>
+    </w:p>
+    <w:p>
+      <w:pPr>
+        <w:pStyle w:val="Heading1"/>
+      </w:pPr>
+      <w:r>
+        <w:t xml:space="preserve">Farming: Weight, Water &amp; Weather Conversions</w:t>
+      </w:r>
+    </w:p>
+    <w:p>
+      <w:pPr>
+        <w:pStyle w:val="ListParagraph"/>
+        <w:keepNext/>
+        <w:numPr>
+          <w:ilvl w:val="0"/>
+          <w:numId w:val="2"/>
+        </w:numPr>
+        <w:spacing w:after="0" w:before="120"/>
+      </w:pPr>
+      <w:r>
+        <w:rPr>
+          <w:b/>
+          <w:bCs/>
+        </w:rPr>
+        <w:t xml:space="preserve">How many kilograms are in one quintal?</w:t>
+      </w:r>
+    </w:p>
+    <w:p>
+      <w:pPr>
+        <w:spacing w:after="120"/>
+        <w:ind w:left="440"/>
+      </w:pPr>
+    </w:p>
+    <w:p>
+      <w:pPr>
+        <w:pStyle w:val="ListParagraph"/>
+        <w:keepNext/>
+        <w:numPr>
+          <w:ilvl w:val="0"/>
+          <w:numId w:val="2"/>
+        </w:numPr>
+        <w:spacing w:after="0" w:before="120"/>
+      </w:pPr>
+      <w:r>
+        <w:rPr>
+          <w:b/>
+          <w:bCs/>
+        </w:rPr>
+        <w:t xml:space="preserve">How many kilograms are in one tonne?</w:t>
+      </w:r>
+    </w:p>
+    <w:p>
+      <w:pPr>
+        <w:spacing w:after="120"/>
+        <w:ind w:left="440"/>
+      </w:pPr>
+    </w:p>
+    <w:p>
+      <w:pPr>
+        <w:pStyle w:val="ListParagraph"/>
+        <w:keepNext/>
+        <w:numPr>
+          <w:ilvl w:val="0"/>
+          <w:numId w:val="2"/>
+        </w:numPr>
+        <w:spacing w:after="0" w:before="120"/>
+      </w:pPr>
+      <w:r>
+        <w:rPr>
+          <w:b/>
+          <w:bCs/>
+        </w:rPr>
+        <w:t xml:space="preserve">How many quintals are in one tonne?</w:t>
+      </w:r>
+    </w:p>
+    <w:p>
+      <w:pPr>
+        <w:spacing w:after="120"/>
+        <w:ind w:left="440"/>
+      </w:pPr>
+    </w:p>
+    <w:p>
+      <w:pPr>
+        <w:pStyle w:val="ListParagraph"/>
+        <w:keepNext/>
+        <w:numPr>
+          <w:ilvl w:val="0"/>
+          <w:numId w:val="2"/>
+        </w:numPr>
+        <w:spacing w:after="0" w:before="120"/>
+      </w:pPr>
+      <w:r>
+        <w:rPr>
+          <w:b/>
+          <w:bCs/>
+        </w:rPr>
+        <w:t xml:space="preserve">Convert 5 quintals into kilograms.</w:t>
+      </w:r>
+    </w:p>
+    <w:p>
+      <w:pPr>
+        <w:spacing w:after="120"/>
+        <w:ind w:left="440"/>
+      </w:pPr>
+    </w:p>
+    <w:p>
+      <w:pPr>
+        <w:pStyle w:val="ListParagraph"/>
+        <w:keepNext/>
+        <w:numPr>
+          <w:ilvl w:val="0"/>
+          <w:numId w:val="2"/>
+        </w:numPr>
+        <w:spacing w:after="0" w:before="120"/>
+      </w:pPr>
+      <w:r>
+        <w:rPr>
+          <w:b/>
+          <w:bCs/>
+        </w:rPr>
+        <w:t xml:space="preserve">Convert 20 quintals into tonnes.</w:t>
+      </w:r>
+    </w:p>
+    <w:p>
+      <w:pPr>
+        <w:spacing w:after="120"/>
+        <w:ind w:left="440"/>
+      </w:pPr>
+    </w:p>
+    <w:p>
+      <w:pPr>
+        <w:pStyle w:val="ListParagraph"/>
+        <w:keepNext/>
+        <w:numPr>
+          <w:ilvl w:val="0"/>
+          <w:numId w:val="2"/>
+        </w:numPr>
+        <w:spacing w:after="0" w:before="120"/>
+      </w:pPr>
+      <w:r>
+        <w:rPr>
+          <w:b/>
+          <w:bCs/>
+        </w:rPr>
+        <w:t xml:space="preserve">Convert 1.5 tonnes into quintals.</w:t>
+      </w:r>
+    </w:p>
+    <w:p>
+      <w:pPr>
+        <w:spacing w:after="120"/>
+        <w:ind w:left="440"/>
+      </w:pPr>
+    </w:p>
+    <w:p>
+      <w:pPr>
+        <w:pStyle w:val="ListParagraph"/>
+        <w:keepNext/>
+        <w:numPr>
+          <w:ilvl w:val="0"/>
+          <w:numId w:val="2"/>
+        </w:numPr>
+        <w:spacing w:after="0" w:before="120"/>
+      </w:pPr>
+      <w:r>
+        <w:rPr>
+          <w:b/>
+          <w:bCs/>
+        </w:rPr>
+        <w:t xml:space="preserve">How many litres are in one cubic metre?</w:t>
+      </w:r>
+    </w:p>
+    <w:p>
+      <w:pPr>
+        <w:spacing w:after="120"/>
+        <w:ind w:left="440"/>
+      </w:pPr>
+    </w:p>
+    <w:p>
+      <w:pPr>
+        <w:pStyle w:val="ListParagraph"/>
+        <w:keepNext/>
+        <w:numPr>
+          <w:ilvl w:val="0"/>
+          <w:numId w:val="2"/>
+        </w:numPr>
+        <w:spacing w:after="0" w:before="120"/>
+      </w:pPr>
+      <w:r>
+        <w:rPr>
+          <w:b/>
+          <w:bCs/>
+        </w:rPr>
+        <w:t xml:space="preserve">What is a hectare-metre, and how many litres does it hold?</w:t>
+      </w:r>
+    </w:p>
+    <w:p>
+      <w:pPr>
+        <w:spacing w:after="120"/>
+        <w:ind w:left="440"/>
+      </w:pPr>
+    </w:p>
+    <w:p>
+      <w:pPr>
+        <w:pStyle w:val="ListParagraph"/>
+        <w:keepNext/>
+        <w:numPr>
+          <w:ilvl w:val="0"/>
+          <w:numId w:val="2"/>
+        </w:numPr>
+        <w:spacing w:after="0" w:before="120"/>
+      </w:pPr>
+      <w:r>
+        <w:rPr>
+          <w:b/>
+          <w:bCs/>
+        </w:rPr>
+        <w:t xml:space="preserve">How much water does 1 mm of rainfall put on one hectare?</w:t>
+      </w:r>
+    </w:p>
+    <w:p>
+      <w:pPr>
+        <w:spacing w:after="120"/>
+        <w:ind w:left="440"/>
+      </w:pPr>
+    </w:p>
+    <w:p>
+      <w:pPr>
+        <w:pStyle w:val="ListParagraph"/>
+        <w:keepNext/>
+        <w:numPr>
+          <w:ilvl w:val="0"/>
+          <w:numId w:val="2"/>
+        </w:numPr>
+        <w:spacing w:after="0" w:before="120"/>
+      </w:pPr>
+      <w:r>
+        <w:rPr>
+          <w:b/>
+          <w:bCs/>
+        </w:rPr>
+        <w:t xml:space="preserve">How do you convert °C to °F? What is 25°C in °F?</w:t>
+      </w:r>
+    </w:p>
+    <w:p>
+      <w:pPr>
+        <w:spacing w:after="120"/>
+        <w:ind w:left="440"/>
+      </w:pPr>
+    </w:p>
+    <w:p>
+      <w:pPr>
+        <w:pStyle w:val="Heading1"/>
+      </w:pPr>
+      <w:r>
+        <w:t xml:space="preserve">Farming: Calculations</w:t>
+      </w:r>
+    </w:p>
+    <w:p>
+      <w:pPr>
+        <w:pStyle w:val="ListParagraph"/>
+        <w:keepNext/>
+        <w:numPr>
+          <w:ilvl w:val="0"/>
+          <w:numId w:val="2"/>
+        </w:numPr>
+        <w:spacing w:after="0" w:before="120"/>
+      </w:pPr>
+      <w:r>
+        <w:rPr>
+          <w:b/>
+          <w:bCs/>
+        </w:rPr>
+        <w:t xml:space="preserve">Your father produces 20 quintals of wheat per acre. How much will 5 acres produce?</w:t>
+      </w:r>
+    </w:p>
+    <w:p>
+      <w:pPr>
+        <w:spacing w:after="120"/>
+        <w:ind w:left="440"/>
+      </w:pPr>
+    </w:p>
+    <w:p>
+      <w:pPr>
+        <w:pStyle w:val="ListParagraph"/>
+        <w:keepNext/>
+        <w:numPr>
+          <w:ilvl w:val="0"/>
+          <w:numId w:val="2"/>
+        </w:numPr>
+        <w:spacing w:after="0" w:before="120"/>
+      </w:pPr>
+      <w:r>
+        <w:rPr>
+          <w:b/>
+          <w:bCs/>
+        </w:rPr>
+        <w:t xml:space="preserve">One hectare produces 40 quintals. How much will 2.5 hectares produce?</w:t>
+      </w:r>
+    </w:p>
+    <w:p>
+      <w:pPr>
+        <w:spacing w:after="120"/>
+        <w:ind w:left="440"/>
+      </w:pPr>
+    </w:p>
+    <w:p>
+      <w:pPr>
+        <w:pStyle w:val="ListParagraph"/>
+        <w:keepNext/>
+        <w:numPr>
+          <w:ilvl w:val="0"/>
+          <w:numId w:val="2"/>
+        </w:numPr>
+        <w:spacing w:after="0" w:before="120"/>
+      </w:pPr>
+      <w:r>
+        <w:rPr>
+          <w:b/>
+          <w:bCs/>
+        </w:rPr>
+        <w:t xml:space="preserve">The fertiliser requirement is 50 kg per acre. How much is needed for 10 acres?</w:t>
+      </w:r>
+    </w:p>
+    <w:p>
+      <w:pPr>
+        <w:spacing w:after="120"/>
+        <w:ind w:left="440"/>
+      </w:pPr>
+    </w:p>
+    <w:p>
+      <w:pPr>
+        <w:pStyle w:val="ListParagraph"/>
+        <w:keepNext/>
+        <w:numPr>
+          <w:ilvl w:val="0"/>
+          <w:numId w:val="2"/>
+        </w:numPr>
+        <w:spacing w:after="0" w:before="120"/>
+      </w:pPr>
+      <w:r>
+        <w:rPr>
+          <w:b/>
+          <w:bCs/>
+        </w:rPr>
+        <w:t xml:space="preserve">How much fertiliser is needed for 5 hectares at 100 kg per hectare?</w:t>
+      </w:r>
+    </w:p>
+    <w:p>
+      <w:pPr>
+        <w:spacing w:after="120"/>
+        <w:ind w:left="440"/>
+      </w:pPr>
+    </w:p>
+    <w:p>
+      <w:pPr>
+        <w:pStyle w:val="ListParagraph"/>
+        <w:keepNext/>
+        <w:numPr>
+          <w:ilvl w:val="0"/>
+          <w:numId w:val="2"/>
+        </w:numPr>
+        <w:spacing w:after="0" w:before="120"/>
+      </w:pPr>
+      <w:r>
+        <w:rPr>
+          <w:b/>
+          <w:bCs/>
+        </w:rPr>
+        <w:t xml:space="preserve">What does a yield of 3 tonnes per hectare mean in kilograms?</w:t>
+      </w:r>
+    </w:p>
+    <w:p>
+      <w:pPr>
+        <w:spacing w:after="120"/>
+        <w:ind w:left="440"/>
+      </w:pPr>
+    </w:p>
+    <w:p>
+      <w:pPr>
+        <w:pStyle w:val="ListParagraph"/>
+        <w:keepNext/>
+        <w:numPr>
+          <w:ilvl w:val="0"/>
+          <w:numId w:val="2"/>
+        </w:numPr>
+        <w:spacing w:after="0" w:before="120"/>
+      </w:pPr>
+      <w:r>
+        <w:rPr>
+          <w:b/>
+          <w:bCs/>
+        </w:rPr>
+        <w:t xml:space="preserve">At a seed rate of 100 kg per hectare, how much seed is needed for 2.5 hectares?</w:t>
+      </w:r>
+    </w:p>
+    <w:p>
+      <w:pPr>
+        <w:spacing w:after="120"/>
+        <w:ind w:left="440"/>
+      </w:pPr>
+    </w:p>
+    <w:p>
+      <w:pPr>
+        <w:pStyle w:val="ListParagraph"/>
+        <w:keepNext/>
+        <w:numPr>
+          <w:ilvl w:val="0"/>
+          <w:numId w:val="2"/>
+        </w:numPr>
+        <w:spacing w:after="0" w:before="120"/>
+      </w:pPr>
+      <w:r>
+        <w:rPr>
+          <w:b/>
+          <w:bCs/>
+        </w:rPr>
+        <w:t xml:space="preserve">If your father's average monthly income is ₹20,000, what is his annual income?</w:t>
+      </w:r>
+    </w:p>
+    <w:p>
+      <w:pPr>
+        <w:spacing w:after="120"/>
+        <w:ind w:left="440"/>
+      </w:pPr>
+    </w:p>
+    <w:p>
+      <w:pPr>
+        <w:pStyle w:val="ListParagraph"/>
+        <w:keepNext/>
+        <w:numPr>
+          <w:ilvl w:val="0"/>
+          <w:numId w:val="2"/>
+        </w:numPr>
+        <w:spacing w:after="0" w:before="120"/>
+      </w:pPr>
+      <w:r>
+        <w:rPr>
+          <w:b/>
+          <w:bCs/>
+        </w:rPr>
+        <w:t xml:space="preserve">If he earns ₹2.4 lakh a year, what is his average daily income?</w:t>
+      </w:r>
+    </w:p>
+    <w:p>
+      <w:pPr>
+        <w:spacing w:after="120"/>
+        <w:ind w:left="440"/>
+      </w:pPr>
+    </w:p>
+    <w:p>
+      <w:pPr>
+        <w:pStyle w:val="Heading1"/>
+      </w:pPr>
+      <w:r>
+        <w:t xml:space="preserve">Farming: Your Father's Exact Figures</w:t>
+      </w:r>
+    </w:p>
+    <w:p>
+      <w:pPr>
+        <w:pStyle w:val="ListParagraph"/>
+        <w:keepNext/>
+        <w:numPr>
+          <w:ilvl w:val="0"/>
+          <w:numId w:val="2"/>
+        </w:numPr>
+        <w:spacing w:after="0" w:before="120"/>
+      </w:pPr>
+      <w:r>
+        <w:rPr>
+          <w:b/>
+          <w:bCs/>
+        </w:rPr>
+        <w:t xml:space="preserve">How much of your land is cultivated?</w:t>
+      </w:r>
+    </w:p>
+    <w:p>
+      <w:pPr>
+        <w:spacing w:after="120"/>
+        <w:ind w:left="440"/>
+      </w:pPr>
+    </w:p>
+    <w:p>
+      <w:pPr>
+        <w:pStyle w:val="ListParagraph"/>
+        <w:keepNext/>
+        <w:numPr>
+          <w:ilvl w:val="0"/>
+          <w:numId w:val="2"/>
+        </w:numPr>
+        <w:spacing w:after="0" w:before="120"/>
+      </w:pPr>
+      <w:r>
+        <w:rPr>
+          <w:b/>
+          <w:bCs/>
+        </w:rPr>
+        <w:t xml:space="preserve">What is your family's land in acres and hectares?</w:t>
+      </w:r>
+    </w:p>
+    <w:p>
+      <w:pPr>
+        <w:spacing w:after="120"/>
+        <w:ind w:left="440"/>
+      </w:pPr>
+    </w:p>
+    <w:p>
+      <w:pPr>
+        <w:pStyle w:val="ListParagraph"/>
+        <w:keepNext/>
+        <w:numPr>
+          <w:ilvl w:val="0"/>
+          <w:numId w:val="2"/>
+        </w:numPr>
+        <w:spacing w:after="0" w:before="120"/>
+      </w:pPr>
+      <w:r>
+        <w:rPr>
+          <w:b/>
+          <w:bCs/>
+        </w:rPr>
+        <w:t xml:space="preserve">How much land is under each crop?</w:t>
+      </w:r>
+    </w:p>
+    <w:p>
+      <w:pPr>
+        <w:spacing w:after="120"/>
+        <w:ind w:left="440"/>
+      </w:pPr>
+    </w:p>
+    <w:p>
+      <w:pPr>
+        <w:pStyle w:val="ListParagraph"/>
+        <w:keepNext/>
+        <w:numPr>
+          <w:ilvl w:val="0"/>
+          <w:numId w:val="2"/>
+        </w:numPr>
+        <w:spacing w:after="0" w:before="120"/>
+      </w:pPr>
+      <w:r>
+        <w:rPr>
+          <w:b/>
+          <w:bCs/>
+        </w:rPr>
+        <w:t xml:space="preserve">What is the average yield per acre?</w:t>
+      </w:r>
+    </w:p>
+    <w:p>
+      <w:pPr>
+        <w:spacing w:after="120"/>
+        <w:ind w:left="440"/>
+      </w:pPr>
+    </w:p>
+    <w:p>
+      <w:pPr>
+        <w:pStyle w:val="ListParagraph"/>
+        <w:keepNext/>
+        <w:numPr>
+          <w:ilvl w:val="0"/>
+          <w:numId w:val="2"/>
+        </w:numPr>
+        <w:spacing w:after="0" w:before="120"/>
+      </w:pPr>
+      <w:r>
+        <w:rPr>
+          <w:b/>
+          <w:bCs/>
+        </w:rPr>
+        <w:t xml:space="preserve">What is the cost of cultivation per acre?</w:t>
+      </w:r>
+    </w:p>
+    <w:p>
+      <w:pPr>
+        <w:spacing w:after="120"/>
+        <w:ind w:left="440"/>
+      </w:pPr>
+    </w:p>
+    <w:p>
+      <w:pPr>
+        <w:pStyle w:val="ListParagraph"/>
+        <w:keepNext/>
+        <w:numPr>
+          <w:ilvl w:val="0"/>
+          <w:numId w:val="2"/>
+        </w:numPr>
+        <w:spacing w:after="0" w:before="120"/>
+      </w:pPr>
+      <w:r>
+        <w:rPr>
+          <w:b/>
+          <w:bCs/>
+        </w:rPr>
+        <w:t xml:space="preserve">What is the selling price per quintal?</w:t>
+      </w:r>
+    </w:p>
+    <w:p>
+      <w:pPr>
+        <w:spacing w:after="120"/>
+        <w:ind w:left="440"/>
+      </w:pPr>
+    </w:p>
+    <w:p>
+      <w:pPr>
+        <w:pStyle w:val="ListParagraph"/>
+        <w:keepNext/>
+        <w:numPr>
+          <w:ilvl w:val="0"/>
+          <w:numId w:val="2"/>
+        </w:numPr>
+        <w:spacing w:after="0" w:before="120"/>
+      </w:pPr>
+      <w:r>
+        <w:rPr>
+          <w:b/>
+          <w:bCs/>
+        </w:rPr>
+        <w:t xml:space="preserve">What is the total revenue from the farm?</w:t>
+      </w:r>
+    </w:p>
+    <w:p>
+      <w:pPr>
+        <w:spacing w:after="120"/>
+        <w:ind w:left="440"/>
+      </w:pPr>
+    </w:p>
+    <w:p>
+      <w:pPr>
+        <w:pStyle w:val="ListParagraph"/>
+        <w:keepNext/>
+        <w:numPr>
+          <w:ilvl w:val="0"/>
+          <w:numId w:val="2"/>
+        </w:numPr>
+        <w:spacing w:after="0" w:before="120"/>
+      </w:pPr>
+      <w:r>
+        <w:rPr>
+          <w:b/>
+          <w:bCs/>
+        </w:rPr>
+        <w:t xml:space="preserve">What is the approximate profit?</w:t>
+      </w:r>
+    </w:p>
+    <w:p>
+      <w:pPr>
+        <w:spacing w:after="120"/>
+        <w:ind w:left="440"/>
+      </w:pPr>
+    </w:p>
+    <w:p>
+      <w:pPr>
+        <w:pStyle w:val="ListParagraph"/>
+        <w:keepNext/>
+        <w:numPr>
+          <w:ilvl w:val="0"/>
+          <w:numId w:val="2"/>
+        </w:numPr>
+        <w:spacing w:after="0" w:before="120"/>
+      </w:pPr>
+      <w:r>
+        <w:rPr>
+          <w:b/>
+          <w:bCs/>
+        </w:rPr>
+        <w:t xml:space="preserve">What percentage of the cost goes on inputs?</w:t>
+      </w:r>
+    </w:p>
+    <w:p>
+      <w:pPr>
+        <w:spacing w:after="120"/>
+        <w:ind w:left="440"/>
+      </w:pPr>
+    </w:p>
+    <w:p>
+      <w:pPr>
+        <w:pStyle w:val="ListParagraph"/>
+        <w:keepNext/>
+        <w:numPr>
+          <w:ilvl w:val="0"/>
+          <w:numId w:val="2"/>
+        </w:numPr>
+        <w:spacing w:after="0" w:before="120"/>
+      </w:pPr>
+      <w:r>
+        <w:rPr>
+          <w:b/>
+          <w:bCs/>
+        </w:rPr>
+        <w:t xml:space="preserve">How much water do your crops need?</w:t>
+      </w:r>
+    </w:p>
+    <w:p>
+      <w:pPr>
+        <w:spacing w:after="120"/>
+        <w:ind w:left="440"/>
+      </w:pPr>
+    </w:p>
+    <w:p>
+      <w:pPr>
+        <w:pStyle w:val="ListParagraph"/>
+        <w:keepNext/>
+        <w:numPr>
+          <w:ilvl w:val="0"/>
+          <w:numId w:val="2"/>
+        </w:numPr>
+        <w:spacing w:after="0" w:before="120"/>
+      </w:pPr>
+      <w:r>
+        <w:rPr>
+          <w:b/>
+          <w:bCs/>
+        </w:rPr>
+        <w:t xml:space="preserve">How much electricity or diesel does irrigation use?</w:t>
       </w:r>
     </w:p>
     <w:p>

</xml_diff>

<commit_message>
Add PIQ 13 (Class 10) questions to SSB question sheet
Co-Authored-By: Claude Opus 5.5 <noreply@anthropic.com>
Claude-Session: https://claude.ai/code/session_01TypcejD48cCyAqfjtUUit5
</commit_message>
<xml_diff>
--- a/SSB_Question_Sheet.docx
+++ b/SSB_Question_Sheet.docx
@@ -19284,6 +19284,2246 @@
           <w:bCs/>
         </w:rPr>
         <w:t xml:space="preserve">How much electricity or diesel does irrigation use?</w:t>
+      </w:r>
+    </w:p>
+    <w:p>
+      <w:pPr>
+        <w:spacing w:after="120"/>
+        <w:ind w:left="440"/>
+      </w:pPr>
+    </w:p>
+    <w:p>
+      <w:pPr>
+        <w:pStyle w:val="Heading1"/>
+      </w:pPr>
+      <w:r>
+        <w:t xml:space="preserve">PIQ 13 – Class 10</w:t>
+      </w:r>
+    </w:p>
+    <w:p>
+      <w:pPr>
+        <w:pStyle w:val="ListParagraph"/>
+        <w:keepNext/>
+        <w:numPr>
+          <w:ilvl w:val="0"/>
+          <w:numId w:val="2"/>
+        </w:numPr>
+        <w:spacing w:after="0" w:before="120"/>
+      </w:pPr>
+      <w:r>
+        <w:rPr>
+          <w:b/>
+          <w:bCs/>
+        </w:rPr>
+        <w:t xml:space="preserve">Which school did you attend?</w:t>
+      </w:r>
+    </w:p>
+    <w:p>
+      <w:pPr>
+        <w:spacing w:after="120"/>
+        <w:ind w:left="440"/>
+      </w:pPr>
+    </w:p>
+    <w:p>
+      <w:pPr>
+        <w:pStyle w:val="ListParagraph"/>
+        <w:keepNext/>
+        <w:numPr>
+          <w:ilvl w:val="0"/>
+          <w:numId w:val="2"/>
+        </w:numPr>
+        <w:spacing w:after="0" w:before="120"/>
+      </w:pPr>
+      <w:r>
+        <w:rPr>
+          <w:b/>
+          <w:bCs/>
+        </w:rPr>
+        <w:t xml:space="preserve">Where is Children College located?</w:t>
+      </w:r>
+    </w:p>
+    <w:p>
+      <w:pPr>
+        <w:spacing w:after="120"/>
+        <w:ind w:left="440"/>
+      </w:pPr>
+    </w:p>
+    <w:p>
+      <w:pPr>
+        <w:pStyle w:val="ListParagraph"/>
+        <w:keepNext/>
+        <w:numPr>
+          <w:ilvl w:val="0"/>
+          <w:numId w:val="2"/>
+        </w:numPr>
+        <w:spacing w:after="0" w:before="120"/>
+      </w:pPr>
+      <w:r>
+        <w:rPr>
+          <w:b/>
+          <w:bCs/>
+        </w:rPr>
+        <w:t xml:space="preserve">Which board did you study under?</w:t>
+      </w:r>
+    </w:p>
+    <w:p>
+      <w:pPr>
+        <w:spacing w:after="120"/>
+        <w:ind w:left="440"/>
+      </w:pPr>
+    </w:p>
+    <w:p>
+      <w:pPr>
+        <w:pStyle w:val="ListParagraph"/>
+        <w:keepNext/>
+        <w:numPr>
+          <w:ilvl w:val="0"/>
+          <w:numId w:val="2"/>
+        </w:numPr>
+        <w:spacing w:after="0" w:before="120"/>
+      </w:pPr>
+      <w:r>
+        <w:rPr>
+          <w:b/>
+          <w:bCs/>
+        </w:rPr>
+        <w:t xml:space="preserve">Why did you choose ICSE?</w:t>
+      </w:r>
+    </w:p>
+    <w:p>
+      <w:pPr>
+        <w:spacing w:after="120"/>
+        <w:ind w:left="440"/>
+      </w:pPr>
+    </w:p>
+    <w:p>
+      <w:pPr>
+        <w:pStyle w:val="ListParagraph"/>
+        <w:keepNext/>
+        <w:numPr>
+          <w:ilvl w:val="0"/>
+          <w:numId w:val="2"/>
+        </w:numPr>
+        <w:spacing w:after="0" w:before="120"/>
+      </w:pPr>
+      <w:r>
+        <w:rPr>
+          <w:b/>
+          <w:bCs/>
+        </w:rPr>
+        <w:t xml:space="preserve">When did you pass Class 10?</w:t>
+      </w:r>
+    </w:p>
+    <w:p>
+      <w:pPr>
+        <w:spacing w:after="120"/>
+        <w:ind w:left="440"/>
+      </w:pPr>
+    </w:p>
+    <w:p>
+      <w:pPr>
+        <w:pStyle w:val="ListParagraph"/>
+        <w:keepNext/>
+        <w:numPr>
+          <w:ilvl w:val="0"/>
+          <w:numId w:val="2"/>
+        </w:numPr>
+        <w:spacing w:after="0" w:before="120"/>
+      </w:pPr>
+      <w:r>
+        <w:rPr>
+          <w:b/>
+          <w:bCs/>
+        </w:rPr>
+        <w:t xml:space="preserve">What percentage did you score?</w:t>
+      </w:r>
+    </w:p>
+    <w:p>
+      <w:pPr>
+        <w:spacing w:after="120"/>
+        <w:ind w:left="440"/>
+      </w:pPr>
+    </w:p>
+    <w:p>
+      <w:pPr>
+        <w:pStyle w:val="ListParagraph"/>
+        <w:keepNext/>
+        <w:numPr>
+          <w:ilvl w:val="0"/>
+          <w:numId w:val="2"/>
+        </w:numPr>
+        <w:spacing w:after="0" w:before="120"/>
+      </w:pPr>
+      <w:r>
+        <w:rPr>
+          <w:b/>
+          <w:bCs/>
+        </w:rPr>
+        <w:t xml:space="preserve">What does 84.83% say about your performance?</w:t>
+      </w:r>
+    </w:p>
+    <w:p>
+      <w:pPr>
+        <w:spacing w:after="120"/>
+        <w:ind w:left="440"/>
+      </w:pPr>
+    </w:p>
+    <w:p>
+      <w:pPr>
+        <w:pStyle w:val="ListParagraph"/>
+        <w:keepNext/>
+        <w:numPr>
+          <w:ilvl w:val="0"/>
+          <w:numId w:val="2"/>
+        </w:numPr>
+        <w:spacing w:after="0" w:before="120"/>
+      </w:pPr>
+      <w:r>
+        <w:rPr>
+          <w:b/>
+          <w:bCs/>
+        </w:rPr>
+        <w:t xml:space="preserve">Were you satisfied with your result?</w:t>
+      </w:r>
+    </w:p>
+    <w:p>
+      <w:pPr>
+        <w:spacing w:after="120"/>
+        <w:ind w:left="440"/>
+      </w:pPr>
+    </w:p>
+    <w:p>
+      <w:pPr>
+        <w:pStyle w:val="ListParagraph"/>
+        <w:keepNext/>
+        <w:numPr>
+          <w:ilvl w:val="0"/>
+          <w:numId w:val="2"/>
+        </w:numPr>
+        <w:spacing w:after="0" w:before="120"/>
+      </w:pPr>
+      <w:r>
+        <w:rPr>
+          <w:b/>
+          <w:bCs/>
+        </w:rPr>
+        <w:t xml:space="preserve">Which subjects did you study?</w:t>
+      </w:r>
+    </w:p>
+    <w:p>
+      <w:pPr>
+        <w:spacing w:after="120"/>
+        <w:ind w:left="440"/>
+      </w:pPr>
+    </w:p>
+    <w:p>
+      <w:pPr>
+        <w:pStyle w:val="ListParagraph"/>
+        <w:keepNext/>
+        <w:numPr>
+          <w:ilvl w:val="0"/>
+          <w:numId w:val="2"/>
+        </w:numPr>
+        <w:spacing w:after="0" w:before="120"/>
+      </w:pPr>
+      <w:r>
+        <w:rPr>
+          <w:b/>
+          <w:bCs/>
+        </w:rPr>
+        <w:t xml:space="preserve">Why did you choose Science with Computer?</w:t>
+      </w:r>
+    </w:p>
+    <w:p>
+      <w:pPr>
+        <w:spacing w:after="120"/>
+        <w:ind w:left="440"/>
+      </w:pPr>
+    </w:p>
+    <w:p>
+      <w:pPr>
+        <w:pStyle w:val="ListParagraph"/>
+        <w:keepNext/>
+        <w:numPr>
+          <w:ilvl w:val="0"/>
+          <w:numId w:val="2"/>
+        </w:numPr>
+        <w:spacing w:after="0" w:before="120"/>
+      </w:pPr>
+      <w:r>
+        <w:rPr>
+          <w:b/>
+          <w:bCs/>
+        </w:rPr>
+        <w:t xml:space="preserve">Which was your favourite subject?</w:t>
+      </w:r>
+    </w:p>
+    <w:p>
+      <w:pPr>
+        <w:spacing w:after="120"/>
+        <w:ind w:left="440"/>
+      </w:pPr>
+    </w:p>
+    <w:p>
+      <w:pPr>
+        <w:pStyle w:val="ListParagraph"/>
+        <w:keepNext/>
+        <w:numPr>
+          <w:ilvl w:val="0"/>
+          <w:numId w:val="2"/>
+        </w:numPr>
+        <w:spacing w:after="0" w:before="120"/>
+      </w:pPr>
+      <w:r>
+        <w:rPr>
+          <w:b/>
+          <w:bCs/>
+        </w:rPr>
+        <w:t xml:space="preserve">Which subject did you find difficult, and why?</w:t>
+      </w:r>
+    </w:p>
+    <w:p>
+      <w:pPr>
+        <w:spacing w:after="120"/>
+        <w:ind w:left="440"/>
+      </w:pPr>
+    </w:p>
+    <w:p>
+      <w:pPr>
+        <w:pStyle w:val="Heading1"/>
+      </w:pPr>
+      <w:r>
+        <w:t xml:space="preserve">PIQ 13 – Class 10: ICSE</w:t>
+      </w:r>
+    </w:p>
+    <w:p>
+      <w:pPr>
+        <w:pStyle w:val="ListParagraph"/>
+        <w:keepNext/>
+        <w:numPr>
+          <w:ilvl w:val="0"/>
+          <w:numId w:val="2"/>
+        </w:numPr>
+        <w:spacing w:after="0" w:before="120"/>
+      </w:pPr>
+      <w:r>
+        <w:rPr>
+          <w:b/>
+          <w:bCs/>
+        </w:rPr>
+        <w:t xml:space="preserve">What does ICSE stand for?</w:t>
+      </w:r>
+    </w:p>
+    <w:p>
+      <w:pPr>
+        <w:spacing w:after="120"/>
+        <w:ind w:left="440"/>
+      </w:pPr>
+    </w:p>
+    <w:p>
+      <w:pPr>
+        <w:pStyle w:val="ListParagraph"/>
+        <w:keepNext/>
+        <w:numPr>
+          <w:ilvl w:val="0"/>
+          <w:numId w:val="2"/>
+        </w:numPr>
+        <w:spacing w:after="0" w:before="120"/>
+      </w:pPr>
+      <w:r>
+        <w:rPr>
+          <w:b/>
+          <w:bCs/>
+        </w:rPr>
+        <w:t xml:space="preserve">Which body conducts ICSE? What is CISCE?</w:t>
+      </w:r>
+    </w:p>
+    <w:p>
+      <w:pPr>
+        <w:spacing w:after="120"/>
+        <w:ind w:left="440"/>
+      </w:pPr>
+    </w:p>
+    <w:p>
+      <w:pPr>
+        <w:pStyle w:val="ListParagraph"/>
+        <w:keepNext/>
+        <w:numPr>
+          <w:ilvl w:val="0"/>
+          <w:numId w:val="2"/>
+        </w:numPr>
+        <w:spacing w:after="0" w:before="120"/>
+      </w:pPr>
+      <w:r>
+        <w:rPr>
+          <w:b/>
+          <w:bCs/>
+        </w:rPr>
+        <w:t xml:space="preserve">What is the difference between ICSE and CBSE?</w:t>
+      </w:r>
+    </w:p>
+    <w:p>
+      <w:pPr>
+        <w:spacing w:after="120"/>
+        <w:ind w:left="440"/>
+      </w:pPr>
+    </w:p>
+    <w:p>
+      <w:pPr>
+        <w:pStyle w:val="ListParagraph"/>
+        <w:keepNext/>
+        <w:numPr>
+          <w:ilvl w:val="0"/>
+          <w:numId w:val="2"/>
+        </w:numPr>
+        <w:spacing w:after="0" w:before="120"/>
+      </w:pPr>
+      <w:r>
+        <w:rPr>
+          <w:b/>
+          <w:bCs/>
+        </w:rPr>
+        <w:t xml:space="preserve">What is the difference between a board and a school?</w:t>
+      </w:r>
+    </w:p>
+    <w:p>
+      <w:pPr>
+        <w:spacing w:after="120"/>
+        <w:ind w:left="440"/>
+      </w:pPr>
+    </w:p>
+    <w:p>
+      <w:pPr>
+        <w:pStyle w:val="ListParagraph"/>
+        <w:keepNext/>
+        <w:numPr>
+          <w:ilvl w:val="0"/>
+          <w:numId w:val="2"/>
+        </w:numPr>
+        <w:spacing w:after="0" w:before="120"/>
+      </w:pPr>
+      <w:r>
+        <w:rPr>
+          <w:b/>
+          <w:bCs/>
+        </w:rPr>
+        <w:t xml:space="preserve">What are the main features of ICSE?</w:t>
+      </w:r>
+    </w:p>
+    <w:p>
+      <w:pPr>
+        <w:spacing w:after="120"/>
+        <w:ind w:left="440"/>
+      </w:pPr>
+    </w:p>
+    <w:p>
+      <w:pPr>
+        <w:pStyle w:val="ListParagraph"/>
+        <w:keepNext/>
+        <w:numPr>
+          <w:ilvl w:val="0"/>
+          <w:numId w:val="2"/>
+        </w:numPr>
+        <w:spacing w:after="0" w:before="120"/>
+      </w:pPr>
+      <w:r>
+        <w:rPr>
+          <w:b/>
+          <w:bCs/>
+        </w:rPr>
+        <w:t xml:space="preserve">How was your experience with the ICSE curriculum?</w:t>
+      </w:r>
+    </w:p>
+    <w:p>
+      <w:pPr>
+        <w:spacing w:after="120"/>
+        <w:ind w:left="440"/>
+      </w:pPr>
+    </w:p>
+    <w:p>
+      <w:pPr>
+        <w:pStyle w:val="Heading1"/>
+      </w:pPr>
+      <w:r>
+        <w:t xml:space="preserve">PIQ 13 – Class 10: Science &amp; Computer</w:t>
+      </w:r>
+    </w:p>
+    <w:p>
+      <w:pPr>
+        <w:pStyle w:val="ListParagraph"/>
+        <w:keepNext/>
+        <w:numPr>
+          <w:ilvl w:val="0"/>
+          <w:numId w:val="2"/>
+        </w:numPr>
+        <w:spacing w:after="0" w:before="120"/>
+      </w:pPr>
+      <w:r>
+        <w:rPr>
+          <w:b/>
+          <w:bCs/>
+        </w:rPr>
+        <w:t xml:space="preserve">Which science subject was your strongest, and why?</w:t>
+      </w:r>
+    </w:p>
+    <w:p>
+      <w:pPr>
+        <w:spacing w:after="120"/>
+        <w:ind w:left="440"/>
+      </w:pPr>
+    </w:p>
+    <w:p>
+      <w:pPr>
+        <w:pStyle w:val="ListParagraph"/>
+        <w:keepNext/>
+        <w:numPr>
+          <w:ilvl w:val="0"/>
+          <w:numId w:val="2"/>
+        </w:numPr>
+        <w:spacing w:after="0" w:before="120"/>
+      </w:pPr>
+      <w:r>
+        <w:rPr>
+          <w:b/>
+          <w:bCs/>
+        </w:rPr>
+        <w:t xml:space="preserve">Which science subject was your weakest, and why?</w:t>
+      </w:r>
+    </w:p>
+    <w:p>
+      <w:pPr>
+        <w:spacing w:after="120"/>
+        <w:ind w:left="440"/>
+      </w:pPr>
+    </w:p>
+    <w:p>
+      <w:pPr>
+        <w:pStyle w:val="ListParagraph"/>
+        <w:keepNext/>
+        <w:numPr>
+          <w:ilvl w:val="0"/>
+          <w:numId w:val="2"/>
+        </w:numPr>
+        <w:spacing w:after="0" w:before="120"/>
+      </w:pPr>
+      <w:r>
+        <w:rPr>
+          <w:b/>
+          <w:bCs/>
+        </w:rPr>
+        <w:t xml:space="preserve">Tell me one concept you remember from Class 10 Physics.</w:t>
+      </w:r>
+    </w:p>
+    <w:p>
+      <w:pPr>
+        <w:spacing w:after="120"/>
+        <w:ind w:left="440"/>
+      </w:pPr>
+    </w:p>
+    <w:p>
+      <w:pPr>
+        <w:pStyle w:val="ListParagraph"/>
+        <w:keepNext/>
+        <w:numPr>
+          <w:ilvl w:val="0"/>
+          <w:numId w:val="2"/>
+        </w:numPr>
+        <w:spacing w:after="0" w:before="120"/>
+      </w:pPr>
+      <w:r>
+        <w:rPr>
+          <w:b/>
+          <w:bCs/>
+        </w:rPr>
+        <w:t xml:space="preserve">Tell me one concept from Class 10 Chemistry.</w:t>
+      </w:r>
+    </w:p>
+    <w:p>
+      <w:pPr>
+        <w:spacing w:after="120"/>
+        <w:ind w:left="440"/>
+      </w:pPr>
+    </w:p>
+    <w:p>
+      <w:pPr>
+        <w:pStyle w:val="ListParagraph"/>
+        <w:keepNext/>
+        <w:numPr>
+          <w:ilvl w:val="0"/>
+          <w:numId w:val="2"/>
+        </w:numPr>
+        <w:spacing w:after="0" w:before="120"/>
+      </w:pPr>
+      <w:r>
+        <w:rPr>
+          <w:b/>
+          <w:bCs/>
+        </w:rPr>
+        <w:t xml:space="preserve">What is the difference between physics and chemistry?</w:t>
+      </w:r>
+    </w:p>
+    <w:p>
+      <w:pPr>
+        <w:spacing w:after="120"/>
+        <w:ind w:left="440"/>
+      </w:pPr>
+    </w:p>
+    <w:p>
+      <w:pPr>
+        <w:pStyle w:val="ListParagraph"/>
+        <w:keepNext/>
+        <w:numPr>
+          <w:ilvl w:val="0"/>
+          <w:numId w:val="2"/>
+        </w:numPr>
+        <w:spacing w:after="0" w:before="120"/>
+      </w:pPr>
+      <w:r>
+        <w:rPr>
+          <w:b/>
+          <w:bCs/>
+        </w:rPr>
+        <w:t xml:space="preserve">What did you learn in Computer?</w:t>
+      </w:r>
+    </w:p>
+    <w:p>
+      <w:pPr>
+        <w:spacing w:after="120"/>
+        <w:ind w:left="440"/>
+      </w:pPr>
+    </w:p>
+    <w:p>
+      <w:pPr>
+        <w:pStyle w:val="ListParagraph"/>
+        <w:keepNext/>
+        <w:numPr>
+          <w:ilvl w:val="0"/>
+          <w:numId w:val="2"/>
+        </w:numPr>
+        <w:spacing w:after="0" w:before="120"/>
+      </w:pPr>
+      <w:r>
+        <w:rPr>
+          <w:b/>
+          <w:bCs/>
+        </w:rPr>
+        <w:t xml:space="preserve">Which programming language did you study?</w:t>
+      </w:r>
+    </w:p>
+    <w:p>
+      <w:pPr>
+        <w:spacing w:after="120"/>
+        <w:ind w:left="440"/>
+      </w:pPr>
+    </w:p>
+    <w:p>
+      <w:pPr>
+        <w:pStyle w:val="ListParagraph"/>
+        <w:keepNext/>
+        <w:numPr>
+          <w:ilvl w:val="0"/>
+          <w:numId w:val="2"/>
+        </w:numPr>
+        <w:spacing w:after="0" w:before="120"/>
+      </w:pPr>
+      <w:r>
+        <w:rPr>
+          <w:b/>
+          <w:bCs/>
+        </w:rPr>
+        <w:t xml:space="preserve">What is a flowchart?</w:t>
+      </w:r>
+    </w:p>
+    <w:p>
+      <w:pPr>
+        <w:spacing w:after="120"/>
+        <w:ind w:left="440"/>
+      </w:pPr>
+    </w:p>
+    <w:p>
+      <w:pPr>
+        <w:pStyle w:val="ListParagraph"/>
+        <w:keepNext/>
+        <w:numPr>
+          <w:ilvl w:val="0"/>
+          <w:numId w:val="2"/>
+        </w:numPr>
+        <w:spacing w:after="0" w:before="120"/>
+      </w:pPr>
+      <w:r>
+        <w:rPr>
+          <w:b/>
+          <w:bCs/>
+        </w:rPr>
+        <w:t xml:space="preserve">What is a variable?</w:t>
+      </w:r>
+    </w:p>
+    <w:p>
+      <w:pPr>
+        <w:spacing w:after="120"/>
+        <w:ind w:left="440"/>
+      </w:pPr>
+    </w:p>
+    <w:p>
+      <w:pPr>
+        <w:pStyle w:val="ListParagraph"/>
+        <w:keepNext/>
+        <w:numPr>
+          <w:ilvl w:val="0"/>
+          <w:numId w:val="2"/>
+        </w:numPr>
+        <w:spacing w:after="0" w:before="120"/>
+      </w:pPr>
+      <w:r>
+        <w:rPr>
+          <w:b/>
+          <w:bCs/>
+        </w:rPr>
+        <w:t xml:space="preserve">What is a loop?</w:t>
+      </w:r>
+    </w:p>
+    <w:p>
+      <w:pPr>
+        <w:spacing w:after="120"/>
+        <w:ind w:left="440"/>
+      </w:pPr>
+    </w:p>
+    <w:p>
+      <w:pPr>
+        <w:pStyle w:val="ListParagraph"/>
+        <w:keepNext/>
+        <w:numPr>
+          <w:ilvl w:val="0"/>
+          <w:numId w:val="2"/>
+        </w:numPr>
+        <w:spacing w:after="0" w:before="120"/>
+      </w:pPr>
+      <w:r>
+        <w:rPr>
+          <w:b/>
+          <w:bCs/>
+        </w:rPr>
+        <w:t xml:space="preserve">What is a compiler?</w:t>
+      </w:r>
+    </w:p>
+    <w:p>
+      <w:pPr>
+        <w:spacing w:after="120"/>
+        <w:ind w:left="440"/>
+      </w:pPr>
+    </w:p>
+    <w:p>
+      <w:pPr>
+        <w:pStyle w:val="Heading1"/>
+      </w:pPr>
+      <w:r>
+        <w:t xml:space="preserve">PIQ 13 – Class 10: Academic Performance</w:t>
+      </w:r>
+    </w:p>
+    <w:p>
+      <w:pPr>
+        <w:pStyle w:val="ListParagraph"/>
+        <w:keepNext/>
+        <w:numPr>
+          <w:ilvl w:val="0"/>
+          <w:numId w:val="2"/>
+        </w:numPr>
+        <w:spacing w:after="0" w:before="120"/>
+      </w:pPr>
+      <w:r>
+        <w:rPr>
+          <w:b/>
+          <w:bCs/>
+        </w:rPr>
+        <w:t xml:space="preserve">What were your subject-wise marks?</w:t>
+      </w:r>
+    </w:p>
+    <w:p>
+      <w:pPr>
+        <w:spacing w:after="120"/>
+        <w:ind w:left="440"/>
+      </w:pPr>
+    </w:p>
+    <w:p>
+      <w:pPr>
+        <w:pStyle w:val="ListParagraph"/>
+        <w:keepNext/>
+        <w:numPr>
+          <w:ilvl w:val="0"/>
+          <w:numId w:val="2"/>
+        </w:numPr>
+        <w:spacing w:after="0" w:before="120"/>
+      </w:pPr>
+      <w:r>
+        <w:rPr>
+          <w:b/>
+          <w:bCs/>
+        </w:rPr>
+        <w:t xml:space="preserve">What was your highest-scoring subject?</w:t>
+      </w:r>
+    </w:p>
+    <w:p>
+      <w:pPr>
+        <w:spacing w:after="120"/>
+        <w:ind w:left="440"/>
+      </w:pPr>
+    </w:p>
+    <w:p>
+      <w:pPr>
+        <w:pStyle w:val="ListParagraph"/>
+        <w:keepNext/>
+        <w:numPr>
+          <w:ilvl w:val="0"/>
+          <w:numId w:val="2"/>
+        </w:numPr>
+        <w:spacing w:after="0" w:before="120"/>
+      </w:pPr>
+      <w:r>
+        <w:rPr>
+          <w:b/>
+          <w:bCs/>
+        </w:rPr>
+        <w:t xml:space="preserve">What was your lowest-scoring subject, and why did you score lower in it?</w:t>
+      </w:r>
+    </w:p>
+    <w:p>
+      <w:pPr>
+        <w:spacing w:after="120"/>
+        <w:ind w:left="440"/>
+      </w:pPr>
+    </w:p>
+    <w:p>
+      <w:pPr>
+        <w:pStyle w:val="ListParagraph"/>
+        <w:keepNext/>
+        <w:numPr>
+          <w:ilvl w:val="0"/>
+          <w:numId w:val="2"/>
+        </w:numPr>
+        <w:spacing w:after="0" w:before="120"/>
+      </w:pPr>
+      <w:r>
+        <w:rPr>
+          <w:b/>
+          <w:bCs/>
+        </w:rPr>
+        <w:t xml:space="preserve">If you were in the top 10, why didn't you score above 90%?</w:t>
+      </w:r>
+    </w:p>
+    <w:p>
+      <w:pPr>
+        <w:spacing w:after="120"/>
+        <w:ind w:left="440"/>
+      </w:pPr>
+    </w:p>
+    <w:p>
+      <w:pPr>
+        <w:pStyle w:val="ListParagraph"/>
+        <w:keepNext/>
+        <w:numPr>
+          <w:ilvl w:val="0"/>
+          <w:numId w:val="2"/>
+        </w:numPr>
+        <w:spacing w:after="0" w:before="120"/>
+      </w:pPr>
+      <w:r>
+        <w:rPr>
+          <w:b/>
+          <w:bCs/>
+        </w:rPr>
+        <w:t xml:space="preserve">How did you prepare for the board exams?</w:t>
+      </w:r>
+    </w:p>
+    <w:p>
+      <w:pPr>
+        <w:spacing w:after="120"/>
+        <w:ind w:left="440"/>
+      </w:pPr>
+    </w:p>
+    <w:p>
+      <w:pPr>
+        <w:pStyle w:val="ListParagraph"/>
+        <w:keepNext/>
+        <w:numPr>
+          <w:ilvl w:val="0"/>
+          <w:numId w:val="2"/>
+        </w:numPr>
+        <w:spacing w:after="0" w:before="120"/>
+      </w:pPr>
+      <w:r>
+        <w:rPr>
+          <w:b/>
+          <w:bCs/>
+        </w:rPr>
+        <w:t xml:space="preserve">How many hours did you study?</w:t>
+      </w:r>
+    </w:p>
+    <w:p>
+      <w:pPr>
+        <w:spacing w:after="120"/>
+        <w:ind w:left="440"/>
+      </w:pPr>
+    </w:p>
+    <w:p>
+      <w:pPr>
+        <w:pStyle w:val="ListParagraph"/>
+        <w:keepNext/>
+        <w:numPr>
+          <w:ilvl w:val="0"/>
+          <w:numId w:val="2"/>
+        </w:numPr>
+        <w:spacing w:after="0" w:before="120"/>
+      </w:pPr>
+      <w:r>
+        <w:rPr>
+          <w:b/>
+          <w:bCs/>
+        </w:rPr>
+        <w:t xml:space="preserve">Did you attend coaching?</w:t>
+      </w:r>
+    </w:p>
+    <w:p>
+      <w:pPr>
+        <w:spacing w:after="120"/>
+        <w:ind w:left="440"/>
+      </w:pPr>
+    </w:p>
+    <w:p>
+      <w:pPr>
+        <w:pStyle w:val="ListParagraph"/>
+        <w:keepNext/>
+        <w:numPr>
+          <w:ilvl w:val="0"/>
+          <w:numId w:val="2"/>
+        </w:numPr>
+        <w:spacing w:after="0" w:before="120"/>
+      </w:pPr>
+      <w:r>
+        <w:rPr>
+          <w:b/>
+          <w:bCs/>
+        </w:rPr>
+        <w:t xml:space="preserve">How did you balance academics and extracurricular activities?</w:t>
+      </w:r>
+    </w:p>
+    <w:p>
+      <w:pPr>
+        <w:spacing w:after="120"/>
+        <w:ind w:left="440"/>
+      </w:pPr>
+    </w:p>
+    <w:p>
+      <w:pPr>
+        <w:pStyle w:val="ListParagraph"/>
+        <w:keepNext/>
+        <w:numPr>
+          <w:ilvl w:val="0"/>
+          <w:numId w:val="2"/>
+        </w:numPr>
+        <w:spacing w:after="0" w:before="120"/>
+      </w:pPr>
+      <w:r>
+        <w:rPr>
+          <w:b/>
+          <w:bCs/>
+        </w:rPr>
+        <w:t xml:space="preserve">What changed after Class 10?</w:t>
+      </w:r>
+    </w:p>
+    <w:p>
+      <w:pPr>
+        <w:spacing w:after="120"/>
+        <w:ind w:left="440"/>
+      </w:pPr>
+    </w:p>
+    <w:p>
+      <w:pPr>
+        <w:pStyle w:val="Heading1"/>
+      </w:pPr>
+      <w:r>
+        <w:t xml:space="preserve">PIQ 13 – Class 10: Top 10 Achievement</w:t>
+      </w:r>
+    </w:p>
+    <w:p>
+      <w:pPr>
+        <w:pStyle w:val="ListParagraph"/>
+        <w:keepNext/>
+        <w:numPr>
+          <w:ilvl w:val="0"/>
+          <w:numId w:val="2"/>
+        </w:numPr>
+        <w:spacing w:after="0" w:before="120"/>
+      </w:pPr>
+      <w:r>
+        <w:rPr>
+          <w:b/>
+          <w:bCs/>
+        </w:rPr>
+        <w:t xml:space="preserve">What does "Top 10 in school" mean exactly?</w:t>
+      </w:r>
+    </w:p>
+    <w:p>
+      <w:pPr>
+        <w:spacing w:after="120"/>
+        <w:ind w:left="440"/>
+      </w:pPr>
+    </w:p>
+    <w:p>
+      <w:pPr>
+        <w:pStyle w:val="ListParagraph"/>
+        <w:keepNext/>
+        <w:numPr>
+          <w:ilvl w:val="0"/>
+          <w:numId w:val="2"/>
+        </w:numPr>
+        <w:spacing w:after="0" w:before="120"/>
+      </w:pPr>
+      <w:r>
+        <w:rPr>
+          <w:b/>
+          <w:bCs/>
+        </w:rPr>
+        <w:t xml:space="preserve">What was your exact rank?</w:t>
+      </w:r>
+    </w:p>
+    <w:p>
+      <w:pPr>
+        <w:spacing w:after="120"/>
+        <w:ind w:left="440"/>
+      </w:pPr>
+    </w:p>
+    <w:p>
+      <w:pPr>
+        <w:pStyle w:val="ListParagraph"/>
+        <w:keepNext/>
+        <w:numPr>
+          <w:ilvl w:val="0"/>
+          <w:numId w:val="2"/>
+        </w:numPr>
+        <w:spacing w:after="0" w:before="120"/>
+      </w:pPr>
+      <w:r>
+        <w:rPr>
+          <w:b/>
+          <w:bCs/>
+        </w:rPr>
+        <w:t xml:space="preserve">Top 10 among how many students?</w:t>
+      </w:r>
+    </w:p>
+    <w:p>
+      <w:pPr>
+        <w:spacing w:after="120"/>
+        <w:ind w:left="440"/>
+      </w:pPr>
+    </w:p>
+    <w:p>
+      <w:pPr>
+        <w:pStyle w:val="ListParagraph"/>
+        <w:keepNext/>
+        <w:numPr>
+          <w:ilvl w:val="0"/>
+          <w:numId w:val="2"/>
+        </w:numPr>
+        <w:spacing w:after="0" w:before="120"/>
+      </w:pPr>
+      <w:r>
+        <w:rPr>
+          <w:b/>
+          <w:bCs/>
+        </w:rPr>
+        <w:t xml:space="preserve">Was it based on aggregate percentage?</w:t>
+      </w:r>
+    </w:p>
+    <w:p>
+      <w:pPr>
+        <w:spacing w:after="120"/>
+        <w:ind w:left="440"/>
+      </w:pPr>
+    </w:p>
+    <w:p>
+      <w:pPr>
+        <w:pStyle w:val="ListParagraph"/>
+        <w:keepNext/>
+        <w:numPr>
+          <w:ilvl w:val="0"/>
+          <w:numId w:val="2"/>
+        </w:numPr>
+        <w:spacing w:after="0" w:before="120"/>
+      </w:pPr>
+      <w:r>
+        <w:rPr>
+          <w:b/>
+          <w:bCs/>
+        </w:rPr>
+        <w:t xml:space="preserve">Was the ranking for your batch or the whole school?</w:t>
+      </w:r>
+    </w:p>
+    <w:p>
+      <w:pPr>
+        <w:spacing w:after="120"/>
+        <w:ind w:left="440"/>
+      </w:pPr>
+    </w:p>
+    <w:p>
+      <w:pPr>
+        <w:pStyle w:val="ListParagraph"/>
+        <w:keepNext/>
+        <w:numPr>
+          <w:ilvl w:val="0"/>
+          <w:numId w:val="2"/>
+        </w:numPr>
+        <w:spacing w:after="0" w:before="120"/>
+      </w:pPr>
+      <w:r>
+        <w:rPr>
+          <w:b/>
+          <w:bCs/>
+        </w:rPr>
+        <w:t xml:space="preserve">Was it officially announced?</w:t>
+      </w:r>
+    </w:p>
+    <w:p>
+      <w:pPr>
+        <w:spacing w:after="120"/>
+        <w:ind w:left="440"/>
+      </w:pPr>
+    </w:p>
+    <w:p>
+      <w:pPr>
+        <w:pStyle w:val="ListParagraph"/>
+        <w:keepNext/>
+        <w:numPr>
+          <w:ilvl w:val="0"/>
+          <w:numId w:val="2"/>
+        </w:numPr>
+        <w:spacing w:after="0" w:before="120"/>
+      </w:pPr>
+      <w:r>
+        <w:rPr>
+          <w:b/>
+          <w:bCs/>
+        </w:rPr>
+        <w:t xml:space="preserve">Did you receive any certificate or recognition?</w:t>
+      </w:r>
+    </w:p>
+    <w:p>
+      <w:pPr>
+        <w:spacing w:after="120"/>
+        <w:ind w:left="440"/>
+      </w:pPr>
+    </w:p>
+    <w:p>
+      <w:pPr>
+        <w:pStyle w:val="ListParagraph"/>
+        <w:keepNext/>
+        <w:numPr>
+          <w:ilvl w:val="0"/>
+          <w:numId w:val="2"/>
+        </w:numPr>
+        <w:spacing w:after="0" w:before="120"/>
+      </w:pPr>
+      <w:r>
+        <w:rPr>
+          <w:b/>
+          <w:bCs/>
+        </w:rPr>
+        <w:t xml:space="preserve">How do you know you were in the top 10?</w:t>
+      </w:r>
+    </w:p>
+    <w:p>
+      <w:pPr>
+        <w:spacing w:after="120"/>
+        <w:ind w:left="440"/>
+      </w:pPr>
+    </w:p>
+    <w:p>
+      <w:pPr>
+        <w:pStyle w:val="Heading1"/>
+      </w:pPr>
+      <w:r>
+        <w:t xml:space="preserve">PIQ 13 – Class 10: School</w:t>
+      </w:r>
+    </w:p>
+    <w:p>
+      <w:pPr>
+        <w:pStyle w:val="ListParagraph"/>
+        <w:keepNext/>
+        <w:numPr>
+          <w:ilvl w:val="0"/>
+          <w:numId w:val="2"/>
+        </w:numPr>
+        <w:spacing w:after="0" w:before="120"/>
+      </w:pPr>
+      <w:r>
+        <w:rPr>
+          <w:b/>
+          <w:bCs/>
+        </w:rPr>
+        <w:t xml:space="preserve">How far was your school from home?</w:t>
+      </w:r>
+    </w:p>
+    <w:p>
+      <w:pPr>
+        <w:spacing w:after="120"/>
+        <w:ind w:left="440"/>
+      </w:pPr>
+    </w:p>
+    <w:p>
+      <w:pPr>
+        <w:pStyle w:val="ListParagraph"/>
+        <w:keepNext/>
+        <w:numPr>
+          <w:ilvl w:val="0"/>
+          <w:numId w:val="2"/>
+        </w:numPr>
+        <w:spacing w:after="0" w:before="120"/>
+      </w:pPr>
+      <w:r>
+        <w:rPr>
+          <w:b/>
+          <w:bCs/>
+        </w:rPr>
+        <w:t xml:space="preserve">How did you commute, and how long did it take?</w:t>
+      </w:r>
+    </w:p>
+    <w:p>
+      <w:pPr>
+        <w:spacing w:after="120"/>
+        <w:ind w:left="440"/>
+      </w:pPr>
+    </w:p>
+    <w:p>
+      <w:pPr>
+        <w:pStyle w:val="ListParagraph"/>
+        <w:keepNext/>
+        <w:numPr>
+          <w:ilvl w:val="0"/>
+          <w:numId w:val="2"/>
+        </w:numPr>
+        <w:spacing w:after="0" w:before="120"/>
+      </w:pPr>
+      <w:r>
+        <w:rPr>
+          <w:b/>
+          <w:bCs/>
+        </w:rPr>
+        <w:t xml:space="preserve">What were your school timings?</w:t>
+      </w:r>
+    </w:p>
+    <w:p>
+      <w:pPr>
+        <w:spacing w:after="120"/>
+        <w:ind w:left="440"/>
+      </w:pPr>
+    </w:p>
+    <w:p>
+      <w:pPr>
+        <w:pStyle w:val="ListParagraph"/>
+        <w:keepNext/>
+        <w:numPr>
+          <w:ilvl w:val="0"/>
+          <w:numId w:val="2"/>
+        </w:numPr>
+        <w:spacing w:after="0" w:before="120"/>
+      </w:pPr>
+      <w:r>
+        <w:rPr>
+          <w:b/>
+          <w:bCs/>
+        </w:rPr>
+        <w:t xml:space="preserve">How many students were in your class?</w:t>
+      </w:r>
+    </w:p>
+    <w:p>
+      <w:pPr>
+        <w:spacing w:after="120"/>
+        <w:ind w:left="440"/>
+      </w:pPr>
+    </w:p>
+    <w:p>
+      <w:pPr>
+        <w:pStyle w:val="ListParagraph"/>
+        <w:keepNext/>
+        <w:numPr>
+          <w:ilvl w:val="0"/>
+          <w:numId w:val="2"/>
+        </w:numPr>
+        <w:spacing w:after="0" w:before="120"/>
+      </w:pPr>
+      <w:r>
+        <w:rPr>
+          <w:b/>
+          <w:bCs/>
+        </w:rPr>
+        <w:t xml:space="preserve">How many sections were there?</w:t>
+      </w:r>
+    </w:p>
+    <w:p>
+      <w:pPr>
+        <w:spacing w:after="120"/>
+        <w:ind w:left="440"/>
+      </w:pPr>
+    </w:p>
+    <w:p>
+      <w:pPr>
+        <w:pStyle w:val="ListParagraph"/>
+        <w:keepNext/>
+        <w:numPr>
+          <w:ilvl w:val="0"/>
+          <w:numId w:val="2"/>
+        </w:numPr>
+        <w:spacing w:after="0" w:before="120"/>
+      </w:pPr>
+      <w:r>
+        <w:rPr>
+          <w:b/>
+          <w:bCs/>
+        </w:rPr>
+        <w:t xml:space="preserve">Who was your principal?</w:t>
+      </w:r>
+    </w:p>
+    <w:p>
+      <w:pPr>
+        <w:spacing w:after="120"/>
+        <w:ind w:left="440"/>
+      </w:pPr>
+    </w:p>
+    <w:p>
+      <w:pPr>
+        <w:pStyle w:val="ListParagraph"/>
+        <w:keepNext/>
+        <w:numPr>
+          <w:ilvl w:val="0"/>
+          <w:numId w:val="2"/>
+        </w:numPr>
+        <w:spacing w:after="0" w:before="120"/>
+      </w:pPr>
+      <w:r>
+        <w:rPr>
+          <w:b/>
+          <w:bCs/>
+        </w:rPr>
+        <w:t xml:space="preserve">What was the teacher-student relationship like?</w:t>
+      </w:r>
+    </w:p>
+    <w:p>
+      <w:pPr>
+        <w:spacing w:after="120"/>
+        <w:ind w:left="440"/>
+      </w:pPr>
+    </w:p>
+    <w:p>
+      <w:pPr>
+        <w:pStyle w:val="ListParagraph"/>
+        <w:keepNext/>
+        <w:numPr>
+          <w:ilvl w:val="0"/>
+          <w:numId w:val="2"/>
+        </w:numPr>
+        <w:spacing w:after="0" w:before="120"/>
+      </w:pPr>
+      <w:r>
+        <w:rPr>
+          <w:b/>
+          <w:bCs/>
+        </w:rPr>
+        <w:t xml:space="preserve">What activities did your school conduct?</w:t>
+      </w:r>
+    </w:p>
+    <w:p>
+      <w:pPr>
+        <w:spacing w:after="120"/>
+        <w:ind w:left="440"/>
+      </w:pPr>
+    </w:p>
+    <w:p>
+      <w:pPr>
+        <w:pStyle w:val="ListParagraph"/>
+        <w:keepNext/>
+        <w:numPr>
+          <w:ilvl w:val="0"/>
+          <w:numId w:val="2"/>
+        </w:numPr>
+        <w:spacing w:after="0" w:before="120"/>
+      </w:pPr>
+      <w:r>
+        <w:rPr>
+          <w:b/>
+          <w:bCs/>
+        </w:rPr>
+        <w:t xml:space="preserve">Which school activities did you take part in?</w:t>
+      </w:r>
+    </w:p>
+    <w:p>
+      <w:pPr>
+        <w:spacing w:after="120"/>
+        <w:ind w:left="440"/>
+      </w:pPr>
+    </w:p>
+    <w:p>
+      <w:pPr>
+        <w:pStyle w:val="ListParagraph"/>
+        <w:keepNext/>
+        <w:numPr>
+          <w:ilvl w:val="0"/>
+          <w:numId w:val="2"/>
+        </w:numPr>
+        <w:spacing w:after="0" w:before="120"/>
+      </w:pPr>
+      <w:r>
+        <w:rPr>
+          <w:b/>
+          <w:bCs/>
+        </w:rPr>
+        <w:t xml:space="preserve">What facilities were available?</w:t>
+      </w:r>
+    </w:p>
+    <w:p>
+      <w:pPr>
+        <w:spacing w:after="120"/>
+        <w:ind w:left="440"/>
+      </w:pPr>
+    </w:p>
+    <w:p>
+      <w:pPr>
+        <w:pStyle w:val="ListParagraph"/>
+        <w:keepNext/>
+        <w:numPr>
+          <w:ilvl w:val="0"/>
+          <w:numId w:val="2"/>
+        </w:numPr>
+        <w:spacing w:after="0" w:before="120"/>
+      </w:pPr>
+      <w:r>
+        <w:rPr>
+          <w:b/>
+          <w:bCs/>
+        </w:rPr>
+        <w:t xml:space="preserve">What did you like about your school?</w:t>
+      </w:r>
+    </w:p>
+    <w:p>
+      <w:pPr>
+        <w:spacing w:after="120"/>
+        <w:ind w:left="440"/>
+      </w:pPr>
+    </w:p>
+    <w:p>
+      <w:pPr>
+        <w:pStyle w:val="ListParagraph"/>
+        <w:keepNext/>
+        <w:numPr>
+          <w:ilvl w:val="0"/>
+          <w:numId w:val="2"/>
+        </w:numPr>
+        <w:spacing w:after="0" w:before="120"/>
+      </w:pPr>
+      <w:r>
+        <w:rPr>
+          <w:b/>
+          <w:bCs/>
+        </w:rPr>
+        <w:t xml:space="preserve">What didn't you like?</w:t>
+      </w:r>
+    </w:p>
+    <w:p>
+      <w:pPr>
+        <w:spacing w:after="120"/>
+        <w:ind w:left="440"/>
+      </w:pPr>
+    </w:p>
+    <w:p>
+      <w:pPr>
+        <w:pStyle w:val="ListParagraph"/>
+        <w:keepNext/>
+        <w:numPr>
+          <w:ilvl w:val="0"/>
+          <w:numId w:val="2"/>
+        </w:numPr>
+        <w:spacing w:after="0" w:before="120"/>
+      </w:pPr>
+      <w:r>
+        <w:rPr>
+          <w:b/>
+          <w:bCs/>
+        </w:rPr>
+        <w:t xml:space="preserve">Who was your favourite teacher, and which subject did they teach?</w:t>
+      </w:r>
+    </w:p>
+    <w:p>
+      <w:pPr>
+        <w:spacing w:after="120"/>
+        <w:ind w:left="440"/>
+      </w:pPr>
+    </w:p>
+    <w:p>
+      <w:pPr>
+        <w:pStyle w:val="ListParagraph"/>
+        <w:keepNext/>
+        <w:numPr>
+          <w:ilvl w:val="0"/>
+          <w:numId w:val="2"/>
+        </w:numPr>
+        <w:spacing w:after="0" w:before="120"/>
+      </w:pPr>
+      <w:r>
+        <w:rPr>
+          <w:b/>
+          <w:bCs/>
+        </w:rPr>
+        <w:t xml:space="preserve">Why were they your favourite?</w:t>
+      </w:r>
+    </w:p>
+    <w:p>
+      <w:pPr>
+        <w:spacing w:after="120"/>
+        <w:ind w:left="440"/>
+      </w:pPr>
+    </w:p>
+    <w:p>
+      <w:pPr>
+        <w:pStyle w:val="ListParagraph"/>
+        <w:keepNext/>
+        <w:numPr>
+          <w:ilvl w:val="0"/>
+          <w:numId w:val="2"/>
+        </w:numPr>
+        <w:spacing w:after="0" w:before="120"/>
+      </w:pPr>
+      <w:r>
+        <w:rPr>
+          <w:b/>
+          <w:bCs/>
+        </w:rPr>
+        <w:t xml:space="preserve">What did you learn from that teacher?</w:t>
+      </w:r>
+    </w:p>
+    <w:p>
+      <w:pPr>
+        <w:spacing w:after="120"/>
+        <w:ind w:left="440"/>
+      </w:pPr>
+    </w:p>
+    <w:p>
+      <w:pPr>
+        <w:pStyle w:val="ListParagraph"/>
+        <w:keepNext/>
+        <w:numPr>
+          <w:ilvl w:val="0"/>
+          <w:numId w:val="2"/>
+        </w:numPr>
+        <w:spacing w:after="0" w:before="120"/>
+      </w:pPr>
+      <w:r>
+        <w:rPr>
+          <w:b/>
+          <w:bCs/>
+        </w:rPr>
+        <w:t xml:space="preserve">If you became principal of your school, what one thing would you change?</w:t>
+      </w:r>
+    </w:p>
+    <w:p>
+      <w:pPr>
+        <w:spacing w:after="120"/>
+        <w:ind w:left="440"/>
+      </w:pPr>
+    </w:p>
+    <w:p>
+      <w:pPr>
+        <w:pStyle w:val="Heading1"/>
+      </w:pPr>
+      <w:r>
+        <w:t xml:space="preserve">PIQ 13 – Class 10: Day Scholar Routine</w:t>
+      </w:r>
+    </w:p>
+    <w:p>
+      <w:pPr>
+        <w:pStyle w:val="ListParagraph"/>
+        <w:keepNext/>
+        <w:numPr>
+          <w:ilvl w:val="0"/>
+          <w:numId w:val="2"/>
+        </w:numPr>
+        <w:spacing w:after="0" w:before="120"/>
+      </w:pPr>
+      <w:r>
+        <w:rPr>
+          <w:b/>
+          <w:bCs/>
+        </w:rPr>
+        <w:t xml:space="preserve">What time did you leave home, and when did you return?</w:t>
+      </w:r>
+    </w:p>
+    <w:p>
+      <w:pPr>
+        <w:spacing w:after="120"/>
+        <w:ind w:left="440"/>
+      </w:pPr>
+    </w:p>
+    <w:p>
+      <w:pPr>
+        <w:pStyle w:val="ListParagraph"/>
+        <w:keepNext/>
+        <w:numPr>
+          <w:ilvl w:val="0"/>
+          <w:numId w:val="2"/>
+        </w:numPr>
+        <w:spacing w:after="0" w:before="120"/>
+      </w:pPr>
+      <w:r>
+        <w:rPr>
+          <w:b/>
+          <w:bCs/>
+        </w:rPr>
+        <w:t xml:space="preserve">What did you do after school?</w:t>
+      </w:r>
+    </w:p>
+    <w:p>
+      <w:pPr>
+        <w:spacing w:after="120"/>
+        <w:ind w:left="440"/>
+      </w:pPr>
+    </w:p>
+    <w:p>
+      <w:pPr>
+        <w:pStyle w:val="ListParagraph"/>
+        <w:keepNext/>
+        <w:numPr>
+          <w:ilvl w:val="0"/>
+          <w:numId w:val="2"/>
+        </w:numPr>
+        <w:spacing w:after="0" w:before="120"/>
+      </w:pPr>
+      <w:r>
+        <w:rPr>
+          <w:b/>
+          <w:bCs/>
+        </w:rPr>
+        <w:t xml:space="preserve">How did you manage studies at home?</w:t>
+      </w:r>
+    </w:p>
+    <w:p>
+      <w:pPr>
+        <w:spacing w:after="120"/>
+        <w:ind w:left="440"/>
+      </w:pPr>
+    </w:p>
+    <w:p>
+      <w:pPr>
+        <w:pStyle w:val="ListParagraph"/>
+        <w:keepNext/>
+        <w:numPr>
+          <w:ilvl w:val="0"/>
+          <w:numId w:val="2"/>
+        </w:numPr>
+        <w:spacing w:after="0" w:before="120"/>
+      </w:pPr>
+      <w:r>
+        <w:rPr>
+          <w:b/>
+          <w:bCs/>
+        </w:rPr>
+        <w:t xml:space="preserve">Did you ever stay late at school for work?</w:t>
+      </w:r>
+    </w:p>
+    <w:p>
+      <w:pPr>
+        <w:spacing w:after="120"/>
+        <w:ind w:left="440"/>
+      </w:pPr>
+    </w:p>
+    <w:p>
+      <w:pPr>
+        <w:pStyle w:val="ListParagraph"/>
+        <w:keepNext/>
+        <w:numPr>
+          <w:ilvl w:val="0"/>
+          <w:numId w:val="2"/>
+        </w:numPr>
+        <w:spacing w:after="0" w:before="120"/>
+      </w:pPr>
+      <w:r>
+        <w:rPr>
+          <w:b/>
+          <w:bCs/>
+        </w:rPr>
+        <w:t xml:space="preserve">What was your typical weekday routine in Class 10?</w:t>
+      </w:r>
+    </w:p>
+    <w:p>
+      <w:pPr>
+        <w:spacing w:after="120"/>
+        <w:ind w:left="440"/>
+      </w:pPr>
+    </w:p>
+    <w:p>
+      <w:pPr>
+        <w:pStyle w:val="Heading1"/>
+      </w:pPr>
+      <w:r>
+        <w:t xml:space="preserve">PIQ 13 – Class 10: English Medium</w:t>
+      </w:r>
+    </w:p>
+    <w:p>
+      <w:pPr>
+        <w:pStyle w:val="ListParagraph"/>
+        <w:keepNext/>
+        <w:numPr>
+          <w:ilvl w:val="0"/>
+          <w:numId w:val="2"/>
+        </w:numPr>
+        <w:spacing w:after="0" w:before="120"/>
+      </w:pPr>
+      <w:r>
+        <w:rPr>
+          <w:b/>
+          <w:bCs/>
+        </w:rPr>
+        <w:t xml:space="preserve">Why did you study in English medium?</w:t>
+      </w:r>
+    </w:p>
+    <w:p>
+      <w:pPr>
+        <w:spacing w:after="120"/>
+        <w:ind w:left="440"/>
+      </w:pPr>
+    </w:p>
+    <w:p>
+      <w:pPr>
+        <w:pStyle w:val="ListParagraph"/>
+        <w:keepNext/>
+        <w:numPr>
+          <w:ilvl w:val="0"/>
+          <w:numId w:val="2"/>
+        </w:numPr>
+        <w:spacing w:after="0" w:before="120"/>
+      </w:pPr>
+      <w:r>
+        <w:rPr>
+          <w:b/>
+          <w:bCs/>
+        </w:rPr>
+        <w:t xml:space="preserve">Do you speak English at home? What language do you speak with your family?</w:t>
+      </w:r>
+    </w:p>
+    <w:p>
+      <w:pPr>
+        <w:spacing w:after="120"/>
+        <w:ind w:left="440"/>
+      </w:pPr>
+    </w:p>
+    <w:p>
+      <w:pPr>
+        <w:pStyle w:val="ListParagraph"/>
+        <w:keepNext/>
+        <w:numPr>
+          <w:ilvl w:val="0"/>
+          <w:numId w:val="2"/>
+        </w:numPr>
+        <w:spacing w:after="0" w:before="120"/>
+      </w:pPr>
+      <w:r>
+        <w:rPr>
+          <w:b/>
+          <w:bCs/>
+        </w:rPr>
+        <w:t xml:space="preserve">Which language are you most comfortable speaking?</w:t>
+      </w:r>
+    </w:p>
+    <w:p>
+      <w:pPr>
+        <w:spacing w:after="120"/>
+        <w:ind w:left="440"/>
+      </w:pPr>
+    </w:p>
+    <w:p>
+      <w:pPr>
+        <w:pStyle w:val="ListParagraph"/>
+        <w:keepNext/>
+        <w:numPr>
+          <w:ilvl w:val="0"/>
+          <w:numId w:val="2"/>
+        </w:numPr>
+        <w:spacing w:after="0" w:before="120"/>
+      </w:pPr>
+      <w:r>
+        <w:rPr>
+          <w:b/>
+          <w:bCs/>
+        </w:rPr>
+        <w:t xml:space="preserve">Is English important in India?</w:t>
+      </w:r>
+    </w:p>
+    <w:p>
+      <w:pPr>
+        <w:spacing w:after="120"/>
+        <w:ind w:left="440"/>
+      </w:pPr>
+    </w:p>
+    <w:p>
+      <w:pPr>
+        <w:pStyle w:val="ListParagraph"/>
+        <w:keepNext/>
+        <w:numPr>
+          <w:ilvl w:val="0"/>
+          <w:numId w:val="2"/>
+        </w:numPr>
+        <w:spacing w:after="0" w:before="120"/>
+      </w:pPr>
+      <w:r>
+        <w:rPr>
+          <w:b/>
+          <w:bCs/>
+        </w:rPr>
+        <w:t xml:space="preserve">What are the advantages and disadvantages of English-medium education?</w:t>
+      </w:r>
+    </w:p>
+    <w:p>
+      <w:pPr>
+        <w:spacing w:after="120"/>
+        <w:ind w:left="440"/>
+      </w:pPr>
+    </w:p>
+    <w:p>
+      <w:pPr>
+        <w:pStyle w:val="Heading1"/>
+      </w:pPr>
+      <w:r>
+        <w:t xml:space="preserve">PIQ 13 – Class 10: Study Habits</w:t>
+      </w:r>
+    </w:p>
+    <w:p>
+      <w:pPr>
+        <w:pStyle w:val="ListParagraph"/>
+        <w:keepNext/>
+        <w:numPr>
+          <w:ilvl w:val="0"/>
+          <w:numId w:val="2"/>
+        </w:numPr>
+        <w:spacing w:after="0" w:before="120"/>
+      </w:pPr>
+      <w:r>
+        <w:rPr>
+          <w:b/>
+          <w:bCs/>
+        </w:rPr>
+        <w:t xml:space="preserve">Are you naturally good at academics?</w:t>
+      </w:r>
+    </w:p>
+    <w:p>
+      <w:pPr>
+        <w:spacing w:after="120"/>
+        <w:ind w:left="440"/>
+      </w:pPr>
+    </w:p>
+    <w:p>
+      <w:pPr>
+        <w:pStyle w:val="ListParagraph"/>
+        <w:keepNext/>
+        <w:numPr>
+          <w:ilvl w:val="0"/>
+          <w:numId w:val="2"/>
+        </w:numPr>
+        <w:spacing w:after="0" w:before="120"/>
+      </w:pPr>
+      <w:r>
+        <w:rPr>
+          <w:b/>
+          <w:bCs/>
+        </w:rPr>
+        <w:t xml:space="preserve">How do you handle difficult subjects?</w:t>
+      </w:r>
+    </w:p>
+    <w:p>
+      <w:pPr>
+        <w:spacing w:after="120"/>
+        <w:ind w:left="440"/>
+      </w:pPr>
+    </w:p>
+    <w:p>
+      <w:pPr>
+        <w:pStyle w:val="ListParagraph"/>
+        <w:keepNext/>
+        <w:numPr>
+          <w:ilvl w:val="0"/>
+          <w:numId w:val="2"/>
+        </w:numPr>
+        <w:spacing w:after="0" w:before="120"/>
+      </w:pPr>
+      <w:r>
+        <w:rPr>
+          <w:b/>
+          <w:bCs/>
+        </w:rPr>
+        <w:t xml:space="preserve">What do you do when you don't understand something? Do you ask for help?</w:t>
+      </w:r>
+    </w:p>
+    <w:p>
+      <w:pPr>
+        <w:spacing w:after="120"/>
+        <w:ind w:left="440"/>
+      </w:pPr>
+    </w:p>
+    <w:p>
+      <w:pPr>
+        <w:pStyle w:val="ListParagraph"/>
+        <w:keepNext/>
+        <w:numPr>
+          <w:ilvl w:val="0"/>
+          <w:numId w:val="2"/>
+        </w:numPr>
+        <w:spacing w:after="0" w:before="120"/>
+      </w:pPr>
+      <w:r>
+        <w:rPr>
+          <w:b/>
+          <w:bCs/>
+        </w:rPr>
+        <w:t xml:space="preserve">Do you procrastinate?</w:t>
+      </w:r>
+    </w:p>
+    <w:p>
+      <w:pPr>
+        <w:spacing w:after="120"/>
+        <w:ind w:left="440"/>
+      </w:pPr>
+    </w:p>
+    <w:p>
+      <w:pPr>
+        <w:pStyle w:val="ListParagraph"/>
+        <w:keepNext/>
+        <w:numPr>
+          <w:ilvl w:val="0"/>
+          <w:numId w:val="2"/>
+        </w:numPr>
+        <w:spacing w:after="0" w:before="120"/>
+      </w:pPr>
+      <w:r>
+        <w:rPr>
+          <w:b/>
+          <w:bCs/>
+        </w:rPr>
+        <w:t xml:space="preserve">How do you handle academic pressure?</w:t>
+      </w:r>
+    </w:p>
+    <w:p>
+      <w:pPr>
+        <w:spacing w:after="120"/>
+        <w:ind w:left="440"/>
+      </w:pPr>
+    </w:p>
+    <w:p>
+      <w:pPr>
+        <w:pStyle w:val="ListParagraph"/>
+        <w:keepNext/>
+        <w:numPr>
+          <w:ilvl w:val="0"/>
+          <w:numId w:val="2"/>
+        </w:numPr>
+        <w:spacing w:after="0" w:before="120"/>
+      </w:pPr>
+      <w:r>
+        <w:rPr>
+          <w:b/>
+          <w:bCs/>
+        </w:rPr>
+        <w:t xml:space="preserve">Have you ever failed an exam? What did you learn from it?</w:t>
+      </w:r>
+    </w:p>
+    <w:p>
+      <w:pPr>
+        <w:spacing w:after="120"/>
+        <w:ind w:left="440"/>
+      </w:pPr>
+    </w:p>
+    <w:p>
+      <w:pPr>
+        <w:pStyle w:val="ListParagraph"/>
+        <w:keepNext/>
+        <w:numPr>
+          <w:ilvl w:val="0"/>
+          <w:numId w:val="2"/>
+        </w:numPr>
+        <w:spacing w:after="0" w:before="120"/>
+      </w:pPr>
+      <w:r>
+        <w:rPr>
+          <w:b/>
+          <w:bCs/>
+        </w:rPr>
+        <w:t xml:space="preserve">Do you prefer studying alone or in a group?</w:t>
+      </w:r>
+    </w:p>
+    <w:p>
+      <w:pPr>
+        <w:spacing w:after="120"/>
+        <w:ind w:left="440"/>
+      </w:pPr>
+    </w:p>
+    <w:p>
+      <w:pPr>
+        <w:pStyle w:val="ListParagraph"/>
+        <w:keepNext/>
+        <w:numPr>
+          <w:ilvl w:val="0"/>
+          <w:numId w:val="2"/>
+        </w:numPr>
+        <w:spacing w:after="0" w:before="120"/>
+      </w:pPr>
+      <w:r>
+        <w:rPr>
+          <w:b/>
+          <w:bCs/>
+        </w:rPr>
+        <w:t xml:space="preserve">What was your biggest academic achievement?</w:t>
+      </w:r>
+    </w:p>
+    <w:p>
+      <w:pPr>
+        <w:spacing w:after="120"/>
+        <w:ind w:left="440"/>
+      </w:pPr>
+    </w:p>
+    <w:p>
+      <w:pPr>
+        <w:pStyle w:val="ListParagraph"/>
+        <w:keepNext/>
+        <w:numPr>
+          <w:ilvl w:val="0"/>
+          <w:numId w:val="2"/>
+        </w:numPr>
+        <w:spacing w:after="0" w:before="120"/>
+      </w:pPr>
+      <w:r>
+        <w:rPr>
+          <w:b/>
+          <w:bCs/>
+        </w:rPr>
+        <w:t xml:space="preserve">What was one academic setback?</w:t>
+      </w:r>
+    </w:p>
+    <w:p>
+      <w:pPr>
+        <w:spacing w:after="120"/>
+        <w:ind w:left="440"/>
+      </w:pPr>
+    </w:p>
+    <w:p>
+      <w:pPr>
+        <w:pStyle w:val="ListParagraph"/>
+        <w:keepNext/>
+        <w:numPr>
+          <w:ilvl w:val="0"/>
+          <w:numId w:val="2"/>
+        </w:numPr>
+        <w:spacing w:after="0" w:before="120"/>
+      </w:pPr>
+      <w:r>
+        <w:rPr>
+          <w:b/>
+          <w:bCs/>
+        </w:rPr>
+        <w:t xml:space="preserve">What did you learn from Class 10?</w:t>
+      </w:r>
+    </w:p>
+    <w:p>
+      <w:pPr>
+        <w:spacing w:after="120"/>
+        <w:ind w:left="440"/>
+      </w:pPr>
+    </w:p>
+    <w:p>
+      <w:pPr>
+        <w:pStyle w:val="Heading1"/>
+      </w:pPr>
+      <w:r>
+        <w:t xml:space="preserve">PIQ 13 – Class 10 to Class 12</w:t>
+      </w:r>
+    </w:p>
+    <w:p>
+      <w:pPr>
+        <w:pStyle w:val="ListParagraph"/>
+        <w:keepNext/>
+        <w:numPr>
+          <w:ilvl w:val="0"/>
+          <w:numId w:val="2"/>
+        </w:numPr>
+        <w:spacing w:after="0" w:before="120"/>
+      </w:pPr>
+      <w:r>
+        <w:rPr>
+          <w:b/>
+          <w:bCs/>
+        </w:rPr>
+        <w:t xml:space="preserve">Take me through your education from Class 10 onwards.</w:t>
+      </w:r>
+    </w:p>
+    <w:p>
+      <w:pPr>
+        <w:spacing w:after="120"/>
+        <w:ind w:left="440"/>
+      </w:pPr>
+    </w:p>
+    <w:p>
+      <w:pPr>
+        <w:pStyle w:val="ListParagraph"/>
+        <w:keepNext/>
+        <w:numPr>
+          <w:ilvl w:val="0"/>
+          <w:numId w:val="2"/>
+        </w:numPr>
+        <w:spacing w:after="0" w:before="120"/>
+      </w:pPr>
+      <w:r>
+        <w:rPr>
+          <w:b/>
+          <w:bCs/>
+        </w:rPr>
+        <w:t xml:space="preserve">What did you choose after Class 10, and why?</w:t>
+      </w:r>
+    </w:p>
+    <w:p>
+      <w:pPr>
+        <w:spacing w:after="120"/>
+        <w:ind w:left="440"/>
+      </w:pPr>
+    </w:p>
+    <w:p>
+      <w:pPr>
+        <w:pStyle w:val="ListParagraph"/>
+        <w:keepNext/>
+        <w:numPr>
+          <w:ilvl w:val="0"/>
+          <w:numId w:val="2"/>
+        </w:numPr>
+        <w:spacing w:after="0" w:before="120"/>
+      </w:pPr>
+      <w:r>
+        <w:rPr>
+          <w:b/>
+          <w:bCs/>
+        </w:rPr>
+        <w:t xml:space="preserve">Why didn't you continue with ICSE for Class 12?</w:t>
+      </w:r>
+    </w:p>
+    <w:p>
+      <w:pPr>
+        <w:spacing w:after="120"/>
+        <w:ind w:left="440"/>
+      </w:pPr>
+    </w:p>
+    <w:p>
+      <w:pPr>
+        <w:pStyle w:val="ListParagraph"/>
+        <w:keepNext/>
+        <w:numPr>
+          <w:ilvl w:val="0"/>
+          <w:numId w:val="2"/>
+        </w:numPr>
+        <w:spacing w:after="0" w:before="120"/>
+      </w:pPr>
+      <w:r>
+        <w:rPr>
+          <w:b/>
+          <w:bCs/>
+        </w:rPr>
+        <w:t xml:space="preserve">Why did you move to another school?</w:t>
+      </w:r>
+    </w:p>
+    <w:p>
+      <w:pPr>
+        <w:spacing w:after="120"/>
+        <w:ind w:left="440"/>
+      </w:pPr>
+    </w:p>
+    <w:p>
+      <w:pPr>
+        <w:pStyle w:val="ListParagraph"/>
+        <w:keepNext/>
+        <w:numPr>
+          <w:ilvl w:val="0"/>
+          <w:numId w:val="2"/>
+        </w:numPr>
+        <w:spacing w:after="0" w:before="120"/>
+      </w:pPr>
+      <w:r>
+        <w:rPr>
+          <w:b/>
+          <w:bCs/>
+        </w:rPr>
+        <w:t xml:space="preserve">What subjects did you choose, and why?</w:t>
+      </w:r>
+    </w:p>
+    <w:p>
+      <w:pPr>
+        <w:spacing w:after="120"/>
+        <w:ind w:left="440"/>
+      </w:pPr>
+    </w:p>
+    <w:p>
+      <w:pPr>
+        <w:pStyle w:val="ListParagraph"/>
+        <w:keepNext/>
+        <w:numPr>
+          <w:ilvl w:val="0"/>
+          <w:numId w:val="2"/>
+        </w:numPr>
+        <w:spacing w:after="0" w:before="120"/>
+      </w:pPr>
+      <w:r>
+        <w:rPr>
+          <w:b/>
+          <w:bCs/>
+        </w:rPr>
+        <w:t xml:space="preserve">Did your Class 10 result influence your choice?</w:t>
+      </w:r>
+    </w:p>
+    <w:p>
+      <w:pPr>
+        <w:spacing w:after="120"/>
+        <w:ind w:left="440"/>
+      </w:pPr>
+    </w:p>
+    <w:p>
+      <w:pPr>
+        <w:pStyle w:val="ListParagraph"/>
+        <w:keepNext/>
+        <w:numPr>
+          <w:ilvl w:val="0"/>
+          <w:numId w:val="2"/>
+        </w:numPr>
+        <w:spacing w:after="0" w:before="120"/>
+      </w:pPr>
+      <w:r>
+        <w:rPr>
+          <w:b/>
+          <w:bCs/>
+        </w:rPr>
+        <w:t xml:space="preserve">What career were you considering at that time?</w:t>
+      </w:r>
+    </w:p>
+    <w:p>
+      <w:pPr>
+        <w:spacing w:after="120"/>
+        <w:ind w:left="440"/>
+      </w:pPr>
+    </w:p>
+    <w:p>
+      <w:pPr>
+        <w:pStyle w:val="ListParagraph"/>
+        <w:keepNext/>
+        <w:numPr>
+          <w:ilvl w:val="0"/>
+          <w:numId w:val="2"/>
+        </w:numPr>
+        <w:spacing w:after="0" w:before="120"/>
+      </w:pPr>
+      <w:r>
+        <w:rPr>
+          <w:b/>
+          <w:bCs/>
+        </w:rPr>
+        <w:t xml:space="preserve">How did that eventually lead you to Computer Science?</w:t>
       </w:r>
     </w:p>
     <w:p>

</xml_diff>

<commit_message>
Add PIQ 14 (Class 12) questions to SSB question sheet
Co-Authored-By: Claude Opus 5.5 <noreply@anthropic.com>
Claude-Session: https://claude.ai/code/session_01TypcejD48cCyAqfjtUUit5
</commit_message>
<xml_diff>
--- a/SSB_Question_Sheet.docx
+++ b/SSB_Question_Sheet.docx
@@ -21524,6 +21524,1806 @@
           <w:bCs/>
         </w:rPr>
         <w:t xml:space="preserve">How did that eventually lead you to Computer Science?</w:t>
+      </w:r>
+    </w:p>
+    <w:p>
+      <w:pPr>
+        <w:spacing w:after="120"/>
+        <w:ind w:left="440"/>
+      </w:pPr>
+    </w:p>
+    <w:p>
+      <w:pPr>
+        <w:pStyle w:val="Heading1"/>
+      </w:pPr>
+      <w:r>
+        <w:t xml:space="preserve">PIQ 14 – Class 12</w:t>
+      </w:r>
+    </w:p>
+    <w:p>
+      <w:pPr>
+        <w:pStyle w:val="ListParagraph"/>
+        <w:keepNext/>
+        <w:numPr>
+          <w:ilvl w:val="0"/>
+          <w:numId w:val="2"/>
+        </w:numPr>
+        <w:spacing w:after="0" w:before="120"/>
+      </w:pPr>
+      <w:r>
+        <w:rPr>
+          <w:b/>
+          <w:bCs/>
+        </w:rPr>
+        <w:t xml:space="preserve">Where did you complete Class 12?</w:t>
+      </w:r>
+    </w:p>
+    <w:p>
+      <w:pPr>
+        <w:spacing w:after="120"/>
+        <w:ind w:left="440"/>
+      </w:pPr>
+    </w:p>
+    <w:p>
+      <w:pPr>
+        <w:pStyle w:val="ListParagraph"/>
+        <w:keepNext/>
+        <w:numPr>
+          <w:ilvl w:val="0"/>
+          <w:numId w:val="2"/>
+        </w:numPr>
+        <w:spacing w:after="0" w:before="120"/>
+      </w:pPr>
+      <w:r>
+        <w:rPr>
+          <w:b/>
+          <w:bCs/>
+        </w:rPr>
+        <w:t xml:space="preserve">Which board was it?</w:t>
+      </w:r>
+    </w:p>
+    <w:p>
+      <w:pPr>
+        <w:spacing w:after="120"/>
+        <w:ind w:left="440"/>
+      </w:pPr>
+    </w:p>
+    <w:p>
+      <w:pPr>
+        <w:pStyle w:val="ListParagraph"/>
+        <w:keepNext/>
+        <w:numPr>
+          <w:ilvl w:val="0"/>
+          <w:numId w:val="2"/>
+        </w:numPr>
+        <w:spacing w:after="0" w:before="120"/>
+      </w:pPr>
+      <w:r>
+        <w:rPr>
+          <w:b/>
+          <w:bCs/>
+        </w:rPr>
+        <w:t xml:space="preserve">When did you pass?</w:t>
+      </w:r>
+    </w:p>
+    <w:p>
+      <w:pPr>
+        <w:spacing w:after="120"/>
+        <w:ind w:left="440"/>
+      </w:pPr>
+    </w:p>
+    <w:p>
+      <w:pPr>
+        <w:pStyle w:val="ListParagraph"/>
+        <w:keepNext/>
+        <w:numPr>
+          <w:ilvl w:val="0"/>
+          <w:numId w:val="2"/>
+        </w:numPr>
+        <w:spacing w:after="0" w:before="120"/>
+      </w:pPr>
+      <w:r>
+        <w:rPr>
+          <w:b/>
+          <w:bCs/>
+        </w:rPr>
+        <w:t xml:space="preserve">What percentage did you score?</w:t>
+      </w:r>
+    </w:p>
+    <w:p>
+      <w:pPr>
+        <w:spacing w:after="120"/>
+        <w:ind w:left="440"/>
+      </w:pPr>
+    </w:p>
+    <w:p>
+      <w:pPr>
+        <w:pStyle w:val="ListParagraph"/>
+        <w:keepNext/>
+        <w:numPr>
+          <w:ilvl w:val="0"/>
+          <w:numId w:val="2"/>
+        </w:numPr>
+        <w:spacing w:after="0" w:before="120"/>
+      </w:pPr>
+      <w:r>
+        <w:rPr>
+          <w:b/>
+          <w:bCs/>
+        </w:rPr>
+        <w:t xml:space="preserve">What does first division mean?</w:t>
+      </w:r>
+    </w:p>
+    <w:p>
+      <w:pPr>
+        <w:spacing w:after="120"/>
+        <w:ind w:left="440"/>
+      </w:pPr>
+    </w:p>
+    <w:p>
+      <w:pPr>
+        <w:pStyle w:val="ListParagraph"/>
+        <w:keepNext/>
+        <w:numPr>
+          <w:ilvl w:val="0"/>
+          <w:numId w:val="2"/>
+        </w:numPr>
+        <w:spacing w:after="0" w:before="120"/>
+      </w:pPr>
+      <w:r>
+        <w:rPr>
+          <w:b/>
+          <w:bCs/>
+        </w:rPr>
+        <w:t xml:space="preserve">What were your subject-wise marks?</w:t>
+      </w:r>
+    </w:p>
+    <w:p>
+      <w:pPr>
+        <w:spacing w:after="120"/>
+        <w:ind w:left="440"/>
+      </w:pPr>
+    </w:p>
+    <w:p>
+      <w:pPr>
+        <w:pStyle w:val="ListParagraph"/>
+        <w:keepNext/>
+        <w:numPr>
+          <w:ilvl w:val="0"/>
+          <w:numId w:val="2"/>
+        </w:numPr>
+        <w:spacing w:after="0" w:before="120"/>
+      </w:pPr>
+      <w:r>
+        <w:rPr>
+          <w:b/>
+          <w:bCs/>
+        </w:rPr>
+        <w:t xml:space="preserve">Which subject did you do best in, and why?</w:t>
+      </w:r>
+    </w:p>
+    <w:p>
+      <w:pPr>
+        <w:spacing w:after="120"/>
+        <w:ind w:left="440"/>
+      </w:pPr>
+    </w:p>
+    <w:p>
+      <w:pPr>
+        <w:pStyle w:val="ListParagraph"/>
+        <w:keepNext/>
+        <w:numPr>
+          <w:ilvl w:val="0"/>
+          <w:numId w:val="2"/>
+        </w:numPr>
+        <w:spacing w:after="0" w:before="120"/>
+      </w:pPr>
+      <w:r>
+        <w:rPr>
+          <w:b/>
+          <w:bCs/>
+        </w:rPr>
+        <w:t xml:space="preserve">Which subject brought your percentage down?</w:t>
+      </w:r>
+    </w:p>
+    <w:p>
+      <w:pPr>
+        <w:spacing w:after="120"/>
+        <w:ind w:left="440"/>
+      </w:pPr>
+    </w:p>
+    <w:p>
+      <w:pPr>
+        <w:pStyle w:val="ListParagraph"/>
+        <w:keepNext/>
+        <w:numPr>
+          <w:ilvl w:val="0"/>
+          <w:numId w:val="2"/>
+        </w:numPr>
+        <w:spacing w:after="0" w:before="120"/>
+      </w:pPr>
+      <w:r>
+        <w:rPr>
+          <w:b/>
+          <w:bCs/>
+        </w:rPr>
+        <w:t xml:space="preserve">Why did you move from Azamgarh to Lucknow?</w:t>
+      </w:r>
+    </w:p>
+    <w:p>
+      <w:pPr>
+        <w:spacing w:after="120"/>
+        <w:ind w:left="440"/>
+      </w:pPr>
+    </w:p>
+    <w:p>
+      <w:pPr>
+        <w:pStyle w:val="ListParagraph"/>
+        <w:keepNext/>
+        <w:numPr>
+          <w:ilvl w:val="0"/>
+          <w:numId w:val="2"/>
+        </w:numPr>
+        <w:spacing w:after="0" w:before="120"/>
+      </w:pPr>
+      <w:r>
+        <w:rPr>
+          <w:b/>
+          <w:bCs/>
+        </w:rPr>
+        <w:t xml:space="preserve">Who decided that you should move?</w:t>
+      </w:r>
+    </w:p>
+    <w:p>
+      <w:pPr>
+        <w:spacing w:after="120"/>
+        <w:ind w:left="440"/>
+      </w:pPr>
+    </w:p>
+    <w:p>
+      <w:pPr>
+        <w:pStyle w:val="ListParagraph"/>
+        <w:keepNext/>
+        <w:numPr>
+          <w:ilvl w:val="0"/>
+          <w:numId w:val="2"/>
+        </w:numPr>
+        <w:spacing w:after="0" w:before="120"/>
+      </w:pPr>
+      <w:r>
+        <w:rPr>
+          <w:b/>
+          <w:bCs/>
+        </w:rPr>
+        <w:t xml:space="preserve">Why did you choose Rani Laxmi Bai Memorial School?</w:t>
+      </w:r>
+    </w:p>
+    <w:p>
+      <w:pPr>
+        <w:spacing w:after="120"/>
+        <w:ind w:left="440"/>
+      </w:pPr>
+    </w:p>
+    <w:p>
+      <w:pPr>
+        <w:pStyle w:val="ListParagraph"/>
+        <w:keepNext/>
+        <w:numPr>
+          <w:ilvl w:val="0"/>
+          <w:numId w:val="2"/>
+        </w:numPr>
+        <w:spacing w:after="0" w:before="120"/>
+      </w:pPr>
+      <w:r>
+        <w:rPr>
+          <w:b/>
+          <w:bCs/>
+        </w:rPr>
+        <w:t xml:space="preserve">Did you receive any academic recognition?</w:t>
+      </w:r>
+    </w:p>
+    <w:p>
+      <w:pPr>
+        <w:spacing w:after="120"/>
+        <w:ind w:left="440"/>
+      </w:pPr>
+    </w:p>
+    <w:p>
+      <w:pPr>
+        <w:pStyle w:val="Heading1"/>
+      </w:pPr>
+      <w:r>
+        <w:t xml:space="preserve">PIQ 14 – Class 12: The Drop from 84.83% to 68.8%</w:t>
+      </w:r>
+    </w:p>
+    <w:p>
+      <w:pPr>
+        <w:pStyle w:val="ListParagraph"/>
+        <w:keepNext/>
+        <w:numPr>
+          <w:ilvl w:val="0"/>
+          <w:numId w:val="2"/>
+        </w:numPr>
+        <w:spacing w:after="0" w:before="120"/>
+      </w:pPr>
+      <w:r>
+        <w:rPr>
+          <w:b/>
+          <w:bCs/>
+        </w:rPr>
+        <w:t xml:space="preserve">You scored 84.83% in Class 10. Why did it fall to 68.8% in Class 12?</w:t>
+      </w:r>
+    </w:p>
+    <w:p>
+      <w:pPr>
+        <w:spacing w:after="120"/>
+        <w:ind w:left="440"/>
+      </w:pPr>
+    </w:p>
+    <w:p>
+      <w:pPr>
+        <w:pStyle w:val="ListParagraph"/>
+        <w:keepNext/>
+        <w:numPr>
+          <w:ilvl w:val="0"/>
+          <w:numId w:val="2"/>
+        </w:numPr>
+        <w:spacing w:after="0" w:before="120"/>
+      </w:pPr>
+      <w:r>
+        <w:rPr>
+          <w:b/>
+          <w:bCs/>
+        </w:rPr>
+        <w:t xml:space="preserve">Did you find the syllabus difficult?</w:t>
+      </w:r>
+    </w:p>
+    <w:p>
+      <w:pPr>
+        <w:spacing w:after="120"/>
+        <w:ind w:left="440"/>
+      </w:pPr>
+    </w:p>
+    <w:p>
+      <w:pPr>
+        <w:pStyle w:val="ListParagraph"/>
+        <w:keepNext/>
+        <w:numPr>
+          <w:ilvl w:val="0"/>
+          <w:numId w:val="2"/>
+        </w:numPr>
+        <w:spacing w:after="0" w:before="120"/>
+      </w:pPr>
+      <w:r>
+        <w:rPr>
+          <w:b/>
+          <w:bCs/>
+        </w:rPr>
+        <w:t xml:space="preserve">Did your study habits change?</w:t>
+      </w:r>
+    </w:p>
+    <w:p>
+      <w:pPr>
+        <w:spacing w:after="120"/>
+        <w:ind w:left="440"/>
+      </w:pPr>
+    </w:p>
+    <w:p>
+      <w:pPr>
+        <w:pStyle w:val="ListParagraph"/>
+        <w:keepNext/>
+        <w:numPr>
+          <w:ilvl w:val="0"/>
+          <w:numId w:val="2"/>
+        </w:numPr>
+        <w:spacing w:after="0" w:before="120"/>
+      </w:pPr>
+      <w:r>
+        <w:rPr>
+          <w:b/>
+          <w:bCs/>
+        </w:rPr>
+        <w:t xml:space="preserve">Did you become less disciplined?</w:t>
+      </w:r>
+    </w:p>
+    <w:p>
+      <w:pPr>
+        <w:spacing w:after="120"/>
+        <w:ind w:left="440"/>
+      </w:pPr>
+    </w:p>
+    <w:p>
+      <w:pPr>
+        <w:pStyle w:val="ListParagraph"/>
+        <w:keepNext/>
+        <w:numPr>
+          <w:ilvl w:val="0"/>
+          <w:numId w:val="2"/>
+        </w:numPr>
+        <w:spacing w:after="0" w:before="120"/>
+      </w:pPr>
+      <w:r>
+        <w:rPr>
+          <w:b/>
+          <w:bCs/>
+        </w:rPr>
+        <w:t xml:space="preserve">Were you busy with other activities?</w:t>
+      </w:r>
+    </w:p>
+    <w:p>
+      <w:pPr>
+        <w:spacing w:after="120"/>
+        <w:ind w:left="440"/>
+      </w:pPr>
+    </w:p>
+    <w:p>
+      <w:pPr>
+        <w:pStyle w:val="ListParagraph"/>
+        <w:keepNext/>
+        <w:numPr>
+          <w:ilvl w:val="0"/>
+          <w:numId w:val="2"/>
+        </w:numPr>
+        <w:spacing w:after="0" w:before="120"/>
+      </w:pPr>
+      <w:r>
+        <w:rPr>
+          <w:b/>
+          <w:bCs/>
+        </w:rPr>
+        <w:t xml:space="preserve">Did moving to Lucknow affect your studies?</w:t>
+      </w:r>
+    </w:p>
+    <w:p>
+      <w:pPr>
+        <w:spacing w:after="120"/>
+        <w:ind w:left="440"/>
+      </w:pPr>
+    </w:p>
+    <w:p>
+      <w:pPr>
+        <w:pStyle w:val="ListParagraph"/>
+        <w:keepNext/>
+        <w:numPr>
+          <w:ilvl w:val="0"/>
+          <w:numId w:val="2"/>
+        </w:numPr>
+        <w:spacing w:after="0" w:before="120"/>
+      </w:pPr>
+      <w:r>
+        <w:rPr>
+          <w:b/>
+          <w:bCs/>
+        </w:rPr>
+        <w:t xml:space="preserve">Did you find it difficult to adjust to the new school?</w:t>
+      </w:r>
+    </w:p>
+    <w:p>
+      <w:pPr>
+        <w:spacing w:after="120"/>
+        <w:ind w:left="440"/>
+      </w:pPr>
+    </w:p>
+    <w:p>
+      <w:pPr>
+        <w:pStyle w:val="ListParagraph"/>
+        <w:keepNext/>
+        <w:numPr>
+          <w:ilvl w:val="0"/>
+          <w:numId w:val="2"/>
+        </w:numPr>
+        <w:spacing w:after="0" w:before="120"/>
+      </w:pPr>
+      <w:r>
+        <w:rPr>
+          <w:b/>
+          <w:bCs/>
+        </w:rPr>
+        <w:t xml:space="preserve">Were you satisfied with your Class 12 result?</w:t>
+      </w:r>
+    </w:p>
+    <w:p>
+      <w:pPr>
+        <w:spacing w:after="120"/>
+        <w:ind w:left="440"/>
+      </w:pPr>
+    </w:p>
+    <w:p>
+      <w:pPr>
+        <w:pStyle w:val="ListParagraph"/>
+        <w:keepNext/>
+        <w:numPr>
+          <w:ilvl w:val="0"/>
+          <w:numId w:val="2"/>
+        </w:numPr>
+        <w:spacing w:after="0" w:before="120"/>
+      </w:pPr>
+      <w:r>
+        <w:rPr>
+          <w:b/>
+          <w:bCs/>
+        </w:rPr>
+        <w:t xml:space="preserve">What would you do differently if you could go back?</w:t>
+      </w:r>
+    </w:p>
+    <w:p>
+      <w:pPr>
+        <w:spacing w:after="120"/>
+        <w:ind w:left="440"/>
+      </w:pPr>
+    </w:p>
+    <w:p>
+      <w:pPr>
+        <w:pStyle w:val="ListParagraph"/>
+        <w:keepNext/>
+        <w:numPr>
+          <w:ilvl w:val="0"/>
+          <w:numId w:val="2"/>
+        </w:numPr>
+        <w:spacing w:after="0" w:before="120"/>
+      </w:pPr>
+      <w:r>
+        <w:rPr>
+          <w:b/>
+          <w:bCs/>
+        </w:rPr>
+        <w:t xml:space="preserve">How did your parents react to your result?</w:t>
+      </w:r>
+    </w:p>
+    <w:p>
+      <w:pPr>
+        <w:spacing w:after="120"/>
+        <w:ind w:left="440"/>
+      </w:pPr>
+    </w:p>
+    <w:p>
+      <w:pPr>
+        <w:pStyle w:val="ListParagraph"/>
+        <w:keepNext/>
+        <w:numPr>
+          <w:ilvl w:val="0"/>
+          <w:numId w:val="2"/>
+        </w:numPr>
+        <w:spacing w:after="0" w:before="120"/>
+      </w:pPr>
+      <w:r>
+        <w:rPr>
+          <w:b/>
+          <w:bCs/>
+        </w:rPr>
+        <w:t xml:space="preserve">Did your Class 12 marks affect your college options?</w:t>
+      </w:r>
+    </w:p>
+    <w:p>
+      <w:pPr>
+        <w:spacing w:after="120"/>
+        <w:ind w:left="440"/>
+      </w:pPr>
+    </w:p>
+    <w:p>
+      <w:pPr>
+        <w:pStyle w:val="Heading1"/>
+      </w:pPr>
+      <w:r>
+        <w:t xml:space="preserve">PIQ 14 – Class 12: Life in Lucknow</w:t>
+      </w:r>
+    </w:p>
+    <w:p>
+      <w:pPr>
+        <w:pStyle w:val="ListParagraph"/>
+        <w:keepNext/>
+        <w:numPr>
+          <w:ilvl w:val="0"/>
+          <w:numId w:val="2"/>
+        </w:numPr>
+        <w:spacing w:after="0" w:before="120"/>
+      </w:pPr>
+      <w:r>
+        <w:rPr>
+          <w:b/>
+          <w:bCs/>
+        </w:rPr>
+        <w:t xml:space="preserve">Where did you live in Lucknow?</w:t>
+      </w:r>
+    </w:p>
+    <w:p>
+      <w:pPr>
+        <w:spacing w:after="120"/>
+        <w:ind w:left="440"/>
+      </w:pPr>
+    </w:p>
+    <w:p>
+      <w:pPr>
+        <w:pStyle w:val="ListParagraph"/>
+        <w:keepNext/>
+        <w:numPr>
+          <w:ilvl w:val="0"/>
+          <w:numId w:val="2"/>
+        </w:numPr>
+        <w:spacing w:after="0" w:before="120"/>
+      </w:pPr>
+      <w:r>
+        <w:rPr>
+          <w:b/>
+          <w:bCs/>
+        </w:rPr>
+        <w:t xml:space="preserve">Who lived with you?</w:t>
+      </w:r>
+    </w:p>
+    <w:p>
+      <w:pPr>
+        <w:spacing w:after="120"/>
+        <w:ind w:left="440"/>
+      </w:pPr>
+    </w:p>
+    <w:p>
+      <w:pPr>
+        <w:pStyle w:val="ListParagraph"/>
+        <w:keepNext/>
+        <w:numPr>
+          <w:ilvl w:val="0"/>
+          <w:numId w:val="2"/>
+        </w:numPr>
+        <w:spacing w:after="0" w:before="120"/>
+      </w:pPr>
+      <w:r>
+        <w:rPr>
+          <w:b/>
+          <w:bCs/>
+        </w:rPr>
+        <w:t xml:space="preserve">How far was your school from where you lived?</w:t>
+      </w:r>
+    </w:p>
+    <w:p>
+      <w:pPr>
+        <w:spacing w:after="120"/>
+        <w:ind w:left="440"/>
+      </w:pPr>
+    </w:p>
+    <w:p>
+      <w:pPr>
+        <w:pStyle w:val="ListParagraph"/>
+        <w:keepNext/>
+        <w:numPr>
+          <w:ilvl w:val="0"/>
+          <w:numId w:val="2"/>
+        </w:numPr>
+        <w:spacing w:after="0" w:before="120"/>
+      </w:pPr>
+      <w:r>
+        <w:rPr>
+          <w:b/>
+          <w:bCs/>
+        </w:rPr>
+        <w:t xml:space="preserve">How did you travel to school, and how long did it take?</w:t>
+      </w:r>
+    </w:p>
+    <w:p>
+      <w:pPr>
+        <w:spacing w:after="120"/>
+        <w:ind w:left="440"/>
+      </w:pPr>
+    </w:p>
+    <w:p>
+      <w:pPr>
+        <w:pStyle w:val="ListParagraph"/>
+        <w:keepNext/>
+        <w:numPr>
+          <w:ilvl w:val="0"/>
+          <w:numId w:val="2"/>
+        </w:numPr>
+        <w:spacing w:after="0" w:before="120"/>
+      </w:pPr>
+      <w:r>
+        <w:rPr>
+          <w:b/>
+          <w:bCs/>
+        </w:rPr>
+        <w:t xml:space="preserve">What was your daily routine in Class 12?</w:t>
+      </w:r>
+    </w:p>
+    <w:p>
+      <w:pPr>
+        <w:spacing w:after="120"/>
+        <w:ind w:left="440"/>
+      </w:pPr>
+    </w:p>
+    <w:p>
+      <w:pPr>
+        <w:pStyle w:val="ListParagraph"/>
+        <w:keepNext/>
+        <w:numPr>
+          <w:ilvl w:val="0"/>
+          <w:numId w:val="2"/>
+        </w:numPr>
+        <w:spacing w:after="0" w:before="120"/>
+      </w:pPr>
+      <w:r>
+        <w:rPr>
+          <w:b/>
+          <w:bCs/>
+        </w:rPr>
+        <w:t xml:space="preserve">What time did you wake up, and when did you get home?</w:t>
+      </w:r>
+    </w:p>
+    <w:p>
+      <w:pPr>
+        <w:spacing w:after="120"/>
+        <w:ind w:left="440"/>
+      </w:pPr>
+    </w:p>
+    <w:p>
+      <w:pPr>
+        <w:pStyle w:val="ListParagraph"/>
+        <w:keepNext/>
+        <w:numPr>
+          <w:ilvl w:val="0"/>
+          <w:numId w:val="2"/>
+        </w:numPr>
+        <w:spacing w:after="0" w:before="120"/>
+      </w:pPr>
+      <w:r>
+        <w:rPr>
+          <w:b/>
+          <w:bCs/>
+        </w:rPr>
+        <w:t xml:space="preserve">What did you do after school?</w:t>
+      </w:r>
+    </w:p>
+    <w:p>
+      <w:pPr>
+        <w:spacing w:after="120"/>
+        <w:ind w:left="440"/>
+      </w:pPr>
+    </w:p>
+    <w:p>
+      <w:pPr>
+        <w:pStyle w:val="ListParagraph"/>
+        <w:keepNext/>
+        <w:numPr>
+          <w:ilvl w:val="0"/>
+          <w:numId w:val="2"/>
+        </w:numPr>
+        <w:spacing w:after="0" w:before="120"/>
+      </w:pPr>
+      <w:r>
+        <w:rPr>
+          <w:b/>
+          <w:bCs/>
+        </w:rPr>
+        <w:t xml:space="preserve">How much time did you spend studying?</w:t>
+      </w:r>
+    </w:p>
+    <w:p>
+      <w:pPr>
+        <w:spacing w:after="120"/>
+        <w:ind w:left="440"/>
+      </w:pPr>
+    </w:p>
+    <w:p>
+      <w:pPr>
+        <w:pStyle w:val="Heading1"/>
+      </w:pPr>
+      <w:r>
+        <w:t xml:space="preserve">PIQ 14 – Class 12: CBSE</w:t>
+      </w:r>
+    </w:p>
+    <w:p>
+      <w:pPr>
+        <w:pStyle w:val="ListParagraph"/>
+        <w:keepNext/>
+        <w:numPr>
+          <w:ilvl w:val="0"/>
+          <w:numId w:val="2"/>
+        </w:numPr>
+        <w:spacing w:after="0" w:before="120"/>
+      </w:pPr>
+      <w:r>
+        <w:rPr>
+          <w:b/>
+          <w:bCs/>
+        </w:rPr>
+        <w:t xml:space="preserve">What does CBSE stand for?</w:t>
+      </w:r>
+    </w:p>
+    <w:p>
+      <w:pPr>
+        <w:spacing w:after="120"/>
+        <w:ind w:left="440"/>
+      </w:pPr>
+    </w:p>
+    <w:p>
+      <w:pPr>
+        <w:pStyle w:val="ListParagraph"/>
+        <w:keepNext/>
+        <w:numPr>
+          <w:ilvl w:val="0"/>
+          <w:numId w:val="2"/>
+        </w:numPr>
+        <w:spacing w:after="0" w:before="120"/>
+      </w:pPr>
+      <w:r>
+        <w:rPr>
+          <w:b/>
+          <w:bCs/>
+        </w:rPr>
+        <w:t xml:space="preserve">Who conducts the CBSE exams?</w:t>
+      </w:r>
+    </w:p>
+    <w:p>
+      <w:pPr>
+        <w:spacing w:after="120"/>
+        <w:ind w:left="440"/>
+      </w:pPr>
+    </w:p>
+    <w:p>
+      <w:pPr>
+        <w:pStyle w:val="ListParagraph"/>
+        <w:keepNext/>
+        <w:numPr>
+          <w:ilvl w:val="0"/>
+          <w:numId w:val="2"/>
+        </w:numPr>
+        <w:spacing w:after="0" w:before="120"/>
+      </w:pPr>
+      <w:r>
+        <w:rPr>
+          <w:b/>
+          <w:bCs/>
+        </w:rPr>
+        <w:t xml:space="preserve">What differences did you personally notice between ICSE and CBSE?</w:t>
+      </w:r>
+    </w:p>
+    <w:p>
+      <w:pPr>
+        <w:spacing w:after="120"/>
+        <w:ind w:left="440"/>
+      </w:pPr>
+    </w:p>
+    <w:p>
+      <w:pPr>
+        <w:pStyle w:val="ListParagraph"/>
+        <w:keepNext/>
+        <w:numPr>
+          <w:ilvl w:val="0"/>
+          <w:numId w:val="2"/>
+        </w:numPr>
+        <w:spacing w:after="0" w:before="120"/>
+      </w:pPr>
+      <w:r>
+        <w:rPr>
+          <w:b/>
+          <w:bCs/>
+        </w:rPr>
+        <w:t xml:space="preserve">Which board did you prefer, and why?</w:t>
+      </w:r>
+    </w:p>
+    <w:p>
+      <w:pPr>
+        <w:spacing w:after="120"/>
+        <w:ind w:left="440"/>
+      </w:pPr>
+    </w:p>
+    <w:p>
+      <w:pPr>
+        <w:pStyle w:val="Heading1"/>
+      </w:pPr>
+      <w:r>
+        <w:t xml:space="preserve">PIQ 14 – Class 12: School</w:t>
+      </w:r>
+    </w:p>
+    <w:p>
+      <w:pPr>
+        <w:pStyle w:val="ListParagraph"/>
+        <w:keepNext/>
+        <w:numPr>
+          <w:ilvl w:val="0"/>
+          <w:numId w:val="2"/>
+        </w:numPr>
+        <w:spacing w:after="0" w:before="120"/>
+      </w:pPr>
+      <w:r>
+        <w:rPr>
+          <w:b/>
+          <w:bCs/>
+        </w:rPr>
+        <w:t xml:space="preserve">Where is Rani Laxmi Bai Memorial School located?</w:t>
+      </w:r>
+    </w:p>
+    <w:p>
+      <w:pPr>
+        <w:spacing w:after="120"/>
+        <w:ind w:left="440"/>
+      </w:pPr>
+    </w:p>
+    <w:p>
+      <w:pPr>
+        <w:pStyle w:val="ListParagraph"/>
+        <w:keepNext/>
+        <w:numPr>
+          <w:ilvl w:val="0"/>
+          <w:numId w:val="2"/>
+        </w:numPr>
+        <w:spacing w:after="0" w:before="120"/>
+      </w:pPr>
+      <w:r>
+        <w:rPr>
+          <w:b/>
+          <w:bCs/>
+        </w:rPr>
+        <w:t xml:space="preserve">What were your school timings?</w:t>
+      </w:r>
+    </w:p>
+    <w:p>
+      <w:pPr>
+        <w:spacing w:after="120"/>
+        <w:ind w:left="440"/>
+      </w:pPr>
+    </w:p>
+    <w:p>
+      <w:pPr>
+        <w:pStyle w:val="ListParagraph"/>
+        <w:keepNext/>
+        <w:numPr>
+          <w:ilvl w:val="0"/>
+          <w:numId w:val="2"/>
+        </w:numPr>
+        <w:spacing w:after="0" w:before="120"/>
+      </w:pPr>
+      <w:r>
+        <w:rPr>
+          <w:b/>
+          <w:bCs/>
+        </w:rPr>
+        <w:t xml:space="preserve">How many students were in your class?</w:t>
+      </w:r>
+    </w:p>
+    <w:p>
+      <w:pPr>
+        <w:spacing w:after="120"/>
+        <w:ind w:left="440"/>
+      </w:pPr>
+    </w:p>
+    <w:p>
+      <w:pPr>
+        <w:pStyle w:val="ListParagraph"/>
+        <w:keepNext/>
+        <w:numPr>
+          <w:ilvl w:val="0"/>
+          <w:numId w:val="2"/>
+        </w:numPr>
+        <w:spacing w:after="0" w:before="120"/>
+      </w:pPr>
+      <w:r>
+        <w:rPr>
+          <w:b/>
+          <w:bCs/>
+        </w:rPr>
+        <w:t xml:space="preserve">What is your school known for?</w:t>
+      </w:r>
+    </w:p>
+    <w:p>
+      <w:pPr>
+        <w:spacing w:after="120"/>
+        <w:ind w:left="440"/>
+      </w:pPr>
+    </w:p>
+    <w:p>
+      <w:pPr>
+        <w:pStyle w:val="ListParagraph"/>
+        <w:keepNext/>
+        <w:numPr>
+          <w:ilvl w:val="0"/>
+          <w:numId w:val="2"/>
+        </w:numPr>
+        <w:spacing w:after="0" w:before="120"/>
+      </w:pPr>
+      <w:r>
+        <w:rPr>
+          <w:b/>
+          <w:bCs/>
+        </w:rPr>
+        <w:t xml:space="preserve">Who was your principal?</w:t>
+      </w:r>
+    </w:p>
+    <w:p>
+      <w:pPr>
+        <w:spacing w:after="120"/>
+        <w:ind w:left="440"/>
+      </w:pPr>
+    </w:p>
+    <w:p>
+      <w:pPr>
+        <w:pStyle w:val="ListParagraph"/>
+        <w:keepNext/>
+        <w:numPr>
+          <w:ilvl w:val="0"/>
+          <w:numId w:val="2"/>
+        </w:numPr>
+        <w:spacing w:after="0" w:before="120"/>
+      </w:pPr>
+      <w:r>
+        <w:rPr>
+          <w:b/>
+          <w:bCs/>
+        </w:rPr>
+        <w:t xml:space="preserve">Who was your favourite teacher, and which subject did they teach?</w:t>
+      </w:r>
+    </w:p>
+    <w:p>
+      <w:pPr>
+        <w:spacing w:after="120"/>
+        <w:ind w:left="440"/>
+      </w:pPr>
+    </w:p>
+    <w:p>
+      <w:pPr>
+        <w:pStyle w:val="ListParagraph"/>
+        <w:keepNext/>
+        <w:numPr>
+          <w:ilvl w:val="0"/>
+          <w:numId w:val="2"/>
+        </w:numPr>
+        <w:spacing w:after="0" w:before="120"/>
+      </w:pPr>
+      <w:r>
+        <w:rPr>
+          <w:b/>
+          <w:bCs/>
+        </w:rPr>
+        <w:t xml:space="preserve">What activities did you take part in?</w:t>
+      </w:r>
+    </w:p>
+    <w:p>
+      <w:pPr>
+        <w:spacing w:after="120"/>
+        <w:ind w:left="440"/>
+      </w:pPr>
+    </w:p>
+    <w:p>
+      <w:pPr>
+        <w:pStyle w:val="ListParagraph"/>
+        <w:keepNext/>
+        <w:numPr>
+          <w:ilvl w:val="0"/>
+          <w:numId w:val="2"/>
+        </w:numPr>
+        <w:spacing w:after="0" w:before="120"/>
+      </w:pPr>
+      <w:r>
+        <w:rPr>
+          <w:b/>
+          <w:bCs/>
+        </w:rPr>
+        <w:t xml:space="preserve">What was your role in school?</w:t>
+      </w:r>
+    </w:p>
+    <w:p>
+      <w:pPr>
+        <w:spacing w:after="120"/>
+        <w:ind w:left="440"/>
+      </w:pPr>
+    </w:p>
+    <w:p>
+      <w:pPr>
+        <w:pStyle w:val="ListParagraph"/>
+        <w:keepNext/>
+        <w:numPr>
+          <w:ilvl w:val="0"/>
+          <w:numId w:val="2"/>
+        </w:numPr>
+        <w:spacing w:after="0" w:before="120"/>
+      </w:pPr>
+      <w:r>
+        <w:rPr>
+          <w:b/>
+          <w:bCs/>
+        </w:rPr>
+        <w:t xml:space="preserve">What facilities did your school have?</w:t>
+      </w:r>
+    </w:p>
+    <w:p>
+      <w:pPr>
+        <w:spacing w:after="120"/>
+        <w:ind w:left="440"/>
+      </w:pPr>
+    </w:p>
+    <w:p>
+      <w:pPr>
+        <w:pStyle w:val="ListParagraph"/>
+        <w:keepNext/>
+        <w:numPr>
+          <w:ilvl w:val="0"/>
+          <w:numId w:val="2"/>
+        </w:numPr>
+        <w:spacing w:after="0" w:before="120"/>
+      </w:pPr>
+      <w:r>
+        <w:rPr>
+          <w:b/>
+          <w:bCs/>
+        </w:rPr>
+        <w:t xml:space="preserve">What would you improve about your school?</w:t>
+      </w:r>
+    </w:p>
+    <w:p>
+      <w:pPr>
+        <w:spacing w:after="120"/>
+        <w:ind w:left="440"/>
+      </w:pPr>
+    </w:p>
+    <w:p>
+      <w:pPr>
+        <w:pStyle w:val="Heading1"/>
+      </w:pPr>
+      <w:r>
+        <w:t xml:space="preserve">PIQ 14 – Class 12: Rani Lakshmibai &amp; 1857</w:t>
+      </w:r>
+    </w:p>
+    <w:p>
+      <w:pPr>
+        <w:pStyle w:val="ListParagraph"/>
+        <w:keepNext/>
+        <w:numPr>
+          <w:ilvl w:val="0"/>
+          <w:numId w:val="2"/>
+        </w:numPr>
+        <w:spacing w:after="0" w:before="120"/>
+      </w:pPr>
+      <w:r>
+        <w:rPr>
+          <w:b/>
+          <w:bCs/>
+        </w:rPr>
+        <w:t xml:space="preserve">Why is your school named after Rani Lakshmibai?</w:t>
+      </w:r>
+    </w:p>
+    <w:p>
+      <w:pPr>
+        <w:spacing w:after="120"/>
+        <w:ind w:left="440"/>
+      </w:pPr>
+    </w:p>
+    <w:p>
+      <w:pPr>
+        <w:pStyle w:val="ListParagraph"/>
+        <w:keepNext/>
+        <w:numPr>
+          <w:ilvl w:val="0"/>
+          <w:numId w:val="2"/>
+        </w:numPr>
+        <w:spacing w:after="0" w:before="120"/>
+      </w:pPr>
+      <w:r>
+        <w:rPr>
+          <w:b/>
+          <w:bCs/>
+        </w:rPr>
+        <w:t xml:space="preserve">Who was Rani Lakshmibai?</w:t>
+      </w:r>
+    </w:p>
+    <w:p>
+      <w:pPr>
+        <w:spacing w:after="120"/>
+        <w:ind w:left="440"/>
+      </w:pPr>
+    </w:p>
+    <w:p>
+      <w:pPr>
+        <w:pStyle w:val="ListParagraph"/>
+        <w:keepNext/>
+        <w:numPr>
+          <w:ilvl w:val="0"/>
+          <w:numId w:val="2"/>
+        </w:numPr>
+        <w:spacing w:after="0" w:before="120"/>
+      </w:pPr>
+      <w:r>
+        <w:rPr>
+          <w:b/>
+          <w:bCs/>
+        </w:rPr>
+        <w:t xml:space="preserve">What was her role in 1857?</w:t>
+      </w:r>
+    </w:p>
+    <w:p>
+      <w:pPr>
+        <w:spacing w:after="120"/>
+        <w:ind w:left="440"/>
+      </w:pPr>
+    </w:p>
+    <w:p>
+      <w:pPr>
+        <w:pStyle w:val="ListParagraph"/>
+        <w:keepNext/>
+        <w:numPr>
+          <w:ilvl w:val="0"/>
+          <w:numId w:val="2"/>
+        </w:numPr>
+        <w:spacing w:after="0" w:before="120"/>
+      </w:pPr>
+      <w:r>
+        <w:rPr>
+          <w:b/>
+          <w:bCs/>
+        </w:rPr>
+        <w:t xml:space="preserve">What happened at Jhansi?</w:t>
+      </w:r>
+    </w:p>
+    <w:p>
+      <w:pPr>
+        <w:spacing w:after="120"/>
+        <w:ind w:left="440"/>
+      </w:pPr>
+    </w:p>
+    <w:p>
+      <w:pPr>
+        <w:pStyle w:val="ListParagraph"/>
+        <w:keepNext/>
+        <w:numPr>
+          <w:ilvl w:val="0"/>
+          <w:numId w:val="2"/>
+        </w:numPr>
+        <w:spacing w:after="0" w:before="120"/>
+      </w:pPr>
+      <w:r>
+        <w:rPr>
+          <w:b/>
+          <w:bCs/>
+        </w:rPr>
+        <w:t xml:space="preserve">Who were the major leaders of the Revolt of 1857?</w:t>
+      </w:r>
+    </w:p>
+    <w:p>
+      <w:pPr>
+        <w:spacing w:after="120"/>
+        <w:ind w:left="440"/>
+      </w:pPr>
+    </w:p>
+    <w:p>
+      <w:pPr>
+        <w:pStyle w:val="ListParagraph"/>
+        <w:keepNext/>
+        <w:numPr>
+          <w:ilvl w:val="0"/>
+          <w:numId w:val="2"/>
+        </w:numPr>
+        <w:spacing w:after="0" w:before="120"/>
+      </w:pPr>
+      <w:r>
+        <w:rPr>
+          <w:b/>
+          <w:bCs/>
+        </w:rPr>
+        <w:t xml:space="preserve">Why is she remembered?</w:t>
+      </w:r>
+    </w:p>
+    <w:p>
+      <w:pPr>
+        <w:spacing w:after="120"/>
+        <w:ind w:left="440"/>
+      </w:pPr>
+    </w:p>
+    <w:p>
+      <w:pPr>
+        <w:pStyle w:val="Heading1"/>
+      </w:pPr>
+      <w:r>
+        <w:t xml:space="preserve">PIQ 14 – Class 12: 2020 &amp; COVID-19</w:t>
+      </w:r>
+    </w:p>
+    <w:p>
+      <w:pPr>
+        <w:pStyle w:val="ListParagraph"/>
+        <w:keepNext/>
+        <w:numPr>
+          <w:ilvl w:val="0"/>
+          <w:numId w:val="2"/>
+        </w:numPr>
+        <w:spacing w:after="0" w:before="120"/>
+      </w:pPr>
+      <w:r>
+        <w:rPr>
+          <w:b/>
+          <w:bCs/>
+        </w:rPr>
+        <w:t xml:space="preserve">What happened in 2020?</w:t>
+      </w:r>
+    </w:p>
+    <w:p>
+      <w:pPr>
+        <w:spacing w:after="120"/>
+        <w:ind w:left="440"/>
+      </w:pPr>
+    </w:p>
+    <w:p>
+      <w:pPr>
+        <w:pStyle w:val="ListParagraph"/>
+        <w:keepNext/>
+        <w:numPr>
+          <w:ilvl w:val="0"/>
+          <w:numId w:val="2"/>
+        </w:numPr>
+        <w:spacing w:after="0" w:before="120"/>
+      </w:pPr>
+      <w:r>
+        <w:rPr>
+          <w:b/>
+          <w:bCs/>
+        </w:rPr>
+        <w:t xml:space="preserve">When did COVID-19 hit India?</w:t>
+      </w:r>
+    </w:p>
+    <w:p>
+      <w:pPr>
+        <w:spacing w:after="120"/>
+        <w:ind w:left="440"/>
+      </w:pPr>
+    </w:p>
+    <w:p>
+      <w:pPr>
+        <w:pStyle w:val="ListParagraph"/>
+        <w:keepNext/>
+        <w:numPr>
+          <w:ilvl w:val="0"/>
+          <w:numId w:val="2"/>
+        </w:numPr>
+        <w:spacing w:after="0" w:before="120"/>
+      </w:pPr>
+      <w:r>
+        <w:rPr>
+          <w:b/>
+          <w:bCs/>
+        </w:rPr>
+        <w:t xml:space="preserve">How did COVID affect your Class 12 education?</w:t>
+      </w:r>
+    </w:p>
+    <w:p>
+      <w:pPr>
+        <w:spacing w:after="120"/>
+        <w:ind w:left="440"/>
+      </w:pPr>
+    </w:p>
+    <w:p>
+      <w:pPr>
+        <w:pStyle w:val="ListParagraph"/>
+        <w:keepNext/>
+        <w:numPr>
+          <w:ilvl w:val="0"/>
+          <w:numId w:val="2"/>
+        </w:numPr>
+        <w:spacing w:after="0" w:before="120"/>
+      </w:pPr>
+      <w:r>
+        <w:rPr>
+          <w:b/>
+          <w:bCs/>
+        </w:rPr>
+        <w:t xml:space="preserve">Were your exams affected?</w:t>
+      </w:r>
+    </w:p>
+    <w:p>
+      <w:pPr>
+        <w:spacing w:after="120"/>
+        <w:ind w:left="440"/>
+      </w:pPr>
+    </w:p>
+    <w:p>
+      <w:pPr>
+        <w:pStyle w:val="ListParagraph"/>
+        <w:keepNext/>
+        <w:numPr>
+          <w:ilvl w:val="0"/>
+          <w:numId w:val="2"/>
+        </w:numPr>
+        <w:spacing w:after="0" w:before="120"/>
+      </w:pPr>
+      <w:r>
+        <w:rPr>
+          <w:b/>
+          <w:bCs/>
+        </w:rPr>
+        <w:t xml:space="preserve">How did you continue studying?</w:t>
+      </w:r>
+    </w:p>
+    <w:p>
+      <w:pPr>
+        <w:spacing w:after="120"/>
+        <w:ind w:left="440"/>
+      </w:pPr>
+    </w:p>
+    <w:p>
+      <w:pPr>
+        <w:pStyle w:val="ListParagraph"/>
+        <w:keepNext/>
+        <w:numPr>
+          <w:ilvl w:val="0"/>
+          <w:numId w:val="2"/>
+        </w:numPr>
+        <w:spacing w:after="0" w:before="120"/>
+      </w:pPr>
+      <w:r>
+        <w:rPr>
+          <w:b/>
+          <w:bCs/>
+        </w:rPr>
+        <w:t xml:space="preserve">What did you do during the lockdown?</w:t>
+      </w:r>
+    </w:p>
+    <w:p>
+      <w:pPr>
+        <w:spacing w:after="120"/>
+        <w:ind w:left="440"/>
+      </w:pPr>
+    </w:p>
+    <w:p>
+      <w:pPr>
+        <w:pStyle w:val="ListParagraph"/>
+        <w:keepNext/>
+        <w:numPr>
+          <w:ilvl w:val="0"/>
+          <w:numId w:val="2"/>
+        </w:numPr>
+        <w:spacing w:after="0" w:before="120"/>
+      </w:pPr>
+      <w:r>
+        <w:rPr>
+          <w:b/>
+          <w:bCs/>
+        </w:rPr>
+        <w:t xml:space="preserve">How did the pandemic affect your career plans?</w:t>
+      </w:r>
+    </w:p>
+    <w:p>
+      <w:pPr>
+        <w:spacing w:after="120"/>
+        <w:ind w:left="440"/>
+      </w:pPr>
+    </w:p>
+    <w:p>
+      <w:pPr>
+        <w:pStyle w:val="Heading1"/>
+      </w:pPr>
+      <w:r>
+        <w:t xml:space="preserve">PIQ 14 – Class 12 to B.Tech</w:t>
+      </w:r>
+    </w:p>
+    <w:p>
+      <w:pPr>
+        <w:pStyle w:val="ListParagraph"/>
+        <w:keepNext/>
+        <w:numPr>
+          <w:ilvl w:val="0"/>
+          <w:numId w:val="2"/>
+        </w:numPr>
+        <w:spacing w:after="0" w:before="120"/>
+      </w:pPr>
+      <w:r>
+        <w:rPr>
+          <w:b/>
+          <w:bCs/>
+        </w:rPr>
+        <w:t xml:space="preserve">What did you do after Class 12?</w:t>
+      </w:r>
+    </w:p>
+    <w:p>
+      <w:pPr>
+        <w:spacing w:after="120"/>
+        <w:ind w:left="440"/>
+      </w:pPr>
+    </w:p>
+    <w:p>
+      <w:pPr>
+        <w:pStyle w:val="ListParagraph"/>
+        <w:keepNext/>
+        <w:numPr>
+          <w:ilvl w:val="0"/>
+          <w:numId w:val="2"/>
+        </w:numPr>
+        <w:spacing w:after="0" w:before="120"/>
+      </w:pPr>
+      <w:r>
+        <w:rPr>
+          <w:b/>
+          <w:bCs/>
+        </w:rPr>
+        <w:t xml:space="preserve">Why did you choose B.Tech?</w:t>
+      </w:r>
+    </w:p>
+    <w:p>
+      <w:pPr>
+        <w:spacing w:after="120"/>
+        <w:ind w:left="440"/>
+      </w:pPr>
+    </w:p>
+    <w:p>
+      <w:pPr>
+        <w:pStyle w:val="ListParagraph"/>
+        <w:keepNext/>
+        <w:numPr>
+          <w:ilvl w:val="0"/>
+          <w:numId w:val="2"/>
+        </w:numPr>
+        <w:spacing w:after="0" w:before="120"/>
+      </w:pPr>
+      <w:r>
+        <w:rPr>
+          <w:b/>
+          <w:bCs/>
+        </w:rPr>
+        <w:t xml:space="preserve">Why did you choose IMS Engineering College (IMSEC)?</w:t>
+      </w:r>
+    </w:p>
+    <w:p>
+      <w:pPr>
+        <w:spacing w:after="120"/>
+        <w:ind w:left="440"/>
+      </w:pPr>
+    </w:p>
+    <w:p>
+      <w:pPr>
+        <w:pStyle w:val="ListParagraph"/>
+        <w:keepNext/>
+        <w:numPr>
+          <w:ilvl w:val="0"/>
+          <w:numId w:val="2"/>
+        </w:numPr>
+        <w:spacing w:after="0" w:before="120"/>
+      </w:pPr>
+      <w:r>
+        <w:rPr>
+          <w:b/>
+          <w:bCs/>
+        </w:rPr>
+        <w:t xml:space="preserve">Which other colleges did you consider?</w:t>
+      </w:r>
+    </w:p>
+    <w:p>
+      <w:pPr>
+        <w:spacing w:after="120"/>
+        <w:ind w:left="440"/>
+      </w:pPr>
+    </w:p>
+    <w:p>
+      <w:pPr>
+        <w:pStyle w:val="ListParagraph"/>
+        <w:keepNext/>
+        <w:numPr>
+          <w:ilvl w:val="0"/>
+          <w:numId w:val="2"/>
+        </w:numPr>
+        <w:spacing w:after="0" w:before="120"/>
+      </w:pPr>
+      <w:r>
+        <w:rPr>
+          <w:b/>
+          <w:bCs/>
+        </w:rPr>
+        <w:t xml:space="preserve">How did you get admission?</w:t>
+      </w:r>
+    </w:p>
+    <w:p>
+      <w:pPr>
+        <w:spacing w:after="120"/>
+        <w:ind w:left="440"/>
+      </w:pPr>
+    </w:p>
+    <w:p>
+      <w:pPr>
+        <w:pStyle w:val="ListParagraph"/>
+        <w:keepNext/>
+        <w:numPr>
+          <w:ilvl w:val="0"/>
+          <w:numId w:val="2"/>
+        </w:numPr>
+        <w:spacing w:after="0" w:before="120"/>
+      </w:pPr>
+      <w:r>
+        <w:rPr>
+          <w:b/>
+          <w:bCs/>
+        </w:rPr>
+        <w:t xml:space="preserve">What did you expect from engineering?</w:t>
+      </w:r>
+    </w:p>
+    <w:p>
+      <w:pPr>
+        <w:spacing w:after="120"/>
+        <w:ind w:left="440"/>
+      </w:pPr>
+    </w:p>
+    <w:p>
+      <w:pPr>
+        <w:pStyle w:val="ListParagraph"/>
+        <w:keepNext/>
+        <w:numPr>
+          <w:ilvl w:val="0"/>
+          <w:numId w:val="2"/>
+        </w:numPr>
+        <w:spacing w:after="0" w:before="120"/>
+      </w:pPr>
+      <w:r>
+        <w:rPr>
+          <w:b/>
+          <w:bCs/>
+        </w:rPr>
+        <w:t xml:space="preserve">How did you improve academically after Class 12?</w:t>
+      </w:r>
+    </w:p>
+    <w:p>
+      <w:pPr>
+        <w:spacing w:after="120"/>
+        <w:ind w:left="440"/>
+      </w:pPr>
+    </w:p>
+    <w:p>
+      <w:pPr>
+        <w:pStyle w:val="ListParagraph"/>
+        <w:keepNext/>
+        <w:numPr>
+          <w:ilvl w:val="0"/>
+          <w:numId w:val="2"/>
+        </w:numPr>
+        <w:spacing w:after="0" w:before="120"/>
+      </w:pPr>
+      <w:r>
+        <w:rPr>
+          <w:b/>
+          <w:bCs/>
+        </w:rPr>
+        <w:t xml:space="preserve">What did you learn during B.Tech?</w:t>
+      </w:r>
+    </w:p>
+    <w:p>
+      <w:pPr>
+        <w:spacing w:after="120"/>
+        <w:ind w:left="440"/>
+      </w:pPr>
+    </w:p>
+    <w:p>
+      <w:pPr>
+        <w:pStyle w:val="Heading1"/>
+      </w:pPr>
+      <w:r>
+        <w:t xml:space="preserve">PIQ 14 – Class 12: Personal Development</w:t>
+      </w:r>
+    </w:p>
+    <w:p>
+      <w:pPr>
+        <w:pStyle w:val="ListParagraph"/>
+        <w:keepNext/>
+        <w:numPr>
+          <w:ilvl w:val="0"/>
+          <w:numId w:val="2"/>
+        </w:numPr>
+        <w:spacing w:after="0" w:before="120"/>
+      </w:pPr>
+      <w:r>
+        <w:rPr>
+          <w:b/>
+          <w:bCs/>
+        </w:rPr>
+        <w:t xml:space="preserve">What did Class 12 teach you?</w:t>
+      </w:r>
+    </w:p>
+    <w:p>
+      <w:pPr>
+        <w:spacing w:after="120"/>
+        <w:ind w:left="440"/>
+      </w:pPr>
+    </w:p>
+    <w:p>
+      <w:pPr>
+        <w:pStyle w:val="ListParagraph"/>
+        <w:keepNext/>
+        <w:numPr>
+          <w:ilvl w:val="0"/>
+          <w:numId w:val="2"/>
+        </w:numPr>
+        <w:spacing w:after="0" w:before="120"/>
+      </w:pPr>
+      <w:r>
+        <w:rPr>
+          <w:b/>
+          <w:bCs/>
+        </w:rPr>
+        <w:t xml:space="preserve">What mistake did you make in Class 11–12?</w:t>
+      </w:r>
+    </w:p>
+    <w:p>
+      <w:pPr>
+        <w:spacing w:after="120"/>
+        <w:ind w:left="440"/>
+      </w:pPr>
+    </w:p>
+    <w:p>
+      <w:pPr>
+        <w:pStyle w:val="ListParagraph"/>
+        <w:keepNext/>
+        <w:numPr>
+          <w:ilvl w:val="0"/>
+          <w:numId w:val="2"/>
+        </w:numPr>
+        <w:spacing w:after="0" w:before="120"/>
+      </w:pPr>
+      <w:r>
+        <w:rPr>
+          <w:b/>
+          <w:bCs/>
+        </w:rPr>
+        <w:t xml:space="preserve">What would you change about your school life?</w:t>
+      </w:r>
+    </w:p>
+    <w:p>
+      <w:pPr>
+        <w:spacing w:after="120"/>
+        <w:ind w:left="440"/>
+      </w:pPr>
+    </w:p>
+    <w:p>
+      <w:pPr>
+        <w:pStyle w:val="ListParagraph"/>
+        <w:keepNext/>
+        <w:numPr>
+          <w:ilvl w:val="0"/>
+          <w:numId w:val="2"/>
+        </w:numPr>
+        <w:spacing w:after="0" w:before="120"/>
+      </w:pPr>
+      <w:r>
+        <w:rPr>
+          <w:b/>
+          <w:bCs/>
+        </w:rPr>
+        <w:t xml:space="preserve">When did you become serious about your career?</w:t>
+      </w:r>
+    </w:p>
+    <w:p>
+      <w:pPr>
+        <w:spacing w:after="120"/>
+        <w:ind w:left="440"/>
+      </w:pPr>
+    </w:p>
+    <w:p>
+      <w:pPr>
+        <w:pStyle w:val="ListParagraph"/>
+        <w:keepNext/>
+        <w:numPr>
+          <w:ilvl w:val="0"/>
+          <w:numId w:val="2"/>
+        </w:numPr>
+        <w:spacing w:after="0" w:before="120"/>
+      </w:pPr>
+      <w:r>
+        <w:rPr>
+          <w:b/>
+          <w:bCs/>
+        </w:rPr>
+        <w:t xml:space="preserve">What did you do in your free time?</w:t>
+      </w:r>
+    </w:p>
+    <w:p>
+      <w:pPr>
+        <w:spacing w:after="120"/>
+        <w:ind w:left="440"/>
+      </w:pPr>
+    </w:p>
+    <w:p>
+      <w:pPr>
+        <w:pStyle w:val="ListParagraph"/>
+        <w:keepNext/>
+        <w:numPr>
+          <w:ilvl w:val="0"/>
+          <w:numId w:val="2"/>
+        </w:numPr>
+        <w:spacing w:after="0" w:before="120"/>
+      </w:pPr>
+      <w:r>
+        <w:rPr>
+          <w:b/>
+          <w:bCs/>
+        </w:rPr>
+        <w:t xml:space="preserve">Tell me one thing you were better at in Class 12 than in Class 10.</w:t>
       </w:r>
     </w:p>
     <w:p>

</xml_diff>

<commit_message>
Add PIQ 15 (B.Tech CSE) questions to SSB question sheet
Co-Authored-By: Claude Opus 5.5 <noreply@anthropic.com>
Claude-Session: https://claude.ai/code/session_01TypcejD48cCyAqfjtUUit5
</commit_message>
<xml_diff>
--- a/SSB_Question_Sheet.docx
+++ b/SSB_Question_Sheet.docx
@@ -23324,6 +23324,3550 @@
           <w:bCs/>
         </w:rPr>
         <w:t xml:space="preserve">Tell me one thing you were better at in Class 12 than in Class 10.</w:t>
+      </w:r>
+    </w:p>
+    <w:p>
+      <w:pPr>
+        <w:spacing w:after="120"/>
+        <w:ind w:left="440"/>
+      </w:pPr>
+    </w:p>
+    <w:p>
+      <w:pPr>
+        <w:pStyle w:val="Heading1"/>
+      </w:pPr>
+      <w:r>
+        <w:t xml:space="preserve">PIQ 15 – B.Tech CSE</w:t>
+      </w:r>
+    </w:p>
+    <w:p>
+      <w:pPr>
+        <w:pStyle w:val="ListParagraph"/>
+        <w:keepNext/>
+        <w:numPr>
+          <w:ilvl w:val="0"/>
+          <w:numId w:val="2"/>
+        </w:numPr>
+        <w:spacing w:after="0" w:before="120"/>
+      </w:pPr>
+      <w:r>
+        <w:rPr>
+          <w:b/>
+          <w:bCs/>
+        </w:rPr>
+        <w:t xml:space="preserve">Which subjects did you study in B.Tech?</w:t>
+      </w:r>
+    </w:p>
+    <w:p>
+      <w:pPr>
+        <w:spacing w:after="120"/>
+        <w:ind w:left="440"/>
+      </w:pPr>
+    </w:p>
+    <w:p>
+      <w:pPr>
+        <w:pStyle w:val="ListParagraph"/>
+        <w:keepNext/>
+        <w:numPr>
+          <w:ilvl w:val="0"/>
+          <w:numId w:val="2"/>
+        </w:numPr>
+        <w:spacing w:after="0" w:before="120"/>
+      </w:pPr>
+      <w:r>
+        <w:rPr>
+          <w:b/>
+          <w:bCs/>
+        </w:rPr>
+        <w:t xml:space="preserve">When did you graduate?</w:t>
+      </w:r>
+    </w:p>
+    <w:p>
+      <w:pPr>
+        <w:spacing w:after="120"/>
+        <w:ind w:left="440"/>
+      </w:pPr>
+    </w:p>
+    <w:p>
+      <w:pPr>
+        <w:pStyle w:val="ListParagraph"/>
+        <w:keepNext/>
+        <w:numPr>
+          <w:ilvl w:val="0"/>
+          <w:numId w:val="2"/>
+        </w:numPr>
+        <w:spacing w:after="0" w:before="120"/>
+      </w:pPr>
+      <w:r>
+        <w:rPr>
+          <w:b/>
+          <w:bCs/>
+        </w:rPr>
+        <w:t xml:space="preserve">What percentage did you get?</w:t>
+      </w:r>
+    </w:p>
+    <w:p>
+      <w:pPr>
+        <w:spacing w:after="120"/>
+        <w:ind w:left="440"/>
+      </w:pPr>
+    </w:p>
+    <w:p>
+      <w:pPr>
+        <w:pStyle w:val="ListParagraph"/>
+        <w:keepNext/>
+        <w:numPr>
+          <w:ilvl w:val="0"/>
+          <w:numId w:val="2"/>
+        </w:numPr>
+        <w:spacing w:after="0" w:before="120"/>
+      </w:pPr>
+      <w:r>
+        <w:rPr>
+          <w:b/>
+          <w:bCs/>
+        </w:rPr>
+        <w:t xml:space="preserve">Which subjects did you enjoy most?</w:t>
+      </w:r>
+    </w:p>
+    <w:p>
+      <w:pPr>
+        <w:spacing w:after="120"/>
+        <w:ind w:left="440"/>
+      </w:pPr>
+    </w:p>
+    <w:p>
+      <w:pPr>
+        <w:pStyle w:val="ListParagraph"/>
+        <w:keepNext/>
+        <w:numPr>
+          <w:ilvl w:val="0"/>
+          <w:numId w:val="2"/>
+        </w:numPr>
+        <w:spacing w:after="0" w:before="120"/>
+      </w:pPr>
+      <w:r>
+        <w:rPr>
+          <w:b/>
+          <w:bCs/>
+        </w:rPr>
+        <w:t xml:space="preserve">Which subject was difficult?</w:t>
+      </w:r>
+    </w:p>
+    <w:p>
+      <w:pPr>
+        <w:spacing w:after="120"/>
+        <w:ind w:left="440"/>
+      </w:pPr>
+    </w:p>
+    <w:p>
+      <w:pPr>
+        <w:pStyle w:val="ListParagraph"/>
+        <w:keepNext/>
+        <w:numPr>
+          <w:ilvl w:val="0"/>
+          <w:numId w:val="2"/>
+        </w:numPr>
+        <w:spacing w:after="0" w:before="120"/>
+      </w:pPr>
+      <w:r>
+        <w:rPr>
+          <w:b/>
+          <w:bCs/>
+        </w:rPr>
+        <w:t xml:space="preserve">What was your final-year project?</w:t>
+      </w:r>
+    </w:p>
+    <w:p>
+      <w:pPr>
+        <w:spacing w:after="120"/>
+        <w:ind w:left="440"/>
+      </w:pPr>
+    </w:p>
+    <w:p>
+      <w:pPr>
+        <w:pStyle w:val="Heading1"/>
+      </w:pPr>
+      <w:r>
+        <w:t xml:space="preserve">PIQ 15 – B.Tech: Academic Progression</w:t>
+      </w:r>
+    </w:p>
+    <w:p>
+      <w:pPr>
+        <w:pStyle w:val="ListParagraph"/>
+        <w:keepNext/>
+        <w:numPr>
+          <w:ilvl w:val="0"/>
+          <w:numId w:val="2"/>
+        </w:numPr>
+        <w:spacing w:after="0" w:before="120"/>
+      </w:pPr>
+      <w:r>
+        <w:rPr>
+          <w:b/>
+          <w:bCs/>
+        </w:rPr>
+        <w:t xml:space="preserve">You improved from 68.8% in Class 12 to 73.3% in B.Tech. What changed?</w:t>
+      </w:r>
+    </w:p>
+    <w:p>
+      <w:pPr>
+        <w:spacing w:after="120"/>
+        <w:ind w:left="440"/>
+      </w:pPr>
+    </w:p>
+    <w:p>
+      <w:pPr>
+        <w:pStyle w:val="ListParagraph"/>
+        <w:keepNext/>
+        <w:numPr>
+          <w:ilvl w:val="0"/>
+          <w:numId w:val="2"/>
+        </w:numPr>
+        <w:spacing w:after="0" w:before="120"/>
+      </w:pPr>
+      <w:r>
+        <w:rPr>
+          <w:b/>
+          <w:bCs/>
+        </w:rPr>
+        <w:t xml:space="preserve">Did you become more disciplined?</w:t>
+      </w:r>
+    </w:p>
+    <w:p>
+      <w:pPr>
+        <w:spacing w:after="120"/>
+        <w:ind w:left="440"/>
+      </w:pPr>
+    </w:p>
+    <w:p>
+      <w:pPr>
+        <w:pStyle w:val="ListParagraph"/>
+        <w:keepNext/>
+        <w:numPr>
+          <w:ilvl w:val="0"/>
+          <w:numId w:val="2"/>
+        </w:numPr>
+        <w:spacing w:after="0" w:before="120"/>
+      </w:pPr>
+      <w:r>
+        <w:rPr>
+          <w:b/>
+          <w:bCs/>
+        </w:rPr>
+        <w:t xml:space="preserve">Did you become more interested in your subjects?</w:t>
+      </w:r>
+    </w:p>
+    <w:p>
+      <w:pPr>
+        <w:spacing w:after="120"/>
+        <w:ind w:left="440"/>
+      </w:pPr>
+    </w:p>
+    <w:p>
+      <w:pPr>
+        <w:pStyle w:val="ListParagraph"/>
+        <w:keepNext/>
+        <w:numPr>
+          <w:ilvl w:val="0"/>
+          <w:numId w:val="2"/>
+        </w:numPr>
+        <w:spacing w:after="0" w:before="120"/>
+      </w:pPr>
+      <w:r>
+        <w:rPr>
+          <w:b/>
+          <w:bCs/>
+        </w:rPr>
+        <w:t xml:space="preserve">Which subjects helped you improve?</w:t>
+      </w:r>
+    </w:p>
+    <w:p>
+      <w:pPr>
+        <w:spacing w:after="120"/>
+        <w:ind w:left="440"/>
+      </w:pPr>
+    </w:p>
+    <w:p>
+      <w:pPr>
+        <w:pStyle w:val="ListParagraph"/>
+        <w:keepNext/>
+        <w:numPr>
+          <w:ilvl w:val="0"/>
+          <w:numId w:val="2"/>
+        </w:numPr>
+        <w:spacing w:after="0" w:before="120"/>
+      </w:pPr>
+      <w:r>
+        <w:rPr>
+          <w:b/>
+          <w:bCs/>
+        </w:rPr>
+        <w:t xml:space="preserve">How would you describe yourself as a student?</w:t>
+      </w:r>
+    </w:p>
+    <w:p>
+      <w:pPr>
+        <w:spacing w:after="120"/>
+        <w:ind w:left="440"/>
+      </w:pPr>
+    </w:p>
+    <w:p>
+      <w:pPr>
+        <w:pStyle w:val="Heading1"/>
+      </w:pPr>
+      <w:r>
+        <w:t xml:space="preserve">PIQ 15 – B.Tech: Programming &amp; OOP</w:t>
+      </w:r>
+    </w:p>
+    <w:p>
+      <w:pPr>
+        <w:pStyle w:val="ListParagraph"/>
+        <w:keepNext/>
+        <w:numPr>
+          <w:ilvl w:val="0"/>
+          <w:numId w:val="2"/>
+        </w:numPr>
+        <w:spacing w:after="0" w:before="120"/>
+      </w:pPr>
+      <w:r>
+        <w:rPr>
+          <w:b/>
+          <w:bCs/>
+        </w:rPr>
+        <w:t xml:space="preserve">What programming languages do you know?</w:t>
+      </w:r>
+    </w:p>
+    <w:p>
+      <w:pPr>
+        <w:spacing w:after="120"/>
+        <w:ind w:left="440"/>
+      </w:pPr>
+    </w:p>
+    <w:p>
+      <w:pPr>
+        <w:pStyle w:val="ListParagraph"/>
+        <w:keepNext/>
+        <w:numPr>
+          <w:ilvl w:val="0"/>
+          <w:numId w:val="2"/>
+        </w:numPr>
+        <w:spacing w:after="0" w:before="120"/>
+      </w:pPr>
+      <w:r>
+        <w:rPr>
+          <w:b/>
+          <w:bCs/>
+        </w:rPr>
+        <w:t xml:space="preserve">Which language are you strongest in?</w:t>
+      </w:r>
+    </w:p>
+    <w:p>
+      <w:pPr>
+        <w:spacing w:after="120"/>
+        <w:ind w:left="440"/>
+      </w:pPr>
+    </w:p>
+    <w:p>
+      <w:pPr>
+        <w:pStyle w:val="ListParagraph"/>
+        <w:keepNext/>
+        <w:numPr>
+          <w:ilvl w:val="0"/>
+          <w:numId w:val="2"/>
+        </w:numPr>
+        <w:spacing w:after="0" w:before="120"/>
+      </w:pPr>
+      <w:r>
+        <w:rPr>
+          <w:b/>
+          <w:bCs/>
+        </w:rPr>
+        <w:t xml:space="preserve">What are the four pillars of OOP?</w:t>
+      </w:r>
+    </w:p>
+    <w:p>
+      <w:pPr>
+        <w:spacing w:after="120"/>
+        <w:ind w:left="440"/>
+      </w:pPr>
+    </w:p>
+    <w:p>
+      <w:pPr>
+        <w:pStyle w:val="ListParagraph"/>
+        <w:keepNext/>
+        <w:numPr>
+          <w:ilvl w:val="0"/>
+          <w:numId w:val="2"/>
+        </w:numPr>
+        <w:spacing w:after="0" w:before="120"/>
+      </w:pPr>
+      <w:r>
+        <w:rPr>
+          <w:b/>
+          <w:bCs/>
+        </w:rPr>
+        <w:t xml:space="preserve">What is inheritance?</w:t>
+      </w:r>
+    </w:p>
+    <w:p>
+      <w:pPr>
+        <w:spacing w:after="120"/>
+        <w:ind w:left="440"/>
+      </w:pPr>
+    </w:p>
+    <w:p>
+      <w:pPr>
+        <w:pStyle w:val="ListParagraph"/>
+        <w:keepNext/>
+        <w:numPr>
+          <w:ilvl w:val="0"/>
+          <w:numId w:val="2"/>
+        </w:numPr>
+        <w:spacing w:after="0" w:before="120"/>
+      </w:pPr>
+      <w:r>
+        <w:rPr>
+          <w:b/>
+          <w:bCs/>
+        </w:rPr>
+        <w:t xml:space="preserve">What is polymorphism?</w:t>
+      </w:r>
+    </w:p>
+    <w:p>
+      <w:pPr>
+        <w:spacing w:after="120"/>
+        <w:ind w:left="440"/>
+      </w:pPr>
+    </w:p>
+    <w:p>
+      <w:pPr>
+        <w:pStyle w:val="ListParagraph"/>
+        <w:keepNext/>
+        <w:numPr>
+          <w:ilvl w:val="0"/>
+          <w:numId w:val="2"/>
+        </w:numPr>
+        <w:spacing w:after="0" w:before="120"/>
+      </w:pPr>
+      <w:r>
+        <w:rPr>
+          <w:b/>
+          <w:bCs/>
+        </w:rPr>
+        <w:t xml:space="preserve">What is encapsulation?</w:t>
+      </w:r>
+    </w:p>
+    <w:p>
+      <w:pPr>
+        <w:spacing w:after="120"/>
+        <w:ind w:left="440"/>
+      </w:pPr>
+    </w:p>
+    <w:p>
+      <w:pPr>
+        <w:pStyle w:val="ListParagraph"/>
+        <w:keepNext/>
+        <w:numPr>
+          <w:ilvl w:val="0"/>
+          <w:numId w:val="2"/>
+        </w:numPr>
+        <w:spacing w:after="0" w:before="120"/>
+      </w:pPr>
+      <w:r>
+        <w:rPr>
+          <w:b/>
+          <w:bCs/>
+        </w:rPr>
+        <w:t xml:space="preserve">What is abstraction?</w:t>
+      </w:r>
+    </w:p>
+    <w:p>
+      <w:pPr>
+        <w:spacing w:after="120"/>
+        <w:ind w:left="440"/>
+      </w:pPr>
+    </w:p>
+    <w:p>
+      <w:pPr>
+        <w:pStyle w:val="Heading1"/>
+      </w:pPr>
+      <w:r>
+        <w:t xml:space="preserve">PIQ 15 – B.Tech: Data Structures &amp; Algorithms</w:t>
+      </w:r>
+    </w:p>
+    <w:p>
+      <w:pPr>
+        <w:pStyle w:val="ListParagraph"/>
+        <w:keepNext/>
+        <w:numPr>
+          <w:ilvl w:val="0"/>
+          <w:numId w:val="2"/>
+        </w:numPr>
+        <w:spacing w:after="0" w:before="120"/>
+      </w:pPr>
+      <w:r>
+        <w:rPr>
+          <w:b/>
+          <w:bCs/>
+        </w:rPr>
+        <w:t xml:space="preserve">What is the difference between an array and a linked list?</w:t>
+      </w:r>
+    </w:p>
+    <w:p>
+      <w:pPr>
+        <w:spacing w:after="120"/>
+        <w:ind w:left="440"/>
+      </w:pPr>
+    </w:p>
+    <w:p>
+      <w:pPr>
+        <w:pStyle w:val="ListParagraph"/>
+        <w:keepNext/>
+        <w:numPr>
+          <w:ilvl w:val="0"/>
+          <w:numId w:val="2"/>
+        </w:numPr>
+        <w:spacing w:after="0" w:before="120"/>
+      </w:pPr>
+      <w:r>
+        <w:rPr>
+          <w:b/>
+          <w:bCs/>
+        </w:rPr>
+        <w:t xml:space="preserve">What is the difference between a stack and a queue?</w:t>
+      </w:r>
+    </w:p>
+    <w:p>
+      <w:pPr>
+        <w:spacing w:after="120"/>
+        <w:ind w:left="440"/>
+      </w:pPr>
+    </w:p>
+    <w:p>
+      <w:pPr>
+        <w:pStyle w:val="ListParagraph"/>
+        <w:keepNext/>
+        <w:numPr>
+          <w:ilvl w:val="0"/>
+          <w:numId w:val="2"/>
+        </w:numPr>
+        <w:spacing w:after="0" w:before="120"/>
+      </w:pPr>
+      <w:r>
+        <w:rPr>
+          <w:b/>
+          <w:bCs/>
+        </w:rPr>
+        <w:t xml:space="preserve">What is a tree?</w:t>
+      </w:r>
+    </w:p>
+    <w:p>
+      <w:pPr>
+        <w:spacing w:after="120"/>
+        <w:ind w:left="440"/>
+      </w:pPr>
+    </w:p>
+    <w:p>
+      <w:pPr>
+        <w:pStyle w:val="ListParagraph"/>
+        <w:keepNext/>
+        <w:numPr>
+          <w:ilvl w:val="0"/>
+          <w:numId w:val="2"/>
+        </w:numPr>
+        <w:spacing w:after="0" w:before="120"/>
+      </w:pPr>
+      <w:r>
+        <w:rPr>
+          <w:b/>
+          <w:bCs/>
+        </w:rPr>
+        <w:t xml:space="preserve">What is a graph?</w:t>
+      </w:r>
+    </w:p>
+    <w:p>
+      <w:pPr>
+        <w:spacing w:after="120"/>
+        <w:ind w:left="440"/>
+      </w:pPr>
+    </w:p>
+    <w:p>
+      <w:pPr>
+        <w:pStyle w:val="ListParagraph"/>
+        <w:keepNext/>
+        <w:numPr>
+          <w:ilvl w:val="0"/>
+          <w:numId w:val="2"/>
+        </w:numPr>
+        <w:spacing w:after="0" w:before="120"/>
+      </w:pPr>
+      <w:r>
+        <w:rPr>
+          <w:b/>
+          <w:bCs/>
+        </w:rPr>
+        <w:t xml:space="preserve">What is sorting?</w:t>
+      </w:r>
+    </w:p>
+    <w:p>
+      <w:pPr>
+        <w:spacing w:after="120"/>
+        <w:ind w:left="440"/>
+      </w:pPr>
+    </w:p>
+    <w:p>
+      <w:pPr>
+        <w:pStyle w:val="ListParagraph"/>
+        <w:keepNext/>
+        <w:numPr>
+          <w:ilvl w:val="0"/>
+          <w:numId w:val="2"/>
+        </w:numPr>
+        <w:spacing w:after="0" w:before="120"/>
+      </w:pPr>
+      <w:r>
+        <w:rPr>
+          <w:b/>
+          <w:bCs/>
+        </w:rPr>
+        <w:t xml:space="preserve">What is searching?</w:t>
+      </w:r>
+    </w:p>
+    <w:p>
+      <w:pPr>
+        <w:spacing w:after="120"/>
+        <w:ind w:left="440"/>
+      </w:pPr>
+    </w:p>
+    <w:p>
+      <w:pPr>
+        <w:pStyle w:val="ListParagraph"/>
+        <w:keepNext/>
+        <w:numPr>
+          <w:ilvl w:val="0"/>
+          <w:numId w:val="2"/>
+        </w:numPr>
+        <w:spacing w:after="0" w:before="120"/>
+      </w:pPr>
+      <w:r>
+        <w:rPr>
+          <w:b/>
+          <w:bCs/>
+        </w:rPr>
+        <w:t xml:space="preserve">What is time complexity?</w:t>
+      </w:r>
+    </w:p>
+    <w:p>
+      <w:pPr>
+        <w:spacing w:after="120"/>
+        <w:ind w:left="440"/>
+      </w:pPr>
+    </w:p>
+    <w:p>
+      <w:pPr>
+        <w:pStyle w:val="ListParagraph"/>
+        <w:keepNext/>
+        <w:numPr>
+          <w:ilvl w:val="0"/>
+          <w:numId w:val="2"/>
+        </w:numPr>
+        <w:spacing w:after="0" w:before="120"/>
+      </w:pPr>
+      <w:r>
+        <w:rPr>
+          <w:b/>
+          <w:bCs/>
+        </w:rPr>
+        <w:t xml:space="preserve">What is Big-O notation?</w:t>
+      </w:r>
+    </w:p>
+    <w:p>
+      <w:pPr>
+        <w:spacing w:after="120"/>
+        <w:ind w:left="440"/>
+      </w:pPr>
+    </w:p>
+    <w:p>
+      <w:pPr>
+        <w:pStyle w:val="Heading1"/>
+      </w:pPr>
+      <w:r>
+        <w:t xml:space="preserve">PIQ 15 – B.Tech: Databases</w:t>
+      </w:r>
+    </w:p>
+    <w:p>
+      <w:pPr>
+        <w:pStyle w:val="ListParagraph"/>
+        <w:keepNext/>
+        <w:numPr>
+          <w:ilvl w:val="0"/>
+          <w:numId w:val="2"/>
+        </w:numPr>
+        <w:spacing w:after="0" w:before="120"/>
+      </w:pPr>
+      <w:r>
+        <w:rPr>
+          <w:b/>
+          <w:bCs/>
+        </w:rPr>
+        <w:t xml:space="preserve">What is the difference between SQL and NoSQL?</w:t>
+      </w:r>
+    </w:p>
+    <w:p>
+      <w:pPr>
+        <w:spacing w:after="120"/>
+        <w:ind w:left="440"/>
+      </w:pPr>
+    </w:p>
+    <w:p>
+      <w:pPr>
+        <w:pStyle w:val="ListParagraph"/>
+        <w:keepNext/>
+        <w:numPr>
+          <w:ilvl w:val="0"/>
+          <w:numId w:val="2"/>
+        </w:numPr>
+        <w:spacing w:after="0" w:before="120"/>
+      </w:pPr>
+      <w:r>
+        <w:rPr>
+          <w:b/>
+          <w:bCs/>
+        </w:rPr>
+        <w:t xml:space="preserve">What is normalisation?</w:t>
+      </w:r>
+    </w:p>
+    <w:p>
+      <w:pPr>
+        <w:spacing w:after="120"/>
+        <w:ind w:left="440"/>
+      </w:pPr>
+    </w:p>
+    <w:p>
+      <w:pPr>
+        <w:pStyle w:val="ListParagraph"/>
+        <w:keepNext/>
+        <w:numPr>
+          <w:ilvl w:val="0"/>
+          <w:numId w:val="2"/>
+        </w:numPr>
+        <w:spacing w:after="0" w:before="120"/>
+      </w:pPr>
+      <w:r>
+        <w:rPr>
+          <w:b/>
+          <w:bCs/>
+        </w:rPr>
+        <w:t xml:space="preserve">What is a primary key?</w:t>
+      </w:r>
+    </w:p>
+    <w:p>
+      <w:pPr>
+        <w:spacing w:after="120"/>
+        <w:ind w:left="440"/>
+      </w:pPr>
+    </w:p>
+    <w:p>
+      <w:pPr>
+        <w:pStyle w:val="ListParagraph"/>
+        <w:keepNext/>
+        <w:numPr>
+          <w:ilvl w:val="0"/>
+          <w:numId w:val="2"/>
+        </w:numPr>
+        <w:spacing w:after="0" w:before="120"/>
+      </w:pPr>
+      <w:r>
+        <w:rPr>
+          <w:b/>
+          <w:bCs/>
+        </w:rPr>
+        <w:t xml:space="preserve">What is a foreign key?</w:t>
+      </w:r>
+    </w:p>
+    <w:p>
+      <w:pPr>
+        <w:spacing w:after="120"/>
+        <w:ind w:left="440"/>
+      </w:pPr>
+    </w:p>
+    <w:p>
+      <w:pPr>
+        <w:pStyle w:val="ListParagraph"/>
+        <w:keepNext/>
+        <w:numPr>
+          <w:ilvl w:val="0"/>
+          <w:numId w:val="2"/>
+        </w:numPr>
+        <w:spacing w:after="0" w:before="120"/>
+      </w:pPr>
+      <w:r>
+        <w:rPr>
+          <w:b/>
+          <w:bCs/>
+        </w:rPr>
+        <w:t xml:space="preserve">What is a JOIN?</w:t>
+      </w:r>
+    </w:p>
+    <w:p>
+      <w:pPr>
+        <w:spacing w:after="120"/>
+        <w:ind w:left="440"/>
+      </w:pPr>
+    </w:p>
+    <w:p>
+      <w:pPr>
+        <w:pStyle w:val="ListParagraph"/>
+        <w:keepNext/>
+        <w:numPr>
+          <w:ilvl w:val="0"/>
+          <w:numId w:val="2"/>
+        </w:numPr>
+        <w:spacing w:after="0" w:before="120"/>
+      </w:pPr>
+      <w:r>
+        <w:rPr>
+          <w:b/>
+          <w:bCs/>
+        </w:rPr>
+        <w:t xml:space="preserve">What is MongoDB?</w:t>
+      </w:r>
+    </w:p>
+    <w:p>
+      <w:pPr>
+        <w:spacing w:after="120"/>
+        <w:ind w:left="440"/>
+      </w:pPr>
+    </w:p>
+    <w:p>
+      <w:pPr>
+        <w:pStyle w:val="Heading1"/>
+      </w:pPr>
+      <w:r>
+        <w:t xml:space="preserve">PIQ 15 – B.Tech: Web Development</w:t>
+      </w:r>
+    </w:p>
+    <w:p>
+      <w:pPr>
+        <w:pStyle w:val="ListParagraph"/>
+        <w:keepNext/>
+        <w:numPr>
+          <w:ilvl w:val="0"/>
+          <w:numId w:val="2"/>
+        </w:numPr>
+        <w:spacing w:after="0" w:before="120"/>
+      </w:pPr>
+      <w:r>
+        <w:rPr>
+          <w:b/>
+          <w:bCs/>
+        </w:rPr>
+        <w:t xml:space="preserve">What is frontend development?</w:t>
+      </w:r>
+    </w:p>
+    <w:p>
+      <w:pPr>
+        <w:spacing w:after="120"/>
+        <w:ind w:left="440"/>
+      </w:pPr>
+    </w:p>
+    <w:p>
+      <w:pPr>
+        <w:pStyle w:val="ListParagraph"/>
+        <w:keepNext/>
+        <w:numPr>
+          <w:ilvl w:val="0"/>
+          <w:numId w:val="2"/>
+        </w:numPr>
+        <w:spacing w:after="0" w:before="120"/>
+      </w:pPr>
+      <w:r>
+        <w:rPr>
+          <w:b/>
+          <w:bCs/>
+        </w:rPr>
+        <w:t xml:space="preserve">What is backend development?</w:t>
+      </w:r>
+    </w:p>
+    <w:p>
+      <w:pPr>
+        <w:spacing w:after="120"/>
+        <w:ind w:left="440"/>
+      </w:pPr>
+    </w:p>
+    <w:p>
+      <w:pPr>
+        <w:pStyle w:val="ListParagraph"/>
+        <w:keepNext/>
+        <w:numPr>
+          <w:ilvl w:val="0"/>
+          <w:numId w:val="2"/>
+        </w:numPr>
+        <w:spacing w:after="0" w:before="120"/>
+      </w:pPr>
+      <w:r>
+        <w:rPr>
+          <w:b/>
+          <w:bCs/>
+        </w:rPr>
+        <w:t xml:space="preserve">What is an API?</w:t>
+      </w:r>
+    </w:p>
+    <w:p>
+      <w:pPr>
+        <w:spacing w:after="120"/>
+        <w:ind w:left="440"/>
+      </w:pPr>
+    </w:p>
+    <w:p>
+      <w:pPr>
+        <w:pStyle w:val="ListParagraph"/>
+        <w:keepNext/>
+        <w:numPr>
+          <w:ilvl w:val="0"/>
+          <w:numId w:val="2"/>
+        </w:numPr>
+        <w:spacing w:after="0" w:before="120"/>
+      </w:pPr>
+      <w:r>
+        <w:rPr>
+          <w:b/>
+          <w:bCs/>
+        </w:rPr>
+        <w:t xml:space="preserve">What is REST?</w:t>
+      </w:r>
+    </w:p>
+    <w:p>
+      <w:pPr>
+        <w:spacing w:after="120"/>
+        <w:ind w:left="440"/>
+      </w:pPr>
+    </w:p>
+    <w:p>
+      <w:pPr>
+        <w:pStyle w:val="ListParagraph"/>
+        <w:keepNext/>
+        <w:numPr>
+          <w:ilvl w:val="0"/>
+          <w:numId w:val="2"/>
+        </w:numPr>
+        <w:spacing w:after="0" w:before="120"/>
+      </w:pPr>
+      <w:r>
+        <w:rPr>
+          <w:b/>
+          <w:bCs/>
+        </w:rPr>
+        <w:t xml:space="preserve">What is HTTP?</w:t>
+      </w:r>
+    </w:p>
+    <w:p>
+      <w:pPr>
+        <w:spacing w:after="120"/>
+        <w:ind w:left="440"/>
+      </w:pPr>
+    </w:p>
+    <w:p>
+      <w:pPr>
+        <w:pStyle w:val="ListParagraph"/>
+        <w:keepNext/>
+        <w:numPr>
+          <w:ilvl w:val="0"/>
+          <w:numId w:val="2"/>
+        </w:numPr>
+        <w:spacing w:after="0" w:before="120"/>
+      </w:pPr>
+      <w:r>
+        <w:rPr>
+          <w:b/>
+          <w:bCs/>
+        </w:rPr>
+        <w:t xml:space="preserve">What is JavaScript?</w:t>
+      </w:r>
+    </w:p>
+    <w:p>
+      <w:pPr>
+        <w:spacing w:after="120"/>
+        <w:ind w:left="440"/>
+      </w:pPr>
+    </w:p>
+    <w:p>
+      <w:pPr>
+        <w:pStyle w:val="ListParagraph"/>
+        <w:keepNext/>
+        <w:numPr>
+          <w:ilvl w:val="0"/>
+          <w:numId w:val="2"/>
+        </w:numPr>
+        <w:spacing w:after="0" w:before="120"/>
+      </w:pPr>
+      <w:r>
+        <w:rPr>
+          <w:b/>
+          <w:bCs/>
+        </w:rPr>
+        <w:t xml:space="preserve">What is React?</w:t>
+      </w:r>
+    </w:p>
+    <w:p>
+      <w:pPr>
+        <w:spacing w:after="120"/>
+        <w:ind w:left="440"/>
+      </w:pPr>
+    </w:p>
+    <w:p>
+      <w:pPr>
+        <w:pStyle w:val="ListParagraph"/>
+        <w:keepNext/>
+        <w:numPr>
+          <w:ilvl w:val="0"/>
+          <w:numId w:val="2"/>
+        </w:numPr>
+        <w:spacing w:after="0" w:before="120"/>
+      </w:pPr>
+      <w:r>
+        <w:rPr>
+          <w:b/>
+          <w:bCs/>
+        </w:rPr>
+        <w:t xml:space="preserve">Why React?</w:t>
+      </w:r>
+    </w:p>
+    <w:p>
+      <w:pPr>
+        <w:spacing w:after="120"/>
+        <w:ind w:left="440"/>
+      </w:pPr>
+    </w:p>
+    <w:p>
+      <w:pPr>
+        <w:pStyle w:val="ListParagraph"/>
+        <w:keepNext/>
+        <w:numPr>
+          <w:ilvl w:val="0"/>
+          <w:numId w:val="2"/>
+        </w:numPr>
+        <w:spacing w:after="0" w:before="120"/>
+      </w:pPr>
+      <w:r>
+        <w:rPr>
+          <w:b/>
+          <w:bCs/>
+        </w:rPr>
+        <w:t xml:space="preserve">What is Node.js?</w:t>
+      </w:r>
+    </w:p>
+    <w:p>
+      <w:pPr>
+        <w:spacing w:after="120"/>
+        <w:ind w:left="440"/>
+      </w:pPr>
+    </w:p>
+    <w:p>
+      <w:pPr>
+        <w:pStyle w:val="ListParagraph"/>
+        <w:keepNext/>
+        <w:numPr>
+          <w:ilvl w:val="0"/>
+          <w:numId w:val="2"/>
+        </w:numPr>
+        <w:spacing w:after="0" w:before="120"/>
+      </w:pPr>
+      <w:r>
+        <w:rPr>
+          <w:b/>
+          <w:bCs/>
+        </w:rPr>
+        <w:t xml:space="preserve">What is Express?</w:t>
+      </w:r>
+    </w:p>
+    <w:p>
+      <w:pPr>
+        <w:spacing w:after="120"/>
+        <w:ind w:left="440"/>
+      </w:pPr>
+    </w:p>
+    <w:p>
+      <w:pPr>
+        <w:pStyle w:val="ListParagraph"/>
+        <w:keepNext/>
+        <w:numPr>
+          <w:ilvl w:val="0"/>
+          <w:numId w:val="2"/>
+        </w:numPr>
+        <w:spacing w:after="0" w:before="120"/>
+      </w:pPr>
+      <w:r>
+        <w:rPr>
+          <w:b/>
+          <w:bCs/>
+        </w:rPr>
+        <w:t xml:space="preserve">What is MERN?</w:t>
+      </w:r>
+    </w:p>
+    <w:p>
+      <w:pPr>
+        <w:spacing w:after="120"/>
+        <w:ind w:left="440"/>
+      </w:pPr>
+    </w:p>
+    <w:p>
+      <w:pPr>
+        <w:pStyle w:val="ListParagraph"/>
+        <w:keepNext/>
+        <w:numPr>
+          <w:ilvl w:val="0"/>
+          <w:numId w:val="2"/>
+        </w:numPr>
+        <w:spacing w:after="0" w:before="120"/>
+      </w:pPr>
+      <w:r>
+        <w:rPr>
+          <w:b/>
+          <w:bCs/>
+        </w:rPr>
+        <w:t xml:space="preserve">What do you enjoy about software development?</w:t>
+      </w:r>
+    </w:p>
+    <w:p>
+      <w:pPr>
+        <w:spacing w:after="120"/>
+        <w:ind w:left="440"/>
+      </w:pPr>
+    </w:p>
+    <w:p>
+      <w:pPr>
+        <w:pStyle w:val="Heading1"/>
+      </w:pPr>
+      <w:r>
+        <w:t xml:space="preserve">PIQ 15 – B.Tech: NLP</w:t>
+      </w:r>
+    </w:p>
+    <w:p>
+      <w:pPr>
+        <w:pStyle w:val="ListParagraph"/>
+        <w:keepNext/>
+        <w:numPr>
+          <w:ilvl w:val="0"/>
+          <w:numId w:val="2"/>
+        </w:numPr>
+        <w:spacing w:after="0" w:before="120"/>
+      </w:pPr>
+      <w:r>
+        <w:rPr>
+          <w:b/>
+          <w:bCs/>
+        </w:rPr>
+        <w:t xml:space="preserve">What is NLP, and what does it stand for?</w:t>
+      </w:r>
+    </w:p>
+    <w:p>
+      <w:pPr>
+        <w:spacing w:after="120"/>
+        <w:ind w:left="440"/>
+      </w:pPr>
+    </w:p>
+    <w:p>
+      <w:pPr>
+        <w:pStyle w:val="ListParagraph"/>
+        <w:keepNext/>
+        <w:numPr>
+          <w:ilvl w:val="0"/>
+          <w:numId w:val="2"/>
+        </w:numPr>
+        <w:spacing w:after="0" w:before="120"/>
+      </w:pPr>
+      <w:r>
+        <w:rPr>
+          <w:b/>
+          <w:bCs/>
+        </w:rPr>
+        <w:t xml:space="preserve">Why is NLP important?</w:t>
+      </w:r>
+    </w:p>
+    <w:p>
+      <w:pPr>
+        <w:spacing w:after="120"/>
+        <w:ind w:left="440"/>
+      </w:pPr>
+    </w:p>
+    <w:p>
+      <w:pPr>
+        <w:pStyle w:val="ListParagraph"/>
+        <w:keepNext/>
+        <w:numPr>
+          <w:ilvl w:val="0"/>
+          <w:numId w:val="2"/>
+        </w:numPr>
+        <w:spacing w:after="0" w:before="120"/>
+      </w:pPr>
+      <w:r>
+        <w:rPr>
+          <w:b/>
+          <w:bCs/>
+        </w:rPr>
+        <w:t xml:space="preserve">What problems does NLP solve?</w:t>
+      </w:r>
+    </w:p>
+    <w:p>
+      <w:pPr>
+        <w:spacing w:after="120"/>
+        <w:ind w:left="440"/>
+      </w:pPr>
+    </w:p>
+    <w:p>
+      <w:pPr>
+        <w:pStyle w:val="ListParagraph"/>
+        <w:keepNext/>
+        <w:numPr>
+          <w:ilvl w:val="0"/>
+          <w:numId w:val="2"/>
+        </w:numPr>
+        <w:spacing w:after="0" w:before="120"/>
+      </w:pPr>
+      <w:r>
+        <w:rPr>
+          <w:b/>
+          <w:bCs/>
+        </w:rPr>
+        <w:t xml:space="preserve">What is the difference between AI, ML and NLP?</w:t>
+      </w:r>
+    </w:p>
+    <w:p>
+      <w:pPr>
+        <w:spacing w:after="120"/>
+        <w:ind w:left="440"/>
+      </w:pPr>
+    </w:p>
+    <w:p>
+      <w:pPr>
+        <w:pStyle w:val="ListParagraph"/>
+        <w:keepNext/>
+        <w:numPr>
+          <w:ilvl w:val="0"/>
+          <w:numId w:val="2"/>
+        </w:numPr>
+        <w:spacing w:after="0" w:before="120"/>
+      </w:pPr>
+      <w:r>
+        <w:rPr>
+          <w:b/>
+          <w:bCs/>
+        </w:rPr>
+        <w:t xml:space="preserve">How does NLP use Machine Learning?</w:t>
+      </w:r>
+    </w:p>
+    <w:p>
+      <w:pPr>
+        <w:spacing w:after="120"/>
+        <w:ind w:left="440"/>
+      </w:pPr>
+    </w:p>
+    <w:p>
+      <w:pPr>
+        <w:pStyle w:val="ListParagraph"/>
+        <w:keepNext/>
+        <w:numPr>
+          <w:ilvl w:val="0"/>
+          <w:numId w:val="2"/>
+        </w:numPr>
+        <w:spacing w:after="0" w:before="120"/>
+      </w:pPr>
+      <w:r>
+        <w:rPr>
+          <w:b/>
+          <w:bCs/>
+        </w:rPr>
+        <w:t xml:space="preserve">What is tokenisation?</w:t>
+      </w:r>
+    </w:p>
+    <w:p>
+      <w:pPr>
+        <w:spacing w:after="120"/>
+        <w:ind w:left="440"/>
+      </w:pPr>
+    </w:p>
+    <w:p>
+      <w:pPr>
+        <w:pStyle w:val="ListParagraph"/>
+        <w:keepNext/>
+        <w:numPr>
+          <w:ilvl w:val="0"/>
+          <w:numId w:val="2"/>
+        </w:numPr>
+        <w:spacing w:after="0" w:before="120"/>
+      </w:pPr>
+      <w:r>
+        <w:rPr>
+          <w:b/>
+          <w:bCs/>
+        </w:rPr>
+        <w:t xml:space="preserve">What is stemming?</w:t>
+      </w:r>
+    </w:p>
+    <w:p>
+      <w:pPr>
+        <w:spacing w:after="120"/>
+        <w:ind w:left="440"/>
+      </w:pPr>
+    </w:p>
+    <w:p>
+      <w:pPr>
+        <w:pStyle w:val="ListParagraph"/>
+        <w:keepNext/>
+        <w:numPr>
+          <w:ilvl w:val="0"/>
+          <w:numId w:val="2"/>
+        </w:numPr>
+        <w:spacing w:after="0" w:before="120"/>
+      </w:pPr>
+      <w:r>
+        <w:rPr>
+          <w:b/>
+          <w:bCs/>
+        </w:rPr>
+        <w:t xml:space="preserve">What is lemmatisation?</w:t>
+      </w:r>
+    </w:p>
+    <w:p>
+      <w:pPr>
+        <w:spacing w:after="120"/>
+        <w:ind w:left="440"/>
+      </w:pPr>
+    </w:p>
+    <w:p>
+      <w:pPr>
+        <w:pStyle w:val="ListParagraph"/>
+        <w:keepNext/>
+        <w:numPr>
+          <w:ilvl w:val="0"/>
+          <w:numId w:val="2"/>
+        </w:numPr>
+        <w:spacing w:after="0" w:before="120"/>
+      </w:pPr>
+      <w:r>
+        <w:rPr>
+          <w:b/>
+          <w:bCs/>
+        </w:rPr>
+        <w:t xml:space="preserve">What are stop words?</w:t>
+      </w:r>
+    </w:p>
+    <w:p>
+      <w:pPr>
+        <w:spacing w:after="120"/>
+        <w:ind w:left="440"/>
+      </w:pPr>
+    </w:p>
+    <w:p>
+      <w:pPr>
+        <w:pStyle w:val="ListParagraph"/>
+        <w:keepNext/>
+        <w:numPr>
+          <w:ilvl w:val="0"/>
+          <w:numId w:val="2"/>
+        </w:numPr>
+        <w:spacing w:after="0" w:before="120"/>
+      </w:pPr>
+      <w:r>
+        <w:rPr>
+          <w:b/>
+          <w:bCs/>
+        </w:rPr>
+        <w:t xml:space="preserve">What is POS tagging?</w:t>
+      </w:r>
+    </w:p>
+    <w:p>
+      <w:pPr>
+        <w:spacing w:after="120"/>
+        <w:ind w:left="440"/>
+      </w:pPr>
+    </w:p>
+    <w:p>
+      <w:pPr>
+        <w:pStyle w:val="ListParagraph"/>
+        <w:keepNext/>
+        <w:numPr>
+          <w:ilvl w:val="0"/>
+          <w:numId w:val="2"/>
+        </w:numPr>
+        <w:spacing w:after="0" w:before="120"/>
+      </w:pPr>
+      <w:r>
+        <w:rPr>
+          <w:b/>
+          <w:bCs/>
+        </w:rPr>
+        <w:t xml:space="preserve">What is Named Entity Recognition?</w:t>
+      </w:r>
+    </w:p>
+    <w:p>
+      <w:pPr>
+        <w:spacing w:after="120"/>
+        <w:ind w:left="440"/>
+      </w:pPr>
+    </w:p>
+    <w:p>
+      <w:pPr>
+        <w:pStyle w:val="ListParagraph"/>
+        <w:keepNext/>
+        <w:numPr>
+          <w:ilvl w:val="0"/>
+          <w:numId w:val="2"/>
+        </w:numPr>
+        <w:spacing w:after="0" w:before="120"/>
+      </w:pPr>
+      <w:r>
+        <w:rPr>
+          <w:b/>
+          <w:bCs/>
+        </w:rPr>
+        <w:t xml:space="preserve">What is sentiment analysis?</w:t>
+      </w:r>
+    </w:p>
+    <w:p>
+      <w:pPr>
+        <w:spacing w:after="120"/>
+        <w:ind w:left="440"/>
+      </w:pPr>
+    </w:p>
+    <w:p>
+      <w:pPr>
+        <w:pStyle w:val="ListParagraph"/>
+        <w:keepNext/>
+        <w:numPr>
+          <w:ilvl w:val="0"/>
+          <w:numId w:val="2"/>
+        </w:numPr>
+        <w:spacing w:after="0" w:before="120"/>
+      </w:pPr>
+      <w:r>
+        <w:rPr>
+          <w:b/>
+          <w:bCs/>
+        </w:rPr>
+        <w:t xml:space="preserve">What is text classification?</w:t>
+      </w:r>
+    </w:p>
+    <w:p>
+      <w:pPr>
+        <w:spacing w:after="120"/>
+        <w:ind w:left="440"/>
+      </w:pPr>
+    </w:p>
+    <w:p>
+      <w:pPr>
+        <w:pStyle w:val="ListParagraph"/>
+        <w:keepNext/>
+        <w:numPr>
+          <w:ilvl w:val="0"/>
+          <w:numId w:val="2"/>
+        </w:numPr>
+        <w:spacing w:after="0" w:before="120"/>
+      </w:pPr>
+      <w:r>
+        <w:rPr>
+          <w:b/>
+          <w:bCs/>
+        </w:rPr>
+        <w:t xml:space="preserve">What is speech recognition?</w:t>
+      </w:r>
+    </w:p>
+    <w:p>
+      <w:pPr>
+        <w:spacing w:after="120"/>
+        <w:ind w:left="440"/>
+      </w:pPr>
+    </w:p>
+    <w:p>
+      <w:pPr>
+        <w:pStyle w:val="ListParagraph"/>
+        <w:keepNext/>
+        <w:numPr>
+          <w:ilvl w:val="0"/>
+          <w:numId w:val="2"/>
+        </w:numPr>
+        <w:spacing w:after="0" w:before="120"/>
+      </w:pPr>
+      <w:r>
+        <w:rPr>
+          <w:b/>
+          <w:bCs/>
+        </w:rPr>
+        <w:t xml:space="preserve">What is text generation?</w:t>
+      </w:r>
+    </w:p>
+    <w:p>
+      <w:pPr>
+        <w:spacing w:after="120"/>
+        <w:ind w:left="440"/>
+      </w:pPr>
+    </w:p>
+    <w:p>
+      <w:pPr>
+        <w:pStyle w:val="ListParagraph"/>
+        <w:keepNext/>
+        <w:numPr>
+          <w:ilvl w:val="0"/>
+          <w:numId w:val="2"/>
+        </w:numPr>
+        <w:spacing w:after="0" w:before="120"/>
+      </w:pPr>
+      <w:r>
+        <w:rPr>
+          <w:b/>
+          <w:bCs/>
+        </w:rPr>
+        <w:t xml:space="preserve">What is an NLP pipeline?</w:t>
+      </w:r>
+    </w:p>
+    <w:p>
+      <w:pPr>
+        <w:spacing w:after="120"/>
+        <w:ind w:left="440"/>
+      </w:pPr>
+    </w:p>
+    <w:p>
+      <w:pPr>
+        <w:pStyle w:val="ListParagraph"/>
+        <w:keepNext/>
+        <w:numPr>
+          <w:ilvl w:val="0"/>
+          <w:numId w:val="2"/>
+        </w:numPr>
+        <w:spacing w:after="0" w:before="120"/>
+      </w:pPr>
+      <w:r>
+        <w:rPr>
+          <w:b/>
+          <w:bCs/>
+        </w:rPr>
+        <w:t xml:space="preserve">Give a real-world application of NLP.</w:t>
+      </w:r>
+    </w:p>
+    <w:p>
+      <w:pPr>
+        <w:spacing w:after="120"/>
+        <w:ind w:left="440"/>
+      </w:pPr>
+    </w:p>
+    <w:p>
+      <w:pPr>
+        <w:pStyle w:val="ListParagraph"/>
+        <w:keepNext/>
+        <w:numPr>
+          <w:ilvl w:val="0"/>
+          <w:numId w:val="2"/>
+        </w:numPr>
+        <w:spacing w:after="0" w:before="120"/>
+      </w:pPr>
+      <w:r>
+        <w:rPr>
+          <w:b/>
+          <w:bCs/>
+        </w:rPr>
+        <w:t xml:space="preserve">Explain how one NLP application works, from input to output.</w:t>
+      </w:r>
+    </w:p>
+    <w:p>
+      <w:pPr>
+        <w:spacing w:after="120"/>
+        <w:ind w:left="440"/>
+      </w:pPr>
+    </w:p>
+    <w:p>
+      <w:pPr>
+        <w:pStyle w:val="Heading1"/>
+      </w:pPr>
+      <w:r>
+        <w:t xml:space="preserve">PIQ 15 – B.Tech: Your Book Chapter</w:t>
+      </w:r>
+    </w:p>
+    <w:p>
+      <w:pPr>
+        <w:pStyle w:val="ListParagraph"/>
+        <w:keepNext/>
+        <w:numPr>
+          <w:ilvl w:val="0"/>
+          <w:numId w:val="2"/>
+        </w:numPr>
+        <w:spacing w:after="0" w:before="120"/>
+      </w:pPr>
+      <w:r>
+        <w:rPr>
+          <w:b/>
+          <w:bCs/>
+        </w:rPr>
+        <w:t xml:space="preserve">Tell me about your book chapter.</w:t>
+      </w:r>
+    </w:p>
+    <w:p>
+      <w:pPr>
+        <w:spacing w:after="120"/>
+        <w:ind w:left="440"/>
+      </w:pPr>
+    </w:p>
+    <w:p>
+      <w:pPr>
+        <w:pStyle w:val="ListParagraph"/>
+        <w:keepNext/>
+        <w:numPr>
+          <w:ilvl w:val="0"/>
+          <w:numId w:val="2"/>
+        </w:numPr>
+        <w:spacing w:after="0" w:before="120"/>
+      </w:pPr>
+      <w:r>
+        <w:rPr>
+          <w:b/>
+          <w:bCs/>
+        </w:rPr>
+        <w:t xml:space="preserve">What is the exact title of the chapter?</w:t>
+      </w:r>
+    </w:p>
+    <w:p>
+      <w:pPr>
+        <w:spacing w:after="120"/>
+        <w:ind w:left="440"/>
+      </w:pPr>
+    </w:p>
+    <w:p>
+      <w:pPr>
+        <w:pStyle w:val="ListParagraph"/>
+        <w:keepNext/>
+        <w:numPr>
+          <w:ilvl w:val="0"/>
+          <w:numId w:val="2"/>
+        </w:numPr>
+        <w:spacing w:after="0" w:before="120"/>
+      </w:pPr>
+      <w:r>
+        <w:rPr>
+          <w:b/>
+          <w:bCs/>
+        </w:rPr>
+        <w:t xml:space="preserve">What is the title of the book?</w:t>
+      </w:r>
+    </w:p>
+    <w:p>
+      <w:pPr>
+        <w:spacing w:after="120"/>
+        <w:ind w:left="440"/>
+      </w:pPr>
+    </w:p>
+    <w:p>
+      <w:pPr>
+        <w:pStyle w:val="ListParagraph"/>
+        <w:keepNext/>
+        <w:numPr>
+          <w:ilvl w:val="0"/>
+          <w:numId w:val="2"/>
+        </w:numPr>
+        <w:spacing w:after="0" w:before="120"/>
+      </w:pPr>
+      <w:r>
+        <w:rPr>
+          <w:b/>
+          <w:bCs/>
+        </w:rPr>
+        <w:t xml:space="preserve">Who is the publisher?</w:t>
+      </w:r>
+    </w:p>
+    <w:p>
+      <w:pPr>
+        <w:spacing w:after="120"/>
+        <w:ind w:left="440"/>
+      </w:pPr>
+    </w:p>
+    <w:p>
+      <w:pPr>
+        <w:pStyle w:val="ListParagraph"/>
+        <w:keepNext/>
+        <w:numPr>
+          <w:ilvl w:val="0"/>
+          <w:numId w:val="2"/>
+        </w:numPr>
+        <w:spacing w:after="0" w:before="120"/>
+      </w:pPr>
+      <w:r>
+        <w:rPr>
+          <w:b/>
+          <w:bCs/>
+        </w:rPr>
+        <w:t xml:space="preserve">When was it published?</w:t>
+      </w:r>
+    </w:p>
+    <w:p>
+      <w:pPr>
+        <w:spacing w:after="120"/>
+        <w:ind w:left="440"/>
+      </w:pPr>
+    </w:p>
+    <w:p>
+      <w:pPr>
+        <w:pStyle w:val="ListParagraph"/>
+        <w:keepNext/>
+        <w:numPr>
+          <w:ilvl w:val="0"/>
+          <w:numId w:val="2"/>
+        </w:numPr>
+        <w:spacing w:after="0" w:before="120"/>
+      </w:pPr>
+      <w:r>
+        <w:rPr>
+          <w:b/>
+          <w:bCs/>
+        </w:rPr>
+        <w:t xml:space="preserve">Who are the authors?</w:t>
+      </w:r>
+    </w:p>
+    <w:p>
+      <w:pPr>
+        <w:spacing w:after="120"/>
+        <w:ind w:left="440"/>
+      </w:pPr>
+    </w:p>
+    <w:p>
+      <w:pPr>
+        <w:pStyle w:val="ListParagraph"/>
+        <w:keepNext/>
+        <w:numPr>
+          <w:ilvl w:val="0"/>
+          <w:numId w:val="2"/>
+        </w:numPr>
+        <w:spacing w:after="0" w:before="120"/>
+      </w:pPr>
+      <w:r>
+        <w:rPr>
+          <w:b/>
+          <w:bCs/>
+        </w:rPr>
+        <w:t xml:space="preserve">What exactly did you contribute?</w:t>
+      </w:r>
+    </w:p>
+    <w:p>
+      <w:pPr>
+        <w:spacing w:after="120"/>
+        <w:ind w:left="440"/>
+      </w:pPr>
+    </w:p>
+    <w:p>
+      <w:pPr>
+        <w:pStyle w:val="ListParagraph"/>
+        <w:keepNext/>
+        <w:numPr>
+          <w:ilvl w:val="0"/>
+          <w:numId w:val="2"/>
+        </w:numPr>
+        <w:spacing w:after="0" w:before="120"/>
+      </w:pPr>
+      <w:r>
+        <w:rPr>
+          <w:b/>
+          <w:bCs/>
+        </w:rPr>
+        <w:t xml:space="preserve">Why was the chapter written, and who proposed the topic?</w:t>
+      </w:r>
+    </w:p>
+    <w:p>
+      <w:pPr>
+        <w:spacing w:after="120"/>
+        <w:ind w:left="440"/>
+      </w:pPr>
+    </w:p>
+    <w:p>
+      <w:pPr>
+        <w:pStyle w:val="ListParagraph"/>
+        <w:keepNext/>
+        <w:numPr>
+          <w:ilvl w:val="0"/>
+          <w:numId w:val="2"/>
+        </w:numPr>
+        <w:spacing w:after="0" w:before="120"/>
+      </w:pPr>
+      <w:r>
+        <w:rPr>
+          <w:b/>
+          <w:bCs/>
+        </w:rPr>
+        <w:t xml:space="preserve">What problem does it address, and why does it matter?</w:t>
+      </w:r>
+    </w:p>
+    <w:p>
+      <w:pPr>
+        <w:spacing w:after="120"/>
+        <w:ind w:left="440"/>
+      </w:pPr>
+    </w:p>
+    <w:p>
+      <w:pPr>
+        <w:pStyle w:val="ListParagraph"/>
+        <w:keepNext/>
+        <w:numPr>
+          <w:ilvl w:val="0"/>
+          <w:numId w:val="2"/>
+        </w:numPr>
+        <w:spacing w:after="0" w:before="120"/>
+      </w:pPr>
+      <w:r>
+        <w:rPr>
+          <w:b/>
+          <w:bCs/>
+        </w:rPr>
+        <w:t xml:space="preserve">What was the existing approach?</w:t>
+      </w:r>
+    </w:p>
+    <w:p>
+      <w:pPr>
+        <w:spacing w:after="120"/>
+        <w:ind w:left="440"/>
+      </w:pPr>
+    </w:p>
+    <w:p>
+      <w:pPr>
+        <w:pStyle w:val="ListParagraph"/>
+        <w:keepNext/>
+        <w:numPr>
+          <w:ilvl w:val="0"/>
+          <w:numId w:val="2"/>
+        </w:numPr>
+        <w:spacing w:after="0" w:before="120"/>
+      </w:pPr>
+      <w:r>
+        <w:rPr>
+          <w:b/>
+          <w:bCs/>
+        </w:rPr>
+        <w:t xml:space="preserve">How did you research it, and what sources did you use?</w:t>
+      </w:r>
+    </w:p>
+    <w:p>
+      <w:pPr>
+        <w:spacing w:after="120"/>
+        <w:ind w:left="440"/>
+      </w:pPr>
+    </w:p>
+    <w:p>
+      <w:pPr>
+        <w:pStyle w:val="ListParagraph"/>
+        <w:keepNext/>
+        <w:numPr>
+          <w:ilvl w:val="0"/>
+          <w:numId w:val="2"/>
+        </w:numPr>
+        <w:spacing w:after="0" w:before="120"/>
+      </w:pPr>
+      <w:r>
+        <w:rPr>
+          <w:b/>
+          <w:bCs/>
+        </w:rPr>
+        <w:t xml:space="preserve">What methodology did you discuss?</w:t>
+      </w:r>
+    </w:p>
+    <w:p>
+      <w:pPr>
+        <w:spacing w:after="120"/>
+        <w:ind w:left="440"/>
+      </w:pPr>
+    </w:p>
+    <w:p>
+      <w:pPr>
+        <w:pStyle w:val="ListParagraph"/>
+        <w:keepNext/>
+        <w:numPr>
+          <w:ilvl w:val="0"/>
+          <w:numId w:val="2"/>
+        </w:numPr>
+        <w:spacing w:after="0" w:before="120"/>
+      </w:pPr>
+      <w:r>
+        <w:rPr>
+          <w:b/>
+          <w:bCs/>
+        </w:rPr>
+        <w:t xml:space="preserve">What were the main findings?</w:t>
+      </w:r>
+    </w:p>
+    <w:p>
+      <w:pPr>
+        <w:spacing w:after="120"/>
+        <w:ind w:left="440"/>
+      </w:pPr>
+    </w:p>
+    <w:p>
+      <w:pPr>
+        <w:pStyle w:val="ListParagraph"/>
+        <w:keepNext/>
+        <w:numPr>
+          <w:ilvl w:val="0"/>
+          <w:numId w:val="2"/>
+        </w:numPr>
+        <w:spacing w:after="0" w:before="120"/>
+      </w:pPr>
+      <w:r>
+        <w:rPr>
+          <w:b/>
+          <w:bCs/>
+        </w:rPr>
+        <w:t xml:space="preserve">What are its practical applications?</w:t>
+      </w:r>
+    </w:p>
+    <w:p>
+      <w:pPr>
+        <w:spacing w:after="120"/>
+        <w:ind w:left="440"/>
+      </w:pPr>
+    </w:p>
+    <w:p>
+      <w:pPr>
+        <w:pStyle w:val="ListParagraph"/>
+        <w:keepNext/>
+        <w:numPr>
+          <w:ilvl w:val="0"/>
+          <w:numId w:val="2"/>
+        </w:numPr>
+        <w:spacing w:after="0" w:before="120"/>
+      </w:pPr>
+      <w:r>
+        <w:rPr>
+          <w:b/>
+          <w:bCs/>
+        </w:rPr>
+        <w:t xml:space="preserve">What are its limitations?</w:t>
+      </w:r>
+    </w:p>
+    <w:p>
+      <w:pPr>
+        <w:spacing w:after="120"/>
+        <w:ind w:left="440"/>
+      </w:pPr>
+    </w:p>
+    <w:p>
+      <w:pPr>
+        <w:pStyle w:val="ListParagraph"/>
+        <w:keepNext/>
+        <w:numPr>
+          <w:ilvl w:val="0"/>
+          <w:numId w:val="2"/>
+        </w:numPr>
+        <w:spacing w:after="0" w:before="120"/>
+      </w:pPr>
+      <w:r>
+        <w:rPr>
+          <w:b/>
+          <w:bCs/>
+        </w:rPr>
+        <w:t xml:space="preserve">What did you learn from writing it?</w:t>
+      </w:r>
+    </w:p>
+    <w:p>
+      <w:pPr>
+        <w:spacing w:after="120"/>
+        <w:ind w:left="440"/>
+      </w:pPr>
+    </w:p>
+    <w:p>
+      <w:pPr>
+        <w:pStyle w:val="ListParagraph"/>
+        <w:keepNext/>
+        <w:numPr>
+          <w:ilvl w:val="0"/>
+          <w:numId w:val="2"/>
+        </w:numPr>
+        <w:spacing w:after="0" w:before="120"/>
+      </w:pPr>
+      <w:r>
+        <w:rPr>
+          <w:b/>
+          <w:bCs/>
+        </w:rPr>
+        <w:t xml:space="preserve">Was it peer-reviewed?</w:t>
+      </w:r>
+    </w:p>
+    <w:p>
+      <w:pPr>
+        <w:spacing w:after="120"/>
+        <w:ind w:left="440"/>
+      </w:pPr>
+    </w:p>
+    <w:p>
+      <w:pPr>
+        <w:pStyle w:val="ListParagraph"/>
+        <w:keepNext/>
+        <w:numPr>
+          <w:ilvl w:val="0"/>
+          <w:numId w:val="2"/>
+        </w:numPr>
+        <w:spacing w:after="0" w:before="120"/>
+      </w:pPr>
+      <w:r>
+        <w:rPr>
+          <w:b/>
+          <w:bCs/>
+        </w:rPr>
+        <w:t xml:space="preserve">Why should I consider your book chapter an achievement?</w:t>
+      </w:r>
+    </w:p>
+    <w:p>
+      <w:pPr>
+        <w:spacing w:after="120"/>
+        <w:ind w:left="440"/>
+      </w:pPr>
+    </w:p>
+    <w:p>
+      <w:pPr>
+        <w:pStyle w:val="Heading1"/>
+      </w:pPr>
+      <w:r>
+        <w:t xml:space="preserve">PIQ 15 – B.Tech: Audio-to-Sign-Language Project</w:t>
+      </w:r>
+    </w:p>
+    <w:p>
+      <w:pPr>
+        <w:pStyle w:val="ListParagraph"/>
+        <w:keepNext/>
+        <w:numPr>
+          <w:ilvl w:val="0"/>
+          <w:numId w:val="2"/>
+        </w:numPr>
+        <w:spacing w:after="0" w:before="120"/>
+      </w:pPr>
+      <w:r>
+        <w:rPr>
+          <w:b/>
+          <w:bCs/>
+        </w:rPr>
+        <w:t xml:space="preserve">What was your Audio-to-Sign-Language Translator project?</w:t>
+      </w:r>
+    </w:p>
+    <w:p>
+      <w:pPr>
+        <w:spacing w:after="120"/>
+        <w:ind w:left="440"/>
+      </w:pPr>
+    </w:p>
+    <w:p>
+      <w:pPr>
+        <w:pStyle w:val="ListParagraph"/>
+        <w:keepNext/>
+        <w:numPr>
+          <w:ilvl w:val="0"/>
+          <w:numId w:val="2"/>
+        </w:numPr>
+        <w:spacing w:after="0" w:before="120"/>
+      </w:pPr>
+      <w:r>
+        <w:rPr>
+          <w:b/>
+          <w:bCs/>
+        </w:rPr>
+        <w:t xml:space="preserve">Why did you build it?</w:t>
+      </w:r>
+    </w:p>
+    <w:p>
+      <w:pPr>
+        <w:spacing w:after="120"/>
+        <w:ind w:left="440"/>
+      </w:pPr>
+    </w:p>
+    <w:p>
+      <w:pPr>
+        <w:pStyle w:val="ListParagraph"/>
+        <w:keepNext/>
+        <w:numPr>
+          <w:ilvl w:val="0"/>
+          <w:numId w:val="2"/>
+        </w:numPr>
+        <w:spacing w:after="0" w:before="120"/>
+      </w:pPr>
+      <w:r>
+        <w:rPr>
+          <w:b/>
+          <w:bCs/>
+        </w:rPr>
+        <w:t xml:space="preserve">How did speech recognition work in it?</w:t>
+      </w:r>
+    </w:p>
+    <w:p>
+      <w:pPr>
+        <w:spacing w:after="120"/>
+        <w:ind w:left="440"/>
+      </w:pPr>
+    </w:p>
+    <w:p>
+      <w:pPr>
+        <w:pStyle w:val="ListParagraph"/>
+        <w:keepNext/>
+        <w:numPr>
+          <w:ilvl w:val="0"/>
+          <w:numId w:val="2"/>
+        </w:numPr>
+        <w:spacing w:after="0" w:before="120"/>
+      </w:pPr>
+      <w:r>
+        <w:rPr>
+          <w:b/>
+          <w:bCs/>
+        </w:rPr>
+        <w:t xml:space="preserve">What role did NLP play?</w:t>
+      </w:r>
+    </w:p>
+    <w:p>
+      <w:pPr>
+        <w:spacing w:after="120"/>
+        <w:ind w:left="440"/>
+      </w:pPr>
+    </w:p>
+    <w:p>
+      <w:pPr>
+        <w:pStyle w:val="ListParagraph"/>
+        <w:keepNext/>
+        <w:numPr>
+          <w:ilvl w:val="0"/>
+          <w:numId w:val="2"/>
+        </w:numPr>
+        <w:spacing w:after="0" w:before="120"/>
+      </w:pPr>
+      <w:r>
+        <w:rPr>
+          <w:b/>
+          <w:bCs/>
+        </w:rPr>
+        <w:t xml:space="preserve">What is the Web Speech API?</w:t>
+      </w:r>
+    </w:p>
+    <w:p>
+      <w:pPr>
+        <w:spacing w:after="120"/>
+        <w:ind w:left="440"/>
+      </w:pPr>
+    </w:p>
+    <w:p>
+      <w:pPr>
+        <w:pStyle w:val="ListParagraph"/>
+        <w:keepNext/>
+        <w:numPr>
+          <w:ilvl w:val="0"/>
+          <w:numId w:val="2"/>
+        </w:numPr>
+        <w:spacing w:after="0" w:before="120"/>
+      </w:pPr>
+      <w:r>
+        <w:rPr>
+          <w:b/>
+          <w:bCs/>
+        </w:rPr>
+        <w:t xml:space="preserve">What is speech-to-text?</w:t>
+      </w:r>
+    </w:p>
+    <w:p>
+      <w:pPr>
+        <w:spacing w:after="120"/>
+        <w:ind w:left="440"/>
+      </w:pPr>
+    </w:p>
+    <w:p>
+      <w:pPr>
+        <w:pStyle w:val="ListParagraph"/>
+        <w:keepNext/>
+        <w:numPr>
+          <w:ilvl w:val="0"/>
+          <w:numId w:val="2"/>
+        </w:numPr>
+        <w:spacing w:after="0" w:before="120"/>
+      </w:pPr>
+      <w:r>
+        <w:rPr>
+          <w:b/>
+          <w:bCs/>
+        </w:rPr>
+        <w:t xml:space="preserve">How was text converted into sign language?</w:t>
+      </w:r>
+    </w:p>
+    <w:p>
+      <w:pPr>
+        <w:spacing w:after="120"/>
+        <w:ind w:left="440"/>
+      </w:pPr>
+    </w:p>
+    <w:p>
+      <w:pPr>
+        <w:pStyle w:val="ListParagraph"/>
+        <w:keepNext/>
+        <w:numPr>
+          <w:ilvl w:val="0"/>
+          <w:numId w:val="2"/>
+        </w:numPr>
+        <w:spacing w:after="0" w:before="120"/>
+      </w:pPr>
+      <w:r>
+        <w:rPr>
+          <w:b/>
+          <w:bCs/>
+        </w:rPr>
+        <w:t xml:space="preserve">What limitations did your system have?</w:t>
+      </w:r>
+    </w:p>
+    <w:p>
+      <w:pPr>
+        <w:spacing w:after="120"/>
+        <w:ind w:left="440"/>
+      </w:pPr>
+    </w:p>
+    <w:p>
+      <w:pPr>
+        <w:pStyle w:val="ListParagraph"/>
+        <w:keepNext/>
+        <w:numPr>
+          <w:ilvl w:val="0"/>
+          <w:numId w:val="2"/>
+        </w:numPr>
+        <w:spacing w:after="0" w:before="120"/>
+      </w:pPr>
+      <w:r>
+        <w:rPr>
+          <w:b/>
+          <w:bCs/>
+        </w:rPr>
+        <w:t xml:space="preserve">What would you improve?</w:t>
+      </w:r>
+    </w:p>
+    <w:p>
+      <w:pPr>
+        <w:spacing w:after="120"/>
+        <w:ind w:left="440"/>
+      </w:pPr>
+    </w:p>
+    <w:p>
+      <w:pPr>
+        <w:pStyle w:val="ListParagraph"/>
+        <w:keepNext/>
+        <w:numPr>
+          <w:ilvl w:val="0"/>
+          <w:numId w:val="2"/>
+        </w:numPr>
+        <w:spacing w:after="0" w:before="120"/>
+      </w:pPr>
+      <w:r>
+        <w:rPr>
+          <w:b/>
+          <w:bCs/>
+        </w:rPr>
+        <w:t xml:space="preserve">Was it a prototype or a production-ready system?</w:t>
+      </w:r>
+    </w:p>
+    <w:p>
+      <w:pPr>
+        <w:spacing w:after="120"/>
+        <w:ind w:left="440"/>
+      </w:pPr>
+    </w:p>
+    <w:p>
+      <w:pPr>
+        <w:pStyle w:val="ListParagraph"/>
+        <w:keepNext/>
+        <w:numPr>
+          <w:ilvl w:val="0"/>
+          <w:numId w:val="2"/>
+        </w:numPr>
+        <w:spacing w:after="0" w:before="120"/>
+      </w:pPr>
+      <w:r>
+        <w:rPr>
+          <w:b/>
+          <w:bCs/>
+        </w:rPr>
+        <w:t xml:space="preserve">What was your individual contribution?</w:t>
+      </w:r>
+    </w:p>
+    <w:p>
+      <w:pPr>
+        <w:spacing w:after="120"/>
+        <w:ind w:left="440"/>
+      </w:pPr>
+    </w:p>
+    <w:p>
+      <w:pPr>
+        <w:pStyle w:val="Heading1"/>
+      </w:pPr>
+      <w:r>
+        <w:t xml:space="preserve">PIQ 15 – B.Tech: Research &amp; Publishing</w:t>
+      </w:r>
+    </w:p>
+    <w:p>
+      <w:pPr>
+        <w:pStyle w:val="ListParagraph"/>
+        <w:keepNext/>
+        <w:numPr>
+          <w:ilvl w:val="0"/>
+          <w:numId w:val="2"/>
+        </w:numPr>
+        <w:spacing w:after="0" w:before="120"/>
+      </w:pPr>
+      <w:r>
+        <w:rPr>
+          <w:b/>
+          <w:bCs/>
+        </w:rPr>
+        <w:t xml:space="preserve">What is a book chapter, and how is it different from a research paper?</w:t>
+      </w:r>
+    </w:p>
+    <w:p>
+      <w:pPr>
+        <w:spacing w:after="120"/>
+        <w:ind w:left="440"/>
+      </w:pPr>
+    </w:p>
+    <w:p>
+      <w:pPr>
+        <w:pStyle w:val="ListParagraph"/>
+        <w:keepNext/>
+        <w:numPr>
+          <w:ilvl w:val="0"/>
+          <w:numId w:val="2"/>
+        </w:numPr>
+        <w:spacing w:after="0" w:before="120"/>
+      </w:pPr>
+      <w:r>
+        <w:rPr>
+          <w:b/>
+          <w:bCs/>
+        </w:rPr>
+        <w:t xml:space="preserve">What is research methodology?</w:t>
+      </w:r>
+    </w:p>
+    <w:p>
+      <w:pPr>
+        <w:spacing w:after="120"/>
+        <w:ind w:left="440"/>
+      </w:pPr>
+    </w:p>
+    <w:p>
+      <w:pPr>
+        <w:pStyle w:val="ListParagraph"/>
+        <w:keepNext/>
+        <w:numPr>
+          <w:ilvl w:val="0"/>
+          <w:numId w:val="2"/>
+        </w:numPr>
+        <w:spacing w:after="0" w:before="120"/>
+      </w:pPr>
+      <w:r>
+        <w:rPr>
+          <w:b/>
+          <w:bCs/>
+        </w:rPr>
+        <w:t xml:space="preserve">What is an academic publisher?</w:t>
+      </w:r>
+    </w:p>
+    <w:p>
+      <w:pPr>
+        <w:spacing w:after="120"/>
+        <w:ind w:left="440"/>
+      </w:pPr>
+    </w:p>
+    <w:p>
+      <w:pPr>
+        <w:pStyle w:val="ListParagraph"/>
+        <w:keepNext/>
+        <w:numPr>
+          <w:ilvl w:val="0"/>
+          <w:numId w:val="2"/>
+        </w:numPr>
+        <w:spacing w:after="0" w:before="120"/>
+      </w:pPr>
+      <w:r>
+        <w:rPr>
+          <w:b/>
+          <w:bCs/>
+        </w:rPr>
+        <w:t xml:space="preserve">How do you know research is reliable?</w:t>
+      </w:r>
+    </w:p>
+    <w:p>
+      <w:pPr>
+        <w:spacing w:after="120"/>
+        <w:ind w:left="440"/>
+      </w:pPr>
+    </w:p>
+    <w:p>
+      <w:pPr>
+        <w:pStyle w:val="ListParagraph"/>
+        <w:keepNext/>
+        <w:numPr>
+          <w:ilvl w:val="0"/>
+          <w:numId w:val="2"/>
+        </w:numPr>
+        <w:spacing w:after="0" w:before="120"/>
+      </w:pPr>
+      <w:r>
+        <w:rPr>
+          <w:b/>
+          <w:bCs/>
+        </w:rPr>
+        <w:t xml:space="preserve">What makes research useful?</w:t>
+      </w:r>
+    </w:p>
+    <w:p>
+      <w:pPr>
+        <w:spacing w:after="120"/>
+        <w:ind w:left="440"/>
+      </w:pPr>
+    </w:p>
+    <w:p>
+      <w:pPr>
+        <w:pStyle w:val="ListParagraph"/>
+        <w:keepNext/>
+        <w:numPr>
+          <w:ilvl w:val="0"/>
+          <w:numId w:val="2"/>
+        </w:numPr>
+        <w:spacing w:after="0" w:before="120"/>
+      </w:pPr>
+      <w:r>
+        <w:rPr>
+          <w:b/>
+          <w:bCs/>
+        </w:rPr>
+        <w:t xml:space="preserve">What is academic integrity?</w:t>
+      </w:r>
+    </w:p>
+    <w:p>
+      <w:pPr>
+        <w:spacing w:after="120"/>
+        <w:ind w:left="440"/>
+      </w:pPr>
+    </w:p>
+    <w:p>
+      <w:pPr>
+        <w:pStyle w:val="Heading1"/>
+      </w:pPr>
+      <w:r>
+        <w:t xml:space="preserve">PIQ 15 – B.Tech: AKTU</w:t>
+      </w:r>
+    </w:p>
+    <w:p>
+      <w:pPr>
+        <w:pStyle w:val="ListParagraph"/>
+        <w:keepNext/>
+        <w:numPr>
+          <w:ilvl w:val="0"/>
+          <w:numId w:val="2"/>
+        </w:numPr>
+        <w:spacing w:after="0" w:before="120"/>
+      </w:pPr>
+      <w:r>
+        <w:rPr>
+          <w:b/>
+          <w:bCs/>
+        </w:rPr>
+        <w:t xml:space="preserve">What does AKTU stand for?</w:t>
+      </w:r>
+    </w:p>
+    <w:p>
+      <w:pPr>
+        <w:spacing w:after="120"/>
+        <w:ind w:left="440"/>
+      </w:pPr>
+    </w:p>
+    <w:p>
+      <w:pPr>
+        <w:pStyle w:val="ListParagraph"/>
+        <w:keepNext/>
+        <w:numPr>
+          <w:ilvl w:val="0"/>
+          <w:numId w:val="2"/>
+        </w:numPr>
+        <w:spacing w:after="0" w:before="120"/>
+      </w:pPr>
+      <w:r>
+        <w:rPr>
+          <w:b/>
+          <w:bCs/>
+        </w:rPr>
+        <w:t xml:space="preserve">Where is AKTU headquartered?</w:t>
+      </w:r>
+    </w:p>
+    <w:p>
+      <w:pPr>
+        <w:spacing w:after="120"/>
+        <w:ind w:left="440"/>
+      </w:pPr>
+    </w:p>
+    <w:p>
+      <w:pPr>
+        <w:pStyle w:val="ListParagraph"/>
+        <w:keepNext/>
+        <w:numPr>
+          <w:ilvl w:val="0"/>
+          <w:numId w:val="2"/>
+        </w:numPr>
+        <w:spacing w:after="0" w:before="120"/>
+      </w:pPr>
+      <w:r>
+        <w:rPr>
+          <w:b/>
+          <w:bCs/>
+        </w:rPr>
+        <w:t xml:space="preserve">What is the role of a state technical university?</w:t>
+      </w:r>
+    </w:p>
+    <w:p>
+      <w:pPr>
+        <w:spacing w:after="120"/>
+        <w:ind w:left="440"/>
+      </w:pPr>
+    </w:p>
+    <w:p>
+      <w:pPr>
+        <w:pStyle w:val="ListParagraph"/>
+        <w:keepNext/>
+        <w:numPr>
+          <w:ilvl w:val="0"/>
+          <w:numId w:val="2"/>
+        </w:numPr>
+        <w:spacing w:after="0" w:before="120"/>
+      </w:pPr>
+      <w:r>
+        <w:rPr>
+          <w:b/>
+          <w:bCs/>
+        </w:rPr>
+        <w:t xml:space="preserve">Which colleges are affiliated with AKTU?</w:t>
+      </w:r>
+    </w:p>
+    <w:p>
+      <w:pPr>
+        <w:spacing w:after="120"/>
+        <w:ind w:left="440"/>
+      </w:pPr>
+    </w:p>
+    <w:p>
+      <w:pPr>
+        <w:pStyle w:val="ListParagraph"/>
+        <w:keepNext/>
+        <w:numPr>
+          <w:ilvl w:val="0"/>
+          <w:numId w:val="2"/>
+        </w:numPr>
+        <w:spacing w:after="0" w:before="120"/>
+      </w:pPr>
+      <w:r>
+        <w:rPr>
+          <w:b/>
+          <w:bCs/>
+        </w:rPr>
+        <w:t xml:space="preserve">How are AKTU exams conducted?</w:t>
+      </w:r>
+    </w:p>
+    <w:p>
+      <w:pPr>
+        <w:spacing w:after="120"/>
+        <w:ind w:left="440"/>
+      </w:pPr>
+    </w:p>
+    <w:p>
+      <w:pPr>
+        <w:pStyle w:val="ListParagraph"/>
+        <w:keepNext/>
+        <w:numPr>
+          <w:ilvl w:val="0"/>
+          <w:numId w:val="2"/>
+        </w:numPr>
+        <w:spacing w:after="0" w:before="120"/>
+      </w:pPr>
+      <w:r>
+        <w:rPr>
+          <w:b/>
+          <w:bCs/>
+        </w:rPr>
+        <w:t xml:space="preserve">What is the difference between an autonomous college and an affiliated college?</w:t>
+      </w:r>
+    </w:p>
+    <w:p>
+      <w:pPr>
+        <w:spacing w:after="120"/>
+        <w:ind w:left="440"/>
+      </w:pPr>
+    </w:p>
+    <w:p>
+      <w:pPr>
+        <w:pStyle w:val="ListParagraph"/>
+        <w:keepNext/>
+        <w:numPr>
+          <w:ilvl w:val="0"/>
+          <w:numId w:val="2"/>
+        </w:numPr>
+        <w:spacing w:after="0" w:before="120"/>
+      </w:pPr>
+      <w:r>
+        <w:rPr>
+          <w:b/>
+          <w:bCs/>
+        </w:rPr>
+        <w:t xml:space="preserve">Why is the university named after Dr. A.P.J. Abdul Kalam?</w:t>
+      </w:r>
+    </w:p>
+    <w:p>
+      <w:pPr>
+        <w:spacing w:after="120"/>
+        <w:ind w:left="440"/>
+      </w:pPr>
+    </w:p>
+    <w:p>
+      <w:pPr>
+        <w:pStyle w:val="Heading1"/>
+      </w:pPr>
+      <w:r>
+        <w:t xml:space="preserve">PIQ 15 – B.Tech: Dr. A.P.J. Abdul Kalam</w:t>
+      </w:r>
+    </w:p>
+    <w:p>
+      <w:pPr>
+        <w:pStyle w:val="ListParagraph"/>
+        <w:keepNext/>
+        <w:numPr>
+          <w:ilvl w:val="0"/>
+          <w:numId w:val="2"/>
+        </w:numPr>
+        <w:spacing w:after="0" w:before="120"/>
+      </w:pPr>
+      <w:r>
+        <w:rPr>
+          <w:b/>
+          <w:bCs/>
+        </w:rPr>
+        <w:t xml:space="preserve">Who was Dr. A.P.J. Abdul Kalam?</w:t>
+      </w:r>
+    </w:p>
+    <w:p>
+      <w:pPr>
+        <w:spacing w:after="120"/>
+        <w:ind w:left="440"/>
+      </w:pPr>
+    </w:p>
+    <w:p>
+      <w:pPr>
+        <w:pStyle w:val="ListParagraph"/>
+        <w:keepNext/>
+        <w:numPr>
+          <w:ilvl w:val="0"/>
+          <w:numId w:val="2"/>
+        </w:numPr>
+        <w:spacing w:after="0" w:before="120"/>
+      </w:pPr>
+      <w:r>
+        <w:rPr>
+          <w:b/>
+          <w:bCs/>
+        </w:rPr>
+        <w:t xml:space="preserve">What was his contribution to India's missile programme?</w:t>
+      </w:r>
+    </w:p>
+    <w:p>
+      <w:pPr>
+        <w:spacing w:after="120"/>
+        <w:ind w:left="440"/>
+      </w:pPr>
+    </w:p>
+    <w:p>
+      <w:pPr>
+        <w:pStyle w:val="ListParagraph"/>
+        <w:keepNext/>
+        <w:numPr>
+          <w:ilvl w:val="0"/>
+          <w:numId w:val="2"/>
+        </w:numPr>
+        <w:spacing w:after="0" w:before="120"/>
+      </w:pPr>
+      <w:r>
+        <w:rPr>
+          <w:b/>
+          <w:bCs/>
+        </w:rPr>
+        <w:t xml:space="preserve">What was his role in India's space and defence programmes?</w:t>
+      </w:r>
+    </w:p>
+    <w:p>
+      <w:pPr>
+        <w:spacing w:after="120"/>
+        <w:ind w:left="440"/>
+      </w:pPr>
+    </w:p>
+    <w:p>
+      <w:pPr>
+        <w:pStyle w:val="ListParagraph"/>
+        <w:keepNext/>
+        <w:numPr>
+          <w:ilvl w:val="0"/>
+          <w:numId w:val="2"/>
+        </w:numPr>
+        <w:spacing w:after="0" w:before="120"/>
+      </w:pPr>
+      <w:r>
+        <w:rPr>
+          <w:b/>
+          <w:bCs/>
+        </w:rPr>
+        <w:t xml:space="preserve">Why is he called the "Missile Man of India"?</w:t>
+      </w:r>
+    </w:p>
+    <w:p>
+      <w:pPr>
+        <w:spacing w:after="120"/>
+        <w:ind w:left="440"/>
+      </w:pPr>
+    </w:p>
+    <w:p>
+      <w:pPr>
+        <w:pStyle w:val="ListParagraph"/>
+        <w:keepNext/>
+        <w:numPr>
+          <w:ilvl w:val="0"/>
+          <w:numId w:val="2"/>
+        </w:numPr>
+        <w:spacing w:after="0" w:before="120"/>
+      </w:pPr>
+      <w:r>
+        <w:rPr>
+          <w:b/>
+          <w:bCs/>
+        </w:rPr>
+        <w:t xml:space="preserve">What was his educational background?</w:t>
+      </w:r>
+    </w:p>
+    <w:p>
+      <w:pPr>
+        <w:spacing w:after="120"/>
+        <w:ind w:left="440"/>
+      </w:pPr>
+    </w:p>
+    <w:p>
+      <w:pPr>
+        <w:pStyle w:val="ListParagraph"/>
+        <w:keepNext/>
+        <w:numPr>
+          <w:ilvl w:val="0"/>
+          <w:numId w:val="2"/>
+        </w:numPr>
+        <w:spacing w:after="0" w:before="120"/>
+      </w:pPr>
+      <w:r>
+        <w:rPr>
+          <w:b/>
+          <w:bCs/>
+        </w:rPr>
+        <w:t xml:space="preserve">What did he contribute as President?</w:t>
+      </w:r>
+    </w:p>
+    <w:p>
+      <w:pPr>
+        <w:spacing w:after="120"/>
+        <w:ind w:left="440"/>
+      </w:pPr>
+    </w:p>
+    <w:p>
+      <w:pPr>
+        <w:pStyle w:val="ListParagraph"/>
+        <w:keepNext/>
+        <w:numPr>
+          <w:ilvl w:val="0"/>
+          <w:numId w:val="2"/>
+        </w:numPr>
+        <w:spacing w:after="0" w:before="120"/>
+      </w:pPr>
+      <w:r>
+        <w:rPr>
+          <w:b/>
+          <w:bCs/>
+        </w:rPr>
+        <w:t xml:space="preserve">Which of his qualities do you admire?</w:t>
+      </w:r>
+    </w:p>
+    <w:p>
+      <w:pPr>
+        <w:spacing w:after="120"/>
+        <w:ind w:left="440"/>
+      </w:pPr>
+    </w:p>
+    <w:p>
+      <w:pPr>
+        <w:pStyle w:val="Heading1"/>
+      </w:pPr>
+      <w:r>
+        <w:t xml:space="preserve">PIQ 15 – B.Tech: College</w:t>
+      </w:r>
+    </w:p>
+    <w:p>
+      <w:pPr>
+        <w:pStyle w:val="ListParagraph"/>
+        <w:keepNext/>
+        <w:numPr>
+          <w:ilvl w:val="0"/>
+          <w:numId w:val="2"/>
+        </w:numPr>
+        <w:spacing w:after="0" w:before="120"/>
+      </w:pPr>
+      <w:r>
+        <w:rPr>
+          <w:b/>
+          <w:bCs/>
+        </w:rPr>
+        <w:t xml:space="preserve">Where is IMSEC located?</w:t>
+      </w:r>
+    </w:p>
+    <w:p>
+      <w:pPr>
+        <w:spacing w:after="120"/>
+        <w:ind w:left="440"/>
+      </w:pPr>
+    </w:p>
+    <w:p>
+      <w:pPr>
+        <w:pStyle w:val="ListParagraph"/>
+        <w:keepNext/>
+        <w:numPr>
+          <w:ilvl w:val="0"/>
+          <w:numId w:val="2"/>
+        </w:numPr>
+        <w:spacing w:after="0" w:before="120"/>
+      </w:pPr>
+      <w:r>
+        <w:rPr>
+          <w:b/>
+          <w:bCs/>
+        </w:rPr>
+        <w:t xml:space="preserve">When was it established?</w:t>
+      </w:r>
+    </w:p>
+    <w:p>
+      <w:pPr>
+        <w:spacing w:after="120"/>
+        <w:ind w:left="440"/>
+      </w:pPr>
+    </w:p>
+    <w:p>
+      <w:pPr>
+        <w:pStyle w:val="ListParagraph"/>
+        <w:keepNext/>
+        <w:numPr>
+          <w:ilvl w:val="0"/>
+          <w:numId w:val="2"/>
+        </w:numPr>
+        <w:spacing w:after="0" w:before="120"/>
+      </w:pPr>
+      <w:r>
+        <w:rPr>
+          <w:b/>
+          <w:bCs/>
+        </w:rPr>
+        <w:t xml:space="preserve">What courses does it offer?</w:t>
+      </w:r>
+    </w:p>
+    <w:p>
+      <w:pPr>
+        <w:spacing w:after="120"/>
+        <w:ind w:left="440"/>
+      </w:pPr>
+    </w:p>
+    <w:p>
+      <w:pPr>
+        <w:pStyle w:val="ListParagraph"/>
+        <w:keepNext/>
+        <w:numPr>
+          <w:ilvl w:val="0"/>
+          <w:numId w:val="2"/>
+        </w:numPr>
+        <w:spacing w:after="0" w:before="120"/>
+      </w:pPr>
+      <w:r>
+        <w:rPr>
+          <w:b/>
+          <w:bCs/>
+        </w:rPr>
+        <w:t xml:space="preserve">How many students were in your batch?</w:t>
+      </w:r>
+    </w:p>
+    <w:p>
+      <w:pPr>
+        <w:spacing w:after="120"/>
+        <w:ind w:left="440"/>
+      </w:pPr>
+    </w:p>
+    <w:p>
+      <w:pPr>
+        <w:pStyle w:val="ListParagraph"/>
+        <w:keepNext/>
+        <w:numPr>
+          <w:ilvl w:val="0"/>
+          <w:numId w:val="2"/>
+        </w:numPr>
+        <w:spacing w:after="0" w:before="120"/>
+      </w:pPr>
+      <w:r>
+        <w:rPr>
+          <w:b/>
+          <w:bCs/>
+        </w:rPr>
+        <w:t xml:space="preserve">What clubs and activities were there?</w:t>
+      </w:r>
+    </w:p>
+    <w:p>
+      <w:pPr>
+        <w:spacing w:after="120"/>
+        <w:ind w:left="440"/>
+      </w:pPr>
+    </w:p>
+    <w:p>
+      <w:pPr>
+        <w:pStyle w:val="ListParagraph"/>
+        <w:keepNext/>
+        <w:numPr>
+          <w:ilvl w:val="0"/>
+          <w:numId w:val="2"/>
+        </w:numPr>
+        <w:spacing w:after="0" w:before="120"/>
+      </w:pPr>
+      <w:r>
+        <w:rPr>
+          <w:b/>
+          <w:bCs/>
+        </w:rPr>
+        <w:t xml:space="preserve">Did you take part in any?</w:t>
+      </w:r>
+    </w:p>
+    <w:p>
+      <w:pPr>
+        <w:spacing w:after="120"/>
+        <w:ind w:left="440"/>
+      </w:pPr>
+    </w:p>
+    <w:p>
+      <w:pPr>
+        <w:pStyle w:val="ListParagraph"/>
+        <w:keepNext/>
+        <w:numPr>
+          <w:ilvl w:val="0"/>
+          <w:numId w:val="2"/>
+        </w:numPr>
+        <w:spacing w:after="0" w:before="120"/>
+      </w:pPr>
+      <w:r>
+        <w:rPr>
+          <w:b/>
+          <w:bCs/>
+        </w:rPr>
+        <w:t xml:space="preserve">Who was your favourite professor, and why?</w:t>
+      </w:r>
+    </w:p>
+    <w:p>
+      <w:pPr>
+        <w:spacing w:after="120"/>
+        <w:ind w:left="440"/>
+      </w:pPr>
+    </w:p>
+    <w:p>
+      <w:pPr>
+        <w:pStyle w:val="ListParagraph"/>
+        <w:keepNext/>
+        <w:numPr>
+          <w:ilvl w:val="0"/>
+          <w:numId w:val="2"/>
+        </w:numPr>
+        <w:spacing w:after="0" w:before="120"/>
+      </w:pPr>
+      <w:r>
+        <w:rPr>
+          <w:b/>
+          <w:bCs/>
+        </w:rPr>
+        <w:t xml:space="preserve">What was your biggest achievement in college?</w:t>
+      </w:r>
+    </w:p>
+    <w:p>
+      <w:pPr>
+        <w:spacing w:after="120"/>
+        <w:ind w:left="440"/>
+      </w:pPr>
+    </w:p>
+    <w:p>
+      <w:pPr>
+        <w:pStyle w:val="ListParagraph"/>
+        <w:keepNext/>
+        <w:numPr>
+          <w:ilvl w:val="0"/>
+          <w:numId w:val="2"/>
+        </w:numPr>
+        <w:spacing w:after="0" w:before="120"/>
+      </w:pPr>
+      <w:r>
+        <w:rPr>
+          <w:b/>
+          <w:bCs/>
+        </w:rPr>
+        <w:t xml:space="preserve">What was your biggest failure in college?</w:t>
+      </w:r>
+    </w:p>
+    <w:p>
+      <w:pPr>
+        <w:spacing w:after="120"/>
+        <w:ind w:left="440"/>
+      </w:pPr>
+    </w:p>
+    <w:p>
+      <w:pPr>
+        <w:pStyle w:val="ListParagraph"/>
+        <w:keepNext/>
+        <w:numPr>
+          <w:ilvl w:val="0"/>
+          <w:numId w:val="2"/>
+        </w:numPr>
+        <w:spacing w:after="0" w:before="120"/>
+      </w:pPr>
+      <w:r>
+        <w:rPr>
+          <w:b/>
+          <w:bCs/>
+        </w:rPr>
+        <w:t xml:space="preserve">What would you change about your college?</w:t>
+      </w:r>
+    </w:p>
+    <w:p>
+      <w:pPr>
+        <w:spacing w:after="120"/>
+        <w:ind w:left="440"/>
+      </w:pPr>
+    </w:p>
+    <w:p>
+      <w:pPr>
+        <w:pStyle w:val="ListParagraph"/>
+        <w:keepNext/>
+        <w:numPr>
+          <w:ilvl w:val="0"/>
+          <w:numId w:val="2"/>
+        </w:numPr>
+        <w:spacing w:after="0" w:before="120"/>
+      </w:pPr>
+      <w:r>
+        <w:rPr>
+          <w:b/>
+          <w:bCs/>
+        </w:rPr>
+        <w:t xml:space="preserve">How did college change you?</w:t>
+      </w:r>
+    </w:p>
+    <w:p>
+      <w:pPr>
+        <w:spacing w:after="120"/>
+        <w:ind w:left="440"/>
+      </w:pPr>
+    </w:p>
+    <w:p>
+      <w:pPr>
+        <w:pStyle w:val="Heading1"/>
+      </w:pPr>
+      <w:r>
+        <w:t xml:space="preserve">PIQ 15 – B.Tech: Day Scholar</w:t>
+      </w:r>
+    </w:p>
+    <w:p>
+      <w:pPr>
+        <w:pStyle w:val="ListParagraph"/>
+        <w:keepNext/>
+        <w:numPr>
+          <w:ilvl w:val="0"/>
+          <w:numId w:val="2"/>
+        </w:numPr>
+        <w:spacing w:after="0" w:before="120"/>
+      </w:pPr>
+      <w:r>
+        <w:rPr>
+          <w:b/>
+          <w:bCs/>
+        </w:rPr>
+        <w:t xml:space="preserve">Where did you live during B.Tech?</w:t>
+      </w:r>
+    </w:p>
+    <w:p>
+      <w:pPr>
+        <w:spacing w:after="120"/>
+        <w:ind w:left="440"/>
+      </w:pPr>
+    </w:p>
+    <w:p>
+      <w:pPr>
+        <w:pStyle w:val="ListParagraph"/>
+        <w:keepNext/>
+        <w:numPr>
+          <w:ilvl w:val="0"/>
+          <w:numId w:val="2"/>
+        </w:numPr>
+        <w:spacing w:after="0" w:before="120"/>
+      </w:pPr>
+      <w:r>
+        <w:rPr>
+          <w:b/>
+          <w:bCs/>
+        </w:rPr>
+        <w:t xml:space="preserve">How far was college from home?</w:t>
+      </w:r>
+    </w:p>
+    <w:p>
+      <w:pPr>
+        <w:spacing w:after="120"/>
+        <w:ind w:left="440"/>
+      </w:pPr>
+    </w:p>
+    <w:p>
+      <w:pPr>
+        <w:pStyle w:val="ListParagraph"/>
+        <w:keepNext/>
+        <w:numPr>
+          <w:ilvl w:val="0"/>
+          <w:numId w:val="2"/>
+        </w:numPr>
+        <w:spacing w:after="0" w:before="120"/>
+      </w:pPr>
+      <w:r>
+        <w:rPr>
+          <w:b/>
+          <w:bCs/>
+        </w:rPr>
+        <w:t xml:space="preserve">How did you commute, and how long did it take?</w:t>
+      </w:r>
+    </w:p>
+    <w:p>
+      <w:pPr>
+        <w:spacing w:after="120"/>
+        <w:ind w:left="440"/>
+      </w:pPr>
+    </w:p>
+    <w:p>
+      <w:pPr>
+        <w:pStyle w:val="ListParagraph"/>
+        <w:keepNext/>
+        <w:numPr>
+          <w:ilvl w:val="0"/>
+          <w:numId w:val="2"/>
+        </w:numPr>
+        <w:spacing w:after="0" w:before="120"/>
+      </w:pPr>
+      <w:r>
+        <w:rPr>
+          <w:b/>
+          <w:bCs/>
+        </w:rPr>
+        <w:t xml:space="preserve">What did a typical college day look like?</w:t>
+      </w:r>
+    </w:p>
+    <w:p>
+      <w:pPr>
+        <w:spacing w:after="120"/>
+        <w:ind w:left="440"/>
+      </w:pPr>
+    </w:p>
+    <w:p>
+      <w:pPr>
+        <w:pStyle w:val="ListParagraph"/>
+        <w:keepNext/>
+        <w:numPr>
+          <w:ilvl w:val="0"/>
+          <w:numId w:val="2"/>
+        </w:numPr>
+        <w:spacing w:after="0" w:before="120"/>
+      </w:pPr>
+      <w:r>
+        <w:rPr>
+          <w:b/>
+          <w:bCs/>
+        </w:rPr>
+        <w:t xml:space="preserve">What did you do after college hours?</w:t>
+      </w:r>
+    </w:p>
+    <w:p>
+      <w:pPr>
+        <w:spacing w:after="120"/>
+        <w:ind w:left="440"/>
+      </w:pPr>
+    </w:p>
+    <w:p>
+      <w:pPr>
+        <w:pStyle w:val="Heading1"/>
+      </w:pPr>
+      <w:r>
+        <w:t xml:space="preserve">PIQ 15 – B.Tech: 73.3% Result</w:t>
+      </w:r>
+    </w:p>
+    <w:p>
+      <w:pPr>
+        <w:pStyle w:val="ListParagraph"/>
+        <w:keepNext/>
+        <w:numPr>
+          <w:ilvl w:val="0"/>
+          <w:numId w:val="2"/>
+        </w:numPr>
+        <w:spacing w:after="0" w:before="120"/>
+      </w:pPr>
+      <w:r>
+        <w:rPr>
+          <w:b/>
+          <w:bCs/>
+        </w:rPr>
+        <w:t xml:space="preserve">Were you satisfied with 73.3%?</w:t>
+      </w:r>
+    </w:p>
+    <w:p>
+      <w:pPr>
+        <w:spacing w:after="120"/>
+        <w:ind w:left="440"/>
+      </w:pPr>
+    </w:p>
+    <w:p>
+      <w:pPr>
+        <w:pStyle w:val="ListParagraph"/>
+        <w:keepNext/>
+        <w:numPr>
+          <w:ilvl w:val="0"/>
+          <w:numId w:val="2"/>
+        </w:numPr>
+        <w:spacing w:after="0" w:before="120"/>
+      </w:pPr>
+      <w:r>
+        <w:rPr>
+          <w:b/>
+          <w:bCs/>
+        </w:rPr>
+        <w:t xml:space="preserve">Why didn't you score higher?</w:t>
+      </w:r>
+    </w:p>
+    <w:p>
+      <w:pPr>
+        <w:spacing w:after="120"/>
+        <w:ind w:left="440"/>
+      </w:pPr>
+    </w:p>
+    <w:p>
+      <w:pPr>
+        <w:pStyle w:val="ListParagraph"/>
+        <w:keepNext/>
+        <w:numPr>
+          <w:ilvl w:val="0"/>
+          <w:numId w:val="2"/>
+        </w:numPr>
+        <w:spacing w:after="0" w:before="120"/>
+      </w:pPr>
+      <w:r>
+        <w:rPr>
+          <w:b/>
+          <w:bCs/>
+        </w:rPr>
+        <w:t xml:space="preserve">Which semester was your best?</w:t>
+      </w:r>
+    </w:p>
+    <w:p>
+      <w:pPr>
+        <w:spacing w:after="120"/>
+        <w:ind w:left="440"/>
+      </w:pPr>
+    </w:p>
+    <w:p>
+      <w:pPr>
+        <w:pStyle w:val="ListParagraph"/>
+        <w:keepNext/>
+        <w:numPr>
+          <w:ilvl w:val="0"/>
+          <w:numId w:val="2"/>
+        </w:numPr>
+        <w:spacing w:after="0" w:before="120"/>
+      </w:pPr>
+      <w:r>
+        <w:rPr>
+          <w:b/>
+          <w:bCs/>
+        </w:rPr>
+        <w:t xml:space="preserve">Do your marks reflect your technical ability?</w:t>
+      </w:r>
+    </w:p>
+    <w:p>
+      <w:pPr>
+        <w:spacing w:after="120"/>
+        <w:ind w:left="440"/>
+      </w:pPr>
+    </w:p>
+    <w:p>
+      <w:pPr>
+        <w:pStyle w:val="ListParagraph"/>
+        <w:keepNext/>
+        <w:numPr>
+          <w:ilvl w:val="0"/>
+          <w:numId w:val="2"/>
+        </w:numPr>
+        <w:spacing w:after="0" w:before="120"/>
+      </w:pPr>
+      <w:r>
+        <w:rPr>
+          <w:b/>
+          <w:bCs/>
+        </w:rPr>
+        <w:t xml:space="preserve">How did you balance academics and projects?</w:t>
+      </w:r>
+    </w:p>
+    <w:p>
+      <w:pPr>
+        <w:spacing w:after="120"/>
+        <w:ind w:left="440"/>
+      </w:pPr>
+    </w:p>
+    <w:p>
+      <w:pPr>
+        <w:pStyle w:val="ListParagraph"/>
+        <w:keepNext/>
+        <w:numPr>
+          <w:ilvl w:val="0"/>
+          <w:numId w:val="2"/>
+        </w:numPr>
+        <w:spacing w:after="0" w:before="120"/>
+      </w:pPr>
+      <w:r>
+        <w:rPr>
+          <w:b/>
+          <w:bCs/>
+        </w:rPr>
+        <w:t xml:space="preserve">What did you learn outside the curriculum?</w:t>
+      </w:r>
+    </w:p>
+    <w:p>
+      <w:pPr>
+        <w:spacing w:after="120"/>
+        <w:ind w:left="440"/>
+      </w:pPr>
+    </w:p>
+    <w:p>
+      <w:pPr>
+        <w:pStyle w:val="Heading1"/>
+      </w:pPr>
+      <w:r>
+        <w:t xml:space="preserve">PIQ 15 – B.Tech: CSE and the Armed Forces</w:t>
+      </w:r>
+    </w:p>
+    <w:p>
+      <w:pPr>
+        <w:pStyle w:val="ListParagraph"/>
+        <w:keepNext/>
+        <w:numPr>
+          <w:ilvl w:val="0"/>
+          <w:numId w:val="2"/>
+        </w:numPr>
+        <w:spacing w:after="0" w:before="120"/>
+      </w:pPr>
+      <w:r>
+        <w:rPr>
+          <w:b/>
+          <w:bCs/>
+        </w:rPr>
+        <w:t xml:space="preserve">Give me one concrete example of Computer Science solving a military problem.</w:t>
+      </w:r>
+    </w:p>
+    <w:p>
+      <w:pPr>
+        <w:spacing w:after="120"/>
+        <w:ind w:left="440"/>
+      </w:pPr>
+    </w:p>
+    <w:p>
+      <w:pPr>
+        <w:pStyle w:val="ListParagraph"/>
+        <w:keepNext/>
+        <w:numPr>
+          <w:ilvl w:val="0"/>
+          <w:numId w:val="2"/>
+        </w:numPr>
+        <w:spacing w:after="0" w:before="120"/>
+      </w:pPr>
+      <w:r>
+        <w:rPr>
+          <w:b/>
+          <w:bCs/>
+        </w:rPr>
+        <w:t xml:space="preserve">How can Computer Science help secure military communications?</w:t>
+      </w:r>
+    </w:p>
+    <w:p>
+      <w:pPr>
+        <w:spacing w:after="120"/>
+        <w:ind w:left="440"/>
+      </w:pPr>
+    </w:p>
+    <w:p>
+      <w:pPr>
+        <w:pStyle w:val="ListParagraph"/>
+        <w:keepNext/>
+        <w:numPr>
+          <w:ilvl w:val="0"/>
+          <w:numId w:val="2"/>
+        </w:numPr>
+        <w:spacing w:after="0" w:before="120"/>
+      </w:pPr>
+      <w:r>
+        <w:rPr>
+          <w:b/>
+          <w:bCs/>
+        </w:rPr>
+        <w:t xml:space="preserve">How can data analysis help the Armed Forces?</w:t>
+      </w:r>
+    </w:p>
+    <w:p>
+      <w:pPr>
+        <w:spacing w:after="120"/>
+        <w:ind w:left="440"/>
+      </w:pPr>
+    </w:p>
+    <w:p>
+      <w:pPr>
+        <w:pStyle w:val="ListParagraph"/>
+        <w:keepNext/>
+        <w:numPr>
+          <w:ilvl w:val="0"/>
+          <w:numId w:val="2"/>
+        </w:numPr>
+        <w:spacing w:after="0" w:before="120"/>
+      </w:pPr>
+      <w:r>
+        <w:rPr>
+          <w:b/>
+          <w:bCs/>
+        </w:rPr>
+        <w:t xml:space="preserve">How can simulation help military training?</w:t>
+      </w:r>
+    </w:p>
+    <w:p>
+      <w:pPr>
+        <w:spacing w:after="120"/>
+        <w:ind w:left="440"/>
+      </w:pPr>
+    </w:p>
+    <w:p>
+      <w:pPr>
+        <w:pStyle w:val="ListParagraph"/>
+        <w:keepNext/>
+        <w:numPr>
+          <w:ilvl w:val="0"/>
+          <w:numId w:val="2"/>
+        </w:numPr>
+        <w:spacing w:after="0" w:before="120"/>
+      </w:pPr>
+      <w:r>
+        <w:rPr>
+          <w:b/>
+          <w:bCs/>
+        </w:rPr>
+        <w:t xml:space="preserve">What is geospatial technology, and how is it used in defence?</w:t>
+      </w:r>
+    </w:p>
+    <w:p>
+      <w:pPr>
+        <w:spacing w:after="120"/>
+        <w:ind w:left="440"/>
+      </w:pPr>
+    </w:p>
+    <w:p>
+      <w:pPr>
+        <w:pStyle w:val="Heading1"/>
+      </w:pPr>
+      <w:r>
+        <w:t xml:space="preserve">PIQ 15 – B.Tech: Leaving IT</w:t>
+      </w:r>
+    </w:p>
+    <w:p>
+      <w:pPr>
+        <w:pStyle w:val="ListParagraph"/>
+        <w:keepNext/>
+        <w:numPr>
+          <w:ilvl w:val="0"/>
+          <w:numId w:val="2"/>
+        </w:numPr>
+        <w:spacing w:after="0" w:before="120"/>
+      </w:pPr>
+      <w:r>
+        <w:rPr>
+          <w:b/>
+          <w:bCs/>
+        </w:rPr>
+        <w:t xml:space="preserve">Why the Navy specifically?</w:t>
+      </w:r>
+    </w:p>
+    <w:p>
+      <w:pPr>
+        <w:spacing w:after="120"/>
+        <w:ind w:left="440"/>
+      </w:pPr>
+    </w:p>
+    <w:p>
+      <w:pPr>
+        <w:pStyle w:val="ListParagraph"/>
+        <w:keepNext/>
+        <w:numPr>
+          <w:ilvl w:val="0"/>
+          <w:numId w:val="2"/>
+        </w:numPr>
+        <w:spacing w:after="0" w:before="120"/>
+      </w:pPr>
+      <w:r>
+        <w:rPr>
+          <w:b/>
+          <w:bCs/>
+        </w:rPr>
+        <w:t xml:space="preserve">What if you get a better-paying IT offer?</w:t>
+      </w:r>
+    </w:p>
+    <w:p>
+      <w:pPr>
+        <w:spacing w:after="120"/>
+        <w:ind w:left="440"/>
+      </w:pPr>
+    </w:p>
+    <w:p>
+      <w:pPr>
+        <w:pStyle w:val="ListParagraph"/>
+        <w:keepNext/>
+        <w:numPr>
+          <w:ilvl w:val="0"/>
+          <w:numId w:val="2"/>
+        </w:numPr>
+        <w:spacing w:after="0" w:before="120"/>
+      </w:pPr>
+      <w:r>
+        <w:rPr>
+          <w:b/>
+          <w:bCs/>
+        </w:rPr>
+        <w:t xml:space="preserve">Do you consider your IT career a backup?</w:t>
+      </w:r>
+    </w:p>
+    <w:p>
+      <w:pPr>
+        <w:spacing w:after="120"/>
+        <w:ind w:left="440"/>
+      </w:pPr>
+    </w:p>
+    <w:p>
+      <w:pPr>
+        <w:pStyle w:val="ListParagraph"/>
+        <w:keepNext/>
+        <w:numPr>
+          <w:ilvl w:val="0"/>
+          <w:numId w:val="2"/>
+        </w:numPr>
+        <w:spacing w:after="0" w:before="120"/>
+      </w:pPr>
+      <w:r>
+        <w:rPr>
+          <w:b/>
+          <w:bCs/>
+        </w:rPr>
+        <w:t xml:space="preserve">Which skills from IT will help you as an officer?</w:t>
       </w:r>
     </w:p>
     <w:p>

</xml_diff>

<commit_message>
Add PIQ 16 (Height, Age & Weight) questions to SSB question sheet
Co-Authored-By: Claude Opus 5.5 <noreply@anthropic.com>
Claude-Session: https://claude.ai/code/session_01TypcejD48cCyAqfjtUUit5
</commit_message>
<xml_diff>
--- a/SSB_Question_Sheet.docx
+++ b/SSB_Question_Sheet.docx
@@ -26868,6 +26868,1582 @@
           <w:bCs/>
         </w:rPr>
         <w:t xml:space="preserve">Which skills from IT will help you as an officer?</w:t>
+      </w:r>
+    </w:p>
+    <w:p>
+      <w:pPr>
+        <w:spacing w:after="120"/>
+        <w:ind w:left="440"/>
+      </w:pPr>
+    </w:p>
+    <w:p>
+      <w:pPr>
+        <w:pStyle w:val="Heading1"/>
+      </w:pPr>
+      <w:r>
+        <w:t xml:space="preserve">PIQ 16 – Height, Age &amp; Weight</w:t>
+      </w:r>
+    </w:p>
+    <w:p>
+      <w:pPr>
+        <w:pStyle w:val="ListParagraph"/>
+        <w:keepNext/>
+        <w:numPr>
+          <w:ilvl w:val="0"/>
+          <w:numId w:val="2"/>
+        </w:numPr>
+        <w:spacing w:after="0" w:before="120"/>
+      </w:pPr>
+      <w:r>
+        <w:rPr>
+          <w:b/>
+          <w:bCs/>
+        </w:rPr>
+        <w:t xml:space="preserve">What is your height?</w:t>
+      </w:r>
+    </w:p>
+    <w:p>
+      <w:pPr>
+        <w:spacing w:after="120"/>
+        <w:ind w:left="440"/>
+      </w:pPr>
+    </w:p>
+    <w:p>
+      <w:pPr>
+        <w:pStyle w:val="ListParagraph"/>
+        <w:keepNext/>
+        <w:numPr>
+          <w:ilvl w:val="0"/>
+          <w:numId w:val="2"/>
+        </w:numPr>
+        <w:spacing w:after="0" w:before="120"/>
+      </w:pPr>
+      <w:r>
+        <w:rPr>
+          <w:b/>
+          <w:bCs/>
+        </w:rPr>
+        <w:t xml:space="preserve">What is your height in centimetres?</w:t>
+      </w:r>
+    </w:p>
+    <w:p>
+      <w:pPr>
+        <w:spacing w:after="120"/>
+        <w:ind w:left="440"/>
+      </w:pPr>
+    </w:p>
+    <w:p>
+      <w:pPr>
+        <w:pStyle w:val="ListParagraph"/>
+        <w:keepNext/>
+        <w:numPr>
+          <w:ilvl w:val="0"/>
+          <w:numId w:val="2"/>
+        </w:numPr>
+        <w:spacing w:after="0" w:before="120"/>
+      </w:pPr>
+      <w:r>
+        <w:rPr>
+          <w:b/>
+          <w:bCs/>
+        </w:rPr>
+        <w:t xml:space="preserve">What is your height in feet and inches?</w:t>
+      </w:r>
+    </w:p>
+    <w:p>
+      <w:pPr>
+        <w:spacing w:after="120"/>
+        <w:ind w:left="440"/>
+      </w:pPr>
+    </w:p>
+    <w:p>
+      <w:pPr>
+        <w:pStyle w:val="ListParagraph"/>
+        <w:keepNext/>
+        <w:numPr>
+          <w:ilvl w:val="0"/>
+          <w:numId w:val="2"/>
+        </w:numPr>
+        <w:spacing w:after="0" w:before="120"/>
+      </w:pPr>
+      <w:r>
+        <w:rPr>
+          <w:b/>
+          <w:bCs/>
+        </w:rPr>
+        <w:t xml:space="preserve">What is your weight?</w:t>
+      </w:r>
+    </w:p>
+    <w:p>
+      <w:pPr>
+        <w:spacing w:after="120"/>
+        <w:ind w:left="440"/>
+      </w:pPr>
+    </w:p>
+    <w:p>
+      <w:pPr>
+        <w:pStyle w:val="ListParagraph"/>
+        <w:keepNext/>
+        <w:numPr>
+          <w:ilvl w:val="0"/>
+          <w:numId w:val="2"/>
+        </w:numPr>
+        <w:spacing w:after="0" w:before="120"/>
+      </w:pPr>
+      <w:r>
+        <w:rPr>
+          <w:b/>
+          <w:bCs/>
+        </w:rPr>
+        <w:t xml:space="preserve">What is your weight in pounds?</w:t>
+      </w:r>
+    </w:p>
+    <w:p>
+      <w:pPr>
+        <w:spacing w:after="120"/>
+        <w:ind w:left="440"/>
+      </w:pPr>
+    </w:p>
+    <w:p>
+      <w:pPr>
+        <w:pStyle w:val="ListParagraph"/>
+        <w:keepNext/>
+        <w:numPr>
+          <w:ilvl w:val="0"/>
+          <w:numId w:val="2"/>
+        </w:numPr>
+        <w:spacing w:after="0" w:before="120"/>
+      </w:pPr>
+      <w:r>
+        <w:rPr>
+          <w:b/>
+          <w:bCs/>
+        </w:rPr>
+        <w:t xml:space="preserve">What is your age?</w:t>
+      </w:r>
+    </w:p>
+    <w:p>
+      <w:pPr>
+        <w:spacing w:after="120"/>
+        <w:ind w:left="440"/>
+      </w:pPr>
+    </w:p>
+    <w:p>
+      <w:pPr>
+        <w:pStyle w:val="ListParagraph"/>
+        <w:keepNext/>
+        <w:numPr>
+          <w:ilvl w:val="0"/>
+          <w:numId w:val="2"/>
+        </w:numPr>
+        <w:spacing w:after="0" w:before="120"/>
+      </w:pPr>
+      <w:r>
+        <w:rPr>
+          <w:b/>
+          <w:bCs/>
+        </w:rPr>
+        <w:t xml:space="preserve">What is your age in months?</w:t>
+      </w:r>
+    </w:p>
+    <w:p>
+      <w:pPr>
+        <w:spacing w:after="120"/>
+        <w:ind w:left="440"/>
+      </w:pPr>
+    </w:p>
+    <w:p>
+      <w:pPr>
+        <w:pStyle w:val="ListParagraph"/>
+        <w:keepNext/>
+        <w:numPr>
+          <w:ilvl w:val="0"/>
+          <w:numId w:val="2"/>
+        </w:numPr>
+        <w:spacing w:after="0" w:before="120"/>
+      </w:pPr>
+      <w:r>
+        <w:rPr>
+          <w:b/>
+          <w:bCs/>
+        </w:rPr>
+        <w:t xml:space="preserve">What is your date of birth?</w:t>
+      </w:r>
+    </w:p>
+    <w:p>
+      <w:pPr>
+        <w:spacing w:after="120"/>
+        <w:ind w:left="440"/>
+      </w:pPr>
+    </w:p>
+    <w:p>
+      <w:pPr>
+        <w:pStyle w:val="ListParagraph"/>
+        <w:keepNext/>
+        <w:numPr>
+          <w:ilvl w:val="0"/>
+          <w:numId w:val="2"/>
+        </w:numPr>
+        <w:spacing w:after="0" w:before="120"/>
+      </w:pPr>
+      <w:r>
+        <w:rPr>
+          <w:b/>
+          <w:bCs/>
+        </w:rPr>
+        <w:t xml:space="preserve">When will you turn 24?</w:t>
+      </w:r>
+    </w:p>
+    <w:p>
+      <w:pPr>
+        <w:spacing w:after="120"/>
+        <w:ind w:left="440"/>
+      </w:pPr>
+    </w:p>
+    <w:p>
+      <w:pPr>
+        <w:pStyle w:val="ListParagraph"/>
+        <w:keepNext/>
+        <w:numPr>
+          <w:ilvl w:val="0"/>
+          <w:numId w:val="2"/>
+        </w:numPr>
+        <w:spacing w:after="0" w:before="120"/>
+      </w:pPr>
+      <w:r>
+        <w:rPr>
+          <w:b/>
+          <w:bCs/>
+        </w:rPr>
+        <w:t xml:space="preserve">How old will you be when you join the Armed Forces?</w:t>
+      </w:r>
+    </w:p>
+    <w:p>
+      <w:pPr>
+        <w:spacing w:after="120"/>
+        <w:ind w:left="440"/>
+      </w:pPr>
+    </w:p>
+    <w:p>
+      <w:pPr>
+        <w:pStyle w:val="Heading1"/>
+      </w:pPr>
+      <w:r>
+        <w:t xml:space="preserve">PIQ 16 – BMI</w:t>
+      </w:r>
+    </w:p>
+    <w:p>
+      <w:pPr>
+        <w:pStyle w:val="ListParagraph"/>
+        <w:keepNext/>
+        <w:numPr>
+          <w:ilvl w:val="0"/>
+          <w:numId w:val="2"/>
+        </w:numPr>
+        <w:spacing w:after="0" w:before="120"/>
+      </w:pPr>
+      <w:r>
+        <w:rPr>
+          <w:b/>
+          <w:bCs/>
+        </w:rPr>
+        <w:t xml:space="preserve">What is BMI?</w:t>
+      </w:r>
+    </w:p>
+    <w:p>
+      <w:pPr>
+        <w:spacing w:after="120"/>
+        <w:ind w:left="440"/>
+      </w:pPr>
+    </w:p>
+    <w:p>
+      <w:pPr>
+        <w:pStyle w:val="ListParagraph"/>
+        <w:keepNext/>
+        <w:numPr>
+          <w:ilvl w:val="0"/>
+          <w:numId w:val="2"/>
+        </w:numPr>
+        <w:spacing w:after="0" w:before="120"/>
+      </w:pPr>
+      <w:r>
+        <w:rPr>
+          <w:b/>
+          <w:bCs/>
+        </w:rPr>
+        <w:t xml:space="preserve">What is your BMI? Calculate it.</w:t>
+      </w:r>
+    </w:p>
+    <w:p>
+      <w:pPr>
+        <w:spacing w:after="120"/>
+        <w:ind w:left="440"/>
+      </w:pPr>
+    </w:p>
+    <w:p>
+      <w:pPr>
+        <w:pStyle w:val="ListParagraph"/>
+        <w:keepNext/>
+        <w:numPr>
+          <w:ilvl w:val="0"/>
+          <w:numId w:val="2"/>
+        </w:numPr>
+        <w:spacing w:after="0" w:before="120"/>
+      </w:pPr>
+      <w:r>
+        <w:rPr>
+          <w:b/>
+          <w:bCs/>
+        </w:rPr>
+        <w:t xml:space="preserve">What is the normal BMI range?</w:t>
+      </w:r>
+    </w:p>
+    <w:p>
+      <w:pPr>
+        <w:spacing w:after="120"/>
+        <w:ind w:left="440"/>
+      </w:pPr>
+    </w:p>
+    <w:p>
+      <w:pPr>
+        <w:pStyle w:val="ListParagraph"/>
+        <w:keepNext/>
+        <w:numPr>
+          <w:ilvl w:val="0"/>
+          <w:numId w:val="2"/>
+        </w:numPr>
+        <w:spacing w:after="0" w:before="120"/>
+      </w:pPr>
+      <w:r>
+        <w:rPr>
+          <w:b/>
+          <w:bCs/>
+        </w:rPr>
+        <w:t xml:space="preserve">What does BMI indicate?</w:t>
+      </w:r>
+    </w:p>
+    <w:p>
+      <w:pPr>
+        <w:spacing w:after="120"/>
+        <w:ind w:left="440"/>
+      </w:pPr>
+    </w:p>
+    <w:p>
+      <w:pPr>
+        <w:pStyle w:val="ListParagraph"/>
+        <w:keepNext/>
+        <w:numPr>
+          <w:ilvl w:val="0"/>
+          <w:numId w:val="2"/>
+        </w:numPr>
+        <w:spacing w:after="0" w:before="120"/>
+      </w:pPr>
+      <w:r>
+        <w:rPr>
+          <w:b/>
+          <w:bCs/>
+        </w:rPr>
+        <w:t xml:space="preserve">Is BMI a perfect measure of fitness? Why not?</w:t>
+      </w:r>
+    </w:p>
+    <w:p>
+      <w:pPr>
+        <w:spacing w:after="120"/>
+        <w:ind w:left="440"/>
+      </w:pPr>
+    </w:p>
+    <w:p>
+      <w:pPr>
+        <w:pStyle w:val="Heading1"/>
+      </w:pPr>
+      <w:r>
+        <w:t xml:space="preserve">PIQ 16 – Fitness</w:t>
+      </w:r>
+    </w:p>
+    <w:p>
+      <w:pPr>
+        <w:pStyle w:val="ListParagraph"/>
+        <w:keepNext/>
+        <w:numPr>
+          <w:ilvl w:val="0"/>
+          <w:numId w:val="2"/>
+        </w:numPr>
+        <w:spacing w:after="0" w:before="120"/>
+      </w:pPr>
+      <w:r>
+        <w:rPr>
+          <w:b/>
+          <w:bCs/>
+        </w:rPr>
+        <w:t xml:space="preserve">Do you exercise? What do you do, and how often?</w:t>
+      </w:r>
+    </w:p>
+    <w:p>
+      <w:pPr>
+        <w:spacing w:after="120"/>
+        <w:ind w:left="440"/>
+      </w:pPr>
+    </w:p>
+    <w:p>
+      <w:pPr>
+        <w:pStyle w:val="ListParagraph"/>
+        <w:keepNext/>
+        <w:numPr>
+          <w:ilvl w:val="0"/>
+          <w:numId w:val="2"/>
+        </w:numPr>
+        <w:spacing w:after="0" w:before="120"/>
+      </w:pPr>
+      <w:r>
+        <w:rPr>
+          <w:b/>
+          <w:bCs/>
+        </w:rPr>
+        <w:t xml:space="preserve">Do you run? How far?</w:t>
+      </w:r>
+    </w:p>
+    <w:p>
+      <w:pPr>
+        <w:spacing w:after="120"/>
+        <w:ind w:left="440"/>
+      </w:pPr>
+    </w:p>
+    <w:p>
+      <w:pPr>
+        <w:pStyle w:val="ListParagraph"/>
+        <w:keepNext/>
+        <w:numPr>
+          <w:ilvl w:val="0"/>
+          <w:numId w:val="2"/>
+        </w:numPr>
+        <w:spacing w:after="0" w:before="120"/>
+      </w:pPr>
+      <w:r>
+        <w:rPr>
+          <w:b/>
+          <w:bCs/>
+        </w:rPr>
+        <w:t xml:space="preserve">What is your running pace?</w:t>
+      </w:r>
+    </w:p>
+    <w:p>
+      <w:pPr>
+        <w:spacing w:after="120"/>
+        <w:ind w:left="440"/>
+      </w:pPr>
+    </w:p>
+    <w:p>
+      <w:pPr>
+        <w:pStyle w:val="ListParagraph"/>
+        <w:keepNext/>
+        <w:numPr>
+          <w:ilvl w:val="0"/>
+          <w:numId w:val="2"/>
+        </w:numPr>
+        <w:spacing w:after="0" w:before="120"/>
+      </w:pPr>
+      <w:r>
+        <w:rPr>
+          <w:b/>
+          <w:bCs/>
+        </w:rPr>
+        <w:t xml:space="preserve">How long does your longest run take, and when did you last do it?</w:t>
+      </w:r>
+    </w:p>
+    <w:p>
+      <w:pPr>
+        <w:spacing w:after="120"/>
+        <w:ind w:left="440"/>
+      </w:pPr>
+    </w:p>
+    <w:p>
+      <w:pPr>
+        <w:pStyle w:val="ListParagraph"/>
+        <w:keepNext/>
+        <w:numPr>
+          <w:ilvl w:val="0"/>
+          <w:numId w:val="2"/>
+        </w:numPr>
+        <w:spacing w:after="0" w:before="120"/>
+      </w:pPr>
+      <w:r>
+        <w:rPr>
+          <w:b/>
+          <w:bCs/>
+        </w:rPr>
+        <w:t xml:space="preserve">How many push-ups can you do?</w:t>
+      </w:r>
+    </w:p>
+    <w:p>
+      <w:pPr>
+        <w:spacing w:after="120"/>
+        <w:ind w:left="440"/>
+      </w:pPr>
+    </w:p>
+    <w:p>
+      <w:pPr>
+        <w:pStyle w:val="ListParagraph"/>
+        <w:keepNext/>
+        <w:numPr>
+          <w:ilvl w:val="0"/>
+          <w:numId w:val="2"/>
+        </w:numPr>
+        <w:spacing w:after="0" w:before="120"/>
+      </w:pPr>
+      <w:r>
+        <w:rPr>
+          <w:b/>
+          <w:bCs/>
+        </w:rPr>
+        <w:t xml:space="preserve">How many sit-ups can you do?</w:t>
+      </w:r>
+    </w:p>
+    <w:p>
+      <w:pPr>
+        <w:spacing w:after="120"/>
+        <w:ind w:left="440"/>
+      </w:pPr>
+    </w:p>
+    <w:p>
+      <w:pPr>
+        <w:pStyle w:val="ListParagraph"/>
+        <w:keepNext/>
+        <w:numPr>
+          <w:ilvl w:val="0"/>
+          <w:numId w:val="2"/>
+        </w:numPr>
+        <w:spacing w:after="0" w:before="120"/>
+      </w:pPr>
+      <w:r>
+        <w:rPr>
+          <w:b/>
+          <w:bCs/>
+        </w:rPr>
+        <w:t xml:space="preserve">How many pull-ups can you do?</w:t>
+      </w:r>
+    </w:p>
+    <w:p>
+      <w:pPr>
+        <w:spacing w:after="120"/>
+        <w:ind w:left="440"/>
+      </w:pPr>
+    </w:p>
+    <w:p>
+      <w:pPr>
+        <w:pStyle w:val="ListParagraph"/>
+        <w:keepNext/>
+        <w:numPr>
+          <w:ilvl w:val="0"/>
+          <w:numId w:val="2"/>
+        </w:numPr>
+        <w:spacing w:after="0" w:before="120"/>
+      </w:pPr>
+      <w:r>
+        <w:rPr>
+          <w:b/>
+          <w:bCs/>
+        </w:rPr>
+        <w:t xml:space="preserve">How long can you hold a plank?</w:t>
+      </w:r>
+    </w:p>
+    <w:p>
+      <w:pPr>
+        <w:spacing w:after="120"/>
+        <w:ind w:left="440"/>
+      </w:pPr>
+    </w:p>
+    <w:p>
+      <w:pPr>
+        <w:pStyle w:val="ListParagraph"/>
+        <w:keepNext/>
+        <w:numPr>
+          <w:ilvl w:val="0"/>
+          <w:numId w:val="2"/>
+        </w:numPr>
+        <w:spacing w:after="0" w:before="120"/>
+      </w:pPr>
+      <w:r>
+        <w:rPr>
+          <w:b/>
+          <w:bCs/>
+        </w:rPr>
+        <w:t xml:space="preserve">Do you play any sport?</w:t>
+      </w:r>
+    </w:p>
+    <w:p>
+      <w:pPr>
+        <w:spacing w:after="120"/>
+        <w:ind w:left="440"/>
+      </w:pPr>
+    </w:p>
+    <w:p>
+      <w:pPr>
+        <w:pStyle w:val="ListParagraph"/>
+        <w:keepNext/>
+        <w:numPr>
+          <w:ilvl w:val="0"/>
+          <w:numId w:val="2"/>
+        </w:numPr>
+        <w:spacing w:after="0" w:before="120"/>
+      </w:pPr>
+      <w:r>
+        <w:rPr>
+          <w:b/>
+          <w:bCs/>
+        </w:rPr>
+        <w:t xml:space="preserve">What is your fitness goal?</w:t>
+      </w:r>
+    </w:p>
+    <w:p>
+      <w:pPr>
+        <w:spacing w:after="120"/>
+        <w:ind w:left="440"/>
+      </w:pPr>
+    </w:p>
+    <w:p>
+      <w:pPr>
+        <w:pStyle w:val="ListParagraph"/>
+        <w:keepNext/>
+        <w:numPr>
+          <w:ilvl w:val="0"/>
+          <w:numId w:val="2"/>
+        </w:numPr>
+        <w:spacing w:after="0" w:before="120"/>
+      </w:pPr>
+      <w:r>
+        <w:rPr>
+          <w:b/>
+          <w:bCs/>
+        </w:rPr>
+        <w:t xml:space="preserve">How do you maintain your fitness?</w:t>
+      </w:r>
+    </w:p>
+    <w:p>
+      <w:pPr>
+        <w:spacing w:after="120"/>
+        <w:ind w:left="440"/>
+      </w:pPr>
+    </w:p>
+    <w:p>
+      <w:pPr>
+        <w:pStyle w:val="ListParagraph"/>
+        <w:keepNext/>
+        <w:numPr>
+          <w:ilvl w:val="0"/>
+          <w:numId w:val="2"/>
+        </w:numPr>
+        <w:spacing w:after="0" w:before="120"/>
+      </w:pPr>
+      <w:r>
+        <w:rPr>
+          <w:b/>
+          <w:bCs/>
+        </w:rPr>
+        <w:t xml:space="preserve">If you run 5 km in 30 minutes, what is your pace and speed?</w:t>
+      </w:r>
+    </w:p>
+    <w:p>
+      <w:pPr>
+        <w:spacing w:after="120"/>
+        <w:ind w:left="440"/>
+      </w:pPr>
+    </w:p>
+    <w:p>
+      <w:pPr>
+        <w:pStyle w:val="ListParagraph"/>
+        <w:keepNext/>
+        <w:numPr>
+          <w:ilvl w:val="0"/>
+          <w:numId w:val="2"/>
+        </w:numPr>
+        <w:spacing w:after="0" w:before="120"/>
+      </w:pPr>
+      <w:r>
+        <w:rPr>
+          <w:b/>
+          <w:bCs/>
+        </w:rPr>
+        <w:t xml:space="preserve">How are distance, time, pace and speed related?</w:t>
+      </w:r>
+    </w:p>
+    <w:p>
+      <w:pPr>
+        <w:spacing w:after="120"/>
+        <w:ind w:left="440"/>
+      </w:pPr>
+    </w:p>
+    <w:p>
+      <w:pPr>
+        <w:pStyle w:val="Heading1"/>
+      </w:pPr>
+      <w:r>
+        <w:t xml:space="preserve">PIQ 16 – Age &amp; Career Timing</w:t>
+      </w:r>
+    </w:p>
+    <w:p>
+      <w:pPr>
+        <w:pStyle w:val="ListParagraph"/>
+        <w:keepNext/>
+        <w:numPr>
+          <w:ilvl w:val="0"/>
+          <w:numId w:val="2"/>
+        </w:numPr>
+        <w:spacing w:after="0" w:before="120"/>
+      </w:pPr>
+      <w:r>
+        <w:rPr>
+          <w:b/>
+          <w:bCs/>
+        </w:rPr>
+        <w:t xml:space="preserve">How long have you been working, and how much experience do you have?</w:t>
+      </w:r>
+    </w:p>
+    <w:p>
+      <w:pPr>
+        <w:spacing w:after="120"/>
+        <w:ind w:left="440"/>
+      </w:pPr>
+    </w:p>
+    <w:p>
+      <w:pPr>
+        <w:pStyle w:val="ListParagraph"/>
+        <w:keepNext/>
+        <w:numPr>
+          <w:ilvl w:val="0"/>
+          <w:numId w:val="2"/>
+        </w:numPr>
+        <w:spacing w:after="0" w:before="120"/>
+      </w:pPr>
+      <w:r>
+        <w:rPr>
+          <w:b/>
+          <w:bCs/>
+        </w:rPr>
+        <w:t xml:space="preserve">What have you achieved since graduation?</w:t>
+      </w:r>
+    </w:p>
+    <w:p>
+      <w:pPr>
+        <w:spacing w:after="120"/>
+        <w:ind w:left="440"/>
+      </w:pPr>
+    </w:p>
+    <w:p>
+      <w:pPr>
+        <w:pStyle w:val="ListParagraph"/>
+        <w:keepNext/>
+        <w:numPr>
+          <w:ilvl w:val="0"/>
+          <w:numId w:val="2"/>
+        </w:numPr>
+        <w:spacing w:after="0" w:before="120"/>
+      </w:pPr>
+      <w:r>
+        <w:rPr>
+          <w:b/>
+          <w:bCs/>
+        </w:rPr>
+        <w:t xml:space="preserve">Where do you see yourself in five years?</w:t>
+      </w:r>
+    </w:p>
+    <w:p>
+      <w:pPr>
+        <w:spacing w:after="120"/>
+        <w:ind w:left="440"/>
+      </w:pPr>
+    </w:p>
+    <w:p>
+      <w:pPr>
+        <w:pStyle w:val="ListParagraph"/>
+        <w:keepNext/>
+        <w:numPr>
+          <w:ilvl w:val="0"/>
+          <w:numId w:val="2"/>
+        </w:numPr>
+        <w:spacing w:after="0" w:before="120"/>
+      </w:pPr>
+      <w:r>
+        <w:rPr>
+          <w:b/>
+          <w:bCs/>
+        </w:rPr>
+        <w:t xml:space="preserve">You are almost 24. Why have you decided to join the Armed Forces now?</w:t>
+      </w:r>
+    </w:p>
+    <w:p>
+      <w:pPr>
+        <w:spacing w:after="120"/>
+        <w:ind w:left="440"/>
+      </w:pPr>
+    </w:p>
+    <w:p>
+      <w:pPr>
+        <w:pStyle w:val="ListParagraph"/>
+        <w:keepNext/>
+        <w:numPr>
+          <w:ilvl w:val="0"/>
+          <w:numId w:val="2"/>
+        </w:numPr>
+        <w:spacing w:after="0" w:before="120"/>
+      </w:pPr>
+      <w:r>
+        <w:rPr>
+          <w:b/>
+          <w:bCs/>
+        </w:rPr>
+        <w:t xml:space="preserve">Why didn't you try to join earlier?</w:t>
+      </w:r>
+    </w:p>
+    <w:p>
+      <w:pPr>
+        <w:spacing w:after="120"/>
+        <w:ind w:left="440"/>
+      </w:pPr>
+    </w:p>
+    <w:p>
+      <w:pPr>
+        <w:pStyle w:val="Heading1"/>
+      </w:pPr>
+      <w:r>
+        <w:t xml:space="preserve">PIQ 16 – Physical Standards</w:t>
+      </w:r>
+    </w:p>
+    <w:p>
+      <w:pPr>
+        <w:pStyle w:val="ListParagraph"/>
+        <w:keepNext/>
+        <w:numPr>
+          <w:ilvl w:val="0"/>
+          <w:numId w:val="2"/>
+        </w:numPr>
+        <w:spacing w:after="0" w:before="120"/>
+      </w:pPr>
+      <w:r>
+        <w:rPr>
+          <w:b/>
+          <w:bCs/>
+        </w:rPr>
+        <w:t xml:space="preserve">What is the minimum height requirement for your entry?</w:t>
+      </w:r>
+    </w:p>
+    <w:p>
+      <w:pPr>
+        <w:spacing w:after="120"/>
+        <w:ind w:left="440"/>
+      </w:pPr>
+    </w:p>
+    <w:p>
+      <w:pPr>
+        <w:pStyle w:val="ListParagraph"/>
+        <w:keepNext/>
+        <w:numPr>
+          <w:ilvl w:val="0"/>
+          <w:numId w:val="2"/>
+        </w:numPr>
+        <w:spacing w:after="0" w:before="120"/>
+      </w:pPr>
+      <w:r>
+        <w:rPr>
+          <w:b/>
+          <w:bCs/>
+        </w:rPr>
+        <w:t xml:space="preserve">Do height standards differ by service and entry?</w:t>
+      </w:r>
+    </w:p>
+    <w:p>
+      <w:pPr>
+        <w:spacing w:after="120"/>
+        <w:ind w:left="440"/>
+      </w:pPr>
+    </w:p>
+    <w:p>
+      <w:pPr>
+        <w:pStyle w:val="ListParagraph"/>
+        <w:keepNext/>
+        <w:numPr>
+          <w:ilvl w:val="0"/>
+          <w:numId w:val="2"/>
+        </w:numPr>
+        <w:spacing w:after="0" w:before="120"/>
+      </w:pPr>
+      <w:r>
+        <w:rPr>
+          <w:b/>
+          <w:bCs/>
+        </w:rPr>
+        <w:t xml:space="preserve">Why are physical standards necessary?</w:t>
+      </w:r>
+    </w:p>
+    <w:p>
+      <w:pPr>
+        <w:spacing w:after="120"/>
+        <w:ind w:left="440"/>
+      </w:pPr>
+    </w:p>
+    <w:p>
+      <w:pPr>
+        <w:pStyle w:val="ListParagraph"/>
+        <w:keepNext/>
+        <w:numPr>
+          <w:ilvl w:val="0"/>
+          <w:numId w:val="2"/>
+        </w:numPr>
+        <w:spacing w:after="0" w:before="120"/>
+      </w:pPr>
+      <w:r>
+        <w:rPr>
+          <w:b/>
+          <w:bCs/>
+        </w:rPr>
+        <w:t xml:space="preserve">What other physical standards are checked?</w:t>
+      </w:r>
+    </w:p>
+    <w:p>
+      <w:pPr>
+        <w:spacing w:after="120"/>
+        <w:ind w:left="440"/>
+      </w:pPr>
+    </w:p>
+    <w:p>
+      <w:pPr>
+        <w:pStyle w:val="ListParagraph"/>
+        <w:keepNext/>
+        <w:numPr>
+          <w:ilvl w:val="0"/>
+          <w:numId w:val="2"/>
+        </w:numPr>
+        <w:spacing w:after="0" w:before="120"/>
+      </w:pPr>
+      <w:r>
+        <w:rPr>
+          <w:b/>
+          <w:bCs/>
+        </w:rPr>
+        <w:t xml:space="preserve">Why is physical fitness important for an officer?</w:t>
+      </w:r>
+    </w:p>
+    <w:p>
+      <w:pPr>
+        <w:spacing w:after="120"/>
+        <w:ind w:left="440"/>
+      </w:pPr>
+    </w:p>
+    <w:p>
+      <w:pPr>
+        <w:pStyle w:val="ListParagraph"/>
+        <w:keepNext/>
+        <w:numPr>
+          <w:ilvl w:val="0"/>
+          <w:numId w:val="2"/>
+        </w:numPr>
+        <w:spacing w:after="0" w:before="120"/>
+      </w:pPr>
+      <w:r>
+        <w:rPr>
+          <w:b/>
+          <w:bCs/>
+        </w:rPr>
+        <w:t xml:space="preserve">What are the physical demands of military service?</w:t>
+      </w:r>
+    </w:p>
+    <w:p>
+      <w:pPr>
+        <w:spacing w:after="120"/>
+        <w:ind w:left="440"/>
+      </w:pPr>
+    </w:p>
+    <w:p>
+      <w:pPr>
+        <w:pStyle w:val="ListParagraph"/>
+        <w:keepNext/>
+        <w:numPr>
+          <w:ilvl w:val="0"/>
+          <w:numId w:val="2"/>
+        </w:numPr>
+        <w:spacing w:after="0" w:before="120"/>
+      </w:pPr>
+      <w:r>
+        <w:rPr>
+          <w:b/>
+          <w:bCs/>
+        </w:rPr>
+        <w:t xml:space="preserve">Why do you want to join despite those demands?</w:t>
+      </w:r>
+    </w:p>
+    <w:p>
+      <w:pPr>
+        <w:spacing w:after="120"/>
+        <w:ind w:left="440"/>
+      </w:pPr>
+    </w:p>
+    <w:p>
+      <w:pPr>
+        <w:pStyle w:val="Heading1"/>
+      </w:pPr>
+      <w:r>
+        <w:t xml:space="preserve">PIQ 16 – Weight &amp; Diet</w:t>
+      </w:r>
+    </w:p>
+    <w:p>
+      <w:pPr>
+        <w:pStyle w:val="ListParagraph"/>
+        <w:keepNext/>
+        <w:numPr>
+          <w:ilvl w:val="0"/>
+          <w:numId w:val="2"/>
+        </w:numPr>
+        <w:spacing w:after="0" w:before="120"/>
+      </w:pPr>
+      <w:r>
+        <w:rPr>
+          <w:b/>
+          <w:bCs/>
+        </w:rPr>
+        <w:t xml:space="preserve">Has your weight changed recently?</w:t>
+      </w:r>
+    </w:p>
+    <w:p>
+      <w:pPr>
+        <w:spacing w:after="120"/>
+        <w:ind w:left="440"/>
+      </w:pPr>
+    </w:p>
+    <w:p>
+      <w:pPr>
+        <w:pStyle w:val="ListParagraph"/>
+        <w:keepNext/>
+        <w:numPr>
+          <w:ilvl w:val="0"/>
+          <w:numId w:val="2"/>
+        </w:numPr>
+        <w:spacing w:after="0" w:before="120"/>
+      </w:pPr>
+      <w:r>
+        <w:rPr>
+          <w:b/>
+          <w:bCs/>
+        </w:rPr>
+        <w:t xml:space="preserve">What was your weight a year ago, and why did it change?</w:t>
+      </w:r>
+    </w:p>
+    <w:p>
+      <w:pPr>
+        <w:spacing w:after="120"/>
+        <w:ind w:left="440"/>
+      </w:pPr>
+    </w:p>
+    <w:p>
+      <w:pPr>
+        <w:pStyle w:val="ListParagraph"/>
+        <w:keepNext/>
+        <w:numPr>
+          <w:ilvl w:val="0"/>
+          <w:numId w:val="2"/>
+        </w:numPr>
+        <w:spacing w:after="0" w:before="120"/>
+      </w:pPr>
+      <w:r>
+        <w:rPr>
+          <w:b/>
+          <w:bCs/>
+        </w:rPr>
+        <w:t xml:space="preserve">How do you maintain your weight?</w:t>
+      </w:r>
+    </w:p>
+    <w:p>
+      <w:pPr>
+        <w:spacing w:after="120"/>
+        <w:ind w:left="440"/>
+      </w:pPr>
+    </w:p>
+    <w:p>
+      <w:pPr>
+        <w:pStyle w:val="ListParagraph"/>
+        <w:keepNext/>
+        <w:numPr>
+          <w:ilvl w:val="0"/>
+          <w:numId w:val="2"/>
+        </w:numPr>
+        <w:spacing w:after="0" w:before="120"/>
+      </w:pPr>
+      <w:r>
+        <w:rPr>
+          <w:b/>
+          <w:bCs/>
+        </w:rPr>
+        <w:t xml:space="preserve">What is your diet?</w:t>
+      </w:r>
+    </w:p>
+    <w:p>
+      <w:pPr>
+        <w:spacing w:after="120"/>
+        <w:ind w:left="440"/>
+      </w:pPr>
+    </w:p>
+    <w:p>
+      <w:pPr>
+        <w:pStyle w:val="ListParagraph"/>
+        <w:keepNext/>
+        <w:numPr>
+          <w:ilvl w:val="0"/>
+          <w:numId w:val="2"/>
+        </w:numPr>
+        <w:spacing w:after="0" w:before="120"/>
+      </w:pPr>
+      <w:r>
+        <w:rPr>
+          <w:b/>
+          <w:bCs/>
+        </w:rPr>
+        <w:t xml:space="preserve">How much protein do you eat?</w:t>
+      </w:r>
+    </w:p>
+    <w:p>
+      <w:pPr>
+        <w:spacing w:after="120"/>
+        <w:ind w:left="440"/>
+      </w:pPr>
+    </w:p>
+    <w:p>
+      <w:pPr>
+        <w:pStyle w:val="ListParagraph"/>
+        <w:keepNext/>
+        <w:numPr>
+          <w:ilvl w:val="0"/>
+          <w:numId w:val="2"/>
+        </w:numPr>
+        <w:spacing w:after="0" w:before="120"/>
+      </w:pPr>
+      <w:r>
+        <w:rPr>
+          <w:b/>
+          <w:bCs/>
+        </w:rPr>
+        <w:t xml:space="preserve">How many calories do you eat?</w:t>
+      </w:r>
+    </w:p>
+    <w:p>
+      <w:pPr>
+        <w:spacing w:after="120"/>
+        <w:ind w:left="440"/>
+      </w:pPr>
+    </w:p>
+    <w:p>
+      <w:pPr>
+        <w:pStyle w:val="ListParagraph"/>
+        <w:keepNext/>
+        <w:numPr>
+          <w:ilvl w:val="0"/>
+          <w:numId w:val="2"/>
+        </w:numPr>
+        <w:spacing w:after="0" w:before="120"/>
+      </w:pPr>
+      <w:r>
+        <w:rPr>
+          <w:b/>
+          <w:bCs/>
+        </w:rPr>
+        <w:t xml:space="preserve">Do you take supplements?</w:t>
+      </w:r>
+    </w:p>
+    <w:p>
+      <w:pPr>
+        <w:spacing w:after="120"/>
+        <w:ind w:left="440"/>
+      </w:pPr>
+    </w:p>
+    <w:p>
+      <w:pPr>
+        <w:pStyle w:val="ListParagraph"/>
+        <w:keepNext/>
+        <w:numPr>
+          <w:ilvl w:val="0"/>
+          <w:numId w:val="2"/>
+        </w:numPr>
+        <w:spacing w:after="0" w:before="120"/>
+      </w:pPr>
+      <w:r>
+        <w:rPr>
+          <w:b/>
+          <w:bCs/>
+        </w:rPr>
+        <w:t xml:space="preserve">How do you balance strength and endurance training?</w:t>
+      </w:r>
+    </w:p>
+    <w:p>
+      <w:pPr>
+        <w:spacing w:after="120"/>
+        <w:ind w:left="440"/>
+      </w:pPr>
+    </w:p>
+    <w:p>
+      <w:pPr>
+        <w:pStyle w:val="Heading1"/>
+      </w:pPr>
+      <w:r>
+        <w:t xml:space="preserve">PIQ 16 – Lifestyle</w:t>
+      </w:r>
+    </w:p>
+    <w:p>
+      <w:pPr>
+        <w:pStyle w:val="ListParagraph"/>
+        <w:keepNext/>
+        <w:numPr>
+          <w:ilvl w:val="0"/>
+          <w:numId w:val="2"/>
+        </w:numPr>
+        <w:spacing w:after="0" w:before="120"/>
+      </w:pPr>
+      <w:r>
+        <w:rPr>
+          <w:b/>
+          <w:bCs/>
+        </w:rPr>
+        <w:t xml:space="preserve">What time do you wake up?</w:t>
+      </w:r>
+    </w:p>
+    <w:p>
+      <w:pPr>
+        <w:spacing w:after="120"/>
+        <w:ind w:left="440"/>
+      </w:pPr>
+    </w:p>
+    <w:p>
+      <w:pPr>
+        <w:pStyle w:val="ListParagraph"/>
+        <w:keepNext/>
+        <w:numPr>
+          <w:ilvl w:val="0"/>
+          <w:numId w:val="2"/>
+        </w:numPr>
+        <w:spacing w:after="0" w:before="120"/>
+      </w:pPr>
+      <w:r>
+        <w:rPr>
+          <w:b/>
+          <w:bCs/>
+        </w:rPr>
+        <w:t xml:space="preserve">How much do you sleep?</w:t>
+      </w:r>
+    </w:p>
+    <w:p>
+      <w:pPr>
+        <w:spacing w:after="120"/>
+        <w:ind w:left="440"/>
+      </w:pPr>
+    </w:p>
+    <w:p>
+      <w:pPr>
+        <w:pStyle w:val="ListParagraph"/>
+        <w:keepNext/>
+        <w:numPr>
+          <w:ilvl w:val="0"/>
+          <w:numId w:val="2"/>
+        </w:numPr>
+        <w:spacing w:after="0" w:before="120"/>
+      </w:pPr>
+      <w:r>
+        <w:rPr>
+          <w:b/>
+          <w:bCs/>
+        </w:rPr>
+        <w:t xml:space="preserve">When do you exercise, study and work?</w:t>
+      </w:r>
+    </w:p>
+    <w:p>
+      <w:pPr>
+        <w:spacing w:after="120"/>
+        <w:ind w:left="440"/>
+      </w:pPr>
+    </w:p>
+    <w:p>
+      <w:pPr>
+        <w:pStyle w:val="ListParagraph"/>
+        <w:keepNext/>
+        <w:numPr>
+          <w:ilvl w:val="0"/>
+          <w:numId w:val="2"/>
+        </w:numPr>
+        <w:spacing w:after="0" w:before="120"/>
+      </w:pPr>
+      <w:r>
+        <w:rPr>
+          <w:b/>
+          <w:bCs/>
+        </w:rPr>
+        <w:t xml:space="preserve">How do you manage SSB preparation with your job?</w:t>
+      </w:r>
+    </w:p>
+    <w:p>
+      <w:pPr>
+        <w:spacing w:after="120"/>
+        <w:ind w:left="440"/>
+      </w:pPr>
+    </w:p>
+    <w:p>
+      <w:pPr>
+        <w:pStyle w:val="ListParagraph"/>
+        <w:keepNext/>
+        <w:numPr>
+          <w:ilvl w:val="0"/>
+          <w:numId w:val="2"/>
+        </w:numPr>
+        <w:spacing w:after="0" w:before="120"/>
+      </w:pPr>
+      <w:r>
+        <w:rPr>
+          <w:b/>
+          <w:bCs/>
+        </w:rPr>
+        <w:t xml:space="preserve">How do you spend your weekends?</w:t>
+      </w:r>
+    </w:p>
+    <w:p>
+      <w:pPr>
+        <w:spacing w:after="120"/>
+        <w:ind w:left="440"/>
+      </w:pPr>
+    </w:p>
+    <w:p>
+      <w:pPr>
+        <w:pStyle w:val="ListParagraph"/>
+        <w:keepNext/>
+        <w:numPr>
+          <w:ilvl w:val="0"/>
+          <w:numId w:val="2"/>
+        </w:numPr>
+        <w:spacing w:after="0" w:before="120"/>
+      </w:pPr>
+      <w:r>
+        <w:rPr>
+          <w:b/>
+          <w:bCs/>
+        </w:rPr>
+        <w:t xml:space="preserve">How much time do you spend on your phone?</w:t>
+      </w:r>
+    </w:p>
+    <w:p>
+      <w:pPr>
+        <w:spacing w:after="120"/>
+        <w:ind w:left="440"/>
+      </w:pPr>
+    </w:p>
+    <w:p>
+      <w:pPr>
+        <w:pStyle w:val="ListParagraph"/>
+        <w:keepNext/>
+        <w:numPr>
+          <w:ilvl w:val="0"/>
+          <w:numId w:val="2"/>
+        </w:numPr>
+        <w:spacing w:after="0" w:before="120"/>
+      </w:pPr>
+      <w:r>
+        <w:rPr>
+          <w:b/>
+          <w:bCs/>
+        </w:rPr>
+        <w:t xml:space="preserve">What do you do for recreation?</w:t>
+      </w:r>
+    </w:p>
+    <w:p>
+      <w:pPr>
+        <w:spacing w:after="120"/>
+        <w:ind w:left="440"/>
+      </w:pPr>
+    </w:p>
+    <w:p>
+      <w:pPr>
+        <w:pStyle w:val="Heading1"/>
+      </w:pPr>
+      <w:r>
+        <w:t xml:space="preserve">PIQ 16 – Fitness: Personal</w:t>
+      </w:r>
+    </w:p>
+    <w:p>
+      <w:pPr>
+        <w:pStyle w:val="ListParagraph"/>
+        <w:keepNext/>
+        <w:numPr>
+          <w:ilvl w:val="0"/>
+          <w:numId w:val="2"/>
+        </w:numPr>
+        <w:spacing w:after="0" w:before="120"/>
+      </w:pPr>
+      <w:r>
+        <w:rPr>
+          <w:b/>
+          <w:bCs/>
+        </w:rPr>
+        <w:t xml:space="preserve">Are you satisfied with your physical fitness?</w:t>
+      </w:r>
+    </w:p>
+    <w:p>
+      <w:pPr>
+        <w:spacing w:after="120"/>
+        <w:ind w:left="440"/>
+      </w:pPr>
+    </w:p>
+    <w:p>
+      <w:pPr>
+        <w:pStyle w:val="ListParagraph"/>
+        <w:keepNext/>
+        <w:numPr>
+          <w:ilvl w:val="0"/>
+          <w:numId w:val="2"/>
+        </w:numPr>
+        <w:spacing w:after="0" w:before="120"/>
+      </w:pPr>
+      <w:r>
+        <w:rPr>
+          <w:b/>
+          <w:bCs/>
+        </w:rPr>
+        <w:t xml:space="preserve">What is your biggest fitness weakness, and what are you doing about it?</w:t>
+      </w:r>
+    </w:p>
+    <w:p>
+      <w:pPr>
+        <w:spacing w:after="120"/>
+        <w:ind w:left="440"/>
+      </w:pPr>
+    </w:p>
+    <w:p>
+      <w:pPr>
+        <w:pStyle w:val="ListParagraph"/>
+        <w:keepNext/>
+        <w:numPr>
+          <w:ilvl w:val="0"/>
+          <w:numId w:val="2"/>
+        </w:numPr>
+        <w:spacing w:after="0" w:before="120"/>
+      </w:pPr>
+      <w:r>
+        <w:rPr>
+          <w:b/>
+          <w:bCs/>
+        </w:rPr>
+        <w:t xml:space="preserve">Have you ever missed your training routine?</w:t>
+      </w:r>
+    </w:p>
+    <w:p>
+      <w:pPr>
+        <w:spacing w:after="120"/>
+        <w:ind w:left="440"/>
+      </w:pPr>
+    </w:p>
+    <w:p>
+      <w:pPr>
+        <w:pStyle w:val="ListParagraph"/>
+        <w:keepNext/>
+        <w:numPr>
+          <w:ilvl w:val="0"/>
+          <w:numId w:val="2"/>
+        </w:numPr>
+        <w:spacing w:after="0" w:before="120"/>
+      </w:pPr>
+      <w:r>
+        <w:rPr>
+          <w:b/>
+          <w:bCs/>
+        </w:rPr>
+        <w:t xml:space="preserve">How do you stay disciplined when you don't feel motivated?</w:t>
+      </w:r>
+    </w:p>
+    <w:p>
+      <w:pPr>
+        <w:spacing w:after="120"/>
+        <w:ind w:left="440"/>
+      </w:pPr>
+    </w:p>
+    <w:p>
+      <w:pPr>
+        <w:pStyle w:val="ListParagraph"/>
+        <w:keepNext/>
+        <w:numPr>
+          <w:ilvl w:val="0"/>
+          <w:numId w:val="2"/>
+        </w:numPr>
+        <w:spacing w:after="0" w:before="120"/>
+      </w:pPr>
+      <w:r>
+        <w:rPr>
+          <w:b/>
+          <w:bCs/>
+        </w:rPr>
+        <w:t xml:space="preserve">Which fitness activity do you enjoy most?</w:t>
+      </w:r>
+    </w:p>
+    <w:p>
+      <w:pPr>
+        <w:spacing w:after="120"/>
+        <w:ind w:left="440"/>
+      </w:pPr>
+    </w:p>
+    <w:p>
+      <w:pPr>
+        <w:pStyle w:val="ListParagraph"/>
+        <w:keepNext/>
+        <w:numPr>
+          <w:ilvl w:val="0"/>
+          <w:numId w:val="2"/>
+        </w:numPr>
+        <w:spacing w:after="0" w:before="120"/>
+      </w:pPr>
+      <w:r>
+        <w:rPr>
+          <w:b/>
+          <w:bCs/>
+        </w:rPr>
+        <w:t xml:space="preserve">Do you prefer strength training or endurance training?</w:t>
+      </w:r>
+    </w:p>
+    <w:p>
+      <w:pPr>
+        <w:spacing w:after="120"/>
+        <w:ind w:left="440"/>
+      </w:pPr>
+    </w:p>
+    <w:p>
+      <w:pPr>
+        <w:pStyle w:val="ListParagraph"/>
+        <w:keepNext/>
+        <w:numPr>
+          <w:ilvl w:val="0"/>
+          <w:numId w:val="2"/>
+        </w:numPr>
+        <w:spacing w:after="0" w:before="120"/>
+      </w:pPr>
+      <w:r>
+        <w:rPr>
+          <w:b/>
+          <w:bCs/>
+        </w:rPr>
+        <w:t xml:space="preserve">Which sport do you follow?</w:t>
+      </w:r>
+    </w:p>
+    <w:p>
+      <w:pPr>
+        <w:spacing w:after="120"/>
+        <w:ind w:left="440"/>
+      </w:pPr>
+    </w:p>
+    <w:p>
+      <w:pPr>
+        <w:pStyle w:val="ListParagraph"/>
+        <w:keepNext/>
+        <w:numPr>
+          <w:ilvl w:val="0"/>
+          <w:numId w:val="2"/>
+        </w:numPr>
+        <w:spacing w:after="0" w:before="120"/>
+      </w:pPr>
+      <w:r>
+        <w:rPr>
+          <w:b/>
+          <w:bCs/>
+        </w:rPr>
+        <w:t xml:space="preserve">Have you represented your school or college in sports?</w:t>
       </w:r>
     </w:p>
     <w:p>

</xml_diff>